<commit_message>
Cập nhật hướng dẫn giải và máy chấm
</commit_message>
<xml_diff>
--- a/TAI-LIEU.docx
+++ b/TAI-LIEU.docx
@@ -250,7 +250,7 @@
           <w:sz w:val="21"/>
           <w:szCs w:val="22"/>
         </w:rPr>
-        <w:id w:val="1413286840"/>
+        <w:id w:val="1926988543"/>
         <w:docPartObj>
           <w:docPartGallery w:val="Table of Contents"/>
           <w:docPartUnique/>
@@ -287,12 +287,12 @@
             <w:fldChar w:fldCharType="begin"/>
           </w:r>
           <w:r>
-            <w:instrText>TOC \o "1-2" \h \z \u</w:instrText>
+            <w:instrText>TOC \o "1-3" \h \z \u</w:instrText>
           </w:r>
           <w:r>
             <w:fldChar w:fldCharType="separate"/>
           </w:r>
-          <w:hyperlink w:anchor="_Toc243860553" w:history="1">
+          <w:hyperlink w:anchor="_Toc243866066" w:history="1">
             <w:r>
               <w:rPr>
                 <w:rStyle w:val="Hyperlink"/>
@@ -319,7 +319,7 @@
                 <w:noProof/>
                 <w:webHidden/>
               </w:rPr>
-              <w:instrText xml:space="preserve"> PAGEREF _Toc243860553 \h </w:instrText>
+              <w:instrText xml:space="preserve"> PAGEREF _Toc243866066 \h </w:instrText>
             </w:r>
             <w:r>
               <w:rPr>
@@ -339,7 +339,7 @@
                 <w:noProof/>
                 <w:webHidden/>
               </w:rPr>
-              <w:t>3</w:t>
+              <w:t>4</w:t>
             </w:r>
             <w:r>
               <w:rPr>
@@ -366,7 +366,7 @@
               <w14:ligatures w14:val="standardContextual"/>
             </w:rPr>
           </w:pPr>
-          <w:hyperlink w:anchor="_Toc243860554" w:history="1">
+          <w:hyperlink w:anchor="_Toc243866067" w:history="1">
             <w:r>
               <w:rPr>
                 <w:rStyle w:val="Hyperlink"/>
@@ -393,7 +393,7 @@
                 <w:noProof/>
                 <w:webHidden/>
               </w:rPr>
-              <w:instrText xml:space="preserve"> PAGEREF _Toc243860554 \h </w:instrText>
+              <w:instrText xml:space="preserve"> PAGEREF _Toc243866067 \h </w:instrText>
             </w:r>
             <w:r>
               <w:rPr>
@@ -413,7 +413,7 @@
                 <w:noProof/>
                 <w:webHidden/>
               </w:rPr>
-              <w:t>4</w:t>
+              <w:t>5</w:t>
             </w:r>
             <w:r>
               <w:rPr>
@@ -440,7 +440,7 @@
               <w14:ligatures w14:val="standardContextual"/>
             </w:rPr>
           </w:pPr>
-          <w:hyperlink w:anchor="_Toc243860555" w:history="1">
+          <w:hyperlink w:anchor="_Toc243866068" w:history="1">
             <w:r>
               <w:rPr>
                 <w:rStyle w:val="Hyperlink"/>
@@ -467,7 +467,7 @@
                 <w:noProof/>
                 <w:webHidden/>
               </w:rPr>
-              <w:instrText xml:space="preserve"> PAGEREF _Toc243860555 \h </w:instrText>
+              <w:instrText xml:space="preserve"> PAGEREF _Toc243866068 \h </w:instrText>
             </w:r>
             <w:r>
               <w:rPr>
@@ -487,7 +487,7 @@
                 <w:noProof/>
                 <w:webHidden/>
               </w:rPr>
-              <w:t>4</w:t>
+              <w:t>5</w:t>
             </w:r>
             <w:r>
               <w:rPr>
@@ -514,7 +514,7 @@
               <w14:ligatures w14:val="standardContextual"/>
             </w:rPr>
           </w:pPr>
-          <w:hyperlink w:anchor="_Toc243860556" w:history="1">
+          <w:hyperlink w:anchor="_Toc243866069" w:history="1">
             <w:r>
               <w:rPr>
                 <w:rStyle w:val="Hyperlink"/>
@@ -541,7 +541,7 @@
                 <w:noProof/>
                 <w:webHidden/>
               </w:rPr>
-              <w:instrText xml:space="preserve"> PAGEREF _Toc243860556 \h </w:instrText>
+              <w:instrText xml:space="preserve"> PAGEREF _Toc243866069 \h </w:instrText>
             </w:r>
             <w:r>
               <w:rPr>
@@ -561,7 +561,7 @@
                 <w:noProof/>
                 <w:webHidden/>
               </w:rPr>
-              <w:t>4</w:t>
+              <w:t>5</w:t>
             </w:r>
             <w:r>
               <w:rPr>
@@ -588,7 +588,7 @@
               <w14:ligatures w14:val="standardContextual"/>
             </w:rPr>
           </w:pPr>
-          <w:hyperlink w:anchor="_Toc243860557" w:history="1">
+          <w:hyperlink w:anchor="_Toc243866070" w:history="1">
             <w:r>
               <w:rPr>
                 <w:rStyle w:val="Hyperlink"/>
@@ -615,7 +615,7 @@
                 <w:noProof/>
                 <w:webHidden/>
               </w:rPr>
-              <w:instrText xml:space="preserve"> PAGEREF _Toc243860557 \h </w:instrText>
+              <w:instrText xml:space="preserve"> PAGEREF _Toc243866070 \h </w:instrText>
             </w:r>
             <w:r>
               <w:rPr>
@@ -635,7 +635,7 @@
                 <w:noProof/>
                 <w:webHidden/>
               </w:rPr>
-              <w:t>5</w:t>
+              <w:t>6</w:t>
             </w:r>
             <w:r>
               <w:rPr>
@@ -662,7 +662,7 @@
               <w14:ligatures w14:val="standardContextual"/>
             </w:rPr>
           </w:pPr>
-          <w:hyperlink w:anchor="_Toc243860558" w:history="1">
+          <w:hyperlink w:anchor="_Toc243866071" w:history="1">
             <w:r>
               <w:rPr>
                 <w:rStyle w:val="Hyperlink"/>
@@ -689,7 +689,7 @@
                 <w:noProof/>
                 <w:webHidden/>
               </w:rPr>
-              <w:instrText xml:space="preserve"> PAGEREF _Toc243860558 \h </w:instrText>
+              <w:instrText xml:space="preserve"> PAGEREF _Toc243866071 \h </w:instrText>
             </w:r>
             <w:r>
               <w:rPr>
@@ -709,7 +709,229 @@
                 <w:noProof/>
                 <w:webHidden/>
               </w:rPr>
-              <w:t>6</w:t>
+              <w:t>7</w:t>
+            </w:r>
+            <w:r>
+              <w:rPr>
+                <w:noProof/>
+                <w:webHidden/>
+              </w:rPr>
+              <w:fldChar w:fldCharType="end"/>
+            </w:r>
+          </w:hyperlink>
+        </w:p>
+        <w:p>
+          <w:pPr>
+            <w:pStyle w:val="TOC3"/>
+            <w:tabs>
+              <w:tab w:val="right" w:leader="dot" w:pos="9739"/>
+            </w:tabs>
+            <w:rPr>
+              <w:rFonts w:asciiTheme="minorHAnsi" w:hAnsiTheme="minorHAnsi" w:cstheme="minorBidi"/>
+              <w:noProof/>
+              <w:color w:val="auto"/>
+              <w:kern w:val="2"/>
+              <w:sz w:val="22"/>
+              <w:lang w:val="en-US"/>
+              <w14:ligatures w14:val="standardContextual"/>
+            </w:rPr>
+          </w:pPr>
+          <w:hyperlink w:anchor="_Toc243866072" w:history="1">
+            <w:r>
+              <w:rPr>
+                <w:rStyle w:val="Hyperlink"/>
+                <w:noProof/>
+              </w:rPr>
+              <w:t>Ladder trước hạn</w:t>
+            </w:r>
+            <w:r>
+              <w:rPr>
+                <w:noProof/>
+                <w:webHidden/>
+              </w:rPr>
+              <w:tab/>
+            </w:r>
+            <w:r>
+              <w:rPr>
+                <w:noProof/>
+                <w:webHidden/>
+              </w:rPr>
+              <w:fldChar w:fldCharType="begin"/>
+            </w:r>
+            <w:r>
+              <w:rPr>
+                <w:noProof/>
+                <w:webHidden/>
+              </w:rPr>
+              <w:instrText xml:space="preserve"> PAGEREF _Toc243866072 \h </w:instrText>
+            </w:r>
+            <w:r>
+              <w:rPr>
+                <w:noProof/>
+                <w:webHidden/>
+              </w:rPr>
+            </w:r>
+            <w:r>
+              <w:rPr>
+                <w:noProof/>
+                <w:webHidden/>
+              </w:rPr>
+              <w:fldChar w:fldCharType="separate"/>
+            </w:r>
+            <w:r>
+              <w:rPr>
+                <w:noProof/>
+                <w:webHidden/>
+              </w:rPr>
+              <w:t>7</w:t>
+            </w:r>
+            <w:r>
+              <w:rPr>
+                <w:noProof/>
+                <w:webHidden/>
+              </w:rPr>
+              <w:fldChar w:fldCharType="end"/>
+            </w:r>
+          </w:hyperlink>
+        </w:p>
+        <w:p>
+          <w:pPr>
+            <w:pStyle w:val="TOC3"/>
+            <w:tabs>
+              <w:tab w:val="right" w:leader="dot" w:pos="9739"/>
+            </w:tabs>
+            <w:rPr>
+              <w:rFonts w:asciiTheme="minorHAnsi" w:hAnsiTheme="minorHAnsi" w:cstheme="minorBidi"/>
+              <w:noProof/>
+              <w:color w:val="auto"/>
+              <w:kern w:val="2"/>
+              <w:sz w:val="22"/>
+              <w:lang w:val="en-US"/>
+              <w14:ligatures w14:val="standardContextual"/>
+            </w:rPr>
+          </w:pPr>
+          <w:hyperlink w:anchor="_Toc243866073" w:history="1">
+            <w:r>
+              <w:rPr>
+                <w:rStyle w:val="Hyperlink"/>
+                <w:noProof/>
+              </w:rPr>
+              <w:t>Chốt bài tại hạn</w:t>
+            </w:r>
+            <w:r>
+              <w:rPr>
+                <w:noProof/>
+                <w:webHidden/>
+              </w:rPr>
+              <w:tab/>
+            </w:r>
+            <w:r>
+              <w:rPr>
+                <w:noProof/>
+                <w:webHidden/>
+              </w:rPr>
+              <w:fldChar w:fldCharType="begin"/>
+            </w:r>
+            <w:r>
+              <w:rPr>
+                <w:noProof/>
+                <w:webHidden/>
+              </w:rPr>
+              <w:instrText xml:space="preserve"> PAGEREF _Toc243866073 \h </w:instrText>
+            </w:r>
+            <w:r>
+              <w:rPr>
+                <w:noProof/>
+                <w:webHidden/>
+              </w:rPr>
+            </w:r>
+            <w:r>
+              <w:rPr>
+                <w:noProof/>
+                <w:webHidden/>
+              </w:rPr>
+              <w:fldChar w:fldCharType="separate"/>
+            </w:r>
+            <w:r>
+              <w:rPr>
+                <w:noProof/>
+                <w:webHidden/>
+              </w:rPr>
+              <w:t>7</w:t>
+            </w:r>
+            <w:r>
+              <w:rPr>
+                <w:noProof/>
+                <w:webHidden/>
+              </w:rPr>
+              <w:fldChar w:fldCharType="end"/>
+            </w:r>
+          </w:hyperlink>
+        </w:p>
+        <w:p>
+          <w:pPr>
+            <w:pStyle w:val="TOC3"/>
+            <w:tabs>
+              <w:tab w:val="right" w:leader="dot" w:pos="9739"/>
+            </w:tabs>
+            <w:rPr>
+              <w:rFonts w:asciiTheme="minorHAnsi" w:hAnsiTheme="minorHAnsi" w:cstheme="minorBidi"/>
+              <w:noProof/>
+              <w:color w:val="auto"/>
+              <w:kern w:val="2"/>
+              <w:sz w:val="22"/>
+              <w:lang w:val="en-US"/>
+              <w14:ligatures w14:val="standardContextual"/>
+            </w:rPr>
+          </w:pPr>
+          <w:hyperlink w:anchor="_Toc243866074" w:history="1">
+            <w:r>
+              <w:rPr>
+                <w:rStyle w:val="Hyperlink"/>
+                <w:noProof/>
+              </w:rPr>
+              <w:t>Xếp hạng chính thức</w:t>
+            </w:r>
+            <w:r>
+              <w:rPr>
+                <w:noProof/>
+                <w:webHidden/>
+              </w:rPr>
+              <w:tab/>
+            </w:r>
+            <w:r>
+              <w:rPr>
+                <w:noProof/>
+                <w:webHidden/>
+              </w:rPr>
+              <w:fldChar w:fldCharType="begin"/>
+            </w:r>
+            <w:r>
+              <w:rPr>
+                <w:noProof/>
+                <w:webHidden/>
+              </w:rPr>
+              <w:instrText xml:space="preserve"> PAGEREF _Toc243866074 \h </w:instrText>
+            </w:r>
+            <w:r>
+              <w:rPr>
+                <w:noProof/>
+                <w:webHidden/>
+              </w:rPr>
+            </w:r>
+            <w:r>
+              <w:rPr>
+                <w:noProof/>
+                <w:webHidden/>
+              </w:rPr>
+              <w:fldChar w:fldCharType="separate"/>
+            </w:r>
+            <w:r>
+              <w:rPr>
+                <w:noProof/>
+                <w:webHidden/>
+              </w:rPr>
+              <w:t>8</w:t>
             </w:r>
             <w:r>
               <w:rPr>
@@ -736,7 +958,7 @@
               <w14:ligatures w14:val="standardContextual"/>
             </w:rPr>
           </w:pPr>
-          <w:hyperlink w:anchor="_Toc243860559" w:history="1">
+          <w:hyperlink w:anchor="_Toc243866075" w:history="1">
             <w:r>
               <w:rPr>
                 <w:rStyle w:val="Hyperlink"/>
@@ -763,7 +985,7 @@
                 <w:noProof/>
                 <w:webHidden/>
               </w:rPr>
-              <w:instrText xml:space="preserve"> PAGEREF _Toc243860559 \h </w:instrText>
+              <w:instrText xml:space="preserve"> PAGEREF _Toc243866075 \h </w:instrText>
             </w:r>
             <w:r>
               <w:rPr>
@@ -783,7 +1005,7 @@
                 <w:noProof/>
                 <w:webHidden/>
               </w:rPr>
-              <w:t>7</w:t>
+              <w:t>8</w:t>
             </w:r>
             <w:r>
               <w:rPr>
@@ -810,7 +1032,7 @@
               <w14:ligatures w14:val="standardContextual"/>
             </w:rPr>
           </w:pPr>
-          <w:hyperlink w:anchor="_Toc243860560" w:history="1">
+          <w:hyperlink w:anchor="_Toc243866076" w:history="1">
             <w:r>
               <w:rPr>
                 <w:rStyle w:val="Hyperlink"/>
@@ -837,7 +1059,7 @@
                 <w:noProof/>
                 <w:webHidden/>
               </w:rPr>
-              <w:instrText xml:space="preserve"> PAGEREF _Toc243860560 \h </w:instrText>
+              <w:instrText xml:space="preserve"> PAGEREF _Toc243866076 \h </w:instrText>
             </w:r>
             <w:r>
               <w:rPr>
@@ -857,7 +1079,7 @@
                 <w:noProof/>
                 <w:webHidden/>
               </w:rPr>
-              <w:t>9</w:t>
+              <w:t>10</w:t>
             </w:r>
             <w:r>
               <w:rPr>
@@ -884,7 +1106,7 @@
               <w14:ligatures w14:val="standardContextual"/>
             </w:rPr>
           </w:pPr>
-          <w:hyperlink w:anchor="_Toc243860561" w:history="1">
+          <w:hyperlink w:anchor="_Toc243866077" w:history="1">
             <w:r>
               <w:rPr>
                 <w:rStyle w:val="Hyperlink"/>
@@ -911,7 +1133,7 @@
                 <w:noProof/>
                 <w:webHidden/>
               </w:rPr>
-              <w:instrText xml:space="preserve"> PAGEREF _Toc243860561 \h </w:instrText>
+              <w:instrText xml:space="preserve"> PAGEREF _Toc243866077 \h </w:instrText>
             </w:r>
             <w:r>
               <w:rPr>
@@ -931,7 +1153,7 @@
                 <w:noProof/>
                 <w:webHidden/>
               </w:rPr>
-              <w:t>11</w:t>
+              <w:t>12</w:t>
             </w:r>
             <w:r>
               <w:rPr>
@@ -958,7 +1180,7 @@
               <w14:ligatures w14:val="standardContextual"/>
             </w:rPr>
           </w:pPr>
-          <w:hyperlink w:anchor="_Toc243860562" w:history="1">
+          <w:hyperlink w:anchor="_Toc243866078" w:history="1">
             <w:r>
               <w:rPr>
                 <w:rStyle w:val="Hyperlink"/>
@@ -985,7 +1207,7 @@
                 <w:noProof/>
                 <w:webHidden/>
               </w:rPr>
-              <w:instrText xml:space="preserve"> PAGEREF _Toc243860562 \h </w:instrText>
+              <w:instrText xml:space="preserve"> PAGEREF _Toc243866078 \h </w:instrText>
             </w:r>
             <w:r>
               <w:rPr>
@@ -1005,7 +1227,7 @@
                 <w:noProof/>
                 <w:webHidden/>
               </w:rPr>
-              <w:t>11</w:t>
+              <w:t>12</w:t>
             </w:r>
             <w:r>
               <w:rPr>
@@ -1032,7 +1254,7 @@
               <w14:ligatures w14:val="standardContextual"/>
             </w:rPr>
           </w:pPr>
-          <w:hyperlink w:anchor="_Toc243860563" w:history="1">
+          <w:hyperlink w:anchor="_Toc243866079" w:history="1">
             <w:r>
               <w:rPr>
                 <w:rStyle w:val="Hyperlink"/>
@@ -1059,7 +1281,7 @@
                 <w:noProof/>
                 <w:webHidden/>
               </w:rPr>
-              <w:instrText xml:space="preserve"> PAGEREF _Toc243860563 \h </w:instrText>
+              <w:instrText xml:space="preserve"> PAGEREF _Toc243866079 \h </w:instrText>
             </w:r>
             <w:r>
               <w:rPr>
@@ -1079,7 +1301,7 @@
                 <w:noProof/>
                 <w:webHidden/>
               </w:rPr>
-              <w:t>11</w:t>
+              <w:t>12</w:t>
             </w:r>
             <w:r>
               <w:rPr>
@@ -1106,7 +1328,7 @@
               <w14:ligatures w14:val="standardContextual"/>
             </w:rPr>
           </w:pPr>
-          <w:hyperlink w:anchor="_Toc243860564" w:history="1">
+          <w:hyperlink w:anchor="_Toc243866080" w:history="1">
             <w:r>
               <w:rPr>
                 <w:rStyle w:val="Hyperlink"/>
@@ -1133,7 +1355,7 @@
                 <w:noProof/>
                 <w:webHidden/>
               </w:rPr>
-              <w:instrText xml:space="preserve"> PAGEREF _Toc243860564 \h </w:instrText>
+              <w:instrText xml:space="preserve"> PAGEREF _Toc243866080 \h </w:instrText>
             </w:r>
             <w:r>
               <w:rPr>
@@ -1153,7 +1375,7 @@
                 <w:noProof/>
                 <w:webHidden/>
               </w:rPr>
-              <w:t>12</w:t>
+              <w:t>13</w:t>
             </w:r>
             <w:r>
               <w:rPr>
@@ -1180,7 +1402,7 @@
               <w14:ligatures w14:val="standardContextual"/>
             </w:rPr>
           </w:pPr>
-          <w:hyperlink w:anchor="_Toc243860565" w:history="1">
+          <w:hyperlink w:anchor="_Toc243866081" w:history="1">
             <w:r>
               <w:rPr>
                 <w:rStyle w:val="Hyperlink"/>
@@ -1207,7 +1429,7 @@
                 <w:noProof/>
                 <w:webHidden/>
               </w:rPr>
-              <w:instrText xml:space="preserve"> PAGEREF _Toc243860565 \h </w:instrText>
+              <w:instrText xml:space="preserve"> PAGEREF _Toc243866081 \h </w:instrText>
             </w:r>
             <w:r>
               <w:rPr>
@@ -1227,7 +1449,7 @@
                 <w:noProof/>
                 <w:webHidden/>
               </w:rPr>
-              <w:t>12</w:t>
+              <w:t>13</w:t>
             </w:r>
             <w:r>
               <w:rPr>
@@ -1254,7 +1476,7 @@
               <w14:ligatures w14:val="standardContextual"/>
             </w:rPr>
           </w:pPr>
-          <w:hyperlink w:anchor="_Toc243860566" w:history="1">
+          <w:hyperlink w:anchor="_Toc243866082" w:history="1">
             <w:r>
               <w:rPr>
                 <w:rStyle w:val="Hyperlink"/>
@@ -1281,7 +1503,7 @@
                 <w:noProof/>
                 <w:webHidden/>
               </w:rPr>
-              <w:instrText xml:space="preserve"> PAGEREF _Toc243860566 \h </w:instrText>
+              <w:instrText xml:space="preserve"> PAGEREF _Toc243866082 \h </w:instrText>
             </w:r>
             <w:r>
               <w:rPr>
@@ -1301,7 +1523,7 @@
                 <w:noProof/>
                 <w:webHidden/>
               </w:rPr>
-              <w:t>13</w:t>
+              <w:t>14</w:t>
             </w:r>
             <w:r>
               <w:rPr>
@@ -1328,7 +1550,7 @@
               <w14:ligatures w14:val="standardContextual"/>
             </w:rPr>
           </w:pPr>
-          <w:hyperlink w:anchor="_Toc243860567" w:history="1">
+          <w:hyperlink w:anchor="_Toc243866083" w:history="1">
             <w:r>
               <w:rPr>
                 <w:rStyle w:val="Hyperlink"/>
@@ -1355,7 +1577,7 @@
                 <w:noProof/>
                 <w:webHidden/>
               </w:rPr>
-              <w:instrText xml:space="preserve"> PAGEREF _Toc243860567 \h </w:instrText>
+              <w:instrText xml:space="preserve"> PAGEREF _Toc243866083 \h </w:instrText>
             </w:r>
             <w:r>
               <w:rPr>
@@ -1375,7 +1597,7 @@
                 <w:noProof/>
                 <w:webHidden/>
               </w:rPr>
-              <w:t>14</w:t>
+              <w:t>15</w:t>
             </w:r>
             <w:r>
               <w:rPr>
@@ -1402,7 +1624,7 @@
               <w14:ligatures w14:val="standardContextual"/>
             </w:rPr>
           </w:pPr>
-          <w:hyperlink w:anchor="_Toc243860568" w:history="1">
+          <w:hyperlink w:anchor="_Toc243866084" w:history="1">
             <w:r>
               <w:rPr>
                 <w:rStyle w:val="Hyperlink"/>
@@ -1429,7 +1651,7 @@
                 <w:noProof/>
                 <w:webHidden/>
               </w:rPr>
-              <w:instrText xml:space="preserve"> PAGEREF _Toc243860568 \h </w:instrText>
+              <w:instrText xml:space="preserve"> PAGEREF _Toc243866084 \h </w:instrText>
             </w:r>
             <w:r>
               <w:rPr>
@@ -1449,7 +1671,7 @@
                 <w:noProof/>
                 <w:webHidden/>
               </w:rPr>
-              <w:t>14</w:t>
+              <w:t>15</w:t>
             </w:r>
             <w:r>
               <w:rPr>
@@ -1476,7 +1698,7 @@
               <w14:ligatures w14:val="standardContextual"/>
             </w:rPr>
           </w:pPr>
-          <w:hyperlink w:anchor="_Toc243860569" w:history="1">
+          <w:hyperlink w:anchor="_Toc243866085" w:history="1">
             <w:r>
               <w:rPr>
                 <w:rStyle w:val="Hyperlink"/>
@@ -1503,7 +1725,7 @@
                 <w:noProof/>
                 <w:webHidden/>
               </w:rPr>
-              <w:instrText xml:space="preserve"> PAGEREF _Toc243860569 \h </w:instrText>
+              <w:instrText xml:space="preserve"> PAGEREF _Toc243866085 \h </w:instrText>
             </w:r>
             <w:r>
               <w:rPr>
@@ -1523,7 +1745,7 @@
                 <w:noProof/>
                 <w:webHidden/>
               </w:rPr>
-              <w:t>15</w:t>
+              <w:t>16</w:t>
             </w:r>
             <w:r>
               <w:rPr>
@@ -1550,7 +1772,7 @@
               <w14:ligatures w14:val="standardContextual"/>
             </w:rPr>
           </w:pPr>
-          <w:hyperlink w:anchor="_Toc243860570" w:history="1">
+          <w:hyperlink w:anchor="_Toc243866086" w:history="1">
             <w:r>
               <w:rPr>
                 <w:rStyle w:val="Hyperlink"/>
@@ -1577,7 +1799,7 @@
                 <w:noProof/>
                 <w:webHidden/>
               </w:rPr>
-              <w:instrText xml:space="preserve"> PAGEREF _Toc243860570 \h </w:instrText>
+              <w:instrText xml:space="preserve"> PAGEREF _Toc243866086 \h </w:instrText>
             </w:r>
             <w:r>
               <w:rPr>
@@ -1597,7 +1819,7 @@
                 <w:noProof/>
                 <w:webHidden/>
               </w:rPr>
-              <w:t>16</w:t>
+              <w:t>17</w:t>
             </w:r>
             <w:r>
               <w:rPr>
@@ -1624,7 +1846,7 @@
               <w14:ligatures w14:val="standardContextual"/>
             </w:rPr>
           </w:pPr>
-          <w:hyperlink w:anchor="_Toc243860571" w:history="1">
+          <w:hyperlink w:anchor="_Toc243866087" w:history="1">
             <w:r>
               <w:rPr>
                 <w:rStyle w:val="Hyperlink"/>
@@ -1651,7 +1873,7 @@
                 <w:noProof/>
                 <w:webHidden/>
               </w:rPr>
-              <w:instrText xml:space="preserve"> PAGEREF _Toc243860571 \h </w:instrText>
+              <w:instrText xml:space="preserve"> PAGEREF _Toc243866087 \h </w:instrText>
             </w:r>
             <w:r>
               <w:rPr>
@@ -1671,7 +1893,7 @@
                 <w:noProof/>
                 <w:webHidden/>
               </w:rPr>
-              <w:t>17</w:t>
+              <w:t>18</w:t>
             </w:r>
             <w:r>
               <w:rPr>
@@ -1698,7 +1920,7 @@
               <w14:ligatures w14:val="standardContextual"/>
             </w:rPr>
           </w:pPr>
-          <w:hyperlink w:anchor="_Toc243860572" w:history="1">
+          <w:hyperlink w:anchor="_Toc243866088" w:history="1">
             <w:r>
               <w:rPr>
                 <w:rStyle w:val="Hyperlink"/>
@@ -1725,7 +1947,7 @@
                 <w:noProof/>
                 <w:webHidden/>
               </w:rPr>
-              <w:instrText xml:space="preserve"> PAGEREF _Toc243860572 \h </w:instrText>
+              <w:instrText xml:space="preserve"> PAGEREF _Toc243866088 \h </w:instrText>
             </w:r>
             <w:r>
               <w:rPr>
@@ -1745,7 +1967,7 @@
                 <w:noProof/>
                 <w:webHidden/>
               </w:rPr>
-              <w:t>18</w:t>
+              <w:t>19</w:t>
             </w:r>
             <w:r>
               <w:rPr>
@@ -1772,7 +1994,7 @@
               <w14:ligatures w14:val="standardContextual"/>
             </w:rPr>
           </w:pPr>
-          <w:hyperlink w:anchor="_Toc243860573" w:history="1">
+          <w:hyperlink w:anchor="_Toc243866089" w:history="1">
             <w:r>
               <w:rPr>
                 <w:rStyle w:val="Hyperlink"/>
@@ -1799,7 +2021,7 @@
                 <w:noProof/>
                 <w:webHidden/>
               </w:rPr>
-              <w:instrText xml:space="preserve"> PAGEREF _Toc243860573 \h </w:instrText>
+              <w:instrText xml:space="preserve"> PAGEREF _Toc243866089 \h </w:instrText>
             </w:r>
             <w:r>
               <w:rPr>
@@ -1819,7 +2041,7 @@
                 <w:noProof/>
                 <w:webHidden/>
               </w:rPr>
-              <w:t>19</w:t>
+              <w:t>20</w:t>
             </w:r>
             <w:r>
               <w:rPr>
@@ -1846,7 +2068,7 @@
               <w14:ligatures w14:val="standardContextual"/>
             </w:rPr>
           </w:pPr>
-          <w:hyperlink w:anchor="_Toc243860574" w:history="1">
+          <w:hyperlink w:anchor="_Toc243866090" w:history="1">
             <w:r>
               <w:rPr>
                 <w:rStyle w:val="Hyperlink"/>
@@ -1873,7 +2095,7 @@
                 <w:noProof/>
                 <w:webHidden/>
               </w:rPr>
-              <w:instrText xml:space="preserve"> PAGEREF _Toc243860574 \h </w:instrText>
+              <w:instrText xml:space="preserve"> PAGEREF _Toc243866090 \h </w:instrText>
             </w:r>
             <w:r>
               <w:rPr>
@@ -1893,7 +2115,229 @@
                 <w:noProof/>
                 <w:webHidden/>
               </w:rPr>
-              <w:t>19</w:t>
+              <w:t>20</w:t>
+            </w:r>
+            <w:r>
+              <w:rPr>
+                <w:noProof/>
+                <w:webHidden/>
+              </w:rPr>
+              <w:fldChar w:fldCharType="end"/>
+            </w:r>
+          </w:hyperlink>
+        </w:p>
+        <w:p>
+          <w:pPr>
+            <w:pStyle w:val="TOC3"/>
+            <w:tabs>
+              <w:tab w:val="right" w:leader="dot" w:pos="9739"/>
+            </w:tabs>
+            <w:rPr>
+              <w:rFonts w:asciiTheme="minorHAnsi" w:hAnsiTheme="minorHAnsi" w:cstheme="minorBidi"/>
+              <w:noProof/>
+              <w:color w:val="auto"/>
+              <w:kern w:val="2"/>
+              <w:sz w:val="22"/>
+              <w:lang w:val="en-US"/>
+              <w14:ligatures w14:val="standardContextual"/>
+            </w:rPr>
+          </w:pPr>
+          <w:hyperlink w:anchor="_Toc243866091" w:history="1">
+            <w:r>
+              <w:rPr>
+                <w:rStyle w:val="Hyperlink"/>
+                <w:noProof/>
+              </w:rPr>
+              <w:t>Bước 1 Mở giải công khai</w:t>
+            </w:r>
+            <w:r>
+              <w:rPr>
+                <w:noProof/>
+                <w:webHidden/>
+              </w:rPr>
+              <w:tab/>
+            </w:r>
+            <w:r>
+              <w:rPr>
+                <w:noProof/>
+                <w:webHidden/>
+              </w:rPr>
+              <w:fldChar w:fldCharType="begin"/>
+            </w:r>
+            <w:r>
+              <w:rPr>
+                <w:noProof/>
+                <w:webHidden/>
+              </w:rPr>
+              <w:instrText xml:space="preserve"> PAGEREF _Toc243866091 \h </w:instrText>
+            </w:r>
+            <w:r>
+              <w:rPr>
+                <w:noProof/>
+                <w:webHidden/>
+              </w:rPr>
+            </w:r>
+            <w:r>
+              <w:rPr>
+                <w:noProof/>
+                <w:webHidden/>
+              </w:rPr>
+              <w:fldChar w:fldCharType="separate"/>
+            </w:r>
+            <w:r>
+              <w:rPr>
+                <w:noProof/>
+                <w:webHidden/>
+              </w:rPr>
+              <w:t>20</w:t>
+            </w:r>
+            <w:r>
+              <w:rPr>
+                <w:noProof/>
+                <w:webHidden/>
+              </w:rPr>
+              <w:fldChar w:fldCharType="end"/>
+            </w:r>
+          </w:hyperlink>
+        </w:p>
+        <w:p>
+          <w:pPr>
+            <w:pStyle w:val="TOC3"/>
+            <w:tabs>
+              <w:tab w:val="right" w:leader="dot" w:pos="9739"/>
+            </w:tabs>
+            <w:rPr>
+              <w:rFonts w:asciiTheme="minorHAnsi" w:hAnsiTheme="minorHAnsi" w:cstheme="minorBidi"/>
+              <w:noProof/>
+              <w:color w:val="auto"/>
+              <w:kern w:val="2"/>
+              <w:sz w:val="22"/>
+              <w:lang w:val="en-US"/>
+              <w14:ligatures w14:val="standardContextual"/>
+            </w:rPr>
+          </w:pPr>
+          <w:hyperlink w:anchor="_Toc243866092" w:history="1">
+            <w:r>
+              <w:rPr>
+                <w:rStyle w:val="Hyperlink"/>
+                <w:noProof/>
+              </w:rPr>
+              <w:t>Bước 2 Xem bảng điểm và ma trận</w:t>
+            </w:r>
+            <w:r>
+              <w:rPr>
+                <w:noProof/>
+                <w:webHidden/>
+              </w:rPr>
+              <w:tab/>
+            </w:r>
+            <w:r>
+              <w:rPr>
+                <w:noProof/>
+                <w:webHidden/>
+              </w:rPr>
+              <w:fldChar w:fldCharType="begin"/>
+            </w:r>
+            <w:r>
+              <w:rPr>
+                <w:noProof/>
+                <w:webHidden/>
+              </w:rPr>
+              <w:instrText xml:space="preserve"> PAGEREF _Toc243866092 \h </w:instrText>
+            </w:r>
+            <w:r>
+              <w:rPr>
+                <w:noProof/>
+                <w:webHidden/>
+              </w:rPr>
+            </w:r>
+            <w:r>
+              <w:rPr>
+                <w:noProof/>
+                <w:webHidden/>
+              </w:rPr>
+              <w:fldChar w:fldCharType="separate"/>
+            </w:r>
+            <w:r>
+              <w:rPr>
+                <w:noProof/>
+                <w:webHidden/>
+              </w:rPr>
+              <w:t>20</w:t>
+            </w:r>
+            <w:r>
+              <w:rPr>
+                <w:noProof/>
+                <w:webHidden/>
+              </w:rPr>
+              <w:fldChar w:fldCharType="end"/>
+            </w:r>
+          </w:hyperlink>
+        </w:p>
+        <w:p>
+          <w:pPr>
+            <w:pStyle w:val="TOC3"/>
+            <w:tabs>
+              <w:tab w:val="right" w:leader="dot" w:pos="9739"/>
+            </w:tabs>
+            <w:rPr>
+              <w:rFonts w:asciiTheme="minorHAnsi" w:hAnsiTheme="minorHAnsi" w:cstheme="minorBidi"/>
+              <w:noProof/>
+              <w:color w:val="auto"/>
+              <w:kern w:val="2"/>
+              <w:sz w:val="22"/>
+              <w:lang w:val="en-US"/>
+              <w14:ligatures w14:val="standardContextual"/>
+            </w:rPr>
+          </w:pPr>
+          <w:hyperlink w:anchor="_Toc243866093" w:history="1">
+            <w:r>
+              <w:rPr>
+                <w:rStyle w:val="Hyperlink"/>
+                <w:noProof/>
+              </w:rPr>
+              <w:t>Bước 3 Xem lại từng nước</w:t>
+            </w:r>
+            <w:r>
+              <w:rPr>
+                <w:noProof/>
+                <w:webHidden/>
+              </w:rPr>
+              <w:tab/>
+            </w:r>
+            <w:r>
+              <w:rPr>
+                <w:noProof/>
+                <w:webHidden/>
+              </w:rPr>
+              <w:fldChar w:fldCharType="begin"/>
+            </w:r>
+            <w:r>
+              <w:rPr>
+                <w:noProof/>
+                <w:webHidden/>
+              </w:rPr>
+              <w:instrText xml:space="preserve"> PAGEREF _Toc243866093 \h </w:instrText>
+            </w:r>
+            <w:r>
+              <w:rPr>
+                <w:noProof/>
+                <w:webHidden/>
+              </w:rPr>
+            </w:r>
+            <w:r>
+              <w:rPr>
+                <w:noProof/>
+                <w:webHidden/>
+              </w:rPr>
+              <w:fldChar w:fldCharType="separate"/>
+            </w:r>
+            <w:r>
+              <w:rPr>
+                <w:noProof/>
+                <w:webHidden/>
+              </w:rPr>
+              <w:t>21</w:t>
             </w:r>
             <w:r>
               <w:rPr>
@@ -1920,7 +2364,7 @@
               <w14:ligatures w14:val="standardContextual"/>
             </w:rPr>
           </w:pPr>
-          <w:hyperlink w:anchor="_Toc243860575" w:history="1">
+          <w:hyperlink w:anchor="_Toc243866094" w:history="1">
             <w:r>
               <w:rPr>
                 <w:rStyle w:val="Hyperlink"/>
@@ -1947,7 +2391,7 @@
                 <w:noProof/>
                 <w:webHidden/>
               </w:rPr>
-              <w:instrText xml:space="preserve"> PAGEREF _Toc243860575 \h </w:instrText>
+              <w:instrText xml:space="preserve"> PAGEREF _Toc243866094 \h </w:instrText>
             </w:r>
             <w:r>
               <w:rPr>
@@ -1967,7 +2411,895 @@
                 <w:noProof/>
                 <w:webHidden/>
               </w:rPr>
-              <w:t>21</w:t>
+              <w:t>22</w:t>
+            </w:r>
+            <w:r>
+              <w:rPr>
+                <w:noProof/>
+                <w:webHidden/>
+              </w:rPr>
+              <w:fldChar w:fldCharType="end"/>
+            </w:r>
+          </w:hyperlink>
+        </w:p>
+        <w:p>
+          <w:pPr>
+            <w:pStyle w:val="TOC3"/>
+            <w:tabs>
+              <w:tab w:val="right" w:leader="dot" w:pos="9739"/>
+            </w:tabs>
+            <w:rPr>
+              <w:rFonts w:asciiTheme="minorHAnsi" w:hAnsiTheme="minorHAnsi" w:cstheme="minorBidi"/>
+              <w:noProof/>
+              <w:color w:val="auto"/>
+              <w:kern w:val="2"/>
+              <w:sz w:val="22"/>
+              <w:lang w:val="en-US"/>
+              <w14:ligatures w14:val="standardContextual"/>
+            </w:rPr>
+          </w:pPr>
+          <w:hyperlink w:anchor="_Toc243866095" w:history="1">
+            <w:r>
+              <w:rPr>
+                <w:rStyle w:val="Hyperlink"/>
+                <w:noProof/>
+              </w:rPr>
+              <w:t>Bước 4 Đăng ký bằng email trường</w:t>
+            </w:r>
+            <w:r>
+              <w:rPr>
+                <w:noProof/>
+                <w:webHidden/>
+              </w:rPr>
+              <w:tab/>
+            </w:r>
+            <w:r>
+              <w:rPr>
+                <w:noProof/>
+                <w:webHidden/>
+              </w:rPr>
+              <w:fldChar w:fldCharType="begin"/>
+            </w:r>
+            <w:r>
+              <w:rPr>
+                <w:noProof/>
+                <w:webHidden/>
+              </w:rPr>
+              <w:instrText xml:space="preserve"> PAGEREF _Toc243866095 \h </w:instrText>
+            </w:r>
+            <w:r>
+              <w:rPr>
+                <w:noProof/>
+                <w:webHidden/>
+              </w:rPr>
+            </w:r>
+            <w:r>
+              <w:rPr>
+                <w:noProof/>
+                <w:webHidden/>
+              </w:rPr>
+              <w:fldChar w:fldCharType="separate"/>
+            </w:r>
+            <w:r>
+              <w:rPr>
+                <w:noProof/>
+                <w:webHidden/>
+              </w:rPr>
+              <w:t>22</w:t>
+            </w:r>
+            <w:r>
+              <w:rPr>
+                <w:noProof/>
+                <w:webHidden/>
+              </w:rPr>
+              <w:fldChar w:fldCharType="end"/>
+            </w:r>
+          </w:hyperlink>
+        </w:p>
+        <w:p>
+          <w:pPr>
+            <w:pStyle w:val="TOC3"/>
+            <w:tabs>
+              <w:tab w:val="right" w:leader="dot" w:pos="9739"/>
+            </w:tabs>
+            <w:rPr>
+              <w:rFonts w:asciiTheme="minorHAnsi" w:hAnsiTheme="minorHAnsi" w:cstheme="minorBidi"/>
+              <w:noProof/>
+              <w:color w:val="auto"/>
+              <w:kern w:val="2"/>
+              <w:sz w:val="22"/>
+              <w:lang w:val="en-US"/>
+              <w14:ligatures w14:val="standardContextual"/>
+            </w:rPr>
+          </w:pPr>
+          <w:hyperlink w:anchor="_Toc243866096" w:history="1">
+            <w:r>
+              <w:rPr>
+                <w:rStyle w:val="Hyperlink"/>
+                <w:noProof/>
+              </w:rPr>
+              <w:t>Bước 5 Xác minh email</w:t>
+            </w:r>
+            <w:r>
+              <w:rPr>
+                <w:noProof/>
+                <w:webHidden/>
+              </w:rPr>
+              <w:tab/>
+            </w:r>
+            <w:r>
+              <w:rPr>
+                <w:noProof/>
+                <w:webHidden/>
+              </w:rPr>
+              <w:fldChar w:fldCharType="begin"/>
+            </w:r>
+            <w:r>
+              <w:rPr>
+                <w:noProof/>
+                <w:webHidden/>
+              </w:rPr>
+              <w:instrText xml:space="preserve"> PAGEREF _Toc243866096 \h </w:instrText>
+            </w:r>
+            <w:r>
+              <w:rPr>
+                <w:noProof/>
+                <w:webHidden/>
+              </w:rPr>
+            </w:r>
+            <w:r>
+              <w:rPr>
+                <w:noProof/>
+                <w:webHidden/>
+              </w:rPr>
+              <w:fldChar w:fldCharType="separate"/>
+            </w:r>
+            <w:r>
+              <w:rPr>
+                <w:noProof/>
+                <w:webHidden/>
+              </w:rPr>
+              <w:t>22</w:t>
+            </w:r>
+            <w:r>
+              <w:rPr>
+                <w:noProof/>
+                <w:webHidden/>
+              </w:rPr>
+              <w:fldChar w:fldCharType="end"/>
+            </w:r>
+          </w:hyperlink>
+        </w:p>
+        <w:p>
+          <w:pPr>
+            <w:pStyle w:val="TOC3"/>
+            <w:tabs>
+              <w:tab w:val="right" w:leader="dot" w:pos="9739"/>
+            </w:tabs>
+            <w:rPr>
+              <w:rFonts w:asciiTheme="minorHAnsi" w:hAnsiTheme="minorHAnsi" w:cstheme="minorBidi"/>
+              <w:noProof/>
+              <w:color w:val="auto"/>
+              <w:kern w:val="2"/>
+              <w:sz w:val="22"/>
+              <w:lang w:val="en-US"/>
+              <w14:ligatures w14:val="standardContextual"/>
+            </w:rPr>
+          </w:pPr>
+          <w:hyperlink w:anchor="_Toc243866097" w:history="1">
+            <w:r>
+              <w:rPr>
+                <w:rStyle w:val="Hyperlink"/>
+                <w:noProof/>
+              </w:rPr>
+              <w:t>Bước 6 Đặt mật khẩu và đăng nhập</w:t>
+            </w:r>
+            <w:r>
+              <w:rPr>
+                <w:noProof/>
+                <w:webHidden/>
+              </w:rPr>
+              <w:tab/>
+            </w:r>
+            <w:r>
+              <w:rPr>
+                <w:noProof/>
+                <w:webHidden/>
+              </w:rPr>
+              <w:fldChar w:fldCharType="begin"/>
+            </w:r>
+            <w:r>
+              <w:rPr>
+                <w:noProof/>
+                <w:webHidden/>
+              </w:rPr>
+              <w:instrText xml:space="preserve"> PAGEREF _Toc243866097 \h </w:instrText>
+            </w:r>
+            <w:r>
+              <w:rPr>
+                <w:noProof/>
+                <w:webHidden/>
+              </w:rPr>
+            </w:r>
+            <w:r>
+              <w:rPr>
+                <w:noProof/>
+                <w:webHidden/>
+              </w:rPr>
+              <w:fldChar w:fldCharType="separate"/>
+            </w:r>
+            <w:r>
+              <w:rPr>
+                <w:noProof/>
+                <w:webHidden/>
+              </w:rPr>
+              <w:t>23</w:t>
+            </w:r>
+            <w:r>
+              <w:rPr>
+                <w:noProof/>
+                <w:webHidden/>
+              </w:rPr>
+              <w:fldChar w:fldCharType="end"/>
+            </w:r>
+          </w:hyperlink>
+        </w:p>
+        <w:p>
+          <w:pPr>
+            <w:pStyle w:val="TOC3"/>
+            <w:tabs>
+              <w:tab w:val="right" w:leader="dot" w:pos="9739"/>
+            </w:tabs>
+            <w:rPr>
+              <w:rFonts w:asciiTheme="minorHAnsi" w:hAnsiTheme="minorHAnsi" w:cstheme="minorBidi"/>
+              <w:noProof/>
+              <w:color w:val="auto"/>
+              <w:kern w:val="2"/>
+              <w:sz w:val="22"/>
+              <w:lang w:val="en-US"/>
+              <w14:ligatures w14:val="standardContextual"/>
+            </w:rPr>
+          </w:pPr>
+          <w:hyperlink w:anchor="_Toc243866098" w:history="1">
+            <w:r>
+              <w:rPr>
+                <w:rStyle w:val="Hyperlink"/>
+                <w:noProof/>
+              </w:rPr>
+              <w:t>Bước 7 Tạo đội</w:t>
+            </w:r>
+            <w:r>
+              <w:rPr>
+                <w:noProof/>
+                <w:webHidden/>
+              </w:rPr>
+              <w:tab/>
+            </w:r>
+            <w:r>
+              <w:rPr>
+                <w:noProof/>
+                <w:webHidden/>
+              </w:rPr>
+              <w:fldChar w:fldCharType="begin"/>
+            </w:r>
+            <w:r>
+              <w:rPr>
+                <w:noProof/>
+                <w:webHidden/>
+              </w:rPr>
+              <w:instrText xml:space="preserve"> PAGEREF _Toc243866098 \h </w:instrText>
+            </w:r>
+            <w:r>
+              <w:rPr>
+                <w:noProof/>
+                <w:webHidden/>
+              </w:rPr>
+            </w:r>
+            <w:r>
+              <w:rPr>
+                <w:noProof/>
+                <w:webHidden/>
+              </w:rPr>
+              <w:fldChar w:fldCharType="separate"/>
+            </w:r>
+            <w:r>
+              <w:rPr>
+                <w:noProof/>
+                <w:webHidden/>
+              </w:rPr>
+              <w:t>23</w:t>
+            </w:r>
+            <w:r>
+              <w:rPr>
+                <w:noProof/>
+                <w:webHidden/>
+              </w:rPr>
+              <w:fldChar w:fldCharType="end"/>
+            </w:r>
+          </w:hyperlink>
+        </w:p>
+        <w:p>
+          <w:pPr>
+            <w:pStyle w:val="TOC3"/>
+            <w:tabs>
+              <w:tab w:val="right" w:leader="dot" w:pos="9739"/>
+            </w:tabs>
+            <w:rPr>
+              <w:rFonts w:asciiTheme="minorHAnsi" w:hAnsiTheme="minorHAnsi" w:cstheme="minorBidi"/>
+              <w:noProof/>
+              <w:color w:val="auto"/>
+              <w:kern w:val="2"/>
+              <w:sz w:val="22"/>
+              <w:lang w:val="en-US"/>
+              <w14:ligatures w14:val="standardContextual"/>
+            </w:rPr>
+          </w:pPr>
+          <w:hyperlink w:anchor="_Toc243866099" w:history="1">
+            <w:r>
+              <w:rPr>
+                <w:rStyle w:val="Hyperlink"/>
+                <w:noProof/>
+              </w:rPr>
+              <w:t>Bước 8 Mời các thành viên</w:t>
+            </w:r>
+            <w:r>
+              <w:rPr>
+                <w:noProof/>
+                <w:webHidden/>
+              </w:rPr>
+              <w:tab/>
+            </w:r>
+            <w:r>
+              <w:rPr>
+                <w:noProof/>
+                <w:webHidden/>
+              </w:rPr>
+              <w:fldChar w:fldCharType="begin"/>
+            </w:r>
+            <w:r>
+              <w:rPr>
+                <w:noProof/>
+                <w:webHidden/>
+              </w:rPr>
+              <w:instrText xml:space="preserve"> PAGEREF _Toc243866099 \h </w:instrText>
+            </w:r>
+            <w:r>
+              <w:rPr>
+                <w:noProof/>
+                <w:webHidden/>
+              </w:rPr>
+            </w:r>
+            <w:r>
+              <w:rPr>
+                <w:noProof/>
+                <w:webHidden/>
+              </w:rPr>
+              <w:fldChar w:fldCharType="separate"/>
+            </w:r>
+            <w:r>
+              <w:rPr>
+                <w:noProof/>
+                <w:webHidden/>
+              </w:rPr>
+              <w:t>24</w:t>
+            </w:r>
+            <w:r>
+              <w:rPr>
+                <w:noProof/>
+                <w:webHidden/>
+              </w:rPr>
+              <w:fldChar w:fldCharType="end"/>
+            </w:r>
+          </w:hyperlink>
+        </w:p>
+        <w:p>
+          <w:pPr>
+            <w:pStyle w:val="TOC3"/>
+            <w:tabs>
+              <w:tab w:val="right" w:leader="dot" w:pos="9739"/>
+            </w:tabs>
+            <w:rPr>
+              <w:rFonts w:asciiTheme="minorHAnsi" w:hAnsiTheme="minorHAnsi" w:cstheme="minorBidi"/>
+              <w:noProof/>
+              <w:color w:val="auto"/>
+              <w:kern w:val="2"/>
+              <w:sz w:val="22"/>
+              <w:lang w:val="en-US"/>
+              <w14:ligatures w14:val="standardContextual"/>
+            </w:rPr>
+          </w:pPr>
+          <w:hyperlink w:anchor="_Toc243866100" w:history="1">
+            <w:r>
+              <w:rPr>
+                <w:rStyle w:val="Hyperlink"/>
+                <w:noProof/>
+              </w:rPr>
+              <w:t>Bước 9 Vào đội bằng mã mời</w:t>
+            </w:r>
+            <w:r>
+              <w:rPr>
+                <w:noProof/>
+                <w:webHidden/>
+              </w:rPr>
+              <w:tab/>
+            </w:r>
+            <w:r>
+              <w:rPr>
+                <w:noProof/>
+                <w:webHidden/>
+              </w:rPr>
+              <w:fldChar w:fldCharType="begin"/>
+            </w:r>
+            <w:r>
+              <w:rPr>
+                <w:noProof/>
+                <w:webHidden/>
+              </w:rPr>
+              <w:instrText xml:space="preserve"> PAGEREF _Toc243866100 \h </w:instrText>
+            </w:r>
+            <w:r>
+              <w:rPr>
+                <w:noProof/>
+                <w:webHidden/>
+              </w:rPr>
+            </w:r>
+            <w:r>
+              <w:rPr>
+                <w:noProof/>
+                <w:webHidden/>
+              </w:rPr>
+              <w:fldChar w:fldCharType="separate"/>
+            </w:r>
+            <w:r>
+              <w:rPr>
+                <w:noProof/>
+                <w:webHidden/>
+              </w:rPr>
+              <w:t>24</w:t>
+            </w:r>
+            <w:r>
+              <w:rPr>
+                <w:noProof/>
+                <w:webHidden/>
+              </w:rPr>
+              <w:fldChar w:fldCharType="end"/>
+            </w:r>
+          </w:hyperlink>
+        </w:p>
+        <w:p>
+          <w:pPr>
+            <w:pStyle w:val="TOC3"/>
+            <w:tabs>
+              <w:tab w:val="right" w:leader="dot" w:pos="9739"/>
+            </w:tabs>
+            <w:rPr>
+              <w:rFonts w:asciiTheme="minorHAnsi" w:hAnsiTheme="minorHAnsi" w:cstheme="minorBidi"/>
+              <w:noProof/>
+              <w:color w:val="auto"/>
+              <w:kern w:val="2"/>
+              <w:sz w:val="22"/>
+              <w:lang w:val="en-US"/>
+              <w14:ligatures w14:val="standardContextual"/>
+            </w:rPr>
+          </w:pPr>
+          <w:hyperlink w:anchor="_Toc243866101" w:history="1">
+            <w:r>
+              <w:rPr>
+                <w:rStyle w:val="Hyperlink"/>
+                <w:noProof/>
+              </w:rPr>
+              <w:t>Bước 10 Tạo repo từ mẫu</w:t>
+            </w:r>
+            <w:r>
+              <w:rPr>
+                <w:noProof/>
+                <w:webHidden/>
+              </w:rPr>
+              <w:tab/>
+            </w:r>
+            <w:r>
+              <w:rPr>
+                <w:noProof/>
+                <w:webHidden/>
+              </w:rPr>
+              <w:fldChar w:fldCharType="begin"/>
+            </w:r>
+            <w:r>
+              <w:rPr>
+                <w:noProof/>
+                <w:webHidden/>
+              </w:rPr>
+              <w:instrText xml:space="preserve"> PAGEREF _Toc243866101 \h </w:instrText>
+            </w:r>
+            <w:r>
+              <w:rPr>
+                <w:noProof/>
+                <w:webHidden/>
+              </w:rPr>
+            </w:r>
+            <w:r>
+              <w:rPr>
+                <w:noProof/>
+                <w:webHidden/>
+              </w:rPr>
+              <w:fldChar w:fldCharType="separate"/>
+            </w:r>
+            <w:r>
+              <w:rPr>
+                <w:noProof/>
+                <w:webHidden/>
+              </w:rPr>
+              <w:t>25</w:t>
+            </w:r>
+            <w:r>
+              <w:rPr>
+                <w:noProof/>
+                <w:webHidden/>
+              </w:rPr>
+              <w:fldChar w:fldCharType="end"/>
+            </w:r>
+          </w:hyperlink>
+        </w:p>
+        <w:p>
+          <w:pPr>
+            <w:pStyle w:val="TOC3"/>
+            <w:tabs>
+              <w:tab w:val="right" w:leader="dot" w:pos="9739"/>
+            </w:tabs>
+            <w:rPr>
+              <w:rFonts w:asciiTheme="minorHAnsi" w:hAnsiTheme="minorHAnsi" w:cstheme="minorBidi"/>
+              <w:noProof/>
+              <w:color w:val="auto"/>
+              <w:kern w:val="2"/>
+              <w:sz w:val="22"/>
+              <w:lang w:val="en-US"/>
+              <w14:ligatures w14:val="standardContextual"/>
+            </w:rPr>
+          </w:pPr>
+          <w:hyperlink w:anchor="_Toc243866102" w:history="1">
+            <w:r>
+              <w:rPr>
+                <w:rStyle w:val="Hyperlink"/>
+                <w:noProof/>
+              </w:rPr>
+              <w:t>Bước 11 Cho App truy cập đúng repo</w:t>
+            </w:r>
+            <w:r>
+              <w:rPr>
+                <w:noProof/>
+                <w:webHidden/>
+              </w:rPr>
+              <w:tab/>
+            </w:r>
+            <w:r>
+              <w:rPr>
+                <w:noProof/>
+                <w:webHidden/>
+              </w:rPr>
+              <w:fldChar w:fldCharType="begin"/>
+            </w:r>
+            <w:r>
+              <w:rPr>
+                <w:noProof/>
+                <w:webHidden/>
+              </w:rPr>
+              <w:instrText xml:space="preserve"> PAGEREF _Toc243866102 \h </w:instrText>
+            </w:r>
+            <w:r>
+              <w:rPr>
+                <w:noProof/>
+                <w:webHidden/>
+              </w:rPr>
+            </w:r>
+            <w:r>
+              <w:rPr>
+                <w:noProof/>
+                <w:webHidden/>
+              </w:rPr>
+              <w:fldChar w:fldCharType="separate"/>
+            </w:r>
+            <w:r>
+              <w:rPr>
+                <w:noProof/>
+                <w:webHidden/>
+              </w:rPr>
+              <w:t>25</w:t>
+            </w:r>
+            <w:r>
+              <w:rPr>
+                <w:noProof/>
+                <w:webHidden/>
+              </w:rPr>
+              <w:fldChar w:fldCharType="end"/>
+            </w:r>
+          </w:hyperlink>
+        </w:p>
+        <w:p>
+          <w:pPr>
+            <w:pStyle w:val="TOC3"/>
+            <w:tabs>
+              <w:tab w:val="right" w:leader="dot" w:pos="9739"/>
+            </w:tabs>
+            <w:rPr>
+              <w:rFonts w:asciiTheme="minorHAnsi" w:hAnsiTheme="minorHAnsi" w:cstheme="minorBidi"/>
+              <w:noProof/>
+              <w:color w:val="auto"/>
+              <w:kern w:val="2"/>
+              <w:sz w:val="22"/>
+              <w:lang w:val="en-US"/>
+              <w14:ligatures w14:val="standardContextual"/>
+            </w:rPr>
+          </w:pPr>
+          <w:hyperlink w:anchor="_Toc243866103" w:history="1">
+            <w:r>
+              <w:rPr>
+                <w:rStyle w:val="Hyperlink"/>
+                <w:noProof/>
+              </w:rPr>
+              <w:t>Bước 12 Gắn link repo với đội</w:t>
+            </w:r>
+            <w:r>
+              <w:rPr>
+                <w:noProof/>
+                <w:webHidden/>
+              </w:rPr>
+              <w:tab/>
+            </w:r>
+            <w:r>
+              <w:rPr>
+                <w:noProof/>
+                <w:webHidden/>
+              </w:rPr>
+              <w:fldChar w:fldCharType="begin"/>
+            </w:r>
+            <w:r>
+              <w:rPr>
+                <w:noProof/>
+                <w:webHidden/>
+              </w:rPr>
+              <w:instrText xml:space="preserve"> PAGEREF _Toc243866103 \h </w:instrText>
+            </w:r>
+            <w:r>
+              <w:rPr>
+                <w:noProof/>
+                <w:webHidden/>
+              </w:rPr>
+            </w:r>
+            <w:r>
+              <w:rPr>
+                <w:noProof/>
+                <w:webHidden/>
+              </w:rPr>
+              <w:fldChar w:fldCharType="separate"/>
+            </w:r>
+            <w:r>
+              <w:rPr>
+                <w:noProof/>
+                <w:webHidden/>
+              </w:rPr>
+              <w:t>26</w:t>
+            </w:r>
+            <w:r>
+              <w:rPr>
+                <w:noProof/>
+                <w:webHidden/>
+              </w:rPr>
+              <w:fldChar w:fldCharType="end"/>
+            </w:r>
+          </w:hyperlink>
+        </w:p>
+        <w:p>
+          <w:pPr>
+            <w:pStyle w:val="TOC3"/>
+            <w:tabs>
+              <w:tab w:val="right" w:leader="dot" w:pos="9739"/>
+            </w:tabs>
+            <w:rPr>
+              <w:rFonts w:asciiTheme="minorHAnsi" w:hAnsiTheme="minorHAnsi" w:cstheme="minorBidi"/>
+              <w:noProof/>
+              <w:color w:val="auto"/>
+              <w:kern w:val="2"/>
+              <w:sz w:val="22"/>
+              <w:lang w:val="en-US"/>
+              <w14:ligatures w14:val="standardContextual"/>
+            </w:rPr>
+          </w:pPr>
+          <w:hyperlink w:anchor="_Toc243866104" w:history="1">
+            <w:r>
+              <w:rPr>
+                <w:rStyle w:val="Hyperlink"/>
+                <w:noProof/>
+              </w:rPr>
+              <w:t>Bước 13 Theo dõi kiểm tra 72 mẫu</w:t>
+            </w:r>
+            <w:r>
+              <w:rPr>
+                <w:noProof/>
+                <w:webHidden/>
+              </w:rPr>
+              <w:tab/>
+            </w:r>
+            <w:r>
+              <w:rPr>
+                <w:noProof/>
+                <w:webHidden/>
+              </w:rPr>
+              <w:fldChar w:fldCharType="begin"/>
+            </w:r>
+            <w:r>
+              <w:rPr>
+                <w:noProof/>
+                <w:webHidden/>
+              </w:rPr>
+              <w:instrText xml:space="preserve"> PAGEREF _Toc243866104 \h </w:instrText>
+            </w:r>
+            <w:r>
+              <w:rPr>
+                <w:noProof/>
+                <w:webHidden/>
+              </w:rPr>
+            </w:r>
+            <w:r>
+              <w:rPr>
+                <w:noProof/>
+                <w:webHidden/>
+              </w:rPr>
+              <w:fldChar w:fldCharType="separate"/>
+            </w:r>
+            <w:r>
+              <w:rPr>
+                <w:noProof/>
+                <w:webHidden/>
+              </w:rPr>
+              <w:t>26</w:t>
+            </w:r>
+            <w:r>
+              <w:rPr>
+                <w:noProof/>
+                <w:webHidden/>
+              </w:rPr>
+              <w:fldChar w:fldCharType="end"/>
+            </w:r>
+          </w:hyperlink>
+        </w:p>
+        <w:p>
+          <w:pPr>
+            <w:pStyle w:val="TOC3"/>
+            <w:tabs>
+              <w:tab w:val="right" w:leader="dot" w:pos="9739"/>
+            </w:tabs>
+            <w:rPr>
+              <w:rFonts w:asciiTheme="minorHAnsi" w:hAnsiTheme="minorHAnsi" w:cstheme="minorBidi"/>
+              <w:noProof/>
+              <w:color w:val="auto"/>
+              <w:kern w:val="2"/>
+              <w:sz w:val="22"/>
+              <w:lang w:val="en-US"/>
+              <w14:ligatures w14:val="standardContextual"/>
+            </w:rPr>
+          </w:pPr>
+          <w:hyperlink w:anchor="_Toc243866105" w:history="1">
+            <w:r>
+              <w:rPr>
+                <w:rStyle w:val="Hyperlink"/>
+                <w:noProof/>
+              </w:rPr>
+              <w:t>Bước 14 Xem giải của đội</w:t>
+            </w:r>
+            <w:r>
+              <w:rPr>
+                <w:noProof/>
+                <w:webHidden/>
+              </w:rPr>
+              <w:tab/>
+            </w:r>
+            <w:r>
+              <w:rPr>
+                <w:noProof/>
+                <w:webHidden/>
+              </w:rPr>
+              <w:fldChar w:fldCharType="begin"/>
+            </w:r>
+            <w:r>
+              <w:rPr>
+                <w:noProof/>
+                <w:webHidden/>
+              </w:rPr>
+              <w:instrText xml:space="preserve"> PAGEREF _Toc243866105 \h </w:instrText>
+            </w:r>
+            <w:r>
+              <w:rPr>
+                <w:noProof/>
+                <w:webHidden/>
+              </w:rPr>
+            </w:r>
+            <w:r>
+              <w:rPr>
+                <w:noProof/>
+                <w:webHidden/>
+              </w:rPr>
+              <w:fldChar w:fldCharType="separate"/>
+            </w:r>
+            <w:r>
+              <w:rPr>
+                <w:noProof/>
+                <w:webHidden/>
+              </w:rPr>
+              <w:t>27</w:t>
+            </w:r>
+            <w:r>
+              <w:rPr>
+                <w:noProof/>
+                <w:webHidden/>
+              </w:rPr>
+              <w:fldChar w:fldCharType="end"/>
+            </w:r>
+          </w:hyperlink>
+        </w:p>
+        <w:p>
+          <w:pPr>
+            <w:pStyle w:val="TOC3"/>
+            <w:tabs>
+              <w:tab w:val="right" w:leader="dot" w:pos="9739"/>
+            </w:tabs>
+            <w:rPr>
+              <w:rFonts w:asciiTheme="minorHAnsi" w:hAnsiTheme="minorHAnsi" w:cstheme="minorBidi"/>
+              <w:noProof/>
+              <w:color w:val="auto"/>
+              <w:kern w:val="2"/>
+              <w:sz w:val="22"/>
+              <w:lang w:val="en-US"/>
+              <w14:ligatures w14:val="standardContextual"/>
+            </w:rPr>
+          </w:pPr>
+          <w:hyperlink w:anchor="_Toc243866106" w:history="1">
+            <w:r>
+              <w:rPr>
+                <w:rStyle w:val="Hyperlink"/>
+                <w:noProof/>
+              </w:rPr>
+              <w:t>Bước 15 Luyện tập với bot mẫu</w:t>
+            </w:r>
+            <w:r>
+              <w:rPr>
+                <w:noProof/>
+                <w:webHidden/>
+              </w:rPr>
+              <w:tab/>
+            </w:r>
+            <w:r>
+              <w:rPr>
+                <w:noProof/>
+                <w:webHidden/>
+              </w:rPr>
+              <w:fldChar w:fldCharType="begin"/>
+            </w:r>
+            <w:r>
+              <w:rPr>
+                <w:noProof/>
+                <w:webHidden/>
+              </w:rPr>
+              <w:instrText xml:space="preserve"> PAGEREF _Toc243866106 \h </w:instrText>
+            </w:r>
+            <w:r>
+              <w:rPr>
+                <w:noProof/>
+                <w:webHidden/>
+              </w:rPr>
+            </w:r>
+            <w:r>
+              <w:rPr>
+                <w:noProof/>
+                <w:webHidden/>
+              </w:rPr>
+              <w:fldChar w:fldCharType="separate"/>
+            </w:r>
+            <w:r>
+              <w:rPr>
+                <w:noProof/>
+                <w:webHidden/>
+              </w:rPr>
+              <w:t>27</w:t>
             </w:r>
             <w:r>
               <w:rPr>
@@ -1994,7 +3326,7 @@
               <w14:ligatures w14:val="standardContextual"/>
             </w:rPr>
           </w:pPr>
-          <w:hyperlink w:anchor="_Toc243860576" w:history="1">
+          <w:hyperlink w:anchor="_Toc243866107" w:history="1">
             <w:r>
               <w:rPr>
                 <w:rStyle w:val="Hyperlink"/>
@@ -2021,7 +3353,7 @@
                 <w:noProof/>
                 <w:webHidden/>
               </w:rPr>
-              <w:instrText xml:space="preserve"> PAGEREF _Toc243860576 \h </w:instrText>
+              <w:instrText xml:space="preserve"> PAGEREF _Toc243866107 \h </w:instrText>
             </w:r>
             <w:r>
               <w:rPr>
@@ -2041,7 +3373,525 @@
                 <w:noProof/>
                 <w:webHidden/>
               </w:rPr>
-              <w:t>27</w:t>
+              <w:t>28</w:t>
+            </w:r>
+            <w:r>
+              <w:rPr>
+                <w:noProof/>
+                <w:webHidden/>
+              </w:rPr>
+              <w:fldChar w:fldCharType="end"/>
+            </w:r>
+          </w:hyperlink>
+        </w:p>
+        <w:p>
+          <w:pPr>
+            <w:pStyle w:val="TOC3"/>
+            <w:tabs>
+              <w:tab w:val="right" w:leader="dot" w:pos="9739"/>
+            </w:tabs>
+            <w:rPr>
+              <w:rFonts w:asciiTheme="minorHAnsi" w:hAnsiTheme="minorHAnsi" w:cstheme="minorBidi"/>
+              <w:noProof/>
+              <w:color w:val="auto"/>
+              <w:kern w:val="2"/>
+              <w:sz w:val="22"/>
+              <w:lang w:val="en-US"/>
+              <w14:ligatures w14:val="standardContextual"/>
+            </w:rPr>
+          </w:pPr>
+          <w:hyperlink w:anchor="_Toc243866108" w:history="1">
+            <w:r>
+              <w:rPr>
+                <w:rStyle w:val="Hyperlink"/>
+                <w:noProof/>
+              </w:rPr>
+              <w:t>Bước 16 Xem tổng quan ban tổ chức</w:t>
+            </w:r>
+            <w:r>
+              <w:rPr>
+                <w:noProof/>
+                <w:webHidden/>
+              </w:rPr>
+              <w:tab/>
+            </w:r>
+            <w:r>
+              <w:rPr>
+                <w:noProof/>
+                <w:webHidden/>
+              </w:rPr>
+              <w:fldChar w:fldCharType="begin"/>
+            </w:r>
+            <w:r>
+              <w:rPr>
+                <w:noProof/>
+                <w:webHidden/>
+              </w:rPr>
+              <w:instrText xml:space="preserve"> PAGEREF _Toc243866108 \h </w:instrText>
+            </w:r>
+            <w:r>
+              <w:rPr>
+                <w:noProof/>
+                <w:webHidden/>
+              </w:rPr>
+            </w:r>
+            <w:r>
+              <w:rPr>
+                <w:noProof/>
+                <w:webHidden/>
+              </w:rPr>
+              <w:fldChar w:fldCharType="separate"/>
+            </w:r>
+            <w:r>
+              <w:rPr>
+                <w:noProof/>
+                <w:webHidden/>
+              </w:rPr>
+              <w:t>28</w:t>
+            </w:r>
+            <w:r>
+              <w:rPr>
+                <w:noProof/>
+                <w:webHidden/>
+              </w:rPr>
+              <w:fldChar w:fldCharType="end"/>
+            </w:r>
+          </w:hyperlink>
+        </w:p>
+        <w:p>
+          <w:pPr>
+            <w:pStyle w:val="TOC3"/>
+            <w:tabs>
+              <w:tab w:val="right" w:leader="dot" w:pos="9739"/>
+            </w:tabs>
+            <w:rPr>
+              <w:rFonts w:asciiTheme="minorHAnsi" w:hAnsiTheme="minorHAnsi" w:cstheme="minorBidi"/>
+              <w:noProof/>
+              <w:color w:val="auto"/>
+              <w:kern w:val="2"/>
+              <w:sz w:val="22"/>
+              <w:lang w:val="en-US"/>
+              <w14:ligatures w14:val="standardContextual"/>
+            </w:rPr>
+          </w:pPr>
+          <w:hyperlink w:anchor="_Toc243866109" w:history="1">
+            <w:r>
+              <w:rPr>
+                <w:rStyle w:val="Hyperlink"/>
+                <w:noProof/>
+              </w:rPr>
+              <w:t>Bước 17 Chọn giải ở Tổng quan</w:t>
+            </w:r>
+            <w:r>
+              <w:rPr>
+                <w:noProof/>
+                <w:webHidden/>
+              </w:rPr>
+              <w:tab/>
+            </w:r>
+            <w:r>
+              <w:rPr>
+                <w:noProof/>
+                <w:webHidden/>
+              </w:rPr>
+              <w:fldChar w:fldCharType="begin"/>
+            </w:r>
+            <w:r>
+              <w:rPr>
+                <w:noProof/>
+                <w:webHidden/>
+              </w:rPr>
+              <w:instrText xml:space="preserve"> PAGEREF _Toc243866109 \h </w:instrText>
+            </w:r>
+            <w:r>
+              <w:rPr>
+                <w:noProof/>
+                <w:webHidden/>
+              </w:rPr>
+            </w:r>
+            <w:r>
+              <w:rPr>
+                <w:noProof/>
+                <w:webHidden/>
+              </w:rPr>
+              <w:fldChar w:fldCharType="separate"/>
+            </w:r>
+            <w:r>
+              <w:rPr>
+                <w:noProof/>
+                <w:webHidden/>
+              </w:rPr>
+              <w:t>29</w:t>
+            </w:r>
+            <w:r>
+              <w:rPr>
+                <w:noProof/>
+                <w:webHidden/>
+              </w:rPr>
+              <w:fldChar w:fldCharType="end"/>
+            </w:r>
+          </w:hyperlink>
+        </w:p>
+        <w:p>
+          <w:pPr>
+            <w:pStyle w:val="TOC3"/>
+            <w:tabs>
+              <w:tab w:val="right" w:leader="dot" w:pos="9739"/>
+            </w:tabs>
+            <w:rPr>
+              <w:rFonts w:asciiTheme="minorHAnsi" w:hAnsiTheme="minorHAnsi" w:cstheme="minorBidi"/>
+              <w:noProof/>
+              <w:color w:val="auto"/>
+              <w:kern w:val="2"/>
+              <w:sz w:val="22"/>
+              <w:lang w:val="en-US"/>
+              <w14:ligatures w14:val="standardContextual"/>
+            </w:rPr>
+          </w:pPr>
+          <w:hyperlink w:anchor="_Toc243866110" w:history="1">
+            <w:r>
+              <w:rPr>
+                <w:rStyle w:val="Hyperlink"/>
+                <w:noProof/>
+              </w:rPr>
+              <w:t>Bước 18 Chuẩn bị giải mới</w:t>
+            </w:r>
+            <w:r>
+              <w:rPr>
+                <w:noProof/>
+                <w:webHidden/>
+              </w:rPr>
+              <w:tab/>
+            </w:r>
+            <w:r>
+              <w:rPr>
+                <w:noProof/>
+                <w:webHidden/>
+              </w:rPr>
+              <w:fldChar w:fldCharType="begin"/>
+            </w:r>
+            <w:r>
+              <w:rPr>
+                <w:noProof/>
+                <w:webHidden/>
+              </w:rPr>
+              <w:instrText xml:space="preserve"> PAGEREF _Toc243866110 \h </w:instrText>
+            </w:r>
+            <w:r>
+              <w:rPr>
+                <w:noProof/>
+                <w:webHidden/>
+              </w:rPr>
+            </w:r>
+            <w:r>
+              <w:rPr>
+                <w:noProof/>
+                <w:webHidden/>
+              </w:rPr>
+              <w:fldChar w:fldCharType="separate"/>
+            </w:r>
+            <w:r>
+              <w:rPr>
+                <w:noProof/>
+                <w:webHidden/>
+              </w:rPr>
+              <w:t>30</w:t>
+            </w:r>
+            <w:r>
+              <w:rPr>
+                <w:noProof/>
+                <w:webHidden/>
+              </w:rPr>
+              <w:fldChar w:fldCharType="end"/>
+            </w:r>
+          </w:hyperlink>
+        </w:p>
+        <w:p>
+          <w:pPr>
+            <w:pStyle w:val="TOC3"/>
+            <w:tabs>
+              <w:tab w:val="right" w:leader="dot" w:pos="9739"/>
+            </w:tabs>
+            <w:rPr>
+              <w:rFonts w:asciiTheme="minorHAnsi" w:hAnsiTheme="minorHAnsi" w:cstheme="minorBidi"/>
+              <w:noProof/>
+              <w:color w:val="auto"/>
+              <w:kern w:val="2"/>
+              <w:sz w:val="22"/>
+              <w:lang w:val="en-US"/>
+              <w14:ligatures w14:val="standardContextual"/>
+            </w:rPr>
+          </w:pPr>
+          <w:hyperlink w:anchor="_Toc243866111" w:history="1">
+            <w:r>
+              <w:rPr>
+                <w:rStyle w:val="Hyperlink"/>
+                <w:noProof/>
+              </w:rPr>
+              <w:t>Bước 19 Cài máy chấm Windows hoặc Linux</w:t>
+            </w:r>
+            <w:r>
+              <w:rPr>
+                <w:noProof/>
+                <w:webHidden/>
+              </w:rPr>
+              <w:tab/>
+            </w:r>
+            <w:r>
+              <w:rPr>
+                <w:noProof/>
+                <w:webHidden/>
+              </w:rPr>
+              <w:fldChar w:fldCharType="begin"/>
+            </w:r>
+            <w:r>
+              <w:rPr>
+                <w:noProof/>
+                <w:webHidden/>
+              </w:rPr>
+              <w:instrText xml:space="preserve"> PAGEREF _Toc243866111 \h </w:instrText>
+            </w:r>
+            <w:r>
+              <w:rPr>
+                <w:noProof/>
+                <w:webHidden/>
+              </w:rPr>
+            </w:r>
+            <w:r>
+              <w:rPr>
+                <w:noProof/>
+                <w:webHidden/>
+              </w:rPr>
+              <w:fldChar w:fldCharType="separate"/>
+            </w:r>
+            <w:r>
+              <w:rPr>
+                <w:noProof/>
+                <w:webHidden/>
+              </w:rPr>
+              <w:t>30</w:t>
+            </w:r>
+            <w:r>
+              <w:rPr>
+                <w:noProof/>
+                <w:webHidden/>
+              </w:rPr>
+              <w:fldChar w:fldCharType="end"/>
+            </w:r>
+          </w:hyperlink>
+        </w:p>
+        <w:p>
+          <w:pPr>
+            <w:pStyle w:val="TOC3"/>
+            <w:tabs>
+              <w:tab w:val="right" w:leader="dot" w:pos="9739"/>
+            </w:tabs>
+            <w:rPr>
+              <w:rFonts w:asciiTheme="minorHAnsi" w:hAnsiTheme="minorHAnsi" w:cstheme="minorBidi"/>
+              <w:noProof/>
+              <w:color w:val="auto"/>
+              <w:kern w:val="2"/>
+              <w:sz w:val="22"/>
+              <w:lang w:val="en-US"/>
+              <w14:ligatures w14:val="standardContextual"/>
+            </w:rPr>
+          </w:pPr>
+          <w:hyperlink w:anchor="_Toc243866112" w:history="1">
+            <w:r>
+              <w:rPr>
+                <w:rStyle w:val="Hyperlink"/>
+                <w:noProof/>
+              </w:rPr>
+              <w:t>Bước 20 Kiểm tình trạng chấm và hàng đợi</w:t>
+            </w:r>
+            <w:r>
+              <w:rPr>
+                <w:noProof/>
+                <w:webHidden/>
+              </w:rPr>
+              <w:tab/>
+            </w:r>
+            <w:r>
+              <w:rPr>
+                <w:noProof/>
+                <w:webHidden/>
+              </w:rPr>
+              <w:fldChar w:fldCharType="begin"/>
+            </w:r>
+            <w:r>
+              <w:rPr>
+                <w:noProof/>
+                <w:webHidden/>
+              </w:rPr>
+              <w:instrText xml:space="preserve"> PAGEREF _Toc243866112 \h </w:instrText>
+            </w:r>
+            <w:r>
+              <w:rPr>
+                <w:noProof/>
+                <w:webHidden/>
+              </w:rPr>
+            </w:r>
+            <w:r>
+              <w:rPr>
+                <w:noProof/>
+                <w:webHidden/>
+              </w:rPr>
+              <w:fldChar w:fldCharType="separate"/>
+            </w:r>
+            <w:r>
+              <w:rPr>
+                <w:noProof/>
+                <w:webHidden/>
+              </w:rPr>
+              <w:t>31</w:t>
+            </w:r>
+            <w:r>
+              <w:rPr>
+                <w:noProof/>
+                <w:webHidden/>
+              </w:rPr>
+              <w:fldChar w:fldCharType="end"/>
+            </w:r>
+          </w:hyperlink>
+        </w:p>
+        <w:p>
+          <w:pPr>
+            <w:pStyle w:val="TOC3"/>
+            <w:tabs>
+              <w:tab w:val="right" w:leader="dot" w:pos="9739"/>
+            </w:tabs>
+            <w:rPr>
+              <w:rFonts w:asciiTheme="minorHAnsi" w:hAnsiTheme="minorHAnsi" w:cstheme="minorBidi"/>
+              <w:noProof/>
+              <w:color w:val="auto"/>
+              <w:kern w:val="2"/>
+              <w:sz w:val="22"/>
+              <w:lang w:val="en-US"/>
+              <w14:ligatures w14:val="standardContextual"/>
+            </w:rPr>
+          </w:pPr>
+          <w:hyperlink w:anchor="_Toc243866113" w:history="1">
+            <w:r>
+              <w:rPr>
+                <w:rStyle w:val="Hyperlink"/>
+                <w:noProof/>
+              </w:rPr>
+              <w:t>Bước 21 Soạn thông báo</w:t>
+            </w:r>
+            <w:r>
+              <w:rPr>
+                <w:noProof/>
+                <w:webHidden/>
+              </w:rPr>
+              <w:tab/>
+            </w:r>
+            <w:r>
+              <w:rPr>
+                <w:noProof/>
+                <w:webHidden/>
+              </w:rPr>
+              <w:fldChar w:fldCharType="begin"/>
+            </w:r>
+            <w:r>
+              <w:rPr>
+                <w:noProof/>
+                <w:webHidden/>
+              </w:rPr>
+              <w:instrText xml:space="preserve"> PAGEREF _Toc243866113 \h </w:instrText>
+            </w:r>
+            <w:r>
+              <w:rPr>
+                <w:noProof/>
+                <w:webHidden/>
+              </w:rPr>
+            </w:r>
+            <w:r>
+              <w:rPr>
+                <w:noProof/>
+                <w:webHidden/>
+              </w:rPr>
+              <w:fldChar w:fldCharType="separate"/>
+            </w:r>
+            <w:r>
+              <w:rPr>
+                <w:noProof/>
+                <w:webHidden/>
+              </w:rPr>
+              <w:t>31</w:t>
+            </w:r>
+            <w:r>
+              <w:rPr>
+                <w:noProof/>
+                <w:webHidden/>
+              </w:rPr>
+              <w:fldChar w:fldCharType="end"/>
+            </w:r>
+          </w:hyperlink>
+        </w:p>
+        <w:p>
+          <w:pPr>
+            <w:pStyle w:val="TOC3"/>
+            <w:tabs>
+              <w:tab w:val="right" w:leader="dot" w:pos="9739"/>
+            </w:tabs>
+            <w:rPr>
+              <w:rFonts w:asciiTheme="minorHAnsi" w:hAnsiTheme="minorHAnsi" w:cstheme="minorBidi"/>
+              <w:noProof/>
+              <w:color w:val="auto"/>
+              <w:kern w:val="2"/>
+              <w:sz w:val="22"/>
+              <w:lang w:val="en-US"/>
+              <w14:ligatures w14:val="standardContextual"/>
+            </w:rPr>
+          </w:pPr>
+          <w:hyperlink w:anchor="_Toc243866114" w:history="1">
+            <w:r>
+              <w:rPr>
+                <w:rStyle w:val="Hyperlink"/>
+                <w:noProof/>
+              </w:rPr>
+              <w:t>Bước 22 Xuất bảng điểm CSV</w:t>
+            </w:r>
+            <w:r>
+              <w:rPr>
+                <w:noProof/>
+                <w:webHidden/>
+              </w:rPr>
+              <w:tab/>
+            </w:r>
+            <w:r>
+              <w:rPr>
+                <w:noProof/>
+                <w:webHidden/>
+              </w:rPr>
+              <w:fldChar w:fldCharType="begin"/>
+            </w:r>
+            <w:r>
+              <w:rPr>
+                <w:noProof/>
+                <w:webHidden/>
+              </w:rPr>
+              <w:instrText xml:space="preserve"> PAGEREF _Toc243866114 \h </w:instrText>
+            </w:r>
+            <w:r>
+              <w:rPr>
+                <w:noProof/>
+                <w:webHidden/>
+              </w:rPr>
+            </w:r>
+            <w:r>
+              <w:rPr>
+                <w:noProof/>
+                <w:webHidden/>
+              </w:rPr>
+              <w:fldChar w:fldCharType="separate"/>
+            </w:r>
+            <w:r>
+              <w:rPr>
+                <w:noProof/>
+                <w:webHidden/>
+              </w:rPr>
+              <w:t>32</w:t>
             </w:r>
             <w:r>
               <w:rPr>
@@ -2065,7 +3915,7 @@
         <w:pageBreakBefore/>
       </w:pPr>
       <w:bookmarkStart w:id="0" w:name="mở-đầu"/>
-      <w:bookmarkStart w:id="1" w:name="_Toc243860553"/>
+      <w:bookmarkStart w:id="1" w:name="_Toc243866066"/>
       <w:r>
         <w:lastRenderedPageBreak/>
         <w:t>Mở đầu</w:t>
@@ -2131,7 +3981,7 @@
           <w:noProof/>
         </w:rPr>
         <w:drawing>
-          <wp:inline distT="0" distB="0" distL="0" distR="0" wp14:anchorId="04F332DB" wp14:editId="00F29E7B">
+          <wp:inline distT="0" distB="0" distL="0" distR="0" wp14:anchorId="1A50B8E7" wp14:editId="25D23995">
             <wp:extent cx="5759999" cy="4391052"/>
             <wp:effectExtent l="0" t="0" r="0" b="0"/>
             <wp:docPr id="19" name="Picture" descr="Hình 1 Trang chủ công khai với hai giải demo đã hoàn tất"/>
@@ -2220,7 +4070,7 @@
         <w:pageBreakBefore/>
       </w:pPr>
       <w:bookmarkStart w:id="2" w:name="phần-a-giải-đấu"/>
-      <w:bookmarkStart w:id="3" w:name="_Toc243860554"/>
+      <w:bookmarkStart w:id="3" w:name="_Toc243866067"/>
       <w:bookmarkEnd w:id="0"/>
       <w:r>
         <w:lastRenderedPageBreak/>
@@ -2233,7 +4083,7 @@
         <w:pStyle w:val="Heading2"/>
       </w:pPr>
       <w:bookmarkStart w:id="4" w:name="a1-trò-chơi-ottv2"/>
-      <w:bookmarkStart w:id="5" w:name="_Toc243860555"/>
+      <w:bookmarkStart w:id="5" w:name="_Toc243866068"/>
       <w:r>
         <w:t>A1 Trò chơi OTTv2</w:t>
       </w:r>
@@ -2492,7 +4342,7 @@
         <w:pStyle w:val="Heading2"/>
       </w:pPr>
       <w:bookmarkStart w:id="6" w:name="a2-tài-khoản-và-đội"/>
-      <w:bookmarkStart w:id="7" w:name="_Toc243860556"/>
+      <w:bookmarkStart w:id="7" w:name="_Toc243866069"/>
       <w:bookmarkEnd w:id="4"/>
       <w:r>
         <w:t>A2 Tài khoản và đội</w:t>
@@ -2786,7 +4636,7 @@
         <w:pStyle w:val="Heading2"/>
       </w:pPr>
       <w:bookmarkStart w:id="8" w:name="a3-nộp-bot-qua-github"/>
-      <w:bookmarkStart w:id="9" w:name="_Toc243860557"/>
+      <w:bookmarkStart w:id="9" w:name="_Toc243866070"/>
       <w:bookmarkEnd w:id="6"/>
       <w:r>
         <w:t>A3 Nộp bot qua GitHub</w:t>
@@ -3189,7 +5039,7 @@
         <w:pStyle w:val="Heading2"/>
       </w:pPr>
       <w:bookmarkStart w:id="10" w:name="a4-thể-lệ-và-lịch-đấu"/>
-      <w:bookmarkStart w:id="11" w:name="_Toc243860558"/>
+      <w:bookmarkStart w:id="11" w:name="_Toc243866071"/>
       <w:bookmarkEnd w:id="8"/>
       <w:r>
         <w:t>A4 Thể lệ và lịch đấu</w:t>
@@ -3201,9 +5051,11 @@
         <w:pStyle w:val="Heading3"/>
       </w:pPr>
       <w:bookmarkStart w:id="12" w:name="ladder-trước-hạn"/>
+      <w:bookmarkStart w:id="13" w:name="_Toc243866072"/>
       <w:r>
         <w:t>Ladder trước hạn</w:t>
       </w:r>
+      <w:bookmarkEnd w:id="13"/>
     </w:p>
     <w:p>
       <w:r>
@@ -3248,11 +5100,13 @@
       <w:pPr>
         <w:pStyle w:val="Heading3"/>
       </w:pPr>
-      <w:bookmarkStart w:id="13" w:name="chốt-bài-tại-hạn"/>
+      <w:bookmarkStart w:id="14" w:name="chốt-bài-tại-hạn"/>
+      <w:bookmarkStart w:id="15" w:name="_Toc243866073"/>
       <w:bookmarkEnd w:id="12"/>
       <w:r>
         <w:t>Chốt bài tại hạn</w:t>
       </w:r>
+      <w:bookmarkEnd w:id="15"/>
     </w:p>
     <w:p>
       <w:r>
@@ -3271,12 +5125,14 @@
       <w:pPr>
         <w:pStyle w:val="Heading3"/>
       </w:pPr>
-      <w:bookmarkStart w:id="14" w:name="xếp-hạng-chính-thức"/>
-      <w:bookmarkEnd w:id="13"/>
+      <w:bookmarkStart w:id="16" w:name="xếp-hạng-chính-thức"/>
+      <w:bookmarkStart w:id="17" w:name="_Toc243866074"/>
+      <w:bookmarkEnd w:id="14"/>
       <w:r>
         <w:lastRenderedPageBreak/>
         <w:t>Xếp hạng chính thức</w:t>
       </w:r>
+      <w:bookmarkEnd w:id="17"/>
     </w:p>
     <w:tbl>
       <w:tblPr>
@@ -3593,14 +5449,14 @@
       <w:pPr>
         <w:pStyle w:val="Heading2"/>
       </w:pPr>
-      <w:bookmarkStart w:id="15" w:name="a5-xem-kết-quả"/>
-      <w:bookmarkStart w:id="16" w:name="_Toc243860559"/>
-      <w:bookmarkEnd w:id="14"/>
+      <w:bookmarkStart w:id="18" w:name="a5-xem-kết-quả"/>
+      <w:bookmarkStart w:id="19" w:name="_Toc243866075"/>
+      <w:bookmarkEnd w:id="16"/>
       <w:bookmarkEnd w:id="10"/>
       <w:r>
         <w:t>A5 Xem kết quả</w:t>
       </w:r>
-      <w:bookmarkEnd w:id="16"/>
+      <w:bookmarkEnd w:id="19"/>
     </w:p>
     <w:p>
       <w:r>
@@ -3618,7 +5474,7 @@
         </w:rPr>
         <w:lastRenderedPageBreak/>
         <w:drawing>
-          <wp:inline distT="0" distB="0" distL="0" distR="0" wp14:anchorId="76B67A85" wp14:editId="5187361B">
+          <wp:inline distT="0" distB="0" distL="0" distR="0" wp14:anchorId="0CF7BD6F" wp14:editId="172AF690">
             <wp:extent cx="5759999" cy="5603684"/>
             <wp:effectExtent l="0" t="0" r="0" b="0"/>
             <wp:docPr id="35" name="Picture" descr="Hình 2 Bảng điểm vòng tròn của giải qua GitHub sau khi hoàn tất 12 ván"/>
@@ -3697,7 +5553,7 @@
         </w:rPr>
         <w:lastRenderedPageBreak/>
         <w:drawing>
-          <wp:inline distT="0" distB="0" distL="0" distR="0" wp14:anchorId="4B337D81" wp14:editId="11629396">
+          <wp:inline distT="0" distB="0" distL="0" distR="0" wp14:anchorId="66419E5E" wp14:editId="7E6574DB">
             <wp:extent cx="5579999" cy="7011710"/>
             <wp:effectExtent l="0" t="0" r="0" b="0"/>
             <wp:docPr id="38" name="Picture" descr="Hình 3 Replay một ván đã kết thúc bằng chiếm căn cứ"/>
@@ -3761,13 +5617,13 @@
       <w:pPr>
         <w:pStyle w:val="Heading2"/>
       </w:pPr>
-      <w:bookmarkStart w:id="17" w:name="a6-ban-tổ-chức-và-điều-hành"/>
-      <w:bookmarkStart w:id="18" w:name="_Toc243860560"/>
-      <w:bookmarkEnd w:id="15"/>
+      <w:bookmarkStart w:id="20" w:name="a6-ban-tổ-chức-và-điều-hành"/>
+      <w:bookmarkStart w:id="21" w:name="_Toc243866076"/>
+      <w:bookmarkEnd w:id="18"/>
       <w:r>
         <w:t>A6 Ban tổ chức và điều hành</w:t>
       </w:r>
-      <w:bookmarkEnd w:id="18"/>
+      <w:bookmarkEnd w:id="21"/>
     </w:p>
     <w:p>
       <w:r>
@@ -3793,7 +5649,7 @@
         </w:rPr>
         <w:lastRenderedPageBreak/>
         <w:drawing>
-          <wp:inline distT="0" distB="0" distL="0" distR="0" wp14:anchorId="0DC48D2E" wp14:editId="4868CD37">
+          <wp:inline distT="0" distB="0" distL="0" distR="0" wp14:anchorId="1540E74D" wp14:editId="75F6449E">
             <wp:extent cx="5759999" cy="3254999"/>
             <wp:effectExtent l="0" t="0" r="0" b="0"/>
             <wp:docPr id="42" name="Picture" descr="Hình 4 Phần chính của biểu mẫu tạo giải với các giá trị mặc định"/>
@@ -3882,26 +5738,26 @@
         <w:pStyle w:val="Heading1"/>
         <w:pageBreakBefore/>
       </w:pPr>
-      <w:bookmarkStart w:id="19" w:name="phần-b-thiết-kế-kỹ-thuật"/>
-      <w:bookmarkStart w:id="20" w:name="_Toc243860561"/>
-      <w:bookmarkEnd w:id="17"/>
+      <w:bookmarkStart w:id="22" w:name="phần-b-thiết-kế-kỹ-thuật"/>
+      <w:bookmarkStart w:id="23" w:name="_Toc243866077"/>
+      <w:bookmarkEnd w:id="20"/>
       <w:bookmarkEnd w:id="2"/>
       <w:r>
         <w:lastRenderedPageBreak/>
         <w:t>PHẦN B THIẾT KẾ KỸ THUẬT</w:t>
       </w:r>
-      <w:bookmarkEnd w:id="20"/>
+      <w:bookmarkEnd w:id="23"/>
     </w:p>
     <w:p>
       <w:pPr>
         <w:pStyle w:val="Heading2"/>
       </w:pPr>
-      <w:bookmarkStart w:id="21" w:name="b1-kiến-trúc-tổng-thể"/>
-      <w:bookmarkStart w:id="22" w:name="_Toc243860562"/>
+      <w:bookmarkStart w:id="24" w:name="b1-kiến-trúc-tổng-thể"/>
+      <w:bookmarkStart w:id="25" w:name="_Toc243866078"/>
       <w:r>
         <w:t>B1 Kiến trúc tổng thể</w:t>
       </w:r>
-      <w:bookmarkEnd w:id="22"/>
+      <w:bookmarkEnd w:id="25"/>
     </w:p>
     <w:p>
       <w:r>
@@ -3918,7 +5774,7 @@
           <w:noProof/>
         </w:rPr>
         <w:drawing>
-          <wp:inline distT="0" distB="0" distL="0" distR="0" wp14:anchorId="779596F6" wp14:editId="40CD4F5B">
+          <wp:inline distT="0" distB="0" distL="0" distR="0" wp14:anchorId="03B364D4" wp14:editId="142FBD36">
             <wp:extent cx="5759999" cy="3702857"/>
             <wp:effectExtent l="0" t="0" r="0" b="0"/>
             <wp:docPr id="47" name="Picture" descr="Hình 5 Kiến trúc triển khai; các mũi tên biểu diễn kết nối hoặc yêu cầu giữa các thành phần"/>
@@ -3998,13 +5854,13 @@
       <w:pPr>
         <w:pStyle w:val="Heading2"/>
       </w:pPr>
-      <w:bookmarkStart w:id="23" w:name="b2-dịch-vụ-được-dùng"/>
-      <w:bookmarkStart w:id="24" w:name="_Toc243860563"/>
-      <w:bookmarkEnd w:id="21"/>
+      <w:bookmarkStart w:id="26" w:name="b2-dịch-vụ-được-dùng"/>
+      <w:bookmarkStart w:id="27" w:name="_Toc243866079"/>
+      <w:bookmarkEnd w:id="24"/>
       <w:r>
         <w:t>B2 Dịch vụ được dùng</w:t>
       </w:r>
-      <w:bookmarkEnd w:id="24"/>
+      <w:bookmarkEnd w:id="27"/>
     </w:p>
     <w:tbl>
       <w:tblPr>
@@ -4324,13 +6180,13 @@
       <w:pPr>
         <w:pStyle w:val="Heading2"/>
       </w:pPr>
-      <w:bookmarkStart w:id="25" w:name="b3-hub-và-cách-phục-vụ-dữ-liệu"/>
-      <w:bookmarkStart w:id="26" w:name="_Toc243860564"/>
-      <w:bookmarkEnd w:id="23"/>
+      <w:bookmarkStart w:id="28" w:name="b3-hub-và-cách-phục-vụ-dữ-liệu"/>
+      <w:bookmarkStart w:id="29" w:name="_Toc243866080"/>
+      <w:bookmarkEnd w:id="26"/>
       <w:r>
         <w:t>B3 Hub và cách phục vụ dữ liệu</w:t>
       </w:r>
-      <w:bookmarkEnd w:id="26"/>
+      <w:bookmarkEnd w:id="29"/>
     </w:p>
     <w:p>
       <w:r>
@@ -4381,13 +6237,13 @@
       <w:pPr>
         <w:pStyle w:val="Heading2"/>
       </w:pPr>
-      <w:bookmarkStart w:id="27" w:name="b4-máy-chấm-và-chia-việc"/>
-      <w:bookmarkStart w:id="28" w:name="_Toc243860565"/>
-      <w:bookmarkEnd w:id="25"/>
+      <w:bookmarkStart w:id="30" w:name="b4-máy-chấm-và-chia-việc"/>
+      <w:bookmarkStart w:id="31" w:name="_Toc243866081"/>
+      <w:bookmarkEnd w:id="28"/>
       <w:r>
         <w:t>B4 Máy chấm và chia việc</w:t>
       </w:r>
-      <w:bookmarkEnd w:id="28"/>
+      <w:bookmarkEnd w:id="31"/>
     </w:p>
     <w:p>
       <w:r>
@@ -4424,7 +6280,7 @@
           <w:noProof/>
         </w:rPr>
         <w:drawing>
-          <wp:inline distT="0" distB="0" distL="0" distR="0" wp14:anchorId="1F6A36CB" wp14:editId="48C4D054">
+          <wp:inline distT="0" distB="0" distL="0" distR="0" wp14:anchorId="067A69D5" wp14:editId="213AC01C">
             <wp:extent cx="5759999" cy="3543157"/>
             <wp:effectExtent l="0" t="0" r="0" b="0"/>
             <wp:docPr id="53" name="Picture" descr="Hình 6 Trang quản lý máy chấm trên web thật; tên máy được che, trạng thái phản ánh thời điểm chụp"/>
@@ -4481,7 +6337,7 @@
         <w:pStyle w:val="BodyText"/>
       </w:pPr>
       <w:r>
-        <w:t>Người vận hành lấy gói cài từ trang web, chọn Windows hoặc Linux và dùng mã riêng do ban tổ chức cấp. Windows dùng toolchain cục bộ; Linux cần bubblewrap, cgroup v2 và cấu hình hệ thống phù hợp. Trước khi nhận trận, máy tự báo phiên bản, nền tảng, runtime và số slot để ban tổ chức kiểm. Mã máy chấm phải nằm ngoài repo và được thu hồi khi máy không còn dùng.</w:t>
+        <w:t>Ban tổ chức tạo mã máy chấm và gửi tin nhắn cài qua kênh riêng. Tin nhắn có link tải hạn bảy ngày cho Windows hoặc Linux; gói không tải công khai. Windows dùng toolchain cục bộ; Linux cần bubblewrap, cgroup v2 và cấu hình hệ thống phù hợp. Trước khi nhận trận, máy tự báo phiên bản, nền tảng, runtime và số slot để ban tổ chức kiểm. Mã máy chấm phải nằm ngoài repo và được thu hồi khi máy không còn dùng.</w:t>
       </w:r>
     </w:p>
     <w:p>
@@ -4504,13 +6360,13 @@
       <w:pPr>
         <w:pStyle w:val="Heading2"/>
       </w:pPr>
-      <w:bookmarkStart w:id="29" w:name="b5-sandbox-thay-docker"/>
-      <w:bookmarkStart w:id="30" w:name="_Toc243860566"/>
-      <w:bookmarkEnd w:id="27"/>
+      <w:bookmarkStart w:id="32" w:name="b5-sandbox-thay-docker"/>
+      <w:bookmarkStart w:id="33" w:name="_Toc243866082"/>
+      <w:bookmarkEnd w:id="30"/>
       <w:r>
         <w:t>B5 Sandbox thay Docker</w:t>
       </w:r>
-      <w:bookmarkEnd w:id="30"/>
+      <w:bookmarkEnd w:id="33"/>
     </w:p>
     <w:p>
       <w:r>
@@ -4522,11 +6378,8 @@
         <w:pStyle w:val="BodyText"/>
       </w:pPr>
       <w:r>
-        <w:t xml:space="preserve">Trên Windows, AppContainer hạn chế quyền của tiến trình và Job Object quản lý cây tiến trình, bộ nhớ và thời gian. Máy chấm khởi tạo bot với tập file cần thiết thay vì quyền người dùng đầy đủ. Cách này </w:t>
-      </w:r>
-      <w:r>
         <w:lastRenderedPageBreak/>
-        <w:t>chạy trực tiếp trên Windows, không yêu cầu người tham gia cài WSL hoặc Docker. Nó vẫn phụ thuộc phiên bản hệ điều hành và toolchain đã kiểm.</w:t>
+        <w:t>Trên Windows, AppContainer hạn chế quyền của tiến trình và Job Object quản lý cây tiến trình, bộ nhớ và thời gian. Máy chấm khởi tạo bot với tập file cần thiết thay vì quyền người dùng đầy đủ. Cách này chạy trực tiếp trên Windows, không yêu cầu người tham gia cài WSL hoặc Docker. Nó vẫn phụ thuộc phiên bản hệ điều hành và toolchain đã kiểm.</w:t>
       </w:r>
     </w:p>
     <w:p>
@@ -4549,13 +6402,13 @@
       <w:pPr>
         <w:pStyle w:val="Heading2"/>
       </w:pPr>
-      <w:bookmarkStart w:id="31" w:name="b6-quỹ-giờ-và-khả-năng-đối-chiếu"/>
-      <w:bookmarkStart w:id="32" w:name="_Toc243860567"/>
-      <w:bookmarkEnd w:id="29"/>
+      <w:bookmarkStart w:id="34" w:name="b6-quỹ-giờ-và-khả-năng-đối-chiếu"/>
+      <w:bookmarkStart w:id="35" w:name="_Toc243866083"/>
+      <w:bookmarkEnd w:id="32"/>
       <w:r>
         <w:t>B6 Quỹ giờ và khả năng đối chiếu</w:t>
       </w:r>
-      <w:bookmarkEnd w:id="32"/>
+      <w:bookmarkEnd w:id="35"/>
     </w:p>
     <w:p>
       <w:r>
@@ -4598,13 +6451,13 @@
       <w:pPr>
         <w:pStyle w:val="Heading2"/>
       </w:pPr>
-      <w:bookmarkStart w:id="33" w:name="b7-chịu-lỗi-và-sao-lưu"/>
-      <w:bookmarkStart w:id="34" w:name="_Toc243860568"/>
-      <w:bookmarkEnd w:id="31"/>
+      <w:bookmarkStart w:id="36" w:name="b7-chịu-lỗi-và-sao-lưu"/>
+      <w:bookmarkStart w:id="37" w:name="_Toc243866084"/>
+      <w:bookmarkEnd w:id="34"/>
       <w:r>
         <w:t>B7 Chịu lỗi và sao lưu</w:t>
       </w:r>
-      <w:bookmarkEnd w:id="34"/>
+      <w:bookmarkEnd w:id="37"/>
     </w:p>
     <w:p>
       <w:r>
@@ -4788,6 +6641,7 @@
               <w:spacing w:before="60" w:after="100"/>
             </w:pPr>
             <w:r>
+              <w:lastRenderedPageBreak/>
               <w:t>T3 Chặn mạng 90 giây</w:t>
             </w:r>
           </w:p>
@@ -4832,7 +6686,6 @@
               <w:spacing w:before="60" w:after="100"/>
             </w:pPr>
             <w:r>
-              <w:lastRenderedPageBreak/>
               <w:t>T4 Hub chết đột ngột</w:t>
             </w:r>
           </w:p>
@@ -4961,13 +6814,13 @@
       <w:pPr>
         <w:pStyle w:val="Heading2"/>
       </w:pPr>
-      <w:bookmarkStart w:id="35" w:name="b8-bảo-mật"/>
-      <w:bookmarkStart w:id="36" w:name="_Toc243860569"/>
-      <w:bookmarkEnd w:id="33"/>
+      <w:bookmarkStart w:id="38" w:name="b8-bảo-mật"/>
+      <w:bookmarkStart w:id="39" w:name="_Toc243866085"/>
+      <w:bookmarkEnd w:id="36"/>
       <w:r>
         <w:t>B8 Bảo mật</w:t>
       </w:r>
-      <w:bookmarkEnd w:id="36"/>
+      <w:bookmarkEnd w:id="39"/>
     </w:p>
     <w:p>
       <w:r>
@@ -4987,6 +6840,14 @@
         <w:pStyle w:val="BodyText"/>
       </w:pPr>
       <w:r>
+        <w:t>Gói máy chấm chỉ tải qua link có chữ ký hết hạn sau bảy ngày; mã máy chấm gửi riêng và thu hồi được mới là thông tin cấp quyền nhận việc.</w:t>
+      </w:r>
+    </w:p>
+    <w:p>
+      <w:pPr>
+        <w:pStyle w:val="BodyText"/>
+      </w:pPr>
+      <w:r>
         <w:t>Mã xác minh được lưu dưới dạng HMAC; khóa, SMTP và khóa GitHub App nằm ngoài repo. Giới hạn quyền App vào repo được chọn giảm phạm vi khi một cấu hình bị lộ. Webhook phải có chữ ký hợp lệ, còn việc nhận nguồn chỉ đi qua các host GitHub được phép. Hub kiểm đường dẫn giải nén, liên kết và giới hạn kích thước để chặn ghi ra ngoài thư mục hoặc bom nén.</w:t>
       </w:r>
     </w:p>
@@ -4995,6 +6856,7 @@
         <w:pStyle w:val="BodyText"/>
       </w:pPr>
       <w:r>
+        <w:lastRenderedPageBreak/>
         <w:t>nginx và ứng dụng đặt chính sách nội dung, chống đoán loại file và hạn chế thông tin referrer. HSTS có thời hạn sáu tháng để trình duyệt ưu tiên HTTPS. Tunnel chỉ chuyển tiếp hostname đã cấu hình; API và trang cá nhân không có Cache Rule công khai. Cần kiểm cả header, quyền API và trạng thái dữ liệu sau triển khai, không chỉ kiểm trang chủ mở được.</w:t>
       </w:r>
     </w:p>
@@ -5003,7 +6865,6 @@
         <w:pStyle w:val="BodyText"/>
       </w:pPr>
       <w:r>
-        <w:lastRenderedPageBreak/>
         <w:t>Bộ kiểm có thử vai khách, sinh viên và ban tổ chức, truy cập chéo đội, request thiếu CSRF, dữ liệu script và nguồn phá sandbox. Tuy vậy máy chấm được tin cậy vẫn có quyền nhìn nguồn cần chạy; hệ thống chưa giải quyết việc một người vận hành máy chấm cố ý lấy mã. Tài khoản máy, quyền tổ chức và trao đổi mã phải đi cùng quy trình quản lý của nhóm.</w:t>
       </w:r>
     </w:p>
@@ -5011,13 +6872,13 @@
       <w:pPr>
         <w:pStyle w:val="Heading2"/>
       </w:pPr>
-      <w:bookmarkStart w:id="37" w:name="b9-sức-tải-và-thời-gian-đã-đo"/>
-      <w:bookmarkStart w:id="38" w:name="_Toc243860570"/>
-      <w:bookmarkEnd w:id="35"/>
+      <w:bookmarkStart w:id="40" w:name="b9-sức-tải-và-thời-gian-đã-đo"/>
+      <w:bookmarkStart w:id="41" w:name="_Toc243866086"/>
+      <w:bookmarkEnd w:id="38"/>
       <w:r>
         <w:t>B9 Sức tải và thời gian đã đo</w:t>
       </w:r>
-      <w:bookmarkEnd w:id="38"/>
+      <w:bookmarkEnd w:id="41"/>
     </w:p>
     <w:p>
       <w:r>
@@ -5827,6 +7688,7 @@
               <w:spacing w:before="60" w:after="100"/>
             </w:pPr>
             <w:r>
+              <w:lastRenderedPageBreak/>
               <w:t>200</w:t>
             </w:r>
           </w:p>
@@ -6049,7 +7911,6 @@
               <w:spacing w:before="60" w:after="100"/>
             </w:pPr>
             <w:r>
-              <w:lastRenderedPageBreak/>
               <w:t>1.000</w:t>
             </w:r>
           </w:p>
@@ -6132,13 +7993,13 @@
       <w:pPr>
         <w:pStyle w:val="Heading2"/>
       </w:pPr>
-      <w:bookmarkStart w:id="39" w:name="b10-cài-đặt-và-vận-hành"/>
-      <w:bookmarkStart w:id="40" w:name="_Toc243860571"/>
-      <w:bookmarkEnd w:id="37"/>
+      <w:bookmarkStart w:id="42" w:name="b10-cài-đặt-và-vận-hành"/>
+      <w:bookmarkStart w:id="43" w:name="_Toc243866087"/>
+      <w:bookmarkEnd w:id="40"/>
       <w:r>
         <w:t>B10 Cài đặt và vận hành</w:t>
       </w:r>
-      <w:bookmarkEnd w:id="40"/>
+      <w:bookmarkEnd w:id="43"/>
     </w:p>
     <w:p>
       <w:r>
@@ -6194,7 +8055,7 @@
         <w:t>Tạo tài khoản và nối máy chấm.</w:t>
       </w:r>
       <w:r>
-        <w:t xml:space="preserve"> Khởi tạo tài khoản ban tổ chức qua công cụ quản trị, không đưa mật khẩu vào lệnh lưu lịch sử. Cấp mã riêng và cài máy chấm từ web trên Windows hoặc Linux; kiểm nền tảng, runtime và slot. Chạy một lượt kiểm, một ván và mở replay trước khi tạo giải thật.</w:t>
+        <w:t xml:space="preserve"> Khởi tạo tài khoản ban tổ chức qua công cụ quản trị, không đưa mật khẩu vào lệnh lưu lịch sử. Ban tổ chức tạo mã, gửi tin nhắn cài có link tải hạn bảy ngày qua kênh riêng; gói không tải công khai. Người vận hành cài trên Windows hoặc Linux; kiểm nền tảng, runtime và slot. Chạy một lượt kiểm, một ván và mở replay trước khi tạo giải thật.</w:t>
       </w:r>
     </w:p>
     <w:p>
@@ -6239,7 +8100,7 @@
         <w:t>Tự thử trên Windows và Linux.</w:t>
       </w:r>
       <w:r>
-        <w:t xml:space="preserve"> Người dùng có thể mở web công khai, xem hai giải demo và replay mà không cần tài khoản quản trị. Người vận hành được cấp mã có thể cài máy chấm từ web trên Windows; với Ubuntu hoặc WSL2 cần kiểm cgroup và chính sách user namespace trước. Sau khi nối, xác nhận máy online và nhận được lượt kiểm, thay vì chỉ thấy chương trình cài báo thành công.</w:t>
+        <w:t xml:space="preserve"> Người dùng có thể mở web công khai, xem hai giải demo và replay mà không cần tài khoản quản trị. Người vận hành nhận tin nhắn cài riêng có thể cài máy chấm trên Windows; với Ubuntu hoặc WSL2 cần kiểm cgroup và chính sách user namespace trước. Sau khi nối, xác nhận máy online và nhận được lượt kiểm, thay vì chỉ thấy chương trình cài báo thành công.</w:t>
       </w:r>
     </w:p>
     <w:p>
@@ -6247,14 +8108,14 @@
         <w:pStyle w:val="Heading2"/>
         <w:pageBreakBefore/>
       </w:pPr>
-      <w:bookmarkStart w:id="41" w:name="b11-giới-hạn-và-hướng-tiếp"/>
-      <w:bookmarkStart w:id="42" w:name="_Toc243860572"/>
-      <w:bookmarkEnd w:id="39"/>
+      <w:bookmarkStart w:id="44" w:name="b11-giới-hạn-và-hướng-tiếp"/>
+      <w:bookmarkStart w:id="45" w:name="_Toc243866088"/>
+      <w:bookmarkEnd w:id="42"/>
       <w:r>
         <w:lastRenderedPageBreak/>
         <w:t>B11 Giới hạn và hướng tiếp</w:t>
       </w:r>
-      <w:bookmarkEnd w:id="42"/>
+      <w:bookmarkEnd w:id="45"/>
     </w:p>
     <w:p>
       <w:r>
@@ -6337,15 +8198,15 @@
         <w:pStyle w:val="Heading1"/>
         <w:pageBreakBefore/>
       </w:pPr>
-      <w:bookmarkStart w:id="43" w:name="phần-c-hướng-dẫn-demo-từng-bước"/>
-      <w:bookmarkStart w:id="44" w:name="_Toc243860573"/>
-      <w:bookmarkEnd w:id="41"/>
-      <w:bookmarkEnd w:id="19"/>
+      <w:bookmarkStart w:id="46" w:name="phần-c-hướng-dẫn-demo-từng-bước"/>
+      <w:bookmarkStart w:id="47" w:name="_Toc243866089"/>
+      <w:bookmarkEnd w:id="44"/>
+      <w:bookmarkEnd w:id="22"/>
       <w:r>
         <w:lastRenderedPageBreak/>
         <w:t>PHẦN C HƯỚNG DẪN DEMO TỪNG BƯỚC</w:t>
       </w:r>
-      <w:bookmarkEnd w:id="44"/>
+      <w:bookmarkEnd w:id="47"/>
     </w:p>
     <w:p>
       <w:r>
@@ -6356,21 +8217,23 @@
       <w:pPr>
         <w:pStyle w:val="Heading2"/>
       </w:pPr>
-      <w:bookmarkStart w:id="45" w:name="c1-khách-xem-giải"/>
-      <w:bookmarkStart w:id="46" w:name="_Toc243860574"/>
+      <w:bookmarkStart w:id="48" w:name="c1-khách-xem-giải"/>
+      <w:bookmarkStart w:id="49" w:name="_Toc243866090"/>
       <w:r>
         <w:t>C1 Khách xem giải</w:t>
       </w:r>
-      <w:bookmarkEnd w:id="46"/>
+      <w:bookmarkEnd w:id="49"/>
     </w:p>
     <w:p>
       <w:pPr>
         <w:pStyle w:val="Heading3"/>
       </w:pPr>
-      <w:bookmarkStart w:id="47" w:name="bước-1-mở-giải-công-khai"/>
+      <w:bookmarkStart w:id="50" w:name="bước-1-mở-giải-công-khai"/>
+      <w:bookmarkStart w:id="51" w:name="_Toc243866091"/>
       <w:r>
         <w:t>Bước 1 Mở giải công khai</w:t>
       </w:r>
+      <w:bookmarkEnd w:id="51"/>
     </w:p>
     <w:p>
       <w:r>
@@ -6397,7 +8260,7 @@
           <w:noProof/>
         </w:rPr>
         <w:drawing>
-          <wp:inline distT="0" distB="0" distL="0" distR="0" wp14:anchorId="41790467" wp14:editId="5AAAADBF">
+          <wp:inline distT="0" distB="0" distL="0" distR="0" wp14:anchorId="65E8C0B2" wp14:editId="2D35544B">
             <wp:extent cx="3400077" cy="2592000"/>
             <wp:effectExtent l="0" t="0" r="0" b="0"/>
             <wp:docPr id="65" name="Picture" descr="Hình 7 Mở giải công khai"/>
@@ -6453,11 +8316,13 @@
       <w:pPr>
         <w:pStyle w:val="Heading3"/>
       </w:pPr>
-      <w:bookmarkStart w:id="48" w:name="bước-2-xem-bảng-điểm-và-ma-trận"/>
-      <w:bookmarkEnd w:id="47"/>
+      <w:bookmarkStart w:id="52" w:name="bước-2-xem-bảng-điểm-và-ma-trận"/>
+      <w:bookmarkStart w:id="53" w:name="_Toc243866092"/>
+      <w:bookmarkEnd w:id="50"/>
       <w:r>
         <w:t>Bước 2 Xem bảng điểm và ma trận</w:t>
       </w:r>
+      <w:bookmarkEnd w:id="53"/>
     </w:p>
     <w:p>
       <w:r>
@@ -6504,7 +8369,7 @@
           <w:noProof/>
         </w:rPr>
         <w:drawing>
-          <wp:inline distT="0" distB="0" distL="0" distR="0" wp14:anchorId="60D8596B" wp14:editId="66EB4053">
+          <wp:inline distT="0" distB="0" distL="0" distR="0" wp14:anchorId="71EF7CBD" wp14:editId="0B91410B">
             <wp:extent cx="2664303" cy="2592000"/>
             <wp:effectExtent l="0" t="0" r="0" b="0"/>
             <wp:docPr id="69" name="Picture" descr="Hình 8 Xem bảng điểm và ma trận"/>
@@ -6561,12 +8426,14 @@
         <w:pStyle w:val="Heading3"/>
         <w:pageBreakBefore/>
       </w:pPr>
-      <w:bookmarkStart w:id="49" w:name="bước-3-xem-lại-từng-nước"/>
-      <w:bookmarkEnd w:id="48"/>
+      <w:bookmarkStart w:id="54" w:name="bước-3-xem-lại-từng-nước"/>
+      <w:bookmarkStart w:id="55" w:name="_Toc243866093"/>
+      <w:bookmarkEnd w:id="52"/>
       <w:r>
         <w:lastRenderedPageBreak/>
         <w:t>Bước 3 Xem lại từng nước</w:t>
       </w:r>
+      <w:bookmarkEnd w:id="55"/>
     </w:p>
     <w:p>
       <w:r>
@@ -6603,7 +8470,7 @@
           <w:noProof/>
         </w:rPr>
         <w:drawing>
-          <wp:inline distT="0" distB="0" distL="0" distR="0" wp14:anchorId="6A0FA3EA" wp14:editId="75103A32">
+          <wp:inline distT="0" distB="0" distL="0" distR="0" wp14:anchorId="5E790981" wp14:editId="646E70C7">
             <wp:extent cx="4297381" cy="5400000"/>
             <wp:effectExtent l="0" t="0" r="0" b="0"/>
             <wp:docPr id="73" name="Picture" descr="Hình 9 Xem lại từng nước"/>
@@ -6660,24 +8527,26 @@
         <w:pStyle w:val="Heading2"/>
         <w:pageBreakBefore/>
       </w:pPr>
-      <w:bookmarkStart w:id="50" w:name="c2-thí-sinh-đăng-ký-và-nộp-bot"/>
-      <w:bookmarkStart w:id="51" w:name="_Toc243860575"/>
-      <w:bookmarkEnd w:id="49"/>
-      <w:bookmarkEnd w:id="45"/>
+      <w:bookmarkStart w:id="56" w:name="c2-thí-sinh-đăng-ký-và-nộp-bot"/>
+      <w:bookmarkStart w:id="57" w:name="_Toc243866094"/>
+      <w:bookmarkEnd w:id="54"/>
+      <w:bookmarkEnd w:id="48"/>
       <w:r>
         <w:lastRenderedPageBreak/>
         <w:t>C2 Thí sinh đăng ký và nộp bot</w:t>
       </w:r>
-      <w:bookmarkEnd w:id="51"/>
+      <w:bookmarkEnd w:id="57"/>
     </w:p>
     <w:p>
       <w:pPr>
         <w:pStyle w:val="Heading3"/>
       </w:pPr>
-      <w:bookmarkStart w:id="52" w:name="bước-4-đăng-ký-bằng-email-trường"/>
+      <w:bookmarkStart w:id="58" w:name="bước-4-đăng-ký-bằng-email-trường"/>
+      <w:bookmarkStart w:id="59" w:name="_Toc243866095"/>
       <w:r>
         <w:t>Bước 4 Đăng ký bằng email trường</w:t>
       </w:r>
+      <w:bookmarkEnd w:id="59"/>
     </w:p>
     <w:p>
       <w:r>
@@ -6714,7 +8583,7 @@
           <w:noProof/>
         </w:rPr>
         <w:drawing>
-          <wp:inline distT="0" distB="0" distL="0" distR="0" wp14:anchorId="0A95897A" wp14:editId="25C7C3CC">
+          <wp:inline distT="0" distB="0" distL="0" distR="0" wp14:anchorId="7BE9771A" wp14:editId="468B2777">
             <wp:extent cx="3800539" cy="2592000"/>
             <wp:effectExtent l="0" t="0" r="0" b="0"/>
             <wp:docPr id="78" name="Picture" descr="Hình 10 Đăng ký bằng email trường"/>
@@ -6770,11 +8639,13 @@
       <w:pPr>
         <w:pStyle w:val="Heading3"/>
       </w:pPr>
-      <w:bookmarkStart w:id="53" w:name="bước-5-xác-minh-email"/>
-      <w:bookmarkEnd w:id="52"/>
+      <w:bookmarkStart w:id="60" w:name="bước-5-xác-minh-email"/>
+      <w:bookmarkStart w:id="61" w:name="_Toc243866096"/>
+      <w:bookmarkEnd w:id="58"/>
       <w:r>
         <w:t>Bước 5 Xác minh email</w:t>
       </w:r>
+      <w:bookmarkEnd w:id="61"/>
     </w:p>
     <w:p>
       <w:r>
@@ -6801,7 +8672,7 @@
           <w:noProof/>
         </w:rPr>
         <w:drawing>
-          <wp:inline distT="0" distB="0" distL="0" distR="0" wp14:anchorId="7BAF1E9B" wp14:editId="083614AD">
+          <wp:inline distT="0" distB="0" distL="0" distR="0" wp14:anchorId="6375E65B" wp14:editId="3D132101">
             <wp:extent cx="2518243" cy="2592000"/>
             <wp:effectExtent l="0" t="0" r="0" b="0"/>
             <wp:docPr id="82" name="Picture" descr="Hình 11 Xác minh email"/>
@@ -6858,12 +8729,14 @@
         <w:pStyle w:val="Heading3"/>
         <w:pageBreakBefore/>
       </w:pPr>
-      <w:bookmarkStart w:id="54" w:name="bước-6-đặt-mật-khẩu-và-đăng-nhập"/>
-      <w:bookmarkEnd w:id="53"/>
+      <w:bookmarkStart w:id="62" w:name="bước-6-đặt-mật-khẩu-và-đăng-nhập"/>
+      <w:bookmarkStart w:id="63" w:name="_Toc243866097"/>
+      <w:bookmarkEnd w:id="60"/>
       <w:r>
         <w:lastRenderedPageBreak/>
         <w:t>Bước 6 Đặt mật khẩu và đăng nhập</w:t>
       </w:r>
+      <w:bookmarkEnd w:id="63"/>
     </w:p>
     <w:p>
       <w:r>
@@ -6890,7 +8763,7 @@
           <w:noProof/>
         </w:rPr>
         <w:drawing>
-          <wp:inline distT="0" distB="0" distL="0" distR="0" wp14:anchorId="1DC3E7C6" wp14:editId="7F9F4FDF">
+          <wp:inline distT="0" distB="0" distL="0" distR="0" wp14:anchorId="21E5E514" wp14:editId="0B91EF35">
             <wp:extent cx="2099959" cy="2592000"/>
             <wp:effectExtent l="0" t="0" r="0" b="0"/>
             <wp:docPr id="86" name="Picture" descr="Hình 12 Đặt mật khẩu và đăng nhập"/>
@@ -6946,11 +8819,13 @@
       <w:pPr>
         <w:pStyle w:val="Heading3"/>
       </w:pPr>
-      <w:bookmarkStart w:id="55" w:name="bước-7-tạo-đội"/>
-      <w:bookmarkEnd w:id="54"/>
+      <w:bookmarkStart w:id="64" w:name="bước-7-tạo-đội"/>
+      <w:bookmarkStart w:id="65" w:name="_Toc243866098"/>
+      <w:bookmarkEnd w:id="62"/>
       <w:r>
         <w:t>Bước 7 Tạo đội</w:t>
       </w:r>
+      <w:bookmarkEnd w:id="65"/>
     </w:p>
     <w:p>
       <w:r>
@@ -6987,7 +8862,7 @@
           <w:noProof/>
         </w:rPr>
         <w:drawing>
-          <wp:inline distT="0" distB="0" distL="0" distR="0" wp14:anchorId="1DC82004" wp14:editId="2180F2A0">
+          <wp:inline distT="0" distB="0" distL="0" distR="0" wp14:anchorId="78928DE8" wp14:editId="295AEC54">
             <wp:extent cx="5012628" cy="2592000"/>
             <wp:effectExtent l="0" t="0" r="0" b="0"/>
             <wp:docPr id="90" name="Picture" descr="Hình 13 Tạo đội"/>
@@ -7044,12 +8919,14 @@
         <w:pStyle w:val="Heading3"/>
         <w:pageBreakBefore/>
       </w:pPr>
-      <w:bookmarkStart w:id="56" w:name="bước-8-mời-các-thành-viên"/>
-      <w:bookmarkEnd w:id="55"/>
+      <w:bookmarkStart w:id="66" w:name="bước-8-mời-các-thành-viên"/>
+      <w:bookmarkStart w:id="67" w:name="_Toc243866099"/>
+      <w:bookmarkEnd w:id="64"/>
       <w:r>
         <w:lastRenderedPageBreak/>
         <w:t>Bước 8 Mời các thành viên</w:t>
       </w:r>
+      <w:bookmarkEnd w:id="67"/>
     </w:p>
     <w:p>
       <w:r>
@@ -7076,7 +8953,7 @@
           <w:noProof/>
         </w:rPr>
         <w:drawing>
-          <wp:inline distT="0" distB="0" distL="0" distR="0" wp14:anchorId="6AE8AE4D" wp14:editId="7B73B96E">
+          <wp:inline distT="0" distB="0" distL="0" distR="0" wp14:anchorId="20290D7D" wp14:editId="61F72603">
             <wp:extent cx="4187916" cy="2592000"/>
             <wp:effectExtent l="0" t="0" r="0" b="0"/>
             <wp:docPr id="94" name="Picture" descr="Hình 14 Mời các thành viên"/>
@@ -7132,11 +9009,13 @@
       <w:pPr>
         <w:pStyle w:val="Heading3"/>
       </w:pPr>
-      <w:bookmarkStart w:id="57" w:name="bước-9-vào-đội-bằng-mã-mời"/>
-      <w:bookmarkEnd w:id="56"/>
+      <w:bookmarkStart w:id="68" w:name="bước-9-vào-đội-bằng-mã-mời"/>
+      <w:bookmarkStart w:id="69" w:name="_Toc243866100"/>
+      <w:bookmarkEnd w:id="66"/>
       <w:r>
         <w:t>Bước 9 Vào đội bằng mã mời</w:t>
       </w:r>
+      <w:bookmarkEnd w:id="69"/>
     </w:p>
     <w:p>
       <w:r>
@@ -7163,7 +9042,7 @@
           <w:noProof/>
         </w:rPr>
         <w:drawing>
-          <wp:inline distT="0" distB="0" distL="0" distR="0" wp14:anchorId="219D9BBC" wp14:editId="366C4EFE">
+          <wp:inline distT="0" distB="0" distL="0" distR="0" wp14:anchorId="617A245E" wp14:editId="25D21DD7">
             <wp:extent cx="5012628" cy="2592000"/>
             <wp:effectExtent l="0" t="0" r="0" b="0"/>
             <wp:docPr id="98" name="Picture" descr="Hình 15 Vào đội bằng mã mời"/>
@@ -7220,12 +9099,14 @@
         <w:pStyle w:val="Heading3"/>
         <w:pageBreakBefore/>
       </w:pPr>
-      <w:bookmarkStart w:id="58" w:name="bước-10-tạo-repo-từ-mẫu"/>
-      <w:bookmarkEnd w:id="57"/>
+      <w:bookmarkStart w:id="70" w:name="bước-10-tạo-repo-từ-mẫu"/>
+      <w:bookmarkStart w:id="71" w:name="_Toc243866101"/>
+      <w:bookmarkEnd w:id="68"/>
       <w:r>
         <w:lastRenderedPageBreak/>
         <w:t>Bước 10 Tạo repo từ mẫu</w:t>
       </w:r>
+      <w:bookmarkEnd w:id="71"/>
     </w:p>
     <w:p>
       <w:r>
@@ -7252,7 +9133,7 @@
           <w:noProof/>
         </w:rPr>
         <w:drawing>
-          <wp:inline distT="0" distB="0" distL="0" distR="0" wp14:anchorId="741F3BFD" wp14:editId="6D4D5151">
+          <wp:inline distT="0" distB="0" distL="0" distR="0" wp14:anchorId="08CF85F8" wp14:editId="1C532BCD">
             <wp:extent cx="5682461" cy="2592000"/>
             <wp:effectExtent l="0" t="0" r="0" b="0"/>
             <wp:docPr id="102" name="Picture" descr="Hình 16 Tạo repo từ mẫu"/>
@@ -7308,11 +9189,13 @@
       <w:pPr>
         <w:pStyle w:val="Heading3"/>
       </w:pPr>
-      <w:bookmarkStart w:id="59" w:name="bước-11-cho-app-truy-cập-đúng-repo"/>
-      <w:bookmarkEnd w:id="58"/>
+      <w:bookmarkStart w:id="72" w:name="bước-11-cho-app-truy-cập-đúng-repo"/>
+      <w:bookmarkStart w:id="73" w:name="_Toc243866102"/>
+      <w:bookmarkEnd w:id="70"/>
       <w:r>
         <w:t>Bước 11 Cho App truy cập đúng repo</w:t>
       </w:r>
+      <w:bookmarkEnd w:id="73"/>
     </w:p>
     <w:p>
       <w:r>
@@ -7349,7 +9232,7 @@
           <w:noProof/>
         </w:rPr>
         <w:drawing>
-          <wp:inline distT="0" distB="0" distL="0" distR="0" wp14:anchorId="4A358CBB" wp14:editId="0364C8F7">
+          <wp:inline distT="0" distB="0" distL="0" distR="0" wp14:anchorId="3DC40D7F" wp14:editId="2546998E">
             <wp:extent cx="5759999" cy="1755999"/>
             <wp:effectExtent l="0" t="0" r="0" b="0"/>
             <wp:docPr id="106" name="Picture" descr="Hình 17 Cho App truy cập đúng repo"/>
@@ -7406,12 +9289,14 @@
         <w:pStyle w:val="Heading3"/>
         <w:pageBreakBefore/>
       </w:pPr>
-      <w:bookmarkStart w:id="60" w:name="bước-12-gắn-link-repo-với-đội"/>
-      <w:bookmarkEnd w:id="59"/>
+      <w:bookmarkStart w:id="74" w:name="bước-12-gắn-link-repo-với-đội"/>
+      <w:bookmarkStart w:id="75" w:name="_Toc243866103"/>
+      <w:bookmarkEnd w:id="72"/>
       <w:r>
         <w:lastRenderedPageBreak/>
         <w:t>Bước 12 Gắn link repo với đội</w:t>
       </w:r>
+      <w:bookmarkEnd w:id="75"/>
     </w:p>
     <w:p>
       <w:r>
@@ -7448,7 +9333,7 @@
           <w:noProof/>
         </w:rPr>
         <w:drawing>
-          <wp:inline distT="0" distB="0" distL="0" distR="0" wp14:anchorId="4C7E55D7" wp14:editId="25AFF618">
+          <wp:inline distT="0" distB="0" distL="0" distR="0" wp14:anchorId="207D9CF4" wp14:editId="0DFAF13E">
             <wp:extent cx="5284928" cy="2592000"/>
             <wp:effectExtent l="0" t="0" r="0" b="0"/>
             <wp:docPr id="110" name="Picture" descr="Hình 18 Gắn link repo với đội"/>
@@ -7504,11 +9389,13 @@
       <w:pPr>
         <w:pStyle w:val="Heading3"/>
       </w:pPr>
-      <w:bookmarkStart w:id="61" w:name="bước-13-theo-dõi-kiểm-tra-72-mẫu"/>
-      <w:bookmarkEnd w:id="60"/>
+      <w:bookmarkStart w:id="76" w:name="bước-13-theo-dõi-kiểm-tra-72-mẫu"/>
+      <w:bookmarkStart w:id="77" w:name="_Toc243866104"/>
+      <w:bookmarkEnd w:id="74"/>
       <w:r>
         <w:t>Bước 13 Theo dõi kiểm tra 72 mẫu</w:t>
       </w:r>
+      <w:bookmarkEnd w:id="77"/>
     </w:p>
     <w:p>
       <w:r>
@@ -7585,7 +9472,7 @@
           <w:noProof/>
         </w:rPr>
         <w:drawing>
-          <wp:inline distT="0" distB="0" distL="0" distR="0" wp14:anchorId="6A80BA27" wp14:editId="6772564A">
+          <wp:inline distT="0" distB="0" distL="0" distR="0" wp14:anchorId="6F059EA1" wp14:editId="45A36ECA">
             <wp:extent cx="3093102" cy="2592000"/>
             <wp:effectExtent l="0" t="0" r="0" b="0"/>
             <wp:docPr id="114" name="Picture" descr="Hình 19 Theo dõi kiểm tra 72 mẫu"/>
@@ -7642,46 +9529,58 @@
         <w:pStyle w:val="Heading3"/>
         <w:pageBreakBefore/>
       </w:pPr>
-      <w:bookmarkStart w:id="62" w:name="bước-14-luyện-tập-với-bot-mẫu"/>
-      <w:bookmarkEnd w:id="61"/>
+      <w:bookmarkStart w:id="78" w:name="bước-14-xem-giải-của-đội"/>
+      <w:bookmarkStart w:id="79" w:name="_Toc243866105"/>
+      <w:bookmarkEnd w:id="76"/>
       <w:r>
         <w:lastRenderedPageBreak/>
-        <w:t>Bước 14 Luyện tập với bot mẫu</w:t>
-      </w:r>
-    </w:p>
-    <w:p>
-      <w:r>
-        <w:t xml:space="preserve">Khi đã có bài hợp lệ, mở </w:t>
+        <w:t>Bước 14 Xem giải của đội</w:t>
+      </w:r>
+      <w:bookmarkEnd w:id="79"/>
+    </w:p>
+    <w:p>
+      <w:r>
+        <w:t xml:space="preserve">Mở </w:t>
       </w:r>
       <w:r>
         <w:rPr>
           <w:b/>
           <w:bCs/>
         </w:rPr>
-        <w:t>Luyện tập</w:t>
-      </w:r>
-      <w:r>
-        <w:t xml:space="preserve">, chọn bài của đội và </w:t>
+        <w:t>Cá nhân &amp; đội</w:t>
+      </w:r>
+      <w:r>
+        <w:t xml:space="preserve"> hoặc </w:t>
       </w:r>
       <w:r>
         <w:rPr>
           <w:b/>
           <w:bCs/>
         </w:rPr>
-        <w:t>Bot mẫu BTC</w:t>
-      </w:r>
-      <w:r>
-        <w:t xml:space="preserve">, giữ quỹ giờ phù hợp rồi bấm </w:t>
+        <w:t>Tổng quan</w:t>
+      </w:r>
+      <w:r>
+        <w:t xml:space="preserve"> để xem khung </w:t>
       </w:r>
       <w:r>
         <w:rPr>
           <w:b/>
           <w:bCs/>
         </w:rPr>
-        <w:t>Tạo trận luyện tập</w:t>
-      </w:r>
-      <w:r>
-        <w:t>. Website mở ván để xem trực tiếp hoặc replay; ván này không đổi Elo.</w:t>
+        <w:t>Giải của đội</w:t>
+      </w:r>
+      <w:r>
+        <w:t xml:space="preserve">. Đối chiếu trạng thái tham gia, hạng, Elo hoặc điểm, số ván và đợt kế tiếp; bấm </w:t>
+      </w:r>
+      <w:r>
+        <w:rPr>
+          <w:b/>
+          <w:bCs/>
+        </w:rPr>
+        <w:t>Mở giải</w:t>
+      </w:r>
+      <w:r>
+        <w:t xml:space="preserve"> để xem bảng điểm và replay.</w:t>
       </w:r>
     </w:p>
     <w:p>
@@ -7694,22 +9593,131 @@
           <w:noProof/>
         </w:rPr>
         <w:drawing>
-          <wp:inline distT="0" distB="0" distL="0" distR="0" wp14:anchorId="286532D8" wp14:editId="4D5C59C4">
-            <wp:extent cx="5759999" cy="3774999"/>
+          <wp:inline distT="0" distB="0" distL="0" distR="0" wp14:anchorId="29DE0F3B" wp14:editId="46FB07BA">
+            <wp:extent cx="5759999" cy="1349999"/>
             <wp:effectExtent l="0" t="0" r="0" b="0"/>
-            <wp:docPr id="118" name="Picture" descr="Hình 20 Luyện tập với bot mẫu"/>
+            <wp:docPr id="118" name="Picture" descr="Hình 20 Xem giải của đội"/>
             <wp:cNvGraphicFramePr/>
             <a:graphic xmlns:a="http://schemas.openxmlformats.org/drawingml/2006/main">
               <a:graphicData uri="http://schemas.openxmlformats.org/drawingml/2006/picture">
                 <pic:pic xmlns:pic="http://schemas.openxmlformats.org/drawingml/2006/picture">
                   <pic:nvPicPr>
-                    <pic:cNvPr id="119" name="Picture" descr="img/h4/14-luyen-tap.png"/>
+                    <pic:cNvPr id="119" name="Picture" descr="img/q-team-competitions.png"/>
                     <pic:cNvPicPr>
                       <a:picLocks noChangeAspect="1" noChangeArrowheads="1"/>
                     </pic:cNvPicPr>
                   </pic:nvPicPr>
                   <pic:blipFill>
                     <a:blip r:embed="rId30"/>
+                    <a:stretch>
+                      <a:fillRect/>
+                    </a:stretch>
+                  </pic:blipFill>
+                  <pic:spPr bwMode="auto">
+                    <a:xfrm>
+                      <a:off x="0" y="0"/>
+                      <a:ext cx="5759999" cy="1349999"/>
+                    </a:xfrm>
+                    <a:prstGeom prst="rect">
+                      <a:avLst/>
+                    </a:prstGeom>
+                    <a:noFill/>
+                    <a:ln w="9525">
+                      <a:noFill/>
+                      <a:headEnd/>
+                      <a:tailEnd/>
+                    </a:ln>
+                  </pic:spPr>
+                </pic:pic>
+              </a:graphicData>
+            </a:graphic>
+          </wp:inline>
+        </w:drawing>
+      </w:r>
+    </w:p>
+    <w:p>
+      <w:pPr>
+        <w:pStyle w:val="Caption"/>
+        <w:spacing w:after="140"/>
+        <w:jc w:val="center"/>
+      </w:pPr>
+      <w:r>
+        <w:t>Hình 20 Xem giải của đội</w:t>
+      </w:r>
+    </w:p>
+    <w:p>
+      <w:pPr>
+        <w:pStyle w:val="Heading3"/>
+      </w:pPr>
+      <w:bookmarkStart w:id="80" w:name="bước-15-luyện-tập-với-bot-mẫu"/>
+      <w:bookmarkStart w:id="81" w:name="_Toc243866106"/>
+      <w:bookmarkEnd w:id="78"/>
+      <w:r>
+        <w:t>Bước 15 Luyện tập với bot mẫu</w:t>
+      </w:r>
+      <w:bookmarkEnd w:id="81"/>
+    </w:p>
+    <w:p>
+      <w:r>
+        <w:t xml:space="preserve">Khi đã có bài hợp lệ, mở </w:t>
+      </w:r>
+      <w:r>
+        <w:rPr>
+          <w:b/>
+          <w:bCs/>
+        </w:rPr>
+        <w:t>Luyện tập</w:t>
+      </w:r>
+      <w:r>
+        <w:t xml:space="preserve">, chọn bài của đội và </w:t>
+      </w:r>
+      <w:r>
+        <w:rPr>
+          <w:b/>
+          <w:bCs/>
+        </w:rPr>
+        <w:t>Bot mẫu BTC</w:t>
+      </w:r>
+      <w:r>
+        <w:t xml:space="preserve">, giữ quỹ giờ phù hợp rồi bấm </w:t>
+      </w:r>
+      <w:r>
+        <w:rPr>
+          <w:b/>
+          <w:bCs/>
+        </w:rPr>
+        <w:t>Tạo trận luyện tập</w:t>
+      </w:r>
+      <w:r>
+        <w:t>. Website mở ván để xem trực tiếp hoặc replay; ván này không đổi Elo.</w:t>
+      </w:r>
+    </w:p>
+    <w:p>
+      <w:pPr>
+        <w:keepNext/>
+        <w:jc w:val="center"/>
+      </w:pPr>
+      <w:r>
+        <w:rPr>
+          <w:noProof/>
+        </w:rPr>
+        <w:drawing>
+          <wp:inline distT="0" distB="0" distL="0" distR="0" wp14:anchorId="27643460" wp14:editId="4A3A1D7E">
+            <wp:extent cx="5759999" cy="3774999"/>
+            <wp:effectExtent l="0" t="0" r="0" b="0"/>
+            <wp:docPr id="122" name="Picture" descr="Hình 21 Luyện tập với bot mẫu"/>
+            <wp:cNvGraphicFramePr/>
+            <a:graphic xmlns:a="http://schemas.openxmlformats.org/drawingml/2006/main">
+              <a:graphicData uri="http://schemas.openxmlformats.org/drawingml/2006/picture">
+                <pic:pic xmlns:pic="http://schemas.openxmlformats.org/drawingml/2006/picture">
+                  <pic:nvPicPr>
+                    <pic:cNvPr id="123" name="Picture" descr="img/h4/14-luyen-tap.png"/>
+                    <pic:cNvPicPr>
+                      <a:picLocks noChangeAspect="1" noChangeArrowheads="1"/>
+                    </pic:cNvPicPr>
+                  </pic:nvPicPr>
+                  <pic:blipFill>
+                    <a:blip r:embed="rId31"/>
                     <a:stretch>
                       <a:fillRect/>
                     </a:stretch>
@@ -7743,7 +9751,7 @@
         <w:jc w:val="center"/>
       </w:pPr>
       <w:r>
-        <w:t>Hình 20 Luyện tập với bot mẫu</w:t>
+        <w:t>Hình 21 Luyện tập với bot mẫu</w:t>
       </w:r>
     </w:p>
     <w:p>
@@ -7751,24 +9759,26 @@
         <w:pStyle w:val="Heading2"/>
         <w:pageBreakBefore/>
       </w:pPr>
-      <w:bookmarkStart w:id="63" w:name="c3-ban-tổ-chức-điều-hành"/>
-      <w:bookmarkStart w:id="64" w:name="_Toc243860576"/>
-      <w:bookmarkEnd w:id="62"/>
-      <w:bookmarkEnd w:id="50"/>
+      <w:bookmarkStart w:id="82" w:name="c3-ban-tổ-chức-điều-hành"/>
+      <w:bookmarkStart w:id="83" w:name="_Toc243866107"/>
+      <w:bookmarkEnd w:id="80"/>
+      <w:bookmarkEnd w:id="56"/>
       <w:r>
         <w:lastRenderedPageBreak/>
         <w:t>C3 Ban tổ chức điều hành</w:t>
       </w:r>
-      <w:bookmarkEnd w:id="64"/>
+      <w:bookmarkEnd w:id="83"/>
     </w:p>
     <w:p>
       <w:pPr>
         <w:pStyle w:val="Heading3"/>
       </w:pPr>
-      <w:bookmarkStart w:id="65" w:name="bước-15-xem-tổng-quan-ban-tổ-chức"/>
-      <w:r>
-        <w:t>Bước 15 Xem tổng quan ban tổ chức</w:t>
-      </w:r>
+      <w:bookmarkStart w:id="84" w:name="bước-16-xem-tổng-quan-ban-tổ-chức"/>
+      <w:bookmarkStart w:id="85" w:name="_Toc243866108"/>
+      <w:r>
+        <w:t>Bước 16 Xem tổng quan ban tổ chức</w:t>
+      </w:r>
+      <w:bookmarkEnd w:id="85"/>
     </w:p>
     <w:p>
       <w:r>
@@ -7785,22 +9795,22 @@
           <w:noProof/>
         </w:rPr>
         <w:drawing>
-          <wp:inline distT="0" distB="0" distL="0" distR="0" wp14:anchorId="6AEC911D" wp14:editId="1087E85E">
-            <wp:extent cx="4259285" cy="2592000"/>
+          <wp:inline distT="0" distB="0" distL="0" distR="0" wp14:anchorId="328A43B7" wp14:editId="7D548E41">
+            <wp:extent cx="5759999" cy="3505263"/>
             <wp:effectExtent l="0" t="0" r="0" b="0"/>
-            <wp:docPr id="123" name="Picture" descr="Hình 21 Xem tổng quan ban tổ chức"/>
+            <wp:docPr id="127" name="Picture" descr="Hình 22 Xem tổng quan ban tổ chức"/>
             <wp:cNvGraphicFramePr/>
             <a:graphic xmlns:a="http://schemas.openxmlformats.org/drawingml/2006/main">
               <a:graphicData uri="http://schemas.openxmlformats.org/drawingml/2006/picture">
                 <pic:pic xmlns:pic="http://schemas.openxmlformats.org/drawingml/2006/picture">
                   <pic:nvPicPr>
-                    <pic:cNvPr id="124" name="Picture" descr="img/h4/15-btc-tong-quan.png"/>
+                    <pic:cNvPr id="128" name="Picture" descr="img/h4/15-btc-tong-quan.png"/>
                     <pic:cNvPicPr>
                       <a:picLocks noChangeAspect="1" noChangeArrowheads="1"/>
                     </pic:cNvPicPr>
                   </pic:nvPicPr>
                   <pic:blipFill>
-                    <a:blip r:embed="rId31"/>
+                    <a:blip r:embed="rId32"/>
                     <a:stretch>
                       <a:fillRect/>
                     </a:stretch>
@@ -7808,7 +9818,7 @@
                   <pic:spPr bwMode="auto">
                     <a:xfrm>
                       <a:off x="0" y="0"/>
-                      <a:ext cx="4259285" cy="2592000"/>
+                      <a:ext cx="5759999" cy="3505263"/>
                     </a:xfrm>
                     <a:prstGeom prst="rect">
                       <a:avLst/>
@@ -7834,18 +9844,143 @@
         <w:jc w:val="center"/>
       </w:pPr>
       <w:r>
-        <w:t>Hình 21 Xem tổng quan ban tổ chức</w:t>
+        <w:t>Hình 22 Xem tổng quan ban tổ chức</w:t>
       </w:r>
     </w:p>
     <w:p>
       <w:pPr>
         <w:pStyle w:val="Heading3"/>
-      </w:pPr>
-      <w:bookmarkStart w:id="66" w:name="bước-16-chuẩn-bị-giải-mới"/>
-      <w:bookmarkEnd w:id="65"/>
-      <w:r>
-        <w:t>Bước 16 Chuẩn bị giải mới</w:t>
-      </w:r>
+        <w:pageBreakBefore/>
+      </w:pPr>
+      <w:bookmarkStart w:id="86" w:name="bước-17-chọn-giải-ở-tổng-quan"/>
+      <w:bookmarkStart w:id="87" w:name="_Toc243866109"/>
+      <w:bookmarkEnd w:id="84"/>
+      <w:r>
+        <w:lastRenderedPageBreak/>
+        <w:t>Bước 17 Chọn giải ở Tổng quan</w:t>
+      </w:r>
+      <w:bookmarkEnd w:id="87"/>
+    </w:p>
+    <w:p>
+      <w:r>
+        <w:t xml:space="preserve">Tại </w:t>
+      </w:r>
+      <w:r>
+        <w:rPr>
+          <w:b/>
+          <w:bCs/>
+        </w:rPr>
+        <w:t>Tổng quan</w:t>
+      </w:r>
+      <w:r>
+        <w:t xml:space="preserve">, chọn </w:t>
+      </w:r>
+      <w:r>
+        <w:rPr>
+          <w:b/>
+          <w:bCs/>
+        </w:rPr>
+        <w:t>Giải</w:t>
+      </w:r>
+      <w:r>
+        <w:t xml:space="preserve"> để xem số đội đang đấu, đội đủ hoặc chưa đủ điều kiện, tiến độ và hàng đợi của riêng giải đó. Bộ lọc cũng có ở </w:t>
+      </w:r>
+      <w:r>
+        <w:rPr>
+          <w:b/>
+          <w:bCs/>
+        </w:rPr>
+        <w:t>Đội &amp; tài khoản</w:t>
+      </w:r>
+      <w:r>
+        <w:t xml:space="preserve"> và </w:t>
+      </w:r>
+      <w:r>
+        <w:rPr>
+          <w:b/>
+          <w:bCs/>
+        </w:rPr>
+        <w:t>Người dùng &amp; lập đội</w:t>
+      </w:r>
+      <w:r>
+        <w:t>; tải lại trang vẫn giữ lựa chọn trên đường dẫn.</w:t>
+      </w:r>
+    </w:p>
+    <w:p>
+      <w:pPr>
+        <w:keepNext/>
+        <w:jc w:val="center"/>
+      </w:pPr>
+      <w:r>
+        <w:rPr>
+          <w:noProof/>
+        </w:rPr>
+        <w:drawing>
+          <wp:inline distT="0" distB="0" distL="0" distR="0" wp14:anchorId="2FE25E75" wp14:editId="1A4E7850">
+            <wp:extent cx="5759999" cy="4220526"/>
+            <wp:effectExtent l="0" t="0" r="0" b="0"/>
+            <wp:docPr id="131" name="Picture" descr="Hình 23 Chọn giải ở Tổng quan"/>
+            <wp:cNvGraphicFramePr/>
+            <a:graphic xmlns:a="http://schemas.openxmlformats.org/drawingml/2006/main">
+              <a:graphicData uri="http://schemas.openxmlformats.org/drawingml/2006/picture">
+                <pic:pic xmlns:pic="http://schemas.openxmlformats.org/drawingml/2006/picture">
+                  <pic:nvPicPr>
+                    <pic:cNvPr id="132" name="Picture" descr="img/q-admin-competition.png"/>
+                    <pic:cNvPicPr>
+                      <a:picLocks noChangeAspect="1" noChangeArrowheads="1"/>
+                    </pic:cNvPicPr>
+                  </pic:nvPicPr>
+                  <pic:blipFill>
+                    <a:blip r:embed="rId33"/>
+                    <a:stretch>
+                      <a:fillRect/>
+                    </a:stretch>
+                  </pic:blipFill>
+                  <pic:spPr bwMode="auto">
+                    <a:xfrm>
+                      <a:off x="0" y="0"/>
+                      <a:ext cx="5759999" cy="4220526"/>
+                    </a:xfrm>
+                    <a:prstGeom prst="rect">
+                      <a:avLst/>
+                    </a:prstGeom>
+                    <a:noFill/>
+                    <a:ln w="9525">
+                      <a:noFill/>
+                      <a:headEnd/>
+                      <a:tailEnd/>
+                    </a:ln>
+                  </pic:spPr>
+                </pic:pic>
+              </a:graphicData>
+            </a:graphic>
+          </wp:inline>
+        </w:drawing>
+      </w:r>
+    </w:p>
+    <w:p>
+      <w:pPr>
+        <w:pStyle w:val="Caption"/>
+        <w:spacing w:after="140"/>
+        <w:jc w:val="center"/>
+      </w:pPr>
+      <w:r>
+        <w:t>Hình 23 Chọn giải ở Tổng quan</w:t>
+      </w:r>
+    </w:p>
+    <w:p>
+      <w:pPr>
+        <w:pStyle w:val="Heading3"/>
+        <w:pageBreakBefore/>
+      </w:pPr>
+      <w:bookmarkStart w:id="88" w:name="bước-18-chuẩn-bị-giải-mới"/>
+      <w:bookmarkStart w:id="89" w:name="_Toc243866110"/>
+      <w:bookmarkEnd w:id="86"/>
+      <w:r>
+        <w:lastRenderedPageBreak/>
+        <w:t>Bước 18 Chuẩn bị giải mới</w:t>
+      </w:r>
+      <w:bookmarkEnd w:id="89"/>
     </w:p>
     <w:p>
       <w:r>
@@ -7872,16 +10007,16 @@
           <w:noProof/>
         </w:rPr>
         <w:drawing>
-          <wp:inline distT="0" distB="0" distL="0" distR="0" wp14:anchorId="48EA281A" wp14:editId="5A1151FF">
+          <wp:inline distT="0" distB="0" distL="0" distR="0" wp14:anchorId="4F6A4551" wp14:editId="3AF20D5E">
             <wp:extent cx="4586765" cy="2592000"/>
             <wp:effectExtent l="0" t="0" r="0" b="0"/>
-            <wp:docPr id="127" name="Picture" descr="Hình 22 Chuẩn bị giải mới"/>
+            <wp:docPr id="135" name="Picture" descr="Hình 24 Chuẩn bị giải mới"/>
             <wp:cNvGraphicFramePr/>
             <a:graphic xmlns:a="http://schemas.openxmlformats.org/drawingml/2006/main">
               <a:graphicData uri="http://schemas.openxmlformats.org/drawingml/2006/picture">
                 <pic:pic xmlns:pic="http://schemas.openxmlformats.org/drawingml/2006/picture">
                   <pic:nvPicPr>
-                    <pic:cNvPr id="128" name="Picture" descr="img/h4/16-btc-tao-giai.png"/>
+                    <pic:cNvPr id="136" name="Picture" descr="img/h4/16-btc-tao-giai.png"/>
                     <pic:cNvPicPr>
                       <a:picLocks noChangeAspect="1" noChangeArrowheads="1"/>
                     </pic:cNvPicPr>
@@ -7921,20 +10056,20 @@
         <w:jc w:val="center"/>
       </w:pPr>
       <w:r>
-        <w:t>Hình 22 Chuẩn bị giải mới</w:t>
+        <w:t>Hình 24 Chuẩn bị giải mới</w:t>
       </w:r>
     </w:p>
     <w:p>
       <w:pPr>
         <w:pStyle w:val="Heading3"/>
-        <w:pageBreakBefore/>
-      </w:pPr>
-      <w:bookmarkStart w:id="67" w:name="bước-17-cài-máy-chấm-windows-hoặc-linux"/>
-      <w:bookmarkEnd w:id="66"/>
-      <w:r>
-        <w:lastRenderedPageBreak/>
-        <w:t>Bước 17 Cài máy chấm Windows hoặc Linux</w:t>
-      </w:r>
+      </w:pPr>
+      <w:bookmarkStart w:id="90" w:name="bước-19-cài-máy-chấm-windows-hoặc-linux"/>
+      <w:bookmarkStart w:id="91" w:name="_Toc243866111"/>
+      <w:bookmarkEnd w:id="88"/>
+      <w:r>
+        <w:t>Bước 19 Cài máy chấm Windows hoặc Linux</w:t>
+      </w:r>
+      <w:bookmarkEnd w:id="91"/>
     </w:p>
     <w:p>
       <w:r>
@@ -7948,7 +10083,17 @@
         <w:t>Máy chấm</w:t>
       </w:r>
       <w:r>
-        <w:t xml:space="preserve">, kéo tới khung </w:t>
+        <w:t xml:space="preserve">, bấm </w:t>
+      </w:r>
+      <w:r>
+        <w:rPr>
+          <w:b/>
+          <w:bCs/>
+        </w:rPr>
+        <w:t>Tạo mã máy chấm</w:t>
+      </w:r>
+      <w:r>
+        <w:t xml:space="preserve"> rồi sao chép tin nhắn đúng hệ điều hành để gửi riêng cho người vận hành. Link trong tin nhắn hết hạn sau bảy ngày; lệnh tự kiểm file tải bằng SHA-256. Khung </w:t>
       </w:r>
       <w:r>
         <w:rPr>
@@ -7958,17 +10103,7 @@
         <w:t>Cài máy chấm</w:t>
       </w:r>
       <w:r>
-        <w:t xml:space="preserve"> và dùng hướng dẫn đúng hệ điều hành. Người vận hành dùng mã riêng được cấp; gói tải công khai không chứa mã, ảnh không mở cửa sổ tạo mã. Dòng </w:t>
-      </w:r>
-      <w:r>
-        <w:rPr>
-          <w:b/>
-          <w:bCs/>
-        </w:rPr>
-        <w:t>Dừng, bật lại hoặc gỡ máy chấm</w:t>
-      </w:r>
-      <w:r>
-        <w:t xml:space="preserve"> ở cuối khung mở ra lệnh dừng, bật lại và gỡ hẳn cho Windows và Linux.</w:t>
+        <w:t xml:space="preserve"> chỉ nêu yêu cầu máy và có hai nút sao chép lệnh dừng/gỡ, không hiển thị link hoặc lệnh cài; ảnh không mở cửa sổ tạo mã.</w:t>
       </w:r>
     </w:p>
     <w:p>
@@ -7981,22 +10116,22 @@
           <w:noProof/>
         </w:rPr>
         <w:drawing>
-          <wp:inline distT="0" distB="0" distL="0" distR="0" wp14:anchorId="65839AB2" wp14:editId="04D2908F">
-            <wp:extent cx="5759999" cy="3909690"/>
+          <wp:inline distT="0" distB="0" distL="0" distR="0" wp14:anchorId="72F799ED" wp14:editId="1FD8FD94">
+            <wp:extent cx="5759999" cy="1196950"/>
             <wp:effectExtent l="0" t="0" r="0" b="0"/>
-            <wp:docPr id="131" name="Picture" descr="Hình 23 Cài máy chấm Windows hoặc Linux"/>
+            <wp:docPr id="139" name="Picture" descr="Hình 25 Cài máy chấm Windows hoặc Linux"/>
             <wp:cNvGraphicFramePr/>
             <a:graphic xmlns:a="http://schemas.openxmlformats.org/drawingml/2006/main">
               <a:graphicData uri="http://schemas.openxmlformats.org/drawingml/2006/picture">
                 <pic:pic xmlns:pic="http://schemas.openxmlformats.org/drawingml/2006/picture">
                   <pic:nvPicPr>
-                    <pic:cNvPr id="132" name="Picture" descr="img/h4/17-btc-cai-may-cham.png"/>
+                    <pic:cNvPr id="140" name="Picture" descr="img/h4/17-btc-cai-may-cham.png"/>
                     <pic:cNvPicPr>
                       <a:picLocks noChangeAspect="1" noChangeArrowheads="1"/>
                     </pic:cNvPicPr>
                   </pic:nvPicPr>
                   <pic:blipFill>
-                    <a:blip r:embed="rId32"/>
+                    <a:blip r:embed="rId34"/>
                     <a:stretch>
                       <a:fillRect/>
                     </a:stretch>
@@ -8004,7 +10139,7 @@
                   <pic:spPr bwMode="auto">
                     <a:xfrm>
                       <a:off x="0" y="0"/>
-                      <a:ext cx="5759999" cy="3909690"/>
+                      <a:ext cx="5759999" cy="1196950"/>
                     </a:xfrm>
                     <a:prstGeom prst="rect">
                       <a:avLst/>
@@ -8030,7 +10165,7 @@
         <w:jc w:val="center"/>
       </w:pPr>
       <w:r>
-        <w:t>Hình 23 Cài máy chấm Windows hoặc Linux</w:t>
+        <w:t>Hình 25 Cài máy chấm Windows hoặc Linux</w:t>
       </w:r>
     </w:p>
     <w:p>
@@ -8038,12 +10173,14 @@
         <w:pStyle w:val="Heading3"/>
         <w:pageBreakBefore/>
       </w:pPr>
-      <w:bookmarkStart w:id="68" w:name="bước-18-kiểm-tình-trạng-chấm-và-hàng-đợi"/>
-      <w:bookmarkEnd w:id="67"/>
+      <w:bookmarkStart w:id="92" w:name="bước-20-kiểm-tình-trạng-chấm-và-hàng-đợi"/>
+      <w:bookmarkStart w:id="93" w:name="_Toc243866112"/>
+      <w:bookmarkEnd w:id="90"/>
       <w:r>
         <w:lastRenderedPageBreak/>
-        <w:t>Bước 18 Kiểm tình trạng chấm và hàng đợi</w:t>
-      </w:r>
+        <w:t>Bước 20 Kiểm tình trạng chấm và hàng đợi</w:t>
+      </w:r>
+      <w:bookmarkEnd w:id="93"/>
     </w:p>
     <w:p>
       <w:r>
@@ -8070,16 +10207,16 @@
           <w:noProof/>
         </w:rPr>
         <w:drawing>
-          <wp:inline distT="0" distB="0" distL="0" distR="0" wp14:anchorId="1D007506" wp14:editId="35962E10">
+          <wp:inline distT="0" distB="0" distL="0" distR="0" wp14:anchorId="6284E091" wp14:editId="1EA817A9">
             <wp:extent cx="4213732" cy="2592000"/>
             <wp:effectExtent l="0" t="0" r="0" b="0"/>
-            <wp:docPr id="135" name="Picture" descr="Hình 24 Kiểm tình trạng chấm và hàng đợi"/>
+            <wp:docPr id="143" name="Picture" descr="Hình 26 Kiểm tình trạng chấm và hàng đợi"/>
             <wp:cNvGraphicFramePr/>
             <a:graphic xmlns:a="http://schemas.openxmlformats.org/drawingml/2006/main">
               <a:graphicData uri="http://schemas.openxmlformats.org/drawingml/2006/picture">
                 <pic:pic xmlns:pic="http://schemas.openxmlformats.org/drawingml/2006/picture">
                   <pic:nvPicPr>
-                    <pic:cNvPr id="136" name="Picture" descr="img/h4/18-btc-tinh-trang-cham.png"/>
+                    <pic:cNvPr id="144" name="Picture" descr="img/h4/18-btc-tinh-trang-cham.png"/>
                     <pic:cNvPicPr>
                       <a:picLocks noChangeAspect="1" noChangeArrowheads="1"/>
                     </pic:cNvPicPr>
@@ -8119,18 +10256,20 @@
         <w:jc w:val="center"/>
       </w:pPr>
       <w:r>
-        <w:t>Hình 24 Kiểm tình trạng chấm và hàng đợi</w:t>
+        <w:t>Hình 26 Kiểm tình trạng chấm và hàng đợi</w:t>
       </w:r>
     </w:p>
     <w:p>
       <w:pPr>
         <w:pStyle w:val="Heading3"/>
       </w:pPr>
-      <w:bookmarkStart w:id="69" w:name="bước-19-soạn-thông-báo"/>
-      <w:bookmarkEnd w:id="68"/>
-      <w:r>
-        <w:t>Bước 19 Soạn thông báo</w:t>
-      </w:r>
+      <w:bookmarkStart w:id="94" w:name="bước-21-soạn-thông-báo"/>
+      <w:bookmarkStart w:id="95" w:name="_Toc243866113"/>
+      <w:bookmarkEnd w:id="92"/>
+      <w:r>
+        <w:t>Bước 21 Soạn thông báo</w:t>
+      </w:r>
+      <w:bookmarkEnd w:id="95"/>
     </w:p>
     <w:p>
       <w:r>
@@ -8167,22 +10306,22 @@
           <w:noProof/>
         </w:rPr>
         <w:drawing>
-          <wp:inline distT="0" distB="0" distL="0" distR="0" wp14:anchorId="5D71EF35" wp14:editId="76F2A475">
+          <wp:inline distT="0" distB="0" distL="0" distR="0" wp14:anchorId="31A060F9" wp14:editId="70B4FB3C">
             <wp:extent cx="5759999" cy="2369999"/>
             <wp:effectExtent l="0" t="0" r="0" b="0"/>
-            <wp:docPr id="139" name="Picture" descr="Hình 25 Soạn thông báo"/>
+            <wp:docPr id="147" name="Picture" descr="Hình 27 Soạn thông báo"/>
             <wp:cNvGraphicFramePr/>
             <a:graphic xmlns:a="http://schemas.openxmlformats.org/drawingml/2006/main">
               <a:graphicData uri="http://schemas.openxmlformats.org/drawingml/2006/picture">
                 <pic:pic xmlns:pic="http://schemas.openxmlformats.org/drawingml/2006/picture">
                   <pic:nvPicPr>
-                    <pic:cNvPr id="140" name="Picture" descr="img/h4/19-btc-thong-bao.png"/>
+                    <pic:cNvPr id="148" name="Picture" descr="img/h4/19-btc-thong-bao.png"/>
                     <pic:cNvPicPr>
                       <a:picLocks noChangeAspect="1" noChangeArrowheads="1"/>
                     </pic:cNvPicPr>
                   </pic:nvPicPr>
                   <pic:blipFill>
-                    <a:blip r:embed="rId33"/>
+                    <a:blip r:embed="rId35"/>
                     <a:stretch>
                       <a:fillRect/>
                     </a:stretch>
@@ -8216,7 +10355,7 @@
         <w:jc w:val="center"/>
       </w:pPr>
       <w:r>
-        <w:t>Hình 25 Soạn thông báo</w:t>
+        <w:t>Hình 27 Soạn thông báo</w:t>
       </w:r>
     </w:p>
     <w:p>
@@ -8224,12 +10363,14 @@
         <w:pStyle w:val="Heading3"/>
         <w:pageBreakBefore/>
       </w:pPr>
-      <w:bookmarkStart w:id="70" w:name="bước-20-xuất-bảng-điểm-csv"/>
-      <w:bookmarkEnd w:id="69"/>
+      <w:bookmarkStart w:id="96" w:name="bước-22-xuất-bảng-điểm-csv"/>
+      <w:bookmarkStart w:id="97" w:name="_Toc243866114"/>
+      <w:bookmarkEnd w:id="94"/>
       <w:r>
         <w:lastRenderedPageBreak/>
-        <w:t>Bước 20 Xuất bảng điểm CSV</w:t>
-      </w:r>
+        <w:t>Bước 22 Xuất bảng điểm CSV</w:t>
+      </w:r>
+      <w:bookmarkEnd w:id="97"/>
     </w:p>
     <w:p>
       <w:r>
@@ -8256,22 +10397,22 @@
           <w:noProof/>
         </w:rPr>
         <w:drawing>
-          <wp:inline distT="0" distB="0" distL="0" distR="0" wp14:anchorId="559C2566" wp14:editId="62538E7F">
+          <wp:inline distT="0" distB="0" distL="0" distR="0" wp14:anchorId="6A171146" wp14:editId="11FE9A9A">
             <wp:extent cx="4559999" cy="5400000"/>
             <wp:effectExtent l="0" t="0" r="0" b="0"/>
-            <wp:docPr id="143" name="Picture" descr="Hình 26 Xuất bảng điểm CSV"/>
+            <wp:docPr id="151" name="Picture" descr="Hình 28 Xuất bảng điểm CSV"/>
             <wp:cNvGraphicFramePr/>
             <a:graphic xmlns:a="http://schemas.openxmlformats.org/drawingml/2006/main">
               <a:graphicData uri="http://schemas.openxmlformats.org/drawingml/2006/picture">
                 <pic:pic xmlns:pic="http://schemas.openxmlformats.org/drawingml/2006/picture">
                   <pic:nvPicPr>
-                    <pic:cNvPr id="144" name="Picture" descr="img/h4/20-btc-xuat-csv.png"/>
+                    <pic:cNvPr id="152" name="Picture" descr="img/h4/20-btc-xuat-csv.png"/>
                     <pic:cNvPicPr>
                       <a:picLocks noChangeAspect="1" noChangeArrowheads="1"/>
                     </pic:cNvPicPr>
                   </pic:nvPicPr>
                   <pic:blipFill>
-                    <a:blip r:embed="rId34"/>
+                    <a:blip r:embed="rId36"/>
                     <a:stretch>
                       <a:fillRect/>
                     </a:stretch>
@@ -8305,16 +10446,16 @@
         <w:jc w:val="center"/>
       </w:pPr>
       <w:r>
-        <w:t>Hình 26 Xuất bảng điểm CSV</w:t>
-      </w:r>
-    </w:p>
-    <w:bookmarkEnd w:id="70"/>
-    <w:bookmarkEnd w:id="63"/>
-    <w:bookmarkEnd w:id="43"/>
+        <w:t>Hình 28 Xuất bảng điểm CSV</w:t>
+      </w:r>
+    </w:p>
+    <w:bookmarkEnd w:id="96"/>
+    <w:bookmarkEnd w:id="82"/>
+    <w:bookmarkEnd w:id="46"/>
     <w:sectPr>
-      <w:headerReference w:type="default" r:id="rId35"/>
-      <w:footerReference w:type="default" r:id="rId36"/>
-      <w:footerReference w:type="first" r:id="rId37"/>
+      <w:headerReference w:type="default" r:id="rId37"/>
+      <w:footerReference w:type="default" r:id="rId38"/>
+      <w:footerReference w:type="first" r:id="rId39"/>
       <w:pgSz w:w="11909" w:h="16834"/>
       <w:pgMar w:top="1037" w:right="1080" w:bottom="936" w:left="1080" w:header="432" w:footer="432" w:gutter="0"/>
       <w:cols w:space="720"/>
@@ -8608,7 +10749,7 @@
   <w:abstractNum w:abstractNumId="9" w15:restartNumberingAfterBreak="0">
     <w:nsid w:val="0000A990"/>
     <w:multiLevelType w:val="multilevel"/>
-    <w:tmpl w:val="324CE9D0"/>
+    <w:tmpl w:val="7CA0676E"/>
     <w:lvl w:ilvl="0">
       <w:numFmt w:val="bullet"/>
       <w:lvlText w:val=" "/>
@@ -8685,7 +10826,7 @@
   <w:abstractNum w:abstractNumId="10" w15:restartNumberingAfterBreak="0">
     <w:nsid w:val="0000A991"/>
     <w:multiLevelType w:val="multilevel"/>
-    <w:tmpl w:val="7512D784"/>
+    <w:tmpl w:val="C9B4A1E0"/>
     <w:lvl w:ilvl="0">
       <w:numFmt w:val="bullet"/>
       <w:lvlText w:val=""/>
@@ -8813,10 +10954,10 @@
   <w:num w:numId="9" w16cid:durableId="718209112">
     <w:abstractNumId w:val="0"/>
   </w:num>
-  <w:num w:numId="10" w16cid:durableId="949623257">
+  <w:num w:numId="10" w16cid:durableId="1171287671">
     <w:abstractNumId w:val="9"/>
   </w:num>
-  <w:num w:numId="11" w16cid:durableId="1512841671">
+  <w:num w:numId="11" w16cid:durableId="1870025255">
     <w:abstractNumId w:val="10"/>
   </w:num>
 </w:numbering>
@@ -20398,7 +22539,7 @@
     <w:autoRedefine/>
     <w:uiPriority w:val="39"/>
     <w:unhideWhenUsed/>
-    <w:rsid w:val="009D319E"/>
+    <w:rsid w:val="007102A4"/>
     <w:pPr>
       <w:spacing w:after="100"/>
     </w:pPr>
@@ -20410,10 +22551,23 @@
     <w:autoRedefine/>
     <w:uiPriority w:val="39"/>
     <w:unhideWhenUsed/>
-    <w:rsid w:val="009D319E"/>
+    <w:rsid w:val="007102A4"/>
     <w:pPr>
       <w:spacing w:after="100"/>
       <w:ind w:left="210"/>
+    </w:pPr>
+  </w:style>
+  <w:style w:type="paragraph" w:styleId="TOC3">
+    <w:name w:val="toc 3"/>
+    <w:basedOn w:val="Normal"/>
+    <w:next w:val="Normal"/>
+    <w:autoRedefine/>
+    <w:uiPriority w:val="39"/>
+    <w:unhideWhenUsed/>
+    <w:rsid w:val="007102A4"/>
+    <w:pPr>
+      <w:spacing w:after="100"/>
+      <w:ind w:left="420"/>
     </w:pPr>
   </w:style>
   <w:style w:type="character" w:styleId="Hyperlink">
@@ -20421,7 +22575,7 @@
     <w:basedOn w:val="DefaultParagraphFont"/>
     <w:uiPriority w:val="99"/>
     <w:unhideWhenUsed/>
-    <w:rsid w:val="009D319E"/>
+    <w:rsid w:val="007102A4"/>
     <w:rPr>
       <w:color w:val="0000FF" w:themeColor="hyperlink"/>
       <w:u w:val="single"/>

</xml_diff>

<commit_message>
Cập nhật ảnh trạng thái tham gia giải
</commit_message>
<xml_diff>
--- a/TAI-LIEU.docx
+++ b/TAI-LIEU.docx
@@ -292,7 +292,7 @@
           <w:r>
             <w:fldChar w:fldCharType="separate"/>
           </w:r>
-          <w:hyperlink w:anchor="_Toc243866066" w:history="1">
+          <w:hyperlink w:anchor="_Toc243903605" w:history="1">
             <w:r>
               <w:rPr>
                 <w:rStyle w:val="Hyperlink"/>
@@ -319,7 +319,7 @@
                 <w:noProof/>
                 <w:webHidden/>
               </w:rPr>
-              <w:instrText xml:space="preserve"> PAGEREF _Toc243866066 \h </w:instrText>
+              <w:instrText xml:space="preserve"> PAGEREF _Toc243903605 \h </w:instrText>
             </w:r>
             <w:r>
               <w:rPr>
@@ -366,7 +366,7 @@
               <w14:ligatures w14:val="standardContextual"/>
             </w:rPr>
           </w:pPr>
-          <w:hyperlink w:anchor="_Toc243866067" w:history="1">
+          <w:hyperlink w:anchor="_Toc243903606" w:history="1">
             <w:r>
               <w:rPr>
                 <w:rStyle w:val="Hyperlink"/>
@@ -393,7 +393,7 @@
                 <w:noProof/>
                 <w:webHidden/>
               </w:rPr>
-              <w:instrText xml:space="preserve"> PAGEREF _Toc243866067 \h </w:instrText>
+              <w:instrText xml:space="preserve"> PAGEREF _Toc243903606 \h </w:instrText>
             </w:r>
             <w:r>
               <w:rPr>
@@ -440,7 +440,7 @@
               <w14:ligatures w14:val="standardContextual"/>
             </w:rPr>
           </w:pPr>
-          <w:hyperlink w:anchor="_Toc243866068" w:history="1">
+          <w:hyperlink w:anchor="_Toc243903607" w:history="1">
             <w:r>
               <w:rPr>
                 <w:rStyle w:val="Hyperlink"/>
@@ -467,7 +467,7 @@
                 <w:noProof/>
                 <w:webHidden/>
               </w:rPr>
-              <w:instrText xml:space="preserve"> PAGEREF _Toc243866068 \h </w:instrText>
+              <w:instrText xml:space="preserve"> PAGEREF _Toc243903607 \h </w:instrText>
             </w:r>
             <w:r>
               <w:rPr>
@@ -514,7 +514,7 @@
               <w14:ligatures w14:val="standardContextual"/>
             </w:rPr>
           </w:pPr>
-          <w:hyperlink w:anchor="_Toc243866069" w:history="1">
+          <w:hyperlink w:anchor="_Toc243903608" w:history="1">
             <w:r>
               <w:rPr>
                 <w:rStyle w:val="Hyperlink"/>
@@ -541,7 +541,7 @@
                 <w:noProof/>
                 <w:webHidden/>
               </w:rPr>
-              <w:instrText xml:space="preserve"> PAGEREF _Toc243866069 \h </w:instrText>
+              <w:instrText xml:space="preserve"> PAGEREF _Toc243903608 \h </w:instrText>
             </w:r>
             <w:r>
               <w:rPr>
@@ -588,7 +588,7 @@
               <w14:ligatures w14:val="standardContextual"/>
             </w:rPr>
           </w:pPr>
-          <w:hyperlink w:anchor="_Toc243866070" w:history="1">
+          <w:hyperlink w:anchor="_Toc243903609" w:history="1">
             <w:r>
               <w:rPr>
                 <w:rStyle w:val="Hyperlink"/>
@@ -615,7 +615,7 @@
                 <w:noProof/>
                 <w:webHidden/>
               </w:rPr>
-              <w:instrText xml:space="preserve"> PAGEREF _Toc243866070 \h </w:instrText>
+              <w:instrText xml:space="preserve"> PAGEREF _Toc243903609 \h </w:instrText>
             </w:r>
             <w:r>
               <w:rPr>
@@ -662,7 +662,7 @@
               <w14:ligatures w14:val="standardContextual"/>
             </w:rPr>
           </w:pPr>
-          <w:hyperlink w:anchor="_Toc243866071" w:history="1">
+          <w:hyperlink w:anchor="_Toc243903610" w:history="1">
             <w:r>
               <w:rPr>
                 <w:rStyle w:val="Hyperlink"/>
@@ -689,7 +689,7 @@
                 <w:noProof/>
                 <w:webHidden/>
               </w:rPr>
-              <w:instrText xml:space="preserve"> PAGEREF _Toc243866071 \h </w:instrText>
+              <w:instrText xml:space="preserve"> PAGEREF _Toc243903610 \h </w:instrText>
             </w:r>
             <w:r>
               <w:rPr>
@@ -736,7 +736,7 @@
               <w14:ligatures w14:val="standardContextual"/>
             </w:rPr>
           </w:pPr>
-          <w:hyperlink w:anchor="_Toc243866072" w:history="1">
+          <w:hyperlink w:anchor="_Toc243903611" w:history="1">
             <w:r>
               <w:rPr>
                 <w:rStyle w:val="Hyperlink"/>
@@ -763,7 +763,7 @@
                 <w:noProof/>
                 <w:webHidden/>
               </w:rPr>
-              <w:instrText xml:space="preserve"> PAGEREF _Toc243866072 \h </w:instrText>
+              <w:instrText xml:space="preserve"> PAGEREF _Toc243903611 \h </w:instrText>
             </w:r>
             <w:r>
               <w:rPr>
@@ -810,7 +810,7 @@
               <w14:ligatures w14:val="standardContextual"/>
             </w:rPr>
           </w:pPr>
-          <w:hyperlink w:anchor="_Toc243866073" w:history="1">
+          <w:hyperlink w:anchor="_Toc243903612" w:history="1">
             <w:r>
               <w:rPr>
                 <w:rStyle w:val="Hyperlink"/>
@@ -837,7 +837,7 @@
                 <w:noProof/>
                 <w:webHidden/>
               </w:rPr>
-              <w:instrText xml:space="preserve"> PAGEREF _Toc243866073 \h </w:instrText>
+              <w:instrText xml:space="preserve"> PAGEREF _Toc243903612 \h </w:instrText>
             </w:r>
             <w:r>
               <w:rPr>
@@ -884,7 +884,7 @@
               <w14:ligatures w14:val="standardContextual"/>
             </w:rPr>
           </w:pPr>
-          <w:hyperlink w:anchor="_Toc243866074" w:history="1">
+          <w:hyperlink w:anchor="_Toc243903613" w:history="1">
             <w:r>
               <w:rPr>
                 <w:rStyle w:val="Hyperlink"/>
@@ -911,7 +911,7 @@
                 <w:noProof/>
                 <w:webHidden/>
               </w:rPr>
-              <w:instrText xml:space="preserve"> PAGEREF _Toc243866074 \h </w:instrText>
+              <w:instrText xml:space="preserve"> PAGEREF _Toc243903613 \h </w:instrText>
             </w:r>
             <w:r>
               <w:rPr>
@@ -958,7 +958,7 @@
               <w14:ligatures w14:val="standardContextual"/>
             </w:rPr>
           </w:pPr>
-          <w:hyperlink w:anchor="_Toc243866075" w:history="1">
+          <w:hyperlink w:anchor="_Toc243903614" w:history="1">
             <w:r>
               <w:rPr>
                 <w:rStyle w:val="Hyperlink"/>
@@ -985,7 +985,7 @@
                 <w:noProof/>
                 <w:webHidden/>
               </w:rPr>
-              <w:instrText xml:space="preserve"> PAGEREF _Toc243866075 \h </w:instrText>
+              <w:instrText xml:space="preserve"> PAGEREF _Toc243903614 \h </w:instrText>
             </w:r>
             <w:r>
               <w:rPr>
@@ -1032,7 +1032,7 @@
               <w14:ligatures w14:val="standardContextual"/>
             </w:rPr>
           </w:pPr>
-          <w:hyperlink w:anchor="_Toc243866076" w:history="1">
+          <w:hyperlink w:anchor="_Toc243903615" w:history="1">
             <w:r>
               <w:rPr>
                 <w:rStyle w:val="Hyperlink"/>
@@ -1059,7 +1059,7 @@
                 <w:noProof/>
                 <w:webHidden/>
               </w:rPr>
-              <w:instrText xml:space="preserve"> PAGEREF _Toc243866076 \h </w:instrText>
+              <w:instrText xml:space="preserve"> PAGEREF _Toc243903615 \h </w:instrText>
             </w:r>
             <w:r>
               <w:rPr>
@@ -1106,7 +1106,7 @@
               <w14:ligatures w14:val="standardContextual"/>
             </w:rPr>
           </w:pPr>
-          <w:hyperlink w:anchor="_Toc243866077" w:history="1">
+          <w:hyperlink w:anchor="_Toc243903616" w:history="1">
             <w:r>
               <w:rPr>
                 <w:rStyle w:val="Hyperlink"/>
@@ -1133,7 +1133,7 @@
                 <w:noProof/>
                 <w:webHidden/>
               </w:rPr>
-              <w:instrText xml:space="preserve"> PAGEREF _Toc243866077 \h </w:instrText>
+              <w:instrText xml:space="preserve"> PAGEREF _Toc243903616 \h </w:instrText>
             </w:r>
             <w:r>
               <w:rPr>
@@ -1180,7 +1180,7 @@
               <w14:ligatures w14:val="standardContextual"/>
             </w:rPr>
           </w:pPr>
-          <w:hyperlink w:anchor="_Toc243866078" w:history="1">
+          <w:hyperlink w:anchor="_Toc243903617" w:history="1">
             <w:r>
               <w:rPr>
                 <w:rStyle w:val="Hyperlink"/>
@@ -1207,7 +1207,7 @@
                 <w:noProof/>
                 <w:webHidden/>
               </w:rPr>
-              <w:instrText xml:space="preserve"> PAGEREF _Toc243866078 \h </w:instrText>
+              <w:instrText xml:space="preserve"> PAGEREF _Toc243903617 \h </w:instrText>
             </w:r>
             <w:r>
               <w:rPr>
@@ -1254,7 +1254,7 @@
               <w14:ligatures w14:val="standardContextual"/>
             </w:rPr>
           </w:pPr>
-          <w:hyperlink w:anchor="_Toc243866079" w:history="1">
+          <w:hyperlink w:anchor="_Toc243903618" w:history="1">
             <w:r>
               <w:rPr>
                 <w:rStyle w:val="Hyperlink"/>
@@ -1281,7 +1281,7 @@
                 <w:noProof/>
                 <w:webHidden/>
               </w:rPr>
-              <w:instrText xml:space="preserve"> PAGEREF _Toc243866079 \h </w:instrText>
+              <w:instrText xml:space="preserve"> PAGEREF _Toc243903618 \h </w:instrText>
             </w:r>
             <w:r>
               <w:rPr>
@@ -1328,7 +1328,7 @@
               <w14:ligatures w14:val="standardContextual"/>
             </w:rPr>
           </w:pPr>
-          <w:hyperlink w:anchor="_Toc243866080" w:history="1">
+          <w:hyperlink w:anchor="_Toc243903619" w:history="1">
             <w:r>
               <w:rPr>
                 <w:rStyle w:val="Hyperlink"/>
@@ -1355,7 +1355,7 @@
                 <w:noProof/>
                 <w:webHidden/>
               </w:rPr>
-              <w:instrText xml:space="preserve"> PAGEREF _Toc243866080 \h </w:instrText>
+              <w:instrText xml:space="preserve"> PAGEREF _Toc243903619 \h </w:instrText>
             </w:r>
             <w:r>
               <w:rPr>
@@ -1402,7 +1402,7 @@
               <w14:ligatures w14:val="standardContextual"/>
             </w:rPr>
           </w:pPr>
-          <w:hyperlink w:anchor="_Toc243866081" w:history="1">
+          <w:hyperlink w:anchor="_Toc243903620" w:history="1">
             <w:r>
               <w:rPr>
                 <w:rStyle w:val="Hyperlink"/>
@@ -1429,7 +1429,7 @@
                 <w:noProof/>
                 <w:webHidden/>
               </w:rPr>
-              <w:instrText xml:space="preserve"> PAGEREF _Toc243866081 \h </w:instrText>
+              <w:instrText xml:space="preserve"> PAGEREF _Toc243903620 \h </w:instrText>
             </w:r>
             <w:r>
               <w:rPr>
@@ -1476,7 +1476,7 @@
               <w14:ligatures w14:val="standardContextual"/>
             </w:rPr>
           </w:pPr>
-          <w:hyperlink w:anchor="_Toc243866082" w:history="1">
+          <w:hyperlink w:anchor="_Toc243903621" w:history="1">
             <w:r>
               <w:rPr>
                 <w:rStyle w:val="Hyperlink"/>
@@ -1503,7 +1503,7 @@
                 <w:noProof/>
                 <w:webHidden/>
               </w:rPr>
-              <w:instrText xml:space="preserve"> PAGEREF _Toc243866082 \h </w:instrText>
+              <w:instrText xml:space="preserve"> PAGEREF _Toc243903621 \h </w:instrText>
             </w:r>
             <w:r>
               <w:rPr>
@@ -1550,7 +1550,7 @@
               <w14:ligatures w14:val="standardContextual"/>
             </w:rPr>
           </w:pPr>
-          <w:hyperlink w:anchor="_Toc243866083" w:history="1">
+          <w:hyperlink w:anchor="_Toc243903622" w:history="1">
             <w:r>
               <w:rPr>
                 <w:rStyle w:val="Hyperlink"/>
@@ -1577,7 +1577,7 @@
                 <w:noProof/>
                 <w:webHidden/>
               </w:rPr>
-              <w:instrText xml:space="preserve"> PAGEREF _Toc243866083 \h </w:instrText>
+              <w:instrText xml:space="preserve"> PAGEREF _Toc243903622 \h </w:instrText>
             </w:r>
             <w:r>
               <w:rPr>
@@ -1624,7 +1624,7 @@
               <w14:ligatures w14:val="standardContextual"/>
             </w:rPr>
           </w:pPr>
-          <w:hyperlink w:anchor="_Toc243866084" w:history="1">
+          <w:hyperlink w:anchor="_Toc243903623" w:history="1">
             <w:r>
               <w:rPr>
                 <w:rStyle w:val="Hyperlink"/>
@@ -1651,7 +1651,7 @@
                 <w:noProof/>
                 <w:webHidden/>
               </w:rPr>
-              <w:instrText xml:space="preserve"> PAGEREF _Toc243866084 \h </w:instrText>
+              <w:instrText xml:space="preserve"> PAGEREF _Toc243903623 \h </w:instrText>
             </w:r>
             <w:r>
               <w:rPr>
@@ -1698,7 +1698,7 @@
               <w14:ligatures w14:val="standardContextual"/>
             </w:rPr>
           </w:pPr>
-          <w:hyperlink w:anchor="_Toc243866085" w:history="1">
+          <w:hyperlink w:anchor="_Toc243903624" w:history="1">
             <w:r>
               <w:rPr>
                 <w:rStyle w:val="Hyperlink"/>
@@ -1725,7 +1725,7 @@
                 <w:noProof/>
                 <w:webHidden/>
               </w:rPr>
-              <w:instrText xml:space="preserve"> PAGEREF _Toc243866085 \h </w:instrText>
+              <w:instrText xml:space="preserve"> PAGEREF _Toc243903624 \h </w:instrText>
             </w:r>
             <w:r>
               <w:rPr>
@@ -1772,7 +1772,7 @@
               <w14:ligatures w14:val="standardContextual"/>
             </w:rPr>
           </w:pPr>
-          <w:hyperlink w:anchor="_Toc243866086" w:history="1">
+          <w:hyperlink w:anchor="_Toc243903625" w:history="1">
             <w:r>
               <w:rPr>
                 <w:rStyle w:val="Hyperlink"/>
@@ -1799,7 +1799,7 @@
                 <w:noProof/>
                 <w:webHidden/>
               </w:rPr>
-              <w:instrText xml:space="preserve"> PAGEREF _Toc243866086 \h </w:instrText>
+              <w:instrText xml:space="preserve"> PAGEREF _Toc243903625 \h </w:instrText>
             </w:r>
             <w:r>
               <w:rPr>
@@ -1846,7 +1846,7 @@
               <w14:ligatures w14:val="standardContextual"/>
             </w:rPr>
           </w:pPr>
-          <w:hyperlink w:anchor="_Toc243866087" w:history="1">
+          <w:hyperlink w:anchor="_Toc243903626" w:history="1">
             <w:r>
               <w:rPr>
                 <w:rStyle w:val="Hyperlink"/>
@@ -1873,7 +1873,7 @@
                 <w:noProof/>
                 <w:webHidden/>
               </w:rPr>
-              <w:instrText xml:space="preserve"> PAGEREF _Toc243866087 \h </w:instrText>
+              <w:instrText xml:space="preserve"> PAGEREF _Toc243903626 \h </w:instrText>
             </w:r>
             <w:r>
               <w:rPr>
@@ -1920,7 +1920,7 @@
               <w14:ligatures w14:val="standardContextual"/>
             </w:rPr>
           </w:pPr>
-          <w:hyperlink w:anchor="_Toc243866088" w:history="1">
+          <w:hyperlink w:anchor="_Toc243903627" w:history="1">
             <w:r>
               <w:rPr>
                 <w:rStyle w:val="Hyperlink"/>
@@ -1947,7 +1947,7 @@
                 <w:noProof/>
                 <w:webHidden/>
               </w:rPr>
-              <w:instrText xml:space="preserve"> PAGEREF _Toc243866088 \h </w:instrText>
+              <w:instrText xml:space="preserve"> PAGEREF _Toc243903627 \h </w:instrText>
             </w:r>
             <w:r>
               <w:rPr>
@@ -1994,7 +1994,7 @@
               <w14:ligatures w14:val="standardContextual"/>
             </w:rPr>
           </w:pPr>
-          <w:hyperlink w:anchor="_Toc243866089" w:history="1">
+          <w:hyperlink w:anchor="_Toc243903628" w:history="1">
             <w:r>
               <w:rPr>
                 <w:rStyle w:val="Hyperlink"/>
@@ -2021,7 +2021,7 @@
                 <w:noProof/>
                 <w:webHidden/>
               </w:rPr>
-              <w:instrText xml:space="preserve"> PAGEREF _Toc243866089 \h </w:instrText>
+              <w:instrText xml:space="preserve"> PAGEREF _Toc243903628 \h </w:instrText>
             </w:r>
             <w:r>
               <w:rPr>
@@ -2068,7 +2068,7 @@
               <w14:ligatures w14:val="standardContextual"/>
             </w:rPr>
           </w:pPr>
-          <w:hyperlink w:anchor="_Toc243866090" w:history="1">
+          <w:hyperlink w:anchor="_Toc243903629" w:history="1">
             <w:r>
               <w:rPr>
                 <w:rStyle w:val="Hyperlink"/>
@@ -2095,7 +2095,7 @@
                 <w:noProof/>
                 <w:webHidden/>
               </w:rPr>
-              <w:instrText xml:space="preserve"> PAGEREF _Toc243866090 \h </w:instrText>
+              <w:instrText xml:space="preserve"> PAGEREF _Toc243903629 \h </w:instrText>
             </w:r>
             <w:r>
               <w:rPr>
@@ -2142,7 +2142,7 @@
               <w14:ligatures w14:val="standardContextual"/>
             </w:rPr>
           </w:pPr>
-          <w:hyperlink w:anchor="_Toc243866091" w:history="1">
+          <w:hyperlink w:anchor="_Toc243903630" w:history="1">
             <w:r>
               <w:rPr>
                 <w:rStyle w:val="Hyperlink"/>
@@ -2169,7 +2169,7 @@
                 <w:noProof/>
                 <w:webHidden/>
               </w:rPr>
-              <w:instrText xml:space="preserve"> PAGEREF _Toc243866091 \h </w:instrText>
+              <w:instrText xml:space="preserve"> PAGEREF _Toc243903630 \h </w:instrText>
             </w:r>
             <w:r>
               <w:rPr>
@@ -2216,7 +2216,7 @@
               <w14:ligatures w14:val="standardContextual"/>
             </w:rPr>
           </w:pPr>
-          <w:hyperlink w:anchor="_Toc243866092" w:history="1">
+          <w:hyperlink w:anchor="_Toc243903631" w:history="1">
             <w:r>
               <w:rPr>
                 <w:rStyle w:val="Hyperlink"/>
@@ -2243,7 +2243,7 @@
                 <w:noProof/>
                 <w:webHidden/>
               </w:rPr>
-              <w:instrText xml:space="preserve"> PAGEREF _Toc243866092 \h </w:instrText>
+              <w:instrText xml:space="preserve"> PAGEREF _Toc243903631 \h </w:instrText>
             </w:r>
             <w:r>
               <w:rPr>
@@ -2290,7 +2290,7 @@
               <w14:ligatures w14:val="standardContextual"/>
             </w:rPr>
           </w:pPr>
-          <w:hyperlink w:anchor="_Toc243866093" w:history="1">
+          <w:hyperlink w:anchor="_Toc243903632" w:history="1">
             <w:r>
               <w:rPr>
                 <w:rStyle w:val="Hyperlink"/>
@@ -2317,7 +2317,7 @@
                 <w:noProof/>
                 <w:webHidden/>
               </w:rPr>
-              <w:instrText xml:space="preserve"> PAGEREF _Toc243866093 \h </w:instrText>
+              <w:instrText xml:space="preserve"> PAGEREF _Toc243903632 \h </w:instrText>
             </w:r>
             <w:r>
               <w:rPr>
@@ -2364,7 +2364,7 @@
               <w14:ligatures w14:val="standardContextual"/>
             </w:rPr>
           </w:pPr>
-          <w:hyperlink w:anchor="_Toc243866094" w:history="1">
+          <w:hyperlink w:anchor="_Toc243903633" w:history="1">
             <w:r>
               <w:rPr>
                 <w:rStyle w:val="Hyperlink"/>
@@ -2391,7 +2391,7 @@
                 <w:noProof/>
                 <w:webHidden/>
               </w:rPr>
-              <w:instrText xml:space="preserve"> PAGEREF _Toc243866094 \h </w:instrText>
+              <w:instrText xml:space="preserve"> PAGEREF _Toc243903633 \h </w:instrText>
             </w:r>
             <w:r>
               <w:rPr>
@@ -2438,7 +2438,7 @@
               <w14:ligatures w14:val="standardContextual"/>
             </w:rPr>
           </w:pPr>
-          <w:hyperlink w:anchor="_Toc243866095" w:history="1">
+          <w:hyperlink w:anchor="_Toc243903634" w:history="1">
             <w:r>
               <w:rPr>
                 <w:rStyle w:val="Hyperlink"/>
@@ -2465,7 +2465,7 @@
                 <w:noProof/>
                 <w:webHidden/>
               </w:rPr>
-              <w:instrText xml:space="preserve"> PAGEREF _Toc243866095 \h </w:instrText>
+              <w:instrText xml:space="preserve"> PAGEREF _Toc243903634 \h </w:instrText>
             </w:r>
             <w:r>
               <w:rPr>
@@ -2512,7 +2512,7 @@
               <w14:ligatures w14:val="standardContextual"/>
             </w:rPr>
           </w:pPr>
-          <w:hyperlink w:anchor="_Toc243866096" w:history="1">
+          <w:hyperlink w:anchor="_Toc243903635" w:history="1">
             <w:r>
               <w:rPr>
                 <w:rStyle w:val="Hyperlink"/>
@@ -2539,7 +2539,7 @@
                 <w:noProof/>
                 <w:webHidden/>
               </w:rPr>
-              <w:instrText xml:space="preserve"> PAGEREF _Toc243866096 \h </w:instrText>
+              <w:instrText xml:space="preserve"> PAGEREF _Toc243903635 \h </w:instrText>
             </w:r>
             <w:r>
               <w:rPr>
@@ -2586,7 +2586,7 @@
               <w14:ligatures w14:val="standardContextual"/>
             </w:rPr>
           </w:pPr>
-          <w:hyperlink w:anchor="_Toc243866097" w:history="1">
+          <w:hyperlink w:anchor="_Toc243903636" w:history="1">
             <w:r>
               <w:rPr>
                 <w:rStyle w:val="Hyperlink"/>
@@ -2613,7 +2613,7 @@
                 <w:noProof/>
                 <w:webHidden/>
               </w:rPr>
-              <w:instrText xml:space="preserve"> PAGEREF _Toc243866097 \h </w:instrText>
+              <w:instrText xml:space="preserve"> PAGEREF _Toc243903636 \h </w:instrText>
             </w:r>
             <w:r>
               <w:rPr>
@@ -2660,7 +2660,7 @@
               <w14:ligatures w14:val="standardContextual"/>
             </w:rPr>
           </w:pPr>
-          <w:hyperlink w:anchor="_Toc243866098" w:history="1">
+          <w:hyperlink w:anchor="_Toc243903637" w:history="1">
             <w:r>
               <w:rPr>
                 <w:rStyle w:val="Hyperlink"/>
@@ -2687,7 +2687,7 @@
                 <w:noProof/>
                 <w:webHidden/>
               </w:rPr>
-              <w:instrText xml:space="preserve"> PAGEREF _Toc243866098 \h </w:instrText>
+              <w:instrText xml:space="preserve"> PAGEREF _Toc243903637 \h </w:instrText>
             </w:r>
             <w:r>
               <w:rPr>
@@ -2734,7 +2734,7 @@
               <w14:ligatures w14:val="standardContextual"/>
             </w:rPr>
           </w:pPr>
-          <w:hyperlink w:anchor="_Toc243866099" w:history="1">
+          <w:hyperlink w:anchor="_Toc243903638" w:history="1">
             <w:r>
               <w:rPr>
                 <w:rStyle w:val="Hyperlink"/>
@@ -2761,7 +2761,7 @@
                 <w:noProof/>
                 <w:webHidden/>
               </w:rPr>
-              <w:instrText xml:space="preserve"> PAGEREF _Toc243866099 \h </w:instrText>
+              <w:instrText xml:space="preserve"> PAGEREF _Toc243903638 \h </w:instrText>
             </w:r>
             <w:r>
               <w:rPr>
@@ -2808,7 +2808,7 @@
               <w14:ligatures w14:val="standardContextual"/>
             </w:rPr>
           </w:pPr>
-          <w:hyperlink w:anchor="_Toc243866100" w:history="1">
+          <w:hyperlink w:anchor="_Toc243903639" w:history="1">
             <w:r>
               <w:rPr>
                 <w:rStyle w:val="Hyperlink"/>
@@ -2835,7 +2835,7 @@
                 <w:noProof/>
                 <w:webHidden/>
               </w:rPr>
-              <w:instrText xml:space="preserve"> PAGEREF _Toc243866100 \h </w:instrText>
+              <w:instrText xml:space="preserve"> PAGEREF _Toc243903639 \h </w:instrText>
             </w:r>
             <w:r>
               <w:rPr>
@@ -2882,7 +2882,7 @@
               <w14:ligatures w14:val="standardContextual"/>
             </w:rPr>
           </w:pPr>
-          <w:hyperlink w:anchor="_Toc243866101" w:history="1">
+          <w:hyperlink w:anchor="_Toc243903640" w:history="1">
             <w:r>
               <w:rPr>
                 <w:rStyle w:val="Hyperlink"/>
@@ -2909,7 +2909,7 @@
                 <w:noProof/>
                 <w:webHidden/>
               </w:rPr>
-              <w:instrText xml:space="preserve"> PAGEREF _Toc243866101 \h </w:instrText>
+              <w:instrText xml:space="preserve"> PAGEREF _Toc243903640 \h </w:instrText>
             </w:r>
             <w:r>
               <w:rPr>
@@ -2956,7 +2956,7 @@
               <w14:ligatures w14:val="standardContextual"/>
             </w:rPr>
           </w:pPr>
-          <w:hyperlink w:anchor="_Toc243866102" w:history="1">
+          <w:hyperlink w:anchor="_Toc243903641" w:history="1">
             <w:r>
               <w:rPr>
                 <w:rStyle w:val="Hyperlink"/>
@@ -2983,7 +2983,7 @@
                 <w:noProof/>
                 <w:webHidden/>
               </w:rPr>
-              <w:instrText xml:space="preserve"> PAGEREF _Toc243866102 \h </w:instrText>
+              <w:instrText xml:space="preserve"> PAGEREF _Toc243903641 \h </w:instrText>
             </w:r>
             <w:r>
               <w:rPr>
@@ -3030,7 +3030,7 @@
               <w14:ligatures w14:val="standardContextual"/>
             </w:rPr>
           </w:pPr>
-          <w:hyperlink w:anchor="_Toc243866103" w:history="1">
+          <w:hyperlink w:anchor="_Toc243903642" w:history="1">
             <w:r>
               <w:rPr>
                 <w:rStyle w:val="Hyperlink"/>
@@ -3057,7 +3057,7 @@
                 <w:noProof/>
                 <w:webHidden/>
               </w:rPr>
-              <w:instrText xml:space="preserve"> PAGEREF _Toc243866103 \h </w:instrText>
+              <w:instrText xml:space="preserve"> PAGEREF _Toc243903642 \h </w:instrText>
             </w:r>
             <w:r>
               <w:rPr>
@@ -3104,7 +3104,7 @@
               <w14:ligatures w14:val="standardContextual"/>
             </w:rPr>
           </w:pPr>
-          <w:hyperlink w:anchor="_Toc243866104" w:history="1">
+          <w:hyperlink w:anchor="_Toc243903643" w:history="1">
             <w:r>
               <w:rPr>
                 <w:rStyle w:val="Hyperlink"/>
@@ -3131,7 +3131,7 @@
                 <w:noProof/>
                 <w:webHidden/>
               </w:rPr>
-              <w:instrText xml:space="preserve"> PAGEREF _Toc243866104 \h </w:instrText>
+              <w:instrText xml:space="preserve"> PAGEREF _Toc243903643 \h </w:instrText>
             </w:r>
             <w:r>
               <w:rPr>
@@ -3178,7 +3178,7 @@
               <w14:ligatures w14:val="standardContextual"/>
             </w:rPr>
           </w:pPr>
-          <w:hyperlink w:anchor="_Toc243866105" w:history="1">
+          <w:hyperlink w:anchor="_Toc243903644" w:history="1">
             <w:r>
               <w:rPr>
                 <w:rStyle w:val="Hyperlink"/>
@@ -3205,7 +3205,7 @@
                 <w:noProof/>
                 <w:webHidden/>
               </w:rPr>
-              <w:instrText xml:space="preserve"> PAGEREF _Toc243866105 \h </w:instrText>
+              <w:instrText xml:space="preserve"> PAGEREF _Toc243903644 \h </w:instrText>
             </w:r>
             <w:r>
               <w:rPr>
@@ -3252,7 +3252,7 @@
               <w14:ligatures w14:val="standardContextual"/>
             </w:rPr>
           </w:pPr>
-          <w:hyperlink w:anchor="_Toc243866106" w:history="1">
+          <w:hyperlink w:anchor="_Toc243903645" w:history="1">
             <w:r>
               <w:rPr>
                 <w:rStyle w:val="Hyperlink"/>
@@ -3279,7 +3279,7 @@
                 <w:noProof/>
                 <w:webHidden/>
               </w:rPr>
-              <w:instrText xml:space="preserve"> PAGEREF _Toc243866106 \h </w:instrText>
+              <w:instrText xml:space="preserve"> PAGEREF _Toc243903645 \h </w:instrText>
             </w:r>
             <w:r>
               <w:rPr>
@@ -3326,7 +3326,7 @@
               <w14:ligatures w14:val="standardContextual"/>
             </w:rPr>
           </w:pPr>
-          <w:hyperlink w:anchor="_Toc243866107" w:history="1">
+          <w:hyperlink w:anchor="_Toc243903646" w:history="1">
             <w:r>
               <w:rPr>
                 <w:rStyle w:val="Hyperlink"/>
@@ -3353,7 +3353,7 @@
                 <w:noProof/>
                 <w:webHidden/>
               </w:rPr>
-              <w:instrText xml:space="preserve"> PAGEREF _Toc243866107 \h </w:instrText>
+              <w:instrText xml:space="preserve"> PAGEREF _Toc243903646 \h </w:instrText>
             </w:r>
             <w:r>
               <w:rPr>
@@ -3400,7 +3400,7 @@
               <w14:ligatures w14:val="standardContextual"/>
             </w:rPr>
           </w:pPr>
-          <w:hyperlink w:anchor="_Toc243866108" w:history="1">
+          <w:hyperlink w:anchor="_Toc243903647" w:history="1">
             <w:r>
               <w:rPr>
                 <w:rStyle w:val="Hyperlink"/>
@@ -3427,7 +3427,7 @@
                 <w:noProof/>
                 <w:webHidden/>
               </w:rPr>
-              <w:instrText xml:space="preserve"> PAGEREF _Toc243866108 \h </w:instrText>
+              <w:instrText xml:space="preserve"> PAGEREF _Toc243903647 \h </w:instrText>
             </w:r>
             <w:r>
               <w:rPr>
@@ -3474,7 +3474,7 @@
               <w14:ligatures w14:val="standardContextual"/>
             </w:rPr>
           </w:pPr>
-          <w:hyperlink w:anchor="_Toc243866109" w:history="1">
+          <w:hyperlink w:anchor="_Toc243903648" w:history="1">
             <w:r>
               <w:rPr>
                 <w:rStyle w:val="Hyperlink"/>
@@ -3501,7 +3501,7 @@
                 <w:noProof/>
                 <w:webHidden/>
               </w:rPr>
-              <w:instrText xml:space="preserve"> PAGEREF _Toc243866109 \h </w:instrText>
+              <w:instrText xml:space="preserve"> PAGEREF _Toc243903648 \h </w:instrText>
             </w:r>
             <w:r>
               <w:rPr>
@@ -3548,7 +3548,7 @@
               <w14:ligatures w14:val="standardContextual"/>
             </w:rPr>
           </w:pPr>
-          <w:hyperlink w:anchor="_Toc243866110" w:history="1">
+          <w:hyperlink w:anchor="_Toc243903649" w:history="1">
             <w:r>
               <w:rPr>
                 <w:rStyle w:val="Hyperlink"/>
@@ -3575,7 +3575,7 @@
                 <w:noProof/>
                 <w:webHidden/>
               </w:rPr>
-              <w:instrText xml:space="preserve"> PAGEREF _Toc243866110 \h </w:instrText>
+              <w:instrText xml:space="preserve"> PAGEREF _Toc243903649 \h </w:instrText>
             </w:r>
             <w:r>
               <w:rPr>
@@ -3622,7 +3622,7 @@
               <w14:ligatures w14:val="standardContextual"/>
             </w:rPr>
           </w:pPr>
-          <w:hyperlink w:anchor="_Toc243866111" w:history="1">
+          <w:hyperlink w:anchor="_Toc243903650" w:history="1">
             <w:r>
               <w:rPr>
                 <w:rStyle w:val="Hyperlink"/>
@@ -3649,7 +3649,7 @@
                 <w:noProof/>
                 <w:webHidden/>
               </w:rPr>
-              <w:instrText xml:space="preserve"> PAGEREF _Toc243866111 \h </w:instrText>
+              <w:instrText xml:space="preserve"> PAGEREF _Toc243903650 \h </w:instrText>
             </w:r>
             <w:r>
               <w:rPr>
@@ -3696,7 +3696,7 @@
               <w14:ligatures w14:val="standardContextual"/>
             </w:rPr>
           </w:pPr>
-          <w:hyperlink w:anchor="_Toc243866112" w:history="1">
+          <w:hyperlink w:anchor="_Toc243903651" w:history="1">
             <w:r>
               <w:rPr>
                 <w:rStyle w:val="Hyperlink"/>
@@ -3723,7 +3723,7 @@
                 <w:noProof/>
                 <w:webHidden/>
               </w:rPr>
-              <w:instrText xml:space="preserve"> PAGEREF _Toc243866112 \h </w:instrText>
+              <w:instrText xml:space="preserve"> PAGEREF _Toc243903651 \h </w:instrText>
             </w:r>
             <w:r>
               <w:rPr>
@@ -3770,7 +3770,7 @@
               <w14:ligatures w14:val="standardContextual"/>
             </w:rPr>
           </w:pPr>
-          <w:hyperlink w:anchor="_Toc243866113" w:history="1">
+          <w:hyperlink w:anchor="_Toc243903652" w:history="1">
             <w:r>
               <w:rPr>
                 <w:rStyle w:val="Hyperlink"/>
@@ -3797,7 +3797,7 @@
                 <w:noProof/>
                 <w:webHidden/>
               </w:rPr>
-              <w:instrText xml:space="preserve"> PAGEREF _Toc243866113 \h </w:instrText>
+              <w:instrText xml:space="preserve"> PAGEREF _Toc243903652 \h </w:instrText>
             </w:r>
             <w:r>
               <w:rPr>
@@ -3844,7 +3844,7 @@
               <w14:ligatures w14:val="standardContextual"/>
             </w:rPr>
           </w:pPr>
-          <w:hyperlink w:anchor="_Toc243866114" w:history="1">
+          <w:hyperlink w:anchor="_Toc243903653" w:history="1">
             <w:r>
               <w:rPr>
                 <w:rStyle w:val="Hyperlink"/>
@@ -3871,7 +3871,7 @@
                 <w:noProof/>
                 <w:webHidden/>
               </w:rPr>
-              <w:instrText xml:space="preserve"> PAGEREF _Toc243866114 \h </w:instrText>
+              <w:instrText xml:space="preserve"> PAGEREF _Toc243903653 \h </w:instrText>
             </w:r>
             <w:r>
               <w:rPr>
@@ -3915,7 +3915,7 @@
         <w:pageBreakBefore/>
       </w:pPr>
       <w:bookmarkStart w:id="0" w:name="mở-đầu"/>
-      <w:bookmarkStart w:id="1" w:name="_Toc243866066"/>
+      <w:bookmarkStart w:id="1" w:name="_Toc243903605"/>
       <w:r>
         <w:lastRenderedPageBreak/>
         <w:t>Mở đầu</w:t>
@@ -4070,7 +4070,7 @@
         <w:pageBreakBefore/>
       </w:pPr>
       <w:bookmarkStart w:id="2" w:name="phần-a-giải-đấu"/>
-      <w:bookmarkStart w:id="3" w:name="_Toc243866067"/>
+      <w:bookmarkStart w:id="3" w:name="_Toc243903606"/>
       <w:bookmarkEnd w:id="0"/>
       <w:r>
         <w:lastRenderedPageBreak/>
@@ -4083,7 +4083,7 @@
         <w:pStyle w:val="Heading2"/>
       </w:pPr>
       <w:bookmarkStart w:id="4" w:name="a1-trò-chơi-ottv2"/>
-      <w:bookmarkStart w:id="5" w:name="_Toc243866068"/>
+      <w:bookmarkStart w:id="5" w:name="_Toc243903607"/>
       <w:r>
         <w:t>A1 Trò chơi OTTv2</w:t>
       </w:r>
@@ -4342,7 +4342,7 @@
         <w:pStyle w:val="Heading2"/>
       </w:pPr>
       <w:bookmarkStart w:id="6" w:name="a2-tài-khoản-và-đội"/>
-      <w:bookmarkStart w:id="7" w:name="_Toc243866069"/>
+      <w:bookmarkStart w:id="7" w:name="_Toc243903608"/>
       <w:bookmarkEnd w:id="4"/>
       <w:r>
         <w:t>A2 Tài khoản và đội</w:t>
@@ -4636,7 +4636,7 @@
         <w:pStyle w:val="Heading2"/>
       </w:pPr>
       <w:bookmarkStart w:id="8" w:name="a3-nộp-bot-qua-github"/>
-      <w:bookmarkStart w:id="9" w:name="_Toc243866070"/>
+      <w:bookmarkStart w:id="9" w:name="_Toc243903609"/>
       <w:bookmarkEnd w:id="6"/>
       <w:r>
         <w:t>A3 Nộp bot qua GitHub</w:t>
@@ -5039,7 +5039,7 @@
         <w:pStyle w:val="Heading2"/>
       </w:pPr>
       <w:bookmarkStart w:id="10" w:name="a4-thể-lệ-và-lịch-đấu"/>
-      <w:bookmarkStart w:id="11" w:name="_Toc243866071"/>
+      <w:bookmarkStart w:id="11" w:name="_Toc243903610"/>
       <w:bookmarkEnd w:id="8"/>
       <w:r>
         <w:t>A4 Thể lệ và lịch đấu</w:t>
@@ -5051,7 +5051,7 @@
         <w:pStyle w:val="Heading3"/>
       </w:pPr>
       <w:bookmarkStart w:id="12" w:name="ladder-trước-hạn"/>
-      <w:bookmarkStart w:id="13" w:name="_Toc243866072"/>
+      <w:bookmarkStart w:id="13" w:name="_Toc243903611"/>
       <w:r>
         <w:t>Ladder trước hạn</w:t>
       </w:r>
@@ -5101,7 +5101,7 @@
         <w:pStyle w:val="Heading3"/>
       </w:pPr>
       <w:bookmarkStart w:id="14" w:name="chốt-bài-tại-hạn"/>
-      <w:bookmarkStart w:id="15" w:name="_Toc243866073"/>
+      <w:bookmarkStart w:id="15" w:name="_Toc243903612"/>
       <w:bookmarkEnd w:id="12"/>
       <w:r>
         <w:t>Chốt bài tại hạn</w:t>
@@ -5126,7 +5126,7 @@
         <w:pStyle w:val="Heading3"/>
       </w:pPr>
       <w:bookmarkStart w:id="16" w:name="xếp-hạng-chính-thức"/>
-      <w:bookmarkStart w:id="17" w:name="_Toc243866074"/>
+      <w:bookmarkStart w:id="17" w:name="_Toc243903613"/>
       <w:bookmarkEnd w:id="14"/>
       <w:r>
         <w:lastRenderedPageBreak/>
@@ -5450,7 +5450,7 @@
         <w:pStyle w:val="Heading2"/>
       </w:pPr>
       <w:bookmarkStart w:id="18" w:name="a5-xem-kết-quả"/>
-      <w:bookmarkStart w:id="19" w:name="_Toc243866075"/>
+      <w:bookmarkStart w:id="19" w:name="_Toc243903614"/>
       <w:bookmarkEnd w:id="16"/>
       <w:bookmarkEnd w:id="10"/>
       <w:r>
@@ -5618,7 +5618,7 @@
         <w:pStyle w:val="Heading2"/>
       </w:pPr>
       <w:bookmarkStart w:id="20" w:name="a6-ban-tổ-chức-và-điều-hành"/>
-      <w:bookmarkStart w:id="21" w:name="_Toc243866076"/>
+      <w:bookmarkStart w:id="21" w:name="_Toc243903615"/>
       <w:bookmarkEnd w:id="18"/>
       <w:r>
         <w:t>A6 Ban tổ chức và điều hành</w:t>
@@ -5739,7 +5739,7 @@
         <w:pageBreakBefore/>
       </w:pPr>
       <w:bookmarkStart w:id="22" w:name="phần-b-thiết-kế-kỹ-thuật"/>
-      <w:bookmarkStart w:id="23" w:name="_Toc243866077"/>
+      <w:bookmarkStart w:id="23" w:name="_Toc243903616"/>
       <w:bookmarkEnd w:id="20"/>
       <w:bookmarkEnd w:id="2"/>
       <w:r>
@@ -5753,7 +5753,7 @@
         <w:pStyle w:val="Heading2"/>
       </w:pPr>
       <w:bookmarkStart w:id="24" w:name="b1-kiến-trúc-tổng-thể"/>
-      <w:bookmarkStart w:id="25" w:name="_Toc243866078"/>
+      <w:bookmarkStart w:id="25" w:name="_Toc243903617"/>
       <w:r>
         <w:t>B1 Kiến trúc tổng thể</w:t>
       </w:r>
@@ -5855,7 +5855,7 @@
         <w:pStyle w:val="Heading2"/>
       </w:pPr>
       <w:bookmarkStart w:id="26" w:name="b2-dịch-vụ-được-dùng"/>
-      <w:bookmarkStart w:id="27" w:name="_Toc243866079"/>
+      <w:bookmarkStart w:id="27" w:name="_Toc243903618"/>
       <w:bookmarkEnd w:id="24"/>
       <w:r>
         <w:t>B2 Dịch vụ được dùng</w:t>
@@ -6181,7 +6181,7 @@
         <w:pStyle w:val="Heading2"/>
       </w:pPr>
       <w:bookmarkStart w:id="28" w:name="b3-hub-và-cách-phục-vụ-dữ-liệu"/>
-      <w:bookmarkStart w:id="29" w:name="_Toc243866080"/>
+      <w:bookmarkStart w:id="29" w:name="_Toc243903619"/>
       <w:bookmarkEnd w:id="26"/>
       <w:r>
         <w:t>B3 Hub và cách phục vụ dữ liệu</w:t>
@@ -6238,7 +6238,7 @@
         <w:pStyle w:val="Heading2"/>
       </w:pPr>
       <w:bookmarkStart w:id="30" w:name="b4-máy-chấm-và-chia-việc"/>
-      <w:bookmarkStart w:id="31" w:name="_Toc243866081"/>
+      <w:bookmarkStart w:id="31" w:name="_Toc243903620"/>
       <w:bookmarkEnd w:id="28"/>
       <w:r>
         <w:t>B4 Máy chấm và chia việc</w:t>
@@ -6361,7 +6361,7 @@
         <w:pStyle w:val="Heading2"/>
       </w:pPr>
       <w:bookmarkStart w:id="32" w:name="b5-sandbox-thay-docker"/>
-      <w:bookmarkStart w:id="33" w:name="_Toc243866082"/>
+      <w:bookmarkStart w:id="33" w:name="_Toc243903621"/>
       <w:bookmarkEnd w:id="30"/>
       <w:r>
         <w:t>B5 Sandbox thay Docker</w:t>
@@ -6403,7 +6403,7 @@
         <w:pStyle w:val="Heading2"/>
       </w:pPr>
       <w:bookmarkStart w:id="34" w:name="b6-quỹ-giờ-và-khả-năng-đối-chiếu"/>
-      <w:bookmarkStart w:id="35" w:name="_Toc243866083"/>
+      <w:bookmarkStart w:id="35" w:name="_Toc243903622"/>
       <w:bookmarkEnd w:id="32"/>
       <w:r>
         <w:t>B6 Quỹ giờ và khả năng đối chiếu</w:t>
@@ -6452,7 +6452,7 @@
         <w:pStyle w:val="Heading2"/>
       </w:pPr>
       <w:bookmarkStart w:id="36" w:name="b7-chịu-lỗi-và-sao-lưu"/>
-      <w:bookmarkStart w:id="37" w:name="_Toc243866084"/>
+      <w:bookmarkStart w:id="37" w:name="_Toc243903623"/>
       <w:bookmarkEnd w:id="34"/>
       <w:r>
         <w:t>B7 Chịu lỗi và sao lưu</w:t>
@@ -6815,7 +6815,7 @@
         <w:pStyle w:val="Heading2"/>
       </w:pPr>
       <w:bookmarkStart w:id="38" w:name="b8-bảo-mật"/>
-      <w:bookmarkStart w:id="39" w:name="_Toc243866085"/>
+      <w:bookmarkStart w:id="39" w:name="_Toc243903624"/>
       <w:bookmarkEnd w:id="36"/>
       <w:r>
         <w:t>B8 Bảo mật</w:t>
@@ -6873,7 +6873,7 @@
         <w:pStyle w:val="Heading2"/>
       </w:pPr>
       <w:bookmarkStart w:id="40" w:name="b9-sức-tải-và-thời-gian-đã-đo"/>
-      <w:bookmarkStart w:id="41" w:name="_Toc243866086"/>
+      <w:bookmarkStart w:id="41" w:name="_Toc243903625"/>
       <w:bookmarkEnd w:id="38"/>
       <w:r>
         <w:t>B9 Sức tải và thời gian đã đo</w:t>
@@ -7994,7 +7994,7 @@
         <w:pStyle w:val="Heading2"/>
       </w:pPr>
       <w:bookmarkStart w:id="42" w:name="b10-cài-đặt-và-vận-hành"/>
-      <w:bookmarkStart w:id="43" w:name="_Toc243866087"/>
+      <w:bookmarkStart w:id="43" w:name="_Toc243903626"/>
       <w:bookmarkEnd w:id="40"/>
       <w:r>
         <w:t>B10 Cài đặt và vận hành</w:t>
@@ -8109,7 +8109,7 @@
         <w:pageBreakBefore/>
       </w:pPr>
       <w:bookmarkStart w:id="44" w:name="b11-giới-hạn-và-hướng-tiếp"/>
-      <w:bookmarkStart w:id="45" w:name="_Toc243866088"/>
+      <w:bookmarkStart w:id="45" w:name="_Toc243903627"/>
       <w:bookmarkEnd w:id="42"/>
       <w:r>
         <w:lastRenderedPageBreak/>
@@ -8199,7 +8199,7 @@
         <w:pageBreakBefore/>
       </w:pPr>
       <w:bookmarkStart w:id="46" w:name="phần-c-hướng-dẫn-demo-từng-bước"/>
-      <w:bookmarkStart w:id="47" w:name="_Toc243866089"/>
+      <w:bookmarkStart w:id="47" w:name="_Toc243903628"/>
       <w:bookmarkEnd w:id="44"/>
       <w:bookmarkEnd w:id="22"/>
       <w:r>
@@ -8218,7 +8218,7 @@
         <w:pStyle w:val="Heading2"/>
       </w:pPr>
       <w:bookmarkStart w:id="48" w:name="c1-khách-xem-giải"/>
-      <w:bookmarkStart w:id="49" w:name="_Toc243866090"/>
+      <w:bookmarkStart w:id="49" w:name="_Toc243903629"/>
       <w:r>
         <w:t>C1 Khách xem giải</w:t>
       </w:r>
@@ -8229,7 +8229,7 @@
         <w:pStyle w:val="Heading3"/>
       </w:pPr>
       <w:bookmarkStart w:id="50" w:name="bước-1-mở-giải-công-khai"/>
-      <w:bookmarkStart w:id="51" w:name="_Toc243866091"/>
+      <w:bookmarkStart w:id="51" w:name="_Toc243903630"/>
       <w:r>
         <w:t>Bước 1 Mở giải công khai</w:t>
       </w:r>
@@ -8317,7 +8317,7 @@
         <w:pStyle w:val="Heading3"/>
       </w:pPr>
       <w:bookmarkStart w:id="52" w:name="bước-2-xem-bảng-điểm-và-ma-trận"/>
-      <w:bookmarkStart w:id="53" w:name="_Toc243866092"/>
+      <w:bookmarkStart w:id="53" w:name="_Toc243903631"/>
       <w:bookmarkEnd w:id="50"/>
       <w:r>
         <w:t>Bước 2 Xem bảng điểm và ma trận</w:t>
@@ -8427,7 +8427,7 @@
         <w:pageBreakBefore/>
       </w:pPr>
       <w:bookmarkStart w:id="54" w:name="bước-3-xem-lại-từng-nước"/>
-      <w:bookmarkStart w:id="55" w:name="_Toc243866093"/>
+      <w:bookmarkStart w:id="55" w:name="_Toc243903632"/>
       <w:bookmarkEnd w:id="52"/>
       <w:r>
         <w:lastRenderedPageBreak/>
@@ -8528,7 +8528,7 @@
         <w:pageBreakBefore/>
       </w:pPr>
       <w:bookmarkStart w:id="56" w:name="c2-thí-sinh-đăng-ký-và-nộp-bot"/>
-      <w:bookmarkStart w:id="57" w:name="_Toc243866094"/>
+      <w:bookmarkStart w:id="57" w:name="_Toc243903633"/>
       <w:bookmarkEnd w:id="54"/>
       <w:bookmarkEnd w:id="48"/>
       <w:r>
@@ -8542,7 +8542,7 @@
         <w:pStyle w:val="Heading3"/>
       </w:pPr>
       <w:bookmarkStart w:id="58" w:name="bước-4-đăng-ký-bằng-email-trường"/>
-      <w:bookmarkStart w:id="59" w:name="_Toc243866095"/>
+      <w:bookmarkStart w:id="59" w:name="_Toc243903634"/>
       <w:r>
         <w:t>Bước 4 Đăng ký bằng email trường</w:t>
       </w:r>
@@ -8640,7 +8640,7 @@
         <w:pStyle w:val="Heading3"/>
       </w:pPr>
       <w:bookmarkStart w:id="60" w:name="bước-5-xác-minh-email"/>
-      <w:bookmarkStart w:id="61" w:name="_Toc243866096"/>
+      <w:bookmarkStart w:id="61" w:name="_Toc243903635"/>
       <w:bookmarkEnd w:id="58"/>
       <w:r>
         <w:t>Bước 5 Xác minh email</w:t>
@@ -8730,7 +8730,7 @@
         <w:pageBreakBefore/>
       </w:pPr>
       <w:bookmarkStart w:id="62" w:name="bước-6-đặt-mật-khẩu-và-đăng-nhập"/>
-      <w:bookmarkStart w:id="63" w:name="_Toc243866097"/>
+      <w:bookmarkStart w:id="63" w:name="_Toc243903636"/>
       <w:bookmarkEnd w:id="60"/>
       <w:r>
         <w:lastRenderedPageBreak/>
@@ -8820,7 +8820,7 @@
         <w:pStyle w:val="Heading3"/>
       </w:pPr>
       <w:bookmarkStart w:id="64" w:name="bước-7-tạo-đội"/>
-      <w:bookmarkStart w:id="65" w:name="_Toc243866098"/>
+      <w:bookmarkStart w:id="65" w:name="_Toc243903637"/>
       <w:bookmarkEnd w:id="62"/>
       <w:r>
         <w:t>Bước 7 Tạo đội</w:t>
@@ -8920,7 +8920,7 @@
         <w:pageBreakBefore/>
       </w:pPr>
       <w:bookmarkStart w:id="66" w:name="bước-8-mời-các-thành-viên"/>
-      <w:bookmarkStart w:id="67" w:name="_Toc243866099"/>
+      <w:bookmarkStart w:id="67" w:name="_Toc243903638"/>
       <w:bookmarkEnd w:id="64"/>
       <w:r>
         <w:lastRenderedPageBreak/>
@@ -9010,7 +9010,7 @@
         <w:pStyle w:val="Heading3"/>
       </w:pPr>
       <w:bookmarkStart w:id="68" w:name="bước-9-vào-đội-bằng-mã-mời"/>
-      <w:bookmarkStart w:id="69" w:name="_Toc243866100"/>
+      <w:bookmarkStart w:id="69" w:name="_Toc243903639"/>
       <w:bookmarkEnd w:id="66"/>
       <w:r>
         <w:t>Bước 9 Vào đội bằng mã mời</w:t>
@@ -9100,7 +9100,7 @@
         <w:pageBreakBefore/>
       </w:pPr>
       <w:bookmarkStart w:id="70" w:name="bước-10-tạo-repo-từ-mẫu"/>
-      <w:bookmarkStart w:id="71" w:name="_Toc243866101"/>
+      <w:bookmarkStart w:id="71" w:name="_Toc243903640"/>
       <w:bookmarkEnd w:id="68"/>
       <w:r>
         <w:lastRenderedPageBreak/>
@@ -9190,7 +9190,7 @@
         <w:pStyle w:val="Heading3"/>
       </w:pPr>
       <w:bookmarkStart w:id="72" w:name="bước-11-cho-app-truy-cập-đúng-repo"/>
-      <w:bookmarkStart w:id="73" w:name="_Toc243866102"/>
+      <w:bookmarkStart w:id="73" w:name="_Toc243903641"/>
       <w:bookmarkEnd w:id="70"/>
       <w:r>
         <w:t>Bước 11 Cho App truy cập đúng repo</w:t>
@@ -9290,7 +9290,7 @@
         <w:pageBreakBefore/>
       </w:pPr>
       <w:bookmarkStart w:id="74" w:name="bước-12-gắn-link-repo-với-đội"/>
-      <w:bookmarkStart w:id="75" w:name="_Toc243866103"/>
+      <w:bookmarkStart w:id="75" w:name="_Toc243903642"/>
       <w:bookmarkEnd w:id="72"/>
       <w:r>
         <w:lastRenderedPageBreak/>
@@ -9390,7 +9390,7 @@
         <w:pStyle w:val="Heading3"/>
       </w:pPr>
       <w:bookmarkStart w:id="76" w:name="bước-13-theo-dõi-kiểm-tra-72-mẫu"/>
-      <w:bookmarkStart w:id="77" w:name="_Toc243866104"/>
+      <w:bookmarkStart w:id="77" w:name="_Toc243903643"/>
       <w:bookmarkEnd w:id="74"/>
       <w:r>
         <w:t>Bước 13 Theo dõi kiểm tra 72 mẫu</w:t>
@@ -9530,7 +9530,7 @@
         <w:pageBreakBefore/>
       </w:pPr>
       <w:bookmarkStart w:id="78" w:name="bước-14-xem-giải-của-đội"/>
-      <w:bookmarkStart w:id="79" w:name="_Toc243866105"/>
+      <w:bookmarkStart w:id="79" w:name="_Toc243903644"/>
       <w:bookmarkEnd w:id="76"/>
       <w:r>
         <w:lastRenderedPageBreak/>
@@ -9594,7 +9594,7 @@
         </w:rPr>
         <w:drawing>
           <wp:inline distT="0" distB="0" distL="0" distR="0" wp14:anchorId="29DE0F3B" wp14:editId="46FB07BA">
-            <wp:extent cx="5759999" cy="1349999"/>
+            <wp:extent cx="5759999" cy="1024999"/>
             <wp:effectExtent l="0" t="0" r="0" b="0"/>
             <wp:docPr id="118" name="Picture" descr="Hình 20 Xem giải của đội"/>
             <wp:cNvGraphicFramePr/>
@@ -9616,7 +9616,7 @@
                   <pic:spPr bwMode="auto">
                     <a:xfrm>
                       <a:off x="0" y="0"/>
-                      <a:ext cx="5759999" cy="1349999"/>
+                      <a:ext cx="5759999" cy="1024999"/>
                     </a:xfrm>
                     <a:prstGeom prst="rect">
                       <a:avLst/>
@@ -9650,7 +9650,7 @@
         <w:pStyle w:val="Heading3"/>
       </w:pPr>
       <w:bookmarkStart w:id="80" w:name="bước-15-luyện-tập-với-bot-mẫu"/>
-      <w:bookmarkStart w:id="81" w:name="_Toc243866106"/>
+      <w:bookmarkStart w:id="81" w:name="_Toc243903645"/>
       <w:bookmarkEnd w:id="78"/>
       <w:r>
         <w:t>Bước 15 Luyện tập với bot mẫu</w:t>
@@ -9760,7 +9760,7 @@
         <w:pageBreakBefore/>
       </w:pPr>
       <w:bookmarkStart w:id="82" w:name="c3-ban-tổ-chức-điều-hành"/>
-      <w:bookmarkStart w:id="83" w:name="_Toc243866107"/>
+      <w:bookmarkStart w:id="83" w:name="_Toc243903646"/>
       <w:bookmarkEnd w:id="80"/>
       <w:bookmarkEnd w:id="56"/>
       <w:r>
@@ -9774,7 +9774,7 @@
         <w:pStyle w:val="Heading3"/>
       </w:pPr>
       <w:bookmarkStart w:id="84" w:name="bước-16-xem-tổng-quan-ban-tổ-chức"/>
-      <w:bookmarkStart w:id="85" w:name="_Toc243866108"/>
+      <w:bookmarkStart w:id="85" w:name="_Toc243903647"/>
       <w:r>
         <w:t>Bước 16 Xem tổng quan ban tổ chức</w:t>
       </w:r>
@@ -9853,7 +9853,7 @@
         <w:pageBreakBefore/>
       </w:pPr>
       <w:bookmarkStart w:id="86" w:name="bước-17-chọn-giải-ở-tổng-quan"/>
-      <w:bookmarkStart w:id="87" w:name="_Toc243866109"/>
+      <w:bookmarkStart w:id="87" w:name="_Toc243903648"/>
       <w:bookmarkEnd w:id="84"/>
       <w:r>
         <w:lastRenderedPageBreak/>
@@ -9917,7 +9917,7 @@
         </w:rPr>
         <w:drawing>
           <wp:inline distT="0" distB="0" distL="0" distR="0" wp14:anchorId="2FE25E75" wp14:editId="1A4E7850">
-            <wp:extent cx="5759999" cy="4220526"/>
+            <wp:extent cx="5759999" cy="4012104"/>
             <wp:effectExtent l="0" t="0" r="0" b="0"/>
             <wp:docPr id="131" name="Picture" descr="Hình 23 Chọn giải ở Tổng quan"/>
             <wp:cNvGraphicFramePr/>
@@ -9939,7 +9939,7 @@
                   <pic:spPr bwMode="auto">
                     <a:xfrm>
                       <a:off x="0" y="0"/>
-                      <a:ext cx="5759999" cy="4220526"/>
+                      <a:ext cx="5759999" cy="4012104"/>
                     </a:xfrm>
                     <a:prstGeom prst="rect">
                       <a:avLst/>
@@ -9974,7 +9974,7 @@
         <w:pageBreakBefore/>
       </w:pPr>
       <w:bookmarkStart w:id="88" w:name="bước-18-chuẩn-bị-giải-mới"/>
-      <w:bookmarkStart w:id="89" w:name="_Toc243866110"/>
+      <w:bookmarkStart w:id="89" w:name="_Toc243903649"/>
       <w:bookmarkEnd w:id="86"/>
       <w:r>
         <w:lastRenderedPageBreak/>
@@ -10064,7 +10064,7 @@
         <w:pStyle w:val="Heading3"/>
       </w:pPr>
       <w:bookmarkStart w:id="90" w:name="bước-19-cài-máy-chấm-windows-hoặc-linux"/>
-      <w:bookmarkStart w:id="91" w:name="_Toc243866111"/>
+      <w:bookmarkStart w:id="91" w:name="_Toc243903650"/>
       <w:bookmarkEnd w:id="88"/>
       <w:r>
         <w:t>Bước 19 Cài máy chấm Windows hoặc Linux</w:t>
@@ -10174,7 +10174,7 @@
         <w:pageBreakBefore/>
       </w:pPr>
       <w:bookmarkStart w:id="92" w:name="bước-20-kiểm-tình-trạng-chấm-và-hàng-đợi"/>
-      <w:bookmarkStart w:id="93" w:name="_Toc243866112"/>
+      <w:bookmarkStart w:id="93" w:name="_Toc243903651"/>
       <w:bookmarkEnd w:id="90"/>
       <w:r>
         <w:lastRenderedPageBreak/>
@@ -10264,7 +10264,7 @@
         <w:pStyle w:val="Heading3"/>
       </w:pPr>
       <w:bookmarkStart w:id="94" w:name="bước-21-soạn-thông-báo"/>
-      <w:bookmarkStart w:id="95" w:name="_Toc243866113"/>
+      <w:bookmarkStart w:id="95" w:name="_Toc243903652"/>
       <w:bookmarkEnd w:id="92"/>
       <w:r>
         <w:t>Bước 21 Soạn thông báo</w:t>
@@ -10364,7 +10364,7 @@
         <w:pageBreakBefore/>
       </w:pPr>
       <w:bookmarkStart w:id="96" w:name="bước-22-xuất-bảng-điểm-csv"/>
-      <w:bookmarkStart w:id="97" w:name="_Toc243866114"/>
+      <w:bookmarkStart w:id="97" w:name="_Toc243903653"/>
       <w:bookmarkEnd w:id="94"/>
       <w:r>
         <w:lastRenderedPageBreak/>

</xml_diff>

<commit_message>
Làm rõ thời gian chấm và hướng dẫn xác minh
</commit_message>
<xml_diff>
--- a/TAI-LIEU.docx
+++ b/TAI-LIEU.docx
@@ -292,7 +292,7 @@
           <w:r>
             <w:fldChar w:fldCharType="separate"/>
           </w:r>
-          <w:hyperlink w:anchor="_Toc243903605" w:history="1">
+          <w:hyperlink w:anchor="_Toc243906805" w:history="1">
             <w:r>
               <w:rPr>
                 <w:rStyle w:val="Hyperlink"/>
@@ -319,7 +319,7 @@
                 <w:noProof/>
                 <w:webHidden/>
               </w:rPr>
-              <w:instrText xml:space="preserve"> PAGEREF _Toc243903605 \h </w:instrText>
+              <w:instrText xml:space="preserve"> PAGEREF _Toc243906805 \h </w:instrText>
             </w:r>
             <w:r>
               <w:rPr>
@@ -366,7 +366,7 @@
               <w14:ligatures w14:val="standardContextual"/>
             </w:rPr>
           </w:pPr>
-          <w:hyperlink w:anchor="_Toc243903606" w:history="1">
+          <w:hyperlink w:anchor="_Toc243906806" w:history="1">
             <w:r>
               <w:rPr>
                 <w:rStyle w:val="Hyperlink"/>
@@ -393,7 +393,7 @@
                 <w:noProof/>
                 <w:webHidden/>
               </w:rPr>
-              <w:instrText xml:space="preserve"> PAGEREF _Toc243903606 \h </w:instrText>
+              <w:instrText xml:space="preserve"> PAGEREF _Toc243906806 \h </w:instrText>
             </w:r>
             <w:r>
               <w:rPr>
@@ -440,7 +440,7 @@
               <w14:ligatures w14:val="standardContextual"/>
             </w:rPr>
           </w:pPr>
-          <w:hyperlink w:anchor="_Toc243903607" w:history="1">
+          <w:hyperlink w:anchor="_Toc243906807" w:history="1">
             <w:r>
               <w:rPr>
                 <w:rStyle w:val="Hyperlink"/>
@@ -467,7 +467,7 @@
                 <w:noProof/>
                 <w:webHidden/>
               </w:rPr>
-              <w:instrText xml:space="preserve"> PAGEREF _Toc243903607 \h </w:instrText>
+              <w:instrText xml:space="preserve"> PAGEREF _Toc243906807 \h </w:instrText>
             </w:r>
             <w:r>
               <w:rPr>
@@ -514,7 +514,7 @@
               <w14:ligatures w14:val="standardContextual"/>
             </w:rPr>
           </w:pPr>
-          <w:hyperlink w:anchor="_Toc243903608" w:history="1">
+          <w:hyperlink w:anchor="_Toc243906808" w:history="1">
             <w:r>
               <w:rPr>
                 <w:rStyle w:val="Hyperlink"/>
@@ -541,7 +541,7 @@
                 <w:noProof/>
                 <w:webHidden/>
               </w:rPr>
-              <w:instrText xml:space="preserve"> PAGEREF _Toc243903608 \h </w:instrText>
+              <w:instrText xml:space="preserve"> PAGEREF _Toc243906808 \h </w:instrText>
             </w:r>
             <w:r>
               <w:rPr>
@@ -588,7 +588,7 @@
               <w14:ligatures w14:val="standardContextual"/>
             </w:rPr>
           </w:pPr>
-          <w:hyperlink w:anchor="_Toc243903609" w:history="1">
+          <w:hyperlink w:anchor="_Toc243906809" w:history="1">
             <w:r>
               <w:rPr>
                 <w:rStyle w:val="Hyperlink"/>
@@ -615,7 +615,7 @@
                 <w:noProof/>
                 <w:webHidden/>
               </w:rPr>
-              <w:instrText xml:space="preserve"> PAGEREF _Toc243903609 \h </w:instrText>
+              <w:instrText xml:space="preserve"> PAGEREF _Toc243906809 \h </w:instrText>
             </w:r>
             <w:r>
               <w:rPr>
@@ -662,7 +662,7 @@
               <w14:ligatures w14:val="standardContextual"/>
             </w:rPr>
           </w:pPr>
-          <w:hyperlink w:anchor="_Toc243903610" w:history="1">
+          <w:hyperlink w:anchor="_Toc243906810" w:history="1">
             <w:r>
               <w:rPr>
                 <w:rStyle w:val="Hyperlink"/>
@@ -689,7 +689,7 @@
                 <w:noProof/>
                 <w:webHidden/>
               </w:rPr>
-              <w:instrText xml:space="preserve"> PAGEREF _Toc243903610 \h </w:instrText>
+              <w:instrText xml:space="preserve"> PAGEREF _Toc243906810 \h </w:instrText>
             </w:r>
             <w:r>
               <w:rPr>
@@ -736,7 +736,7 @@
               <w14:ligatures w14:val="standardContextual"/>
             </w:rPr>
           </w:pPr>
-          <w:hyperlink w:anchor="_Toc243903611" w:history="1">
+          <w:hyperlink w:anchor="_Toc243906811" w:history="1">
             <w:r>
               <w:rPr>
                 <w:rStyle w:val="Hyperlink"/>
@@ -763,7 +763,7 @@
                 <w:noProof/>
                 <w:webHidden/>
               </w:rPr>
-              <w:instrText xml:space="preserve"> PAGEREF _Toc243903611 \h </w:instrText>
+              <w:instrText xml:space="preserve"> PAGEREF _Toc243906811 \h </w:instrText>
             </w:r>
             <w:r>
               <w:rPr>
@@ -810,7 +810,7 @@
               <w14:ligatures w14:val="standardContextual"/>
             </w:rPr>
           </w:pPr>
-          <w:hyperlink w:anchor="_Toc243903612" w:history="1">
+          <w:hyperlink w:anchor="_Toc243906812" w:history="1">
             <w:r>
               <w:rPr>
                 <w:rStyle w:val="Hyperlink"/>
@@ -837,7 +837,7 @@
                 <w:noProof/>
                 <w:webHidden/>
               </w:rPr>
-              <w:instrText xml:space="preserve"> PAGEREF _Toc243903612 \h </w:instrText>
+              <w:instrText xml:space="preserve"> PAGEREF _Toc243906812 \h </w:instrText>
             </w:r>
             <w:r>
               <w:rPr>
@@ -884,7 +884,7 @@
               <w14:ligatures w14:val="standardContextual"/>
             </w:rPr>
           </w:pPr>
-          <w:hyperlink w:anchor="_Toc243903613" w:history="1">
+          <w:hyperlink w:anchor="_Toc243906813" w:history="1">
             <w:r>
               <w:rPr>
                 <w:rStyle w:val="Hyperlink"/>
@@ -911,7 +911,7 @@
                 <w:noProof/>
                 <w:webHidden/>
               </w:rPr>
-              <w:instrText xml:space="preserve"> PAGEREF _Toc243903613 \h </w:instrText>
+              <w:instrText xml:space="preserve"> PAGEREF _Toc243906813 \h </w:instrText>
             </w:r>
             <w:r>
               <w:rPr>
@@ -931,7 +931,7 @@
                 <w:noProof/>
                 <w:webHidden/>
               </w:rPr>
-              <w:t>8</w:t>
+              <w:t>7</w:t>
             </w:r>
             <w:r>
               <w:rPr>
@@ -958,7 +958,7 @@
               <w14:ligatures w14:val="standardContextual"/>
             </w:rPr>
           </w:pPr>
-          <w:hyperlink w:anchor="_Toc243903614" w:history="1">
+          <w:hyperlink w:anchor="_Toc243906814" w:history="1">
             <w:r>
               <w:rPr>
                 <w:rStyle w:val="Hyperlink"/>
@@ -985,7 +985,7 @@
                 <w:noProof/>
                 <w:webHidden/>
               </w:rPr>
-              <w:instrText xml:space="preserve"> PAGEREF _Toc243903614 \h </w:instrText>
+              <w:instrText xml:space="preserve"> PAGEREF _Toc243906814 \h </w:instrText>
             </w:r>
             <w:r>
               <w:rPr>
@@ -1032,7 +1032,7 @@
               <w14:ligatures w14:val="standardContextual"/>
             </w:rPr>
           </w:pPr>
-          <w:hyperlink w:anchor="_Toc243903615" w:history="1">
+          <w:hyperlink w:anchor="_Toc243906815" w:history="1">
             <w:r>
               <w:rPr>
                 <w:rStyle w:val="Hyperlink"/>
@@ -1059,7 +1059,7 @@
                 <w:noProof/>
                 <w:webHidden/>
               </w:rPr>
-              <w:instrText xml:space="preserve"> PAGEREF _Toc243903615 \h </w:instrText>
+              <w:instrText xml:space="preserve"> PAGEREF _Toc243906815 \h </w:instrText>
             </w:r>
             <w:r>
               <w:rPr>
@@ -1106,7 +1106,7 @@
               <w14:ligatures w14:val="standardContextual"/>
             </w:rPr>
           </w:pPr>
-          <w:hyperlink w:anchor="_Toc243903616" w:history="1">
+          <w:hyperlink w:anchor="_Toc243906816" w:history="1">
             <w:r>
               <w:rPr>
                 <w:rStyle w:val="Hyperlink"/>
@@ -1133,7 +1133,7 @@
                 <w:noProof/>
                 <w:webHidden/>
               </w:rPr>
-              <w:instrText xml:space="preserve"> PAGEREF _Toc243903616 \h </w:instrText>
+              <w:instrText xml:space="preserve"> PAGEREF _Toc243906816 \h </w:instrText>
             </w:r>
             <w:r>
               <w:rPr>
@@ -1180,7 +1180,7 @@
               <w14:ligatures w14:val="standardContextual"/>
             </w:rPr>
           </w:pPr>
-          <w:hyperlink w:anchor="_Toc243903617" w:history="1">
+          <w:hyperlink w:anchor="_Toc243906817" w:history="1">
             <w:r>
               <w:rPr>
                 <w:rStyle w:val="Hyperlink"/>
@@ -1207,7 +1207,7 @@
                 <w:noProof/>
                 <w:webHidden/>
               </w:rPr>
-              <w:instrText xml:space="preserve"> PAGEREF _Toc243903617 \h </w:instrText>
+              <w:instrText xml:space="preserve"> PAGEREF _Toc243906817 \h </w:instrText>
             </w:r>
             <w:r>
               <w:rPr>
@@ -1254,7 +1254,7 @@
               <w14:ligatures w14:val="standardContextual"/>
             </w:rPr>
           </w:pPr>
-          <w:hyperlink w:anchor="_Toc243903618" w:history="1">
+          <w:hyperlink w:anchor="_Toc243906818" w:history="1">
             <w:r>
               <w:rPr>
                 <w:rStyle w:val="Hyperlink"/>
@@ -1281,7 +1281,7 @@
                 <w:noProof/>
                 <w:webHidden/>
               </w:rPr>
-              <w:instrText xml:space="preserve"> PAGEREF _Toc243903618 \h </w:instrText>
+              <w:instrText xml:space="preserve"> PAGEREF _Toc243906818 \h </w:instrText>
             </w:r>
             <w:r>
               <w:rPr>
@@ -1328,7 +1328,7 @@
               <w14:ligatures w14:val="standardContextual"/>
             </w:rPr>
           </w:pPr>
-          <w:hyperlink w:anchor="_Toc243903619" w:history="1">
+          <w:hyperlink w:anchor="_Toc243906819" w:history="1">
             <w:r>
               <w:rPr>
                 <w:rStyle w:val="Hyperlink"/>
@@ -1355,7 +1355,7 @@
                 <w:noProof/>
                 <w:webHidden/>
               </w:rPr>
-              <w:instrText xml:space="preserve"> PAGEREF _Toc243903619 \h </w:instrText>
+              <w:instrText xml:space="preserve"> PAGEREF _Toc243906819 \h </w:instrText>
             </w:r>
             <w:r>
               <w:rPr>
@@ -1402,7 +1402,7 @@
               <w14:ligatures w14:val="standardContextual"/>
             </w:rPr>
           </w:pPr>
-          <w:hyperlink w:anchor="_Toc243903620" w:history="1">
+          <w:hyperlink w:anchor="_Toc243906820" w:history="1">
             <w:r>
               <w:rPr>
                 <w:rStyle w:val="Hyperlink"/>
@@ -1429,7 +1429,7 @@
                 <w:noProof/>
                 <w:webHidden/>
               </w:rPr>
-              <w:instrText xml:space="preserve"> PAGEREF _Toc243903620 \h </w:instrText>
+              <w:instrText xml:space="preserve"> PAGEREF _Toc243906820 \h </w:instrText>
             </w:r>
             <w:r>
               <w:rPr>
@@ -1476,13 +1476,13 @@
               <w14:ligatures w14:val="standardContextual"/>
             </w:rPr>
           </w:pPr>
-          <w:hyperlink w:anchor="_Toc243903621" w:history="1">
+          <w:hyperlink w:anchor="_Toc243906821" w:history="1">
             <w:r>
               <w:rPr>
                 <w:rStyle w:val="Hyperlink"/>
                 <w:noProof/>
               </w:rPr>
-              <w:t>B5 Sandbox thay Docker</w:t>
+              <w:t>B5 Sandbox chạy bot</w:t>
             </w:r>
             <w:r>
               <w:rPr>
@@ -1503,7 +1503,7 @@
                 <w:noProof/>
                 <w:webHidden/>
               </w:rPr>
-              <w:instrText xml:space="preserve"> PAGEREF _Toc243903621 \h </w:instrText>
+              <w:instrText xml:space="preserve"> PAGEREF _Toc243906821 \h </w:instrText>
             </w:r>
             <w:r>
               <w:rPr>
@@ -1550,7 +1550,7 @@
               <w14:ligatures w14:val="standardContextual"/>
             </w:rPr>
           </w:pPr>
-          <w:hyperlink w:anchor="_Toc243903622" w:history="1">
+          <w:hyperlink w:anchor="_Toc243906822" w:history="1">
             <w:r>
               <w:rPr>
                 <w:rStyle w:val="Hyperlink"/>
@@ -1577,7 +1577,7 @@
                 <w:noProof/>
                 <w:webHidden/>
               </w:rPr>
-              <w:instrText xml:space="preserve"> PAGEREF _Toc243903622 \h </w:instrText>
+              <w:instrText xml:space="preserve"> PAGEREF _Toc243906822 \h </w:instrText>
             </w:r>
             <w:r>
               <w:rPr>
@@ -1624,7 +1624,7 @@
               <w14:ligatures w14:val="standardContextual"/>
             </w:rPr>
           </w:pPr>
-          <w:hyperlink w:anchor="_Toc243903623" w:history="1">
+          <w:hyperlink w:anchor="_Toc243906823" w:history="1">
             <w:r>
               <w:rPr>
                 <w:rStyle w:val="Hyperlink"/>
@@ -1651,7 +1651,7 @@
                 <w:noProof/>
                 <w:webHidden/>
               </w:rPr>
-              <w:instrText xml:space="preserve"> PAGEREF _Toc243903623 \h </w:instrText>
+              <w:instrText xml:space="preserve"> PAGEREF _Toc243906823 \h </w:instrText>
             </w:r>
             <w:r>
               <w:rPr>
@@ -1698,7 +1698,7 @@
               <w14:ligatures w14:val="standardContextual"/>
             </w:rPr>
           </w:pPr>
-          <w:hyperlink w:anchor="_Toc243903624" w:history="1">
+          <w:hyperlink w:anchor="_Toc243906824" w:history="1">
             <w:r>
               <w:rPr>
                 <w:rStyle w:val="Hyperlink"/>
@@ -1725,7 +1725,7 @@
                 <w:noProof/>
                 <w:webHidden/>
               </w:rPr>
-              <w:instrText xml:space="preserve"> PAGEREF _Toc243903624 \h </w:instrText>
+              <w:instrText xml:space="preserve"> PAGEREF _Toc243906824 \h </w:instrText>
             </w:r>
             <w:r>
               <w:rPr>
@@ -1772,7 +1772,7 @@
               <w14:ligatures w14:val="standardContextual"/>
             </w:rPr>
           </w:pPr>
-          <w:hyperlink w:anchor="_Toc243903625" w:history="1">
+          <w:hyperlink w:anchor="_Toc243906825" w:history="1">
             <w:r>
               <w:rPr>
                 <w:rStyle w:val="Hyperlink"/>
@@ -1799,7 +1799,7 @@
                 <w:noProof/>
                 <w:webHidden/>
               </w:rPr>
-              <w:instrText xml:space="preserve"> PAGEREF _Toc243903625 \h </w:instrText>
+              <w:instrText xml:space="preserve"> PAGEREF _Toc243906825 \h </w:instrText>
             </w:r>
             <w:r>
               <w:rPr>
@@ -1819,7 +1819,7 @@
                 <w:noProof/>
                 <w:webHidden/>
               </w:rPr>
-              <w:t>17</w:t>
+              <w:t>16</w:t>
             </w:r>
             <w:r>
               <w:rPr>
@@ -1846,7 +1846,7 @@
               <w14:ligatures w14:val="standardContextual"/>
             </w:rPr>
           </w:pPr>
-          <w:hyperlink w:anchor="_Toc243903626" w:history="1">
+          <w:hyperlink w:anchor="_Toc243906826" w:history="1">
             <w:r>
               <w:rPr>
                 <w:rStyle w:val="Hyperlink"/>
@@ -1873,7 +1873,7 @@
                 <w:noProof/>
                 <w:webHidden/>
               </w:rPr>
-              <w:instrText xml:space="preserve"> PAGEREF _Toc243903626 \h </w:instrText>
+              <w:instrText xml:space="preserve"> PAGEREF _Toc243906826 \h </w:instrText>
             </w:r>
             <w:r>
               <w:rPr>
@@ -1920,7 +1920,7 @@
               <w14:ligatures w14:val="standardContextual"/>
             </w:rPr>
           </w:pPr>
-          <w:hyperlink w:anchor="_Toc243903627" w:history="1">
+          <w:hyperlink w:anchor="_Toc243906827" w:history="1">
             <w:r>
               <w:rPr>
                 <w:rStyle w:val="Hyperlink"/>
@@ -1947,7 +1947,7 @@
                 <w:noProof/>
                 <w:webHidden/>
               </w:rPr>
-              <w:instrText xml:space="preserve"> PAGEREF _Toc243903627 \h </w:instrText>
+              <w:instrText xml:space="preserve"> PAGEREF _Toc243906827 \h </w:instrText>
             </w:r>
             <w:r>
               <w:rPr>
@@ -1994,7 +1994,7 @@
               <w14:ligatures w14:val="standardContextual"/>
             </w:rPr>
           </w:pPr>
-          <w:hyperlink w:anchor="_Toc243903628" w:history="1">
+          <w:hyperlink w:anchor="_Toc243906828" w:history="1">
             <w:r>
               <w:rPr>
                 <w:rStyle w:val="Hyperlink"/>
@@ -2021,7 +2021,7 @@
                 <w:noProof/>
                 <w:webHidden/>
               </w:rPr>
-              <w:instrText xml:space="preserve"> PAGEREF _Toc243903628 \h </w:instrText>
+              <w:instrText xml:space="preserve"> PAGEREF _Toc243906828 \h </w:instrText>
             </w:r>
             <w:r>
               <w:rPr>
@@ -2068,7 +2068,7 @@
               <w14:ligatures w14:val="standardContextual"/>
             </w:rPr>
           </w:pPr>
-          <w:hyperlink w:anchor="_Toc243903629" w:history="1">
+          <w:hyperlink w:anchor="_Toc243906829" w:history="1">
             <w:r>
               <w:rPr>
                 <w:rStyle w:val="Hyperlink"/>
@@ -2095,7 +2095,7 @@
                 <w:noProof/>
                 <w:webHidden/>
               </w:rPr>
-              <w:instrText xml:space="preserve"> PAGEREF _Toc243903629 \h </w:instrText>
+              <w:instrText xml:space="preserve"> PAGEREF _Toc243906829 \h </w:instrText>
             </w:r>
             <w:r>
               <w:rPr>
@@ -2142,7 +2142,7 @@
               <w14:ligatures w14:val="standardContextual"/>
             </w:rPr>
           </w:pPr>
-          <w:hyperlink w:anchor="_Toc243903630" w:history="1">
+          <w:hyperlink w:anchor="_Toc243906830" w:history="1">
             <w:r>
               <w:rPr>
                 <w:rStyle w:val="Hyperlink"/>
@@ -2169,7 +2169,7 @@
                 <w:noProof/>
                 <w:webHidden/>
               </w:rPr>
-              <w:instrText xml:space="preserve"> PAGEREF _Toc243903630 \h </w:instrText>
+              <w:instrText xml:space="preserve"> PAGEREF _Toc243906830 \h </w:instrText>
             </w:r>
             <w:r>
               <w:rPr>
@@ -2216,7 +2216,7 @@
               <w14:ligatures w14:val="standardContextual"/>
             </w:rPr>
           </w:pPr>
-          <w:hyperlink w:anchor="_Toc243903631" w:history="1">
+          <w:hyperlink w:anchor="_Toc243906831" w:history="1">
             <w:r>
               <w:rPr>
                 <w:rStyle w:val="Hyperlink"/>
@@ -2243,7 +2243,7 @@
                 <w:noProof/>
                 <w:webHidden/>
               </w:rPr>
-              <w:instrText xml:space="preserve"> PAGEREF _Toc243903631 \h </w:instrText>
+              <w:instrText xml:space="preserve"> PAGEREF _Toc243906831 \h </w:instrText>
             </w:r>
             <w:r>
               <w:rPr>
@@ -2290,7 +2290,7 @@
               <w14:ligatures w14:val="standardContextual"/>
             </w:rPr>
           </w:pPr>
-          <w:hyperlink w:anchor="_Toc243903632" w:history="1">
+          <w:hyperlink w:anchor="_Toc243906832" w:history="1">
             <w:r>
               <w:rPr>
                 <w:rStyle w:val="Hyperlink"/>
@@ -2317,7 +2317,7 @@
                 <w:noProof/>
                 <w:webHidden/>
               </w:rPr>
-              <w:instrText xml:space="preserve"> PAGEREF _Toc243903632 \h </w:instrText>
+              <w:instrText xml:space="preserve"> PAGEREF _Toc243906832 \h </w:instrText>
             </w:r>
             <w:r>
               <w:rPr>
@@ -2364,7 +2364,7 @@
               <w14:ligatures w14:val="standardContextual"/>
             </w:rPr>
           </w:pPr>
-          <w:hyperlink w:anchor="_Toc243903633" w:history="1">
+          <w:hyperlink w:anchor="_Toc243906833" w:history="1">
             <w:r>
               <w:rPr>
                 <w:rStyle w:val="Hyperlink"/>
@@ -2391,7 +2391,7 @@
                 <w:noProof/>
                 <w:webHidden/>
               </w:rPr>
-              <w:instrText xml:space="preserve"> PAGEREF _Toc243903633 \h </w:instrText>
+              <w:instrText xml:space="preserve"> PAGEREF _Toc243906833 \h </w:instrText>
             </w:r>
             <w:r>
               <w:rPr>
@@ -2438,7 +2438,7 @@
               <w14:ligatures w14:val="standardContextual"/>
             </w:rPr>
           </w:pPr>
-          <w:hyperlink w:anchor="_Toc243903634" w:history="1">
+          <w:hyperlink w:anchor="_Toc243906834" w:history="1">
             <w:r>
               <w:rPr>
                 <w:rStyle w:val="Hyperlink"/>
@@ -2465,7 +2465,7 @@
                 <w:noProof/>
                 <w:webHidden/>
               </w:rPr>
-              <w:instrText xml:space="preserve"> PAGEREF _Toc243903634 \h </w:instrText>
+              <w:instrText xml:space="preserve"> PAGEREF _Toc243906834 \h </w:instrText>
             </w:r>
             <w:r>
               <w:rPr>
@@ -2512,13 +2512,13 @@
               <w14:ligatures w14:val="standardContextual"/>
             </w:rPr>
           </w:pPr>
-          <w:hyperlink w:anchor="_Toc243903635" w:history="1">
+          <w:hyperlink w:anchor="_Toc243906835" w:history="1">
             <w:r>
               <w:rPr>
                 <w:rStyle w:val="Hyperlink"/>
                 <w:noProof/>
               </w:rPr>
-              <w:t>Bước 5 Xác minh email</w:t>
+              <w:t>Bước 5 Mở email lấy mã</w:t>
             </w:r>
             <w:r>
               <w:rPr>
@@ -2539,7 +2539,7 @@
                 <w:noProof/>
                 <w:webHidden/>
               </w:rPr>
-              <w:instrText xml:space="preserve"> PAGEREF _Toc243903635 \h </w:instrText>
+              <w:instrText xml:space="preserve"> PAGEREF _Toc243906835 \h </w:instrText>
             </w:r>
             <w:r>
               <w:rPr>
@@ -2559,7 +2559,7 @@
                 <w:noProof/>
                 <w:webHidden/>
               </w:rPr>
-              <w:t>22</w:t>
+              <w:t>23</w:t>
             </w:r>
             <w:r>
               <w:rPr>
@@ -2586,13 +2586,13 @@
               <w14:ligatures w14:val="standardContextual"/>
             </w:rPr>
           </w:pPr>
-          <w:hyperlink w:anchor="_Toc243903636" w:history="1">
+          <w:hyperlink w:anchor="_Toc243906836" w:history="1">
             <w:r>
               <w:rPr>
                 <w:rStyle w:val="Hyperlink"/>
                 <w:noProof/>
               </w:rPr>
-              <w:t>Bước 6 Đặt mật khẩu và đăng nhập</w:t>
+              <w:t>Bước 6 Xác minh email</w:t>
             </w:r>
             <w:r>
               <w:rPr>
@@ -2613,7 +2613,7 @@
                 <w:noProof/>
                 <w:webHidden/>
               </w:rPr>
-              <w:instrText xml:space="preserve"> PAGEREF _Toc243903636 \h </w:instrText>
+              <w:instrText xml:space="preserve"> PAGEREF _Toc243906836 \h </w:instrText>
             </w:r>
             <w:r>
               <w:rPr>
@@ -2633,7 +2633,7 @@
                 <w:noProof/>
                 <w:webHidden/>
               </w:rPr>
-              <w:t>23</w:t>
+              <w:t>24</w:t>
             </w:r>
             <w:r>
               <w:rPr>
@@ -2660,13 +2660,13 @@
               <w14:ligatures w14:val="standardContextual"/>
             </w:rPr>
           </w:pPr>
-          <w:hyperlink w:anchor="_Toc243903637" w:history="1">
+          <w:hyperlink w:anchor="_Toc243906837" w:history="1">
             <w:r>
               <w:rPr>
                 <w:rStyle w:val="Hyperlink"/>
                 <w:noProof/>
               </w:rPr>
-              <w:t>Bước 7 Tạo đội</w:t>
+              <w:t>Bước 7 Đặt mật khẩu và đăng nhập</w:t>
             </w:r>
             <w:r>
               <w:rPr>
@@ -2687,7 +2687,7 @@
                 <w:noProof/>
                 <w:webHidden/>
               </w:rPr>
-              <w:instrText xml:space="preserve"> PAGEREF _Toc243903637 \h </w:instrText>
+              <w:instrText xml:space="preserve"> PAGEREF _Toc243906837 \h </w:instrText>
             </w:r>
             <w:r>
               <w:rPr>
@@ -2707,7 +2707,7 @@
                 <w:noProof/>
                 <w:webHidden/>
               </w:rPr>
-              <w:t>23</w:t>
+              <w:t>25</w:t>
             </w:r>
             <w:r>
               <w:rPr>
@@ -2734,13 +2734,13 @@
               <w14:ligatures w14:val="standardContextual"/>
             </w:rPr>
           </w:pPr>
-          <w:hyperlink w:anchor="_Toc243903638" w:history="1">
+          <w:hyperlink w:anchor="_Toc243906838" w:history="1">
             <w:r>
               <w:rPr>
                 <w:rStyle w:val="Hyperlink"/>
                 <w:noProof/>
               </w:rPr>
-              <w:t>Bước 8 Mời các thành viên</w:t>
+              <w:t>Bước 8 Tạo đội</w:t>
             </w:r>
             <w:r>
               <w:rPr>
@@ -2761,7 +2761,7 @@
                 <w:noProof/>
                 <w:webHidden/>
               </w:rPr>
-              <w:instrText xml:space="preserve"> PAGEREF _Toc243903638 \h </w:instrText>
+              <w:instrText xml:space="preserve"> PAGEREF _Toc243906838 \h </w:instrText>
             </w:r>
             <w:r>
               <w:rPr>
@@ -2781,7 +2781,7 @@
                 <w:noProof/>
                 <w:webHidden/>
               </w:rPr>
-              <w:t>24</w:t>
+              <w:t>25</w:t>
             </w:r>
             <w:r>
               <w:rPr>
@@ -2808,13 +2808,13 @@
               <w14:ligatures w14:val="standardContextual"/>
             </w:rPr>
           </w:pPr>
-          <w:hyperlink w:anchor="_Toc243903639" w:history="1">
+          <w:hyperlink w:anchor="_Toc243906839" w:history="1">
             <w:r>
               <w:rPr>
                 <w:rStyle w:val="Hyperlink"/>
                 <w:noProof/>
               </w:rPr>
-              <w:t>Bước 9 Vào đội bằng mã mời</w:t>
+              <w:t>Bước 9 Mời các thành viên</w:t>
             </w:r>
             <w:r>
               <w:rPr>
@@ -2835,7 +2835,7 @@
                 <w:noProof/>
                 <w:webHidden/>
               </w:rPr>
-              <w:instrText xml:space="preserve"> PAGEREF _Toc243903639 \h </w:instrText>
+              <w:instrText xml:space="preserve"> PAGEREF _Toc243906839 \h </w:instrText>
             </w:r>
             <w:r>
               <w:rPr>
@@ -2855,7 +2855,7 @@
                 <w:noProof/>
                 <w:webHidden/>
               </w:rPr>
-              <w:t>24</w:t>
+              <w:t>26</w:t>
             </w:r>
             <w:r>
               <w:rPr>
@@ -2882,13 +2882,13 @@
               <w14:ligatures w14:val="standardContextual"/>
             </w:rPr>
           </w:pPr>
-          <w:hyperlink w:anchor="_Toc243903640" w:history="1">
+          <w:hyperlink w:anchor="_Toc243906840" w:history="1">
             <w:r>
               <w:rPr>
                 <w:rStyle w:val="Hyperlink"/>
                 <w:noProof/>
               </w:rPr>
-              <w:t>Bước 10 Tạo repo từ mẫu</w:t>
+              <w:t>Bước 10 Vào đội bằng mã mời</w:t>
             </w:r>
             <w:r>
               <w:rPr>
@@ -2909,7 +2909,7 @@
                 <w:noProof/>
                 <w:webHidden/>
               </w:rPr>
-              <w:instrText xml:space="preserve"> PAGEREF _Toc243903640 \h </w:instrText>
+              <w:instrText xml:space="preserve"> PAGEREF _Toc243906840 \h </w:instrText>
             </w:r>
             <w:r>
               <w:rPr>
@@ -2929,7 +2929,7 @@
                 <w:noProof/>
                 <w:webHidden/>
               </w:rPr>
-              <w:t>25</w:t>
+              <w:t>26</w:t>
             </w:r>
             <w:r>
               <w:rPr>
@@ -2956,13 +2956,13 @@
               <w14:ligatures w14:val="standardContextual"/>
             </w:rPr>
           </w:pPr>
-          <w:hyperlink w:anchor="_Toc243903641" w:history="1">
+          <w:hyperlink w:anchor="_Toc243906841" w:history="1">
             <w:r>
               <w:rPr>
                 <w:rStyle w:val="Hyperlink"/>
                 <w:noProof/>
               </w:rPr>
-              <w:t>Bước 11 Cho App truy cập đúng repo</w:t>
+              <w:t>Bước 11 Tạo repo từ mẫu</w:t>
             </w:r>
             <w:r>
               <w:rPr>
@@ -2983,7 +2983,7 @@
                 <w:noProof/>
                 <w:webHidden/>
               </w:rPr>
-              <w:instrText xml:space="preserve"> PAGEREF _Toc243903641 \h </w:instrText>
+              <w:instrText xml:space="preserve"> PAGEREF _Toc243906841 \h </w:instrText>
             </w:r>
             <w:r>
               <w:rPr>
@@ -3003,7 +3003,7 @@
                 <w:noProof/>
                 <w:webHidden/>
               </w:rPr>
-              <w:t>25</w:t>
+              <w:t>27</w:t>
             </w:r>
             <w:r>
               <w:rPr>
@@ -3030,13 +3030,13 @@
               <w14:ligatures w14:val="standardContextual"/>
             </w:rPr>
           </w:pPr>
-          <w:hyperlink w:anchor="_Toc243903642" w:history="1">
+          <w:hyperlink w:anchor="_Toc243906842" w:history="1">
             <w:r>
               <w:rPr>
                 <w:rStyle w:val="Hyperlink"/>
                 <w:noProof/>
               </w:rPr>
-              <w:t>Bước 12 Gắn link repo với đội</w:t>
+              <w:t>Bước 12 Cho App truy cập đúng repo</w:t>
             </w:r>
             <w:r>
               <w:rPr>
@@ -3057,7 +3057,7 @@
                 <w:noProof/>
                 <w:webHidden/>
               </w:rPr>
-              <w:instrText xml:space="preserve"> PAGEREF _Toc243903642 \h </w:instrText>
+              <w:instrText xml:space="preserve"> PAGEREF _Toc243906842 \h </w:instrText>
             </w:r>
             <w:r>
               <w:rPr>
@@ -3077,7 +3077,7 @@
                 <w:noProof/>
                 <w:webHidden/>
               </w:rPr>
-              <w:t>26</w:t>
+              <w:t>27</w:t>
             </w:r>
             <w:r>
               <w:rPr>
@@ -3104,13 +3104,13 @@
               <w14:ligatures w14:val="standardContextual"/>
             </w:rPr>
           </w:pPr>
-          <w:hyperlink w:anchor="_Toc243903643" w:history="1">
+          <w:hyperlink w:anchor="_Toc243906843" w:history="1">
             <w:r>
               <w:rPr>
                 <w:rStyle w:val="Hyperlink"/>
                 <w:noProof/>
               </w:rPr>
-              <w:t>Bước 13 Theo dõi kiểm tra 72 mẫu</w:t>
+              <w:t>Bước 13 Gắn link repo với đội</w:t>
             </w:r>
             <w:r>
               <w:rPr>
@@ -3131,7 +3131,7 @@
                 <w:noProof/>
                 <w:webHidden/>
               </w:rPr>
-              <w:instrText xml:space="preserve"> PAGEREF _Toc243903643 \h </w:instrText>
+              <w:instrText xml:space="preserve"> PAGEREF _Toc243906843 \h </w:instrText>
             </w:r>
             <w:r>
               <w:rPr>
@@ -3151,7 +3151,7 @@
                 <w:noProof/>
                 <w:webHidden/>
               </w:rPr>
-              <w:t>26</w:t>
+              <w:t>28</w:t>
             </w:r>
             <w:r>
               <w:rPr>
@@ -3178,13 +3178,13 @@
               <w14:ligatures w14:val="standardContextual"/>
             </w:rPr>
           </w:pPr>
-          <w:hyperlink w:anchor="_Toc243903644" w:history="1">
+          <w:hyperlink w:anchor="_Toc243906844" w:history="1">
             <w:r>
               <w:rPr>
                 <w:rStyle w:val="Hyperlink"/>
                 <w:noProof/>
               </w:rPr>
-              <w:t>Bước 14 Xem giải của đội</w:t>
+              <w:t>Bước 14 Theo dõi kiểm tra 72 mẫu</w:t>
             </w:r>
             <w:r>
               <w:rPr>
@@ -3205,7 +3205,7 @@
                 <w:noProof/>
                 <w:webHidden/>
               </w:rPr>
-              <w:instrText xml:space="preserve"> PAGEREF _Toc243903644 \h </w:instrText>
+              <w:instrText xml:space="preserve"> PAGEREF _Toc243906844 \h </w:instrText>
             </w:r>
             <w:r>
               <w:rPr>
@@ -3225,7 +3225,7 @@
                 <w:noProof/>
                 <w:webHidden/>
               </w:rPr>
-              <w:t>27</w:t>
+              <w:t>28</w:t>
             </w:r>
             <w:r>
               <w:rPr>
@@ -3252,13 +3252,13 @@
               <w14:ligatures w14:val="standardContextual"/>
             </w:rPr>
           </w:pPr>
-          <w:hyperlink w:anchor="_Toc243903645" w:history="1">
+          <w:hyperlink w:anchor="_Toc243906845" w:history="1">
             <w:r>
               <w:rPr>
                 <w:rStyle w:val="Hyperlink"/>
                 <w:noProof/>
               </w:rPr>
-              <w:t>Bước 15 Luyện tập với bot mẫu</w:t>
+              <w:t>Bước 15 Xem giải của đội</w:t>
             </w:r>
             <w:r>
               <w:rPr>
@@ -3279,7 +3279,7 @@
                 <w:noProof/>
                 <w:webHidden/>
               </w:rPr>
-              <w:instrText xml:space="preserve"> PAGEREF _Toc243903645 \h </w:instrText>
+              <w:instrText xml:space="preserve"> PAGEREF _Toc243906845 \h </w:instrText>
             </w:r>
             <w:r>
               <w:rPr>
@@ -3299,7 +3299,81 @@
                 <w:noProof/>
                 <w:webHidden/>
               </w:rPr>
-              <w:t>27</w:t>
+              <w:t>29</w:t>
+            </w:r>
+            <w:r>
+              <w:rPr>
+                <w:noProof/>
+                <w:webHidden/>
+              </w:rPr>
+              <w:fldChar w:fldCharType="end"/>
+            </w:r>
+          </w:hyperlink>
+        </w:p>
+        <w:p>
+          <w:pPr>
+            <w:pStyle w:val="TOC3"/>
+            <w:tabs>
+              <w:tab w:val="right" w:leader="dot" w:pos="9739"/>
+            </w:tabs>
+            <w:rPr>
+              <w:rFonts w:asciiTheme="minorHAnsi" w:hAnsiTheme="minorHAnsi" w:cstheme="minorBidi"/>
+              <w:noProof/>
+              <w:color w:val="auto"/>
+              <w:kern w:val="2"/>
+              <w:sz w:val="22"/>
+              <w:lang w:val="en-US"/>
+              <w14:ligatures w14:val="standardContextual"/>
+            </w:rPr>
+          </w:pPr>
+          <w:hyperlink w:anchor="_Toc243906846" w:history="1">
+            <w:r>
+              <w:rPr>
+                <w:rStyle w:val="Hyperlink"/>
+                <w:noProof/>
+              </w:rPr>
+              <w:t>Bước 16 Luyện tập với bot mẫu</w:t>
+            </w:r>
+            <w:r>
+              <w:rPr>
+                <w:noProof/>
+                <w:webHidden/>
+              </w:rPr>
+              <w:tab/>
+            </w:r>
+            <w:r>
+              <w:rPr>
+                <w:noProof/>
+                <w:webHidden/>
+              </w:rPr>
+              <w:fldChar w:fldCharType="begin"/>
+            </w:r>
+            <w:r>
+              <w:rPr>
+                <w:noProof/>
+                <w:webHidden/>
+              </w:rPr>
+              <w:instrText xml:space="preserve"> PAGEREF _Toc243906846 \h </w:instrText>
+            </w:r>
+            <w:r>
+              <w:rPr>
+                <w:noProof/>
+                <w:webHidden/>
+              </w:rPr>
+            </w:r>
+            <w:r>
+              <w:rPr>
+                <w:noProof/>
+                <w:webHidden/>
+              </w:rPr>
+              <w:fldChar w:fldCharType="separate"/>
+            </w:r>
+            <w:r>
+              <w:rPr>
+                <w:noProof/>
+                <w:webHidden/>
+              </w:rPr>
+              <w:t>29</w:t>
             </w:r>
             <w:r>
               <w:rPr>
@@ -3326,7 +3400,7 @@
               <w14:ligatures w14:val="standardContextual"/>
             </w:rPr>
           </w:pPr>
-          <w:hyperlink w:anchor="_Toc243903646" w:history="1">
+          <w:hyperlink w:anchor="_Toc243906847" w:history="1">
             <w:r>
               <w:rPr>
                 <w:rStyle w:val="Hyperlink"/>
@@ -3353,7 +3427,7 @@
                 <w:noProof/>
                 <w:webHidden/>
               </w:rPr>
-              <w:instrText xml:space="preserve"> PAGEREF _Toc243903646 \h </w:instrText>
+              <w:instrText xml:space="preserve"> PAGEREF _Toc243906847 \h </w:instrText>
             </w:r>
             <w:r>
               <w:rPr>
@@ -3373,7 +3447,7 @@
                 <w:noProof/>
                 <w:webHidden/>
               </w:rPr>
-              <w:t>28</w:t>
+              <w:t>30</w:t>
             </w:r>
             <w:r>
               <w:rPr>
@@ -3400,13 +3474,13 @@
               <w14:ligatures w14:val="standardContextual"/>
             </w:rPr>
           </w:pPr>
-          <w:hyperlink w:anchor="_Toc243903647" w:history="1">
+          <w:hyperlink w:anchor="_Toc243906848" w:history="1">
             <w:r>
               <w:rPr>
                 <w:rStyle w:val="Hyperlink"/>
                 <w:noProof/>
               </w:rPr>
-              <w:t>Bước 16 Xem tổng quan ban tổ chức</w:t>
+              <w:t>Bước 17 Xem tổng quan ban tổ chức</w:t>
             </w:r>
             <w:r>
               <w:rPr>
@@ -3427,7 +3501,7 @@
                 <w:noProof/>
                 <w:webHidden/>
               </w:rPr>
-              <w:instrText xml:space="preserve"> PAGEREF _Toc243903647 \h </w:instrText>
+              <w:instrText xml:space="preserve"> PAGEREF _Toc243906848 \h </w:instrText>
             </w:r>
             <w:r>
               <w:rPr>
@@ -3447,7 +3521,7 @@
                 <w:noProof/>
                 <w:webHidden/>
               </w:rPr>
-              <w:t>28</w:t>
+              <w:t>30</w:t>
             </w:r>
             <w:r>
               <w:rPr>
@@ -3474,13 +3548,13 @@
               <w14:ligatures w14:val="standardContextual"/>
             </w:rPr>
           </w:pPr>
-          <w:hyperlink w:anchor="_Toc243903648" w:history="1">
+          <w:hyperlink w:anchor="_Toc243906849" w:history="1">
             <w:r>
               <w:rPr>
                 <w:rStyle w:val="Hyperlink"/>
                 <w:noProof/>
               </w:rPr>
-              <w:t>Bước 17 Chọn giải ở Tổng quan</w:t>
+              <w:t>Bước 18 Chọn giải ở Tổng quan</w:t>
             </w:r>
             <w:r>
               <w:rPr>
@@ -3501,7 +3575,7 @@
                 <w:noProof/>
                 <w:webHidden/>
               </w:rPr>
-              <w:instrText xml:space="preserve"> PAGEREF _Toc243903648 \h </w:instrText>
+              <w:instrText xml:space="preserve"> PAGEREF _Toc243906849 \h </w:instrText>
             </w:r>
             <w:r>
               <w:rPr>
@@ -3521,7 +3595,7 @@
                 <w:noProof/>
                 <w:webHidden/>
               </w:rPr>
-              <w:t>29</w:t>
+              <w:t>31</w:t>
             </w:r>
             <w:r>
               <w:rPr>
@@ -3548,13 +3622,13 @@
               <w14:ligatures w14:val="standardContextual"/>
             </w:rPr>
           </w:pPr>
-          <w:hyperlink w:anchor="_Toc243903649" w:history="1">
+          <w:hyperlink w:anchor="_Toc243906850" w:history="1">
             <w:r>
               <w:rPr>
                 <w:rStyle w:val="Hyperlink"/>
                 <w:noProof/>
               </w:rPr>
-              <w:t>Bước 18 Chuẩn bị giải mới</w:t>
+              <w:t>Bước 19 Chuẩn bị giải mới</w:t>
             </w:r>
             <w:r>
               <w:rPr>
@@ -3575,7 +3649,7 @@
                 <w:noProof/>
                 <w:webHidden/>
               </w:rPr>
-              <w:instrText xml:space="preserve"> PAGEREF _Toc243903649 \h </w:instrText>
+              <w:instrText xml:space="preserve"> PAGEREF _Toc243906850 \h </w:instrText>
             </w:r>
             <w:r>
               <w:rPr>
@@ -3595,7 +3669,7 @@
                 <w:noProof/>
                 <w:webHidden/>
               </w:rPr>
-              <w:t>30</w:t>
+              <w:t>32</w:t>
             </w:r>
             <w:r>
               <w:rPr>
@@ -3622,13 +3696,13 @@
               <w14:ligatures w14:val="standardContextual"/>
             </w:rPr>
           </w:pPr>
-          <w:hyperlink w:anchor="_Toc243903650" w:history="1">
+          <w:hyperlink w:anchor="_Toc243906851" w:history="1">
             <w:r>
               <w:rPr>
                 <w:rStyle w:val="Hyperlink"/>
                 <w:noProof/>
               </w:rPr>
-              <w:t>Bước 19 Cài máy chấm Windows hoặc Linux</w:t>
+              <w:t>Bước 20 Cài máy chấm Windows hoặc Linux</w:t>
             </w:r>
             <w:r>
               <w:rPr>
@@ -3649,7 +3723,7 @@
                 <w:noProof/>
                 <w:webHidden/>
               </w:rPr>
-              <w:instrText xml:space="preserve"> PAGEREF _Toc243903650 \h </w:instrText>
+              <w:instrText xml:space="preserve"> PAGEREF _Toc243906851 \h </w:instrText>
             </w:r>
             <w:r>
               <w:rPr>
@@ -3669,7 +3743,7 @@
                 <w:noProof/>
                 <w:webHidden/>
               </w:rPr>
-              <w:t>30</w:t>
+              <w:t>32</w:t>
             </w:r>
             <w:r>
               <w:rPr>
@@ -3696,13 +3770,13 @@
               <w14:ligatures w14:val="standardContextual"/>
             </w:rPr>
           </w:pPr>
-          <w:hyperlink w:anchor="_Toc243903651" w:history="1">
+          <w:hyperlink w:anchor="_Toc243906852" w:history="1">
             <w:r>
               <w:rPr>
                 <w:rStyle w:val="Hyperlink"/>
                 <w:noProof/>
               </w:rPr>
-              <w:t>Bước 20 Kiểm tình trạng chấm và hàng đợi</w:t>
+              <w:t>Bước 21 Kiểm tình trạng chấm và hàng đợi</w:t>
             </w:r>
             <w:r>
               <w:rPr>
@@ -3723,7 +3797,7 @@
                 <w:noProof/>
                 <w:webHidden/>
               </w:rPr>
-              <w:instrText xml:space="preserve"> PAGEREF _Toc243903651 \h </w:instrText>
+              <w:instrText xml:space="preserve"> PAGEREF _Toc243906852 \h </w:instrText>
             </w:r>
             <w:r>
               <w:rPr>
@@ -3743,7 +3817,7 @@
                 <w:noProof/>
                 <w:webHidden/>
               </w:rPr>
-              <w:t>31</w:t>
+              <w:t>33</w:t>
             </w:r>
             <w:r>
               <w:rPr>
@@ -3770,13 +3844,13 @@
               <w14:ligatures w14:val="standardContextual"/>
             </w:rPr>
           </w:pPr>
-          <w:hyperlink w:anchor="_Toc243903652" w:history="1">
+          <w:hyperlink w:anchor="_Toc243906853" w:history="1">
             <w:r>
               <w:rPr>
                 <w:rStyle w:val="Hyperlink"/>
                 <w:noProof/>
               </w:rPr>
-              <w:t>Bước 21 Soạn thông báo</w:t>
+              <w:t>Bước 22 Soạn thông báo</w:t>
             </w:r>
             <w:r>
               <w:rPr>
@@ -3797,7 +3871,7 @@
                 <w:noProof/>
                 <w:webHidden/>
               </w:rPr>
-              <w:instrText xml:space="preserve"> PAGEREF _Toc243903652 \h </w:instrText>
+              <w:instrText xml:space="preserve"> PAGEREF _Toc243906853 \h </w:instrText>
             </w:r>
             <w:r>
               <w:rPr>
@@ -3817,7 +3891,7 @@
                 <w:noProof/>
                 <w:webHidden/>
               </w:rPr>
-              <w:t>31</w:t>
+              <w:t>33</w:t>
             </w:r>
             <w:r>
               <w:rPr>
@@ -3844,13 +3918,13 @@
               <w14:ligatures w14:val="standardContextual"/>
             </w:rPr>
           </w:pPr>
-          <w:hyperlink w:anchor="_Toc243903653" w:history="1">
+          <w:hyperlink w:anchor="_Toc243906854" w:history="1">
             <w:r>
               <w:rPr>
                 <w:rStyle w:val="Hyperlink"/>
                 <w:noProof/>
               </w:rPr>
-              <w:t>Bước 22 Xuất bảng điểm CSV</w:t>
+              <w:t>Bước 23 Xuất bảng điểm CSV</w:t>
             </w:r>
             <w:r>
               <w:rPr>
@@ -3871,7 +3945,7 @@
                 <w:noProof/>
                 <w:webHidden/>
               </w:rPr>
-              <w:instrText xml:space="preserve"> PAGEREF _Toc243903653 \h </w:instrText>
+              <w:instrText xml:space="preserve"> PAGEREF _Toc243906854 \h </w:instrText>
             </w:r>
             <w:r>
               <w:rPr>
@@ -3891,7 +3965,7 @@
                 <w:noProof/>
                 <w:webHidden/>
               </w:rPr>
-              <w:t>32</w:t>
+              <w:t>34</w:t>
             </w:r>
             <w:r>
               <w:rPr>
@@ -3915,7 +3989,7 @@
         <w:pageBreakBefore/>
       </w:pPr>
       <w:bookmarkStart w:id="0" w:name="mở-đầu"/>
-      <w:bookmarkStart w:id="1" w:name="_Toc243903605"/>
+      <w:bookmarkStart w:id="1" w:name="_Toc243906805"/>
       <w:r>
         <w:lastRenderedPageBreak/>
         <w:t>Mở đầu</w:t>
@@ -3942,7 +4016,7 @@
         <w:t>https://uetbotarena.id.vn</w:t>
       </w:r>
       <w:r>
-        <w:t xml:space="preserve">. Máy chủ điều hành chạy trên VPS Ubuntu, còn các máy Windows của nhóm nhận việc qua Internet và chấm trong môi trường cô lập. Máy chấm Linux cũng đã được cài thử từ chính gói phát trên website. Mã nguồn của dự án ở </w:t>
+        <w:t xml:space="preserve">. Máy chủ điều hành chạy trên VPS Ubuntu, còn các máy Windows của nhóm nhận việc qua Internet và chấm trong môi trường cô lập. Máy chấm Linux cũng đã được cài thử bằng tin nhắn cài do website cấp. Mã nguồn của dự án ở </w:t>
       </w:r>
       <w:r>
         <w:rPr>
@@ -3981,7 +4055,7 @@
           <w:noProof/>
         </w:rPr>
         <w:drawing>
-          <wp:inline distT="0" distB="0" distL="0" distR="0" wp14:anchorId="1A50B8E7" wp14:editId="25D23995">
+          <wp:inline distT="0" distB="0" distL="0" distR="0" wp14:anchorId="785C911B" wp14:editId="1237B6EB">
             <wp:extent cx="5759999" cy="4391052"/>
             <wp:effectExtent l="0" t="0" r="0" b="0"/>
             <wp:docPr id="19" name="Picture" descr="Hình 1 Trang chủ công khai với hai giải demo đã hoàn tất"/>
@@ -4070,7 +4144,7 @@
         <w:pageBreakBefore/>
       </w:pPr>
       <w:bookmarkStart w:id="2" w:name="phần-a-giải-đấu"/>
-      <w:bookmarkStart w:id="3" w:name="_Toc243903606"/>
+      <w:bookmarkStart w:id="3" w:name="_Toc243906806"/>
       <w:bookmarkEnd w:id="0"/>
       <w:r>
         <w:lastRenderedPageBreak/>
@@ -4083,7 +4157,7 @@
         <w:pStyle w:val="Heading2"/>
       </w:pPr>
       <w:bookmarkStart w:id="4" w:name="a1-trò-chơi-ottv2"/>
-      <w:bookmarkStart w:id="5" w:name="_Toc243903607"/>
+      <w:bookmarkStart w:id="5" w:name="_Toc243906807"/>
       <w:r>
         <w:t>A1 Trò chơi OTTv2</w:t>
       </w:r>
@@ -4342,7 +4416,7 @@
         <w:pStyle w:val="Heading2"/>
       </w:pPr>
       <w:bookmarkStart w:id="6" w:name="a2-tài-khoản-và-đội"/>
-      <w:bookmarkStart w:id="7" w:name="_Toc243903608"/>
+      <w:bookmarkStart w:id="7" w:name="_Toc243906808"/>
       <w:bookmarkEnd w:id="4"/>
       <w:r>
         <w:t>A2 Tài khoản và đội</w:t>
@@ -4636,7 +4710,7 @@
         <w:pStyle w:val="Heading2"/>
       </w:pPr>
       <w:bookmarkStart w:id="8" w:name="a3-nộp-bot-qua-github"/>
-      <w:bookmarkStart w:id="9" w:name="_Toc243903609"/>
+      <w:bookmarkStart w:id="9" w:name="_Toc243906809"/>
       <w:bookmarkEnd w:id="6"/>
       <w:r>
         <w:t>A3 Nộp bot qua GitHub</w:t>
@@ -5031,7 +5105,7 @@
         <w:t>chỉ nộp qua GitHub</w:t>
       </w:r>
       <w:r>
-        <w:t>. Đường nạp ZIP là công cụ nội bộ của ban tổ chức, không phải cách tham gia giải Elo. Nhóm bỏ quy trình Form, Sheet và Apps Script vì khó ràng buộc người nộp với đội, khó chốt đúng lịch sử nguồn và đã có một luồng GitHub thống nhất. GitHub đồng thời giúp sinh viên tập chia sẻ mã và xem lại quá trình phát triển của nhóm.</w:t>
+        <w:t>. Đường nạp ZIP là công cụ nội bộ của ban tổ chức, không phải cách tham gia giải Elo. GitHub đồng thời giúp sinh viên tập chia sẻ mã và xem lại quá trình phát triển của nhóm.</w:t>
       </w:r>
     </w:p>
     <w:p>
@@ -5039,7 +5113,7 @@
         <w:pStyle w:val="Heading2"/>
       </w:pPr>
       <w:bookmarkStart w:id="10" w:name="a4-thể-lệ-và-lịch-đấu"/>
-      <w:bookmarkStart w:id="11" w:name="_Toc243903610"/>
+      <w:bookmarkStart w:id="11" w:name="_Toc243906810"/>
       <w:bookmarkEnd w:id="8"/>
       <w:r>
         <w:t>A4 Thể lệ và lịch đấu</w:t>
@@ -5051,7 +5125,7 @@
         <w:pStyle w:val="Heading3"/>
       </w:pPr>
       <w:bookmarkStart w:id="12" w:name="ladder-trước-hạn"/>
-      <w:bookmarkStart w:id="13" w:name="_Toc243903611"/>
+      <w:bookmarkStart w:id="13" w:name="_Toc243906811"/>
       <w:r>
         <w:t>Ladder trước hạn</w:t>
       </w:r>
@@ -5101,7 +5175,7 @@
         <w:pStyle w:val="Heading3"/>
       </w:pPr>
       <w:bookmarkStart w:id="14" w:name="chốt-bài-tại-hạn"/>
-      <w:bookmarkStart w:id="15" w:name="_Toc243903612"/>
+      <w:bookmarkStart w:id="15" w:name="_Toc243906812"/>
       <w:bookmarkEnd w:id="12"/>
       <w:r>
         <w:t>Chốt bài tại hạn</w:t>
@@ -5126,10 +5200,9 @@
         <w:pStyle w:val="Heading3"/>
       </w:pPr>
       <w:bookmarkStart w:id="16" w:name="xếp-hạng-chính-thức"/>
-      <w:bookmarkStart w:id="17" w:name="_Toc243903613"/>
+      <w:bookmarkStart w:id="17" w:name="_Toc243906813"/>
       <w:bookmarkEnd w:id="14"/>
       <w:r>
-        <w:lastRenderedPageBreak/>
         <w:t>Xếp hạng chính thức</w:t>
       </w:r>
       <w:bookmarkEnd w:id="17"/>
@@ -5228,6 +5301,7 @@
               <w:spacing w:before="60" w:after="100"/>
             </w:pPr>
             <w:r>
+              <w:lastRenderedPageBreak/>
               <w:t>Ghép vòng chung</w:t>
             </w:r>
           </w:p>
@@ -5442,7 +5516,7 @@
         <w:t>10 giây cho cả ván</w:t>
       </w:r>
       <w:r>
-        <w:t xml:space="preserve"> ở ladder và xếp hạng chính thức mặc định. Đồng hồ chỉ trừ khi bot tới lượt và không cộng giây. Ván nội bộ hoặc luyện tập có thể dùng quỹ khác. Việc đo giờ chi tiết được trình bày ở phần B; chung kết trên LAN là hướng tiếp theo, phần đồng bộ với Internet chưa được nghiệm thu.</w:t>
+        <w:t xml:space="preserve"> ở ladder và xếp hạng chính thức mặc định. Đồng hồ chỉ trừ khi bot tới lượt và không cộng giây. Ván nội bộ hoặc luyện tập có thể dùng quỹ khác. Việc đo giờ chi tiết được trình bày ở phần B.</w:t>
       </w:r>
     </w:p>
     <w:p>
@@ -5450,7 +5524,7 @@
         <w:pStyle w:val="Heading2"/>
       </w:pPr>
       <w:bookmarkStart w:id="18" w:name="a5-xem-kết-quả"/>
-      <w:bookmarkStart w:id="19" w:name="_Toc243903614"/>
+      <w:bookmarkStart w:id="19" w:name="_Toc243906814"/>
       <w:bookmarkEnd w:id="16"/>
       <w:bookmarkEnd w:id="10"/>
       <w:r>
@@ -5474,7 +5548,7 @@
         </w:rPr>
         <w:lastRenderedPageBreak/>
         <w:drawing>
-          <wp:inline distT="0" distB="0" distL="0" distR="0" wp14:anchorId="0CF7BD6F" wp14:editId="172AF690">
+          <wp:inline distT="0" distB="0" distL="0" distR="0" wp14:anchorId="7E70FD74" wp14:editId="4FB85229">
             <wp:extent cx="5759999" cy="5603684"/>
             <wp:effectExtent l="0" t="0" r="0" b="0"/>
             <wp:docPr id="35" name="Picture" descr="Hình 2 Bảng điểm vòng tròn của giải qua GitHub sau khi hoàn tất 12 ván"/>
@@ -5553,7 +5627,7 @@
         </w:rPr>
         <w:lastRenderedPageBreak/>
         <w:drawing>
-          <wp:inline distT="0" distB="0" distL="0" distR="0" wp14:anchorId="66419E5E" wp14:editId="7E6574DB">
+          <wp:inline distT="0" distB="0" distL="0" distR="0" wp14:anchorId="6D34D505" wp14:editId="1EDD10C3">
             <wp:extent cx="5579999" cy="7011710"/>
             <wp:effectExtent l="0" t="0" r="0" b="0"/>
             <wp:docPr id="38" name="Picture" descr="Hình 3 Replay một ván đã kết thúc bằng chiếm căn cứ"/>
@@ -5618,7 +5692,7 @@
         <w:pStyle w:val="Heading2"/>
       </w:pPr>
       <w:bookmarkStart w:id="20" w:name="a6-ban-tổ-chức-và-điều-hành"/>
-      <w:bookmarkStart w:id="21" w:name="_Toc243903615"/>
+      <w:bookmarkStart w:id="21" w:name="_Toc243906815"/>
       <w:bookmarkEnd w:id="18"/>
       <w:r>
         <w:t>A6 Ban tổ chức và điều hành</w:t>
@@ -5649,7 +5723,7 @@
         </w:rPr>
         <w:lastRenderedPageBreak/>
         <w:drawing>
-          <wp:inline distT="0" distB="0" distL="0" distR="0" wp14:anchorId="1540E74D" wp14:editId="75F6449E">
+          <wp:inline distT="0" distB="0" distL="0" distR="0" wp14:anchorId="21D8CAB4" wp14:editId="14E52845">
             <wp:extent cx="5759999" cy="3254999"/>
             <wp:effectExtent l="0" t="0" r="0" b="0"/>
             <wp:docPr id="42" name="Picture" descr="Hình 4 Phần chính của biểu mẫu tạo giải với các giá trị mặc định"/>
@@ -5739,7 +5813,7 @@
         <w:pageBreakBefore/>
       </w:pPr>
       <w:bookmarkStart w:id="22" w:name="phần-b-thiết-kế-kỹ-thuật"/>
-      <w:bookmarkStart w:id="23" w:name="_Toc243903616"/>
+      <w:bookmarkStart w:id="23" w:name="_Toc243906816"/>
       <w:bookmarkEnd w:id="20"/>
       <w:bookmarkEnd w:id="2"/>
       <w:r>
@@ -5753,7 +5827,7 @@
         <w:pStyle w:val="Heading2"/>
       </w:pPr>
       <w:bookmarkStart w:id="24" w:name="b1-kiến-trúc-tổng-thể"/>
-      <w:bookmarkStart w:id="25" w:name="_Toc243903617"/>
+      <w:bookmarkStart w:id="25" w:name="_Toc243906817"/>
       <w:r>
         <w:t>B1 Kiến trúc tổng thể</w:t>
       </w:r>
@@ -5774,7 +5848,7 @@
           <w:noProof/>
         </w:rPr>
         <w:drawing>
-          <wp:inline distT="0" distB="0" distL="0" distR="0" wp14:anchorId="03B364D4" wp14:editId="142FBD36">
+          <wp:inline distT="0" distB="0" distL="0" distR="0" wp14:anchorId="3646A07B" wp14:editId="4E87581D">
             <wp:extent cx="5759999" cy="3702857"/>
             <wp:effectExtent l="0" t="0" r="0" b="0"/>
             <wp:docPr id="47" name="Picture" descr="Hình 5 Kiến trúc triển khai; các mũi tên biểu diễn kết nối hoặc yêu cầu giữa các thành phần"/>
@@ -5855,7 +5929,7 @@
         <w:pStyle w:val="Heading2"/>
       </w:pPr>
       <w:bookmarkStart w:id="26" w:name="b2-dịch-vụ-được-dùng"/>
-      <w:bookmarkStart w:id="27" w:name="_Toc243903618"/>
+      <w:bookmarkStart w:id="27" w:name="_Toc243906818"/>
       <w:bookmarkEnd w:id="24"/>
       <w:r>
         <w:t>B2 Dịch vụ được dùng</w:t>
@@ -6154,10 +6228,27 @@
     </w:tbl>
     <w:p>
       <w:pPr>
+        <w:pStyle w:val="Heading2"/>
+      </w:pPr>
+      <w:bookmarkStart w:id="28" w:name="b3-hub-và-cách-phục-vụ-dữ-liệu"/>
+      <w:bookmarkStart w:id="29" w:name="_Toc243906819"/>
+      <w:bookmarkEnd w:id="26"/>
+      <w:r>
+        <w:t>B3 Hub và cách phục vụ dữ liệu</w:t>
+      </w:r>
+      <w:bookmarkEnd w:id="29"/>
+    </w:p>
+    <w:p>
+      <w:r>
+        <w:t>Hub dùng FastAPI để cung cấp API và SQLite để lưu dữ liệu. SQLite phù hợp với một máy chủ có lượng ghi vừa phải, giúp sao lưu và khôi phục đơn giản hơn việc triển khai thêm một cụm cơ sở dữ liệu. Nó không biến các thao tác ghi thành song song: giao dịch và khóa dài vẫn có thể làm mọi yêu cầu chờ nhau.</w:t>
+      </w:r>
+    </w:p>
+    <w:p>
+      <w:pPr>
         <w:pStyle w:val="BodyText"/>
       </w:pPr>
       <w:r>
-        <w:t>Không dùng Docker trong đường chạy và nghiệm thu. Máy chấm dùng cơ chế cách ly sẵn có của hệ điều hành; rootfs Linux được dựng bằng mmdebstrap. Điều này bỏ phụ thuộc Docker Desktop và lớp máy ảo trên Windows, nhưng cần bảo trì hai cách sandbox riêng.</w:t>
+        <w:t>Cơ sở dữ liệu dùng WAL với chế độ synchronous=NORMAL. WAL cho phép đọc trong lúc ghi; NORMAL giảm thời gian chờ ổ đĩa so với FULL. Khi chỉ kill process, giao dịch đã hoàn tất vẫn còn; nếu cả VPS mất điện hoặc kernel sập, có thể mất khoảng 30 giây ghi cuối dù cấu trúc cơ sở dữ liệu vẫn nhất quán. Nhóm chấp nhận đánh đổi này cùng cơ chế chạy lại ván và backup, thay vì hứa không mất dữ liệu trong mọi sự cố.</w:t>
       </w:r>
     </w:p>
     <w:p>
@@ -6165,7 +6256,7 @@
         <w:pStyle w:val="BodyText"/>
       </w:pPr>
       <w:r>
-        <w:t>Không dùng Google Form, Sheet hoặc Apps Script để nhận và chấm bài. Hệ thống cần gắn phiên bản nguồn với đội, kiểm quyền, khóa hạn và chạy lại có dấu vết; duy trì thêm một đường nhận bài sẽ tạo hai nguồn quyết định. Google Sheet vẫn có thể đọc CSV xuất ra để trình bày kết quả.</w:t>
+        <w:t>API ghi nghiệp vụ đi vào process chính. Hai process chỉ đọc chỉ phục vụ danh sách route đã cho phép; chúng không xử lý các yêu cầu đổi đội, nộp bài hoặc ghi kết quả. Mailer có kết nối riêng để cập nhật hàng đợi thư. Cờ hub.read_workers đặt về 0 và cài lại cấu hình cho phép trở về cách phục vụ một process.</w:t>
       </w:r>
     </w:p>
     <w:p>
@@ -6173,24 +6264,40 @@
         <w:pStyle w:val="BodyText"/>
       </w:pPr>
       <w:r>
-        <w:t>App chỉ được cấp các repo cần dùng, thay vì một token cá nhân có quyền rộng. Nhóm không dùng WASM làm backend chấm và chưa xây hệ thống đồng bộ LAN với Internet. Các quyết định này giữ một đường vận hành có thể kiểm tra được trong phạm vi bài tập.</w:t>
+        <w:t>Publisher đọc dữ liệu và xuất snapshot công khai theo lô. Người đã đăng nhập cũng đọc bảng xếp hạng từ cùng snapshot như khách; dữ liệu riêng vẫn qua API có kiểm quyền. nginx có thể chuyển sang process đọc còn lại hoặc hub chính nếu một process đọc mất kết nối. Không cache API cá nhân tại Cloudflare.</w:t>
+      </w:r>
+    </w:p>
+    <w:p>
+      <w:pPr>
+        <w:pStyle w:val="BodyText"/>
+      </w:pPr>
+      <w:r>
+        <w:t>Giao diện dừng hỏi khi tab bị ẩn. Trang đội và bài nộp hỏi mỗi 30 giây, rút xuống 3 giây khi đang có bài kiểm; mỗi lượt chỉ tải dữ liệu rồi thay phần đã đổi trên trang, không tải lại trang, giữ vị trí cuộn, ô đang gõ và mục đang mở; dữ liệu chung đọc snapshot mỗi 10 giây. SSE dùng cho theo dõi riêng và trực tiếp, có giới hạn bốn luồng mỗi người. Khi nối lại, client dùng vị trí đã nhận để tránh nhân đôi dữ liệu.</w:t>
+      </w:r>
+    </w:p>
+    <w:p>
+      <w:pPr>
+        <w:pStyle w:val="BodyText"/>
+      </w:pPr>
+      <w:r>
+        <w:t>Mật khẩu dùng Argon2 từ bản thư viện chuẩn đã ghim. Số worker băm bằng một nửa số vCPU, tức hai worker trên VPS hiện tại. Phiên mặc định sống 14 ngày; cách này giảm nhu cầu đăng nhập lại nhưng đòi hỏi bảo vệ cookie và thu hồi phiên khi cần.</w:t>
       </w:r>
     </w:p>
     <w:p>
       <w:pPr>
         <w:pStyle w:val="Heading2"/>
       </w:pPr>
-      <w:bookmarkStart w:id="28" w:name="b3-hub-và-cách-phục-vụ-dữ-liệu"/>
-      <w:bookmarkStart w:id="29" w:name="_Toc243903619"/>
-      <w:bookmarkEnd w:id="26"/>
-      <w:r>
-        <w:t>B3 Hub và cách phục vụ dữ liệu</w:t>
-      </w:r>
-      <w:bookmarkEnd w:id="29"/>
-    </w:p>
-    <w:p>
-      <w:r>
-        <w:t>Hub dùng FastAPI để cung cấp API và SQLite để lưu dữ liệu. SQLite phù hợp với một máy chủ có lượng ghi vừa phải, giúp sao lưu và khôi phục đơn giản hơn việc triển khai thêm một cụm cơ sở dữ liệu. Nó không biến các thao tác ghi thành song song: giao dịch và khóa dài vẫn có thể làm mọi yêu cầu chờ nhau.</w:t>
+      <w:bookmarkStart w:id="30" w:name="b4-máy-chấm-và-chia-việc"/>
+      <w:bookmarkStart w:id="31" w:name="_Toc243906820"/>
+      <w:bookmarkEnd w:id="28"/>
+      <w:r>
+        <w:t>B4 Máy chấm và chia việc</w:t>
+      </w:r>
+      <w:bookmarkEnd w:id="31"/>
+    </w:p>
+    <w:p>
+      <w:r>
+        <w:t>Máy chấm lấy một lease có thời hạn, gửi heartbeat trong lúc làm và gửi kết quả gắn với lease đó. Lease mặc định 30 giây; heartbeat hợp lệ gia hạn quyền xử lý. Nếu máy mất mạng hoặc tắt, hub đợi hết hạn rồi giao lại việc. Kết quả của lease cũ bị từ chối bằng cơ chế fencing, nên một ván được tính điểm một lần.</w:t>
       </w:r>
     </w:p>
     <w:p>
@@ -6198,7 +6305,7 @@
         <w:pStyle w:val="BodyText"/>
       </w:pPr>
       <w:r>
-        <w:t>Cơ sở dữ liệu dùng WAL với chế độ synchronous=NORMAL. WAL cho phép đọc trong lúc ghi; NORMAL giảm thời gian chờ ổ đĩa so với FULL. Khi chỉ kill process, giao dịch đã hoàn tất vẫn còn; nếu cả VPS mất điện hoặc kernel sập, có thể mất khoảng 30 giây ghi cuối dù cấu trúc cơ sở dữ liệu vẫn nhất quán. Nhóm chấp nhận đánh đổi này cùng cơ chế chạy lại ván và backup, thay vì hứa không mất dữ liệu trong mọi sự cố.</w:t>
+        <w:t>Lỗi hạ tầng được thử lại tối đa ba lần tự động. Hết số lần này, việc cần người vận hành xem chẩn đoán; lỗi hạ tầng không tự biến thành thua của bot. Máy có thể vào hoặc rời cụm mà không đổi bản bot đã khóa. Đây là chia việc cho các máy được nhóm tin cậy, chưa phải giao thức chống máy chấm cố ý giả kết quả.</w:t>
       </w:r>
     </w:p>
     <w:p>
@@ -6206,68 +6313,11 @@
         <w:pStyle w:val="BodyText"/>
       </w:pPr>
       <w:r>
-        <w:t>API ghi nghiệp vụ đi vào process chính. Hai process chỉ đọc chỉ phục vụ danh sách route đã cho phép; chúng không xử lý các yêu cầu đổi đội, nộp bài hoặc ghi kết quả. Mailer có kết nối riêng để cập nhật hàng đợi thư. Cờ hub.read_workers đặt về 0 và cài lại cấu hình cho phép trở về cách phục vụ một process.</w:t>
-      </w:r>
-    </w:p>
-    <w:p>
-      <w:pPr>
-        <w:pStyle w:val="BodyText"/>
-      </w:pPr>
-      <w:r>
-        <w:t>Publisher đọc dữ liệu và xuất snapshot công khai theo lô. Người đã đăng nhập cũng đọc bảng xếp hạng từ cùng snapshot như khách; dữ liệu riêng vẫn qua API có kiểm quyền. nginx có thể chuyển sang process đọc còn lại hoặc hub chính nếu một process đọc mất kết nối. Không cache API cá nhân tại Cloudflare.</w:t>
-      </w:r>
-    </w:p>
-    <w:p>
-      <w:pPr>
-        <w:pStyle w:val="BodyText"/>
-      </w:pPr>
-      <w:r>
-        <w:t>Giao diện dừng hỏi khi tab bị ẩn. Trang đội và bài nộp hỏi mỗi 30 giây, rút xuống 3 giây khi đang có bài kiểm; dữ liệu chung đọc snapshot mỗi 10 giây. SSE dùng cho theo dõi riêng và trực tiếp, có giới hạn bốn luồng mỗi người. Khi nối lại, client dùng vị trí đã nhận để tránh nhân đôi dữ liệu.</w:t>
-      </w:r>
-    </w:p>
-    <w:p>
-      <w:pPr>
-        <w:pStyle w:val="BodyText"/>
-      </w:pPr>
-      <w:r>
-        <w:t>Mật khẩu dùng Argon2 từ bản thư viện chuẩn đã ghim. Số worker băm bằng một nửa số vCPU, tức hai worker trên VPS hiện tại. Phiên mặc định sống 14 ngày; cách này giảm nhu cầu đăng nhập lại nhưng đòi hỏi bảo vệ cookie và thu hồi phiên khi cần.</w:t>
-      </w:r>
-    </w:p>
-    <w:p>
-      <w:pPr>
-        <w:pStyle w:val="Heading2"/>
-      </w:pPr>
-      <w:bookmarkStart w:id="30" w:name="b4-máy-chấm-và-chia-việc"/>
-      <w:bookmarkStart w:id="31" w:name="_Toc243903620"/>
-      <w:bookmarkEnd w:id="28"/>
-      <w:r>
-        <w:t>B4 Máy chấm và chia việc</w:t>
-      </w:r>
-      <w:bookmarkEnd w:id="31"/>
-    </w:p>
-    <w:p>
-      <w:r>
-        <w:t xml:space="preserve">Máy chấm lấy một lease có thời hạn, gửi heartbeat trong lúc làm và gửi kết quả gắn với lease đó. Lease mặc định 30 giây; heartbeat hợp lệ gia hạn quyền xử lý. Nếu máy mất mạng hoặc tắt, hub đợi hết hạn </w:t>
+        <w:t xml:space="preserve">Mỗi giải ghim nền tảng và runtime. Giải chính thức Windows chỉ giao ván tính điểm cho máy Windows cùng runtime; máy Linux vẫn có thể nhận kiểm tra và luyện tập phù hợp. Không trộn kết quả hai nền </w:t>
       </w:r>
       <w:r>
         <w:lastRenderedPageBreak/>
-        <w:t>rồi giao lại việc. Kết quả của lease cũ bị từ chối bằng cơ chế fencing, nên một ván được tính điểm một lần.</w:t>
-      </w:r>
-    </w:p>
-    <w:p>
-      <w:pPr>
-        <w:pStyle w:val="BodyText"/>
-      </w:pPr>
-      <w:r>
-        <w:t>Lỗi hạ tầng được thử lại tối đa ba lần tự động. Hết số lần này, việc cần người vận hành xem chẩn đoán; lỗi hạ tầng không tự biến thành thua của bot. Máy có thể vào hoặc rời cụm mà không đổi bản bot đã khóa. Đây là chia việc cho các máy được nhóm tin cậy, chưa phải giao thức chống máy chấm cố ý giả kết quả.</w:t>
-      </w:r>
-    </w:p>
-    <w:p>
-      <w:pPr>
-        <w:pStyle w:val="BodyText"/>
-      </w:pPr>
-      <w:r>
-        <w:t>Mỗi giải ghim nền tảng và runtime. Giải chính thức Windows chỉ giao ván tính điểm cho máy Windows cùng runtime; máy Linux vẫn có thể nhận kiểm tra và luyện tập phù hợp. Không trộn kết quả hai nền tảng rồi mặc định tốc độ bot tương đương. Việc nâng runtime giữa mùa cần được kiểm và điều hành như thay đổi môi trường thi.</w:t>
+        <w:t>tảng rồi mặc định tốc độ bot tương đương. Việc nâng runtime giữa mùa cần được kiểm và điều hành như thay đổi môi trường thi.</w:t>
       </w:r>
     </w:p>
     <w:p>
@@ -6280,7 +6330,7 @@
           <w:noProof/>
         </w:rPr>
         <w:drawing>
-          <wp:inline distT="0" distB="0" distL="0" distR="0" wp14:anchorId="067A69D5" wp14:editId="213AC01C">
+          <wp:inline distT="0" distB="0" distL="0" distR="0" wp14:anchorId="394C2AAD" wp14:editId="3A0DF608">
             <wp:extent cx="5759999" cy="3543157"/>
             <wp:effectExtent l="0" t="0" r="0" b="0"/>
             <wp:docPr id="53" name="Picture" descr="Hình 6 Trang quản lý máy chấm trên web thật; tên máy được che, trạng thái phản ánh thời điểm chụp"/>
@@ -6361,10 +6411,10 @@
         <w:pStyle w:val="Heading2"/>
       </w:pPr>
       <w:bookmarkStart w:id="32" w:name="b5-sandbox-thay-docker"/>
-      <w:bookmarkStart w:id="33" w:name="_Toc243903621"/>
+      <w:bookmarkStart w:id="33" w:name="_Toc243906821"/>
       <w:bookmarkEnd w:id="30"/>
       <w:r>
-        <w:t>B5 Sandbox thay Docker</w:t>
+        <w:t>B5 Sandbox chạy bot</w:t>
       </w:r>
       <w:bookmarkEnd w:id="33"/>
     </w:p>
@@ -6378,8 +6428,41 @@
         <w:pStyle w:val="BodyText"/>
       </w:pPr>
       <w:r>
+        <w:t>Trên Windows, AppContainer hạn chế quyền của tiến trình và Job Object quản lý cây tiến trình, bộ nhớ và thời gian. Máy chấm khởi tạo bot với tập file cần thiết thay vì quyền người dùng đầy đủ. Cách này chạy trực tiếp trên Windows, không yêu cầu người tham gia cài WSL hoặc Docker. Nó vẫn phụ thuộc phiên bản hệ điều hành và toolchain đã kiểm.</w:t>
+      </w:r>
+    </w:p>
+    <w:p>
+      <w:pPr>
+        <w:pStyle w:val="BodyText"/>
+      </w:pPr>
+      <w:r>
+        <w:t>Trên Linux, bubblewrap dựng không gian tên với rootfs chỉ đọc, cgroup v2 áp giới hạn và seccomp chặn syscall ngoài nhu cầu. Bot không được mạng, fork tùy ý, thiết bị hoặc hệ thống file của máy chủ. Rootfs tải qua link có hạn được dựng bằng mmdebstrap, có kiểm hash khi tải. WSL2 đã được dùng để kiểm luồng này; cấu hình AppArmor và quyền user namespace trên Ubuntu thực cần kiểm riêng trước sử dụng rộng.</w:t>
+      </w:r>
+    </w:p>
+    <w:p>
+      <w:pPr>
+        <w:pStyle w:val="BodyText"/>
+      </w:pPr>
+      <w:r>
         <w:lastRenderedPageBreak/>
-        <w:t>Trên Windows, AppContainer hạn chế quyền của tiến trình và Job Object quản lý cây tiến trình, bộ nhớ và thời gian. Máy chấm khởi tạo bot với tập file cần thiết thay vì quyền người dùng đầy đủ. Cách này chạy trực tiếp trên Windows, không yêu cầu người tham gia cài WSL hoặc Docker. Nó vẫn phụ thuộc phiên bản hệ điều hành và toolchain đã kiểm.</w:t>
+        <w:t>Hai backend đã qua cùng bộ 23 trường hợp phá, gồm vượt tài nguyên và truy cập trái phép. Kết quả đó chứng minh các ca đã thử bị chặn, không chứng minh mọi lỗ hổng hệ điều hành đều bị loại bỏ. Vì vậy chỉ chạy máy chấm bằng tài khoản phù hợp, cập nhật hệ điều hành, giữ bí mật ngoài vùng bot thấy và thu hồi máy có dấu hiệu bất thường.</w:t>
+      </w:r>
+    </w:p>
+    <w:p>
+      <w:pPr>
+        <w:pStyle w:val="Heading2"/>
+      </w:pPr>
+      <w:bookmarkStart w:id="34" w:name="b6-quỹ-giờ-và-khả-năng-đối-chiếu"/>
+      <w:bookmarkStart w:id="35" w:name="_Toc243906822"/>
+      <w:bookmarkEnd w:id="32"/>
+      <w:r>
+        <w:t>B6 Quỹ giờ và khả năng đối chiếu</w:t>
+      </w:r>
+      <w:bookmarkEnd w:id="35"/>
+    </w:p>
+    <w:p>
+      <w:r>
+        <w:t>Đồng hồ thi đấu nằm tại máy chấm và dùng nguồn thời gian monotonic. Chỉ thời gian lượt bot được trừ vào quỹ của chính bot; độ trễ mạng giữa hub và máy chấm không phải thời gian suy nghĩ. Mặc định ladder và chính thức đều là 10 giây mỗi bot cho cả ván, không cộng giây. Startup và thời gian trao đổi có cơ chế giới hạn riêng để một bot không giữ slot vô hạn.</w:t>
       </w:r>
     </w:p>
     <w:p>
@@ -6387,7 +6470,7 @@
         <w:pStyle w:val="BodyText"/>
       </w:pPr>
       <w:r>
-        <w:t>Trên Linux, bubblewrap dựng không gian tên với rootfs chỉ đọc, cgroup v2 áp giới hạn và seccomp chặn syscall ngoài nhu cầu. Bot không được mạng, fork tùy ý, thiết bị hoặc hệ thống file của máy chủ. Rootfs phát qua web được dựng bằng mmdebstrap, có kiểm hash khi tải. WSL2 đã được dùng để kiểm luồng này; cấu hình AppArmor và quyền user namespace trên Ubuntu thực cần kiểm riêng trước sử dụng rộng.</w:t>
+        <w:t>Kiểm tra bài dùng 72 mẫu, mỗi mẫu có ngân sách riêng 500 ms, không rút từ quỹ thi đấu. Bot phải trả lời đúng giao thức, hợp lệ và trong giới hạn ở các mẫu này. Đạt kiểm chỉ là điều kiện nhận bài; chất lượng chiến thuật và độ ổn định trong ván dài vẫn do trận đấu thể hiện.</w:t>
       </w:r>
     </w:p>
     <w:p>
@@ -6395,64 +6478,31 @@
         <w:pStyle w:val="BodyText"/>
       </w:pPr>
       <w:r>
-        <w:t>Hai backend đã qua cùng bộ 23 trường hợp phá, gồm vượt tài nguyên và truy cập trái phép. Kết quả đó chứng minh các ca đã thử bị chặn, không chứng minh mọi lỗ hổng hệ điều hành đều bị loại bỏ. Vì vậy chỉ chạy máy chấm bằng tài khoản phù hợp, cập nhật hệ điều hành, giữ bí mật ngoài vùng bot thấy và thu hồi máy có dấu hiệu bất thường.</w:t>
+        <w:t>Replay gắn hai SHA, luật, tham số, nước đi và kết quả với mã ván. Hub lưu replay nén cùng kết quả để có thể xem lại và kiểm đủ sự kiện. Với ván không ai xem, máy chấm giữ sự kiện tại chỗ rồi gửi khối replay nén một lần khi xong; ván có người xem gửi tiến độ theo nhịp trực tiếp. Cách này giảm số request nhưng vẫn giữ đường đối chiếu.</w:t>
+      </w:r>
+    </w:p>
+    <w:p>
+      <w:pPr>
+        <w:pStyle w:val="BodyText"/>
+      </w:pPr>
+      <w:r>
+        <w:t>Elo được cập nhật theo kết quả hai ván đổi màu khi cả cặp hoàn tất, tránh phụ thuộc thứ tự máy trả kết quả. K của vòng chung và luật phá hòa được ghim trong cấu hình giải. Công cụ tính lại dùng cùng dữ liệu ván, thứ tự mã và quy tắc đã công bố để đối chiếu với bảng hub. Vòng tròn chính thức xếp theo điểm, không tiếp tục đổi Elo.</w:t>
+      </w:r>
+    </w:p>
+    <w:p>
+      <w:pPr>
+        <w:pStyle w:val="BodyText"/>
+      </w:pPr>
+      <w:r>
+        <w:t>Giới hạn công bằng còn lại là khác biệt phần cứng giữa các máy cùng nền tảng. Ghim runtime và dành CPU giảm biến động môi trường nhưng không làm mọi CPU nhanh bằng nhau. Trước một mùa thật cần quan sát bot đã khóa trên cụm máy, giữ cấu hình nhất quán và công bố ngân sách thời gian rõ ràng.</w:t>
       </w:r>
     </w:p>
     <w:p>
       <w:pPr>
         <w:pStyle w:val="Heading2"/>
       </w:pPr>
-      <w:bookmarkStart w:id="34" w:name="b6-quỹ-giờ-và-khả-năng-đối-chiếu"/>
-      <w:bookmarkStart w:id="35" w:name="_Toc243903622"/>
-      <w:bookmarkEnd w:id="32"/>
-      <w:r>
-        <w:t>B6 Quỹ giờ và khả năng đối chiếu</w:t>
-      </w:r>
-      <w:bookmarkEnd w:id="35"/>
-    </w:p>
-    <w:p>
-      <w:r>
-        <w:t>Đồng hồ thi đấu nằm tại máy chấm và dùng nguồn thời gian monotonic. Chỉ thời gian lượt bot được trừ vào quỹ của chính bot; độ trễ mạng giữa hub và máy chấm không phải thời gian suy nghĩ. Mặc định ladder và chính thức đều là 10 giây mỗi bot cho cả ván, không cộng giây. Startup và thời gian trao đổi có cơ chế giới hạn riêng để một bot không giữ slot vô hạn.</w:t>
-      </w:r>
-    </w:p>
-    <w:p>
-      <w:pPr>
-        <w:pStyle w:val="BodyText"/>
-      </w:pPr>
-      <w:r>
-        <w:t>Kiểm tra bài dùng 72 mẫu, mỗi mẫu có ngân sách riêng 500 ms, không rút từ quỹ thi đấu. Bot phải trả lời đúng giao thức, hợp lệ và trong giới hạn ở các mẫu này. Đạt kiểm chỉ là điều kiện nhận bài; chất lượng chiến thuật và độ ổn định trong ván dài vẫn do trận đấu thể hiện.</w:t>
-      </w:r>
-    </w:p>
-    <w:p>
-      <w:pPr>
-        <w:pStyle w:val="BodyText"/>
-      </w:pPr>
-      <w:r>
-        <w:t>Replay gắn hai SHA, luật, tham số, nước đi và kết quả với mã ván. Hub lưu replay nén cùng kết quả để có thể xem lại và kiểm đủ sự kiện. Với ván không ai xem, máy chấm giữ sự kiện tại chỗ rồi gửi khối replay nén một lần khi xong; ván có người xem gửi tiến độ theo nhịp trực tiếp. Cách này giảm số request nhưng vẫn giữ đường đối chiếu.</w:t>
-      </w:r>
-    </w:p>
-    <w:p>
-      <w:pPr>
-        <w:pStyle w:val="BodyText"/>
-      </w:pPr>
-      <w:r>
-        <w:t>Elo được cập nhật theo kết quả hai ván đổi màu khi cả cặp hoàn tất, tránh phụ thuộc thứ tự máy trả kết quả. K của vòng chung và luật phá hòa được ghim trong cấu hình giải. Công cụ tính lại dùng cùng dữ liệu ván, thứ tự mã và quy tắc đã công bố để đối chiếu với bảng hub. Vòng tròn chính thức xếp theo điểm, không tiếp tục đổi Elo.</w:t>
-      </w:r>
-    </w:p>
-    <w:p>
-      <w:pPr>
-        <w:pStyle w:val="BodyText"/>
-      </w:pPr>
-      <w:r>
-        <w:t>Giới hạn công bằng còn lại là khác biệt phần cứng giữa các máy cùng nền tảng. Ghim runtime và dành CPU giảm biến động môi trường nhưng không làm mọi CPU nhanh bằng nhau. Trước một mùa thật cần quan sát bot đã khóa trên cụm máy, giữ cấu hình nhất quán và công bố ngân sách thời gian rõ ràng.</w:t>
-      </w:r>
-    </w:p>
-    <w:p>
-      <w:pPr>
-        <w:pStyle w:val="Heading2"/>
-      </w:pPr>
       <w:bookmarkStart w:id="36" w:name="b7-chịu-lỗi-và-sao-lưu"/>
-      <w:bookmarkStart w:id="37" w:name="_Toc243903623"/>
+      <w:bookmarkStart w:id="37" w:name="_Toc243906823"/>
       <w:bookmarkEnd w:id="34"/>
       <w:r>
         <w:t>B7 Chịu lỗi và sao lưu</w:t>
@@ -6641,7 +6691,6 @@
               <w:spacing w:before="60" w:after="100"/>
             </w:pPr>
             <w:r>
-              <w:lastRenderedPageBreak/>
               <w:t>T3 Chặn mạng 90 giây</w:t>
             </w:r>
           </w:p>
@@ -6767,6 +6816,7 @@
         <w:pStyle w:val="BodyText"/>
       </w:pPr>
       <w:r>
+        <w:lastRenderedPageBreak/>
         <w:t>Sau một lần tắt cứng bổ sung lúc rảnh, shortcut đưa PC online trong 3,31 giây. Thời gian này được đo riêng vì lượt tắt cứng đầu không lưu được thời gian khởi động lại. Sau toàn bộ phép thử, kiểm toàn vẹn SQLite trả về ok; dữ liệu hai giải demo và tài khoản giữ nguyên so với bản trước, cả hai máy online. Các thời gian là số quan sát của lần thử, không phải cam kết phục hồi trong mọi điều kiện mạng.</w:t>
       </w:r>
     </w:p>
@@ -6804,76 +6854,67 @@
     </w:p>
     <w:p>
       <w:pPr>
+        <w:pStyle w:val="Heading2"/>
+      </w:pPr>
+      <w:bookmarkStart w:id="38" w:name="b8-bảo-mật"/>
+      <w:bookmarkStart w:id="39" w:name="_Toc243906824"/>
+      <w:bookmarkEnd w:id="36"/>
+      <w:r>
+        <w:t>B8 Bảo mật</w:t>
+      </w:r>
+      <w:bookmarkEnd w:id="39"/>
+    </w:p>
+    <w:p>
+      <w:r>
+        <w:t>Phân quyền được kiểm tại API cho từng tài khoản, đội và tài nguyên. Cookie phiên có Secure, HttpOnly và SameSite=Strict; thao tác ghi kiểm CSRF và Origin. Dữ liệu người dùng hiển thị được escape, snapshot chỉ chứa trường công khai đã chọn. Không gửi source, token hoặc email riêng theo snapshot để rồi trông chờ giao diện giấu đi.</w:t>
+      </w:r>
+    </w:p>
+    <w:p>
+      <w:pPr>
         <w:pStyle w:val="BodyText"/>
       </w:pPr>
       <w:r>
-        <w:t>Phần thi LAN tương lai sẽ cần cách chốt một bộ bot, đưa sang mạng nội bộ rồi đối chiếu kết quả với Internet. Luồng đồng bộ này chưa được triển khai và nghiệm thu. Vì vậy tài liệu hiện tại không hướng dẫn tắt Internet rồi hứa giải vẫn đồng bộ tự động.</w:t>
+        <w:t>Giới hạn đăng nhập theo tài khoản chỉ đếm lần sai: tối đa 10 lần trong 15 phút, đăng nhập đúng xóa bộ đếm sai trước đó. Khi cửa sổ khóa đã có hiệu lực thì phải đợi hết hạn. Theo IP có giới hạn 600 lần trong 15 phút để giảm thử hàng loạt mà vẫn chừa mạng chung của lớp. Giới hạn email là năm mã mỗi giờ, mười mã mỗi ngày cùng khoảng cách tối thiểu 60 giây và hạn mã 10 phút.</w:t>
+      </w:r>
+    </w:p>
+    <w:p>
+      <w:pPr>
+        <w:pStyle w:val="BodyText"/>
+      </w:pPr>
+      <w:r>
+        <w:t>Gói máy chấm chỉ tải qua link có chữ ký hết hạn sau bảy ngày; mã máy chấm gửi riêng và thu hồi được mới là thông tin cấp quyền nhận việc.</w:t>
+      </w:r>
+    </w:p>
+    <w:p>
+      <w:pPr>
+        <w:pStyle w:val="BodyText"/>
+      </w:pPr>
+      <w:r>
+        <w:t>Mã xác minh được lưu dưới dạng HMAC; khóa, SMTP và khóa GitHub App nằm ngoài repo. Giới hạn quyền App vào repo được chọn giảm phạm vi khi một cấu hình bị lộ. Webhook phải có chữ ký hợp lệ, còn việc nhận nguồn chỉ đi qua các host GitHub được phép. Hub kiểm đường dẫn giải nén, liên kết và giới hạn kích thước để chặn ghi ra ngoài thư mục hoặc bom nén.</w:t>
+      </w:r>
+    </w:p>
+    <w:p>
+      <w:pPr>
+        <w:pStyle w:val="BodyText"/>
+      </w:pPr>
+      <w:r>
+        <w:t>nginx và ứng dụng đặt chính sách nội dung, chống đoán loại file và hạn chế thông tin referrer. HSTS có thời hạn sáu tháng để trình duyệt ưu tiên HTTPS. Tunnel chỉ chuyển tiếp hostname đã cấu hình; API và trang cá nhân không có Cache Rule công khai. Cần kiểm cả header, quyền API và trạng thái dữ liệu sau triển khai, không chỉ kiểm trang chủ mở được.</w:t>
+      </w:r>
+    </w:p>
+    <w:p>
+      <w:pPr>
+        <w:pStyle w:val="BodyText"/>
+      </w:pPr>
+      <w:r>
+        <w:t>Bộ kiểm có thử vai khách, sinh viên và ban tổ chức, truy cập chéo đội, request thiếu CSRF, dữ liệu script và nguồn phá sandbox. Tuy vậy máy chấm được tin cậy vẫn có quyền nhìn nguồn cần chạy; hệ thống chưa giải quyết việc một người vận hành máy chấm cố ý lấy mã. Tài khoản máy, quyền tổ chức và trao đổi mã phải đi cùng quy trình quản lý của nhóm.</w:t>
       </w:r>
     </w:p>
     <w:p>
       <w:pPr>
         <w:pStyle w:val="Heading2"/>
       </w:pPr>
-      <w:bookmarkStart w:id="38" w:name="b8-bảo-mật"/>
-      <w:bookmarkStart w:id="39" w:name="_Toc243903624"/>
-      <w:bookmarkEnd w:id="36"/>
-      <w:r>
-        <w:t>B8 Bảo mật</w:t>
-      </w:r>
-      <w:bookmarkEnd w:id="39"/>
-    </w:p>
-    <w:p>
-      <w:r>
-        <w:t>Phân quyền được kiểm tại API cho từng tài khoản, đội và tài nguyên. Cookie phiên có Secure, HttpOnly và SameSite=Strict; thao tác ghi kiểm CSRF và Origin. Dữ liệu người dùng hiển thị được escape, snapshot chỉ chứa trường công khai đã chọn. Không gửi source, token hoặc email riêng theo snapshot để rồi trông chờ giao diện giấu đi.</w:t>
-      </w:r>
-    </w:p>
-    <w:p>
-      <w:pPr>
-        <w:pStyle w:val="BodyText"/>
-      </w:pPr>
-      <w:r>
-        <w:t>Giới hạn đăng nhập theo tài khoản chỉ đếm lần sai: tối đa 10 lần trong 15 phút, đăng nhập đúng xóa bộ đếm sai trước đó. Khi cửa sổ khóa đã có hiệu lực thì phải đợi hết hạn. Theo IP có giới hạn 600 lần trong 15 phút để giảm thử hàng loạt mà vẫn chừa mạng chung của lớp. Giới hạn email là năm mã mỗi giờ, mười mã mỗi ngày cùng khoảng cách tối thiểu 60 giây và hạn mã 10 phút.</w:t>
-      </w:r>
-    </w:p>
-    <w:p>
-      <w:pPr>
-        <w:pStyle w:val="BodyText"/>
-      </w:pPr>
-      <w:r>
-        <w:t>Gói máy chấm chỉ tải qua link có chữ ký hết hạn sau bảy ngày; mã máy chấm gửi riêng và thu hồi được mới là thông tin cấp quyền nhận việc.</w:t>
-      </w:r>
-    </w:p>
-    <w:p>
-      <w:pPr>
-        <w:pStyle w:val="BodyText"/>
-      </w:pPr>
-      <w:r>
-        <w:t>Mã xác minh được lưu dưới dạng HMAC; khóa, SMTP và khóa GitHub App nằm ngoài repo. Giới hạn quyền App vào repo được chọn giảm phạm vi khi một cấu hình bị lộ. Webhook phải có chữ ký hợp lệ, còn việc nhận nguồn chỉ đi qua các host GitHub được phép. Hub kiểm đường dẫn giải nén, liên kết và giới hạn kích thước để chặn ghi ra ngoài thư mục hoặc bom nén.</w:t>
-      </w:r>
-    </w:p>
-    <w:p>
-      <w:pPr>
-        <w:pStyle w:val="BodyText"/>
-      </w:pPr>
-      <w:r>
-        <w:lastRenderedPageBreak/>
-        <w:t>nginx và ứng dụng đặt chính sách nội dung, chống đoán loại file và hạn chế thông tin referrer. HSTS có thời hạn sáu tháng để trình duyệt ưu tiên HTTPS. Tunnel chỉ chuyển tiếp hostname đã cấu hình; API và trang cá nhân không có Cache Rule công khai. Cần kiểm cả header, quyền API và trạng thái dữ liệu sau triển khai, không chỉ kiểm trang chủ mở được.</w:t>
-      </w:r>
-    </w:p>
-    <w:p>
-      <w:pPr>
-        <w:pStyle w:val="BodyText"/>
-      </w:pPr>
-      <w:r>
-        <w:t>Bộ kiểm có thử vai khách, sinh viên và ban tổ chức, truy cập chéo đội, request thiếu CSRF, dữ liệu script và nguồn phá sandbox. Tuy vậy máy chấm được tin cậy vẫn có quyền nhìn nguồn cần chạy; hệ thống chưa giải quyết việc một người vận hành máy chấm cố ý lấy mã. Tài khoản máy, quyền tổ chức và trao đổi mã phải đi cùng quy trình quản lý của nhóm.</w:t>
-      </w:r>
-    </w:p>
-    <w:p>
-      <w:pPr>
-        <w:pStyle w:val="Heading2"/>
-      </w:pPr>
       <w:bookmarkStart w:id="40" w:name="b9-sức-tải-và-thời-gian-đã-đo"/>
-      <w:bookmarkStart w:id="41" w:name="_Toc243903625"/>
+      <w:bookmarkStart w:id="41" w:name="_Toc243906825"/>
       <w:bookmarkEnd w:id="38"/>
       <w:r>
         <w:t>B9 Sức tải và thời gian đã đo</w:t>
@@ -6915,6 +6956,7 @@
               <w:rPr>
                 <w:b/>
               </w:rPr>
+              <w:lastRenderedPageBreak/>
               <w:t>Chỉ số</w:t>
             </w:r>
           </w:p>
@@ -7416,7 +7458,924 @@
         <w:pStyle w:val="BodyText"/>
       </w:pPr>
       <w:r>
-        <w:t>Các số trên đo web và giao tiếp máy chấm, không phải bot thật đồng thời ở 32 slot. Với bot mẫu dễ trên Windows, quỹ 10 giây mỗi bên, ván đã có binary mất trung bình 1,439 giây từ nhận việc đến xong; ván đầu có biên dịch mất 8,069 giây. Bot tìm kiếm dùng hết quỹ sẽ lâu hơn nhiều. Do đó bảng sau có cả ngoại suy bot mẫu và ngân sách dự phòng 30 giây một ván.</w:t>
+        <w:t>Lu</w:t>
+      </w:r>
+      <w:r>
+        <w:t>ồ</w:t>
+      </w:r>
+      <w:r>
+        <w:t>ng ch</w:t>
+      </w:r>
+      <w:r>
+        <w:t>ấ</w:t>
+      </w:r>
+      <w:r>
+        <w:t>m (slot) là m</w:t>
+      </w:r>
+      <w:r>
+        <w:t>ộ</w:t>
+      </w:r>
+      <w:r>
+        <w:t>t ván ch</w:t>
+      </w:r>
+      <w:r>
+        <w:t>ạ</w:t>
+      </w:r>
+      <w:r>
+        <w:t>y cùng lúc, c</w:t>
+      </w:r>
+      <w:r>
+        <w:t>ầ</w:t>
+      </w:r>
+      <w:r>
+        <w:t>n m</w:t>
+      </w:r>
+      <w:r>
+        <w:t>ộ</w:t>
+      </w:r>
+      <w:r>
+        <w:t>t lu</w:t>
+      </w:r>
+      <w:r>
+        <w:t>ồ</w:t>
+      </w:r>
+      <w:r>
+        <w:t>ng CPU và kho</w:t>
+      </w:r>
+      <w:r>
+        <w:t>ả</w:t>
+      </w:r>
+      <w:r>
+        <w:t>ng 1 GB RAM. C</w:t>
+      </w:r>
+      <w:r>
+        <w:t>ụ</w:t>
+      </w:r>
+      <w:r>
+        <w:t>m hi</w:t>
+      </w:r>
+      <w:r>
+        <w:t>ệ</w:t>
+      </w:r>
+      <w:r>
+        <w:t>n có b</w:t>
+      </w:r>
+      <w:r>
+        <w:t>ố</w:t>
+      </w:r>
+      <w:r>
+        <w:t>n lu</w:t>
+      </w:r>
+      <w:r>
+        <w:t>ồ</w:t>
+      </w:r>
+      <w:r>
+        <w:t>ng: hai máy Windows, m</w:t>
+      </w:r>
+      <w:r>
+        <w:t>ỗ</w:t>
+      </w:r>
+      <w:r>
+        <w:t xml:space="preserve">i máy hai </w:t>
+      </w:r>
+      <w:r>
+        <w:t>lu</w:t>
+      </w:r>
+      <w:r>
+        <w:t>ồ</w:t>
+      </w:r>
+      <w:r>
+        <w:t>ng.</w:t>
+      </w:r>
+    </w:p>
+    <w:p>
+      <w:pPr>
+        <w:pStyle w:val="BodyText"/>
+      </w:pPr>
+      <w:r>
+        <w:t>Đ</w:t>
+      </w:r>
+      <w:r>
+        <w:t>ợ</w:t>
+      </w:r>
+      <w:r>
+        <w:t>t ladder m</w:t>
+      </w:r>
+      <w:r>
+        <w:t>ở</w:t>
+      </w:r>
+      <w:r>
+        <w:t xml:space="preserve"> c</w:t>
+      </w:r>
+      <w:r>
+        <w:t>ứ</w:t>
+      </w:r>
+      <w:r>
+        <w:t xml:space="preserve"> hai gi</w:t>
+      </w:r>
+      <w:r>
+        <w:t>ờ</w:t>
+      </w:r>
+      <w:r>
+        <w:t xml:space="preserve"> m</w:t>
+      </w:r>
+      <w:r>
+        <w:t>ộ</w:t>
+      </w:r>
+      <w:r>
+        <w:t>t l</w:t>
+      </w:r>
+      <w:r>
+        <w:t>ầ</w:t>
+      </w:r>
+      <w:r>
+        <w:t>n, vào gi</w:t>
+      </w:r>
+      <w:r>
+        <w:t>ờ</w:t>
+      </w:r>
+      <w:r>
+        <w:t xml:space="preserve"> ch</w:t>
+      </w:r>
+      <w:r>
+        <w:t>ẵ</w:t>
+      </w:r>
+      <w:r>
+        <w:t>n. Hub ghép các đ</w:t>
+      </w:r>
+      <w:r>
+        <w:t>ộ</w:t>
+      </w:r>
+      <w:r>
+        <w:t>i có b</w:t>
+      </w:r>
+      <w:r>
+        <w:t>ả</w:t>
+      </w:r>
+      <w:r>
+        <w:t>n Đ</w:t>
+      </w:r>
+      <w:r>
+        <w:t>ạ</w:t>
+      </w:r>
+      <w:r>
+        <w:t>t thành c</w:t>
+      </w:r>
+      <w:r>
+        <w:t>ặ</w:t>
+      </w:r>
+      <w:r>
+        <w:t>p, m</w:t>
+      </w:r>
+      <w:r>
+        <w:t>ỗ</w:t>
+      </w:r>
+      <w:r>
+        <w:t>i c</w:t>
+      </w:r>
+      <w:r>
+        <w:t>ặ</w:t>
+      </w:r>
+      <w:r>
+        <w:t>p hai ván đ</w:t>
+      </w:r>
+      <w:r>
+        <w:t>ổ</w:t>
+      </w:r>
+      <w:r>
+        <w:t>i màu; N đ</w:t>
+      </w:r>
+      <w:r>
+        <w:t>ộ</w:t>
+      </w:r>
+      <w:r>
+        <w:t>i có N ván. Th</w:t>
+      </w:r>
+      <w:r>
+        <w:t>ờ</w:t>
+      </w:r>
+      <w:r>
+        <w:t>i gian m</w:t>
+      </w:r>
+      <w:r>
+        <w:t>ộ</w:t>
+      </w:r>
+      <w:r>
+        <w:t>t đ</w:t>
+      </w:r>
+      <w:r>
+        <w:t>ợ</w:t>
+      </w:r>
+      <w:r>
+        <w:t>t là th</w:t>
+      </w:r>
+      <w:r>
+        <w:t>ờ</w:t>
+      </w:r>
+      <w:r>
+        <w:t>i gian ch</w:t>
+      </w:r>
+      <w:r>
+        <w:t>ạ</w:t>
+      </w:r>
+      <w:r>
+        <w:t>y h</w:t>
+      </w:r>
+      <w:r>
+        <w:t>ế</w:t>
+      </w:r>
+      <w:r>
+        <w:t>t các ván đó, không ph</w:t>
+      </w:r>
+      <w:r>
+        <w:t>ả</w:t>
+      </w:r>
+      <w:r>
+        <w:t>i hai gi</w:t>
+      </w:r>
+      <w:r>
+        <w:t>ờ</w:t>
+      </w:r>
+      <w:r>
+        <w:t>. Xong s</w:t>
+      </w:r>
+      <w:r>
+        <w:t>ớ</w:t>
+      </w:r>
+      <w:r>
+        <w:t>m thì máy ch</w:t>
+      </w:r>
+      <w:r>
+        <w:t>ấ</w:t>
+      </w:r>
+      <w:r>
+        <w:t>m dùng th</w:t>
+      </w:r>
+      <w:r>
+        <w:t>ờ</w:t>
+      </w:r>
+      <w:r>
+        <w:t>i gian còn l</w:t>
+      </w:r>
+      <w:r>
+        <w:t>ạ</w:t>
+      </w:r>
+      <w:r>
+        <w:t>i cho ki</w:t>
+      </w:r>
+      <w:r>
+        <w:t>ể</w:t>
+      </w:r>
+      <w:r>
+        <w:t>m bài và luy</w:t>
+      </w:r>
+      <w:r>
+        <w:t>ệ</w:t>
+      </w:r>
+      <w:r>
+        <w:t>n t</w:t>
+      </w:r>
+      <w:r>
+        <w:t>ậ</w:t>
+      </w:r>
+      <w:r>
+        <w:t>p. Đ</w:t>
+      </w:r>
+      <w:r>
+        <w:t>ế</w:t>
+      </w:r>
+      <w:r>
+        <w:t>n m</w:t>
+      </w:r>
+      <w:r>
+        <w:t>ố</w:t>
+      </w:r>
+      <w:r>
+        <w:t>c sau mà đ</w:t>
+      </w:r>
+      <w:r>
+        <w:t>ợ</w:t>
+      </w:r>
+      <w:r>
+        <w:t>t trư</w:t>
+      </w:r>
+      <w:r>
+        <w:t>ớ</w:t>
+      </w:r>
+      <w:r>
+        <w:t>c chưa xong thì b</w:t>
+      </w:r>
+      <w:r>
+        <w:t>ỏ</w:t>
+      </w:r>
+      <w:r>
+        <w:t xml:space="preserve"> m</w:t>
+      </w:r>
+      <w:r>
+        <w:t>ố</w:t>
+      </w:r>
+      <w:r>
+        <w:t>c đó, như A4.</w:t>
+      </w:r>
+    </w:p>
+    <w:p>
+      <w:pPr>
+        <w:pStyle w:val="BodyText"/>
+      </w:pPr>
+      <w:r>
+        <w:t>X</w:t>
+      </w:r>
+      <w:r>
+        <w:t>ế</w:t>
+      </w:r>
+      <w:r>
+        <w:t>p h</w:t>
+      </w:r>
+      <w:r>
+        <w:t>ạ</w:t>
+      </w:r>
+      <w:r>
+        <w:t>ng chính th</w:t>
+      </w:r>
+      <w:r>
+        <w:t>ứ</w:t>
+      </w:r>
+      <w:r>
+        <w:t>c di</w:t>
+      </w:r>
+      <w:r>
+        <w:t>ễ</w:t>
+      </w:r>
+      <w:r>
+        <w:t>n ra sau h</w:t>
+      </w:r>
+      <w:r>
+        <w:t>ạ</w:t>
+      </w:r>
+      <w:r>
+        <w:t>n n</w:t>
+      </w:r>
+      <w:r>
+        <w:t>ộ</w:t>
+      </w:r>
+      <w:r>
+        <w:t>p, tách v</w:t>
+      </w:r>
+      <w:r>
+        <w:t>ớ</w:t>
+      </w:r>
+      <w:r>
+        <w:t>i ladder. Đây là th</w:t>
+      </w:r>
+      <w:r>
+        <w:t>ờ</w:t>
+      </w:r>
+      <w:r>
+        <w:t>i gian ban t</w:t>
+      </w:r>
+      <w:r>
+        <w:t>ổ</w:t>
+      </w:r>
+      <w:r>
+        <w:t xml:space="preserve"> ch</w:t>
+      </w:r>
+      <w:r>
+        <w:t>ứ</w:t>
+      </w:r>
+      <w:r>
+        <w:t>c ph</w:t>
+      </w:r>
+      <w:r>
+        <w:t>ả</w:t>
+      </w:r>
+      <w:r>
+        <w:t>i ch</w:t>
+      </w:r>
+      <w:r>
+        <w:t>ờ</w:t>
+      </w:r>
+      <w:r>
+        <w:t xml:space="preserve"> t</w:t>
+      </w:r>
+      <w:r>
+        <w:t>ừ</w:t>
+      </w:r>
+      <w:r>
+        <w:t xml:space="preserve"> h</w:t>
+      </w:r>
+      <w:r>
+        <w:t>ạ</w:t>
+      </w:r>
+      <w:r>
+        <w:t>n n</w:t>
+      </w:r>
+      <w:r>
+        <w:t>ộ</w:t>
+      </w:r>
+      <w:r>
+        <w:t>p t</w:t>
+      </w:r>
+      <w:r>
+        <w:t>ớ</w:t>
+      </w:r>
+      <w:r>
+        <w:t>i khi có 16 đ</w:t>
+      </w:r>
+      <w:r>
+        <w:t>ộ</w:t>
+      </w:r>
+      <w:r>
+        <w:t>i chung k</w:t>
+      </w:r>
+      <w:r>
+        <w:t>ế</w:t>
+      </w:r>
+      <w:r>
+        <w:t>t. Khi N &gt; 64, m</w:t>
+      </w:r>
+      <w:r>
+        <w:t>ọ</w:t>
+      </w:r>
+      <w:r>
+        <w:t>i đ</w:t>
+      </w:r>
+      <w:r>
+        <w:t>ộ</w:t>
+      </w:r>
+      <w:r>
+        <w:t>i đ</w:t>
+      </w:r>
+      <w:r>
+        <w:t>ấ</w:t>
+      </w:r>
+      <w:r>
+        <w:t>u 20 đ</w:t>
+      </w:r>
+      <w:r>
+        <w:t>ợ</w:t>
+      </w:r>
+      <w:r>
+        <w:t>t vòng chung n</w:t>
+      </w:r>
+      <w:r>
+        <w:t>ố</w:t>
+      </w:r>
+      <w:r>
+        <w:t>i nhau, m</w:t>
+      </w:r>
+      <w:r>
+        <w:t>ỗ</w:t>
+      </w:r>
+      <w:r>
+        <w:t>i đ</w:t>
+      </w:r>
+      <w:r>
+        <w:t>ợ</w:t>
+      </w:r>
+      <w:r>
+        <w:t>t N ván và ph</w:t>
+      </w:r>
+      <w:r>
+        <w:t>ả</w:t>
+      </w:r>
+      <w:r>
+        <w:t>i xong m</w:t>
+      </w:r>
+      <w:r>
+        <w:t>ớ</w:t>
+      </w:r>
+      <w:r>
+        <w:t>i m</w:t>
+      </w:r>
+      <w:r>
+        <w:t>ở</w:t>
+      </w:r>
+      <w:r>
+        <w:t xml:space="preserve"> đ</w:t>
+      </w:r>
+      <w:r>
+        <w:t>ợ</w:t>
+      </w:r>
+      <w:r>
+        <w:t>t sau. Sau đó, 64 đ</w:t>
+      </w:r>
+      <w:r>
+        <w:t>ộ</w:t>
+      </w:r>
+      <w:r>
+        <w:t>i đ</w:t>
+      </w:r>
+      <w:r>
+        <w:t>ầ</w:t>
+      </w:r>
+      <w:r>
+        <w:t>u đá vòng tròn v</w:t>
+      </w:r>
+      <w:r>
+        <w:t>ớ</w:t>
+      </w:r>
+      <w:r>
+        <w:t>i 64 × 63 = 4.032 ván ch</w:t>
+      </w:r>
+      <w:r>
+        <w:t>ạ</w:t>
+      </w:r>
+      <w:r>
+        <w:t>y liên t</w:t>
+      </w:r>
+      <w:r>
+        <w:t>ụ</w:t>
+      </w:r>
+      <w:r>
+        <w:t>c. T</w:t>
+      </w:r>
+      <w:r>
+        <w:t>ổ</w:t>
+      </w:r>
+      <w:r>
+        <w:t>ng là 20 × N + 4.032 ván: 8.032 ván v</w:t>
+      </w:r>
+      <w:r>
+        <w:t>ớ</w:t>
+      </w:r>
+      <w:r>
+        <w:t>i 200 đ</w:t>
+      </w:r>
+      <w:r>
+        <w:t>ộ</w:t>
+      </w:r>
+      <w:r>
+        <w:t>i, 24.032 ván v</w:t>
+      </w:r>
+      <w:r>
+        <w:t>ớ</w:t>
+      </w:r>
+      <w:r>
+        <w:t>i 1.000 đ</w:t>
+      </w:r>
+      <w:r>
+        <w:t>ộ</w:t>
+      </w:r>
+      <w:r>
+        <w:t>i. Khi N ≤ 64, ch</w:t>
+      </w:r>
+      <w:r>
+        <w:t>ỉ</w:t>
+      </w:r>
+      <w:r>
+        <w:t xml:space="preserve"> có vòng tròn N × (N − 1) ván. Không c</w:t>
+      </w:r>
+      <w:r>
+        <w:t>ộ</w:t>
+      </w:r>
+      <w:r>
+        <w:t>ng các đ</w:t>
+      </w:r>
+      <w:r>
+        <w:t>ợ</w:t>
+      </w:r>
+      <w:r>
+        <w:t>t ladder vào kho</w:t>
+      </w:r>
+      <w:r>
+        <w:t>ả</w:t>
+      </w:r>
+      <w:r>
+        <w:t>ng ch</w:t>
+      </w:r>
+      <w:r>
+        <w:t>ờ</w:t>
+      </w:r>
+      <w:r>
+        <w:t xml:space="preserve"> sau h</w:t>
+      </w:r>
+      <w:r>
+        <w:t>ạ</w:t>
+      </w:r>
+      <w:r>
+        <w:t>n.</w:t>
+      </w:r>
+    </w:p>
+    <w:p>
+      <w:pPr>
+        <w:pStyle w:val="BodyText"/>
+      </w:pPr>
+      <w:r>
+        <w:t>Hai m</w:t>
+      </w:r>
+      <w:r>
+        <w:t>ứ</w:t>
+      </w:r>
+      <w:r>
+        <w:t>c th</w:t>
+      </w:r>
+      <w:r>
+        <w:t>ờ</w:t>
+      </w:r>
+      <w:r>
+        <w:t>i gian m</w:t>
+      </w:r>
+      <w:r>
+        <w:t>ộ</w:t>
+      </w:r>
+      <w:r>
+        <w:t>t ván đư</w:t>
+      </w:r>
+      <w:r>
+        <w:t>ợ</w:t>
+      </w:r>
+      <w:r>
+        <w:t>c dùng đ</w:t>
+      </w:r>
+      <w:r>
+        <w:t>ể</w:t>
+      </w:r>
+      <w:r>
+        <w:t xml:space="preserve"> tính b</w:t>
+      </w:r>
+      <w:r>
+        <w:t>ả</w:t>
+      </w:r>
+      <w:r>
+        <w:t>ng. Bot m</w:t>
+      </w:r>
+      <w:r>
+        <w:t>ẫ</w:t>
+      </w:r>
+      <w:r>
+        <w:t>u m</w:t>
+      </w:r>
+      <w:r>
+        <w:t>ấ</w:t>
+      </w:r>
+      <w:r>
+        <w:t>t trung bình 1,439 giây qua 10 ván Windows đã có binary, tính t</w:t>
+      </w:r>
+      <w:r>
+        <w:t>ừ</w:t>
+      </w:r>
+      <w:r>
+        <w:t xml:space="preserve"> lúc nh</w:t>
+      </w:r>
+      <w:r>
+        <w:t>ậ</w:t>
+      </w:r>
+      <w:r>
+        <w:t>n vi</w:t>
+      </w:r>
+      <w:r>
+        <w:t>ệ</w:t>
+      </w:r>
+      <w:r>
+        <w:t>c t</w:t>
+      </w:r>
+      <w:r>
+        <w:t>ớ</w:t>
+      </w:r>
+      <w:r>
+        <w:t>i xong; ván đ</w:t>
+      </w:r>
+      <w:r>
+        <w:t>ầ</w:t>
+      </w:r>
+      <w:r>
+        <w:t>u có biên d</w:t>
+      </w:r>
+      <w:r>
+        <w:t>ị</w:t>
+      </w:r>
+      <w:r>
+        <w:t>ch m</w:t>
+      </w:r>
+      <w:r>
+        <w:t>ấ</w:t>
+      </w:r>
+      <w:r>
+        <w:t>t 8,069 giây. M</w:t>
+      </w:r>
+      <w:r>
+        <w:t>ứ</w:t>
+      </w:r>
+      <w:r>
+        <w:t>c ch</w:t>
+      </w:r>
+      <w:r>
+        <w:t>ậ</w:t>
+      </w:r>
+      <w:r>
+        <w:t>m nh</w:t>
+      </w:r>
+      <w:r>
+        <w:t>ấ</w:t>
+      </w:r>
+      <w:r>
+        <w:t>t dùng đ</w:t>
+      </w:r>
+      <w:r>
+        <w:t>ể</w:t>
+      </w:r>
+      <w:r>
+        <w:t xml:space="preserve"> tính l</w:t>
+      </w:r>
+      <w:r>
+        <w:t>ị</w:t>
+      </w:r>
+      <w:r>
+        <w:t>ch là 30 giây: hai qu</w:t>
+      </w:r>
+      <w:r>
+        <w:t>ỹ</w:t>
+      </w:r>
+      <w:r>
+        <w:t xml:space="preserve"> 10 giây là 20 giây, c</w:t>
+      </w:r>
+      <w:r>
+        <w:t>ộ</w:t>
+      </w:r>
+      <w:r>
+        <w:t>ng kh</w:t>
+      </w:r>
+      <w:r>
+        <w:t>ở</w:t>
+      </w:r>
+      <w:r>
+        <w:t>i đ</w:t>
+      </w:r>
+      <w:r>
+        <w:t>ộ</w:t>
+      </w:r>
+      <w:r>
+        <w:t>ng t</w:t>
+      </w:r>
+      <w:r>
+        <w:t>ố</w:t>
+      </w:r>
+      <w:r>
+        <w:t>i đa hai giây m</w:t>
+      </w:r>
+      <w:r>
+        <w:t>ỗ</w:t>
+      </w:r>
+      <w:r>
+        <w:t>i bot, ba giây ân h</w:t>
+      </w:r>
+      <w:r>
+        <w:t>ạ</w:t>
+      </w:r>
+      <w:r>
+        <w:t>n khi quá gi</w:t>
+      </w:r>
+      <w:r>
+        <w:t>ờ</w:t>
+      </w:r>
+      <w:r>
+        <w:t xml:space="preserve"> và giao ti</w:t>
+      </w:r>
+      <w:r>
+        <w:t>ế</w:t>
+      </w:r>
+      <w:r>
+        <w:t>p. Bot sinh viên th</w:t>
+      </w:r>
+      <w:r>
+        <w:t>ậ</w:t>
+      </w:r>
+      <w:r>
+        <w:t>t có th</w:t>
+      </w:r>
+      <w:r>
+        <w:t>ể</w:t>
+      </w:r>
+      <w:r>
+        <w:t xml:space="preserve"> n</w:t>
+      </w:r>
+      <w:r>
+        <w:t>ằ</w:t>
+      </w:r>
+      <w:r>
+        <w:t>m gi</w:t>
+      </w:r>
+      <w:r>
+        <w:t>ữ</w:t>
+      </w:r>
+      <w:r>
+        <w:t>a hai m</w:t>
+      </w:r>
+      <w:r>
+        <w:t>ứ</w:t>
+      </w:r>
+      <w:r>
+        <w:t>c này.</w:t>
+      </w:r>
+    </w:p>
+    <w:p>
+      <w:pPr>
+        <w:pStyle w:val="BodyText"/>
+      </w:pPr>
+      <w:r>
+        <w:t>G</w:t>
+      </w:r>
+      <w:r>
+        <w:t>ọ</w:t>
+      </w:r>
+      <w:r>
+        <w:t>i S là s</w:t>
+      </w:r>
+      <w:r>
+        <w:t>ố</w:t>
+      </w:r>
+      <w:r>
+        <w:t xml:space="preserve"> lu</w:t>
+      </w:r>
+      <w:r>
+        <w:t>ồ</w:t>
+      </w:r>
+      <w:r>
+        <w:t>ng ch</w:t>
+      </w:r>
+      <w:r>
+        <w:t>ấ</w:t>
+      </w:r>
+      <w:r>
+        <w:t>m và t là th</w:t>
+      </w:r>
+      <w:r>
+        <w:t>ờ</w:t>
+      </w:r>
+      <w:r>
+        <w:t>i gian m</w:t>
+      </w:r>
+      <w:r>
+        <w:t>ộ</w:t>
+      </w:r>
+      <w:r>
+        <w:t>t ván. M</w:t>
+      </w:r>
+      <w:r>
+        <w:t>ộ</w:t>
+      </w:r>
+      <w:r>
+        <w:t>t đ</w:t>
+      </w:r>
+      <w:r>
+        <w:t>ợ</w:t>
+      </w:r>
+      <w:r>
+        <w:t>t ladder m</w:t>
+      </w:r>
+      <w:r>
+        <w:t>ấ</w:t>
+      </w:r>
+      <w:r>
+        <w:t>t kho</w:t>
+      </w:r>
+      <w:r>
+        <w:t>ả</w:t>
+      </w:r>
+      <w:r>
+        <w:t>ng ⌈N/S⌉ × t. V</w:t>
+      </w:r>
+      <w:r>
+        <w:t>ớ</w:t>
+      </w:r>
+      <w:r>
+        <w:t>i N &gt; 64, x</w:t>
+      </w:r>
+      <w:r>
+        <w:t>ế</w:t>
+      </w:r>
+      <w:r>
+        <w:t>p h</w:t>
+      </w:r>
+      <w:r>
+        <w:t>ạ</w:t>
+      </w:r>
+      <w:r>
+        <w:t>ng chính th</w:t>
+      </w:r>
+      <w:r>
+        <w:t>ứ</w:t>
+      </w:r>
+      <w:r>
+        <w:t>c sau h</w:t>
+      </w:r>
+      <w:r>
+        <w:t>ạ</w:t>
+      </w:r>
+      <w:r>
+        <w:t>n m</w:t>
+      </w:r>
+      <w:r>
+        <w:t>ấ</w:t>
+      </w:r>
+      <w:r>
+        <w:t>t kho</w:t>
+      </w:r>
+      <w:r>
+        <w:t>ả</w:t>
+      </w:r>
+      <w:r>
+        <w:t>ng [20 × ⌈N/S⌉ + ⌈4.032/S⌉] × t.</w:t>
       </w:r>
     </w:p>
     <w:tbl>
@@ -7426,11 +8385,11 @@
         <w:tblLook w:val="0020" w:firstRow="1" w:lastRow="0" w:firstColumn="0" w:lastColumn="0" w:noHBand="0" w:noVBand="0"/>
       </w:tblPr>
       <w:tblGrid>
-        <w:gridCol w:w="1573"/>
-        <w:gridCol w:w="2098"/>
-        <w:gridCol w:w="2098"/>
-        <w:gridCol w:w="2098"/>
-        <w:gridCol w:w="2098"/>
+        <w:gridCol w:w="762"/>
+        <w:gridCol w:w="1055"/>
+        <w:gridCol w:w="2403"/>
+        <w:gridCol w:w="1876"/>
+        <w:gridCol w:w="3869"/>
       </w:tblGrid>
       <w:tr>
         <w:trPr>
@@ -7439,7 +8398,7 @@
         </w:trPr>
         <w:tc>
           <w:tcPr>
-            <w:tcW w:w="1250" w:type="dxa"/>
+            <w:tcW w:w="737" w:type="dxa"/>
           </w:tcPr>
           <w:p>
             <w:pPr>
@@ -7450,79 +8409,345 @@
               <w:rPr>
                 <w:b/>
               </w:rPr>
-              <w:t>Số đội</w:t>
+              <w:t>S</w:t>
+            </w:r>
+            <w:r>
+              <w:rPr>
+                <w:b/>
+              </w:rPr>
+              <w:t>ố</w:t>
+            </w:r>
+            <w:r>
+              <w:rPr>
+                <w:b/>
+              </w:rPr>
+              <w:t xml:space="preserve"> đ</w:t>
+            </w:r>
+            <w:r>
+              <w:rPr>
+                <w:b/>
+              </w:rPr>
+              <w:t>ộ</w:t>
+            </w:r>
+            <w:r>
+              <w:rPr>
+                <w:b/>
+              </w:rPr>
+              <w:t>i</w:t>
             </w:r>
           </w:p>
         </w:tc>
         <w:tc>
           <w:tcPr>
-            <w:tcW w:w="1667" w:type="dxa"/>
+            <w:tcW w:w="1020" w:type="dxa"/>
           </w:tcPr>
           <w:p>
             <w:pPr>
               <w:keepNext/>
               <w:spacing w:before="60" w:after="100"/>
-              <w:jc w:val="right"/>
             </w:pPr>
             <w:r>
               <w:rPr>
                 <w:b/>
               </w:rPr>
-              <w:t>Slot</w:t>
+              <w:t>Lu</w:t>
+            </w:r>
+            <w:r>
+              <w:rPr>
+                <w:b/>
+              </w:rPr>
+              <w:t>ồ</w:t>
+            </w:r>
+            <w:r>
+              <w:rPr>
+                <w:b/>
+              </w:rPr>
+              <w:t>ng ch</w:t>
+            </w:r>
+            <w:r>
+              <w:rPr>
+                <w:b/>
+              </w:rPr>
+              <w:t>ấ</w:t>
+            </w:r>
+            <w:r>
+              <w:rPr>
+                <w:b/>
+              </w:rPr>
+              <w:t>m</w:t>
             </w:r>
           </w:p>
         </w:tc>
         <w:tc>
           <w:tcPr>
-            <w:tcW w:w="1667" w:type="dxa"/>
+            <w:tcW w:w="2324" w:type="dxa"/>
           </w:tcPr>
           <w:p>
             <w:pPr>
               <w:keepNext/>
               <w:spacing w:before="60" w:after="100"/>
-              <w:jc w:val="right"/>
             </w:pPr>
             <w:r>
               <w:rPr>
                 <w:b/>
               </w:rPr>
-              <w:t>Một đợt ladder, bot mẫu</w:t>
+              <w:t>M</w:t>
+            </w:r>
+            <w:r>
+              <w:rPr>
+                <w:b/>
+              </w:rPr>
+              <w:t>ộ</w:t>
+            </w:r>
+            <w:r>
+              <w:rPr>
+                <w:b/>
+              </w:rPr>
+              <w:t>t đ</w:t>
+            </w:r>
+            <w:r>
+              <w:rPr>
+                <w:b/>
+              </w:rPr>
+              <w:t>ợ</w:t>
+            </w:r>
+            <w:r>
+              <w:rPr>
+                <w:b/>
+              </w:rPr>
+              <w:t>t ladder: bot m</w:t>
+            </w:r>
+            <w:r>
+              <w:rPr>
+                <w:b/>
+              </w:rPr>
+              <w:t>ẫ</w:t>
+            </w:r>
+            <w:r>
+              <w:rPr>
+                <w:b/>
+              </w:rPr>
+              <w:t>u / ch</w:t>
+            </w:r>
+            <w:r>
+              <w:rPr>
+                <w:b/>
+              </w:rPr>
+              <w:t>ậ</w:t>
+            </w:r>
+            <w:r>
+              <w:rPr>
+                <w:b/>
+              </w:rPr>
+              <w:t>m nh</w:t>
+            </w:r>
+            <w:r>
+              <w:rPr>
+                <w:b/>
+              </w:rPr>
+              <w:t>ấ</w:t>
+            </w:r>
+            <w:r>
+              <w:rPr>
+                <w:b/>
+              </w:rPr>
+              <w:t>t</w:t>
             </w:r>
           </w:p>
         </w:tc>
         <w:tc>
           <w:tcPr>
-            <w:tcW w:w="1667" w:type="dxa"/>
+            <w:tcW w:w="1814" w:type="dxa"/>
           </w:tcPr>
           <w:p>
             <w:pPr>
               <w:keepNext/>
               <w:spacing w:before="60" w:after="100"/>
-              <w:jc w:val="right"/>
             </w:pPr>
             <w:r>
               <w:rPr>
                 <w:b/>
               </w:rPr>
-              <w:t>Toàn bộ chính thức, bot mẫu</w:t>
+              <w:t>Ch</w:t>
+            </w:r>
+            <w:r>
+              <w:rPr>
+                <w:b/>
+              </w:rPr>
+              <w:t>ậ</w:t>
+            </w:r>
+            <w:r>
+              <w:rPr>
+                <w:b/>
+              </w:rPr>
+              <w:t>m nh</w:t>
+            </w:r>
+            <w:r>
+              <w:rPr>
+                <w:b/>
+              </w:rPr>
+              <w:t>ấ</w:t>
+            </w:r>
+            <w:r>
+              <w:rPr>
+                <w:b/>
+              </w:rPr>
+              <w:t>t có k</w:t>
+            </w:r>
+            <w:r>
+              <w:rPr>
+                <w:b/>
+              </w:rPr>
+              <w:t>ị</w:t>
+            </w:r>
+            <w:r>
+              <w:rPr>
+                <w:b/>
+              </w:rPr>
+              <w:t>p m</w:t>
+            </w:r>
+            <w:r>
+              <w:rPr>
+                <w:b/>
+              </w:rPr>
+              <w:t>ố</w:t>
+            </w:r>
+            <w:r>
+              <w:rPr>
+                <w:b/>
+              </w:rPr>
+              <w:t>c 2 gi</w:t>
+            </w:r>
+            <w:r>
+              <w:rPr>
+                <w:b/>
+              </w:rPr>
+              <w:t>ờ</w:t>
             </w:r>
           </w:p>
         </w:tc>
         <w:tc>
           <w:tcPr>
-            <w:tcW w:w="1667" w:type="dxa"/>
+            <w:tcW w:w="3742" w:type="dxa"/>
           </w:tcPr>
           <w:p>
             <w:pPr>
               <w:keepNext/>
               <w:spacing w:before="60" w:after="100"/>
-              <w:jc w:val="right"/>
             </w:pPr>
             <w:r>
               <w:rPr>
                 <w:b/>
               </w:rPr>
-              <w:t>Chính thức, dự phòng</w:t>
+              <w:t>X</w:t>
+            </w:r>
+            <w:r>
+              <w:rPr>
+                <w:b/>
+              </w:rPr>
+              <w:t>ế</w:t>
+            </w:r>
+            <w:r>
+              <w:rPr>
+                <w:b/>
+              </w:rPr>
+              <w:t>p h</w:t>
+            </w:r>
+            <w:r>
+              <w:rPr>
+                <w:b/>
+              </w:rPr>
+              <w:t>ạ</w:t>
+            </w:r>
+            <w:r>
+              <w:rPr>
+                <w:b/>
+              </w:rPr>
+              <w:t>ng chính th</w:t>
+            </w:r>
+            <w:r>
+              <w:rPr>
+                <w:b/>
+              </w:rPr>
+              <w:t>ứ</w:t>
+            </w:r>
+            <w:r>
+              <w:rPr>
+                <w:b/>
+              </w:rPr>
+              <w:t>c sau h</w:t>
+            </w:r>
+            <w:r>
+              <w:rPr>
+                <w:b/>
+              </w:rPr>
+              <w:t>ạ</w:t>
+            </w:r>
+            <w:r>
+              <w:rPr>
+                <w:b/>
+              </w:rPr>
+              <w:t>n, t</w:t>
+            </w:r>
+            <w:r>
+              <w:rPr>
+                <w:b/>
+              </w:rPr>
+              <w:t>ớ</w:t>
+            </w:r>
+            <w:r>
+              <w:rPr>
+                <w:b/>
+              </w:rPr>
+              <w:t>i khi có 16 đ</w:t>
+            </w:r>
+            <w:r>
+              <w:rPr>
+                <w:b/>
+              </w:rPr>
+              <w:t>ộ</w:t>
+            </w:r>
+            <w:r>
+              <w:rPr>
+                <w:b/>
+              </w:rPr>
+              <w:t>i: bot m</w:t>
+            </w:r>
+            <w:r>
+              <w:rPr>
+                <w:b/>
+              </w:rPr>
+              <w:t>ẫ</w:t>
+            </w:r>
+            <w:r>
+              <w:rPr>
+                <w:b/>
+              </w:rPr>
+              <w:t>u / ch</w:t>
+            </w:r>
+            <w:r>
+              <w:rPr>
+                <w:b/>
+              </w:rPr>
+              <w:t>ậ</w:t>
+            </w:r>
+            <w:r>
+              <w:rPr>
+                <w:b/>
+              </w:rPr>
+              <w:t>m nh</w:t>
+            </w:r>
+            <w:r>
+              <w:rPr>
+                <w:b/>
+              </w:rPr>
+              <w:t>ấ</w:t>
+            </w:r>
+            <w:r>
+              <w:rPr>
+                <w:b/>
+              </w:rPr>
+              <w:t>t</w:t>
             </w:r>
           </w:p>
         </w:tc>
@@ -7533,7 +8758,7 @@
         </w:trPr>
         <w:tc>
           <w:tcPr>
-            <w:tcW w:w="1250" w:type="dxa"/>
+            <w:tcW w:w="737" w:type="dxa"/>
           </w:tcPr>
           <w:p>
             <w:pPr>
@@ -7546,57 +8771,68 @@
         </w:tc>
         <w:tc>
           <w:tcPr>
-            <w:tcW w:w="1667" w:type="dxa"/>
+            <w:tcW w:w="1020" w:type="dxa"/>
           </w:tcPr>
           <w:p>
             <w:pPr>
               <w:spacing w:before="60" w:after="100"/>
-              <w:jc w:val="right"/>
             </w:pPr>
             <w:r>
-              <w:t>10</w:t>
+              <w:t>4 (hi</w:t>
+            </w:r>
+            <w:r>
+              <w:t>ệ</w:t>
+            </w:r>
+            <w:r>
+              <w:t>n có)</w:t>
             </w:r>
           </w:p>
         </w:tc>
         <w:tc>
           <w:tcPr>
-            <w:tcW w:w="1667" w:type="dxa"/>
+            <w:tcW w:w="2324" w:type="dxa"/>
           </w:tcPr>
           <w:p>
             <w:pPr>
               <w:spacing w:before="60" w:after="100"/>
-              <w:jc w:val="right"/>
             </w:pPr>
             <w:r>
-              <w:t>0,48 phút</w:t>
+              <w:t>1,2 phút / 25 phút</w:t>
             </w:r>
           </w:p>
         </w:tc>
         <w:tc>
           <w:tcPr>
-            <w:tcW w:w="1667" w:type="dxa"/>
+            <w:tcW w:w="1814" w:type="dxa"/>
           </w:tcPr>
           <w:p>
             <w:pPr>
               <w:spacing w:before="60" w:after="100"/>
-              <w:jc w:val="right"/>
             </w:pPr>
             <w:r>
-              <w:t>19,28 phút</w:t>
+              <w:t>K</w:t>
+            </w:r>
+            <w:r>
+              <w:t>ị</w:t>
+            </w:r>
+            <w:r>
+              <w:t>p</w:t>
             </w:r>
           </w:p>
         </w:tc>
         <w:tc>
           <w:tcPr>
-            <w:tcW w:w="1667" w:type="dxa"/>
+            <w:tcW w:w="3742" w:type="dxa"/>
           </w:tcPr>
           <w:p>
             <w:pPr>
               <w:spacing w:before="60" w:after="100"/>
-              <w:jc w:val="right"/>
             </w:pPr>
             <w:r>
-              <w:t>6,70 giờ</w:t>
+              <w:t>48 phút / 16,7 gi</w:t>
+            </w:r>
+            <w:r>
+              <w:t>ờ</w:t>
             </w:r>
           </w:p>
         </w:tc>
@@ -7607,7 +8843,7 @@
         </w:trPr>
         <w:tc>
           <w:tcPr>
-            <w:tcW w:w="1250" w:type="dxa"/>
+            <w:tcW w:w="737" w:type="dxa"/>
           </w:tcPr>
           <w:p>
             <w:pPr>
@@ -7620,12 +8856,11 @@
         </w:tc>
         <w:tc>
           <w:tcPr>
-            <w:tcW w:w="1667" w:type="dxa"/>
+            <w:tcW w:w="1020" w:type="dxa"/>
           </w:tcPr>
           <w:p>
             <w:pPr>
               <w:spacing w:before="60" w:after="100"/>
-              <w:jc w:val="right"/>
             </w:pPr>
             <w:r>
               <w:t>16</w:t>
@@ -7634,43 +8869,49 @@
         </w:tc>
         <w:tc>
           <w:tcPr>
-            <w:tcW w:w="1667" w:type="dxa"/>
+            <w:tcW w:w="2324" w:type="dxa"/>
           </w:tcPr>
           <w:p>
             <w:pPr>
               <w:spacing w:before="60" w:after="100"/>
-              <w:jc w:val="right"/>
             </w:pPr>
             <w:r>
-              <w:t>0,31 phút</w:t>
+              <w:t>0,3 phút / 6,5 phút</w:t>
             </w:r>
           </w:p>
         </w:tc>
         <w:tc>
           <w:tcPr>
-            <w:tcW w:w="1667" w:type="dxa"/>
+            <w:tcW w:w="1814" w:type="dxa"/>
           </w:tcPr>
           <w:p>
             <w:pPr>
               <w:spacing w:before="60" w:after="100"/>
-              <w:jc w:val="right"/>
             </w:pPr>
             <w:r>
-              <w:t>12,28 phút</w:t>
+              <w:t>K</w:t>
+            </w:r>
+            <w:r>
+              <w:t>ị</w:t>
+            </w:r>
+            <w:r>
+              <w:t>p</w:t>
             </w:r>
           </w:p>
         </w:tc>
         <w:tc>
           <w:tcPr>
-            <w:tcW w:w="1667" w:type="dxa"/>
+            <w:tcW w:w="3742" w:type="dxa"/>
           </w:tcPr>
           <w:p>
             <w:pPr>
               <w:spacing w:before="60" w:after="100"/>
-              <w:jc w:val="right"/>
             </w:pPr>
             <w:r>
-              <w:t>4,27 giờ</w:t>
+              <w:t>12 phút / 4,3 gi</w:t>
+            </w:r>
+            <w:r>
+              <w:t>ờ</w:t>
             </w:r>
           </w:p>
         </w:tc>
@@ -7681,7 +8922,7 @@
         </w:trPr>
         <w:tc>
           <w:tcPr>
-            <w:tcW w:w="1250" w:type="dxa"/>
+            <w:tcW w:w="737" w:type="dxa"/>
           </w:tcPr>
           <w:p>
             <w:pPr>
@@ -7689,63 +8930,92 @@
             </w:pPr>
             <w:r>
               <w:lastRenderedPageBreak/>
-              <w:t>200</w:t>
+              <w:t>1.000</w:t>
             </w:r>
           </w:p>
         </w:tc>
         <w:tc>
           <w:tcPr>
-            <w:tcW w:w="1667" w:type="dxa"/>
+            <w:tcW w:w="1020" w:type="dxa"/>
           </w:tcPr>
           <w:p>
             <w:pPr>
               <w:spacing w:before="60" w:after="100"/>
-              <w:jc w:val="right"/>
             </w:pPr>
             <w:r>
-              <w:t>32</w:t>
+              <w:t>4 (hi</w:t>
+            </w:r>
+            <w:r>
+              <w:t>ệ</w:t>
+            </w:r>
+            <w:r>
+              <w:t>n có)</w:t>
             </w:r>
           </w:p>
         </w:tc>
         <w:tc>
           <w:tcPr>
-            <w:tcW w:w="1667" w:type="dxa"/>
+            <w:tcW w:w="2324" w:type="dxa"/>
           </w:tcPr>
           <w:p>
             <w:pPr>
               <w:spacing w:before="60" w:after="100"/>
-              <w:jc w:val="right"/>
             </w:pPr>
             <w:r>
-              <w:t>0,17 phút</w:t>
+              <w:t>6 phút / 2,1 gi</w:t>
+            </w:r>
+            <w:r>
+              <w:t>ờ</w:t>
             </w:r>
           </w:p>
         </w:tc>
         <w:tc>
           <w:tcPr>
-            <w:tcW w:w="1667" w:type="dxa"/>
+            <w:tcW w:w="1814" w:type="dxa"/>
           </w:tcPr>
           <w:p>
             <w:pPr>
               <w:spacing w:before="60" w:after="100"/>
-              <w:jc w:val="right"/>
             </w:pPr>
             <w:r>
-              <w:t>6,38 phút</w:t>
+              <w:t>Không, m</w:t>
+            </w:r>
+            <w:r>
+              <w:t>ố</w:t>
+            </w:r>
+            <w:r>
+              <w:t>c sau b</w:t>
+            </w:r>
+            <w:r>
+              <w:t>ị</w:t>
+            </w:r>
+            <w:r>
+              <w:t xml:space="preserve"> b</w:t>
+            </w:r>
+            <w:r>
+              <w:t>ỏ</w:t>
             </w:r>
           </w:p>
         </w:tc>
         <w:tc>
           <w:tcPr>
-            <w:tcW w:w="1667" w:type="dxa"/>
+            <w:tcW w:w="3742" w:type="dxa"/>
           </w:tcPr>
           <w:p>
             <w:pPr>
               <w:spacing w:before="60" w:after="100"/>
-              <w:jc w:val="right"/>
             </w:pPr>
             <w:r>
-              <w:t>2,22 giờ</w:t>
+              <w:t>2,4 gi</w:t>
+            </w:r>
+            <w:r>
+              <w:t>ờ</w:t>
+            </w:r>
+            <w:r>
+              <w:t xml:space="preserve"> / 50,1 gi</w:t>
+            </w:r>
+            <w:r>
+              <w:t>ờ</w:t>
             </w:r>
           </w:p>
         </w:tc>
@@ -7756,7 +9026,7 @@
         </w:trPr>
         <w:tc>
           <w:tcPr>
-            <w:tcW w:w="1250" w:type="dxa"/>
+            <w:tcW w:w="737" w:type="dxa"/>
           </w:tcPr>
           <w:p>
             <w:pPr>
@@ -7769,57 +9039,62 @@
         </w:tc>
         <w:tc>
           <w:tcPr>
-            <w:tcW w:w="1667" w:type="dxa"/>
+            <w:tcW w:w="1020" w:type="dxa"/>
           </w:tcPr>
           <w:p>
             <w:pPr>
               <w:spacing w:before="60" w:after="100"/>
-              <w:jc w:val="right"/>
             </w:pPr>
             <w:r>
-              <w:t>10</w:t>
+              <w:t>12</w:t>
             </w:r>
           </w:p>
         </w:tc>
         <w:tc>
           <w:tcPr>
-            <w:tcW w:w="1667" w:type="dxa"/>
+            <w:tcW w:w="2324" w:type="dxa"/>
           </w:tcPr>
           <w:p>
             <w:pPr>
               <w:spacing w:before="60" w:after="100"/>
-              <w:jc w:val="right"/>
             </w:pPr>
             <w:r>
-              <w:t>2,40 phút</w:t>
+              <w:t>2 phút / 42 phút</w:t>
             </w:r>
           </w:p>
         </w:tc>
         <w:tc>
           <w:tcPr>
-            <w:tcW w:w="1667" w:type="dxa"/>
+            <w:tcW w:w="1814" w:type="dxa"/>
           </w:tcPr>
           <w:p>
             <w:pPr>
               <w:spacing w:before="60" w:after="100"/>
-              <w:jc w:val="right"/>
             </w:pPr>
             <w:r>
-              <w:t>57,66 phút</w:t>
+              <w:t>K</w:t>
+            </w:r>
+            <w:r>
+              <w:t>ị</w:t>
+            </w:r>
+            <w:r>
+              <w:t>p</w:t>
             </w:r>
           </w:p>
         </w:tc>
         <w:tc>
           <w:tcPr>
-            <w:tcW w:w="1667" w:type="dxa"/>
+            <w:tcW w:w="3742" w:type="dxa"/>
           </w:tcPr>
           <w:p>
             <w:pPr>
               <w:spacing w:before="60" w:after="100"/>
-              <w:jc w:val="right"/>
             </w:pPr>
             <w:r>
-              <w:t>20,03 giờ</w:t>
+              <w:t>48 phút / 16,8 gi</w:t>
+            </w:r>
+            <w:r>
+              <w:t>ờ</w:t>
             </w:r>
           </w:p>
         </w:tc>
@@ -7830,7 +9105,7 @@
         </w:trPr>
         <w:tc>
           <w:tcPr>
-            <w:tcW w:w="1250" w:type="dxa"/>
+            <w:tcW w:w="737" w:type="dxa"/>
           </w:tcPr>
           <w:p>
             <w:pPr>
@@ -7843,131 +9118,65 @@
         </w:tc>
         <w:tc>
           <w:tcPr>
-            <w:tcW w:w="1667" w:type="dxa"/>
-          </w:tcPr>
-          <w:p>
-            <w:pPr>
-              <w:spacing w:before="60" w:after="100"/>
-              <w:jc w:val="right"/>
-            </w:pPr>
-            <w:r>
-              <w:t>16</w:t>
-            </w:r>
-          </w:p>
-        </w:tc>
-        <w:tc>
-          <w:tcPr>
-            <w:tcW w:w="1667" w:type="dxa"/>
-          </w:tcPr>
-          <w:p>
-            <w:pPr>
-              <w:spacing w:before="60" w:after="100"/>
-              <w:jc w:val="right"/>
-            </w:pPr>
-            <w:r>
-              <w:t>1,51 phút</w:t>
-            </w:r>
-          </w:p>
-        </w:tc>
-        <w:tc>
-          <w:tcPr>
-            <w:tcW w:w="1667" w:type="dxa"/>
-          </w:tcPr>
-          <w:p>
-            <w:pPr>
-              <w:spacing w:before="60" w:after="100"/>
-              <w:jc w:val="right"/>
-            </w:pPr>
-            <w:r>
-              <w:t>36,26 phút</w:t>
-            </w:r>
-          </w:p>
-        </w:tc>
-        <w:tc>
-          <w:tcPr>
-            <w:tcW w:w="1667" w:type="dxa"/>
-          </w:tcPr>
-          <w:p>
-            <w:pPr>
-              <w:spacing w:before="60" w:after="100"/>
-              <w:jc w:val="right"/>
-            </w:pPr>
-            <w:r>
-              <w:t>12,60 giờ</w:t>
-            </w:r>
-          </w:p>
-        </w:tc>
-      </w:tr>
-      <w:tr>
-        <w:trPr>
-          <w:cantSplit/>
-        </w:trPr>
-        <w:tc>
-          <w:tcPr>
-            <w:tcW w:w="1250" w:type="dxa"/>
+            <w:tcW w:w="1020" w:type="dxa"/>
           </w:tcPr>
           <w:p>
             <w:pPr>
               <w:spacing w:before="60" w:after="100"/>
             </w:pPr>
             <w:r>
-              <w:t>1.000</w:t>
+              <w:t>32</w:t>
             </w:r>
           </w:p>
         </w:tc>
         <w:tc>
           <w:tcPr>
-            <w:tcW w:w="1667" w:type="dxa"/>
+            <w:tcW w:w="2324" w:type="dxa"/>
           </w:tcPr>
           <w:p>
             <w:pPr>
               <w:spacing w:before="60" w:after="100"/>
-              <w:jc w:val="right"/>
             </w:pPr>
             <w:r>
-              <w:t>32</w:t>
+              <w:t>0,8 phút / 16 phút</w:t>
             </w:r>
           </w:p>
         </w:tc>
         <w:tc>
           <w:tcPr>
-            <w:tcW w:w="1667" w:type="dxa"/>
+            <w:tcW w:w="1814" w:type="dxa"/>
           </w:tcPr>
           <w:p>
             <w:pPr>
               <w:spacing w:before="60" w:after="100"/>
-              <w:jc w:val="right"/>
             </w:pPr>
             <w:r>
-              <w:t>0,77 phút</w:t>
+              <w:t>K</w:t>
+            </w:r>
+            <w:r>
+              <w:t>ị</w:t>
+            </w:r>
+            <w:r>
+              <w:t>p</w:t>
             </w:r>
           </w:p>
         </w:tc>
         <w:tc>
           <w:tcPr>
-            <w:tcW w:w="1667" w:type="dxa"/>
+            <w:tcW w:w="3742" w:type="dxa"/>
           </w:tcPr>
           <w:p>
             <w:pPr>
               <w:spacing w:before="60" w:after="100"/>
-              <w:jc w:val="right"/>
             </w:pPr>
             <w:r>
-              <w:t>18,37 phút</w:t>
-            </w:r>
-          </w:p>
-        </w:tc>
-        <w:tc>
-          <w:tcPr>
-            <w:tcW w:w="1667" w:type="dxa"/>
-          </w:tcPr>
-          <w:p>
-            <w:pPr>
-              <w:spacing w:before="60" w:after="100"/>
-              <w:jc w:val="right"/>
-            </w:pPr>
-            <w:r>
-              <w:t>6,38 giờ</w:t>
+              <w:t xml:space="preserve">18 </w:t>
+            </w:r>
+            <w:r>
+              <w:t>phút / 6,4 gi</w:t>
+            </w:r>
+            <w:r>
+              <w:t>ờ</w:t>
             </w:r>
           </w:p>
         </w:tc>
@@ -7978,7 +9187,7 @@
         <w:pStyle w:val="BodyText"/>
       </w:pPr>
       <w:r>
-        <w:t>Với hơn 64 đội, số ván chính thức bằng 20 lần số đội cộng 4.032 ván vòng tròn. Tương ứng 200 đội là 8.032 ván và 1.000 đội là 24.032 ván; chưa cộng ladder. Ngoại suy đã tính việc vòng chung phải đợi đủ đợt, còn vòng tròn chạy liên tục. Dự phòng không phải cam kết giờ hoàn tất; cần thay bằng thời gian quan sát của bot đã khóa khi vào mùa thật.</w:t>
+        <w:t>Cụm bốn luồng hiện có đủ cho giải khoảng 200 đội; xếp hạng chính thức ở mức chậm nhất mất gần 17 giờ. Với 1.000 đội, cần từ 12 luồng để mỗi đợt ladder xong trong khoảng 40 phút kể cả khi chậm nhất, và khoảng 32 luồng để xếp hạng chính thức xong trong một đêm sau hạn nộp, khoảng 6,4 giờ. Bảng chưa tính kiểm 72 mẫu mỗi lần push, mất 13–25 giây và dùng chung luồng, hoặc việc phải chạy lại khi lỗi.</w:t>
       </w:r>
     </w:p>
     <w:p>
@@ -7986,7 +9195,7 @@
         <w:pStyle w:val="BodyText"/>
       </w:pPr>
       <w:r>
-        <w:t>Hai máy Windows của nhóm đã chạy giải demo tám đội đủ 56 ván vòng tròn. Giải đi qua GitHub thật có bốn đội, một đợt ladder bốn ván và 12 ván chính thức, tự chọn hai đội; bản push muộn không lọt vào bot đã khóa. Tính lại kết quả khớp hub. Những giải nhỏ này kiểm luồng đầu–cuối, không thay phép đo quy mô lớn hoặc thử bot của sinh viên ngoài nhóm.</w:t>
+        <w:t>Hai máy Windows của nhóm đã chạy giải demo tám đội đủ 56 ván vòng tròn. Giải đi qua GitHub thật có bốn đội, chạy trên hai máy Windows, mỗi máy hai luồng: đợt ladder bốn ván mất 14 giây, có biên dịch lần đầu; 12 ván vòng tròn chính thức mất chín giây và tự chọn hai đội; bản push muộn không lọt vào bot đã khóa. Tính lại kết quả khớp hub. Những giải nhỏ này kiểm luồng đầu–cuối, không thay phép đo quy mô lớn hoặc thử bot của sinh viên ngoài nhóm.</w:t>
       </w:r>
     </w:p>
     <w:p>
@@ -7994,7 +9203,7 @@
         <w:pStyle w:val="Heading2"/>
       </w:pPr>
       <w:bookmarkStart w:id="42" w:name="b10-cài-đặt-và-vận-hành"/>
-      <w:bookmarkStart w:id="43" w:name="_Toc243903626"/>
+      <w:bookmarkStart w:id="43" w:name="_Toc243906826"/>
       <w:bookmarkEnd w:id="40"/>
       <w:r>
         <w:t>B10 Cài đặt và vận hành</w:t>
@@ -8025,7 +9234,7 @@
         <w:t>Cài hub.</w:t>
       </w:r>
       <w:r>
-        <w:t xml:space="preserve"> Lấy bản nguồn đã kiểm, xác minh gói và chạy script cài hub với origin HTTPS. Script tạo môi trường Python, nginx và các unit cần thiết, giữ cấu hình và dữ liệu khi cập nhật. Nếu dùng Linux để chấm, dựng rootfs bằng mmdebstrap rồi phát gói có hash qua web.</w:t>
+        <w:t xml:space="preserve"> Lấy bản nguồn đã kiểm, xác minh gói và chạy script cài hub với origin HTTPS. Script tạo môi trường Python, nginx và các unit cần thiết, giữ cấu hình và dữ liệu khi cập nhật. Nếu dùng Linux để chấm, dựng rootfs bằng mmdebstrap rồi để hub cấp qua link tải có hạn như gói máy chấm.</w:t>
       </w:r>
     </w:p>
     <w:p>
@@ -8109,7 +9318,7 @@
         <w:pageBreakBefore/>
       </w:pPr>
       <w:bookmarkStart w:id="44" w:name="b11-giới-hạn-và-hướng-tiếp"/>
-      <w:bookmarkStart w:id="45" w:name="_Toc243903627"/>
+      <w:bookmarkStart w:id="45" w:name="_Toc243906827"/>
       <w:bookmarkEnd w:id="42"/>
       <w:r>
         <w:lastRenderedPageBreak/>
@@ -8199,7 +9408,7 @@
         <w:pageBreakBefore/>
       </w:pPr>
       <w:bookmarkStart w:id="46" w:name="phần-c-hướng-dẫn-demo-từng-bước"/>
-      <w:bookmarkStart w:id="47" w:name="_Toc243903628"/>
+      <w:bookmarkStart w:id="47" w:name="_Toc243906828"/>
       <w:bookmarkEnd w:id="44"/>
       <w:bookmarkEnd w:id="22"/>
       <w:r>
@@ -8218,7 +9427,7 @@
         <w:pStyle w:val="Heading2"/>
       </w:pPr>
       <w:bookmarkStart w:id="48" w:name="c1-khách-xem-giải"/>
-      <w:bookmarkStart w:id="49" w:name="_Toc243903629"/>
+      <w:bookmarkStart w:id="49" w:name="_Toc243906829"/>
       <w:r>
         <w:t>C1 Khách xem giải</w:t>
       </w:r>
@@ -8229,7 +9438,7 @@
         <w:pStyle w:val="Heading3"/>
       </w:pPr>
       <w:bookmarkStart w:id="50" w:name="bước-1-mở-giải-công-khai"/>
-      <w:bookmarkStart w:id="51" w:name="_Toc243903630"/>
+      <w:bookmarkStart w:id="51" w:name="_Toc243906830"/>
       <w:r>
         <w:t>Bước 1 Mở giải công khai</w:t>
       </w:r>
@@ -8260,7 +9469,7 @@
           <w:noProof/>
         </w:rPr>
         <w:drawing>
-          <wp:inline distT="0" distB="0" distL="0" distR="0" wp14:anchorId="65E8C0B2" wp14:editId="2D35544B">
+          <wp:inline distT="0" distB="0" distL="0" distR="0" wp14:anchorId="44A459D0" wp14:editId="70165049">
             <wp:extent cx="3400077" cy="2592000"/>
             <wp:effectExtent l="0" t="0" r="0" b="0"/>
             <wp:docPr id="65" name="Picture" descr="Hình 7 Mở giải công khai"/>
@@ -8317,7 +9526,7 @@
         <w:pStyle w:val="Heading3"/>
       </w:pPr>
       <w:bookmarkStart w:id="52" w:name="bước-2-xem-bảng-điểm-và-ma-trận"/>
-      <w:bookmarkStart w:id="53" w:name="_Toc243903631"/>
+      <w:bookmarkStart w:id="53" w:name="_Toc243906831"/>
       <w:bookmarkEnd w:id="50"/>
       <w:r>
         <w:t>Bước 2 Xem bảng điểm và ma trận</w:t>
@@ -8369,7 +9578,7 @@
           <w:noProof/>
         </w:rPr>
         <w:drawing>
-          <wp:inline distT="0" distB="0" distL="0" distR="0" wp14:anchorId="71EF7CBD" wp14:editId="0B91410B">
+          <wp:inline distT="0" distB="0" distL="0" distR="0" wp14:anchorId="2312E48D" wp14:editId="26D6BB95">
             <wp:extent cx="2664303" cy="2592000"/>
             <wp:effectExtent l="0" t="0" r="0" b="0"/>
             <wp:docPr id="69" name="Picture" descr="Hình 8 Xem bảng điểm và ma trận"/>
@@ -8427,7 +9636,7 @@
         <w:pageBreakBefore/>
       </w:pPr>
       <w:bookmarkStart w:id="54" w:name="bước-3-xem-lại-từng-nước"/>
-      <w:bookmarkStart w:id="55" w:name="_Toc243903632"/>
+      <w:bookmarkStart w:id="55" w:name="_Toc243906832"/>
       <w:bookmarkEnd w:id="52"/>
       <w:r>
         <w:lastRenderedPageBreak/>
@@ -8470,7 +9679,7 @@
           <w:noProof/>
         </w:rPr>
         <w:drawing>
-          <wp:inline distT="0" distB="0" distL="0" distR="0" wp14:anchorId="5E790981" wp14:editId="646E70C7">
+          <wp:inline distT="0" distB="0" distL="0" distR="0" wp14:anchorId="16E70C1D" wp14:editId="38C864DD">
             <wp:extent cx="4297381" cy="5400000"/>
             <wp:effectExtent l="0" t="0" r="0" b="0"/>
             <wp:docPr id="73" name="Picture" descr="Hình 9 Xem lại từng nước"/>
@@ -8528,7 +9737,7 @@
         <w:pageBreakBefore/>
       </w:pPr>
       <w:bookmarkStart w:id="56" w:name="c2-thí-sinh-đăng-ký-và-nộp-bot"/>
-      <w:bookmarkStart w:id="57" w:name="_Toc243903633"/>
+      <w:bookmarkStart w:id="57" w:name="_Toc243906833"/>
       <w:bookmarkEnd w:id="54"/>
       <w:bookmarkEnd w:id="48"/>
       <w:r>
@@ -8541,14 +9750,16 @@
       <w:pPr>
         <w:pStyle w:val="Heading3"/>
       </w:pPr>
-      <w:bookmarkStart w:id="58" w:name="bước-4-đăng-ký-bằng-email-trường"/>
-      <w:bookmarkStart w:id="59" w:name="_Toc243903634"/>
+      <w:bookmarkStart w:id="58" w:name="_Toc243906834"/>
       <w:r>
         <w:t>Bước 4 Đăng ký bằng email trường</w:t>
       </w:r>
-      <w:bookmarkEnd w:id="59"/>
-    </w:p>
-    <w:p>
+      <w:bookmarkEnd w:id="58"/>
+    </w:p>
+    <w:p>
+      <w:pPr>
+        <w:keepNext/>
+      </w:pPr>
       <w:r>
         <w:t xml:space="preserve">Mở </w:t>
       </w:r>
@@ -8583,8 +9794,8 @@
           <w:noProof/>
         </w:rPr>
         <w:drawing>
-          <wp:inline distT="0" distB="0" distL="0" distR="0" wp14:anchorId="7BE9771A" wp14:editId="468B2777">
-            <wp:extent cx="3800539" cy="2592000"/>
+          <wp:inline distT="0" distB="0" distL="0" distR="0" wp14:anchorId="7AD25231" wp14:editId="71A80ED2">
+            <wp:extent cx="3960000" cy="3160235"/>
             <wp:effectExtent l="0" t="0" r="0" b="0"/>
             <wp:docPr id="78" name="Picture" descr="Hình 10 Đăng ký bằng email trường"/>
             <wp:cNvGraphicFramePr/>
@@ -8606,7 +9817,7 @@
                   <pic:spPr bwMode="auto">
                     <a:xfrm>
                       <a:off x="0" y="0"/>
-                      <a:ext cx="3800539" cy="2592000"/>
+                      <a:ext cx="3960000" cy="3160235"/>
                     </a:xfrm>
                     <a:prstGeom prst="rect">
                       <a:avLst/>
@@ -8638,16 +9849,170 @@
     <w:p>
       <w:pPr>
         <w:pStyle w:val="Heading3"/>
-      </w:pPr>
-      <w:bookmarkStart w:id="60" w:name="bước-5-xác-minh-email"/>
-      <w:bookmarkStart w:id="61" w:name="_Toc243903635"/>
-      <w:bookmarkEnd w:id="58"/>
-      <w:r>
-        <w:t>Bước 5 Xác minh email</w:t>
-      </w:r>
-      <w:bookmarkEnd w:id="61"/>
-    </w:p>
-    <w:p>
+        <w:pageBreakBefore/>
+      </w:pPr>
+      <w:bookmarkStart w:id="59" w:name="_Toc243906835"/>
+      <w:r>
+        <w:lastRenderedPageBreak/>
+        <w:t>Bư</w:t>
+      </w:r>
+      <w:r>
+        <w:t>ớ</w:t>
+      </w:r>
+      <w:r>
+        <w:t>c 5 M</w:t>
+      </w:r>
+      <w:r>
+        <w:t>ở</w:t>
+      </w:r>
+      <w:r>
+        <w:t xml:space="preserve"> email l</w:t>
+      </w:r>
+      <w:r>
+        <w:t>ấ</w:t>
+      </w:r>
+      <w:r>
+        <w:t>y mã</w:t>
+      </w:r>
+      <w:bookmarkEnd w:id="59"/>
+    </w:p>
+    <w:p>
+      <w:pPr>
+        <w:pStyle w:val="BodyText"/>
+        <w:keepNext/>
+      </w:pPr>
+      <w:r>
+        <w:t>M</w:t>
+      </w:r>
+      <w:r>
+        <w:t>ở</w:t>
+      </w:r>
+      <w:r>
+        <w:t xml:space="preserve"> h</w:t>
+      </w:r>
+      <w:r>
+        <w:t>ộ</w:t>
+      </w:r>
+      <w:r>
+        <w:t>p thư email trư</w:t>
+      </w:r>
+      <w:r>
+        <w:t>ờ</w:t>
+      </w:r>
+      <w:r>
+        <w:t>ng, tìm thư t</w:t>
+      </w:r>
+      <w:r>
+        <w:t>ừ</w:t>
+      </w:r>
+      <w:r>
+        <w:t xml:space="preserve"> no-reply@uetbotarena.id.vn có tiêu đ</w:t>
+      </w:r>
+      <w:r>
+        <w:t>ề</w:t>
+      </w:r>
+      <w:r>
+        <w:t xml:space="preserve"> “Mã xác minh UET Bot Arena: &lt;mã 6 s</w:t>
+      </w:r>
+      <w:r>
+        <w:t>ố</w:t>
+      </w:r>
+      <w:r>
+        <w:t>&gt;”. Mã h</w:t>
+      </w:r>
+      <w:r>
+        <w:t>ế</w:t>
+      </w:r>
+      <w:r>
+        <w:t>t h</w:t>
+      </w:r>
+      <w:r>
+        <w:t>ạ</w:t>
+      </w:r>
+      <w:r>
+        <w:t xml:space="preserve">n </w:t>
+      </w:r>
+      <w:r>
+        <w:t>sau 10 phút; không th</w:t>
+      </w:r>
+      <w:r>
+        <w:t>ấ</w:t>
+      </w:r>
+      <w:r>
+        <w:t>y thư thì xem Spam ho</w:t>
+      </w:r>
+      <w:r>
+        <w:t>ặ</w:t>
+      </w:r>
+      <w:r>
+        <w:t>c Junk.</w:t>
+      </w:r>
+    </w:p>
+    <w:tbl>
+      <w:tblPr>
+        <w:tblW w:w="0" w:type="auto"/>
+        <w:jc w:val="center"/>
+        <w:tblBorders>
+          <w:top w:val="single" w:sz="4" w:space="0" w:color="808080"/>
+          <w:left w:val="single" w:sz="4" w:space="0" w:color="808080"/>
+          <w:bottom w:val="single" w:sz="4" w:space="0" w:color="808080"/>
+          <w:right w:val="single" w:sz="4" w:space="0" w:color="808080"/>
+        </w:tblBorders>
+        <w:tblLayout w:type="fixed"/>
+        <w:tblLook w:val="04A0" w:firstRow="1" w:lastRow="0" w:firstColumn="1" w:lastColumn="0" w:noHBand="0" w:noVBand="1"/>
+      </w:tblPr>
+      <w:tblGrid>
+        <w:gridCol w:w="6236"/>
+      </w:tblGrid>
+      <w:tr>
+        <w:trPr>
+          <w:trHeight w:hRule="exact" w:val="4535"/>
+          <w:jc w:val="center"/>
+        </w:trPr>
+        <w:tc>
+          <w:tcPr>
+            <w:tcW w:w="6236" w:type="dxa"/>
+          </w:tcPr>
+          <w:p>
+            <w:pPr>
+              <w:spacing w:after="0"/>
+            </w:pPr>
+          </w:p>
+        </w:tc>
+      </w:tr>
+    </w:tbl>
+    <w:p>
+      <w:pPr>
+        <w:pStyle w:val="Caption"/>
+        <w:spacing w:after="140"/>
+        <w:jc w:val="center"/>
+      </w:pPr>
+      <w:r>
+        <w:t>Hình 11 Email ch</w:t>
+      </w:r>
+      <w:r>
+        <w:t>ứ</w:t>
+      </w:r>
+      <w:r>
+        <w:t>a mã xác minh</w:t>
+      </w:r>
+    </w:p>
+    <w:p>
+      <w:pPr>
+        <w:pStyle w:val="Heading3"/>
+        <w:pageBreakBefore/>
+      </w:pPr>
+      <w:bookmarkStart w:id="60" w:name="_Toc243906836"/>
+      <w:r>
+        <w:lastRenderedPageBreak/>
+        <w:t>Bước 6 Xác minh email</w:t>
+      </w:r>
+      <w:bookmarkEnd w:id="60"/>
+    </w:p>
+    <w:p>
+      <w:pPr>
+        <w:keepNext/>
+      </w:pPr>
       <w:r>
         <w:t xml:space="preserve">Nhập mã sáu số nhận qua email rồi bấm </w:t>
       </w:r>
@@ -8672,8 +10037,8 @@
           <w:noProof/>
         </w:rPr>
         <w:drawing>
-          <wp:inline distT="0" distB="0" distL="0" distR="0" wp14:anchorId="6375E65B" wp14:editId="3D132101">
-            <wp:extent cx="2518243" cy="2592000"/>
+          <wp:inline distT="0" distB="0" distL="0" distR="0" wp14:anchorId="574D7337" wp14:editId="5149F898">
+            <wp:extent cx="3960000" cy="4356000"/>
             <wp:effectExtent l="0" t="0" r="0" b="0"/>
             <wp:docPr id="82" name="Picture" descr="Hình 11 Xác minh email"/>
             <wp:cNvGraphicFramePr/>
@@ -8695,7 +10060,7 @@
                   <pic:spPr bwMode="auto">
                     <a:xfrm>
                       <a:off x="0" y="0"/>
-                      <a:ext cx="2518243" cy="2592000"/>
+                      <a:ext cx="3960000" cy="4356000"/>
                     </a:xfrm>
                     <a:prstGeom prst="rect">
                       <a:avLst/>
@@ -8721,7 +10086,7 @@
         <w:jc w:val="center"/>
       </w:pPr>
       <w:r>
-        <w:t>Hình 11 Xác minh email</w:t>
+        <w:t>Hình 12 Xác minh email</w:t>
       </w:r>
     </w:p>
     <w:p>
@@ -8729,16 +10094,17 @@
         <w:pStyle w:val="Heading3"/>
         <w:pageBreakBefore/>
       </w:pPr>
-      <w:bookmarkStart w:id="62" w:name="bước-6-đặt-mật-khẩu-và-đăng-nhập"/>
-      <w:bookmarkStart w:id="63" w:name="_Toc243903636"/>
-      <w:bookmarkEnd w:id="60"/>
+      <w:bookmarkStart w:id="61" w:name="_Toc243906837"/>
       <w:r>
         <w:lastRenderedPageBreak/>
-        <w:t>Bước 6 Đặt mật khẩu và đăng nhập</w:t>
-      </w:r>
-      <w:bookmarkEnd w:id="63"/>
-    </w:p>
-    <w:p>
+        <w:t>Bước 7 Đặt mật khẩu và đăng nhập</w:t>
+      </w:r>
+      <w:bookmarkEnd w:id="61"/>
+    </w:p>
+    <w:p>
+      <w:pPr>
+        <w:keepNext/>
+      </w:pPr>
       <w:r>
         <w:t xml:space="preserve">Điền họ tên, mật khẩu và phần nhập lại, sau đó bấm </w:t>
       </w:r>
@@ -8763,8 +10129,8 @@
           <w:noProof/>
         </w:rPr>
         <w:drawing>
-          <wp:inline distT="0" distB="0" distL="0" distR="0" wp14:anchorId="21E5E514" wp14:editId="0B91EF35">
-            <wp:extent cx="2099959" cy="2592000"/>
+          <wp:inline distT="0" distB="0" distL="0" distR="0" wp14:anchorId="1DD2C37A" wp14:editId="39A1D425">
+            <wp:extent cx="3960000" cy="5023764"/>
             <wp:effectExtent l="0" t="0" r="0" b="0"/>
             <wp:docPr id="86" name="Picture" descr="Hình 12 Đặt mật khẩu và đăng nhập"/>
             <wp:cNvGraphicFramePr/>
@@ -8786,7 +10152,7 @@
                   <pic:spPr bwMode="auto">
                     <a:xfrm>
                       <a:off x="0" y="0"/>
-                      <a:ext cx="2099959" cy="2592000"/>
+                      <a:ext cx="3960000" cy="5023764"/>
                     </a:xfrm>
                     <a:prstGeom prst="rect">
                       <a:avLst/>
@@ -8812,20 +10178,18 @@
         <w:jc w:val="center"/>
       </w:pPr>
       <w:r>
-        <w:t>Hình 12 Đặt mật khẩu và đăng nhập</w:t>
+        <w:t>Hình 13 Đặt mật khẩu và đăng nhập</w:t>
       </w:r>
     </w:p>
     <w:p>
       <w:pPr>
         <w:pStyle w:val="Heading3"/>
       </w:pPr>
-      <w:bookmarkStart w:id="64" w:name="bước-7-tạo-đội"/>
-      <w:bookmarkStart w:id="65" w:name="_Toc243903637"/>
+      <w:bookmarkStart w:id="62" w:name="_Toc243906838"/>
+      <w:r>
+        <w:t>Bước 8 Tạo đội</w:t>
+      </w:r>
       <w:bookmarkEnd w:id="62"/>
-      <w:r>
-        <w:t>Bước 7 Tạo đội</w:t>
-      </w:r>
-      <w:bookmarkEnd w:id="65"/>
     </w:p>
     <w:p>
       <w:r>
@@ -8862,7 +10226,7 @@
           <w:noProof/>
         </w:rPr>
         <w:drawing>
-          <wp:inline distT="0" distB="0" distL="0" distR="0" wp14:anchorId="78928DE8" wp14:editId="295AEC54">
+          <wp:inline distT="0" distB="0" distL="0" distR="0" wp14:anchorId="10546B75" wp14:editId="11AB1D15">
             <wp:extent cx="5012628" cy="2592000"/>
             <wp:effectExtent l="0" t="0" r="0" b="0"/>
             <wp:docPr id="90" name="Picture" descr="Hình 13 Tạo đội"/>
@@ -8911,7 +10275,7 @@
         <w:jc w:val="center"/>
       </w:pPr>
       <w:r>
-        <w:t>Hình 13 Tạo đội</w:t>
+        <w:t>Hình 14 Tạo đội</w:t>
       </w:r>
     </w:p>
     <w:p>
@@ -8919,14 +10283,12 @@
         <w:pStyle w:val="Heading3"/>
         <w:pageBreakBefore/>
       </w:pPr>
-      <w:bookmarkStart w:id="66" w:name="bước-8-mời-các-thành-viên"/>
-      <w:bookmarkStart w:id="67" w:name="_Toc243903638"/>
-      <w:bookmarkEnd w:id="64"/>
+      <w:bookmarkStart w:id="63" w:name="_Toc243906839"/>
       <w:r>
         <w:lastRenderedPageBreak/>
-        <w:t>Bước 8 Mời các thành viên</w:t>
-      </w:r>
-      <w:bookmarkEnd w:id="67"/>
+        <w:t>Bước 9 Mời các thành viên</w:t>
+      </w:r>
+      <w:bookmarkEnd w:id="63"/>
     </w:p>
     <w:p>
       <w:r>
@@ -8953,7 +10315,7 @@
           <w:noProof/>
         </w:rPr>
         <w:drawing>
-          <wp:inline distT="0" distB="0" distL="0" distR="0" wp14:anchorId="20290D7D" wp14:editId="61F72603">
+          <wp:inline distT="0" distB="0" distL="0" distR="0" wp14:anchorId="6C875D3B" wp14:editId="20109FE4">
             <wp:extent cx="4187916" cy="2592000"/>
             <wp:effectExtent l="0" t="0" r="0" b="0"/>
             <wp:docPr id="94" name="Picture" descr="Hình 14 Mời các thành viên"/>
@@ -9002,20 +10364,18 @@
         <w:jc w:val="center"/>
       </w:pPr>
       <w:r>
-        <w:t>Hình 14 Mời các thành viên</w:t>
+        <w:t>Hình 15 Mời các thành viên</w:t>
       </w:r>
     </w:p>
     <w:p>
       <w:pPr>
         <w:pStyle w:val="Heading3"/>
       </w:pPr>
-      <w:bookmarkStart w:id="68" w:name="bước-9-vào-đội-bằng-mã-mời"/>
-      <w:bookmarkStart w:id="69" w:name="_Toc243903639"/>
-      <w:bookmarkEnd w:id="66"/>
-      <w:r>
-        <w:t>Bước 9 Vào đội bằng mã mời</w:t>
-      </w:r>
-      <w:bookmarkEnd w:id="69"/>
+      <w:bookmarkStart w:id="64" w:name="_Toc243906840"/>
+      <w:r>
+        <w:t>Bước 10 Vào đội bằng mã mời</w:t>
+      </w:r>
+      <w:bookmarkEnd w:id="64"/>
     </w:p>
     <w:p>
       <w:r>
@@ -9042,7 +10402,7 @@
           <w:noProof/>
         </w:rPr>
         <w:drawing>
-          <wp:inline distT="0" distB="0" distL="0" distR="0" wp14:anchorId="617A245E" wp14:editId="25D21DD7">
+          <wp:inline distT="0" distB="0" distL="0" distR="0" wp14:anchorId="38D2A041" wp14:editId="035AC0D3">
             <wp:extent cx="5012628" cy="2592000"/>
             <wp:effectExtent l="0" t="0" r="0" b="0"/>
             <wp:docPr id="98" name="Picture" descr="Hình 15 Vào đội bằng mã mời"/>
@@ -9091,7 +10451,7 @@
         <w:jc w:val="center"/>
       </w:pPr>
       <w:r>
-        <w:t>Hình 15 Vào đội bằng mã mời</w:t>
+        <w:t>Hình 16 Vào đội bằng mã mời</w:t>
       </w:r>
     </w:p>
     <w:p>
@@ -9099,14 +10459,12 @@
         <w:pStyle w:val="Heading3"/>
         <w:pageBreakBefore/>
       </w:pPr>
-      <w:bookmarkStart w:id="70" w:name="bước-10-tạo-repo-từ-mẫu"/>
-      <w:bookmarkStart w:id="71" w:name="_Toc243903640"/>
-      <w:bookmarkEnd w:id="68"/>
+      <w:bookmarkStart w:id="65" w:name="_Toc243906841"/>
       <w:r>
         <w:lastRenderedPageBreak/>
-        <w:t>Bước 10 Tạo repo từ mẫu</w:t>
-      </w:r>
-      <w:bookmarkEnd w:id="71"/>
+        <w:t>Bước 11 Tạo repo từ mẫu</w:t>
+      </w:r>
+      <w:bookmarkEnd w:id="65"/>
     </w:p>
     <w:p>
       <w:r>
@@ -9133,7 +10491,7 @@
           <w:noProof/>
         </w:rPr>
         <w:drawing>
-          <wp:inline distT="0" distB="0" distL="0" distR="0" wp14:anchorId="08CF85F8" wp14:editId="1C532BCD">
+          <wp:inline distT="0" distB="0" distL="0" distR="0" wp14:anchorId="4BA3FEA5" wp14:editId="6D6CEF48">
             <wp:extent cx="5682461" cy="2592000"/>
             <wp:effectExtent l="0" t="0" r="0" b="0"/>
             <wp:docPr id="102" name="Picture" descr="Hình 16 Tạo repo từ mẫu"/>
@@ -9182,20 +10540,18 @@
         <w:jc w:val="center"/>
       </w:pPr>
       <w:r>
-        <w:t>Hình 16 Tạo repo từ mẫu</w:t>
+        <w:t>Hình 17 Tạo repo từ mẫu</w:t>
       </w:r>
     </w:p>
     <w:p>
       <w:pPr>
         <w:pStyle w:val="Heading3"/>
       </w:pPr>
-      <w:bookmarkStart w:id="72" w:name="bước-11-cho-app-truy-cập-đúng-repo"/>
-      <w:bookmarkStart w:id="73" w:name="_Toc243903641"/>
-      <w:bookmarkEnd w:id="70"/>
-      <w:r>
-        <w:t>Bước 11 Cho App truy cập đúng repo</w:t>
-      </w:r>
-      <w:bookmarkEnd w:id="73"/>
+      <w:bookmarkStart w:id="66" w:name="_Toc243906842"/>
+      <w:r>
+        <w:t>Bước 12 Cho App truy cập đúng repo</w:t>
+      </w:r>
+      <w:bookmarkEnd w:id="66"/>
     </w:p>
     <w:p>
       <w:r>
@@ -9232,7 +10588,7 @@
           <w:noProof/>
         </w:rPr>
         <w:drawing>
-          <wp:inline distT="0" distB="0" distL="0" distR="0" wp14:anchorId="3DC40D7F" wp14:editId="2546998E">
+          <wp:inline distT="0" distB="0" distL="0" distR="0" wp14:anchorId="07249A37" wp14:editId="223CE99A">
             <wp:extent cx="5759999" cy="1755999"/>
             <wp:effectExtent l="0" t="0" r="0" b="0"/>
             <wp:docPr id="106" name="Picture" descr="Hình 17 Cho App truy cập đúng repo"/>
@@ -9281,7 +10637,7 @@
         <w:jc w:val="center"/>
       </w:pPr>
       <w:r>
-        <w:t>Hình 17 Cho App truy cập đúng repo</w:t>
+        <w:t>Hình 18 Cho App truy cập đúng repo</w:t>
       </w:r>
     </w:p>
     <w:p>
@@ -9289,14 +10645,12 @@
         <w:pStyle w:val="Heading3"/>
         <w:pageBreakBefore/>
       </w:pPr>
-      <w:bookmarkStart w:id="74" w:name="bước-12-gắn-link-repo-với-đội"/>
-      <w:bookmarkStart w:id="75" w:name="_Toc243903642"/>
-      <w:bookmarkEnd w:id="72"/>
+      <w:bookmarkStart w:id="67" w:name="_Toc243906843"/>
       <w:r>
         <w:lastRenderedPageBreak/>
-        <w:t>Bước 12 Gắn link repo với đội</w:t>
-      </w:r>
-      <w:bookmarkEnd w:id="75"/>
+        <w:t>Bước 13 Gắn link repo với đội</w:t>
+      </w:r>
+      <w:bookmarkEnd w:id="67"/>
     </w:p>
     <w:p>
       <w:r>
@@ -9333,7 +10687,7 @@
           <w:noProof/>
         </w:rPr>
         <w:drawing>
-          <wp:inline distT="0" distB="0" distL="0" distR="0" wp14:anchorId="207D9CF4" wp14:editId="0DFAF13E">
+          <wp:inline distT="0" distB="0" distL="0" distR="0" wp14:anchorId="15DA8693" wp14:editId="7B696FC5">
             <wp:extent cx="5284928" cy="2592000"/>
             <wp:effectExtent l="0" t="0" r="0" b="0"/>
             <wp:docPr id="110" name="Picture" descr="Hình 18 Gắn link repo với đội"/>
@@ -9382,20 +10736,18 @@
         <w:jc w:val="center"/>
       </w:pPr>
       <w:r>
-        <w:t>Hình 18 Gắn link repo với đội</w:t>
+        <w:t>Hình 19 Gắn link repo với đội</w:t>
       </w:r>
     </w:p>
     <w:p>
       <w:pPr>
         <w:pStyle w:val="Heading3"/>
       </w:pPr>
-      <w:bookmarkStart w:id="76" w:name="bước-13-theo-dõi-kiểm-tra-72-mẫu"/>
-      <w:bookmarkStart w:id="77" w:name="_Toc243903643"/>
-      <w:bookmarkEnd w:id="74"/>
-      <w:r>
-        <w:t>Bước 13 Theo dõi kiểm tra 72 mẫu</w:t>
-      </w:r>
-      <w:bookmarkEnd w:id="77"/>
+      <w:bookmarkStart w:id="68" w:name="_Toc243906844"/>
+      <w:r>
+        <w:t>Bước 14 Theo dõi kiểm tra 72 mẫu</w:t>
+      </w:r>
+      <w:bookmarkEnd w:id="68"/>
     </w:p>
     <w:p>
       <w:r>
@@ -9472,7 +10824,7 @@
           <w:noProof/>
         </w:rPr>
         <w:drawing>
-          <wp:inline distT="0" distB="0" distL="0" distR="0" wp14:anchorId="6F059EA1" wp14:editId="45A36ECA">
+          <wp:inline distT="0" distB="0" distL="0" distR="0" wp14:anchorId="16F1C584" wp14:editId="543310A0">
             <wp:extent cx="3093102" cy="2592000"/>
             <wp:effectExtent l="0" t="0" r="0" b="0"/>
             <wp:docPr id="114" name="Picture" descr="Hình 19 Theo dõi kiểm tra 72 mẫu"/>
@@ -9521,7 +10873,7 @@
         <w:jc w:val="center"/>
       </w:pPr>
       <w:r>
-        <w:t>Hình 19 Theo dõi kiểm tra 72 mẫu</w:t>
+        <w:t>Hình 20 Theo dõi kiểm tra 72 mẫu</w:t>
       </w:r>
     </w:p>
     <w:p>
@@ -9529,14 +10881,12 @@
         <w:pStyle w:val="Heading3"/>
         <w:pageBreakBefore/>
       </w:pPr>
-      <w:bookmarkStart w:id="78" w:name="bước-14-xem-giải-của-đội"/>
-      <w:bookmarkStart w:id="79" w:name="_Toc243903644"/>
-      <w:bookmarkEnd w:id="76"/>
+      <w:bookmarkStart w:id="69" w:name="_Toc243906845"/>
       <w:r>
         <w:lastRenderedPageBreak/>
-        <w:t>Bước 14 Xem giải của đội</w:t>
-      </w:r>
-      <w:bookmarkEnd w:id="79"/>
+        <w:t>Bước 15 Xem giải của đội</w:t>
+      </w:r>
+      <w:bookmarkEnd w:id="69"/>
     </w:p>
     <w:p>
       <w:r>
@@ -9593,7 +10943,7 @@
           <w:noProof/>
         </w:rPr>
         <w:drawing>
-          <wp:inline distT="0" distB="0" distL="0" distR="0" wp14:anchorId="29DE0F3B" wp14:editId="46FB07BA">
+          <wp:inline distT="0" distB="0" distL="0" distR="0" wp14:anchorId="4611A264" wp14:editId="2D8FAF1F">
             <wp:extent cx="5759999" cy="1024999"/>
             <wp:effectExtent l="0" t="0" r="0" b="0"/>
             <wp:docPr id="118" name="Picture" descr="Hình 20 Xem giải của đội"/>
@@ -9642,20 +10992,18 @@
         <w:jc w:val="center"/>
       </w:pPr>
       <w:r>
-        <w:t>Hình 20 Xem giải của đội</w:t>
+        <w:t>Hình 21 Xem giải của đội</w:t>
       </w:r>
     </w:p>
     <w:p>
       <w:pPr>
         <w:pStyle w:val="Heading3"/>
       </w:pPr>
-      <w:bookmarkStart w:id="80" w:name="bước-15-luyện-tập-với-bot-mẫu"/>
-      <w:bookmarkStart w:id="81" w:name="_Toc243903645"/>
-      <w:bookmarkEnd w:id="78"/>
-      <w:r>
-        <w:t>Bước 15 Luyện tập với bot mẫu</w:t>
-      </w:r>
-      <w:bookmarkEnd w:id="81"/>
+      <w:bookmarkStart w:id="70" w:name="_Toc243906846"/>
+      <w:r>
+        <w:t>Bước 16 Luyện tập với bot mẫu</w:t>
+      </w:r>
+      <w:bookmarkEnd w:id="70"/>
     </w:p>
     <w:p>
       <w:r>
@@ -9702,7 +11050,7 @@
           <w:noProof/>
         </w:rPr>
         <w:drawing>
-          <wp:inline distT="0" distB="0" distL="0" distR="0" wp14:anchorId="27643460" wp14:editId="4A3A1D7E">
+          <wp:inline distT="0" distB="0" distL="0" distR="0" wp14:anchorId="7C3DF51A" wp14:editId="6FF0D32A">
             <wp:extent cx="5759999" cy="3774999"/>
             <wp:effectExtent l="0" t="0" r="0" b="0"/>
             <wp:docPr id="122" name="Picture" descr="Hình 21 Luyện tập với bot mẫu"/>
@@ -9751,7 +11099,7 @@
         <w:jc w:val="center"/>
       </w:pPr>
       <w:r>
-        <w:t>Hình 21 Luyện tập với bot mẫu</w:t>
+        <w:t>Hình 22 Luyện tập với bot mẫu</w:t>
       </w:r>
     </w:p>
     <w:p>
@@ -9759,26 +11107,24 @@
         <w:pStyle w:val="Heading2"/>
         <w:pageBreakBefore/>
       </w:pPr>
-      <w:bookmarkStart w:id="82" w:name="c3-ban-tổ-chức-điều-hành"/>
-      <w:bookmarkStart w:id="83" w:name="_Toc243903646"/>
-      <w:bookmarkEnd w:id="80"/>
+      <w:bookmarkStart w:id="71" w:name="c3-ban-tổ-chức-điều-hành"/>
+      <w:bookmarkStart w:id="72" w:name="_Toc243906847"/>
       <w:bookmarkEnd w:id="56"/>
       <w:r>
         <w:lastRenderedPageBreak/>
         <w:t>C3 Ban tổ chức điều hành</w:t>
       </w:r>
-      <w:bookmarkEnd w:id="83"/>
+      <w:bookmarkEnd w:id="72"/>
     </w:p>
     <w:p>
       <w:pPr>
         <w:pStyle w:val="Heading3"/>
       </w:pPr>
-      <w:bookmarkStart w:id="84" w:name="bước-16-xem-tổng-quan-ban-tổ-chức"/>
-      <w:bookmarkStart w:id="85" w:name="_Toc243903647"/>
-      <w:r>
-        <w:t>Bước 16 Xem tổng quan ban tổ chức</w:t>
-      </w:r>
-      <w:bookmarkEnd w:id="85"/>
+      <w:bookmarkStart w:id="73" w:name="_Toc243906848"/>
+      <w:r>
+        <w:t>Bước 17 Xem tổng quan ban tổ chức</w:t>
+      </w:r>
+      <w:bookmarkEnd w:id="73"/>
     </w:p>
     <w:p>
       <w:r>
@@ -9795,7 +11141,7 @@
           <w:noProof/>
         </w:rPr>
         <w:drawing>
-          <wp:inline distT="0" distB="0" distL="0" distR="0" wp14:anchorId="328A43B7" wp14:editId="7D548E41">
+          <wp:inline distT="0" distB="0" distL="0" distR="0" wp14:anchorId="04E1E1AE" wp14:editId="689B8795">
             <wp:extent cx="5759999" cy="3505263"/>
             <wp:effectExtent l="0" t="0" r="0" b="0"/>
             <wp:docPr id="127" name="Picture" descr="Hình 22 Xem tổng quan ban tổ chức"/>
@@ -9844,7 +11190,7 @@
         <w:jc w:val="center"/>
       </w:pPr>
       <w:r>
-        <w:t>Hình 22 Xem tổng quan ban tổ chức</w:t>
+        <w:t>Hình 23 Xem tổng quan ban tổ chức</w:t>
       </w:r>
     </w:p>
     <w:p>
@@ -9852,14 +11198,12 @@
         <w:pStyle w:val="Heading3"/>
         <w:pageBreakBefore/>
       </w:pPr>
-      <w:bookmarkStart w:id="86" w:name="bước-17-chọn-giải-ở-tổng-quan"/>
-      <w:bookmarkStart w:id="87" w:name="_Toc243903648"/>
-      <w:bookmarkEnd w:id="84"/>
+      <w:bookmarkStart w:id="74" w:name="_Toc243906849"/>
       <w:r>
         <w:lastRenderedPageBreak/>
-        <w:t>Bước 17 Chọn giải ở Tổng quan</w:t>
-      </w:r>
-      <w:bookmarkEnd w:id="87"/>
+        <w:t>Bước 18 Chọn giải ở Tổng quan</w:t>
+      </w:r>
+      <w:bookmarkEnd w:id="74"/>
     </w:p>
     <w:p>
       <w:r>
@@ -9916,7 +11260,7 @@
           <w:noProof/>
         </w:rPr>
         <w:drawing>
-          <wp:inline distT="0" distB="0" distL="0" distR="0" wp14:anchorId="2FE25E75" wp14:editId="1A4E7850">
+          <wp:inline distT="0" distB="0" distL="0" distR="0" wp14:anchorId="31AD41E3" wp14:editId="5EC56460">
             <wp:extent cx="5759999" cy="4012104"/>
             <wp:effectExtent l="0" t="0" r="0" b="0"/>
             <wp:docPr id="131" name="Picture" descr="Hình 23 Chọn giải ở Tổng quan"/>
@@ -9965,7 +11309,7 @@
         <w:jc w:val="center"/>
       </w:pPr>
       <w:r>
-        <w:t>Hình 23 Chọn giải ở Tổng quan</w:t>
+        <w:t>Hình 24 Chọn giải ở Tổng quan</w:t>
       </w:r>
     </w:p>
     <w:p>
@@ -9973,14 +11317,12 @@
         <w:pStyle w:val="Heading3"/>
         <w:pageBreakBefore/>
       </w:pPr>
-      <w:bookmarkStart w:id="88" w:name="bước-18-chuẩn-bị-giải-mới"/>
-      <w:bookmarkStart w:id="89" w:name="_Toc243903649"/>
-      <w:bookmarkEnd w:id="86"/>
+      <w:bookmarkStart w:id="75" w:name="_Toc243906850"/>
       <w:r>
         <w:lastRenderedPageBreak/>
-        <w:t>Bước 18 Chuẩn bị giải mới</w:t>
-      </w:r>
-      <w:bookmarkEnd w:id="89"/>
+        <w:t>Bước 19 Chuẩn bị giải mới</w:t>
+      </w:r>
+      <w:bookmarkEnd w:id="75"/>
     </w:p>
     <w:p>
       <w:r>
@@ -10007,7 +11349,7 @@
           <w:noProof/>
         </w:rPr>
         <w:drawing>
-          <wp:inline distT="0" distB="0" distL="0" distR="0" wp14:anchorId="4F6A4551" wp14:editId="3AF20D5E">
+          <wp:inline distT="0" distB="0" distL="0" distR="0" wp14:anchorId="55A89895" wp14:editId="3FF26093">
             <wp:extent cx="4586765" cy="2592000"/>
             <wp:effectExtent l="0" t="0" r="0" b="0"/>
             <wp:docPr id="135" name="Picture" descr="Hình 24 Chuẩn bị giải mới"/>
@@ -10056,20 +11398,18 @@
         <w:jc w:val="center"/>
       </w:pPr>
       <w:r>
-        <w:t>Hình 24 Chuẩn bị giải mới</w:t>
+        <w:t>Hình 25 Chuẩn bị giải mới</w:t>
       </w:r>
     </w:p>
     <w:p>
       <w:pPr>
         <w:pStyle w:val="Heading3"/>
       </w:pPr>
-      <w:bookmarkStart w:id="90" w:name="bước-19-cài-máy-chấm-windows-hoặc-linux"/>
-      <w:bookmarkStart w:id="91" w:name="_Toc243903650"/>
-      <w:bookmarkEnd w:id="88"/>
-      <w:r>
-        <w:t>Bước 19 Cài máy chấm Windows hoặc Linux</w:t>
-      </w:r>
-      <w:bookmarkEnd w:id="91"/>
+      <w:bookmarkStart w:id="76" w:name="_Toc243906851"/>
+      <w:r>
+        <w:t>Bước 20 Cài máy chấm Windows hoặc Linux</w:t>
+      </w:r>
+      <w:bookmarkEnd w:id="76"/>
     </w:p>
     <w:p>
       <w:r>
@@ -10116,7 +11456,7 @@
           <w:noProof/>
         </w:rPr>
         <w:drawing>
-          <wp:inline distT="0" distB="0" distL="0" distR="0" wp14:anchorId="72F799ED" wp14:editId="1FD8FD94">
+          <wp:inline distT="0" distB="0" distL="0" distR="0" wp14:anchorId="506FB614" wp14:editId="68A8EC76">
             <wp:extent cx="5759999" cy="1196950"/>
             <wp:effectExtent l="0" t="0" r="0" b="0"/>
             <wp:docPr id="139" name="Picture" descr="Hình 25 Cài máy chấm Windows hoặc Linux"/>
@@ -10165,7 +11505,7 @@
         <w:jc w:val="center"/>
       </w:pPr>
       <w:r>
-        <w:t>Hình 25 Cài máy chấm Windows hoặc Linux</w:t>
+        <w:t>Hình 26 Cài máy chấm Windows hoặc Linux</w:t>
       </w:r>
     </w:p>
     <w:p>
@@ -10173,14 +11513,12 @@
         <w:pStyle w:val="Heading3"/>
         <w:pageBreakBefore/>
       </w:pPr>
-      <w:bookmarkStart w:id="92" w:name="bước-20-kiểm-tình-trạng-chấm-và-hàng-đợi"/>
-      <w:bookmarkStart w:id="93" w:name="_Toc243903651"/>
-      <w:bookmarkEnd w:id="90"/>
+      <w:bookmarkStart w:id="77" w:name="_Toc243906852"/>
       <w:r>
         <w:lastRenderedPageBreak/>
-        <w:t>Bước 20 Kiểm tình trạng chấm và hàng đợi</w:t>
-      </w:r>
-      <w:bookmarkEnd w:id="93"/>
+        <w:t>Bước 21 Kiểm tình trạng chấm và hàng đợi</w:t>
+      </w:r>
+      <w:bookmarkEnd w:id="77"/>
     </w:p>
     <w:p>
       <w:r>
@@ -10207,7 +11545,7 @@
           <w:noProof/>
         </w:rPr>
         <w:drawing>
-          <wp:inline distT="0" distB="0" distL="0" distR="0" wp14:anchorId="6284E091" wp14:editId="1EA817A9">
+          <wp:inline distT="0" distB="0" distL="0" distR="0" wp14:anchorId="33846AD9" wp14:editId="7A03C398">
             <wp:extent cx="4213732" cy="2592000"/>
             <wp:effectExtent l="0" t="0" r="0" b="0"/>
             <wp:docPr id="143" name="Picture" descr="Hình 26 Kiểm tình trạng chấm và hàng đợi"/>
@@ -10256,20 +11594,18 @@
         <w:jc w:val="center"/>
       </w:pPr>
       <w:r>
-        <w:t>Hình 26 Kiểm tình trạng chấm và hàng đợi</w:t>
+        <w:t>Hình 27 Kiểm tình trạng chấm và hàng đợi</w:t>
       </w:r>
     </w:p>
     <w:p>
       <w:pPr>
         <w:pStyle w:val="Heading3"/>
       </w:pPr>
-      <w:bookmarkStart w:id="94" w:name="bước-21-soạn-thông-báo"/>
-      <w:bookmarkStart w:id="95" w:name="_Toc243903652"/>
-      <w:bookmarkEnd w:id="92"/>
-      <w:r>
-        <w:t>Bước 21 Soạn thông báo</w:t>
-      </w:r>
-      <w:bookmarkEnd w:id="95"/>
+      <w:bookmarkStart w:id="78" w:name="_Toc243906853"/>
+      <w:r>
+        <w:t>Bước 22 Soạn thông báo</w:t>
+      </w:r>
+      <w:bookmarkEnd w:id="78"/>
     </w:p>
     <w:p>
       <w:r>
@@ -10306,7 +11642,7 @@
           <w:noProof/>
         </w:rPr>
         <w:drawing>
-          <wp:inline distT="0" distB="0" distL="0" distR="0" wp14:anchorId="31A060F9" wp14:editId="70B4FB3C">
+          <wp:inline distT="0" distB="0" distL="0" distR="0" wp14:anchorId="7D73AA55" wp14:editId="595A727E">
             <wp:extent cx="5759999" cy="2369999"/>
             <wp:effectExtent l="0" t="0" r="0" b="0"/>
             <wp:docPr id="147" name="Picture" descr="Hình 27 Soạn thông báo"/>
@@ -10355,7 +11691,7 @@
         <w:jc w:val="center"/>
       </w:pPr>
       <w:r>
-        <w:t>Hình 27 Soạn thông báo</w:t>
+        <w:t>Hình 28 Soạn thông báo</w:t>
       </w:r>
     </w:p>
     <w:p>
@@ -10363,14 +11699,12 @@
         <w:pStyle w:val="Heading3"/>
         <w:pageBreakBefore/>
       </w:pPr>
-      <w:bookmarkStart w:id="96" w:name="bước-22-xuất-bảng-điểm-csv"/>
-      <w:bookmarkStart w:id="97" w:name="_Toc243903653"/>
-      <w:bookmarkEnd w:id="94"/>
+      <w:bookmarkStart w:id="79" w:name="_Toc243906854"/>
       <w:r>
         <w:lastRenderedPageBreak/>
-        <w:t>Bước 22 Xuất bảng điểm CSV</w:t>
-      </w:r>
-      <w:bookmarkEnd w:id="97"/>
+        <w:t>Bước 23 Xuất bảng điểm CSV</w:t>
+      </w:r>
+      <w:bookmarkEnd w:id="79"/>
     </w:p>
     <w:p>
       <w:r>
@@ -10397,7 +11731,7 @@
           <w:noProof/>
         </w:rPr>
         <w:drawing>
-          <wp:inline distT="0" distB="0" distL="0" distR="0" wp14:anchorId="6A171146" wp14:editId="11FE9A9A">
+          <wp:inline distT="0" distB="0" distL="0" distR="0" wp14:anchorId="7DE73019" wp14:editId="292D379A">
             <wp:extent cx="4559999" cy="5400000"/>
             <wp:effectExtent l="0" t="0" r="0" b="0"/>
             <wp:docPr id="151" name="Picture" descr="Hình 28 Xuất bảng điểm CSV"/>
@@ -10446,11 +11780,10 @@
         <w:jc w:val="center"/>
       </w:pPr>
       <w:r>
-        <w:t>Hình 28 Xuất bảng điểm CSV</w:t>
-      </w:r>
-    </w:p>
-    <w:bookmarkEnd w:id="96"/>
-    <w:bookmarkEnd w:id="82"/>
+        <w:t>Hình 29 Xuất bảng điểm CSV</w:t>
+      </w:r>
+    </w:p>
+    <w:bookmarkEnd w:id="71"/>
     <w:bookmarkEnd w:id="46"/>
     <w:sectPr>
       <w:headerReference w:type="default" r:id="rId37"/>

</xml_diff>

<commit_message>
Thêm ảnh email mã xác minh vào tài liệu
</commit_message>
<xml_diff>
--- a/TAI-LIEU.docx
+++ b/TAI-LIEU.docx
@@ -9350,7 +9350,7 @@
         </w:numPr>
       </w:pPr>
       <w:r>
-        <w:t>Chưa chấm chéo với 15 đội ngoài nhóm và nhiều chiến thuật dùng sát quỹ giờ. ETA và dự phòng vận hành còn phụ thuộc tập bot thực tế.</w:t>
+        <w:t>Chưa chấm chéo với 15 đội ngoài nhóm và nhiều chiến thuật dùng sát quỹ giờ. ETA và thời gian chấm thật còn phụ thuộc tập bot thực tế.</w:t>
       </w:r>
     </w:p>
     <w:p>
@@ -9948,39 +9948,58 @@
         <w:t>c Junk.</w:t>
       </w:r>
     </w:p>
-    <w:tbl>
-      <w:tblPr>
-        <w:tblW w:w="0" w:type="auto"/>
+    <w:p>
+      <w:pPr>
+        <w:keepNext/>
         <w:jc w:val="center"/>
-        <w:tblBorders>
-          <w:top w:val="single" w:sz="4" w:space="0" w:color="808080"/>
-          <w:left w:val="single" w:sz="4" w:space="0" w:color="808080"/>
-          <w:bottom w:val="single" w:sz="4" w:space="0" w:color="808080"/>
-          <w:right w:val="single" w:sz="4" w:space="0" w:color="808080"/>
-        </w:tblBorders>
-        <w:tblLayout w:type="fixed"/>
-        <w:tblLook w:val="04A0" w:firstRow="1" w:lastRow="0" w:firstColumn="1" w:lastColumn="0" w:noHBand="0" w:noVBand="1"/>
-      </w:tblPr>
-      <w:tblGrid>
-        <w:gridCol w:w="6236"/>
-      </w:tblGrid>
-      <w:tr>
-        <w:trPr>
-          <w:trHeight w:hRule="exact" w:val="4535"/>
-          <w:jc w:val="center"/>
-        </w:trPr>
-        <w:tc>
-          <w:tcPr>
-            <w:tcW w:w="6236" w:type="dxa"/>
-          </w:tcPr>
-          <w:p>
-            <w:pPr>
-              <w:spacing w:after="0"/>
-            </w:pPr>
-          </w:p>
-        </w:tc>
-      </w:tr>
-    </w:tbl>
+      </w:pPr>
+      <w:r>
+        <w:rPr>
+          <w:noProof/>
+        </w:rPr>
+        <w:drawing>
+          <wp:inline distT="0" distB="0" distL="0" distR="0">
+            <wp:extent cx="5760000" cy="2531025"/>
+            <wp:effectExtent l="0" t="0" r="0" b="0"/>
+            <wp:docPr id="153" name="Picture" descr="Hình 11 Email chứa mã xác minh"/>
+            <wp:cNvGraphicFramePr/>
+            <a:graphic xmlns:a="http://schemas.openxmlformats.org/drawingml/2006/main">
+              <a:graphicData uri="http://schemas.openxmlformats.org/drawingml/2006/picture">
+                <pic:pic xmlns:pic="http://schemas.openxmlformats.org/drawingml/2006/picture">
+                  <pic:nvPicPr>
+                    <pic:cNvPr id="154" name="Picture" descr="img/h4/05-email-ma.png"/>
+                    <pic:cNvPicPr>
+                      <a:picLocks noChangeAspect="1" noChangeArrowheads="1"/>
+                    </pic:cNvPicPr>
+                  </pic:nvPicPr>
+                  <pic:blipFill>
+                    <a:blip r:embed="rIdEmail1"/>
+                    <a:stretch>
+                      <a:fillRect/>
+                    </a:stretch>
+                  </pic:blipFill>
+                  <pic:spPr bwMode="auto">
+                    <a:xfrm>
+                      <a:off x="0" y="0"/>
+                      <a:ext cx="5760000" cy="2531025"/>
+                    </a:xfrm>
+                    <a:prstGeom prst="rect">
+                      <a:avLst/>
+                    </a:prstGeom>
+                    <a:noFill/>
+                    <a:ln w="9525">
+                      <a:solidFill>
+                        <a:srgbClr val="A6A6A6"/>
+                      </a:solidFill>
+                    </a:ln>
+                  </pic:spPr>
+                </pic:pic>
+              </a:graphicData>
+            </a:graphic>
+          </wp:inline>
+        </w:drawing>
+      </w:r>
+    </w:p>
     <w:p>
       <w:pPr>
         <w:pStyle w:val="Caption"/>

</xml_diff>

<commit_message>
Cập nhật ảnh và hướng dẫn xem replay
</commit_message>
<xml_diff>
--- a/TAI-LIEU.docx
+++ b/TAI-LIEU.docx
@@ -314,7 +314,7 @@
           <w:r>
             <w:fldChar w:fldCharType="separate"/>
           </w:r>
-          <w:hyperlink w:anchor="_Toc243915760" w:history="1">
+          <w:hyperlink w:anchor="_Toc243919596" w:history="1">
             <w:r>
               <w:rPr>
                 <w:rStyle w:val="Hyperlink"/>
@@ -341,7 +341,7 @@
                 <w:noProof/>
                 <w:webHidden/>
               </w:rPr>
-              <w:instrText xml:space="preserve"> PAGEREF _Toc243915760 \h </w:instrText>
+              <w:instrText xml:space="preserve"> PAGEREF _Toc243919596 \h </w:instrText>
             </w:r>
             <w:r>
               <w:rPr>
@@ -388,7 +388,7 @@
               <w14:ligatures w14:val="standardContextual"/>
             </w:rPr>
           </w:pPr>
-          <w:hyperlink w:anchor="_Toc243915761" w:history="1">
+          <w:hyperlink w:anchor="_Toc243919597" w:history="1">
             <w:r>
               <w:rPr>
                 <w:rStyle w:val="Hyperlink"/>
@@ -415,7 +415,7 @@
                 <w:noProof/>
                 <w:webHidden/>
               </w:rPr>
-              <w:instrText xml:space="preserve"> PAGEREF _Toc243915761 \h </w:instrText>
+              <w:instrText xml:space="preserve"> PAGEREF _Toc243919597 \h </w:instrText>
             </w:r>
             <w:r>
               <w:rPr>
@@ -462,7 +462,7 @@
               <w14:ligatures w14:val="standardContextual"/>
             </w:rPr>
           </w:pPr>
-          <w:hyperlink w:anchor="_Toc243915762" w:history="1">
+          <w:hyperlink w:anchor="_Toc243919598" w:history="1">
             <w:r>
               <w:rPr>
                 <w:rStyle w:val="Hyperlink"/>
@@ -489,7 +489,7 @@
                 <w:noProof/>
                 <w:webHidden/>
               </w:rPr>
-              <w:instrText xml:space="preserve"> PAGEREF _Toc243915762 \h </w:instrText>
+              <w:instrText xml:space="preserve"> PAGEREF _Toc243919598 \h </w:instrText>
             </w:r>
             <w:r>
               <w:rPr>
@@ -536,7 +536,7 @@
               <w14:ligatures w14:val="standardContextual"/>
             </w:rPr>
           </w:pPr>
-          <w:hyperlink w:anchor="_Toc243915763" w:history="1">
+          <w:hyperlink w:anchor="_Toc243919599" w:history="1">
             <w:r>
               <w:rPr>
                 <w:rStyle w:val="Hyperlink"/>
@@ -563,7 +563,7 @@
                 <w:noProof/>
                 <w:webHidden/>
               </w:rPr>
-              <w:instrText xml:space="preserve"> PAGEREF _Toc243915763 \h </w:instrText>
+              <w:instrText xml:space="preserve"> PAGEREF _Toc243919599 \h </w:instrText>
             </w:r>
             <w:r>
               <w:rPr>
@@ -610,7 +610,7 @@
               <w14:ligatures w14:val="standardContextual"/>
             </w:rPr>
           </w:pPr>
-          <w:hyperlink w:anchor="_Toc243915764" w:history="1">
+          <w:hyperlink w:anchor="_Toc243919600" w:history="1">
             <w:r>
               <w:rPr>
                 <w:rStyle w:val="Hyperlink"/>
@@ -637,7 +637,7 @@
                 <w:noProof/>
                 <w:webHidden/>
               </w:rPr>
-              <w:instrText xml:space="preserve"> PAGEREF _Toc243915764 \h </w:instrText>
+              <w:instrText xml:space="preserve"> PAGEREF _Toc243919600 \h </w:instrText>
             </w:r>
             <w:r>
               <w:rPr>
@@ -684,7 +684,7 @@
               <w14:ligatures w14:val="standardContextual"/>
             </w:rPr>
           </w:pPr>
-          <w:hyperlink w:anchor="_Toc243915765" w:history="1">
+          <w:hyperlink w:anchor="_Toc243919601" w:history="1">
             <w:r>
               <w:rPr>
                 <w:rStyle w:val="Hyperlink"/>
@@ -711,7 +711,7 @@
                 <w:noProof/>
                 <w:webHidden/>
               </w:rPr>
-              <w:instrText xml:space="preserve"> PAGEREF _Toc243915765 \h </w:instrText>
+              <w:instrText xml:space="preserve"> PAGEREF _Toc243919601 \h </w:instrText>
             </w:r>
             <w:r>
               <w:rPr>
@@ -758,7 +758,7 @@
               <w14:ligatures w14:val="standardContextual"/>
             </w:rPr>
           </w:pPr>
-          <w:hyperlink w:anchor="_Toc243915766" w:history="1">
+          <w:hyperlink w:anchor="_Toc243919602" w:history="1">
             <w:r>
               <w:rPr>
                 <w:rStyle w:val="Hyperlink"/>
@@ -785,7 +785,7 @@
                 <w:noProof/>
                 <w:webHidden/>
               </w:rPr>
-              <w:instrText xml:space="preserve"> PAGEREF _Toc243915766 \h </w:instrText>
+              <w:instrText xml:space="preserve"> PAGEREF _Toc243919602 \h </w:instrText>
             </w:r>
             <w:r>
               <w:rPr>
@@ -832,7 +832,7 @@
               <w14:ligatures w14:val="standardContextual"/>
             </w:rPr>
           </w:pPr>
-          <w:hyperlink w:anchor="_Toc243915767" w:history="1">
+          <w:hyperlink w:anchor="_Toc243919603" w:history="1">
             <w:r>
               <w:rPr>
                 <w:rStyle w:val="Hyperlink"/>
@@ -859,7 +859,7 @@
                 <w:noProof/>
                 <w:webHidden/>
               </w:rPr>
-              <w:instrText xml:space="preserve"> PAGEREF _Toc243915767 \h </w:instrText>
+              <w:instrText xml:space="preserve"> PAGEREF _Toc243919603 \h </w:instrText>
             </w:r>
             <w:r>
               <w:rPr>
@@ -906,7 +906,7 @@
               <w14:ligatures w14:val="standardContextual"/>
             </w:rPr>
           </w:pPr>
-          <w:hyperlink w:anchor="_Toc243915768" w:history="1">
+          <w:hyperlink w:anchor="_Toc243919604" w:history="1">
             <w:r>
               <w:rPr>
                 <w:rStyle w:val="Hyperlink"/>
@@ -933,7 +933,7 @@
                 <w:noProof/>
                 <w:webHidden/>
               </w:rPr>
-              <w:instrText xml:space="preserve"> PAGEREF _Toc243915768 \h </w:instrText>
+              <w:instrText xml:space="preserve"> PAGEREF _Toc243919604 \h </w:instrText>
             </w:r>
             <w:r>
               <w:rPr>
@@ -980,7 +980,7 @@
               <w14:ligatures w14:val="standardContextual"/>
             </w:rPr>
           </w:pPr>
-          <w:hyperlink w:anchor="_Toc243915769" w:history="1">
+          <w:hyperlink w:anchor="_Toc243919605" w:history="1">
             <w:r>
               <w:rPr>
                 <w:rStyle w:val="Hyperlink"/>
@@ -1007,7 +1007,7 @@
                 <w:noProof/>
                 <w:webHidden/>
               </w:rPr>
-              <w:instrText xml:space="preserve"> PAGEREF _Toc243915769 \h </w:instrText>
+              <w:instrText xml:space="preserve"> PAGEREF _Toc243919605 \h </w:instrText>
             </w:r>
             <w:r>
               <w:rPr>
@@ -1054,7 +1054,7 @@
               <w14:ligatures w14:val="standardContextual"/>
             </w:rPr>
           </w:pPr>
-          <w:hyperlink w:anchor="_Toc243915770" w:history="1">
+          <w:hyperlink w:anchor="_Toc243919606" w:history="1">
             <w:r>
               <w:rPr>
                 <w:rStyle w:val="Hyperlink"/>
@@ -1081,7 +1081,7 @@
                 <w:noProof/>
                 <w:webHidden/>
               </w:rPr>
-              <w:instrText xml:space="preserve"> PAGEREF _Toc243915770 \h </w:instrText>
+              <w:instrText xml:space="preserve"> PAGEREF _Toc243919606 \h </w:instrText>
             </w:r>
             <w:r>
               <w:rPr>
@@ -1128,7 +1128,7 @@
               <w14:ligatures w14:val="standardContextual"/>
             </w:rPr>
           </w:pPr>
-          <w:hyperlink w:anchor="_Toc243915771" w:history="1">
+          <w:hyperlink w:anchor="_Toc243919607" w:history="1">
             <w:r>
               <w:rPr>
                 <w:rStyle w:val="Hyperlink"/>
@@ -1155,7 +1155,7 @@
                 <w:noProof/>
                 <w:webHidden/>
               </w:rPr>
-              <w:instrText xml:space="preserve"> PAGEREF _Toc243915771 \h </w:instrText>
+              <w:instrText xml:space="preserve"> PAGEREF _Toc243919607 \h </w:instrText>
             </w:r>
             <w:r>
               <w:rPr>
@@ -1202,7 +1202,7 @@
               <w14:ligatures w14:val="standardContextual"/>
             </w:rPr>
           </w:pPr>
-          <w:hyperlink w:anchor="_Toc243915772" w:history="1">
+          <w:hyperlink w:anchor="_Toc243919608" w:history="1">
             <w:r>
               <w:rPr>
                 <w:rStyle w:val="Hyperlink"/>
@@ -1229,7 +1229,7 @@
                 <w:noProof/>
                 <w:webHidden/>
               </w:rPr>
-              <w:instrText xml:space="preserve"> PAGEREF _Toc243915772 \h </w:instrText>
+              <w:instrText xml:space="preserve"> PAGEREF _Toc243919608 \h </w:instrText>
             </w:r>
             <w:r>
               <w:rPr>
@@ -1276,7 +1276,7 @@
               <w14:ligatures w14:val="standardContextual"/>
             </w:rPr>
           </w:pPr>
-          <w:hyperlink w:anchor="_Toc243915773" w:history="1">
+          <w:hyperlink w:anchor="_Toc243919609" w:history="1">
             <w:r>
               <w:rPr>
                 <w:rStyle w:val="Hyperlink"/>
@@ -1303,7 +1303,7 @@
                 <w:noProof/>
                 <w:webHidden/>
               </w:rPr>
-              <w:instrText xml:space="preserve"> PAGEREF _Toc243915773 \h </w:instrText>
+              <w:instrText xml:space="preserve"> PAGEREF _Toc243919609 \h </w:instrText>
             </w:r>
             <w:r>
               <w:rPr>
@@ -1350,7 +1350,7 @@
               <w14:ligatures w14:val="standardContextual"/>
             </w:rPr>
           </w:pPr>
-          <w:hyperlink w:anchor="_Toc243915774" w:history="1">
+          <w:hyperlink w:anchor="_Toc243919610" w:history="1">
             <w:r>
               <w:rPr>
                 <w:rStyle w:val="Hyperlink"/>
@@ -1377,7 +1377,7 @@
                 <w:noProof/>
                 <w:webHidden/>
               </w:rPr>
-              <w:instrText xml:space="preserve"> PAGEREF _Toc243915774 \h </w:instrText>
+              <w:instrText xml:space="preserve"> PAGEREF _Toc243919610 \h </w:instrText>
             </w:r>
             <w:r>
               <w:rPr>
@@ -1424,7 +1424,7 @@
               <w14:ligatures w14:val="standardContextual"/>
             </w:rPr>
           </w:pPr>
-          <w:hyperlink w:anchor="_Toc243915775" w:history="1">
+          <w:hyperlink w:anchor="_Toc243919611" w:history="1">
             <w:r>
               <w:rPr>
                 <w:rStyle w:val="Hyperlink"/>
@@ -1451,7 +1451,7 @@
                 <w:noProof/>
                 <w:webHidden/>
               </w:rPr>
-              <w:instrText xml:space="preserve"> PAGEREF _Toc243915775 \h </w:instrText>
+              <w:instrText xml:space="preserve"> PAGEREF _Toc243919611 \h </w:instrText>
             </w:r>
             <w:r>
               <w:rPr>
@@ -1498,7 +1498,7 @@
               <w14:ligatures w14:val="standardContextual"/>
             </w:rPr>
           </w:pPr>
-          <w:hyperlink w:anchor="_Toc243915776" w:history="1">
+          <w:hyperlink w:anchor="_Toc243919612" w:history="1">
             <w:r>
               <w:rPr>
                 <w:rStyle w:val="Hyperlink"/>
@@ -1525,7 +1525,7 @@
                 <w:noProof/>
                 <w:webHidden/>
               </w:rPr>
-              <w:instrText xml:space="preserve"> PAGEREF _Toc243915776 \h </w:instrText>
+              <w:instrText xml:space="preserve"> PAGEREF _Toc243919612 \h </w:instrText>
             </w:r>
             <w:r>
               <w:rPr>
@@ -1572,7 +1572,7 @@
               <w14:ligatures w14:val="standardContextual"/>
             </w:rPr>
           </w:pPr>
-          <w:hyperlink w:anchor="_Toc243915777" w:history="1">
+          <w:hyperlink w:anchor="_Toc243919613" w:history="1">
             <w:r>
               <w:rPr>
                 <w:rStyle w:val="Hyperlink"/>
@@ -1599,7 +1599,7 @@
                 <w:noProof/>
                 <w:webHidden/>
               </w:rPr>
-              <w:instrText xml:space="preserve"> PAGEREF _Toc243915777 \h </w:instrText>
+              <w:instrText xml:space="preserve"> PAGEREF _Toc243919613 \h </w:instrText>
             </w:r>
             <w:r>
               <w:rPr>
@@ -1646,7 +1646,7 @@
               <w14:ligatures w14:val="standardContextual"/>
             </w:rPr>
           </w:pPr>
-          <w:hyperlink w:anchor="_Toc243915778" w:history="1">
+          <w:hyperlink w:anchor="_Toc243919614" w:history="1">
             <w:r>
               <w:rPr>
                 <w:rStyle w:val="Hyperlink"/>
@@ -1673,7 +1673,7 @@
                 <w:noProof/>
                 <w:webHidden/>
               </w:rPr>
-              <w:instrText xml:space="preserve"> PAGEREF _Toc243915778 \h </w:instrText>
+              <w:instrText xml:space="preserve"> PAGEREF _Toc243919614 \h </w:instrText>
             </w:r>
             <w:r>
               <w:rPr>
@@ -1720,7 +1720,7 @@
               <w14:ligatures w14:val="standardContextual"/>
             </w:rPr>
           </w:pPr>
-          <w:hyperlink w:anchor="_Toc243915779" w:history="1">
+          <w:hyperlink w:anchor="_Toc243919615" w:history="1">
             <w:r>
               <w:rPr>
                 <w:rStyle w:val="Hyperlink"/>
@@ -1747,7 +1747,7 @@
                 <w:noProof/>
                 <w:webHidden/>
               </w:rPr>
-              <w:instrText xml:space="preserve"> PAGEREF _Toc243915779 \h </w:instrText>
+              <w:instrText xml:space="preserve"> PAGEREF _Toc243919615 \h </w:instrText>
             </w:r>
             <w:r>
               <w:rPr>
@@ -1794,7 +1794,7 @@
               <w14:ligatures w14:val="standardContextual"/>
             </w:rPr>
           </w:pPr>
-          <w:hyperlink w:anchor="_Toc243915780" w:history="1">
+          <w:hyperlink w:anchor="_Toc243919616" w:history="1">
             <w:r>
               <w:rPr>
                 <w:rStyle w:val="Hyperlink"/>
@@ -1821,7 +1821,7 @@
                 <w:noProof/>
                 <w:webHidden/>
               </w:rPr>
-              <w:instrText xml:space="preserve"> PAGEREF _Toc243915780 \h </w:instrText>
+              <w:instrText xml:space="preserve"> PAGEREF _Toc243919616 \h </w:instrText>
             </w:r>
             <w:r>
               <w:rPr>
@@ -1868,7 +1868,7 @@
               <w14:ligatures w14:val="standardContextual"/>
             </w:rPr>
           </w:pPr>
-          <w:hyperlink w:anchor="_Toc243915781" w:history="1">
+          <w:hyperlink w:anchor="_Toc243919617" w:history="1">
             <w:r>
               <w:rPr>
                 <w:rStyle w:val="Hyperlink"/>
@@ -1895,7 +1895,7 @@
                 <w:noProof/>
                 <w:webHidden/>
               </w:rPr>
-              <w:instrText xml:space="preserve"> PAGEREF _Toc243915781 \h </w:instrText>
+              <w:instrText xml:space="preserve"> PAGEREF _Toc243919617 \h </w:instrText>
             </w:r>
             <w:r>
               <w:rPr>
@@ -1942,7 +1942,7 @@
               <w14:ligatures w14:val="standardContextual"/>
             </w:rPr>
           </w:pPr>
-          <w:hyperlink w:anchor="_Toc243915782" w:history="1">
+          <w:hyperlink w:anchor="_Toc243919618" w:history="1">
             <w:r>
               <w:rPr>
                 <w:rStyle w:val="Hyperlink"/>
@@ -1969,7 +1969,7 @@
                 <w:noProof/>
                 <w:webHidden/>
               </w:rPr>
-              <w:instrText xml:space="preserve"> PAGEREF _Toc243915782 \h </w:instrText>
+              <w:instrText xml:space="preserve"> PAGEREF _Toc243919618 \h </w:instrText>
             </w:r>
             <w:r>
               <w:rPr>
@@ -2016,7 +2016,7 @@
               <w14:ligatures w14:val="standardContextual"/>
             </w:rPr>
           </w:pPr>
-          <w:hyperlink w:anchor="_Toc243915783" w:history="1">
+          <w:hyperlink w:anchor="_Toc243919619" w:history="1">
             <w:r>
               <w:rPr>
                 <w:rStyle w:val="Hyperlink"/>
@@ -2043,7 +2043,7 @@
                 <w:noProof/>
                 <w:webHidden/>
               </w:rPr>
-              <w:instrText xml:space="preserve"> PAGEREF _Toc243915783 \h </w:instrText>
+              <w:instrText xml:space="preserve"> PAGEREF _Toc243919619 \h </w:instrText>
             </w:r>
             <w:r>
               <w:rPr>
@@ -2090,7 +2090,7 @@
               <w14:ligatures w14:val="standardContextual"/>
             </w:rPr>
           </w:pPr>
-          <w:hyperlink w:anchor="_Toc243915784" w:history="1">
+          <w:hyperlink w:anchor="_Toc243919620" w:history="1">
             <w:r>
               <w:rPr>
                 <w:rStyle w:val="Hyperlink"/>
@@ -2117,7 +2117,7 @@
                 <w:noProof/>
                 <w:webHidden/>
               </w:rPr>
-              <w:instrText xml:space="preserve"> PAGEREF _Toc243915784 \h </w:instrText>
+              <w:instrText xml:space="preserve"> PAGEREF _Toc243919620 \h </w:instrText>
             </w:r>
             <w:r>
               <w:rPr>
@@ -2164,7 +2164,7 @@
               <w14:ligatures w14:val="standardContextual"/>
             </w:rPr>
           </w:pPr>
-          <w:hyperlink w:anchor="_Toc243915785" w:history="1">
+          <w:hyperlink w:anchor="_Toc243919621" w:history="1">
             <w:r>
               <w:rPr>
                 <w:rStyle w:val="Hyperlink"/>
@@ -2191,7 +2191,7 @@
                 <w:noProof/>
                 <w:webHidden/>
               </w:rPr>
-              <w:instrText xml:space="preserve"> PAGEREF _Toc243915785 \h </w:instrText>
+              <w:instrText xml:space="preserve"> PAGEREF _Toc243919621 \h </w:instrText>
             </w:r>
             <w:r>
               <w:rPr>
@@ -2238,7 +2238,7 @@
               <w14:ligatures w14:val="standardContextual"/>
             </w:rPr>
           </w:pPr>
-          <w:hyperlink w:anchor="_Toc243915786" w:history="1">
+          <w:hyperlink w:anchor="_Toc243919622" w:history="1">
             <w:r>
               <w:rPr>
                 <w:rStyle w:val="Hyperlink"/>
@@ -2265,7 +2265,7 @@
                 <w:noProof/>
                 <w:webHidden/>
               </w:rPr>
-              <w:instrText xml:space="preserve"> PAGEREF _Toc243915786 \h </w:instrText>
+              <w:instrText xml:space="preserve"> PAGEREF _Toc243919622 \h </w:instrText>
             </w:r>
             <w:r>
               <w:rPr>
@@ -2312,7 +2312,7 @@
               <w14:ligatures w14:val="standardContextual"/>
             </w:rPr>
           </w:pPr>
-          <w:hyperlink w:anchor="_Toc243915787" w:history="1">
+          <w:hyperlink w:anchor="_Toc243919623" w:history="1">
             <w:r>
               <w:rPr>
                 <w:rStyle w:val="Hyperlink"/>
@@ -2339,7 +2339,7 @@
                 <w:noProof/>
                 <w:webHidden/>
               </w:rPr>
-              <w:instrText xml:space="preserve"> PAGEREF _Toc243915787 \h </w:instrText>
+              <w:instrText xml:space="preserve"> PAGEREF _Toc243919623 \h </w:instrText>
             </w:r>
             <w:r>
               <w:rPr>
@@ -2386,7 +2386,7 @@
               <w14:ligatures w14:val="standardContextual"/>
             </w:rPr>
           </w:pPr>
-          <w:hyperlink w:anchor="_Toc243915788" w:history="1">
+          <w:hyperlink w:anchor="_Toc243919624" w:history="1">
             <w:r>
               <w:rPr>
                 <w:rStyle w:val="Hyperlink"/>
@@ -2413,7 +2413,7 @@
                 <w:noProof/>
                 <w:webHidden/>
               </w:rPr>
-              <w:instrText xml:space="preserve"> PAGEREF _Toc243915788 \h </w:instrText>
+              <w:instrText xml:space="preserve"> PAGEREF _Toc243919624 \h </w:instrText>
             </w:r>
             <w:r>
               <w:rPr>
@@ -2460,7 +2460,7 @@
               <w14:ligatures w14:val="standardContextual"/>
             </w:rPr>
           </w:pPr>
-          <w:hyperlink w:anchor="_Toc243915789" w:history="1">
+          <w:hyperlink w:anchor="_Toc243919625" w:history="1">
             <w:r>
               <w:rPr>
                 <w:rStyle w:val="Hyperlink"/>
@@ -2487,7 +2487,7 @@
                 <w:noProof/>
                 <w:webHidden/>
               </w:rPr>
-              <w:instrText xml:space="preserve"> PAGEREF _Toc243915789 \h </w:instrText>
+              <w:instrText xml:space="preserve"> PAGEREF _Toc243919625 \h </w:instrText>
             </w:r>
             <w:r>
               <w:rPr>
@@ -2534,7 +2534,7 @@
               <w14:ligatures w14:val="standardContextual"/>
             </w:rPr>
           </w:pPr>
-          <w:hyperlink w:anchor="_Toc243915790" w:history="1">
+          <w:hyperlink w:anchor="_Toc243919626" w:history="1">
             <w:r>
               <w:rPr>
                 <w:rStyle w:val="Hyperlink"/>
@@ -2561,7 +2561,7 @@
                 <w:noProof/>
                 <w:webHidden/>
               </w:rPr>
-              <w:instrText xml:space="preserve"> PAGEREF _Toc243915790 \h </w:instrText>
+              <w:instrText xml:space="preserve"> PAGEREF _Toc243919626 \h </w:instrText>
             </w:r>
             <w:r>
               <w:rPr>
@@ -2608,7 +2608,7 @@
               <w14:ligatures w14:val="standardContextual"/>
             </w:rPr>
           </w:pPr>
-          <w:hyperlink w:anchor="_Toc243915791" w:history="1">
+          <w:hyperlink w:anchor="_Toc243919627" w:history="1">
             <w:r>
               <w:rPr>
                 <w:rStyle w:val="Hyperlink"/>
@@ -2635,7 +2635,7 @@
                 <w:noProof/>
                 <w:webHidden/>
               </w:rPr>
-              <w:instrText xml:space="preserve"> PAGEREF _Toc243915791 \h </w:instrText>
+              <w:instrText xml:space="preserve"> PAGEREF _Toc243919627 \h </w:instrText>
             </w:r>
             <w:r>
               <w:rPr>
@@ -2682,7 +2682,7 @@
               <w14:ligatures w14:val="standardContextual"/>
             </w:rPr>
           </w:pPr>
-          <w:hyperlink w:anchor="_Toc243915792" w:history="1">
+          <w:hyperlink w:anchor="_Toc243919628" w:history="1">
             <w:r>
               <w:rPr>
                 <w:rStyle w:val="Hyperlink"/>
@@ -2709,7 +2709,7 @@
                 <w:noProof/>
                 <w:webHidden/>
               </w:rPr>
-              <w:instrText xml:space="preserve"> PAGEREF _Toc243915792 \h </w:instrText>
+              <w:instrText xml:space="preserve"> PAGEREF _Toc243919628 \h </w:instrText>
             </w:r>
             <w:r>
               <w:rPr>
@@ -2756,7 +2756,7 @@
               <w14:ligatures w14:val="standardContextual"/>
             </w:rPr>
           </w:pPr>
-          <w:hyperlink w:anchor="_Toc243915793" w:history="1">
+          <w:hyperlink w:anchor="_Toc243919629" w:history="1">
             <w:r>
               <w:rPr>
                 <w:rStyle w:val="Hyperlink"/>
@@ -2783,7 +2783,7 @@
                 <w:noProof/>
                 <w:webHidden/>
               </w:rPr>
-              <w:instrText xml:space="preserve"> PAGEREF _Toc243915793 \h </w:instrText>
+              <w:instrText xml:space="preserve"> PAGEREF _Toc243919629 \h </w:instrText>
             </w:r>
             <w:r>
               <w:rPr>
@@ -2830,7 +2830,7 @@
               <w14:ligatures w14:val="standardContextual"/>
             </w:rPr>
           </w:pPr>
-          <w:hyperlink w:anchor="_Toc243915794" w:history="1">
+          <w:hyperlink w:anchor="_Toc243919630" w:history="1">
             <w:r>
               <w:rPr>
                 <w:rStyle w:val="Hyperlink"/>
@@ -2857,7 +2857,7 @@
                 <w:noProof/>
                 <w:webHidden/>
               </w:rPr>
-              <w:instrText xml:space="preserve"> PAGEREF _Toc243915794 \h </w:instrText>
+              <w:instrText xml:space="preserve"> PAGEREF _Toc243919630 \h </w:instrText>
             </w:r>
             <w:r>
               <w:rPr>
@@ -2904,7 +2904,7 @@
               <w14:ligatures w14:val="standardContextual"/>
             </w:rPr>
           </w:pPr>
-          <w:hyperlink w:anchor="_Toc243915795" w:history="1">
+          <w:hyperlink w:anchor="_Toc243919631" w:history="1">
             <w:r>
               <w:rPr>
                 <w:rStyle w:val="Hyperlink"/>
@@ -2931,7 +2931,7 @@
                 <w:noProof/>
                 <w:webHidden/>
               </w:rPr>
-              <w:instrText xml:space="preserve"> PAGEREF _Toc243915795 \h </w:instrText>
+              <w:instrText xml:space="preserve"> PAGEREF _Toc243919631 \h </w:instrText>
             </w:r>
             <w:r>
               <w:rPr>
@@ -2978,7 +2978,7 @@
               <w14:ligatures w14:val="standardContextual"/>
             </w:rPr>
           </w:pPr>
-          <w:hyperlink w:anchor="_Toc243915796" w:history="1">
+          <w:hyperlink w:anchor="_Toc243919632" w:history="1">
             <w:r>
               <w:rPr>
                 <w:rStyle w:val="Hyperlink"/>
@@ -3005,7 +3005,7 @@
                 <w:noProof/>
                 <w:webHidden/>
               </w:rPr>
-              <w:instrText xml:space="preserve"> PAGEREF _Toc243915796 \h </w:instrText>
+              <w:instrText xml:space="preserve"> PAGEREF _Toc243919632 \h </w:instrText>
             </w:r>
             <w:r>
               <w:rPr>
@@ -3052,7 +3052,7 @@
               <w14:ligatures w14:val="standardContextual"/>
             </w:rPr>
           </w:pPr>
-          <w:hyperlink w:anchor="_Toc243915797" w:history="1">
+          <w:hyperlink w:anchor="_Toc243919633" w:history="1">
             <w:r>
               <w:rPr>
                 <w:rStyle w:val="Hyperlink"/>
@@ -3079,7 +3079,7 @@
                 <w:noProof/>
                 <w:webHidden/>
               </w:rPr>
-              <w:instrText xml:space="preserve"> PAGEREF _Toc243915797 \h </w:instrText>
+              <w:instrText xml:space="preserve"> PAGEREF _Toc243919633 \h </w:instrText>
             </w:r>
             <w:r>
               <w:rPr>
@@ -3126,7 +3126,7 @@
               <w14:ligatures w14:val="standardContextual"/>
             </w:rPr>
           </w:pPr>
-          <w:hyperlink w:anchor="_Toc243915798" w:history="1">
+          <w:hyperlink w:anchor="_Toc243919634" w:history="1">
             <w:r>
               <w:rPr>
                 <w:rStyle w:val="Hyperlink"/>
@@ -3153,7 +3153,7 @@
                 <w:noProof/>
                 <w:webHidden/>
               </w:rPr>
-              <w:instrText xml:space="preserve"> PAGEREF _Toc243915798 \h </w:instrText>
+              <w:instrText xml:space="preserve"> PAGEREF _Toc243919634 \h </w:instrText>
             </w:r>
             <w:r>
               <w:rPr>
@@ -3200,7 +3200,7 @@
               <w14:ligatures w14:val="standardContextual"/>
             </w:rPr>
           </w:pPr>
-          <w:hyperlink w:anchor="_Toc243915799" w:history="1">
+          <w:hyperlink w:anchor="_Toc243919635" w:history="1">
             <w:r>
               <w:rPr>
                 <w:rStyle w:val="Hyperlink"/>
@@ -3227,7 +3227,7 @@
                 <w:noProof/>
                 <w:webHidden/>
               </w:rPr>
-              <w:instrText xml:space="preserve"> PAGEREF _Toc243915799 \h </w:instrText>
+              <w:instrText xml:space="preserve"> PAGEREF _Toc243919635 \h </w:instrText>
             </w:r>
             <w:r>
               <w:rPr>
@@ -3274,7 +3274,7 @@
               <w14:ligatures w14:val="standardContextual"/>
             </w:rPr>
           </w:pPr>
-          <w:hyperlink w:anchor="_Toc243915800" w:history="1">
+          <w:hyperlink w:anchor="_Toc243919636" w:history="1">
             <w:r>
               <w:rPr>
                 <w:rStyle w:val="Hyperlink"/>
@@ -3301,7 +3301,7 @@
                 <w:noProof/>
                 <w:webHidden/>
               </w:rPr>
-              <w:instrText xml:space="preserve"> PAGEREF _Toc243915800 \h </w:instrText>
+              <w:instrText xml:space="preserve"> PAGEREF _Toc243919636 \h </w:instrText>
             </w:r>
             <w:r>
               <w:rPr>
@@ -3348,7 +3348,7 @@
               <w14:ligatures w14:val="standardContextual"/>
             </w:rPr>
           </w:pPr>
-          <w:hyperlink w:anchor="_Toc243915801" w:history="1">
+          <w:hyperlink w:anchor="_Toc243919637" w:history="1">
             <w:r>
               <w:rPr>
                 <w:rStyle w:val="Hyperlink"/>
@@ -3375,7 +3375,7 @@
                 <w:noProof/>
                 <w:webHidden/>
               </w:rPr>
-              <w:instrText xml:space="preserve"> PAGEREF _Toc243915801 \h </w:instrText>
+              <w:instrText xml:space="preserve"> PAGEREF _Toc243919637 \h </w:instrText>
             </w:r>
             <w:r>
               <w:rPr>
@@ -3422,7 +3422,7 @@
               <w14:ligatures w14:val="standardContextual"/>
             </w:rPr>
           </w:pPr>
-          <w:hyperlink w:anchor="_Toc243915802" w:history="1">
+          <w:hyperlink w:anchor="_Toc243919638" w:history="1">
             <w:r>
               <w:rPr>
                 <w:rStyle w:val="Hyperlink"/>
@@ -3449,7 +3449,7 @@
                 <w:noProof/>
                 <w:webHidden/>
               </w:rPr>
-              <w:instrText xml:space="preserve"> PAGEREF _Toc243915802 \h </w:instrText>
+              <w:instrText xml:space="preserve"> PAGEREF _Toc243919638 \h </w:instrText>
             </w:r>
             <w:r>
               <w:rPr>
@@ -3496,7 +3496,7 @@
               <w14:ligatures w14:val="standardContextual"/>
             </w:rPr>
           </w:pPr>
-          <w:hyperlink w:anchor="_Toc243915803" w:history="1">
+          <w:hyperlink w:anchor="_Toc243919639" w:history="1">
             <w:r>
               <w:rPr>
                 <w:rStyle w:val="Hyperlink"/>
@@ -3523,7 +3523,7 @@
                 <w:noProof/>
                 <w:webHidden/>
               </w:rPr>
-              <w:instrText xml:space="preserve"> PAGEREF _Toc243915803 \h </w:instrText>
+              <w:instrText xml:space="preserve"> PAGEREF _Toc243919639 \h </w:instrText>
             </w:r>
             <w:r>
               <w:rPr>
@@ -3570,7 +3570,7 @@
               <w14:ligatures w14:val="standardContextual"/>
             </w:rPr>
           </w:pPr>
-          <w:hyperlink w:anchor="_Toc243915804" w:history="1">
+          <w:hyperlink w:anchor="_Toc243919640" w:history="1">
             <w:r>
               <w:rPr>
                 <w:rStyle w:val="Hyperlink"/>
@@ -3597,7 +3597,7 @@
                 <w:noProof/>
                 <w:webHidden/>
               </w:rPr>
-              <w:instrText xml:space="preserve"> PAGEREF _Toc243915804 \h </w:instrText>
+              <w:instrText xml:space="preserve"> PAGEREF _Toc243919640 \h </w:instrText>
             </w:r>
             <w:r>
               <w:rPr>
@@ -3644,7 +3644,7 @@
               <w14:ligatures w14:val="standardContextual"/>
             </w:rPr>
           </w:pPr>
-          <w:hyperlink w:anchor="_Toc243915805" w:history="1">
+          <w:hyperlink w:anchor="_Toc243919641" w:history="1">
             <w:r>
               <w:rPr>
                 <w:rStyle w:val="Hyperlink"/>
@@ -3671,7 +3671,7 @@
                 <w:noProof/>
                 <w:webHidden/>
               </w:rPr>
-              <w:instrText xml:space="preserve"> PAGEREF _Toc243915805 \h </w:instrText>
+              <w:instrText xml:space="preserve"> PAGEREF _Toc243919641 \h </w:instrText>
             </w:r>
             <w:r>
               <w:rPr>
@@ -3718,7 +3718,7 @@
               <w14:ligatures w14:val="standardContextual"/>
             </w:rPr>
           </w:pPr>
-          <w:hyperlink w:anchor="_Toc243915806" w:history="1">
+          <w:hyperlink w:anchor="_Toc243919642" w:history="1">
             <w:r>
               <w:rPr>
                 <w:rStyle w:val="Hyperlink"/>
@@ -3745,7 +3745,7 @@
                 <w:noProof/>
                 <w:webHidden/>
               </w:rPr>
-              <w:instrText xml:space="preserve"> PAGEREF _Toc243915806 \h </w:instrText>
+              <w:instrText xml:space="preserve"> PAGEREF _Toc243919642 \h </w:instrText>
             </w:r>
             <w:r>
               <w:rPr>
@@ -3792,7 +3792,7 @@
               <w14:ligatures w14:val="standardContextual"/>
             </w:rPr>
           </w:pPr>
-          <w:hyperlink w:anchor="_Toc243915807" w:history="1">
+          <w:hyperlink w:anchor="_Toc243919643" w:history="1">
             <w:r>
               <w:rPr>
                 <w:rStyle w:val="Hyperlink"/>
@@ -3819,7 +3819,7 @@
                 <w:noProof/>
                 <w:webHidden/>
               </w:rPr>
-              <w:instrText xml:space="preserve"> PAGEREF _Toc243915807 \h </w:instrText>
+              <w:instrText xml:space="preserve"> PAGEREF _Toc243919643 \h </w:instrText>
             </w:r>
             <w:r>
               <w:rPr>
@@ -3866,7 +3866,7 @@
               <w14:ligatures w14:val="standardContextual"/>
             </w:rPr>
           </w:pPr>
-          <w:hyperlink w:anchor="_Toc243915808" w:history="1">
+          <w:hyperlink w:anchor="_Toc243919644" w:history="1">
             <w:r>
               <w:rPr>
                 <w:rStyle w:val="Hyperlink"/>
@@ -3893,7 +3893,7 @@
                 <w:noProof/>
                 <w:webHidden/>
               </w:rPr>
-              <w:instrText xml:space="preserve"> PAGEREF _Toc243915808 \h </w:instrText>
+              <w:instrText xml:space="preserve"> PAGEREF _Toc243919644 \h </w:instrText>
             </w:r>
             <w:r>
               <w:rPr>
@@ -3940,7 +3940,7 @@
               <w14:ligatures w14:val="standardContextual"/>
             </w:rPr>
           </w:pPr>
-          <w:hyperlink w:anchor="_Toc243915809" w:history="1">
+          <w:hyperlink w:anchor="_Toc243919645" w:history="1">
             <w:r>
               <w:rPr>
                 <w:rStyle w:val="Hyperlink"/>
@@ -3967,7 +3967,7 @@
                 <w:noProof/>
                 <w:webHidden/>
               </w:rPr>
-              <w:instrText xml:space="preserve"> PAGEREF _Toc243915809 \h </w:instrText>
+              <w:instrText xml:space="preserve"> PAGEREF _Toc243919645 \h </w:instrText>
             </w:r>
             <w:r>
               <w:rPr>
@@ -4011,7 +4011,7 @@
         <w:pageBreakBefore/>
       </w:pPr>
       <w:bookmarkStart w:id="0" w:name="mở-đầu"/>
-      <w:bookmarkStart w:id="1" w:name="_Toc243915760"/>
+      <w:bookmarkStart w:id="1" w:name="_Toc243919596"/>
       <w:r>
         <w:lastRenderedPageBreak/>
         <w:t>Mở đầu</w:t>
@@ -4166,7 +4166,7 @@
         <w:pageBreakBefore/>
       </w:pPr>
       <w:bookmarkStart w:id="2" w:name="phần-a-giải-đấu"/>
-      <w:bookmarkStart w:id="3" w:name="_Toc243915761"/>
+      <w:bookmarkStart w:id="3" w:name="_Toc243919597"/>
       <w:bookmarkEnd w:id="0"/>
       <w:r>
         <w:lastRenderedPageBreak/>
@@ -4179,7 +4179,7 @@
         <w:pStyle w:val="Heading2"/>
       </w:pPr>
       <w:bookmarkStart w:id="4" w:name="a1-trò-chơi-ottv2"/>
-      <w:bookmarkStart w:id="5" w:name="_Toc243915762"/>
+      <w:bookmarkStart w:id="5" w:name="_Toc243919598"/>
       <w:r>
         <w:t>1. Trò chơi OTTv2</w:t>
       </w:r>
@@ -4460,7 +4460,7 @@
         <w:pStyle w:val="Heading2"/>
       </w:pPr>
       <w:bookmarkStart w:id="6" w:name="a2-tài-khoản-và-đội"/>
-      <w:bookmarkStart w:id="7" w:name="_Toc243915763"/>
+      <w:bookmarkStart w:id="7" w:name="_Toc243919599"/>
       <w:bookmarkEnd w:id="4"/>
       <w:r>
         <w:t>2. Tài khoản và đội</w:t>
@@ -4779,7 +4779,7 @@
         <w:pStyle w:val="Heading2"/>
       </w:pPr>
       <w:bookmarkStart w:id="8" w:name="a3-nộp-bot-qua-github"/>
-      <w:bookmarkStart w:id="9" w:name="_Toc243915764"/>
+      <w:bookmarkStart w:id="9" w:name="_Toc243919600"/>
       <w:bookmarkEnd w:id="6"/>
       <w:r>
         <w:t>3. Nộp bot qua GitHub</w:t>
@@ -5213,7 +5213,7 @@
         <w:pStyle w:val="Heading2"/>
       </w:pPr>
       <w:bookmarkStart w:id="10" w:name="a4-thể-lệ-và-lịch-đấu"/>
-      <w:bookmarkStart w:id="11" w:name="_Toc243915765"/>
+      <w:bookmarkStart w:id="11" w:name="_Toc243919601"/>
       <w:bookmarkEnd w:id="8"/>
       <w:r>
         <w:t>4. Thể lệ và lịch đấu</w:t>
@@ -5225,7 +5225,7 @@
         <w:pStyle w:val="Heading3"/>
       </w:pPr>
       <w:bookmarkStart w:id="12" w:name="ladder-trước-hạn"/>
-      <w:bookmarkStart w:id="13" w:name="_Toc243915766"/>
+      <w:bookmarkStart w:id="13" w:name="_Toc243919602"/>
       <w:r>
         <w:t>4.1. Ladder trước hạn</w:t>
       </w:r>
@@ -5275,7 +5275,7 @@
         <w:pStyle w:val="Heading3"/>
       </w:pPr>
       <w:bookmarkStart w:id="14" w:name="chốt-bài-tại-hạn"/>
-      <w:bookmarkStart w:id="15" w:name="_Toc243915767"/>
+      <w:bookmarkStart w:id="15" w:name="_Toc243919603"/>
       <w:bookmarkEnd w:id="12"/>
       <w:r>
         <w:t>4.2. Chốt bài tại hạn</w:t>
@@ -5304,7 +5304,7 @@
         <w:pStyle w:val="Heading3"/>
       </w:pPr>
       <w:bookmarkStart w:id="16" w:name="xếp-hạng-chính-thức"/>
-      <w:bookmarkStart w:id="17" w:name="_Toc243915768"/>
+      <w:bookmarkStart w:id="17" w:name="_Toc243919604"/>
       <w:bookmarkEnd w:id="14"/>
       <w:r>
         <w:t>4.3. Xếp hạng chính thức</w:t>
@@ -5655,7 +5655,7 @@
         <w:pStyle w:val="Heading2"/>
       </w:pPr>
       <w:bookmarkStart w:id="18" w:name="a5-xem-kết-quả"/>
-      <w:bookmarkStart w:id="19" w:name="_Toc243915769"/>
+      <w:bookmarkStart w:id="19" w:name="_Toc243919605"/>
       <w:bookmarkEnd w:id="16"/>
       <w:bookmarkEnd w:id="10"/>
       <w:r>
@@ -5759,7 +5759,7 @@
         <w:lastRenderedPageBreak/>
         <w:drawing>
           <wp:inline distT="0" distB="0" distL="0" distR="0" wp14:anchorId="313C35BE" wp14:editId="6DE67CA2">
-            <wp:extent cx="5579999" cy="7011710"/>
+            <wp:extent cx="5579999" cy="7011709"/>
             <wp:effectExtent l="0" t="0" r="0" b="0"/>
             <wp:docPr id="38" name="Picture" descr="Hình 3 Replay một ván đã kết thúc bằng chiếm căn cứ"/>
             <wp:cNvGraphicFramePr/>
@@ -5781,7 +5781,7 @@
                   <pic:spPr bwMode="auto">
                     <a:xfrm>
                       <a:off x="0" y="0"/>
-                      <a:ext cx="5579999" cy="7011710"/>
+                      <a:ext cx="5579999" cy="7011709"/>
                     </a:xfrm>
                     <a:prstGeom prst="rect">
                       <a:avLst/>
@@ -5823,7 +5823,7 @@
         <w:pStyle w:val="Heading2"/>
       </w:pPr>
       <w:bookmarkStart w:id="20" w:name="a6-ban-tổ-chức-và-điều-hành"/>
-      <w:bookmarkStart w:id="21" w:name="_Toc243915770"/>
+      <w:bookmarkStart w:id="21" w:name="_Toc243919606"/>
       <w:bookmarkEnd w:id="18"/>
       <w:r>
         <w:t>6. Ban tổ chức và điều hành</w:t>
@@ -5944,7 +5944,7 @@
         <w:pageBreakBefore/>
       </w:pPr>
       <w:bookmarkStart w:id="22" w:name="phần-b-thiết-kế-kỹ-thuật"/>
-      <w:bookmarkStart w:id="23" w:name="_Toc243915771"/>
+      <w:bookmarkStart w:id="23" w:name="_Toc243919607"/>
       <w:bookmarkEnd w:id="20"/>
       <w:bookmarkEnd w:id="2"/>
       <w:r>
@@ -5958,7 +5958,7 @@
         <w:pStyle w:val="Heading2"/>
       </w:pPr>
       <w:bookmarkStart w:id="24" w:name="b1-kiến-trúc-tổng-thể"/>
-      <w:bookmarkStart w:id="25" w:name="_Toc243915772"/>
+      <w:bookmarkStart w:id="25" w:name="_Toc243919608"/>
       <w:r>
         <w:t>1. Kiến trúc tổng thể</w:t>
       </w:r>
@@ -6060,7 +6060,7 @@
         <w:pStyle w:val="Heading2"/>
       </w:pPr>
       <w:bookmarkStart w:id="26" w:name="b2-dịch-vụ-được-dùng"/>
-      <w:bookmarkStart w:id="27" w:name="_Toc243915773"/>
+      <w:bookmarkStart w:id="27" w:name="_Toc243919609"/>
       <w:bookmarkEnd w:id="24"/>
       <w:r>
         <w:lastRenderedPageBreak/>
@@ -6392,7 +6392,7 @@
         <w:pStyle w:val="Heading2"/>
       </w:pPr>
       <w:bookmarkStart w:id="28" w:name="b3-hub-và-cách-phục-vụ-dữ-liệu"/>
-      <w:bookmarkStart w:id="29" w:name="_Toc243915774"/>
+      <w:bookmarkStart w:id="29" w:name="_Toc243919610"/>
       <w:bookmarkEnd w:id="26"/>
       <w:r>
         <w:t>3. Hub và cách phục vụ dữ liệu</w:t>
@@ -6471,7 +6471,7 @@
         <w:pStyle w:val="Heading2"/>
       </w:pPr>
       <w:bookmarkStart w:id="30" w:name="b4-máy-chấm-và-chia-việc"/>
-      <w:bookmarkStart w:id="31" w:name="_Toc243915775"/>
+      <w:bookmarkStart w:id="31" w:name="_Toc243919611"/>
       <w:bookmarkEnd w:id="28"/>
       <w:r>
         <w:t>4. Máy chấm và chia việc</w:t>
@@ -6594,7 +6594,7 @@
         <w:pStyle w:val="Heading2"/>
       </w:pPr>
       <w:bookmarkStart w:id="32" w:name="b5-sandbox-thay-docker"/>
-      <w:bookmarkStart w:id="33" w:name="_Toc243915776"/>
+      <w:bookmarkStart w:id="33" w:name="_Toc243919612"/>
       <w:bookmarkEnd w:id="30"/>
       <w:r>
         <w:t>5. Sandbox chạy bot</w:t>
@@ -6636,7 +6636,7 @@
         <w:pStyle w:val="Heading2"/>
       </w:pPr>
       <w:bookmarkStart w:id="34" w:name="b6-quỹ-giờ-và-khả-năng-đối-chiếu"/>
-      <w:bookmarkStart w:id="35" w:name="_Toc243915777"/>
+      <w:bookmarkStart w:id="35" w:name="_Toc243919613"/>
       <w:bookmarkEnd w:id="32"/>
       <w:r>
         <w:t>6. Quỹ giờ và khả năng đối chiếu</w:t>
@@ -6685,7 +6685,7 @@
         <w:pStyle w:val="Heading2"/>
       </w:pPr>
       <w:bookmarkStart w:id="36" w:name="b7-chịu-lỗi-và-sao-lưu"/>
-      <w:bookmarkStart w:id="37" w:name="_Toc243915778"/>
+      <w:bookmarkStart w:id="37" w:name="_Toc243919614"/>
       <w:bookmarkEnd w:id="34"/>
       <w:r>
         <w:t>7. Chịu lỗi và sao lưu</w:t>
@@ -7070,7 +7070,7 @@
         <w:pStyle w:val="Heading2"/>
       </w:pPr>
       <w:bookmarkStart w:id="38" w:name="b8-bảo-mật"/>
-      <w:bookmarkStart w:id="39" w:name="_Toc243915779"/>
+      <w:bookmarkStart w:id="39" w:name="_Toc243919615"/>
       <w:bookmarkEnd w:id="36"/>
       <w:r>
         <w:t>8. Bảo mật</w:t>
@@ -7128,7 +7128,7 @@
         <w:pStyle w:val="Heading2"/>
       </w:pPr>
       <w:bookmarkStart w:id="40" w:name="b9-sức-tải-và-thời-gian-đã-đo"/>
-      <w:bookmarkStart w:id="41" w:name="_Toc243915780"/>
+      <w:bookmarkStart w:id="41" w:name="_Toc243919616"/>
       <w:bookmarkEnd w:id="38"/>
       <w:r>
         <w:t>9. Sức tải và thời gian đã đo</w:t>
@@ -8271,7 +8271,7 @@
         <w:pStyle w:val="Heading2"/>
       </w:pPr>
       <w:bookmarkStart w:id="42" w:name="b10-cài-đặt-và-vận-hành"/>
-      <w:bookmarkStart w:id="43" w:name="_Toc243915781"/>
+      <w:bookmarkStart w:id="43" w:name="_Toc243919617"/>
       <w:bookmarkEnd w:id="40"/>
       <w:r>
         <w:t>10. Cài đặt và vận hành</w:t>
@@ -8390,7 +8390,7 @@
         <w:pageBreakBefore/>
       </w:pPr>
       <w:bookmarkStart w:id="44" w:name="b11-giới-hạn-và-hướng-tiếp"/>
-      <w:bookmarkStart w:id="45" w:name="_Toc243915782"/>
+      <w:bookmarkStart w:id="45" w:name="_Toc243919618"/>
       <w:bookmarkEnd w:id="42"/>
       <w:r>
         <w:lastRenderedPageBreak/>
@@ -8480,7 +8480,7 @@
         <w:pageBreakBefore/>
       </w:pPr>
       <w:bookmarkStart w:id="46" w:name="phần-c-hướng-dẫn-demo-từng-bước"/>
-      <w:bookmarkStart w:id="47" w:name="_Toc243915783"/>
+      <w:bookmarkStart w:id="47" w:name="_Toc243919619"/>
       <w:bookmarkEnd w:id="44"/>
       <w:bookmarkEnd w:id="22"/>
       <w:r>
@@ -8499,7 +8499,7 @@
         <w:pStyle w:val="Heading2"/>
       </w:pPr>
       <w:bookmarkStart w:id="48" w:name="c1-khách-xem-giải"/>
-      <w:bookmarkStart w:id="49" w:name="_Toc243915784"/>
+      <w:bookmarkStart w:id="49" w:name="_Toc243919620"/>
       <w:r>
         <w:t>1. Khách xem giải</w:t>
       </w:r>
@@ -8510,7 +8510,7 @@
         <w:pStyle w:val="Heading3"/>
       </w:pPr>
       <w:bookmarkStart w:id="50" w:name="bước-1-mở-giải-công-khai"/>
-      <w:bookmarkStart w:id="51" w:name="_Toc243915785"/>
+      <w:bookmarkStart w:id="51" w:name="_Toc243919621"/>
       <w:r>
         <w:t>Bước 1. Mở giải công khai</w:t>
       </w:r>
@@ -8598,7 +8598,7 @@
         <w:pStyle w:val="Heading3"/>
       </w:pPr>
       <w:bookmarkStart w:id="52" w:name="bước-2-xem-bảng-điểm-và-ma-trận"/>
-      <w:bookmarkStart w:id="53" w:name="_Toc243915786"/>
+      <w:bookmarkStart w:id="53" w:name="_Toc243919622"/>
       <w:bookmarkEnd w:id="50"/>
       <w:r>
         <w:t>Bước 2. Xem bảng điểm và ma trận</w:t>
@@ -8708,7 +8708,7 @@
         <w:pageBreakBefore/>
       </w:pPr>
       <w:bookmarkStart w:id="54" w:name="bước-3-xem-lại-từng-nước"/>
-      <w:bookmarkStart w:id="55" w:name="_Toc243915787"/>
+      <w:bookmarkStart w:id="55" w:name="_Toc243919623"/>
       <w:bookmarkEnd w:id="52"/>
       <w:r>
         <w:lastRenderedPageBreak/>
@@ -8718,27 +8718,7 @@
     </w:p>
     <w:p>
       <w:r>
-        <w:t xml:space="preserve">Mở replay từ một kết quả, bấm </w:t>
-      </w:r>
-      <w:r>
-        <w:rPr>
-          <w:b/>
-          <w:bCs/>
-        </w:rPr>
-        <w:t>Sau</w:t>
-      </w:r>
-      <w:r>
-        <w:t xml:space="preserve"> để đi một nước hoặc </w:t>
-      </w:r>
-      <w:r>
-        <w:rPr>
-          <w:b/>
-          <w:bCs/>
-        </w:rPr>
-        <w:t>Phát replay</w:t>
-      </w:r>
-      <w:r>
-        <w:t xml:space="preserve"> để xem liên tục. Nhãn trên đầu trang và đồng hồ đều thể hiện quỹ 10 giây của giải Elo này.</w:t>
+        <w:t>Mở replay từ một kết quả, bấm Sau để đi một nước hoặc Phát replay để xem liên tục. Đầu trang ghi thể thức và quỹ thời gian của mỗi bot cho cả ván. Khi còn dưới một phút, đồng hồ hiển thị đến 0,01 giây; mỗi nước có thêm thời gian bot đã nghĩ.</w:t>
       </w:r>
     </w:p>
     <w:p>
@@ -8752,7 +8732,7 @@
         </w:rPr>
         <w:drawing>
           <wp:inline distT="0" distB="0" distL="0" distR="0" wp14:anchorId="034B94AE" wp14:editId="05938A77">
-            <wp:extent cx="4297381" cy="5400000"/>
+            <wp:extent cx="4297381" cy="5399998"/>
             <wp:effectExtent l="0" t="0" r="0" b="0"/>
             <wp:docPr id="73" name="Picture" descr="Hình 9 Xem lại từng nước"/>
             <wp:cNvGraphicFramePr/>
@@ -8774,7 +8754,7 @@
                   <pic:spPr bwMode="auto">
                     <a:xfrm>
                       <a:off x="0" y="0"/>
-                      <a:ext cx="4297381" cy="5400000"/>
+                      <a:ext cx="4297381" cy="5399998"/>
                     </a:xfrm>
                     <a:prstGeom prst="rect">
                       <a:avLst/>
@@ -8809,7 +8789,7 @@
         <w:pageBreakBefore/>
       </w:pPr>
       <w:bookmarkStart w:id="56" w:name="c2-thí-sinh-đăng-ký-và-nộp-bot"/>
-      <w:bookmarkStart w:id="57" w:name="_Toc243915788"/>
+      <w:bookmarkStart w:id="57" w:name="_Toc243919624"/>
       <w:bookmarkEnd w:id="54"/>
       <w:bookmarkEnd w:id="48"/>
       <w:r>
@@ -8822,7 +8802,7 @@
       <w:pPr>
         <w:pStyle w:val="Heading3"/>
       </w:pPr>
-      <w:bookmarkStart w:id="58" w:name="_Toc243915789"/>
+      <w:bookmarkStart w:id="58" w:name="_Toc243919625"/>
       <w:r>
         <w:t>Bước 4. Đăng ký bằng email trường</w:t>
       </w:r>
@@ -8923,7 +8903,7 @@
         <w:pStyle w:val="Heading3"/>
         <w:pageBreakBefore/>
       </w:pPr>
-      <w:bookmarkStart w:id="59" w:name="_Toc243915790"/>
+      <w:bookmarkStart w:id="59" w:name="_Toc243919626"/>
       <w:r>
         <w:lastRenderedPageBreak/>
         <w:t>Bước 5. Mở email lấy mã</w:t>
@@ -9006,7 +8986,7 @@
         <w:pStyle w:val="Heading3"/>
         <w:pageBreakBefore/>
       </w:pPr>
-      <w:bookmarkStart w:id="60" w:name="_Toc243915791"/>
+      <w:bookmarkStart w:id="60" w:name="_Toc243919627"/>
       <w:r>
         <w:lastRenderedPageBreak/>
         <w:t>Bước 6. Xác minh email</w:t>
@@ -9098,7 +9078,7 @@
         <w:pStyle w:val="Heading3"/>
         <w:pageBreakBefore/>
       </w:pPr>
-      <w:bookmarkStart w:id="61" w:name="_Toc243915792"/>
+      <w:bookmarkStart w:id="61" w:name="_Toc243919628"/>
       <w:r>
         <w:lastRenderedPageBreak/>
         <w:t>Bước 7. Đặt mật khẩu và đăng nhập</w:t>
@@ -9189,7 +9169,7 @@
       <w:pPr>
         <w:pStyle w:val="Heading3"/>
       </w:pPr>
-      <w:bookmarkStart w:id="62" w:name="_Toc243915793"/>
+      <w:bookmarkStart w:id="62" w:name="_Toc243919629"/>
       <w:r>
         <w:t>Bước 8. Tạo đội</w:t>
       </w:r>
@@ -9287,7 +9267,7 @@
         <w:pStyle w:val="Heading3"/>
         <w:pageBreakBefore/>
       </w:pPr>
-      <w:bookmarkStart w:id="63" w:name="_Toc243915794"/>
+      <w:bookmarkStart w:id="63" w:name="_Toc243919630"/>
       <w:r>
         <w:lastRenderedPageBreak/>
         <w:t>Bước 9. Mời các thành viên</w:t>
@@ -9375,7 +9355,7 @@
       <w:pPr>
         <w:pStyle w:val="Heading3"/>
       </w:pPr>
-      <w:bookmarkStart w:id="64" w:name="_Toc243915795"/>
+      <w:bookmarkStart w:id="64" w:name="_Toc243919631"/>
       <w:r>
         <w:t>Bước 10. Vào đội bằng mã mời</w:t>
       </w:r>
@@ -9463,7 +9443,7 @@
         <w:pStyle w:val="Heading3"/>
         <w:pageBreakBefore/>
       </w:pPr>
-      <w:bookmarkStart w:id="65" w:name="_Toc243915796"/>
+      <w:bookmarkStart w:id="65" w:name="_Toc243919632"/>
       <w:r>
         <w:lastRenderedPageBreak/>
         <w:t>Bước 11. Tạo repo từ mẫu</w:t>
@@ -9551,7 +9531,7 @@
       <w:pPr>
         <w:pStyle w:val="Heading3"/>
       </w:pPr>
-      <w:bookmarkStart w:id="66" w:name="_Toc243915797"/>
+      <w:bookmarkStart w:id="66" w:name="_Toc243919633"/>
       <w:r>
         <w:t>Bước 12. Cho App truy cập đúng repo</w:t>
       </w:r>
@@ -9649,7 +9629,7 @@
         <w:pStyle w:val="Heading3"/>
         <w:pageBreakBefore/>
       </w:pPr>
-      <w:bookmarkStart w:id="67" w:name="_Toc243915798"/>
+      <w:bookmarkStart w:id="67" w:name="_Toc243919634"/>
       <w:r>
         <w:lastRenderedPageBreak/>
         <w:t>Bước 13. Gắn link repo với đội</w:t>
@@ -9747,7 +9727,7 @@
       <w:pPr>
         <w:pStyle w:val="Heading3"/>
       </w:pPr>
-      <w:bookmarkStart w:id="68" w:name="_Toc243915799"/>
+      <w:bookmarkStart w:id="68" w:name="_Toc243919635"/>
       <w:r>
         <w:t>Bước 14. Theo dõi kiểm tra 72 mẫu</w:t>
       </w:r>
@@ -9885,7 +9865,7 @@
         <w:pStyle w:val="Heading3"/>
         <w:pageBreakBefore/>
       </w:pPr>
-      <w:bookmarkStart w:id="69" w:name="_Toc243915800"/>
+      <w:bookmarkStart w:id="69" w:name="_Toc243919636"/>
       <w:r>
         <w:lastRenderedPageBreak/>
         <w:t>Bước 15. Xem giải của đội</w:t>
@@ -10003,7 +9983,7 @@
       <w:pPr>
         <w:pStyle w:val="Heading3"/>
       </w:pPr>
-      <w:bookmarkStart w:id="70" w:name="_Toc243915801"/>
+      <w:bookmarkStart w:id="70" w:name="_Toc243919637"/>
       <w:r>
         <w:t>Bước 16. Luyện tập với bot mẫu</w:t>
       </w:r>
@@ -10112,7 +10092,7 @@
         <w:pageBreakBefore/>
       </w:pPr>
       <w:bookmarkStart w:id="71" w:name="c3-ban-tổ-chức-điều-hành"/>
-      <w:bookmarkStart w:id="72" w:name="_Toc243915802"/>
+      <w:bookmarkStart w:id="72" w:name="_Toc243919638"/>
       <w:bookmarkEnd w:id="56"/>
       <w:r>
         <w:lastRenderedPageBreak/>
@@ -10124,7 +10104,7 @@
       <w:pPr>
         <w:pStyle w:val="Heading3"/>
       </w:pPr>
-      <w:bookmarkStart w:id="73" w:name="_Toc243915803"/>
+      <w:bookmarkStart w:id="73" w:name="_Toc243919639"/>
       <w:r>
         <w:t>Bước 17. Xem tổng quan ban tổ chức</w:t>
       </w:r>
@@ -10202,7 +10182,7 @@
         <w:pStyle w:val="Heading3"/>
         <w:pageBreakBefore/>
       </w:pPr>
-      <w:bookmarkStart w:id="74" w:name="_Toc243915804"/>
+      <w:bookmarkStart w:id="74" w:name="_Toc243919640"/>
       <w:r>
         <w:lastRenderedPageBreak/>
         <w:t>Bước 18. Chọn giải ở Tổng quan</w:t>
@@ -10321,7 +10301,7 @@
         <w:pStyle w:val="Heading3"/>
         <w:pageBreakBefore/>
       </w:pPr>
-      <w:bookmarkStart w:id="75" w:name="_Toc243915805"/>
+      <w:bookmarkStart w:id="75" w:name="_Toc243919641"/>
       <w:r>
         <w:lastRenderedPageBreak/>
         <w:t>Bước 19. Chuẩn bị giải mới</w:t>
@@ -10409,7 +10389,7 @@
       <w:pPr>
         <w:pStyle w:val="Heading3"/>
       </w:pPr>
-      <w:bookmarkStart w:id="76" w:name="_Toc243915806"/>
+      <w:bookmarkStart w:id="76" w:name="_Toc243919642"/>
       <w:r>
         <w:t>Bước 20. Cài máy chấm Windows hoặc Linux</w:t>
       </w:r>
@@ -10517,7 +10497,7 @@
         <w:pStyle w:val="Heading3"/>
         <w:pageBreakBefore/>
       </w:pPr>
-      <w:bookmarkStart w:id="77" w:name="_Toc243915807"/>
+      <w:bookmarkStart w:id="77" w:name="_Toc243919643"/>
       <w:r>
         <w:lastRenderedPageBreak/>
         <w:t>Bước 21. Kiểm tình trạng chấm và hàng đợi</w:t>
@@ -10605,7 +10585,7 @@
       <w:pPr>
         <w:pStyle w:val="Heading3"/>
       </w:pPr>
-      <w:bookmarkStart w:id="78" w:name="_Toc243915808"/>
+      <w:bookmarkStart w:id="78" w:name="_Toc243919644"/>
       <w:r>
         <w:t>Bước 22. Soạn thông báo</w:t>
       </w:r>
@@ -10703,7 +10683,7 @@
         <w:pStyle w:val="Heading3"/>
         <w:pageBreakBefore/>
       </w:pPr>
-      <w:bookmarkStart w:id="79" w:name="_Toc243915809"/>
+      <w:bookmarkStart w:id="79" w:name="_Toc243919645"/>
       <w:r>
         <w:lastRenderedPageBreak/>
         <w:t>Bước 23. Xuất bảng điểm CSV</w:t>

</xml_diff>

<commit_message>
Giải thích thời gian ladder và các mốc mở đợt
</commit_message>
<xml_diff>
--- a/TAI-LIEU.docx
+++ b/TAI-LIEU.docx
@@ -314,7 +314,7 @@
           <w:r>
             <w:fldChar w:fldCharType="separate"/>
           </w:r>
-          <w:hyperlink w:anchor="_Toc243919596" w:history="1">
+          <w:hyperlink w:anchor="_Toc243920845" w:history="1">
             <w:r>
               <w:rPr>
                 <w:rStyle w:val="Hyperlink"/>
@@ -341,7 +341,7 @@
                 <w:noProof/>
                 <w:webHidden/>
               </w:rPr>
-              <w:instrText xml:space="preserve"> PAGEREF _Toc243919596 \h </w:instrText>
+              <w:instrText xml:space="preserve"> PAGEREF _Toc243920845 \h </w:instrText>
             </w:r>
             <w:r>
               <w:rPr>
@@ -388,7 +388,7 @@
               <w14:ligatures w14:val="standardContextual"/>
             </w:rPr>
           </w:pPr>
-          <w:hyperlink w:anchor="_Toc243919597" w:history="1">
+          <w:hyperlink w:anchor="_Toc243920846" w:history="1">
             <w:r>
               <w:rPr>
                 <w:rStyle w:val="Hyperlink"/>
@@ -415,7 +415,7 @@
                 <w:noProof/>
                 <w:webHidden/>
               </w:rPr>
-              <w:instrText xml:space="preserve"> PAGEREF _Toc243919597 \h </w:instrText>
+              <w:instrText xml:space="preserve"> PAGEREF _Toc243920846 \h </w:instrText>
             </w:r>
             <w:r>
               <w:rPr>
@@ -462,7 +462,7 @@
               <w14:ligatures w14:val="standardContextual"/>
             </w:rPr>
           </w:pPr>
-          <w:hyperlink w:anchor="_Toc243919598" w:history="1">
+          <w:hyperlink w:anchor="_Toc243920847" w:history="1">
             <w:r>
               <w:rPr>
                 <w:rStyle w:val="Hyperlink"/>
@@ -489,7 +489,7 @@
                 <w:noProof/>
                 <w:webHidden/>
               </w:rPr>
-              <w:instrText xml:space="preserve"> PAGEREF _Toc243919598 \h </w:instrText>
+              <w:instrText xml:space="preserve"> PAGEREF _Toc243920847 \h </w:instrText>
             </w:r>
             <w:r>
               <w:rPr>
@@ -536,7 +536,7 @@
               <w14:ligatures w14:val="standardContextual"/>
             </w:rPr>
           </w:pPr>
-          <w:hyperlink w:anchor="_Toc243919599" w:history="1">
+          <w:hyperlink w:anchor="_Toc243920848" w:history="1">
             <w:r>
               <w:rPr>
                 <w:rStyle w:val="Hyperlink"/>
@@ -563,7 +563,7 @@
                 <w:noProof/>
                 <w:webHidden/>
               </w:rPr>
-              <w:instrText xml:space="preserve"> PAGEREF _Toc243919599 \h </w:instrText>
+              <w:instrText xml:space="preserve"> PAGEREF _Toc243920848 \h </w:instrText>
             </w:r>
             <w:r>
               <w:rPr>
@@ -610,7 +610,7 @@
               <w14:ligatures w14:val="standardContextual"/>
             </w:rPr>
           </w:pPr>
-          <w:hyperlink w:anchor="_Toc243919600" w:history="1">
+          <w:hyperlink w:anchor="_Toc243920849" w:history="1">
             <w:r>
               <w:rPr>
                 <w:rStyle w:val="Hyperlink"/>
@@ -637,7 +637,7 @@
                 <w:noProof/>
                 <w:webHidden/>
               </w:rPr>
-              <w:instrText xml:space="preserve"> PAGEREF _Toc243919600 \h </w:instrText>
+              <w:instrText xml:space="preserve"> PAGEREF _Toc243920849 \h </w:instrText>
             </w:r>
             <w:r>
               <w:rPr>
@@ -684,7 +684,7 @@
               <w14:ligatures w14:val="standardContextual"/>
             </w:rPr>
           </w:pPr>
-          <w:hyperlink w:anchor="_Toc243919601" w:history="1">
+          <w:hyperlink w:anchor="_Toc243920850" w:history="1">
             <w:r>
               <w:rPr>
                 <w:rStyle w:val="Hyperlink"/>
@@ -711,7 +711,7 @@
                 <w:noProof/>
                 <w:webHidden/>
               </w:rPr>
-              <w:instrText xml:space="preserve"> PAGEREF _Toc243919601 \h </w:instrText>
+              <w:instrText xml:space="preserve"> PAGEREF _Toc243920850 \h </w:instrText>
             </w:r>
             <w:r>
               <w:rPr>
@@ -758,7 +758,7 @@
               <w14:ligatures w14:val="standardContextual"/>
             </w:rPr>
           </w:pPr>
-          <w:hyperlink w:anchor="_Toc243919602" w:history="1">
+          <w:hyperlink w:anchor="_Toc243920851" w:history="1">
             <w:r>
               <w:rPr>
                 <w:rStyle w:val="Hyperlink"/>
@@ -785,7 +785,7 @@
                 <w:noProof/>
                 <w:webHidden/>
               </w:rPr>
-              <w:instrText xml:space="preserve"> PAGEREF _Toc243919602 \h </w:instrText>
+              <w:instrText xml:space="preserve"> PAGEREF _Toc243920851 \h </w:instrText>
             </w:r>
             <w:r>
               <w:rPr>
@@ -832,7 +832,7 @@
               <w14:ligatures w14:val="standardContextual"/>
             </w:rPr>
           </w:pPr>
-          <w:hyperlink w:anchor="_Toc243919603" w:history="1">
+          <w:hyperlink w:anchor="_Toc243920852" w:history="1">
             <w:r>
               <w:rPr>
                 <w:rStyle w:val="Hyperlink"/>
@@ -859,7 +859,7 @@
                 <w:noProof/>
                 <w:webHidden/>
               </w:rPr>
-              <w:instrText xml:space="preserve"> PAGEREF _Toc243919603 \h </w:instrText>
+              <w:instrText xml:space="preserve"> PAGEREF _Toc243920852 \h </w:instrText>
             </w:r>
             <w:r>
               <w:rPr>
@@ -879,7 +879,7 @@
                 <w:noProof/>
                 <w:webHidden/>
               </w:rPr>
-              <w:t>7</w:t>
+              <w:t>8</w:t>
             </w:r>
             <w:r>
               <w:rPr>
@@ -906,7 +906,7 @@
               <w14:ligatures w14:val="standardContextual"/>
             </w:rPr>
           </w:pPr>
-          <w:hyperlink w:anchor="_Toc243919604" w:history="1">
+          <w:hyperlink w:anchor="_Toc243920853" w:history="1">
             <w:r>
               <w:rPr>
                 <w:rStyle w:val="Hyperlink"/>
@@ -933,7 +933,7 @@
                 <w:noProof/>
                 <w:webHidden/>
               </w:rPr>
-              <w:instrText xml:space="preserve"> PAGEREF _Toc243919604 \h </w:instrText>
+              <w:instrText xml:space="preserve"> PAGEREF _Toc243920853 \h </w:instrText>
             </w:r>
             <w:r>
               <w:rPr>
@@ -980,7 +980,7 @@
               <w14:ligatures w14:val="standardContextual"/>
             </w:rPr>
           </w:pPr>
-          <w:hyperlink w:anchor="_Toc243919605" w:history="1">
+          <w:hyperlink w:anchor="_Toc243920854" w:history="1">
             <w:r>
               <w:rPr>
                 <w:rStyle w:val="Hyperlink"/>
@@ -1007,7 +1007,7 @@
                 <w:noProof/>
                 <w:webHidden/>
               </w:rPr>
-              <w:instrText xml:space="preserve"> PAGEREF _Toc243919605 \h </w:instrText>
+              <w:instrText xml:space="preserve"> PAGEREF _Toc243920854 \h </w:instrText>
             </w:r>
             <w:r>
               <w:rPr>
@@ -1054,7 +1054,7 @@
               <w14:ligatures w14:val="standardContextual"/>
             </w:rPr>
           </w:pPr>
-          <w:hyperlink w:anchor="_Toc243919606" w:history="1">
+          <w:hyperlink w:anchor="_Toc243920855" w:history="1">
             <w:r>
               <w:rPr>
                 <w:rStyle w:val="Hyperlink"/>
@@ -1081,7 +1081,7 @@
                 <w:noProof/>
                 <w:webHidden/>
               </w:rPr>
-              <w:instrText xml:space="preserve"> PAGEREF _Toc243919606 \h </w:instrText>
+              <w:instrText xml:space="preserve"> PAGEREF _Toc243920855 \h </w:instrText>
             </w:r>
             <w:r>
               <w:rPr>
@@ -1128,7 +1128,7 @@
               <w14:ligatures w14:val="standardContextual"/>
             </w:rPr>
           </w:pPr>
-          <w:hyperlink w:anchor="_Toc243919607" w:history="1">
+          <w:hyperlink w:anchor="_Toc243920856" w:history="1">
             <w:r>
               <w:rPr>
                 <w:rStyle w:val="Hyperlink"/>
@@ -1155,7 +1155,7 @@
                 <w:noProof/>
                 <w:webHidden/>
               </w:rPr>
-              <w:instrText xml:space="preserve"> PAGEREF _Toc243919607 \h </w:instrText>
+              <w:instrText xml:space="preserve"> PAGEREF _Toc243920856 \h </w:instrText>
             </w:r>
             <w:r>
               <w:rPr>
@@ -1202,7 +1202,7 @@
               <w14:ligatures w14:val="standardContextual"/>
             </w:rPr>
           </w:pPr>
-          <w:hyperlink w:anchor="_Toc243919608" w:history="1">
+          <w:hyperlink w:anchor="_Toc243920857" w:history="1">
             <w:r>
               <w:rPr>
                 <w:rStyle w:val="Hyperlink"/>
@@ -1229,7 +1229,7 @@
                 <w:noProof/>
                 <w:webHidden/>
               </w:rPr>
-              <w:instrText xml:space="preserve"> PAGEREF _Toc243919608 \h </w:instrText>
+              <w:instrText xml:space="preserve"> PAGEREF _Toc243920857 \h </w:instrText>
             </w:r>
             <w:r>
               <w:rPr>
@@ -1276,7 +1276,7 @@
               <w14:ligatures w14:val="standardContextual"/>
             </w:rPr>
           </w:pPr>
-          <w:hyperlink w:anchor="_Toc243919609" w:history="1">
+          <w:hyperlink w:anchor="_Toc243920858" w:history="1">
             <w:r>
               <w:rPr>
                 <w:rStyle w:val="Hyperlink"/>
@@ -1303,7 +1303,7 @@
                 <w:noProof/>
                 <w:webHidden/>
               </w:rPr>
-              <w:instrText xml:space="preserve"> PAGEREF _Toc243919609 \h </w:instrText>
+              <w:instrText xml:space="preserve"> PAGEREF _Toc243920858 \h </w:instrText>
             </w:r>
             <w:r>
               <w:rPr>
@@ -1350,7 +1350,7 @@
               <w14:ligatures w14:val="standardContextual"/>
             </w:rPr>
           </w:pPr>
-          <w:hyperlink w:anchor="_Toc243919610" w:history="1">
+          <w:hyperlink w:anchor="_Toc243920859" w:history="1">
             <w:r>
               <w:rPr>
                 <w:rStyle w:val="Hyperlink"/>
@@ -1377,7 +1377,7 @@
                 <w:noProof/>
                 <w:webHidden/>
               </w:rPr>
-              <w:instrText xml:space="preserve"> PAGEREF _Toc243919610 \h </w:instrText>
+              <w:instrText xml:space="preserve"> PAGEREF _Toc243920859 \h </w:instrText>
             </w:r>
             <w:r>
               <w:rPr>
@@ -1424,7 +1424,7 @@
               <w14:ligatures w14:val="standardContextual"/>
             </w:rPr>
           </w:pPr>
-          <w:hyperlink w:anchor="_Toc243919611" w:history="1">
+          <w:hyperlink w:anchor="_Toc243920860" w:history="1">
             <w:r>
               <w:rPr>
                 <w:rStyle w:val="Hyperlink"/>
@@ -1451,7 +1451,7 @@
                 <w:noProof/>
                 <w:webHidden/>
               </w:rPr>
-              <w:instrText xml:space="preserve"> PAGEREF _Toc243919611 \h </w:instrText>
+              <w:instrText xml:space="preserve"> PAGEREF _Toc243920860 \h </w:instrText>
             </w:r>
             <w:r>
               <w:rPr>
@@ -1498,7 +1498,7 @@
               <w14:ligatures w14:val="standardContextual"/>
             </w:rPr>
           </w:pPr>
-          <w:hyperlink w:anchor="_Toc243919612" w:history="1">
+          <w:hyperlink w:anchor="_Toc243920861" w:history="1">
             <w:r>
               <w:rPr>
                 <w:rStyle w:val="Hyperlink"/>
@@ -1525,7 +1525,7 @@
                 <w:noProof/>
                 <w:webHidden/>
               </w:rPr>
-              <w:instrText xml:space="preserve"> PAGEREF _Toc243919612 \h </w:instrText>
+              <w:instrText xml:space="preserve"> PAGEREF _Toc243920861 \h </w:instrText>
             </w:r>
             <w:r>
               <w:rPr>
@@ -1572,7 +1572,7 @@
               <w14:ligatures w14:val="standardContextual"/>
             </w:rPr>
           </w:pPr>
-          <w:hyperlink w:anchor="_Toc243919613" w:history="1">
+          <w:hyperlink w:anchor="_Toc243920862" w:history="1">
             <w:r>
               <w:rPr>
                 <w:rStyle w:val="Hyperlink"/>
@@ -1599,7 +1599,7 @@
                 <w:noProof/>
                 <w:webHidden/>
               </w:rPr>
-              <w:instrText xml:space="preserve"> PAGEREF _Toc243919613 \h </w:instrText>
+              <w:instrText xml:space="preserve"> PAGEREF _Toc243920862 \h </w:instrText>
             </w:r>
             <w:r>
               <w:rPr>
@@ -1646,7 +1646,7 @@
               <w14:ligatures w14:val="standardContextual"/>
             </w:rPr>
           </w:pPr>
-          <w:hyperlink w:anchor="_Toc243919614" w:history="1">
+          <w:hyperlink w:anchor="_Toc243920863" w:history="1">
             <w:r>
               <w:rPr>
                 <w:rStyle w:val="Hyperlink"/>
@@ -1673,7 +1673,7 @@
                 <w:noProof/>
                 <w:webHidden/>
               </w:rPr>
-              <w:instrText xml:space="preserve"> PAGEREF _Toc243919614 \h </w:instrText>
+              <w:instrText xml:space="preserve"> PAGEREF _Toc243920863 \h </w:instrText>
             </w:r>
             <w:r>
               <w:rPr>
@@ -1720,7 +1720,7 @@
               <w14:ligatures w14:val="standardContextual"/>
             </w:rPr>
           </w:pPr>
-          <w:hyperlink w:anchor="_Toc243919615" w:history="1">
+          <w:hyperlink w:anchor="_Toc243920864" w:history="1">
             <w:r>
               <w:rPr>
                 <w:rStyle w:val="Hyperlink"/>
@@ -1747,7 +1747,7 @@
                 <w:noProof/>
                 <w:webHidden/>
               </w:rPr>
-              <w:instrText xml:space="preserve"> PAGEREF _Toc243919615 \h </w:instrText>
+              <w:instrText xml:space="preserve"> PAGEREF _Toc243920864 \h </w:instrText>
             </w:r>
             <w:r>
               <w:rPr>
@@ -1794,7 +1794,7 @@
               <w14:ligatures w14:val="standardContextual"/>
             </w:rPr>
           </w:pPr>
-          <w:hyperlink w:anchor="_Toc243919616" w:history="1">
+          <w:hyperlink w:anchor="_Toc243920865" w:history="1">
             <w:r>
               <w:rPr>
                 <w:rStyle w:val="Hyperlink"/>
@@ -1821,7 +1821,7 @@
                 <w:noProof/>
                 <w:webHidden/>
               </w:rPr>
-              <w:instrText xml:space="preserve"> PAGEREF _Toc243919616 \h </w:instrText>
+              <w:instrText xml:space="preserve"> PAGEREF _Toc243920865 \h </w:instrText>
             </w:r>
             <w:r>
               <w:rPr>
@@ -1868,7 +1868,7 @@
               <w14:ligatures w14:val="standardContextual"/>
             </w:rPr>
           </w:pPr>
-          <w:hyperlink w:anchor="_Toc243919617" w:history="1">
+          <w:hyperlink w:anchor="_Toc243920866" w:history="1">
             <w:r>
               <w:rPr>
                 <w:rStyle w:val="Hyperlink"/>
@@ -1895,7 +1895,7 @@
                 <w:noProof/>
                 <w:webHidden/>
               </w:rPr>
-              <w:instrText xml:space="preserve"> PAGEREF _Toc243919617 \h </w:instrText>
+              <w:instrText xml:space="preserve"> PAGEREF _Toc243920866 \h </w:instrText>
             </w:r>
             <w:r>
               <w:rPr>
@@ -1942,7 +1942,7 @@
               <w14:ligatures w14:val="standardContextual"/>
             </w:rPr>
           </w:pPr>
-          <w:hyperlink w:anchor="_Toc243919618" w:history="1">
+          <w:hyperlink w:anchor="_Toc243920867" w:history="1">
             <w:r>
               <w:rPr>
                 <w:rStyle w:val="Hyperlink"/>
@@ -1969,7 +1969,7 @@
                 <w:noProof/>
                 <w:webHidden/>
               </w:rPr>
-              <w:instrText xml:space="preserve"> PAGEREF _Toc243919618 \h </w:instrText>
+              <w:instrText xml:space="preserve"> PAGEREF _Toc243920867 \h </w:instrText>
             </w:r>
             <w:r>
               <w:rPr>
@@ -2016,7 +2016,7 @@
               <w14:ligatures w14:val="standardContextual"/>
             </w:rPr>
           </w:pPr>
-          <w:hyperlink w:anchor="_Toc243919619" w:history="1">
+          <w:hyperlink w:anchor="_Toc243920868" w:history="1">
             <w:r>
               <w:rPr>
                 <w:rStyle w:val="Hyperlink"/>
@@ -2043,7 +2043,7 @@
                 <w:noProof/>
                 <w:webHidden/>
               </w:rPr>
-              <w:instrText xml:space="preserve"> PAGEREF _Toc243919619 \h </w:instrText>
+              <w:instrText xml:space="preserve"> PAGEREF _Toc243920868 \h </w:instrText>
             </w:r>
             <w:r>
               <w:rPr>
@@ -2090,7 +2090,7 @@
               <w14:ligatures w14:val="standardContextual"/>
             </w:rPr>
           </w:pPr>
-          <w:hyperlink w:anchor="_Toc243919620" w:history="1">
+          <w:hyperlink w:anchor="_Toc243920869" w:history="1">
             <w:r>
               <w:rPr>
                 <w:rStyle w:val="Hyperlink"/>
@@ -2117,7 +2117,7 @@
                 <w:noProof/>
                 <w:webHidden/>
               </w:rPr>
-              <w:instrText xml:space="preserve"> PAGEREF _Toc243919620 \h </w:instrText>
+              <w:instrText xml:space="preserve"> PAGEREF _Toc243920869 \h </w:instrText>
             </w:r>
             <w:r>
               <w:rPr>
@@ -2164,7 +2164,7 @@
               <w14:ligatures w14:val="standardContextual"/>
             </w:rPr>
           </w:pPr>
-          <w:hyperlink w:anchor="_Toc243919621" w:history="1">
+          <w:hyperlink w:anchor="_Toc243920870" w:history="1">
             <w:r>
               <w:rPr>
                 <w:rStyle w:val="Hyperlink"/>
@@ -2191,7 +2191,7 @@
                 <w:noProof/>
                 <w:webHidden/>
               </w:rPr>
-              <w:instrText xml:space="preserve"> PAGEREF _Toc243919621 \h </w:instrText>
+              <w:instrText xml:space="preserve"> PAGEREF _Toc243920870 \h </w:instrText>
             </w:r>
             <w:r>
               <w:rPr>
@@ -2238,7 +2238,7 @@
               <w14:ligatures w14:val="standardContextual"/>
             </w:rPr>
           </w:pPr>
-          <w:hyperlink w:anchor="_Toc243919622" w:history="1">
+          <w:hyperlink w:anchor="_Toc243920871" w:history="1">
             <w:r>
               <w:rPr>
                 <w:rStyle w:val="Hyperlink"/>
@@ -2265,7 +2265,7 @@
                 <w:noProof/>
                 <w:webHidden/>
               </w:rPr>
-              <w:instrText xml:space="preserve"> PAGEREF _Toc243919622 \h </w:instrText>
+              <w:instrText xml:space="preserve"> PAGEREF _Toc243920871 \h </w:instrText>
             </w:r>
             <w:r>
               <w:rPr>
@@ -2312,7 +2312,7 @@
               <w14:ligatures w14:val="standardContextual"/>
             </w:rPr>
           </w:pPr>
-          <w:hyperlink w:anchor="_Toc243919623" w:history="1">
+          <w:hyperlink w:anchor="_Toc243920872" w:history="1">
             <w:r>
               <w:rPr>
                 <w:rStyle w:val="Hyperlink"/>
@@ -2339,7 +2339,7 @@
                 <w:noProof/>
                 <w:webHidden/>
               </w:rPr>
-              <w:instrText xml:space="preserve"> PAGEREF _Toc243919623 \h </w:instrText>
+              <w:instrText xml:space="preserve"> PAGEREF _Toc243920872 \h </w:instrText>
             </w:r>
             <w:r>
               <w:rPr>
@@ -2386,7 +2386,7 @@
               <w14:ligatures w14:val="standardContextual"/>
             </w:rPr>
           </w:pPr>
-          <w:hyperlink w:anchor="_Toc243919624" w:history="1">
+          <w:hyperlink w:anchor="_Toc243920873" w:history="1">
             <w:r>
               <w:rPr>
                 <w:rStyle w:val="Hyperlink"/>
@@ -2413,7 +2413,7 @@
                 <w:noProof/>
                 <w:webHidden/>
               </w:rPr>
-              <w:instrText xml:space="preserve"> PAGEREF _Toc243919624 \h </w:instrText>
+              <w:instrText xml:space="preserve"> PAGEREF _Toc243920873 \h </w:instrText>
             </w:r>
             <w:r>
               <w:rPr>
@@ -2460,7 +2460,7 @@
               <w14:ligatures w14:val="standardContextual"/>
             </w:rPr>
           </w:pPr>
-          <w:hyperlink w:anchor="_Toc243919625" w:history="1">
+          <w:hyperlink w:anchor="_Toc243920874" w:history="1">
             <w:r>
               <w:rPr>
                 <w:rStyle w:val="Hyperlink"/>
@@ -2487,7 +2487,7 @@
                 <w:noProof/>
                 <w:webHidden/>
               </w:rPr>
-              <w:instrText xml:space="preserve"> PAGEREF _Toc243919625 \h </w:instrText>
+              <w:instrText xml:space="preserve"> PAGEREF _Toc243920874 \h </w:instrText>
             </w:r>
             <w:r>
               <w:rPr>
@@ -2534,7 +2534,7 @@
               <w14:ligatures w14:val="standardContextual"/>
             </w:rPr>
           </w:pPr>
-          <w:hyperlink w:anchor="_Toc243919626" w:history="1">
+          <w:hyperlink w:anchor="_Toc243920875" w:history="1">
             <w:r>
               <w:rPr>
                 <w:rStyle w:val="Hyperlink"/>
@@ -2561,7 +2561,7 @@
                 <w:noProof/>
                 <w:webHidden/>
               </w:rPr>
-              <w:instrText xml:space="preserve"> PAGEREF _Toc243919626 \h </w:instrText>
+              <w:instrText xml:space="preserve"> PAGEREF _Toc243920875 \h </w:instrText>
             </w:r>
             <w:r>
               <w:rPr>
@@ -2608,7 +2608,7 @@
               <w14:ligatures w14:val="standardContextual"/>
             </w:rPr>
           </w:pPr>
-          <w:hyperlink w:anchor="_Toc243919627" w:history="1">
+          <w:hyperlink w:anchor="_Toc243920876" w:history="1">
             <w:r>
               <w:rPr>
                 <w:rStyle w:val="Hyperlink"/>
@@ -2635,7 +2635,7 @@
                 <w:noProof/>
                 <w:webHidden/>
               </w:rPr>
-              <w:instrText xml:space="preserve"> PAGEREF _Toc243919627 \h </w:instrText>
+              <w:instrText xml:space="preserve"> PAGEREF _Toc243920876 \h </w:instrText>
             </w:r>
             <w:r>
               <w:rPr>
@@ -2682,7 +2682,7 @@
               <w14:ligatures w14:val="standardContextual"/>
             </w:rPr>
           </w:pPr>
-          <w:hyperlink w:anchor="_Toc243919628" w:history="1">
+          <w:hyperlink w:anchor="_Toc243920877" w:history="1">
             <w:r>
               <w:rPr>
                 <w:rStyle w:val="Hyperlink"/>
@@ -2709,7 +2709,7 @@
                 <w:noProof/>
                 <w:webHidden/>
               </w:rPr>
-              <w:instrText xml:space="preserve"> PAGEREF _Toc243919628 \h </w:instrText>
+              <w:instrText xml:space="preserve"> PAGEREF _Toc243920877 \h </w:instrText>
             </w:r>
             <w:r>
               <w:rPr>
@@ -2756,7 +2756,7 @@
               <w14:ligatures w14:val="standardContextual"/>
             </w:rPr>
           </w:pPr>
-          <w:hyperlink w:anchor="_Toc243919629" w:history="1">
+          <w:hyperlink w:anchor="_Toc243920878" w:history="1">
             <w:r>
               <w:rPr>
                 <w:rStyle w:val="Hyperlink"/>
@@ -2783,7 +2783,7 @@
                 <w:noProof/>
                 <w:webHidden/>
               </w:rPr>
-              <w:instrText xml:space="preserve"> PAGEREF _Toc243919629 \h </w:instrText>
+              <w:instrText xml:space="preserve"> PAGEREF _Toc243920878 \h </w:instrText>
             </w:r>
             <w:r>
               <w:rPr>
@@ -2830,7 +2830,7 @@
               <w14:ligatures w14:val="standardContextual"/>
             </w:rPr>
           </w:pPr>
-          <w:hyperlink w:anchor="_Toc243919630" w:history="1">
+          <w:hyperlink w:anchor="_Toc243920879" w:history="1">
             <w:r>
               <w:rPr>
                 <w:rStyle w:val="Hyperlink"/>
@@ -2857,7 +2857,7 @@
                 <w:noProof/>
                 <w:webHidden/>
               </w:rPr>
-              <w:instrText xml:space="preserve"> PAGEREF _Toc243919630 \h </w:instrText>
+              <w:instrText xml:space="preserve"> PAGEREF _Toc243920879 \h </w:instrText>
             </w:r>
             <w:r>
               <w:rPr>
@@ -2904,7 +2904,7 @@
               <w14:ligatures w14:val="standardContextual"/>
             </w:rPr>
           </w:pPr>
-          <w:hyperlink w:anchor="_Toc243919631" w:history="1">
+          <w:hyperlink w:anchor="_Toc243920880" w:history="1">
             <w:r>
               <w:rPr>
                 <w:rStyle w:val="Hyperlink"/>
@@ -2931,7 +2931,7 @@
                 <w:noProof/>
                 <w:webHidden/>
               </w:rPr>
-              <w:instrText xml:space="preserve"> PAGEREF _Toc243919631 \h </w:instrText>
+              <w:instrText xml:space="preserve"> PAGEREF _Toc243920880 \h </w:instrText>
             </w:r>
             <w:r>
               <w:rPr>
@@ -2978,7 +2978,7 @@
               <w14:ligatures w14:val="standardContextual"/>
             </w:rPr>
           </w:pPr>
-          <w:hyperlink w:anchor="_Toc243919632" w:history="1">
+          <w:hyperlink w:anchor="_Toc243920881" w:history="1">
             <w:r>
               <w:rPr>
                 <w:rStyle w:val="Hyperlink"/>
@@ -3005,7 +3005,7 @@
                 <w:noProof/>
                 <w:webHidden/>
               </w:rPr>
-              <w:instrText xml:space="preserve"> PAGEREF _Toc243919632 \h </w:instrText>
+              <w:instrText xml:space="preserve"> PAGEREF _Toc243920881 \h </w:instrText>
             </w:r>
             <w:r>
               <w:rPr>
@@ -3052,7 +3052,7 @@
               <w14:ligatures w14:val="standardContextual"/>
             </w:rPr>
           </w:pPr>
-          <w:hyperlink w:anchor="_Toc243919633" w:history="1">
+          <w:hyperlink w:anchor="_Toc243920882" w:history="1">
             <w:r>
               <w:rPr>
                 <w:rStyle w:val="Hyperlink"/>
@@ -3079,7 +3079,7 @@
                 <w:noProof/>
                 <w:webHidden/>
               </w:rPr>
-              <w:instrText xml:space="preserve"> PAGEREF _Toc243919633 \h </w:instrText>
+              <w:instrText xml:space="preserve"> PAGEREF _Toc243920882 \h </w:instrText>
             </w:r>
             <w:r>
               <w:rPr>
@@ -3126,7 +3126,7 @@
               <w14:ligatures w14:val="standardContextual"/>
             </w:rPr>
           </w:pPr>
-          <w:hyperlink w:anchor="_Toc243919634" w:history="1">
+          <w:hyperlink w:anchor="_Toc243920883" w:history="1">
             <w:r>
               <w:rPr>
                 <w:rStyle w:val="Hyperlink"/>
@@ -3153,7 +3153,7 @@
                 <w:noProof/>
                 <w:webHidden/>
               </w:rPr>
-              <w:instrText xml:space="preserve"> PAGEREF _Toc243919634 \h </w:instrText>
+              <w:instrText xml:space="preserve"> PAGEREF _Toc243920883 \h </w:instrText>
             </w:r>
             <w:r>
               <w:rPr>
@@ -3200,7 +3200,7 @@
               <w14:ligatures w14:val="standardContextual"/>
             </w:rPr>
           </w:pPr>
-          <w:hyperlink w:anchor="_Toc243919635" w:history="1">
+          <w:hyperlink w:anchor="_Toc243920884" w:history="1">
             <w:r>
               <w:rPr>
                 <w:rStyle w:val="Hyperlink"/>
@@ -3227,7 +3227,7 @@
                 <w:noProof/>
                 <w:webHidden/>
               </w:rPr>
-              <w:instrText xml:space="preserve"> PAGEREF _Toc243919635 \h </w:instrText>
+              <w:instrText xml:space="preserve"> PAGEREF _Toc243920884 \h </w:instrText>
             </w:r>
             <w:r>
               <w:rPr>
@@ -3274,7 +3274,7 @@
               <w14:ligatures w14:val="standardContextual"/>
             </w:rPr>
           </w:pPr>
-          <w:hyperlink w:anchor="_Toc243919636" w:history="1">
+          <w:hyperlink w:anchor="_Toc243920885" w:history="1">
             <w:r>
               <w:rPr>
                 <w:rStyle w:val="Hyperlink"/>
@@ -3301,7 +3301,7 @@
                 <w:noProof/>
                 <w:webHidden/>
               </w:rPr>
-              <w:instrText xml:space="preserve"> PAGEREF _Toc243919636 \h </w:instrText>
+              <w:instrText xml:space="preserve"> PAGEREF _Toc243920885 \h </w:instrText>
             </w:r>
             <w:r>
               <w:rPr>
@@ -3348,7 +3348,7 @@
               <w14:ligatures w14:val="standardContextual"/>
             </w:rPr>
           </w:pPr>
-          <w:hyperlink w:anchor="_Toc243919637" w:history="1">
+          <w:hyperlink w:anchor="_Toc243920886" w:history="1">
             <w:r>
               <w:rPr>
                 <w:rStyle w:val="Hyperlink"/>
@@ -3375,7 +3375,7 @@
                 <w:noProof/>
                 <w:webHidden/>
               </w:rPr>
-              <w:instrText xml:space="preserve"> PAGEREF _Toc243919637 \h </w:instrText>
+              <w:instrText xml:space="preserve"> PAGEREF _Toc243920886 \h </w:instrText>
             </w:r>
             <w:r>
               <w:rPr>
@@ -3422,7 +3422,7 @@
               <w14:ligatures w14:val="standardContextual"/>
             </w:rPr>
           </w:pPr>
-          <w:hyperlink w:anchor="_Toc243919638" w:history="1">
+          <w:hyperlink w:anchor="_Toc243920887" w:history="1">
             <w:r>
               <w:rPr>
                 <w:rStyle w:val="Hyperlink"/>
@@ -3449,7 +3449,7 @@
                 <w:noProof/>
                 <w:webHidden/>
               </w:rPr>
-              <w:instrText xml:space="preserve"> PAGEREF _Toc243919638 \h </w:instrText>
+              <w:instrText xml:space="preserve"> PAGEREF _Toc243920887 \h </w:instrText>
             </w:r>
             <w:r>
               <w:rPr>
@@ -3496,7 +3496,7 @@
               <w14:ligatures w14:val="standardContextual"/>
             </w:rPr>
           </w:pPr>
-          <w:hyperlink w:anchor="_Toc243919639" w:history="1">
+          <w:hyperlink w:anchor="_Toc243920888" w:history="1">
             <w:r>
               <w:rPr>
                 <w:rStyle w:val="Hyperlink"/>
@@ -3523,7 +3523,7 @@
                 <w:noProof/>
                 <w:webHidden/>
               </w:rPr>
-              <w:instrText xml:space="preserve"> PAGEREF _Toc243919639 \h </w:instrText>
+              <w:instrText xml:space="preserve"> PAGEREF _Toc243920888 \h </w:instrText>
             </w:r>
             <w:r>
               <w:rPr>
@@ -3570,7 +3570,7 @@
               <w14:ligatures w14:val="standardContextual"/>
             </w:rPr>
           </w:pPr>
-          <w:hyperlink w:anchor="_Toc243919640" w:history="1">
+          <w:hyperlink w:anchor="_Toc243920889" w:history="1">
             <w:r>
               <w:rPr>
                 <w:rStyle w:val="Hyperlink"/>
@@ -3597,7 +3597,7 @@
                 <w:noProof/>
                 <w:webHidden/>
               </w:rPr>
-              <w:instrText xml:space="preserve"> PAGEREF _Toc243919640 \h </w:instrText>
+              <w:instrText xml:space="preserve"> PAGEREF _Toc243920889 \h </w:instrText>
             </w:r>
             <w:r>
               <w:rPr>
@@ -3644,7 +3644,7 @@
               <w14:ligatures w14:val="standardContextual"/>
             </w:rPr>
           </w:pPr>
-          <w:hyperlink w:anchor="_Toc243919641" w:history="1">
+          <w:hyperlink w:anchor="_Toc243920890" w:history="1">
             <w:r>
               <w:rPr>
                 <w:rStyle w:val="Hyperlink"/>
@@ -3671,7 +3671,7 @@
                 <w:noProof/>
                 <w:webHidden/>
               </w:rPr>
-              <w:instrText xml:space="preserve"> PAGEREF _Toc243919641 \h </w:instrText>
+              <w:instrText xml:space="preserve"> PAGEREF _Toc243920890 \h </w:instrText>
             </w:r>
             <w:r>
               <w:rPr>
@@ -3718,7 +3718,7 @@
               <w14:ligatures w14:val="standardContextual"/>
             </w:rPr>
           </w:pPr>
-          <w:hyperlink w:anchor="_Toc243919642" w:history="1">
+          <w:hyperlink w:anchor="_Toc243920891" w:history="1">
             <w:r>
               <w:rPr>
                 <w:rStyle w:val="Hyperlink"/>
@@ -3745,7 +3745,7 @@
                 <w:noProof/>
                 <w:webHidden/>
               </w:rPr>
-              <w:instrText xml:space="preserve"> PAGEREF _Toc243919642 \h </w:instrText>
+              <w:instrText xml:space="preserve"> PAGEREF _Toc243920891 \h </w:instrText>
             </w:r>
             <w:r>
               <w:rPr>
@@ -3792,7 +3792,7 @@
               <w14:ligatures w14:val="standardContextual"/>
             </w:rPr>
           </w:pPr>
-          <w:hyperlink w:anchor="_Toc243919643" w:history="1">
+          <w:hyperlink w:anchor="_Toc243920892" w:history="1">
             <w:r>
               <w:rPr>
                 <w:rStyle w:val="Hyperlink"/>
@@ -3819,7 +3819,7 @@
                 <w:noProof/>
                 <w:webHidden/>
               </w:rPr>
-              <w:instrText xml:space="preserve"> PAGEREF _Toc243919643 \h </w:instrText>
+              <w:instrText xml:space="preserve"> PAGEREF _Toc243920892 \h </w:instrText>
             </w:r>
             <w:r>
               <w:rPr>
@@ -3866,7 +3866,7 @@
               <w14:ligatures w14:val="standardContextual"/>
             </w:rPr>
           </w:pPr>
-          <w:hyperlink w:anchor="_Toc243919644" w:history="1">
+          <w:hyperlink w:anchor="_Toc243920893" w:history="1">
             <w:r>
               <w:rPr>
                 <w:rStyle w:val="Hyperlink"/>
@@ -3893,7 +3893,7 @@
                 <w:noProof/>
                 <w:webHidden/>
               </w:rPr>
-              <w:instrText xml:space="preserve"> PAGEREF _Toc243919644 \h </w:instrText>
+              <w:instrText xml:space="preserve"> PAGEREF _Toc243920893 \h </w:instrText>
             </w:r>
             <w:r>
               <w:rPr>
@@ -3940,7 +3940,7 @@
               <w14:ligatures w14:val="standardContextual"/>
             </w:rPr>
           </w:pPr>
-          <w:hyperlink w:anchor="_Toc243919645" w:history="1">
+          <w:hyperlink w:anchor="_Toc243920894" w:history="1">
             <w:r>
               <w:rPr>
                 <w:rStyle w:val="Hyperlink"/>
@@ -3967,7 +3967,7 @@
                 <w:noProof/>
                 <w:webHidden/>
               </w:rPr>
-              <w:instrText xml:space="preserve"> PAGEREF _Toc243919645 \h </w:instrText>
+              <w:instrText xml:space="preserve"> PAGEREF _Toc243920894 \h </w:instrText>
             </w:r>
             <w:r>
               <w:rPr>
@@ -4011,7 +4011,7 @@
         <w:pageBreakBefore/>
       </w:pPr>
       <w:bookmarkStart w:id="0" w:name="mở-đầu"/>
-      <w:bookmarkStart w:id="1" w:name="_Toc243919596"/>
+      <w:bookmarkStart w:id="1" w:name="_Toc243920845"/>
       <w:r>
         <w:lastRenderedPageBreak/>
         <w:t>Mở đầu</w:t>
@@ -4077,7 +4077,7 @@
           <w:noProof/>
         </w:rPr>
         <w:drawing>
-          <wp:inline distT="0" distB="0" distL="0" distR="0" wp14:anchorId="61DF64C8" wp14:editId="522A32EF">
+          <wp:inline distT="0" distB="0" distL="0" distR="0" wp14:anchorId="291A4604" wp14:editId="6FFCD0BB">
             <wp:extent cx="5759999" cy="4391052"/>
             <wp:effectExtent l="0" t="0" r="0" b="0"/>
             <wp:docPr id="19" name="Picture" descr="Hình 1 Trang chủ công khai với hai giải demo đã hoàn tất"/>
@@ -4166,7 +4166,7 @@
         <w:pageBreakBefore/>
       </w:pPr>
       <w:bookmarkStart w:id="2" w:name="phần-a-giải-đấu"/>
-      <w:bookmarkStart w:id="3" w:name="_Toc243919597"/>
+      <w:bookmarkStart w:id="3" w:name="_Toc243920846"/>
       <w:bookmarkEnd w:id="0"/>
       <w:r>
         <w:lastRenderedPageBreak/>
@@ -4179,7 +4179,7 @@
         <w:pStyle w:val="Heading2"/>
       </w:pPr>
       <w:bookmarkStart w:id="4" w:name="a1-trò-chơi-ottv2"/>
-      <w:bookmarkStart w:id="5" w:name="_Toc243919598"/>
+      <w:bookmarkStart w:id="5" w:name="_Toc243920847"/>
       <w:r>
         <w:t>1. Trò chơi OTTv2</w:t>
       </w:r>
@@ -4460,7 +4460,7 @@
         <w:pStyle w:val="Heading2"/>
       </w:pPr>
       <w:bookmarkStart w:id="6" w:name="a2-tài-khoản-và-đội"/>
-      <w:bookmarkStart w:id="7" w:name="_Toc243919599"/>
+      <w:bookmarkStart w:id="7" w:name="_Toc243920848"/>
       <w:bookmarkEnd w:id="4"/>
       <w:r>
         <w:t>2. Tài khoản và đội</w:t>
@@ -4779,7 +4779,7 @@
         <w:pStyle w:val="Heading2"/>
       </w:pPr>
       <w:bookmarkStart w:id="8" w:name="a3-nộp-bot-qua-github"/>
-      <w:bookmarkStart w:id="9" w:name="_Toc243919600"/>
+      <w:bookmarkStart w:id="9" w:name="_Toc243920849"/>
       <w:bookmarkEnd w:id="6"/>
       <w:r>
         <w:t>3. Nộp bot qua GitHub</w:t>
@@ -5213,7 +5213,7 @@
         <w:pStyle w:val="Heading2"/>
       </w:pPr>
       <w:bookmarkStart w:id="10" w:name="a4-thể-lệ-và-lịch-đấu"/>
-      <w:bookmarkStart w:id="11" w:name="_Toc243919601"/>
+      <w:bookmarkStart w:id="11" w:name="_Toc243920850"/>
       <w:bookmarkEnd w:id="8"/>
       <w:r>
         <w:t>4. Thể lệ và lịch đấu</w:t>
@@ -5225,7 +5225,7 @@
         <w:pStyle w:val="Heading3"/>
       </w:pPr>
       <w:bookmarkStart w:id="12" w:name="ladder-trước-hạn"/>
-      <w:bookmarkStart w:id="13" w:name="_Toc243919602"/>
+      <w:bookmarkStart w:id="13" w:name="_Toc243920851"/>
       <w:r>
         <w:t>4.1. Ladder trước hạn</w:t>
       </w:r>
@@ -5233,7 +5233,425 @@
     </w:p>
     <w:p>
       <w:r>
-        <w:t>Ladder là giai đoạn thi đấu trước hạn nộp để đội quan sát sức mạnh của bot. Mặc định các đợt mở vào 00:00, 02:00 và các giờ chẵn tiếp theo theo giờ Việt Nam. Nếu đợt trước chưa xong, hệ thống bỏ mốc kế tiếp và chờ mốc cố định sau đó. Ban tổ chức có thể công bố khoảng giờ khác trong cấu hình giải trước khi mở.</w:t>
+        <w:t>Ladder là giai đoạn thi đấu trước hạn nộp để đội quan sát sức mạnh của bot. Ladder kéo dài từ lúc ban tổ chức bấm Mở giải tới hạn nộp. Ban tổ chức đặt hạn khi tạo giải và sửa được tới trước khi qua hạn. Sau hạn, hệ thống tự chạy xếp hạng chính thức như mục 9 phần B.</w:t>
+      </w:r>
+    </w:p>
+    <w:p>
+      <w:r>
+        <w:t>Ban t</w:t>
+      </w:r>
+      <w:r>
+        <w:t>ổ</w:t>
+      </w:r>
+      <w:r>
+        <w:t xml:space="preserve"> ch</w:t>
+      </w:r>
+      <w:r>
+        <w:t>ứ</w:t>
+      </w:r>
+      <w:r>
+        <w:t>c ch</w:t>
+      </w:r>
+      <w:r>
+        <w:t>ọ</w:t>
+      </w:r>
+      <w:r>
+        <w:t>n kho</w:t>
+      </w:r>
+      <w:r>
+        <w:t>ả</w:t>
+      </w:r>
+      <w:r>
+        <w:t>ng gi</w:t>
+      </w:r>
+      <w:r>
+        <w:t>ờ</w:t>
+      </w:r>
+      <w:r>
+        <w:t xml:space="preserve"> khi t</w:t>
+      </w:r>
+      <w:r>
+        <w:t>ạ</w:t>
+      </w:r>
+      <w:r>
+        <w:t>o gi</w:t>
+      </w:r>
+      <w:r>
+        <w:t>ả</w:t>
+      </w:r>
+      <w:r>
+        <w:t>i, t</w:t>
+      </w:r>
+      <w:r>
+        <w:t>ừ</w:t>
+      </w:r>
+      <w:r>
+        <w:t xml:space="preserve"> 1 đ</w:t>
+      </w:r>
+      <w:r>
+        <w:t>ế</w:t>
+      </w:r>
+      <w:r>
+        <w:t>n 24 gi</w:t>
+      </w:r>
+      <w:r>
+        <w:t>ờ</w:t>
+      </w:r>
+      <w:r>
+        <w:t>, m</w:t>
+      </w:r>
+      <w:r>
+        <w:t>ặ</w:t>
+      </w:r>
+      <w:r>
+        <w:t>c đ</w:t>
+      </w:r>
+      <w:r>
+        <w:t>ị</w:t>
+      </w:r>
+      <w:r>
+        <w:t>nh hai gi</w:t>
+      </w:r>
+      <w:r>
+        <w:t>ờ</w:t>
+      </w:r>
+      <w:r>
+        <w:t xml:space="preserve"> và c</w:t>
+      </w:r>
+      <w:r>
+        <w:t>ố</w:t>
+      </w:r>
+      <w:r>
+        <w:t xml:space="preserve"> đ</w:t>
+      </w:r>
+      <w:r>
+        <w:t>ị</w:t>
+      </w:r>
+      <w:r>
+        <w:t>nh su</w:t>
+      </w:r>
+      <w:r>
+        <w:t>ố</w:t>
+      </w:r>
+      <w:r>
+        <w:t>t gi</w:t>
+      </w:r>
+      <w:r>
+        <w:t>ả</w:t>
+      </w:r>
+      <w:r>
+        <w:t>i. M</w:t>
+      </w:r>
+      <w:r>
+        <w:t>ố</w:t>
+      </w:r>
+      <w:r>
+        <w:t>c tính t</w:t>
+      </w:r>
+      <w:r>
+        <w:t>ừ</w:t>
+      </w:r>
+      <w:r>
+        <w:t xml:space="preserve"> 0:00 gi</w:t>
+      </w:r>
+      <w:r>
+        <w:t>ờ</w:t>
+      </w:r>
+      <w:r>
+        <w:t xml:space="preserve"> Vi</w:t>
+      </w:r>
+      <w:r>
+        <w:t>ệ</w:t>
+      </w:r>
+      <w:r>
+        <w:t>t Nam m</w:t>
+      </w:r>
+      <w:r>
+        <w:t>ỗ</w:t>
+      </w:r>
+      <w:r>
+        <w:t>i ngày. V</w:t>
+      </w:r>
+      <w:r>
+        <w:t>ớ</w:t>
+      </w:r>
+      <w:r>
+        <w:t>i kho</w:t>
+      </w:r>
+      <w:r>
+        <w:t>ả</w:t>
+      </w:r>
+      <w:r>
+        <w:t>ng hai gi</w:t>
+      </w:r>
+      <w:r>
+        <w:t>ờ</w:t>
+      </w:r>
+      <w:r>
+        <w:t>, các đ</w:t>
+      </w:r>
+      <w:r>
+        <w:t>ợ</w:t>
+      </w:r>
+      <w:r>
+        <w:t>t m</w:t>
+      </w:r>
+      <w:r>
+        <w:t>ở</w:t>
+      </w:r>
+      <w:r>
+        <w:t xml:space="preserve"> lúc 00:00, 02:00, …, 22:00: 12 đ</w:t>
+      </w:r>
+      <w:r>
+        <w:t>ợ</w:t>
+      </w:r>
+      <w:r>
+        <w:t>t/ngày, m</w:t>
+      </w:r>
+      <w:r>
+        <w:t>ỗ</w:t>
+      </w:r>
+      <w:r>
+        <w:t>i đ</w:t>
+      </w:r>
+      <w:r>
+        <w:t>ộ</w:t>
+      </w:r>
+      <w:r>
+        <w:t>i 24 ván ladder/ngày; ladder 14 ngày có 168 đ</w:t>
+      </w:r>
+      <w:r>
+        <w:t>ợ</w:t>
+      </w:r>
+      <w:r>
+        <w:t>t. V</w:t>
+      </w:r>
+      <w:r>
+        <w:t>ớ</w:t>
+      </w:r>
+      <w:r>
+        <w:t>i kho</w:t>
+      </w:r>
+      <w:r>
+        <w:t>ả</w:t>
+      </w:r>
+      <w:r>
+        <w:t>ng ba gi</w:t>
+      </w:r>
+      <w:r>
+        <w:t>ờ</w:t>
+      </w:r>
+      <w:r>
+        <w:t>, các m</w:t>
+      </w:r>
+      <w:r>
+        <w:t>ố</w:t>
+      </w:r>
+      <w:r>
+        <w:t>c là 00:00, 03:00, …, 21:00: tám đ</w:t>
+      </w:r>
+      <w:r>
+        <w:t>ợ</w:t>
+      </w:r>
+      <w:r>
+        <w:t>t và 16 ván/ngày.</w:t>
+      </w:r>
+    </w:p>
+    <w:p>
+      <w:r>
+        <w:t>S</w:t>
+      </w:r>
+      <w:r>
+        <w:t>ố</w:t>
+      </w:r>
+      <w:r>
+        <w:t xml:space="preserve"> gi</w:t>
+      </w:r>
+      <w:r>
+        <w:t>ờ</w:t>
+      </w:r>
+      <w:r>
+        <w:t xml:space="preserve"> không chia h</w:t>
+      </w:r>
+      <w:r>
+        <w:t>ế</w:t>
+      </w:r>
+      <w:r>
+        <w:t>t 24 v</w:t>
+      </w:r>
+      <w:r>
+        <w:t>ẫ</w:t>
+      </w:r>
+      <w:r>
+        <w:t>n dùng đư</w:t>
+      </w:r>
+      <w:r>
+        <w:t>ợ</w:t>
+      </w:r>
+      <w:r>
+        <w:t>c. Ví d</w:t>
+      </w:r>
+      <w:r>
+        <w:t>ụ</w:t>
+      </w:r>
+      <w:r>
+        <w:t xml:space="preserve"> năm gi</w:t>
+      </w:r>
+      <w:r>
+        <w:t>ờ</w:t>
+      </w:r>
+      <w:r>
+        <w:t xml:space="preserve"> cho các m</w:t>
+      </w:r>
+      <w:r>
+        <w:t>ố</w:t>
+      </w:r>
+      <w:r>
+        <w:t>c 00:00, 05:00, 10:00, 15:00, 20:00; đ</w:t>
+      </w:r>
+      <w:r>
+        <w:t>ợ</w:t>
+      </w:r>
+      <w:r>
+        <w:t>t cu</w:t>
+      </w:r>
+      <w:r>
+        <w:t>ố</w:t>
+      </w:r>
+      <w:r>
+        <w:t>i ngày ch</w:t>
+      </w:r>
+      <w:r>
+        <w:t>ỉ</w:t>
+      </w:r>
+      <w:r>
+        <w:t xml:space="preserve"> cách m</w:t>
+      </w:r>
+      <w:r>
+        <w:t>ố</w:t>
+      </w:r>
+      <w:r>
+        <w:t>c k</w:t>
+      </w:r>
+      <w:r>
+        <w:t>ế</w:t>
+      </w:r>
+      <w:r>
+        <w:t xml:space="preserve"> ti</w:t>
+      </w:r>
+      <w:r>
+        <w:t>ế</w:t>
+      </w:r>
+      <w:r>
+        <w:t>p b</w:t>
+      </w:r>
+      <w:r>
+        <w:t>ố</w:t>
+      </w:r>
+      <w:r>
+        <w:t>n gi</w:t>
+      </w:r>
+      <w:r>
+        <w:t>ờ</w:t>
+      </w:r>
+      <w:r>
+        <w:t xml:space="preserve"> vì l</w:t>
+      </w:r>
+      <w:r>
+        <w:t>ị</w:t>
+      </w:r>
+      <w:r>
+        <w:t>ch tính l</w:t>
+      </w:r>
+      <w:r>
+        <w:t>ạ</w:t>
+      </w:r>
+      <w:r>
+        <w:t>i t</w:t>
+      </w:r>
+      <w:r>
+        <w:t>ừ</w:t>
+      </w:r>
+      <w:r>
+        <w:t xml:space="preserve"> 0:00. N</w:t>
+      </w:r>
+      <w:r>
+        <w:t>ế</w:t>
+      </w:r>
+      <w:r>
+        <w:t>u đ</w:t>
+      </w:r>
+      <w:r>
+        <w:t>ợ</w:t>
+      </w:r>
+      <w:r>
+        <w:t>t trư</w:t>
+      </w:r>
+      <w:r>
+        <w:t>ớ</w:t>
+      </w:r>
+      <w:r>
+        <w:t>c chưa xong, h</w:t>
+      </w:r>
+      <w:r>
+        <w:t>ệ</w:t>
+      </w:r>
+      <w:r>
+        <w:t xml:space="preserve"> th</w:t>
+      </w:r>
+      <w:r>
+        <w:t>ố</w:t>
+      </w:r>
+      <w:r>
+        <w:t>ng b</w:t>
+      </w:r>
+      <w:r>
+        <w:t>ỏ</w:t>
+      </w:r>
+      <w:r>
+        <w:t xml:space="preserve"> m</w:t>
+      </w:r>
+      <w:r>
+        <w:t>ố</w:t>
+      </w:r>
+      <w:r>
+        <w:t>c k</w:t>
+      </w:r>
+      <w:r>
+        <w:t>ế</w:t>
+      </w:r>
+      <w:r>
+        <w:t xml:space="preserve"> ti</w:t>
+      </w:r>
+      <w:r>
+        <w:t>ế</w:t>
+      </w:r>
+      <w:r>
+        <w:t>p và ch</w:t>
+      </w:r>
+      <w:r>
+        <w:t>ờ</w:t>
+      </w:r>
+      <w:r>
+        <w:t xml:space="preserve"> m</w:t>
+      </w:r>
+      <w:r>
+        <w:t>ố</w:t>
+      </w:r>
+      <w:r>
+        <w:t>c c</w:t>
+      </w:r>
+      <w:r>
+        <w:t>ố</w:t>
+      </w:r>
+      <w:r>
+        <w:t xml:space="preserve"> đ</w:t>
+      </w:r>
+      <w:r>
+        <w:t>ị</w:t>
+      </w:r>
+      <w:r>
+        <w:t>nh sau đó.</w:t>
       </w:r>
     </w:p>
     <w:p>
@@ -5275,9 +5693,10 @@
         <w:pStyle w:val="Heading3"/>
       </w:pPr>
       <w:bookmarkStart w:id="14" w:name="chốt-bài-tại-hạn"/>
-      <w:bookmarkStart w:id="15" w:name="_Toc243919603"/>
+      <w:bookmarkStart w:id="15" w:name="_Toc243920852"/>
       <w:bookmarkEnd w:id="12"/>
       <w:r>
+        <w:lastRenderedPageBreak/>
         <w:t>4.2. Chốt bài tại hạn</w:t>
       </w:r>
       <w:bookmarkEnd w:id="15"/>
@@ -5292,11 +5711,7 @@
         <w:pStyle w:val="BodyText"/>
       </w:pPr>
       <w:r>
-        <w:t xml:space="preserve">Push sau hạn, kể cả force-push, không thay bài đã chốt. Đội phải giữ repo riêng tư và quyền App tới khi hub đọc và khóa xong. Nếu GitHub không cung cấp được lịch sử push, nguồn dự phòng chỉ là gợi ý và </w:t>
-      </w:r>
-      <w:r>
-        <w:lastRenderedPageBreak/>
-        <w:t>cần ban tổ chức phê duyệt. Khi đã giải quyết các bản tại hạn và có đủ đội, hub tự chuyển sang xếp hạng chính thức.</w:t>
+        <w:t>Push sau hạn, kể cả force-push, không thay bài đã chốt. Đội phải giữ repo riêng tư và quyền App tới khi hub đọc và khóa xong. Nếu GitHub không cung cấp được lịch sử push, nguồn dự phòng chỉ là gợi ý và cần ban tổ chức phê duyệt. Khi đã giải quyết các bản tại hạn và có đủ đội, hub tự chuyển sang xếp hạng chính thức.</w:t>
       </w:r>
     </w:p>
     <w:p>
@@ -5304,7 +5719,7 @@
         <w:pStyle w:val="Heading3"/>
       </w:pPr>
       <w:bookmarkStart w:id="16" w:name="xếp-hạng-chính-thức"/>
-      <w:bookmarkStart w:id="17" w:name="_Toc243919604"/>
+      <w:bookmarkStart w:id="17" w:name="_Toc243920853"/>
       <w:bookmarkEnd w:id="14"/>
       <w:r>
         <w:t>4.3. Xếp hạng chính thức</w:t>
@@ -5655,7 +6070,7 @@
         <w:pStyle w:val="Heading2"/>
       </w:pPr>
       <w:bookmarkStart w:id="18" w:name="a5-xem-kết-quả"/>
-      <w:bookmarkStart w:id="19" w:name="_Toc243919605"/>
+      <w:bookmarkStart w:id="19" w:name="_Toc243920854"/>
       <w:bookmarkEnd w:id="16"/>
       <w:bookmarkEnd w:id="10"/>
       <w:r>
@@ -5679,7 +6094,7 @@
         </w:rPr>
         <w:lastRenderedPageBreak/>
         <w:drawing>
-          <wp:inline distT="0" distB="0" distL="0" distR="0" wp14:anchorId="37F0D257" wp14:editId="2CC23371">
+          <wp:inline distT="0" distB="0" distL="0" distR="0" wp14:anchorId="50E08880" wp14:editId="50E16600">
             <wp:extent cx="5759999" cy="5603684"/>
             <wp:effectExtent l="0" t="0" r="0" b="0"/>
             <wp:docPr id="35" name="Picture" descr="Hình 2 Bảng điểm vòng tròn của giải qua GitHub sau khi hoàn tất 12 ván"/>
@@ -5758,7 +6173,7 @@
         </w:rPr>
         <w:lastRenderedPageBreak/>
         <w:drawing>
-          <wp:inline distT="0" distB="0" distL="0" distR="0" wp14:anchorId="313C35BE" wp14:editId="6DE67CA2">
+          <wp:inline distT="0" distB="0" distL="0" distR="0" wp14:anchorId="7212DD1F" wp14:editId="58B9E745">
             <wp:extent cx="5579999" cy="7011709"/>
             <wp:effectExtent l="0" t="0" r="0" b="0"/>
             <wp:docPr id="38" name="Picture" descr="Hình 3 Replay một ván đã kết thúc bằng chiếm căn cứ"/>
@@ -5823,7 +6238,7 @@
         <w:pStyle w:val="Heading2"/>
       </w:pPr>
       <w:bookmarkStart w:id="20" w:name="a6-ban-tổ-chức-và-điều-hành"/>
-      <w:bookmarkStart w:id="21" w:name="_Toc243919606"/>
+      <w:bookmarkStart w:id="21" w:name="_Toc243920855"/>
       <w:bookmarkEnd w:id="18"/>
       <w:r>
         <w:t>6. Ban tổ chức và điều hành</w:t>
@@ -5854,7 +6269,7 @@
         </w:rPr>
         <w:lastRenderedPageBreak/>
         <w:drawing>
-          <wp:inline distT="0" distB="0" distL="0" distR="0" wp14:anchorId="3E483F0C" wp14:editId="74A79449">
+          <wp:inline distT="0" distB="0" distL="0" distR="0" wp14:anchorId="6EEA2964" wp14:editId="2842CDAD">
             <wp:extent cx="5759999" cy="3254999"/>
             <wp:effectExtent l="0" t="0" r="0" b="0"/>
             <wp:docPr id="42" name="Picture" descr="Hình 4 Phần chính của biểu mẫu tạo giải với các giá trị mặc định"/>
@@ -5944,7 +6359,7 @@
         <w:pageBreakBefore/>
       </w:pPr>
       <w:bookmarkStart w:id="22" w:name="phần-b-thiết-kế-kỹ-thuật"/>
-      <w:bookmarkStart w:id="23" w:name="_Toc243919607"/>
+      <w:bookmarkStart w:id="23" w:name="_Toc243920856"/>
       <w:bookmarkEnd w:id="20"/>
       <w:bookmarkEnd w:id="2"/>
       <w:r>
@@ -5958,7 +6373,7 @@
         <w:pStyle w:val="Heading2"/>
       </w:pPr>
       <w:bookmarkStart w:id="24" w:name="b1-kiến-trúc-tổng-thể"/>
-      <w:bookmarkStart w:id="25" w:name="_Toc243919608"/>
+      <w:bookmarkStart w:id="25" w:name="_Toc243920857"/>
       <w:r>
         <w:t>1. Kiến trúc tổng thể</w:t>
       </w:r>
@@ -5979,7 +6394,7 @@
           <w:noProof/>
         </w:rPr>
         <w:drawing>
-          <wp:inline distT="0" distB="0" distL="0" distR="0" wp14:anchorId="5BF0A80F" wp14:editId="3A6C24E3">
+          <wp:inline distT="0" distB="0" distL="0" distR="0" wp14:anchorId="25D93280" wp14:editId="18732B60">
             <wp:extent cx="5759999" cy="3702857"/>
             <wp:effectExtent l="0" t="0" r="0" b="0"/>
             <wp:docPr id="47" name="Picture" descr="Hình 5 Kiến trúc triển khai; các mũi tên biểu diễn kết nối hoặc yêu cầu giữa các thành phần"/>
@@ -6060,7 +6475,7 @@
         <w:pStyle w:val="Heading2"/>
       </w:pPr>
       <w:bookmarkStart w:id="26" w:name="b2-dịch-vụ-được-dùng"/>
-      <w:bookmarkStart w:id="27" w:name="_Toc243919609"/>
+      <w:bookmarkStart w:id="27" w:name="_Toc243920858"/>
       <w:bookmarkEnd w:id="24"/>
       <w:r>
         <w:lastRenderedPageBreak/>
@@ -6392,7 +6807,7 @@
         <w:pStyle w:val="Heading2"/>
       </w:pPr>
       <w:bookmarkStart w:id="28" w:name="b3-hub-và-cách-phục-vụ-dữ-liệu"/>
-      <w:bookmarkStart w:id="29" w:name="_Toc243919610"/>
+      <w:bookmarkStart w:id="29" w:name="_Toc243920859"/>
       <w:bookmarkEnd w:id="26"/>
       <w:r>
         <w:t>3. Hub và cách phục vụ dữ liệu</w:t>
@@ -6471,7 +6886,7 @@
         <w:pStyle w:val="Heading2"/>
       </w:pPr>
       <w:bookmarkStart w:id="30" w:name="b4-máy-chấm-và-chia-việc"/>
-      <w:bookmarkStart w:id="31" w:name="_Toc243919611"/>
+      <w:bookmarkStart w:id="31" w:name="_Toc243920860"/>
       <w:bookmarkEnd w:id="28"/>
       <w:r>
         <w:t>4. Máy chấm và chia việc</w:t>
@@ -6513,7 +6928,7 @@
           <w:noProof/>
         </w:rPr>
         <w:drawing>
-          <wp:inline distT="0" distB="0" distL="0" distR="0" wp14:anchorId="61CFDF58" wp14:editId="7EB82CB9">
+          <wp:inline distT="0" distB="0" distL="0" distR="0" wp14:anchorId="1553B14F" wp14:editId="46C5D65A">
             <wp:extent cx="5759999" cy="3543157"/>
             <wp:effectExtent l="0" t="0" r="0" b="0"/>
             <wp:docPr id="53" name="Picture" descr="Hình 6 Trang quản lý máy chấm trên web thật; tên máy được che, trạng thái phản ánh thời điểm chụp"/>
@@ -6594,7 +7009,7 @@
         <w:pStyle w:val="Heading2"/>
       </w:pPr>
       <w:bookmarkStart w:id="32" w:name="b5-sandbox-thay-docker"/>
-      <w:bookmarkStart w:id="33" w:name="_Toc243919612"/>
+      <w:bookmarkStart w:id="33" w:name="_Toc243920861"/>
       <w:bookmarkEnd w:id="30"/>
       <w:r>
         <w:t>5. Sandbox chạy bot</w:t>
@@ -6636,7 +7051,7 @@
         <w:pStyle w:val="Heading2"/>
       </w:pPr>
       <w:bookmarkStart w:id="34" w:name="b6-quỹ-giờ-và-khả-năng-đối-chiếu"/>
-      <w:bookmarkStart w:id="35" w:name="_Toc243919613"/>
+      <w:bookmarkStart w:id="35" w:name="_Toc243920862"/>
       <w:bookmarkEnd w:id="32"/>
       <w:r>
         <w:t>6. Quỹ giờ và khả năng đối chiếu</w:t>
@@ -6685,7 +7100,7 @@
         <w:pStyle w:val="Heading2"/>
       </w:pPr>
       <w:bookmarkStart w:id="36" w:name="b7-chịu-lỗi-và-sao-lưu"/>
-      <w:bookmarkStart w:id="37" w:name="_Toc243919614"/>
+      <w:bookmarkStart w:id="37" w:name="_Toc243920863"/>
       <w:bookmarkEnd w:id="34"/>
       <w:r>
         <w:t>7. Chịu lỗi và sao lưu</w:t>
@@ -7070,7 +7485,7 @@
         <w:pStyle w:val="Heading2"/>
       </w:pPr>
       <w:bookmarkStart w:id="38" w:name="b8-bảo-mật"/>
-      <w:bookmarkStart w:id="39" w:name="_Toc243919615"/>
+      <w:bookmarkStart w:id="39" w:name="_Toc243920864"/>
       <w:bookmarkEnd w:id="36"/>
       <w:r>
         <w:t>8. Bảo mật</w:t>
@@ -7128,7 +7543,7 @@
         <w:pStyle w:val="Heading2"/>
       </w:pPr>
       <w:bookmarkStart w:id="40" w:name="b9-sức-tải-và-thời-gian-đã-đo"/>
-      <w:bookmarkStart w:id="41" w:name="_Toc243919616"/>
+      <w:bookmarkStart w:id="41" w:name="_Toc243920865"/>
       <w:bookmarkEnd w:id="38"/>
       <w:r>
         <w:t>9. Sức tải và thời gian đã đo</w:t>
@@ -7724,11 +8139,11 @@
         <w:pStyle w:val="BodyText"/>
       </w:pPr>
       <w:r>
-        <w:t xml:space="preserve">Đợt ladder mở cứ hai giờ một lần, vào giờ chẵn. Hub ghép các đội có bản Đạt thành cặp, mỗi cặp hai ván đổi màu; N đội có N ván. Thời gian một đợt là thời gian chạy hết các ván đó, không phải hai giờ. </w:t>
+        <w:t xml:space="preserve">Đợt ladder mở cứ một khoảng giờ do ban tổ chức chọn (mặc định hai giờ), tính từ 0:00 giờ Việt Nam. Hub ghép các đội có bản Đạt thành cặp, mỗi cặp hai ván đổi màu; N đội có N ván. Thời gian một đợt là thời gian chạy hết các ván đó, không phải khoảng cách giữa hai mốc mở đợt. Xong sớm thì máy chấm </w:t>
       </w:r>
       <w:r>
         <w:lastRenderedPageBreak/>
-        <w:t>Xong sớm thì máy chấm dùng thời gian còn lại cho kiểm bài và luyện tập. Đến mốc sau mà đợt trước chưa xong thì bỏ mốc đó, như mục 4 phần A.</w:t>
+        <w:t>dùng thời gian còn lại cho kiểm bài và luyện tập. Đến mốc sau mà đợt trước chưa xong thì bỏ mốc đó, như mục 4 phần A.</w:t>
       </w:r>
     </w:p>
     <w:p>
@@ -7772,10 +8187,11 @@
       </w:tblPr>
       <w:tblGrid>
         <w:gridCol w:w="850"/>
-        <w:gridCol w:w="964"/>
-        <w:gridCol w:w="2211"/>
-        <w:gridCol w:w="1701"/>
-        <w:gridCol w:w="3345"/>
+        <w:gridCol w:w="850"/>
+        <w:gridCol w:w="1984"/>
+        <w:gridCol w:w="1191"/>
+        <w:gridCol w:w="1191"/>
+        <w:gridCol w:w="3005"/>
       </w:tblGrid>
       <w:tr>
         <w:trPr>
@@ -7791,85 +8207,397 @@
           <w:p>
             <w:pPr>
               <w:keepNext/>
-              <w:spacing w:before="60" w:after="100"/>
             </w:pPr>
             <w:r>
               <w:rPr>
                 <w:b/>
               </w:rPr>
-              <w:t>Số đội</w:t>
+              <w:t>S</w:t>
+            </w:r>
+            <w:r>
+              <w:rPr>
+                <w:b/>
+              </w:rPr>
+              <w:t>ố</w:t>
+            </w:r>
+            <w:r>
+              <w:rPr>
+                <w:b/>
+              </w:rPr>
+              <w:t xml:space="preserve"> đ</w:t>
+            </w:r>
+            <w:r>
+              <w:rPr>
+                <w:b/>
+              </w:rPr>
+              <w:t>ộ</w:t>
+            </w:r>
+            <w:r>
+              <w:rPr>
+                <w:b/>
+              </w:rPr>
+              <w:t>i</w:t>
             </w:r>
           </w:p>
         </w:tc>
         <w:tc>
           <w:tcPr>
-            <w:tcW w:w="964" w:type="dxa"/>
+            <w:tcW w:w="850" w:type="dxa"/>
             <w:shd w:val="clear" w:color="auto" w:fill="F2F2F2"/>
           </w:tcPr>
           <w:p>
             <w:pPr>
               <w:keepNext/>
-              <w:spacing w:before="60" w:after="100"/>
             </w:pPr>
             <w:r>
               <w:rPr>
                 <w:b/>
               </w:rPr>
-              <w:t>Luồng chấm</w:t>
+              <w:t>Lu</w:t>
+            </w:r>
+            <w:r>
+              <w:rPr>
+                <w:b/>
+              </w:rPr>
+              <w:t>ồ</w:t>
+            </w:r>
+            <w:r>
+              <w:rPr>
+                <w:b/>
+              </w:rPr>
+              <w:t>ng ch</w:t>
+            </w:r>
+            <w:r>
+              <w:rPr>
+                <w:b/>
+              </w:rPr>
+              <w:t>ấ</w:t>
+            </w:r>
+            <w:r>
+              <w:rPr>
+                <w:b/>
+              </w:rPr>
+              <w:t>m</w:t>
             </w:r>
           </w:p>
         </w:tc>
         <w:tc>
           <w:tcPr>
-            <w:tcW w:w="2211" w:type="dxa"/>
+            <w:tcW w:w="1984" w:type="dxa"/>
             <w:shd w:val="clear" w:color="auto" w:fill="F2F2F2"/>
           </w:tcPr>
           <w:p>
             <w:pPr>
               <w:keepNext/>
-              <w:spacing w:before="60" w:after="100"/>
             </w:pPr>
             <w:r>
               <w:rPr>
                 <w:b/>
               </w:rPr>
-              <w:t>Một đợt ladder: bot mẫu / chậm nhất</w:t>
+              <w:t>M</w:t>
+            </w:r>
+            <w:r>
+              <w:rPr>
+                <w:b/>
+              </w:rPr>
+              <w:t>ộ</w:t>
+            </w:r>
+            <w:r>
+              <w:rPr>
+                <w:b/>
+              </w:rPr>
+              <w:t>t đ</w:t>
+            </w:r>
+            <w:r>
+              <w:rPr>
+                <w:b/>
+              </w:rPr>
+              <w:t>ợ</w:t>
+            </w:r>
+            <w:r>
+              <w:rPr>
+                <w:b/>
+              </w:rPr>
+              <w:t>t ladder: bot m</w:t>
+            </w:r>
+            <w:r>
+              <w:rPr>
+                <w:b/>
+              </w:rPr>
+              <w:t>ẫ</w:t>
+            </w:r>
+            <w:r>
+              <w:rPr>
+                <w:b/>
+              </w:rPr>
+              <w:t>u / ch</w:t>
+            </w:r>
+            <w:r>
+              <w:rPr>
+                <w:b/>
+              </w:rPr>
+              <w:t>ậ</w:t>
+            </w:r>
+            <w:r>
+              <w:rPr>
+                <w:b/>
+              </w:rPr>
+              <w:t>m nh</w:t>
+            </w:r>
+            <w:r>
+              <w:rPr>
+                <w:b/>
+              </w:rPr>
+              <w:t>ấ</w:t>
+            </w:r>
+            <w:r>
+              <w:rPr>
+                <w:b/>
+              </w:rPr>
+              <w:t>t</w:t>
             </w:r>
           </w:p>
         </w:tc>
         <w:tc>
           <w:tcPr>
-            <w:tcW w:w="1701" w:type="dxa"/>
+            <w:tcW w:w="1191" w:type="dxa"/>
             <w:shd w:val="clear" w:color="auto" w:fill="F2F2F2"/>
           </w:tcPr>
           <w:p>
             <w:pPr>
               <w:keepNext/>
-              <w:spacing w:before="60" w:after="100"/>
             </w:pPr>
             <w:r>
               <w:rPr>
                 <w:b/>
               </w:rPr>
-              <w:t>Chậm nhất có kịp mốc 2 giờ</w:t>
+              <w:t>K</w:t>
+            </w:r>
+            <w:r>
+              <w:rPr>
+                <w:b/>
+              </w:rPr>
+              <w:t>ị</w:t>
+            </w:r>
+            <w:r>
+              <w:rPr>
+                <w:b/>
+              </w:rPr>
+              <w:t>p n</w:t>
+            </w:r>
+            <w:r>
+              <w:rPr>
+                <w:b/>
+              </w:rPr>
+              <w:t>ế</w:t>
+            </w:r>
+            <w:r>
+              <w:rPr>
+                <w:b/>
+              </w:rPr>
+              <w:t>u đ</w:t>
+            </w:r>
+            <w:r>
+              <w:rPr>
+                <w:b/>
+              </w:rPr>
+              <w:t>ợ</w:t>
+            </w:r>
+            <w:r>
+              <w:rPr>
+                <w:b/>
+              </w:rPr>
+              <w:t>t cách 2 gi</w:t>
+            </w:r>
+            <w:r>
+              <w:rPr>
+                <w:b/>
+              </w:rPr>
+              <w:t>ờ</w:t>
             </w:r>
           </w:p>
         </w:tc>
         <w:tc>
           <w:tcPr>
-            <w:tcW w:w="3345" w:type="dxa"/>
+            <w:tcW w:w="1191" w:type="dxa"/>
             <w:shd w:val="clear" w:color="auto" w:fill="F2F2F2"/>
           </w:tcPr>
           <w:p>
             <w:pPr>
               <w:keepNext/>
-              <w:spacing w:before="60" w:after="100"/>
             </w:pPr>
             <w:r>
               <w:rPr>
                 <w:b/>
               </w:rPr>
-              <w:t>Xếp hạng chính thức sau hạn, tới khi có 16 đội: bot mẫu / chậm nhất</w:t>
+              <w:t>K</w:t>
+            </w:r>
+            <w:r>
+              <w:rPr>
+                <w:b/>
+              </w:rPr>
+              <w:t>ị</w:t>
+            </w:r>
+            <w:r>
+              <w:rPr>
+                <w:b/>
+              </w:rPr>
+              <w:t>p n</w:t>
+            </w:r>
+            <w:r>
+              <w:rPr>
+                <w:b/>
+              </w:rPr>
+              <w:t>ế</w:t>
+            </w:r>
+            <w:r>
+              <w:rPr>
+                <w:b/>
+              </w:rPr>
+              <w:t>u đ</w:t>
+            </w:r>
+            <w:r>
+              <w:rPr>
+                <w:b/>
+              </w:rPr>
+              <w:t>ợ</w:t>
+            </w:r>
+            <w:r>
+              <w:rPr>
+                <w:b/>
+              </w:rPr>
+              <w:t>t cách 3 gi</w:t>
+            </w:r>
+            <w:r>
+              <w:rPr>
+                <w:b/>
+              </w:rPr>
+              <w:t>ờ</w:t>
+            </w:r>
+          </w:p>
+        </w:tc>
+        <w:tc>
+          <w:tcPr>
+            <w:tcW w:w="3005" w:type="dxa"/>
+            <w:shd w:val="clear" w:color="auto" w:fill="F2F2F2"/>
+          </w:tcPr>
+          <w:p>
+            <w:pPr>
+              <w:keepNext/>
+            </w:pPr>
+            <w:r>
+              <w:rPr>
+                <w:b/>
+              </w:rPr>
+              <w:t>X</w:t>
+            </w:r>
+            <w:r>
+              <w:rPr>
+                <w:b/>
+              </w:rPr>
+              <w:t>ế</w:t>
+            </w:r>
+            <w:r>
+              <w:rPr>
+                <w:b/>
+              </w:rPr>
+              <w:t>p h</w:t>
+            </w:r>
+            <w:r>
+              <w:rPr>
+                <w:b/>
+              </w:rPr>
+              <w:t>ạ</w:t>
+            </w:r>
+            <w:r>
+              <w:rPr>
+                <w:b/>
+              </w:rPr>
+              <w:t>ng chính th</w:t>
+            </w:r>
+            <w:r>
+              <w:rPr>
+                <w:b/>
+              </w:rPr>
+              <w:t>ứ</w:t>
+            </w:r>
+            <w:r>
+              <w:rPr>
+                <w:b/>
+              </w:rPr>
+              <w:t>c sau h</w:t>
+            </w:r>
+            <w:r>
+              <w:rPr>
+                <w:b/>
+              </w:rPr>
+              <w:t>ạ</w:t>
+            </w:r>
+            <w:r>
+              <w:rPr>
+                <w:b/>
+              </w:rPr>
+              <w:t>n, t</w:t>
+            </w:r>
+            <w:r>
+              <w:rPr>
+                <w:b/>
+              </w:rPr>
+              <w:t>ớ</w:t>
+            </w:r>
+            <w:r>
+              <w:rPr>
+                <w:b/>
+              </w:rPr>
+              <w:t>i khi có 16 đ</w:t>
+            </w:r>
+            <w:r>
+              <w:rPr>
+                <w:b/>
+              </w:rPr>
+              <w:t>ộ</w:t>
+            </w:r>
+            <w:r>
+              <w:rPr>
+                <w:b/>
+              </w:rPr>
+              <w:t>i: bot m</w:t>
+            </w:r>
+            <w:r>
+              <w:rPr>
+                <w:b/>
+              </w:rPr>
+              <w:t>ẫ</w:t>
+            </w:r>
+            <w:r>
+              <w:rPr>
+                <w:b/>
+              </w:rPr>
+              <w:t>u / ch</w:t>
+            </w:r>
+            <w:r>
+              <w:rPr>
+                <w:b/>
+              </w:rPr>
+              <w:t>ậ</w:t>
+            </w:r>
+            <w:r>
+              <w:rPr>
+                <w:b/>
+              </w:rPr>
+              <w:t>m nh</w:t>
+            </w:r>
+            <w:r>
+              <w:rPr>
+                <w:b/>
+              </w:rPr>
+              <w:t>ấ</w:t>
+            </w:r>
+            <w:r>
+              <w:rPr>
+                <w:b/>
+              </w:rPr>
+              <w:t>t</w:t>
             </w:r>
           </w:p>
         </w:tc>
@@ -7886,7 +8614,6 @@
           <w:p>
             <w:pPr>
               <w:keepNext/>
-              <w:spacing w:before="60" w:after="100"/>
             </w:pPr>
             <w:r>
               <w:t>200</w:t>
@@ -7895,26 +8622,30 @@
         </w:tc>
         <w:tc>
           <w:tcPr>
-            <w:tcW w:w="964" w:type="dxa"/>
+            <w:tcW w:w="850" w:type="dxa"/>
           </w:tcPr>
           <w:p>
             <w:pPr>
               <w:keepNext/>
-              <w:spacing w:before="60" w:after="100"/>
             </w:pPr>
             <w:r>
-              <w:t>4 (hiện có)</w:t>
+              <w:t>4 (hi</w:t>
+            </w:r>
+            <w:r>
+              <w:t>ệ</w:t>
+            </w:r>
+            <w:r>
+              <w:t>n có)</w:t>
             </w:r>
           </w:p>
         </w:tc>
         <w:tc>
           <w:tcPr>
-            <w:tcW w:w="2211" w:type="dxa"/>
+            <w:tcW w:w="1984" w:type="dxa"/>
           </w:tcPr>
           <w:p>
             <w:pPr>
               <w:keepNext/>
-              <w:spacing w:before="60" w:after="100"/>
             </w:pPr>
             <w:r>
               <w:t>1,2 phút / 25 phút</w:t>
@@ -7923,29 +8654,55 @@
         </w:tc>
         <w:tc>
           <w:tcPr>
-            <w:tcW w:w="1701" w:type="dxa"/>
+            <w:tcW w:w="1191" w:type="dxa"/>
           </w:tcPr>
           <w:p>
             <w:pPr>
               <w:keepNext/>
-              <w:spacing w:before="60" w:after="100"/>
             </w:pPr>
             <w:r>
-              <w:t>Kịp</w:t>
+              <w:t>K</w:t>
+            </w:r>
+            <w:r>
+              <w:t>ị</w:t>
+            </w:r>
+            <w:r>
+              <w:t>p</w:t>
             </w:r>
           </w:p>
         </w:tc>
         <w:tc>
           <w:tcPr>
-            <w:tcW w:w="3345" w:type="dxa"/>
+            <w:tcW w:w="1191" w:type="dxa"/>
           </w:tcPr>
           <w:p>
             <w:pPr>
               <w:keepNext/>
-              <w:spacing w:before="60" w:after="100"/>
             </w:pPr>
             <w:r>
-              <w:t>48 phút / 16,7 giờ</w:t>
+              <w:t>K</w:t>
+            </w:r>
+            <w:r>
+              <w:t>ị</w:t>
+            </w:r>
+            <w:r>
+              <w:t>p</w:t>
+            </w:r>
+          </w:p>
+        </w:tc>
+        <w:tc>
+          <w:tcPr>
+            <w:tcW w:w="3005" w:type="dxa"/>
+          </w:tcPr>
+          <w:p>
+            <w:pPr>
+              <w:keepNext/>
+            </w:pPr>
+            <w:r>
+              <w:t>48 phút / 16,7 gi</w:t>
+            </w:r>
+            <w:r>
+              <w:t>ờ</w:t>
             </w:r>
           </w:p>
         </w:tc>
@@ -7962,7 +8719,6 @@
           <w:p>
             <w:pPr>
               <w:keepNext/>
-              <w:spacing w:before="60" w:after="100"/>
             </w:pPr>
             <w:r>
               <w:t>200</w:t>
@@ -7971,12 +8727,11 @@
         </w:tc>
         <w:tc>
           <w:tcPr>
-            <w:tcW w:w="964" w:type="dxa"/>
+            <w:tcW w:w="850" w:type="dxa"/>
           </w:tcPr>
           <w:p>
             <w:pPr>
               <w:keepNext/>
-              <w:spacing w:before="60" w:after="100"/>
             </w:pPr>
             <w:r>
               <w:t>16</w:t>
@@ -7985,12 +8740,11 @@
         </w:tc>
         <w:tc>
           <w:tcPr>
-            <w:tcW w:w="2211" w:type="dxa"/>
+            <w:tcW w:w="1984" w:type="dxa"/>
           </w:tcPr>
           <w:p>
             <w:pPr>
               <w:keepNext/>
-              <w:spacing w:before="60" w:after="100"/>
             </w:pPr>
             <w:r>
               <w:t>0,3 phút / 6,5 phút</w:t>
@@ -7999,29 +8753,55 @@
         </w:tc>
         <w:tc>
           <w:tcPr>
-            <w:tcW w:w="1701" w:type="dxa"/>
+            <w:tcW w:w="1191" w:type="dxa"/>
           </w:tcPr>
           <w:p>
             <w:pPr>
               <w:keepNext/>
-              <w:spacing w:before="60" w:after="100"/>
             </w:pPr>
             <w:r>
-              <w:t>Kịp</w:t>
+              <w:t>K</w:t>
+            </w:r>
+            <w:r>
+              <w:t>ị</w:t>
+            </w:r>
+            <w:r>
+              <w:t>p</w:t>
             </w:r>
           </w:p>
         </w:tc>
         <w:tc>
           <w:tcPr>
-            <w:tcW w:w="3345" w:type="dxa"/>
+            <w:tcW w:w="1191" w:type="dxa"/>
           </w:tcPr>
           <w:p>
             <w:pPr>
               <w:keepNext/>
-              <w:spacing w:before="60" w:after="100"/>
             </w:pPr>
             <w:r>
-              <w:t>12 phút / 4,3 giờ</w:t>
+              <w:t>K</w:t>
+            </w:r>
+            <w:r>
+              <w:t>ị</w:t>
+            </w:r>
+            <w:r>
+              <w:t>p</w:t>
+            </w:r>
+          </w:p>
+        </w:tc>
+        <w:tc>
+          <w:tcPr>
+            <w:tcW w:w="3005" w:type="dxa"/>
+          </w:tcPr>
+          <w:p>
+            <w:pPr>
+              <w:keepNext/>
+            </w:pPr>
+            <w:r>
+              <w:t>12 phút / 4,3 gi</w:t>
+            </w:r>
+            <w:r>
+              <w:t>ờ</w:t>
             </w:r>
           </w:p>
         </w:tc>
@@ -8038,7 +8818,6 @@
           <w:p>
             <w:pPr>
               <w:keepNext/>
-              <w:spacing w:before="60" w:after="100"/>
             </w:pPr>
             <w:r>
               <w:t>1.000</w:t>
@@ -8047,57 +8826,96 @@
         </w:tc>
         <w:tc>
           <w:tcPr>
-            <w:tcW w:w="964" w:type="dxa"/>
+            <w:tcW w:w="850" w:type="dxa"/>
           </w:tcPr>
           <w:p>
             <w:pPr>
               <w:keepNext/>
-              <w:spacing w:before="60" w:after="100"/>
             </w:pPr>
             <w:r>
-              <w:t>4 (hiện có)</w:t>
+              <w:t>4 (hi</w:t>
+            </w:r>
+            <w:r>
+              <w:t>ệ</w:t>
+            </w:r>
+            <w:r>
+              <w:t>n có)</w:t>
             </w:r>
           </w:p>
         </w:tc>
         <w:tc>
           <w:tcPr>
-            <w:tcW w:w="2211" w:type="dxa"/>
+            <w:tcW w:w="1984" w:type="dxa"/>
           </w:tcPr>
           <w:p>
             <w:pPr>
               <w:keepNext/>
-              <w:spacing w:before="60" w:after="100"/>
             </w:pPr>
             <w:r>
-              <w:t>6 phút / 2,1 giờ</w:t>
+              <w:t>6 phút / 2,1 gi</w:t>
+            </w:r>
+            <w:r>
+              <w:t>ờ</w:t>
             </w:r>
           </w:p>
         </w:tc>
         <w:tc>
           <w:tcPr>
-            <w:tcW w:w="1701" w:type="dxa"/>
+            <w:tcW w:w="1191" w:type="dxa"/>
           </w:tcPr>
           <w:p>
             <w:pPr>
               <w:keepNext/>
-              <w:spacing w:before="60" w:after="100"/>
             </w:pPr>
             <w:r>
-              <w:t>Không, mốc sau bị bỏ</w:t>
+              <w:t>Không</w:t>
             </w:r>
           </w:p>
         </w:tc>
         <w:tc>
           <w:tcPr>
-            <w:tcW w:w="3345" w:type="dxa"/>
+            <w:tcW w:w="1191" w:type="dxa"/>
           </w:tcPr>
           <w:p>
             <w:pPr>
               <w:keepNext/>
-              <w:spacing w:before="60" w:after="100"/>
             </w:pPr>
             <w:r>
-              <w:t>2,4 giờ / 50,1 giờ</w:t>
+              <w:t>K</w:t>
+            </w:r>
+            <w:r>
+              <w:t>ị</w:t>
+            </w:r>
+            <w:r>
+              <w:t>p (2,1 gi</w:t>
+            </w:r>
+            <w:r>
+              <w:t>ờ</w:t>
+            </w:r>
+            <w:r>
+              <w:t>)</w:t>
+            </w:r>
+          </w:p>
+        </w:tc>
+        <w:tc>
+          <w:tcPr>
+            <w:tcW w:w="3005" w:type="dxa"/>
+          </w:tcPr>
+          <w:p>
+            <w:pPr>
+              <w:keepNext/>
+            </w:pPr>
+            <w:r>
+              <w:t>2,4 gi</w:t>
+            </w:r>
+            <w:r>
+              <w:t>ờ</w:t>
+            </w:r>
+            <w:r>
+              <w:t xml:space="preserve"> / 50,1 gi</w:t>
+            </w:r>
+            <w:r>
+              <w:t>ờ</w:t>
             </w:r>
           </w:p>
         </w:tc>
@@ -8114,7 +8932,6 @@
           <w:p>
             <w:pPr>
               <w:keepNext/>
-              <w:spacing w:before="60" w:after="100"/>
             </w:pPr>
             <w:r>
               <w:t>1.000</w:t>
@@ -8123,12 +8940,11 @@
         </w:tc>
         <w:tc>
           <w:tcPr>
-            <w:tcW w:w="964" w:type="dxa"/>
+            <w:tcW w:w="850" w:type="dxa"/>
           </w:tcPr>
           <w:p>
             <w:pPr>
               <w:keepNext/>
-              <w:spacing w:before="60" w:after="100"/>
             </w:pPr>
             <w:r>
               <w:t>12</w:t>
@@ -8137,12 +8953,11 @@
         </w:tc>
         <w:tc>
           <w:tcPr>
-            <w:tcW w:w="2211" w:type="dxa"/>
+            <w:tcW w:w="1984" w:type="dxa"/>
           </w:tcPr>
           <w:p>
             <w:pPr>
               <w:keepNext/>
-              <w:spacing w:before="60" w:after="100"/>
             </w:pPr>
             <w:r>
               <w:t>2 phút / 42 phút</w:t>
@@ -8151,29 +8966,55 @@
         </w:tc>
         <w:tc>
           <w:tcPr>
-            <w:tcW w:w="1701" w:type="dxa"/>
+            <w:tcW w:w="1191" w:type="dxa"/>
           </w:tcPr>
           <w:p>
             <w:pPr>
               <w:keepNext/>
-              <w:spacing w:before="60" w:after="100"/>
             </w:pPr>
             <w:r>
-              <w:t>Kịp</w:t>
+              <w:t>K</w:t>
+            </w:r>
+            <w:r>
+              <w:t>ị</w:t>
+            </w:r>
+            <w:r>
+              <w:t>p</w:t>
             </w:r>
           </w:p>
         </w:tc>
         <w:tc>
           <w:tcPr>
-            <w:tcW w:w="3345" w:type="dxa"/>
+            <w:tcW w:w="1191" w:type="dxa"/>
           </w:tcPr>
           <w:p>
             <w:pPr>
               <w:keepNext/>
-              <w:spacing w:before="60" w:after="100"/>
             </w:pPr>
             <w:r>
-              <w:t>48 phút / 16,8 giờ</w:t>
+              <w:t>K</w:t>
+            </w:r>
+            <w:r>
+              <w:t>ị</w:t>
+            </w:r>
+            <w:r>
+              <w:t>p</w:t>
+            </w:r>
+          </w:p>
+        </w:tc>
+        <w:tc>
+          <w:tcPr>
+            <w:tcW w:w="3005" w:type="dxa"/>
+          </w:tcPr>
+          <w:p>
+            <w:pPr>
+              <w:keepNext/>
+            </w:pPr>
+            <w:r>
+              <w:t>48 phút / 16,8 gi</w:t>
+            </w:r>
+            <w:r>
+              <w:t>ờ</w:t>
             </w:r>
           </w:p>
         </w:tc>
@@ -8188,9 +9029,6 @@
             <w:tcW w:w="850" w:type="dxa"/>
           </w:tcPr>
           <w:p>
-            <w:pPr>
-              <w:spacing w:before="60" w:after="100"/>
-            </w:pPr>
             <w:r>
               <w:t>1.000</w:t>
             </w:r>
@@ -8198,12 +9036,9 @@
         </w:tc>
         <w:tc>
           <w:tcPr>
-            <w:tcW w:w="964" w:type="dxa"/>
+            <w:tcW w:w="850" w:type="dxa"/>
           </w:tcPr>
           <w:p>
-            <w:pPr>
-              <w:spacing w:before="60" w:after="100"/>
-            </w:pPr>
             <w:r>
               <w:t>32</w:t>
             </w:r>
@@ -8211,12 +9046,9 @@
         </w:tc>
         <w:tc>
           <w:tcPr>
-            <w:tcW w:w="2211" w:type="dxa"/>
+            <w:tcW w:w="1984" w:type="dxa"/>
           </w:tcPr>
           <w:p>
-            <w:pPr>
-              <w:spacing w:before="60" w:after="100"/>
-            </w:pPr>
             <w:r>
               <w:t>0,8 phút / 16 phút</w:t>
             </w:r>
@@ -8224,33 +9056,162 @@
         </w:tc>
         <w:tc>
           <w:tcPr>
-            <w:tcW w:w="1701" w:type="dxa"/>
+            <w:tcW w:w="1191" w:type="dxa"/>
           </w:tcPr>
           <w:p>
-            <w:pPr>
-              <w:spacing w:before="60" w:after="100"/>
-            </w:pPr>
-            <w:r>
-              <w:t>Kịp</w:t>
+            <w:r>
+              <w:t>K</w:t>
+            </w:r>
+            <w:r>
+              <w:t>ị</w:t>
+            </w:r>
+            <w:r>
+              <w:t>p</w:t>
             </w:r>
           </w:p>
         </w:tc>
         <w:tc>
           <w:tcPr>
-            <w:tcW w:w="3345" w:type="dxa"/>
+            <w:tcW w:w="1191" w:type="dxa"/>
           </w:tcPr>
           <w:p>
-            <w:pPr>
-              <w:spacing w:before="60" w:after="100"/>
-            </w:pPr>
-            <w:r>
-              <w:t>18 phút / 6,4 giờ</w:t>
+            <w:r>
+              <w:t>K</w:t>
+            </w:r>
+            <w:r>
+              <w:t>ị</w:t>
+            </w:r>
+            <w:r>
+              <w:t>p</w:t>
+            </w:r>
+          </w:p>
+        </w:tc>
+        <w:tc>
+          <w:tcPr>
+            <w:tcW w:w="3005" w:type="dxa"/>
+          </w:tcPr>
+          <w:p>
+            <w:r>
+              <w:t xml:space="preserve">18 phút / 6,4 </w:t>
+            </w:r>
+            <w:r>
+              <w:t>gi</w:t>
+            </w:r>
+            <w:r>
+              <w:t>ờ</w:t>
             </w:r>
           </w:p>
         </w:tc>
       </w:tr>
     </w:tbl>
     <w:p>
+      <w:r>
+        <w:t>Kho</w:t>
+      </w:r>
+      <w:r>
+        <w:t>ả</w:t>
+      </w:r>
+      <w:r>
+        <w:t>ng gi</w:t>
+      </w:r>
+      <w:r>
+        <w:t>ờ</w:t>
+      </w:r>
+      <w:r>
+        <w:t xml:space="preserve"> gi</w:t>
+      </w:r>
+      <w:r>
+        <w:t>ữ</w:t>
+      </w:r>
+      <w:r>
+        <w:t>a các đ</w:t>
+      </w:r>
+      <w:r>
+        <w:t>ợ</w:t>
+      </w:r>
+      <w:r>
+        <w:t>t dài hơn giúp m</w:t>
+      </w:r>
+      <w:r>
+        <w:t>ỗ</w:t>
+      </w:r>
+      <w:r>
+        <w:t>i đ</w:t>
+      </w:r>
+      <w:r>
+        <w:t>ợ</w:t>
+      </w:r>
+      <w:r>
+        <w:t>t có thêm th</w:t>
+      </w:r>
+      <w:r>
+        <w:t>ờ</w:t>
+      </w:r>
+      <w:r>
+        <w:t>i gian ch</w:t>
+      </w:r>
+      <w:r>
+        <w:t>ạ</w:t>
+      </w:r>
+      <w:r>
+        <w:t>y xong, nhưng m</w:t>
+      </w:r>
+      <w:r>
+        <w:t>ỗ</w:t>
+      </w:r>
+      <w:r>
+        <w:t>i đ</w:t>
+      </w:r>
+      <w:r>
+        <w:t>ộ</w:t>
+      </w:r>
+      <w:r>
+        <w:t>i đá ít ván ladder hơn trong m</w:t>
+      </w:r>
+      <w:r>
+        <w:t>ộ</w:t>
+      </w:r>
+      <w:r>
+        <w:t>t ngày. X</w:t>
+      </w:r>
+      <w:r>
+        <w:t>ế</w:t>
+      </w:r>
+      <w:r>
+        <w:t>p h</w:t>
+      </w:r>
+      <w:r>
+        <w:t>ạ</w:t>
+      </w:r>
+      <w:r>
+        <w:t>ng chính th</w:t>
+      </w:r>
+      <w:r>
+        <w:t>ứ</w:t>
+      </w:r>
+      <w:r>
+        <w:t>c sau h</w:t>
+      </w:r>
+      <w:r>
+        <w:t>ạ</w:t>
+      </w:r>
+      <w:r>
+        <w:t>n n</w:t>
+      </w:r>
+      <w:r>
+        <w:t>ộ</w:t>
+      </w:r>
+      <w:r>
+        <w:t>p không đ</w:t>
+      </w:r>
+      <w:r>
+        <w:t>ổ</w:t>
+      </w:r>
+      <w:r>
+        <w:t>i.</w:t>
+      </w:r>
+    </w:p>
+    <w:p>
       <w:pPr>
         <w:pStyle w:val="BodyText"/>
       </w:pPr>
@@ -8271,7 +9232,7 @@
         <w:pStyle w:val="Heading2"/>
       </w:pPr>
       <w:bookmarkStart w:id="42" w:name="b10-cài-đặt-và-vận-hành"/>
-      <w:bookmarkStart w:id="43" w:name="_Toc243919617"/>
+      <w:bookmarkStart w:id="43" w:name="_Toc243920866"/>
       <w:bookmarkEnd w:id="40"/>
       <w:r>
         <w:t>10. Cài đặt và vận hành</w:t>
@@ -8329,14 +9290,11 @@
           <w:b/>
           <w:bCs/>
         </w:rPr>
+        <w:lastRenderedPageBreak/>
         <w:t>Tạo tài khoản và nối máy chấm.</w:t>
       </w:r>
       <w:r>
-        <w:t xml:space="preserve"> Khởi tạo tài khoản ban tổ chức qua công cụ quản trị, không đưa mật khẩu vào lệnh lưu lịch sử. Ban tổ chức tạo mã, gửi tin nhắn cài có link tải hạn bảy ngày qua kênh riêng; </w:t>
-      </w:r>
-      <w:r>
-        <w:lastRenderedPageBreak/>
-        <w:t>gói không tải công khai. Người vận hành cài trên Windows hoặc Linux; kiểm nền tảng, runtime và slot. Chạy một lượt kiểm, một ván và mở replay trước khi tạo giải thật.</w:t>
+        <w:t xml:space="preserve"> Khởi tạo tài khoản ban tổ chức qua công cụ quản trị, không đưa mật khẩu vào lệnh lưu lịch sử. Ban tổ chức tạo mã, gửi tin nhắn cài có link tải hạn bảy ngày qua kênh riêng; gói không tải công khai. Người vận hành cài trên Windows hoặc Linux; kiểm nền tảng, runtime và slot. Chạy một lượt kiểm, một ván và mở replay trước khi tạo giải thật.</w:t>
       </w:r>
     </w:p>
     <w:p>
@@ -8390,7 +9348,7 @@
         <w:pageBreakBefore/>
       </w:pPr>
       <w:bookmarkStart w:id="44" w:name="b11-giới-hạn-và-hướng-tiếp"/>
-      <w:bookmarkStart w:id="45" w:name="_Toc243919618"/>
+      <w:bookmarkStart w:id="45" w:name="_Toc243920867"/>
       <w:bookmarkEnd w:id="42"/>
       <w:r>
         <w:lastRenderedPageBreak/>
@@ -8480,7 +9438,7 @@
         <w:pageBreakBefore/>
       </w:pPr>
       <w:bookmarkStart w:id="46" w:name="phần-c-hướng-dẫn-demo-từng-bước"/>
-      <w:bookmarkStart w:id="47" w:name="_Toc243919619"/>
+      <w:bookmarkStart w:id="47" w:name="_Toc243920868"/>
       <w:bookmarkEnd w:id="44"/>
       <w:bookmarkEnd w:id="22"/>
       <w:r>
@@ -8499,7 +9457,7 @@
         <w:pStyle w:val="Heading2"/>
       </w:pPr>
       <w:bookmarkStart w:id="48" w:name="c1-khách-xem-giải"/>
-      <w:bookmarkStart w:id="49" w:name="_Toc243919620"/>
+      <w:bookmarkStart w:id="49" w:name="_Toc243920869"/>
       <w:r>
         <w:t>1. Khách xem giải</w:t>
       </w:r>
@@ -8510,7 +9468,7 @@
         <w:pStyle w:val="Heading3"/>
       </w:pPr>
       <w:bookmarkStart w:id="50" w:name="bước-1-mở-giải-công-khai"/>
-      <w:bookmarkStart w:id="51" w:name="_Toc243919621"/>
+      <w:bookmarkStart w:id="51" w:name="_Toc243920870"/>
       <w:r>
         <w:t>Bước 1. Mở giải công khai</w:t>
       </w:r>
@@ -8541,7 +9499,7 @@
           <w:noProof/>
         </w:rPr>
         <w:drawing>
-          <wp:inline distT="0" distB="0" distL="0" distR="0" wp14:anchorId="7A98BBC6" wp14:editId="5068A3D3">
+          <wp:inline distT="0" distB="0" distL="0" distR="0" wp14:anchorId="2EBD0C72" wp14:editId="25932B69">
             <wp:extent cx="3400077" cy="2592000"/>
             <wp:effectExtent l="0" t="0" r="0" b="0"/>
             <wp:docPr id="65" name="Picture" descr="Hình 7 Mở giải công khai"/>
@@ -8598,7 +9556,7 @@
         <w:pStyle w:val="Heading3"/>
       </w:pPr>
       <w:bookmarkStart w:id="52" w:name="bước-2-xem-bảng-điểm-và-ma-trận"/>
-      <w:bookmarkStart w:id="53" w:name="_Toc243919622"/>
+      <w:bookmarkStart w:id="53" w:name="_Toc243920871"/>
       <w:bookmarkEnd w:id="50"/>
       <w:r>
         <w:t>Bước 2. Xem bảng điểm và ma trận</w:t>
@@ -8650,7 +9608,7 @@
           <w:noProof/>
         </w:rPr>
         <w:drawing>
-          <wp:inline distT="0" distB="0" distL="0" distR="0" wp14:anchorId="5961AA18" wp14:editId="12C74FC3">
+          <wp:inline distT="0" distB="0" distL="0" distR="0" wp14:anchorId="19F52540" wp14:editId="6CA2D460">
             <wp:extent cx="2664303" cy="2592000"/>
             <wp:effectExtent l="0" t="0" r="0" b="0"/>
             <wp:docPr id="69" name="Picture" descr="Hình 8 Xem bảng điểm và ma trận"/>
@@ -8708,7 +9666,7 @@
         <w:pageBreakBefore/>
       </w:pPr>
       <w:bookmarkStart w:id="54" w:name="bước-3-xem-lại-từng-nước"/>
-      <w:bookmarkStart w:id="55" w:name="_Toc243919623"/>
+      <w:bookmarkStart w:id="55" w:name="_Toc243920872"/>
       <w:bookmarkEnd w:id="52"/>
       <w:r>
         <w:lastRenderedPageBreak/>
@@ -8731,7 +9689,7 @@
           <w:noProof/>
         </w:rPr>
         <w:drawing>
-          <wp:inline distT="0" distB="0" distL="0" distR="0" wp14:anchorId="034B94AE" wp14:editId="05938A77">
+          <wp:inline distT="0" distB="0" distL="0" distR="0" wp14:anchorId="3DBA55B2" wp14:editId="30765A04">
             <wp:extent cx="4297381" cy="5399998"/>
             <wp:effectExtent l="0" t="0" r="0" b="0"/>
             <wp:docPr id="73" name="Picture" descr="Hình 9 Xem lại từng nước"/>
@@ -8789,7 +9747,7 @@
         <w:pageBreakBefore/>
       </w:pPr>
       <w:bookmarkStart w:id="56" w:name="c2-thí-sinh-đăng-ký-và-nộp-bot"/>
-      <w:bookmarkStart w:id="57" w:name="_Toc243919624"/>
+      <w:bookmarkStart w:id="57" w:name="_Toc243920873"/>
       <w:bookmarkEnd w:id="54"/>
       <w:bookmarkEnd w:id="48"/>
       <w:r>
@@ -8802,7 +9760,7 @@
       <w:pPr>
         <w:pStyle w:val="Heading3"/>
       </w:pPr>
-      <w:bookmarkStart w:id="58" w:name="_Toc243919625"/>
+      <w:bookmarkStart w:id="58" w:name="_Toc243920874"/>
       <w:r>
         <w:t>Bước 4. Đăng ký bằng email trường</w:t>
       </w:r>
@@ -8846,7 +9804,7 @@
           <w:noProof/>
         </w:rPr>
         <w:drawing>
-          <wp:inline distT="0" distB="0" distL="0" distR="0" wp14:anchorId="0833B401" wp14:editId="428D3A62">
+          <wp:inline distT="0" distB="0" distL="0" distR="0" wp14:anchorId="476828D0" wp14:editId="01F299D8">
             <wp:extent cx="3960000" cy="3160235"/>
             <wp:effectExtent l="0" t="0" r="0" b="0"/>
             <wp:docPr id="78" name="Picture" descr="Hình 10 Đăng ký bằng email trường"/>
@@ -8903,7 +9861,7 @@
         <w:pStyle w:val="Heading3"/>
         <w:pageBreakBefore/>
       </w:pPr>
-      <w:bookmarkStart w:id="59" w:name="_Toc243919626"/>
+      <w:bookmarkStart w:id="59" w:name="_Toc243920875"/>
       <w:r>
         <w:lastRenderedPageBreak/>
         <w:t>Bước 5. Mở email lấy mã</w:t>
@@ -8929,7 +9887,7 @@
           <w:noProof/>
         </w:rPr>
         <w:drawing>
-          <wp:inline distT="0" distB="0" distL="0" distR="0" wp14:anchorId="3F059CBE" wp14:editId="555B017C">
+          <wp:inline distT="0" distB="0" distL="0" distR="0" wp14:anchorId="5304A49F" wp14:editId="742C4798">
             <wp:extent cx="5760000" cy="2531025"/>
             <wp:effectExtent l="0" t="0" r="0" b="0"/>
             <wp:docPr id="153" name="Picture" descr="Hình 11 Email chứa mã xác minh"/>
@@ -8986,7 +9944,7 @@
         <w:pStyle w:val="Heading3"/>
         <w:pageBreakBefore/>
       </w:pPr>
-      <w:bookmarkStart w:id="60" w:name="_Toc243919627"/>
+      <w:bookmarkStart w:id="60" w:name="_Toc243920876"/>
       <w:r>
         <w:lastRenderedPageBreak/>
         <w:t>Bước 6. Xác minh email</w:t>
@@ -9021,7 +9979,7 @@
           <w:noProof/>
         </w:rPr>
         <w:drawing>
-          <wp:inline distT="0" distB="0" distL="0" distR="0" wp14:anchorId="1F54D16F" wp14:editId="13F34B92">
+          <wp:inline distT="0" distB="0" distL="0" distR="0" wp14:anchorId="61C38F46" wp14:editId="265C506A">
             <wp:extent cx="3960000" cy="4356000"/>
             <wp:effectExtent l="0" t="0" r="0" b="0"/>
             <wp:docPr id="82" name="Picture" descr="Hình 11 Xác minh email"/>
@@ -9078,7 +10036,7 @@
         <w:pStyle w:val="Heading3"/>
         <w:pageBreakBefore/>
       </w:pPr>
-      <w:bookmarkStart w:id="61" w:name="_Toc243919628"/>
+      <w:bookmarkStart w:id="61" w:name="_Toc243920877"/>
       <w:r>
         <w:lastRenderedPageBreak/>
         <w:t>Bước 7. Đặt mật khẩu và đăng nhập</w:t>
@@ -9113,7 +10071,7 @@
           <w:noProof/>
         </w:rPr>
         <w:drawing>
-          <wp:inline distT="0" distB="0" distL="0" distR="0" wp14:anchorId="77A6D503" wp14:editId="5646BE0A">
+          <wp:inline distT="0" distB="0" distL="0" distR="0" wp14:anchorId="3E85C022" wp14:editId="2C28B916">
             <wp:extent cx="3960000" cy="5023764"/>
             <wp:effectExtent l="0" t="0" r="0" b="0"/>
             <wp:docPr id="86" name="Picture" descr="Hình 12 Đặt mật khẩu và đăng nhập"/>
@@ -9169,7 +10127,7 @@
       <w:pPr>
         <w:pStyle w:val="Heading3"/>
       </w:pPr>
-      <w:bookmarkStart w:id="62" w:name="_Toc243919629"/>
+      <w:bookmarkStart w:id="62" w:name="_Toc243920878"/>
       <w:r>
         <w:t>Bước 8. Tạo đội</w:t>
       </w:r>
@@ -9210,7 +10168,7 @@
           <w:noProof/>
         </w:rPr>
         <w:drawing>
-          <wp:inline distT="0" distB="0" distL="0" distR="0" wp14:anchorId="72F5597A" wp14:editId="497680FA">
+          <wp:inline distT="0" distB="0" distL="0" distR="0" wp14:anchorId="31514793" wp14:editId="1633B04A">
             <wp:extent cx="5012628" cy="2592000"/>
             <wp:effectExtent l="0" t="0" r="0" b="0"/>
             <wp:docPr id="90" name="Picture" descr="Hình 13 Tạo đội"/>
@@ -9267,7 +10225,7 @@
         <w:pStyle w:val="Heading3"/>
         <w:pageBreakBefore/>
       </w:pPr>
-      <w:bookmarkStart w:id="63" w:name="_Toc243919630"/>
+      <w:bookmarkStart w:id="63" w:name="_Toc243920879"/>
       <w:r>
         <w:lastRenderedPageBreak/>
         <w:t>Bước 9. Mời các thành viên</w:t>
@@ -9299,7 +10257,7 @@
           <w:noProof/>
         </w:rPr>
         <w:drawing>
-          <wp:inline distT="0" distB="0" distL="0" distR="0" wp14:anchorId="623EC0C6" wp14:editId="1C76507C">
+          <wp:inline distT="0" distB="0" distL="0" distR="0" wp14:anchorId="57FED136" wp14:editId="65ACE5A6">
             <wp:extent cx="4187916" cy="2592000"/>
             <wp:effectExtent l="0" t="0" r="0" b="0"/>
             <wp:docPr id="94" name="Picture" descr="Hình 14 Mời các thành viên"/>
@@ -9355,7 +10313,7 @@
       <w:pPr>
         <w:pStyle w:val="Heading3"/>
       </w:pPr>
-      <w:bookmarkStart w:id="64" w:name="_Toc243919631"/>
+      <w:bookmarkStart w:id="64" w:name="_Toc243920880"/>
       <w:r>
         <w:t>Bước 10. Vào đội bằng mã mời</w:t>
       </w:r>
@@ -9386,7 +10344,7 @@
           <w:noProof/>
         </w:rPr>
         <w:drawing>
-          <wp:inline distT="0" distB="0" distL="0" distR="0" wp14:anchorId="01FA75C0" wp14:editId="0083EBEB">
+          <wp:inline distT="0" distB="0" distL="0" distR="0" wp14:anchorId="34F2F3C3" wp14:editId="677E4D3D">
             <wp:extent cx="5012628" cy="2592000"/>
             <wp:effectExtent l="0" t="0" r="0" b="0"/>
             <wp:docPr id="98" name="Picture" descr="Hình 15 Vào đội bằng mã mời"/>
@@ -9443,7 +10401,7 @@
         <w:pStyle w:val="Heading3"/>
         <w:pageBreakBefore/>
       </w:pPr>
-      <w:bookmarkStart w:id="65" w:name="_Toc243919632"/>
+      <w:bookmarkStart w:id="65" w:name="_Toc243920881"/>
       <w:r>
         <w:lastRenderedPageBreak/>
         <w:t>Bước 11. Tạo repo từ mẫu</w:t>
@@ -9475,7 +10433,7 @@
           <w:noProof/>
         </w:rPr>
         <w:drawing>
-          <wp:inline distT="0" distB="0" distL="0" distR="0" wp14:anchorId="5FFE4D72" wp14:editId="39EDEC4B">
+          <wp:inline distT="0" distB="0" distL="0" distR="0" wp14:anchorId="73660F59" wp14:editId="2D67C2A4">
             <wp:extent cx="5682461" cy="2592000"/>
             <wp:effectExtent l="0" t="0" r="0" b="0"/>
             <wp:docPr id="102" name="Picture" descr="Hình 16 Tạo repo từ mẫu"/>
@@ -9531,7 +10489,7 @@
       <w:pPr>
         <w:pStyle w:val="Heading3"/>
       </w:pPr>
-      <w:bookmarkStart w:id="66" w:name="_Toc243919633"/>
+      <w:bookmarkStart w:id="66" w:name="_Toc243920882"/>
       <w:r>
         <w:t>Bước 12. Cho App truy cập đúng repo</w:t>
       </w:r>
@@ -9572,7 +10530,7 @@
           <w:noProof/>
         </w:rPr>
         <w:drawing>
-          <wp:inline distT="0" distB="0" distL="0" distR="0" wp14:anchorId="778ED6D4" wp14:editId="3DD47E33">
+          <wp:inline distT="0" distB="0" distL="0" distR="0" wp14:anchorId="00A2EA6B" wp14:editId="0507C060">
             <wp:extent cx="5759999" cy="1755999"/>
             <wp:effectExtent l="0" t="0" r="0" b="0"/>
             <wp:docPr id="106" name="Picture" descr="Hình 17 Cho App truy cập đúng repo"/>
@@ -9629,7 +10587,7 @@
         <w:pStyle w:val="Heading3"/>
         <w:pageBreakBefore/>
       </w:pPr>
-      <w:bookmarkStart w:id="67" w:name="_Toc243919634"/>
+      <w:bookmarkStart w:id="67" w:name="_Toc243920883"/>
       <w:r>
         <w:lastRenderedPageBreak/>
         <w:t>Bước 13. Gắn link repo với đội</w:t>
@@ -9671,7 +10629,7 @@
           <w:noProof/>
         </w:rPr>
         <w:drawing>
-          <wp:inline distT="0" distB="0" distL="0" distR="0" wp14:anchorId="1BFA35AF" wp14:editId="68EA352A">
+          <wp:inline distT="0" distB="0" distL="0" distR="0" wp14:anchorId="156BCA84" wp14:editId="6344EC4C">
             <wp:extent cx="5284928" cy="2592000"/>
             <wp:effectExtent l="0" t="0" r="0" b="0"/>
             <wp:docPr id="110" name="Picture" descr="Hình 18 Gắn link repo với đội"/>
@@ -9727,7 +10685,7 @@
       <w:pPr>
         <w:pStyle w:val="Heading3"/>
       </w:pPr>
-      <w:bookmarkStart w:id="68" w:name="_Toc243919635"/>
+      <w:bookmarkStart w:id="68" w:name="_Toc243920884"/>
       <w:r>
         <w:t>Bước 14. Theo dõi kiểm tra 72 mẫu</w:t>
       </w:r>
@@ -9808,7 +10766,7 @@
           <w:noProof/>
         </w:rPr>
         <w:drawing>
-          <wp:inline distT="0" distB="0" distL="0" distR="0" wp14:anchorId="7C068E1B" wp14:editId="228699B2">
+          <wp:inline distT="0" distB="0" distL="0" distR="0" wp14:anchorId="6629FEF9" wp14:editId="742780ED">
             <wp:extent cx="3093102" cy="2592000"/>
             <wp:effectExtent l="0" t="0" r="0" b="0"/>
             <wp:docPr id="114" name="Picture" descr="Hình 19 Theo dõi kiểm tra 72 mẫu"/>
@@ -9865,7 +10823,7 @@
         <w:pStyle w:val="Heading3"/>
         <w:pageBreakBefore/>
       </w:pPr>
-      <w:bookmarkStart w:id="69" w:name="_Toc243919636"/>
+      <w:bookmarkStart w:id="69" w:name="_Toc243920885"/>
       <w:r>
         <w:lastRenderedPageBreak/>
         <w:t>Bước 15. Xem giải của đội</w:t>
@@ -9927,7 +10885,7 @@
           <w:noProof/>
         </w:rPr>
         <w:drawing>
-          <wp:inline distT="0" distB="0" distL="0" distR="0" wp14:anchorId="20C30D1E" wp14:editId="75DB0E5D">
+          <wp:inline distT="0" distB="0" distL="0" distR="0" wp14:anchorId="2A8A0893" wp14:editId="0C77A847">
             <wp:extent cx="5759999" cy="1024999"/>
             <wp:effectExtent l="0" t="0" r="0" b="0"/>
             <wp:docPr id="118" name="Picture" descr="Hình 20 Xem giải của đội"/>
@@ -9983,7 +10941,7 @@
       <w:pPr>
         <w:pStyle w:val="Heading3"/>
       </w:pPr>
-      <w:bookmarkStart w:id="70" w:name="_Toc243919637"/>
+      <w:bookmarkStart w:id="70" w:name="_Toc243920886"/>
       <w:r>
         <w:t>Bước 16. Luyện tập với bot mẫu</w:t>
       </w:r>
@@ -10034,7 +10992,7 @@
           <w:noProof/>
         </w:rPr>
         <w:drawing>
-          <wp:inline distT="0" distB="0" distL="0" distR="0" wp14:anchorId="6FC2F726" wp14:editId="25906644">
+          <wp:inline distT="0" distB="0" distL="0" distR="0" wp14:anchorId="657F5A19" wp14:editId="61B054A9">
             <wp:extent cx="5759999" cy="3774999"/>
             <wp:effectExtent l="0" t="0" r="0" b="0"/>
             <wp:docPr id="122" name="Picture" descr="Hình 21 Luyện tập với bot mẫu"/>
@@ -10092,7 +11050,7 @@
         <w:pageBreakBefore/>
       </w:pPr>
       <w:bookmarkStart w:id="71" w:name="c3-ban-tổ-chức-điều-hành"/>
-      <w:bookmarkStart w:id="72" w:name="_Toc243919638"/>
+      <w:bookmarkStart w:id="72" w:name="_Toc243920887"/>
       <w:bookmarkEnd w:id="56"/>
       <w:r>
         <w:lastRenderedPageBreak/>
@@ -10104,7 +11062,7 @@
       <w:pPr>
         <w:pStyle w:val="Heading3"/>
       </w:pPr>
-      <w:bookmarkStart w:id="73" w:name="_Toc243919639"/>
+      <w:bookmarkStart w:id="73" w:name="_Toc243920888"/>
       <w:r>
         <w:t>Bước 17. Xem tổng quan ban tổ chức</w:t>
       </w:r>
@@ -10125,7 +11083,7 @@
           <w:noProof/>
         </w:rPr>
         <w:drawing>
-          <wp:inline distT="0" distB="0" distL="0" distR="0" wp14:anchorId="2FB0031D" wp14:editId="0E744329">
+          <wp:inline distT="0" distB="0" distL="0" distR="0" wp14:anchorId="44ACC098" wp14:editId="326561F5">
             <wp:extent cx="5759999" cy="3505263"/>
             <wp:effectExtent l="0" t="0" r="0" b="0"/>
             <wp:docPr id="127" name="Picture" descr="Hình 22 Xem tổng quan ban tổ chức"/>
@@ -10182,7 +11140,7 @@
         <w:pStyle w:val="Heading3"/>
         <w:pageBreakBefore/>
       </w:pPr>
-      <w:bookmarkStart w:id="74" w:name="_Toc243919640"/>
+      <w:bookmarkStart w:id="74" w:name="_Toc243920889"/>
       <w:r>
         <w:lastRenderedPageBreak/>
         <w:t>Bước 18. Chọn giải ở Tổng quan</w:t>
@@ -10244,7 +11202,7 @@
           <w:noProof/>
         </w:rPr>
         <w:drawing>
-          <wp:inline distT="0" distB="0" distL="0" distR="0" wp14:anchorId="1D412449" wp14:editId="6719B452">
+          <wp:inline distT="0" distB="0" distL="0" distR="0" wp14:anchorId="766BCC91" wp14:editId="2093CB57">
             <wp:extent cx="5759999" cy="4012104"/>
             <wp:effectExtent l="0" t="0" r="0" b="0"/>
             <wp:docPr id="131" name="Picture" descr="Hình 23 Chọn giải ở Tổng quan"/>
@@ -10301,7 +11259,7 @@
         <w:pStyle w:val="Heading3"/>
         <w:pageBreakBefore/>
       </w:pPr>
-      <w:bookmarkStart w:id="75" w:name="_Toc243919641"/>
+      <w:bookmarkStart w:id="75" w:name="_Toc243920890"/>
       <w:r>
         <w:lastRenderedPageBreak/>
         <w:t>Bước 19. Chuẩn bị giải mới</w:t>
@@ -10320,7 +11278,7 @@
         <w:t>Giải đấu</w:t>
       </w:r>
       <w:r>
-        <w:t>, chọn Elo và điền tên, số đội, hạn nộp theo giờ Việt Nam cùng nền tảng chấm. Ô thời gian chung được ẩn vì ladder và chính thức dùng 10 giây mỗi bot; kiểm toàn bộ cấu hình trước khi tạo, ảnh chưa gửi biểu mẫu.</w:t>
+        <w:t>, chọn Elo và điền tên, số đội, hạn nộp theo giờ Việt Nam cùng nền tảng chấm. Ô thời gian chung được ẩn vì ladder và chính thức dùng 10 giây mỗi bot; kiểm toàn bộ cấu hình trước khi tạo, ảnh chưa gửi biểu mẫu. Hạn nộp quyết định ladder kéo dài bao lâu; mở mục Luật ladder và xếp hạng chính thức để đặt khoảng giờ (mặc định hai giờ), dòng bên dưới cho biết giờ mở từng đợt.</w:t>
       </w:r>
     </w:p>
     <w:p>
@@ -10333,7 +11291,7 @@
           <w:noProof/>
         </w:rPr>
         <w:drawing>
-          <wp:inline distT="0" distB="0" distL="0" distR="0" wp14:anchorId="6027A9A5" wp14:editId="6CA40272">
+          <wp:inline distT="0" distB="0" distL="0" distR="0" wp14:anchorId="60EC9B66" wp14:editId="70128D3D">
             <wp:extent cx="4586765" cy="2592000"/>
             <wp:effectExtent l="0" t="0" r="0" b="0"/>
             <wp:docPr id="135" name="Picture" descr="Hình 24 Chuẩn bị giải mới"/>
@@ -10389,7 +11347,7 @@
       <w:pPr>
         <w:pStyle w:val="Heading3"/>
       </w:pPr>
-      <w:bookmarkStart w:id="76" w:name="_Toc243919642"/>
+      <w:bookmarkStart w:id="76" w:name="_Toc243920891"/>
       <w:r>
         <w:t>Bước 20. Cài máy chấm Windows hoặc Linux</w:t>
       </w:r>
@@ -10440,7 +11398,7 @@
           <w:noProof/>
         </w:rPr>
         <w:drawing>
-          <wp:inline distT="0" distB="0" distL="0" distR="0" wp14:anchorId="6AFEB1A5" wp14:editId="47F1E5E0">
+          <wp:inline distT="0" distB="0" distL="0" distR="0" wp14:anchorId="12C160AA" wp14:editId="1FA604D8">
             <wp:extent cx="5759999" cy="1196950"/>
             <wp:effectExtent l="0" t="0" r="0" b="0"/>
             <wp:docPr id="139" name="Picture" descr="Hình 25 Cài máy chấm Windows hoặc Linux"/>
@@ -10497,7 +11455,7 @@
         <w:pStyle w:val="Heading3"/>
         <w:pageBreakBefore/>
       </w:pPr>
-      <w:bookmarkStart w:id="77" w:name="_Toc243919643"/>
+      <w:bookmarkStart w:id="77" w:name="_Toc243920892"/>
       <w:r>
         <w:lastRenderedPageBreak/>
         <w:t>Bước 21. Kiểm tình trạng chấm và hàng đợi</w:t>
@@ -10529,7 +11487,7 @@
           <w:noProof/>
         </w:rPr>
         <w:drawing>
-          <wp:inline distT="0" distB="0" distL="0" distR="0" wp14:anchorId="260CA19C" wp14:editId="4DA0B257">
+          <wp:inline distT="0" distB="0" distL="0" distR="0" wp14:anchorId="3F1496F4" wp14:editId="13EFE93B">
             <wp:extent cx="4213732" cy="2592000"/>
             <wp:effectExtent l="0" t="0" r="0" b="0"/>
             <wp:docPr id="143" name="Picture" descr="Hình 26 Kiểm tình trạng chấm và hàng đợi"/>
@@ -10585,7 +11543,7 @@
       <w:pPr>
         <w:pStyle w:val="Heading3"/>
       </w:pPr>
-      <w:bookmarkStart w:id="78" w:name="_Toc243919644"/>
+      <w:bookmarkStart w:id="78" w:name="_Toc243920893"/>
       <w:r>
         <w:t>Bước 22. Soạn thông báo</w:t>
       </w:r>
@@ -10626,7 +11584,7 @@
           <w:noProof/>
         </w:rPr>
         <w:drawing>
-          <wp:inline distT="0" distB="0" distL="0" distR="0" wp14:anchorId="28E69730" wp14:editId="3142CF46">
+          <wp:inline distT="0" distB="0" distL="0" distR="0" wp14:anchorId="75D3470F" wp14:editId="455A075B">
             <wp:extent cx="5759999" cy="2369999"/>
             <wp:effectExtent l="0" t="0" r="0" b="0"/>
             <wp:docPr id="147" name="Picture" descr="Hình 27 Soạn thông báo"/>
@@ -10683,7 +11641,7 @@
         <w:pStyle w:val="Heading3"/>
         <w:pageBreakBefore/>
       </w:pPr>
-      <w:bookmarkStart w:id="79" w:name="_Toc243919645"/>
+      <w:bookmarkStart w:id="79" w:name="_Toc243920894"/>
       <w:r>
         <w:lastRenderedPageBreak/>
         <w:t>Bước 23. Xuất bảng điểm CSV</w:t>
@@ -10715,7 +11673,7 @@
           <w:noProof/>
         </w:rPr>
         <w:drawing>
-          <wp:inline distT="0" distB="0" distL="0" distR="0" wp14:anchorId="6B168B2A" wp14:editId="5AE5C92F">
+          <wp:inline distT="0" distB="0" distL="0" distR="0" wp14:anchorId="29D9001B" wp14:editId="04E5E1AE">
             <wp:extent cx="4559999" cy="5400000"/>
             <wp:effectExtent l="0" t="0" r="0" b="0"/>
             <wp:docPr id="151" name="Picture" descr="Hình 28 Xuất bảng điểm CSV"/>

</xml_diff>

<commit_message>
Sửa dấu thập phân trong số đo LAN
</commit_message>
<xml_diff>
--- a/TAI-LIEU.docx
+++ b/TAI-LIEU.docx
@@ -314,7 +314,7 @@
           <w:r>
             <w:fldChar w:fldCharType="separate"/>
           </w:r>
-          <w:hyperlink w:anchor="_Toc243923757" w:history="1">
+          <w:hyperlink w:anchor="_Toc243925912" w:history="1">
             <w:r>
               <w:rPr>
                 <w:rStyle w:val="Hyperlink"/>
@@ -341,7 +341,7 @@
                 <w:noProof/>
                 <w:webHidden/>
               </w:rPr>
-              <w:instrText xml:space="preserve"> PAGEREF _Toc243923757 \h </w:instrText>
+              <w:instrText xml:space="preserve"> PAGEREF _Toc243925912 \h </w:instrText>
             </w:r>
             <w:r>
               <w:rPr>
@@ -388,7 +388,7 @@
               <w14:ligatures w14:val="standardContextual"/>
             </w:rPr>
           </w:pPr>
-          <w:hyperlink w:anchor="_Toc243923758" w:history="1">
+          <w:hyperlink w:anchor="_Toc243925913" w:history="1">
             <w:r>
               <w:rPr>
                 <w:rStyle w:val="Hyperlink"/>
@@ -415,7 +415,7 @@
                 <w:noProof/>
                 <w:webHidden/>
               </w:rPr>
-              <w:instrText xml:space="preserve"> PAGEREF _Toc243923758 \h </w:instrText>
+              <w:instrText xml:space="preserve"> PAGEREF _Toc243925913 \h </w:instrText>
             </w:r>
             <w:r>
               <w:rPr>
@@ -462,7 +462,7 @@
               <w14:ligatures w14:val="standardContextual"/>
             </w:rPr>
           </w:pPr>
-          <w:hyperlink w:anchor="_Toc243923759" w:history="1">
+          <w:hyperlink w:anchor="_Toc243925914" w:history="1">
             <w:r>
               <w:rPr>
                 <w:rStyle w:val="Hyperlink"/>
@@ -489,7 +489,7 @@
                 <w:noProof/>
                 <w:webHidden/>
               </w:rPr>
-              <w:instrText xml:space="preserve"> PAGEREF _Toc243923759 \h </w:instrText>
+              <w:instrText xml:space="preserve"> PAGEREF _Toc243925914 \h </w:instrText>
             </w:r>
             <w:r>
               <w:rPr>
@@ -536,7 +536,7 @@
               <w14:ligatures w14:val="standardContextual"/>
             </w:rPr>
           </w:pPr>
-          <w:hyperlink w:anchor="_Toc243923760" w:history="1">
+          <w:hyperlink w:anchor="_Toc243925915" w:history="1">
             <w:r>
               <w:rPr>
                 <w:rStyle w:val="Hyperlink"/>
@@ -563,7 +563,7 @@
                 <w:noProof/>
                 <w:webHidden/>
               </w:rPr>
-              <w:instrText xml:space="preserve"> PAGEREF _Toc243923760 \h </w:instrText>
+              <w:instrText xml:space="preserve"> PAGEREF _Toc243925915 \h </w:instrText>
             </w:r>
             <w:r>
               <w:rPr>
@@ -610,7 +610,7 @@
               <w14:ligatures w14:val="standardContextual"/>
             </w:rPr>
           </w:pPr>
-          <w:hyperlink w:anchor="_Toc243923761" w:history="1">
+          <w:hyperlink w:anchor="_Toc243925916" w:history="1">
             <w:r>
               <w:rPr>
                 <w:rStyle w:val="Hyperlink"/>
@@ -637,7 +637,7 @@
                 <w:noProof/>
                 <w:webHidden/>
               </w:rPr>
-              <w:instrText xml:space="preserve"> PAGEREF _Toc243923761 \h </w:instrText>
+              <w:instrText xml:space="preserve"> PAGEREF _Toc243925916 \h </w:instrText>
             </w:r>
             <w:r>
               <w:rPr>
@@ -684,7 +684,7 @@
               <w14:ligatures w14:val="standardContextual"/>
             </w:rPr>
           </w:pPr>
-          <w:hyperlink w:anchor="_Toc243923762" w:history="1">
+          <w:hyperlink w:anchor="_Toc243925917" w:history="1">
             <w:r>
               <w:rPr>
                 <w:rStyle w:val="Hyperlink"/>
@@ -711,7 +711,7 @@
                 <w:noProof/>
                 <w:webHidden/>
               </w:rPr>
-              <w:instrText xml:space="preserve"> PAGEREF _Toc243923762 \h </w:instrText>
+              <w:instrText xml:space="preserve"> PAGEREF _Toc243925917 \h </w:instrText>
             </w:r>
             <w:r>
               <w:rPr>
@@ -758,7 +758,7 @@
               <w14:ligatures w14:val="standardContextual"/>
             </w:rPr>
           </w:pPr>
-          <w:hyperlink w:anchor="_Toc243923763" w:history="1">
+          <w:hyperlink w:anchor="_Toc243925918" w:history="1">
             <w:r>
               <w:rPr>
                 <w:rStyle w:val="Hyperlink"/>
@@ -785,7 +785,7 @@
                 <w:noProof/>
                 <w:webHidden/>
               </w:rPr>
-              <w:instrText xml:space="preserve"> PAGEREF _Toc243923763 \h </w:instrText>
+              <w:instrText xml:space="preserve"> PAGEREF _Toc243925918 \h </w:instrText>
             </w:r>
             <w:r>
               <w:rPr>
@@ -832,7 +832,7 @@
               <w14:ligatures w14:val="standardContextual"/>
             </w:rPr>
           </w:pPr>
-          <w:hyperlink w:anchor="_Toc243923764" w:history="1">
+          <w:hyperlink w:anchor="_Toc243925919" w:history="1">
             <w:r>
               <w:rPr>
                 <w:rStyle w:val="Hyperlink"/>
@@ -859,7 +859,7 @@
                 <w:noProof/>
                 <w:webHidden/>
               </w:rPr>
-              <w:instrText xml:space="preserve"> PAGEREF _Toc243923764 \h </w:instrText>
+              <w:instrText xml:space="preserve"> PAGEREF _Toc243925919 \h </w:instrText>
             </w:r>
             <w:r>
               <w:rPr>
@@ -906,7 +906,7 @@
               <w14:ligatures w14:val="standardContextual"/>
             </w:rPr>
           </w:pPr>
-          <w:hyperlink w:anchor="_Toc243923765" w:history="1">
+          <w:hyperlink w:anchor="_Toc243925920" w:history="1">
             <w:r>
               <w:rPr>
                 <w:rStyle w:val="Hyperlink"/>
@@ -933,7 +933,7 @@
                 <w:noProof/>
                 <w:webHidden/>
               </w:rPr>
-              <w:instrText xml:space="preserve"> PAGEREF _Toc243923765 \h </w:instrText>
+              <w:instrText xml:space="preserve"> PAGEREF _Toc243925920 \h </w:instrText>
             </w:r>
             <w:r>
               <w:rPr>
@@ -980,7 +980,7 @@
               <w14:ligatures w14:val="standardContextual"/>
             </w:rPr>
           </w:pPr>
-          <w:hyperlink w:anchor="_Toc243923766" w:history="1">
+          <w:hyperlink w:anchor="_Toc243925921" w:history="1">
             <w:r>
               <w:rPr>
                 <w:rStyle w:val="Hyperlink"/>
@@ -1007,7 +1007,7 @@
                 <w:noProof/>
                 <w:webHidden/>
               </w:rPr>
-              <w:instrText xml:space="preserve"> PAGEREF _Toc243923766 \h </w:instrText>
+              <w:instrText xml:space="preserve"> PAGEREF _Toc243925921 \h </w:instrText>
             </w:r>
             <w:r>
               <w:rPr>
@@ -1054,7 +1054,7 @@
               <w14:ligatures w14:val="standardContextual"/>
             </w:rPr>
           </w:pPr>
-          <w:hyperlink w:anchor="_Toc243923767" w:history="1">
+          <w:hyperlink w:anchor="_Toc243925922" w:history="1">
             <w:r>
               <w:rPr>
                 <w:rStyle w:val="Hyperlink"/>
@@ -1081,7 +1081,7 @@
                 <w:noProof/>
                 <w:webHidden/>
               </w:rPr>
-              <w:instrText xml:space="preserve"> PAGEREF _Toc243923767 \h </w:instrText>
+              <w:instrText xml:space="preserve"> PAGEREF _Toc243925922 \h </w:instrText>
             </w:r>
             <w:r>
               <w:rPr>
@@ -1128,7 +1128,7 @@
               <w14:ligatures w14:val="standardContextual"/>
             </w:rPr>
           </w:pPr>
-          <w:hyperlink w:anchor="_Toc243923768" w:history="1">
+          <w:hyperlink w:anchor="_Toc243925923" w:history="1">
             <w:r>
               <w:rPr>
                 <w:rStyle w:val="Hyperlink"/>
@@ -1155,7 +1155,7 @@
                 <w:noProof/>
                 <w:webHidden/>
               </w:rPr>
-              <w:instrText xml:space="preserve"> PAGEREF _Toc243923768 \h </w:instrText>
+              <w:instrText xml:space="preserve"> PAGEREF _Toc243925923 \h </w:instrText>
             </w:r>
             <w:r>
               <w:rPr>
@@ -1202,7 +1202,7 @@
               <w14:ligatures w14:val="standardContextual"/>
             </w:rPr>
           </w:pPr>
-          <w:hyperlink w:anchor="_Toc243923769" w:history="1">
+          <w:hyperlink w:anchor="_Toc243925924" w:history="1">
             <w:r>
               <w:rPr>
                 <w:rStyle w:val="Hyperlink"/>
@@ -1229,7 +1229,7 @@
                 <w:noProof/>
                 <w:webHidden/>
               </w:rPr>
-              <w:instrText xml:space="preserve"> PAGEREF _Toc243923769 \h </w:instrText>
+              <w:instrText xml:space="preserve"> PAGEREF _Toc243925924 \h </w:instrText>
             </w:r>
             <w:r>
               <w:rPr>
@@ -1276,7 +1276,7 @@
               <w14:ligatures w14:val="standardContextual"/>
             </w:rPr>
           </w:pPr>
-          <w:hyperlink w:anchor="_Toc243923770" w:history="1">
+          <w:hyperlink w:anchor="_Toc243925925" w:history="1">
             <w:r>
               <w:rPr>
                 <w:rStyle w:val="Hyperlink"/>
@@ -1303,7 +1303,7 @@
                 <w:noProof/>
                 <w:webHidden/>
               </w:rPr>
-              <w:instrText xml:space="preserve"> PAGEREF _Toc243923770 \h </w:instrText>
+              <w:instrText xml:space="preserve"> PAGEREF _Toc243925925 \h </w:instrText>
             </w:r>
             <w:r>
               <w:rPr>
@@ -1350,7 +1350,7 @@
               <w14:ligatures w14:val="standardContextual"/>
             </w:rPr>
           </w:pPr>
-          <w:hyperlink w:anchor="_Toc243923771" w:history="1">
+          <w:hyperlink w:anchor="_Toc243925926" w:history="1">
             <w:r>
               <w:rPr>
                 <w:rStyle w:val="Hyperlink"/>
@@ -1377,7 +1377,7 @@
                 <w:noProof/>
                 <w:webHidden/>
               </w:rPr>
-              <w:instrText xml:space="preserve"> PAGEREF _Toc243923771 \h </w:instrText>
+              <w:instrText xml:space="preserve"> PAGEREF _Toc243925926 \h </w:instrText>
             </w:r>
             <w:r>
               <w:rPr>
@@ -1424,7 +1424,7 @@
               <w14:ligatures w14:val="standardContextual"/>
             </w:rPr>
           </w:pPr>
-          <w:hyperlink w:anchor="_Toc243923772" w:history="1">
+          <w:hyperlink w:anchor="_Toc243925927" w:history="1">
             <w:r>
               <w:rPr>
                 <w:rStyle w:val="Hyperlink"/>
@@ -1451,7 +1451,7 @@
                 <w:noProof/>
                 <w:webHidden/>
               </w:rPr>
-              <w:instrText xml:space="preserve"> PAGEREF _Toc243923772 \h </w:instrText>
+              <w:instrText xml:space="preserve"> PAGEREF _Toc243925927 \h </w:instrText>
             </w:r>
             <w:r>
               <w:rPr>
@@ -1498,7 +1498,7 @@
               <w14:ligatures w14:val="standardContextual"/>
             </w:rPr>
           </w:pPr>
-          <w:hyperlink w:anchor="_Toc243923773" w:history="1">
+          <w:hyperlink w:anchor="_Toc243925928" w:history="1">
             <w:r>
               <w:rPr>
                 <w:rStyle w:val="Hyperlink"/>
@@ -1525,7 +1525,7 @@
                 <w:noProof/>
                 <w:webHidden/>
               </w:rPr>
-              <w:instrText xml:space="preserve"> PAGEREF _Toc243923773 \h </w:instrText>
+              <w:instrText xml:space="preserve"> PAGEREF _Toc243925928 \h </w:instrText>
             </w:r>
             <w:r>
               <w:rPr>
@@ -1572,7 +1572,7 @@
               <w14:ligatures w14:val="standardContextual"/>
             </w:rPr>
           </w:pPr>
-          <w:hyperlink w:anchor="_Toc243923774" w:history="1">
+          <w:hyperlink w:anchor="_Toc243925929" w:history="1">
             <w:r>
               <w:rPr>
                 <w:rStyle w:val="Hyperlink"/>
@@ -1599,7 +1599,7 @@
                 <w:noProof/>
                 <w:webHidden/>
               </w:rPr>
-              <w:instrText xml:space="preserve"> PAGEREF _Toc243923774 \h </w:instrText>
+              <w:instrText xml:space="preserve"> PAGEREF _Toc243925929 \h </w:instrText>
             </w:r>
             <w:r>
               <w:rPr>
@@ -1646,7 +1646,7 @@
               <w14:ligatures w14:val="standardContextual"/>
             </w:rPr>
           </w:pPr>
-          <w:hyperlink w:anchor="_Toc243923775" w:history="1">
+          <w:hyperlink w:anchor="_Toc243925930" w:history="1">
             <w:r>
               <w:rPr>
                 <w:rStyle w:val="Hyperlink"/>
@@ -1673,7 +1673,7 @@
                 <w:noProof/>
                 <w:webHidden/>
               </w:rPr>
-              <w:instrText xml:space="preserve"> PAGEREF _Toc243923775 \h </w:instrText>
+              <w:instrText xml:space="preserve"> PAGEREF _Toc243925930 \h </w:instrText>
             </w:r>
             <w:r>
               <w:rPr>
@@ -1720,7 +1720,7 @@
               <w14:ligatures w14:val="standardContextual"/>
             </w:rPr>
           </w:pPr>
-          <w:hyperlink w:anchor="_Toc243923776" w:history="1">
+          <w:hyperlink w:anchor="_Toc243925931" w:history="1">
             <w:r>
               <w:rPr>
                 <w:rStyle w:val="Hyperlink"/>
@@ -1747,7 +1747,7 @@
                 <w:noProof/>
                 <w:webHidden/>
               </w:rPr>
-              <w:instrText xml:space="preserve"> PAGEREF _Toc243923776 \h </w:instrText>
+              <w:instrText xml:space="preserve"> PAGEREF _Toc243925931 \h </w:instrText>
             </w:r>
             <w:r>
               <w:rPr>
@@ -1794,7 +1794,7 @@
               <w14:ligatures w14:val="standardContextual"/>
             </w:rPr>
           </w:pPr>
-          <w:hyperlink w:anchor="_Toc243923777" w:history="1">
+          <w:hyperlink w:anchor="_Toc243925932" w:history="1">
             <w:r>
               <w:rPr>
                 <w:rStyle w:val="Hyperlink"/>
@@ -1821,7 +1821,7 @@
                 <w:noProof/>
                 <w:webHidden/>
               </w:rPr>
-              <w:instrText xml:space="preserve"> PAGEREF _Toc243923777 \h </w:instrText>
+              <w:instrText xml:space="preserve"> PAGEREF _Toc243925932 \h </w:instrText>
             </w:r>
             <w:r>
               <w:rPr>
@@ -1868,7 +1868,7 @@
               <w14:ligatures w14:val="standardContextual"/>
             </w:rPr>
           </w:pPr>
-          <w:hyperlink w:anchor="_Toc243923778" w:history="1">
+          <w:hyperlink w:anchor="_Toc243925933" w:history="1">
             <w:r>
               <w:rPr>
                 <w:rStyle w:val="Hyperlink"/>
@@ -1895,7 +1895,7 @@
                 <w:noProof/>
                 <w:webHidden/>
               </w:rPr>
-              <w:instrText xml:space="preserve"> PAGEREF _Toc243923778 \h </w:instrText>
+              <w:instrText xml:space="preserve"> PAGEREF _Toc243925933 \h </w:instrText>
             </w:r>
             <w:r>
               <w:rPr>
@@ -1942,7 +1942,7 @@
               <w14:ligatures w14:val="standardContextual"/>
             </w:rPr>
           </w:pPr>
-          <w:hyperlink w:anchor="_Toc243923779" w:history="1">
+          <w:hyperlink w:anchor="_Toc243925934" w:history="1">
             <w:r>
               <w:rPr>
                 <w:rStyle w:val="Hyperlink"/>
@@ -1969,7 +1969,7 @@
                 <w:noProof/>
                 <w:webHidden/>
               </w:rPr>
-              <w:instrText xml:space="preserve"> PAGEREF _Toc243923779 \h </w:instrText>
+              <w:instrText xml:space="preserve"> PAGEREF _Toc243925934 \h </w:instrText>
             </w:r>
             <w:r>
               <w:rPr>
@@ -2016,7 +2016,7 @@
               <w14:ligatures w14:val="standardContextual"/>
             </w:rPr>
           </w:pPr>
-          <w:hyperlink w:anchor="_Toc243923780" w:history="1">
+          <w:hyperlink w:anchor="_Toc243925935" w:history="1">
             <w:r>
               <w:rPr>
                 <w:rStyle w:val="Hyperlink"/>
@@ -2043,7 +2043,7 @@
                 <w:noProof/>
                 <w:webHidden/>
               </w:rPr>
-              <w:instrText xml:space="preserve"> PAGEREF _Toc243923780 \h </w:instrText>
+              <w:instrText xml:space="preserve"> PAGEREF _Toc243925935 \h </w:instrText>
             </w:r>
             <w:r>
               <w:rPr>
@@ -2090,7 +2090,7 @@
               <w14:ligatures w14:val="standardContextual"/>
             </w:rPr>
           </w:pPr>
-          <w:hyperlink w:anchor="_Toc243923781" w:history="1">
+          <w:hyperlink w:anchor="_Toc243925936" w:history="1">
             <w:r>
               <w:rPr>
                 <w:rStyle w:val="Hyperlink"/>
@@ -2117,7 +2117,7 @@
                 <w:noProof/>
                 <w:webHidden/>
               </w:rPr>
-              <w:instrText xml:space="preserve"> PAGEREF _Toc243923781 \h </w:instrText>
+              <w:instrText xml:space="preserve"> PAGEREF _Toc243925936 \h </w:instrText>
             </w:r>
             <w:r>
               <w:rPr>
@@ -2164,7 +2164,7 @@
               <w14:ligatures w14:val="standardContextual"/>
             </w:rPr>
           </w:pPr>
-          <w:hyperlink w:anchor="_Toc243923782" w:history="1">
+          <w:hyperlink w:anchor="_Toc243925937" w:history="1">
             <w:r>
               <w:rPr>
                 <w:rStyle w:val="Hyperlink"/>
@@ -2191,7 +2191,7 @@
                 <w:noProof/>
                 <w:webHidden/>
               </w:rPr>
-              <w:instrText xml:space="preserve"> PAGEREF _Toc243923782 \h </w:instrText>
+              <w:instrText xml:space="preserve"> PAGEREF _Toc243925937 \h </w:instrText>
             </w:r>
             <w:r>
               <w:rPr>
@@ -2238,7 +2238,7 @@
               <w14:ligatures w14:val="standardContextual"/>
             </w:rPr>
           </w:pPr>
-          <w:hyperlink w:anchor="_Toc243923783" w:history="1">
+          <w:hyperlink w:anchor="_Toc243925938" w:history="1">
             <w:r>
               <w:rPr>
                 <w:rStyle w:val="Hyperlink"/>
@@ -2265,7 +2265,7 @@
                 <w:noProof/>
                 <w:webHidden/>
               </w:rPr>
-              <w:instrText xml:space="preserve"> PAGEREF _Toc243923783 \h </w:instrText>
+              <w:instrText xml:space="preserve"> PAGEREF _Toc243925938 \h </w:instrText>
             </w:r>
             <w:r>
               <w:rPr>
@@ -2312,7 +2312,7 @@
               <w14:ligatures w14:val="standardContextual"/>
             </w:rPr>
           </w:pPr>
-          <w:hyperlink w:anchor="_Toc243923784" w:history="1">
+          <w:hyperlink w:anchor="_Toc243925939" w:history="1">
             <w:r>
               <w:rPr>
                 <w:rStyle w:val="Hyperlink"/>
@@ -2339,7 +2339,7 @@
                 <w:noProof/>
                 <w:webHidden/>
               </w:rPr>
-              <w:instrText xml:space="preserve"> PAGEREF _Toc243923784 \h </w:instrText>
+              <w:instrText xml:space="preserve"> PAGEREF _Toc243925939 \h </w:instrText>
             </w:r>
             <w:r>
               <w:rPr>
@@ -2386,7 +2386,7 @@
               <w14:ligatures w14:val="standardContextual"/>
             </w:rPr>
           </w:pPr>
-          <w:hyperlink w:anchor="_Toc243923785" w:history="1">
+          <w:hyperlink w:anchor="_Toc243925940" w:history="1">
             <w:r>
               <w:rPr>
                 <w:rStyle w:val="Hyperlink"/>
@@ -2413,7 +2413,7 @@
                 <w:noProof/>
                 <w:webHidden/>
               </w:rPr>
-              <w:instrText xml:space="preserve"> PAGEREF _Toc243923785 \h </w:instrText>
+              <w:instrText xml:space="preserve"> PAGEREF _Toc243925940 \h </w:instrText>
             </w:r>
             <w:r>
               <w:rPr>
@@ -2460,7 +2460,7 @@
               <w14:ligatures w14:val="standardContextual"/>
             </w:rPr>
           </w:pPr>
-          <w:hyperlink w:anchor="_Toc243923786" w:history="1">
+          <w:hyperlink w:anchor="_Toc243925941" w:history="1">
             <w:r>
               <w:rPr>
                 <w:rStyle w:val="Hyperlink"/>
@@ -2487,7 +2487,7 @@
                 <w:noProof/>
                 <w:webHidden/>
               </w:rPr>
-              <w:instrText xml:space="preserve"> PAGEREF _Toc243923786 \h </w:instrText>
+              <w:instrText xml:space="preserve"> PAGEREF _Toc243925941 \h </w:instrText>
             </w:r>
             <w:r>
               <w:rPr>
@@ -2534,7 +2534,7 @@
               <w14:ligatures w14:val="standardContextual"/>
             </w:rPr>
           </w:pPr>
-          <w:hyperlink w:anchor="_Toc243923787" w:history="1">
+          <w:hyperlink w:anchor="_Toc243925942" w:history="1">
             <w:r>
               <w:rPr>
                 <w:rStyle w:val="Hyperlink"/>
@@ -2561,7 +2561,7 @@
                 <w:noProof/>
                 <w:webHidden/>
               </w:rPr>
-              <w:instrText xml:space="preserve"> PAGEREF _Toc243923787 \h </w:instrText>
+              <w:instrText xml:space="preserve"> PAGEREF _Toc243925942 \h </w:instrText>
             </w:r>
             <w:r>
               <w:rPr>
@@ -2608,7 +2608,7 @@
               <w14:ligatures w14:val="standardContextual"/>
             </w:rPr>
           </w:pPr>
-          <w:hyperlink w:anchor="_Toc243923788" w:history="1">
+          <w:hyperlink w:anchor="_Toc243925943" w:history="1">
             <w:r>
               <w:rPr>
                 <w:rStyle w:val="Hyperlink"/>
@@ -2635,7 +2635,7 @@
                 <w:noProof/>
                 <w:webHidden/>
               </w:rPr>
-              <w:instrText xml:space="preserve"> PAGEREF _Toc243923788 \h </w:instrText>
+              <w:instrText xml:space="preserve"> PAGEREF _Toc243925943 \h </w:instrText>
             </w:r>
             <w:r>
               <w:rPr>
@@ -2682,7 +2682,7 @@
               <w14:ligatures w14:val="standardContextual"/>
             </w:rPr>
           </w:pPr>
-          <w:hyperlink w:anchor="_Toc243923789" w:history="1">
+          <w:hyperlink w:anchor="_Toc243925944" w:history="1">
             <w:r>
               <w:rPr>
                 <w:rStyle w:val="Hyperlink"/>
@@ -2709,7 +2709,7 @@
                 <w:noProof/>
                 <w:webHidden/>
               </w:rPr>
-              <w:instrText xml:space="preserve"> PAGEREF _Toc243923789 \h </w:instrText>
+              <w:instrText xml:space="preserve"> PAGEREF _Toc243925944 \h </w:instrText>
             </w:r>
             <w:r>
               <w:rPr>
@@ -2756,7 +2756,7 @@
               <w14:ligatures w14:val="standardContextual"/>
             </w:rPr>
           </w:pPr>
-          <w:hyperlink w:anchor="_Toc243923790" w:history="1">
+          <w:hyperlink w:anchor="_Toc243925945" w:history="1">
             <w:r>
               <w:rPr>
                 <w:rStyle w:val="Hyperlink"/>
@@ -2783,7 +2783,7 @@
                 <w:noProof/>
                 <w:webHidden/>
               </w:rPr>
-              <w:instrText xml:space="preserve"> PAGEREF _Toc243923790 \h </w:instrText>
+              <w:instrText xml:space="preserve"> PAGEREF _Toc243925945 \h </w:instrText>
             </w:r>
             <w:r>
               <w:rPr>
@@ -2830,7 +2830,7 @@
               <w14:ligatures w14:val="standardContextual"/>
             </w:rPr>
           </w:pPr>
-          <w:hyperlink w:anchor="_Toc243923791" w:history="1">
+          <w:hyperlink w:anchor="_Toc243925946" w:history="1">
             <w:r>
               <w:rPr>
                 <w:rStyle w:val="Hyperlink"/>
@@ -2857,7 +2857,7 @@
                 <w:noProof/>
                 <w:webHidden/>
               </w:rPr>
-              <w:instrText xml:space="preserve"> PAGEREF _Toc243923791 \h </w:instrText>
+              <w:instrText xml:space="preserve"> PAGEREF _Toc243925946 \h </w:instrText>
             </w:r>
             <w:r>
               <w:rPr>
@@ -2904,7 +2904,7 @@
               <w14:ligatures w14:val="standardContextual"/>
             </w:rPr>
           </w:pPr>
-          <w:hyperlink w:anchor="_Toc243923792" w:history="1">
+          <w:hyperlink w:anchor="_Toc243925947" w:history="1">
             <w:r>
               <w:rPr>
                 <w:rStyle w:val="Hyperlink"/>
@@ -2931,7 +2931,7 @@
                 <w:noProof/>
                 <w:webHidden/>
               </w:rPr>
-              <w:instrText xml:space="preserve"> PAGEREF _Toc243923792 \h </w:instrText>
+              <w:instrText xml:space="preserve"> PAGEREF _Toc243925947 \h </w:instrText>
             </w:r>
             <w:r>
               <w:rPr>
@@ -2978,7 +2978,7 @@
               <w14:ligatures w14:val="standardContextual"/>
             </w:rPr>
           </w:pPr>
-          <w:hyperlink w:anchor="_Toc243923793" w:history="1">
+          <w:hyperlink w:anchor="_Toc243925948" w:history="1">
             <w:r>
               <w:rPr>
                 <w:rStyle w:val="Hyperlink"/>
@@ -3005,7 +3005,7 @@
                 <w:noProof/>
                 <w:webHidden/>
               </w:rPr>
-              <w:instrText xml:space="preserve"> PAGEREF _Toc243923793 \h </w:instrText>
+              <w:instrText xml:space="preserve"> PAGEREF _Toc243925948 \h </w:instrText>
             </w:r>
             <w:r>
               <w:rPr>
@@ -3052,7 +3052,7 @@
               <w14:ligatures w14:val="standardContextual"/>
             </w:rPr>
           </w:pPr>
-          <w:hyperlink w:anchor="_Toc243923794" w:history="1">
+          <w:hyperlink w:anchor="_Toc243925949" w:history="1">
             <w:r>
               <w:rPr>
                 <w:rStyle w:val="Hyperlink"/>
@@ -3079,7 +3079,7 @@
                 <w:noProof/>
                 <w:webHidden/>
               </w:rPr>
-              <w:instrText xml:space="preserve"> PAGEREF _Toc243923794 \h </w:instrText>
+              <w:instrText xml:space="preserve"> PAGEREF _Toc243925949 \h </w:instrText>
             </w:r>
             <w:r>
               <w:rPr>
@@ -3126,7 +3126,7 @@
               <w14:ligatures w14:val="standardContextual"/>
             </w:rPr>
           </w:pPr>
-          <w:hyperlink w:anchor="_Toc243923795" w:history="1">
+          <w:hyperlink w:anchor="_Toc243925950" w:history="1">
             <w:r>
               <w:rPr>
                 <w:rStyle w:val="Hyperlink"/>
@@ -3153,7 +3153,7 @@
                 <w:noProof/>
                 <w:webHidden/>
               </w:rPr>
-              <w:instrText xml:space="preserve"> PAGEREF _Toc243923795 \h </w:instrText>
+              <w:instrText xml:space="preserve"> PAGEREF _Toc243925950 \h </w:instrText>
             </w:r>
             <w:r>
               <w:rPr>
@@ -3200,7 +3200,7 @@
               <w14:ligatures w14:val="standardContextual"/>
             </w:rPr>
           </w:pPr>
-          <w:hyperlink w:anchor="_Toc243923796" w:history="1">
+          <w:hyperlink w:anchor="_Toc243925951" w:history="1">
             <w:r>
               <w:rPr>
                 <w:rStyle w:val="Hyperlink"/>
@@ -3227,7 +3227,7 @@
                 <w:noProof/>
                 <w:webHidden/>
               </w:rPr>
-              <w:instrText xml:space="preserve"> PAGEREF _Toc243923796 \h </w:instrText>
+              <w:instrText xml:space="preserve"> PAGEREF _Toc243925951 \h </w:instrText>
             </w:r>
             <w:r>
               <w:rPr>
@@ -3274,7 +3274,7 @@
               <w14:ligatures w14:val="standardContextual"/>
             </w:rPr>
           </w:pPr>
-          <w:hyperlink w:anchor="_Toc243923797" w:history="1">
+          <w:hyperlink w:anchor="_Toc243925952" w:history="1">
             <w:r>
               <w:rPr>
                 <w:rStyle w:val="Hyperlink"/>
@@ -3301,7 +3301,7 @@
                 <w:noProof/>
                 <w:webHidden/>
               </w:rPr>
-              <w:instrText xml:space="preserve"> PAGEREF _Toc243923797 \h </w:instrText>
+              <w:instrText xml:space="preserve"> PAGEREF _Toc243925952 \h </w:instrText>
             </w:r>
             <w:r>
               <w:rPr>
@@ -3348,7 +3348,7 @@
               <w14:ligatures w14:val="standardContextual"/>
             </w:rPr>
           </w:pPr>
-          <w:hyperlink w:anchor="_Toc243923798" w:history="1">
+          <w:hyperlink w:anchor="_Toc243925953" w:history="1">
             <w:r>
               <w:rPr>
                 <w:rStyle w:val="Hyperlink"/>
@@ -3375,7 +3375,7 @@
                 <w:noProof/>
                 <w:webHidden/>
               </w:rPr>
-              <w:instrText xml:space="preserve"> PAGEREF _Toc243923798 \h </w:instrText>
+              <w:instrText xml:space="preserve"> PAGEREF _Toc243925953 \h </w:instrText>
             </w:r>
             <w:r>
               <w:rPr>
@@ -3422,7 +3422,7 @@
               <w14:ligatures w14:val="standardContextual"/>
             </w:rPr>
           </w:pPr>
-          <w:hyperlink w:anchor="_Toc243923799" w:history="1">
+          <w:hyperlink w:anchor="_Toc243925954" w:history="1">
             <w:r>
               <w:rPr>
                 <w:rStyle w:val="Hyperlink"/>
@@ -3449,7 +3449,7 @@
                 <w:noProof/>
                 <w:webHidden/>
               </w:rPr>
-              <w:instrText xml:space="preserve"> PAGEREF _Toc243923799 \h </w:instrText>
+              <w:instrText xml:space="preserve"> PAGEREF _Toc243925954 \h </w:instrText>
             </w:r>
             <w:r>
               <w:rPr>
@@ -3496,7 +3496,7 @@
               <w14:ligatures w14:val="standardContextual"/>
             </w:rPr>
           </w:pPr>
-          <w:hyperlink w:anchor="_Toc243923800" w:history="1">
+          <w:hyperlink w:anchor="_Toc243925955" w:history="1">
             <w:r>
               <w:rPr>
                 <w:rStyle w:val="Hyperlink"/>
@@ -3523,7 +3523,7 @@
                 <w:noProof/>
                 <w:webHidden/>
               </w:rPr>
-              <w:instrText xml:space="preserve"> PAGEREF _Toc243923800 \h </w:instrText>
+              <w:instrText xml:space="preserve"> PAGEREF _Toc243925955 \h </w:instrText>
             </w:r>
             <w:r>
               <w:rPr>
@@ -3570,7 +3570,7 @@
               <w14:ligatures w14:val="standardContextual"/>
             </w:rPr>
           </w:pPr>
-          <w:hyperlink w:anchor="_Toc243923801" w:history="1">
+          <w:hyperlink w:anchor="_Toc243925956" w:history="1">
             <w:r>
               <w:rPr>
                 <w:rStyle w:val="Hyperlink"/>
@@ -3597,7 +3597,7 @@
                 <w:noProof/>
                 <w:webHidden/>
               </w:rPr>
-              <w:instrText xml:space="preserve"> PAGEREF _Toc243923801 \h </w:instrText>
+              <w:instrText xml:space="preserve"> PAGEREF _Toc243925956 \h </w:instrText>
             </w:r>
             <w:r>
               <w:rPr>
@@ -3644,7 +3644,7 @@
               <w14:ligatures w14:val="standardContextual"/>
             </w:rPr>
           </w:pPr>
-          <w:hyperlink w:anchor="_Toc243923802" w:history="1">
+          <w:hyperlink w:anchor="_Toc243925957" w:history="1">
             <w:r>
               <w:rPr>
                 <w:rStyle w:val="Hyperlink"/>
@@ -3671,7 +3671,7 @@
                 <w:noProof/>
                 <w:webHidden/>
               </w:rPr>
-              <w:instrText xml:space="preserve"> PAGEREF _Toc243923802 \h </w:instrText>
+              <w:instrText xml:space="preserve"> PAGEREF _Toc243925957 \h </w:instrText>
             </w:r>
             <w:r>
               <w:rPr>
@@ -3718,7 +3718,7 @@
               <w14:ligatures w14:val="standardContextual"/>
             </w:rPr>
           </w:pPr>
-          <w:hyperlink w:anchor="_Toc243923803" w:history="1">
+          <w:hyperlink w:anchor="_Toc243925958" w:history="1">
             <w:r>
               <w:rPr>
                 <w:rStyle w:val="Hyperlink"/>
@@ -3745,7 +3745,7 @@
                 <w:noProof/>
                 <w:webHidden/>
               </w:rPr>
-              <w:instrText xml:space="preserve"> PAGEREF _Toc243923803 \h </w:instrText>
+              <w:instrText xml:space="preserve"> PAGEREF _Toc243925958 \h </w:instrText>
             </w:r>
             <w:r>
               <w:rPr>
@@ -3792,7 +3792,7 @@
               <w14:ligatures w14:val="standardContextual"/>
             </w:rPr>
           </w:pPr>
-          <w:hyperlink w:anchor="_Toc243923804" w:history="1">
+          <w:hyperlink w:anchor="_Toc243925959" w:history="1">
             <w:r>
               <w:rPr>
                 <w:rStyle w:val="Hyperlink"/>
@@ -3819,7 +3819,7 @@
                 <w:noProof/>
                 <w:webHidden/>
               </w:rPr>
-              <w:instrText xml:space="preserve"> PAGEREF _Toc243923804 \h </w:instrText>
+              <w:instrText xml:space="preserve"> PAGEREF _Toc243925959 \h </w:instrText>
             </w:r>
             <w:r>
               <w:rPr>
@@ -3866,7 +3866,7 @@
               <w14:ligatures w14:val="standardContextual"/>
             </w:rPr>
           </w:pPr>
-          <w:hyperlink w:anchor="_Toc243923805" w:history="1">
+          <w:hyperlink w:anchor="_Toc243925960" w:history="1">
             <w:r>
               <w:rPr>
                 <w:rStyle w:val="Hyperlink"/>
@@ -3893,7 +3893,7 @@
                 <w:noProof/>
                 <w:webHidden/>
               </w:rPr>
-              <w:instrText xml:space="preserve"> PAGEREF _Toc243923805 \h </w:instrText>
+              <w:instrText xml:space="preserve"> PAGEREF _Toc243925960 \h </w:instrText>
             </w:r>
             <w:r>
               <w:rPr>
@@ -3940,7 +3940,7 @@
               <w14:ligatures w14:val="standardContextual"/>
             </w:rPr>
           </w:pPr>
-          <w:hyperlink w:anchor="_Toc243923806" w:history="1">
+          <w:hyperlink w:anchor="_Toc243925961" w:history="1">
             <w:r>
               <w:rPr>
                 <w:rStyle w:val="Hyperlink"/>
@@ -3967,7 +3967,7 @@
                 <w:noProof/>
                 <w:webHidden/>
               </w:rPr>
-              <w:instrText xml:space="preserve"> PAGEREF _Toc243923806 \h </w:instrText>
+              <w:instrText xml:space="preserve"> PAGEREF _Toc243925961 \h </w:instrText>
             </w:r>
             <w:r>
               <w:rPr>
@@ -4014,7 +4014,7 @@
               <w14:ligatures w14:val="standardContextual"/>
             </w:rPr>
           </w:pPr>
-          <w:hyperlink w:anchor="_Toc243923807" w:history="1">
+          <w:hyperlink w:anchor="_Toc243925962" w:history="1">
             <w:r>
               <w:rPr>
                 <w:rStyle w:val="Hyperlink"/>
@@ -4041,7 +4041,7 @@
                 <w:noProof/>
                 <w:webHidden/>
               </w:rPr>
-              <w:instrText xml:space="preserve"> PAGEREF _Toc243923807 \h </w:instrText>
+              <w:instrText xml:space="preserve"> PAGEREF _Toc243925962 \h </w:instrText>
             </w:r>
             <w:r>
               <w:rPr>
@@ -4088,7 +4088,7 @@
               <w14:ligatures w14:val="standardContextual"/>
             </w:rPr>
           </w:pPr>
-          <w:hyperlink w:anchor="_Toc243923808" w:history="1">
+          <w:hyperlink w:anchor="_Toc243925963" w:history="1">
             <w:r>
               <w:rPr>
                 <w:rStyle w:val="Hyperlink"/>
@@ -4115,7 +4115,7 @@
                 <w:noProof/>
                 <w:webHidden/>
               </w:rPr>
-              <w:instrText xml:space="preserve"> PAGEREF _Toc243923808 \h </w:instrText>
+              <w:instrText xml:space="preserve"> PAGEREF _Toc243925963 \h </w:instrText>
             </w:r>
             <w:r>
               <w:rPr>
@@ -4162,7 +4162,7 @@
               <w14:ligatures w14:val="standardContextual"/>
             </w:rPr>
           </w:pPr>
-          <w:hyperlink w:anchor="_Toc243923809" w:history="1">
+          <w:hyperlink w:anchor="_Toc243925964" w:history="1">
             <w:r>
               <w:rPr>
                 <w:rStyle w:val="Hyperlink"/>
@@ -4189,7 +4189,7 @@
                 <w:noProof/>
                 <w:webHidden/>
               </w:rPr>
-              <w:instrText xml:space="preserve"> PAGEREF _Toc243923809 \h </w:instrText>
+              <w:instrText xml:space="preserve"> PAGEREF _Toc243925964 \h </w:instrText>
             </w:r>
             <w:r>
               <w:rPr>
@@ -4236,7 +4236,7 @@
               <w14:ligatures w14:val="standardContextual"/>
             </w:rPr>
           </w:pPr>
-          <w:hyperlink w:anchor="_Toc243923810" w:history="1">
+          <w:hyperlink w:anchor="_Toc243925965" w:history="1">
             <w:r>
               <w:rPr>
                 <w:rStyle w:val="Hyperlink"/>
@@ -4263,7 +4263,7 @@
                 <w:noProof/>
                 <w:webHidden/>
               </w:rPr>
-              <w:instrText xml:space="preserve"> PAGEREF _Toc243923810 \h </w:instrText>
+              <w:instrText xml:space="preserve"> PAGEREF _Toc243925965 \h </w:instrText>
             </w:r>
             <w:r>
               <w:rPr>
@@ -4310,7 +4310,7 @@
               <w14:ligatures w14:val="standardContextual"/>
             </w:rPr>
           </w:pPr>
-          <w:hyperlink w:anchor="_Toc243923811" w:history="1">
+          <w:hyperlink w:anchor="_Toc243925966" w:history="1">
             <w:r>
               <w:rPr>
                 <w:rStyle w:val="Hyperlink"/>
@@ -4337,7 +4337,7 @@
                 <w:noProof/>
                 <w:webHidden/>
               </w:rPr>
-              <w:instrText xml:space="preserve"> PAGEREF _Toc243923811 \h </w:instrText>
+              <w:instrText xml:space="preserve"> PAGEREF _Toc243925966 \h </w:instrText>
             </w:r>
             <w:r>
               <w:rPr>
@@ -4384,7 +4384,7 @@
               <w14:ligatures w14:val="standardContextual"/>
             </w:rPr>
           </w:pPr>
-          <w:hyperlink w:anchor="_Toc243923812" w:history="1">
+          <w:hyperlink w:anchor="_Toc243925967" w:history="1">
             <w:r>
               <w:rPr>
                 <w:rStyle w:val="Hyperlink"/>
@@ -4411,7 +4411,7 @@
                 <w:noProof/>
                 <w:webHidden/>
               </w:rPr>
-              <w:instrText xml:space="preserve"> PAGEREF _Toc243923812 \h </w:instrText>
+              <w:instrText xml:space="preserve"> PAGEREF _Toc243925967 \h </w:instrText>
             </w:r>
             <w:r>
               <w:rPr>
@@ -4458,7 +4458,7 @@
               <w14:ligatures w14:val="standardContextual"/>
             </w:rPr>
           </w:pPr>
-          <w:hyperlink w:anchor="_Toc243923813" w:history="1">
+          <w:hyperlink w:anchor="_Toc243925968" w:history="1">
             <w:r>
               <w:rPr>
                 <w:rStyle w:val="Hyperlink"/>
@@ -4485,7 +4485,7 @@
                 <w:noProof/>
                 <w:webHidden/>
               </w:rPr>
-              <w:instrText xml:space="preserve"> PAGEREF _Toc243923813 \h </w:instrText>
+              <w:instrText xml:space="preserve"> PAGEREF _Toc243925968 \h </w:instrText>
             </w:r>
             <w:r>
               <w:rPr>
@@ -4532,7 +4532,7 @@
               <w14:ligatures w14:val="standardContextual"/>
             </w:rPr>
           </w:pPr>
-          <w:hyperlink w:anchor="_Toc243923814" w:history="1">
+          <w:hyperlink w:anchor="_Toc243925969" w:history="1">
             <w:r>
               <w:rPr>
                 <w:rStyle w:val="Hyperlink"/>
@@ -4559,7 +4559,7 @@
                 <w:noProof/>
                 <w:webHidden/>
               </w:rPr>
-              <w:instrText xml:space="preserve"> PAGEREF _Toc243923814 \h </w:instrText>
+              <w:instrText xml:space="preserve"> PAGEREF _Toc243925969 \h </w:instrText>
             </w:r>
             <w:r>
               <w:rPr>
@@ -4606,7 +4606,7 @@
               <w14:ligatures w14:val="standardContextual"/>
             </w:rPr>
           </w:pPr>
-          <w:hyperlink w:anchor="_Toc243923815" w:history="1">
+          <w:hyperlink w:anchor="_Toc243925970" w:history="1">
             <w:r>
               <w:rPr>
                 <w:rStyle w:val="Hyperlink"/>
@@ -4633,7 +4633,7 @@
                 <w:noProof/>
                 <w:webHidden/>
               </w:rPr>
-              <w:instrText xml:space="preserve"> PAGEREF _Toc243923815 \h </w:instrText>
+              <w:instrText xml:space="preserve"> PAGEREF _Toc243925970 \h </w:instrText>
             </w:r>
             <w:r>
               <w:rPr>
@@ -4677,7 +4677,7 @@
         <w:pageBreakBefore/>
       </w:pPr>
       <w:bookmarkStart w:id="0" w:name="mở-đầu"/>
-      <w:bookmarkStart w:id="1" w:name="_Toc243923757"/>
+      <w:bookmarkStart w:id="1" w:name="_Toc243925912"/>
       <w:r>
         <w:lastRenderedPageBreak/>
         <w:t>Mở đầu</w:t>
@@ -4832,7 +4832,7 @@
         <w:pageBreakBefore/>
       </w:pPr>
       <w:bookmarkStart w:id="2" w:name="phần-a-giải-đấu"/>
-      <w:bookmarkStart w:id="3" w:name="_Toc243923758"/>
+      <w:bookmarkStart w:id="3" w:name="_Toc243925913"/>
       <w:bookmarkEnd w:id="0"/>
       <w:r>
         <w:lastRenderedPageBreak/>
@@ -4845,7 +4845,7 @@
         <w:pStyle w:val="Heading2"/>
       </w:pPr>
       <w:bookmarkStart w:id="4" w:name="a1-trò-chơi-ottv2"/>
-      <w:bookmarkStart w:id="5" w:name="_Toc243923759"/>
+      <w:bookmarkStart w:id="5" w:name="_Toc243925914"/>
       <w:r>
         <w:t>1. Trò chơi OTTv2</w:t>
       </w:r>
@@ -5126,7 +5126,7 @@
         <w:pStyle w:val="Heading2"/>
       </w:pPr>
       <w:bookmarkStart w:id="6" w:name="a2-tài-khoản-và-đội"/>
-      <w:bookmarkStart w:id="7" w:name="_Toc243923760"/>
+      <w:bookmarkStart w:id="7" w:name="_Toc243925915"/>
       <w:bookmarkEnd w:id="4"/>
       <w:r>
         <w:t>2. Tài khoản và đội</w:t>
@@ -5445,7 +5445,7 @@
         <w:pStyle w:val="Heading2"/>
       </w:pPr>
       <w:bookmarkStart w:id="8" w:name="a3-nộp-bot-qua-github"/>
-      <w:bookmarkStart w:id="9" w:name="_Toc243923761"/>
+      <w:bookmarkStart w:id="9" w:name="_Toc243925916"/>
       <w:bookmarkEnd w:id="6"/>
       <w:r>
         <w:t>3. Nộp bot qua GitHub</w:t>
@@ -5879,7 +5879,7 @@
         <w:pStyle w:val="Heading2"/>
       </w:pPr>
       <w:bookmarkStart w:id="10" w:name="a4-thể-lệ-và-lịch-đấu"/>
-      <w:bookmarkStart w:id="11" w:name="_Toc243923762"/>
+      <w:bookmarkStart w:id="11" w:name="_Toc243925917"/>
       <w:bookmarkEnd w:id="8"/>
       <w:r>
         <w:t>4. Thể lệ và lịch đấu</w:t>
@@ -5891,7 +5891,7 @@
         <w:pStyle w:val="Heading3"/>
       </w:pPr>
       <w:bookmarkStart w:id="12" w:name="ladder-trước-hạn"/>
-      <w:bookmarkStart w:id="13" w:name="_Toc243923763"/>
+      <w:bookmarkStart w:id="13" w:name="_Toc243925918"/>
       <w:r>
         <w:t>4.1. Ladder trước hạn</w:t>
       </w:r>
@@ -5951,7 +5951,7 @@
         <w:pStyle w:val="Heading3"/>
       </w:pPr>
       <w:bookmarkStart w:id="14" w:name="chốt-bài-tại-hạn"/>
-      <w:bookmarkStart w:id="15" w:name="_Toc243923764"/>
+      <w:bookmarkStart w:id="15" w:name="_Toc243925919"/>
       <w:bookmarkEnd w:id="12"/>
       <w:r>
         <w:lastRenderedPageBreak/>
@@ -5977,7 +5977,7 @@
         <w:pStyle w:val="Heading3"/>
       </w:pPr>
       <w:bookmarkStart w:id="16" w:name="xếp-hạng-chính-thức"/>
-      <w:bookmarkStart w:id="17" w:name="_Toc243923765"/>
+      <w:bookmarkStart w:id="17" w:name="_Toc243925920"/>
       <w:bookmarkEnd w:id="14"/>
       <w:r>
         <w:t>4.3. Xếp hạng chính thức</w:t>
@@ -6328,7 +6328,7 @@
         <w:pStyle w:val="Heading2"/>
       </w:pPr>
       <w:bookmarkStart w:id="18" w:name="a5-xem-kết-quả"/>
-      <w:bookmarkStart w:id="19" w:name="_Toc243923766"/>
+      <w:bookmarkStart w:id="19" w:name="_Toc243925921"/>
       <w:bookmarkEnd w:id="16"/>
       <w:bookmarkEnd w:id="10"/>
       <w:r>
@@ -6496,7 +6496,7 @@
         <w:pStyle w:val="Heading2"/>
       </w:pPr>
       <w:bookmarkStart w:id="20" w:name="a6-ban-tổ-chức-và-điều-hành"/>
-      <w:bookmarkStart w:id="21" w:name="_Toc243923767"/>
+      <w:bookmarkStart w:id="21" w:name="_Toc243925922"/>
       <w:bookmarkEnd w:id="18"/>
       <w:r>
         <w:t>6. Ban tổ chức và điều hành</w:t>
@@ -6615,7 +6615,7 @@
       <w:pPr>
         <w:pStyle w:val="Heading2"/>
       </w:pPr>
-      <w:bookmarkStart w:id="22" w:name="_Toc243923768"/>
+      <w:bookmarkStart w:id="22" w:name="_Toc243925923"/>
       <w:r>
         <w:t>7. Chung kết tại hội trường</w:t>
       </w:r>
@@ -7045,7 +7045,7 @@
         <w:pageBreakBefore/>
       </w:pPr>
       <w:bookmarkStart w:id="23" w:name="phần-b-thiết-kế-kỹ-thuật"/>
-      <w:bookmarkStart w:id="24" w:name="_Toc243923769"/>
+      <w:bookmarkStart w:id="24" w:name="_Toc243925924"/>
       <w:bookmarkEnd w:id="20"/>
       <w:bookmarkEnd w:id="2"/>
       <w:r>
@@ -7059,7 +7059,7 @@
         <w:pStyle w:val="Heading2"/>
       </w:pPr>
       <w:bookmarkStart w:id="25" w:name="b1-kiến-trúc-tổng-thể"/>
-      <w:bookmarkStart w:id="26" w:name="_Toc243923770"/>
+      <w:bookmarkStart w:id="26" w:name="_Toc243925925"/>
       <w:r>
         <w:t>1. Kiến trúc tổng thể</w:t>
       </w:r>
@@ -7161,7 +7161,7 @@
         <w:pStyle w:val="Heading2"/>
       </w:pPr>
       <w:bookmarkStart w:id="27" w:name="b2-dịch-vụ-được-dùng"/>
-      <w:bookmarkStart w:id="28" w:name="_Toc243923771"/>
+      <w:bookmarkStart w:id="28" w:name="_Toc243925926"/>
       <w:bookmarkEnd w:id="25"/>
       <w:r>
         <w:lastRenderedPageBreak/>
@@ -7493,7 +7493,7 @@
         <w:pStyle w:val="Heading2"/>
       </w:pPr>
       <w:bookmarkStart w:id="29" w:name="b3-hub-và-cách-phục-vụ-dữ-liệu"/>
-      <w:bookmarkStart w:id="30" w:name="_Toc243923772"/>
+      <w:bookmarkStart w:id="30" w:name="_Toc243925927"/>
       <w:bookmarkEnd w:id="27"/>
       <w:r>
         <w:t>3. Hub và cách phục vụ dữ liệu</w:t>
@@ -7572,7 +7572,7 @@
         <w:pStyle w:val="Heading2"/>
       </w:pPr>
       <w:bookmarkStart w:id="31" w:name="b4-máy-chấm-và-chia-việc"/>
-      <w:bookmarkStart w:id="32" w:name="_Toc243923773"/>
+      <w:bookmarkStart w:id="32" w:name="_Toc243925928"/>
       <w:bookmarkEnd w:id="29"/>
       <w:r>
         <w:t>4. Máy chấm và chia việc</w:t>
@@ -7695,7 +7695,7 @@
         <w:pStyle w:val="Heading2"/>
       </w:pPr>
       <w:bookmarkStart w:id="33" w:name="b5-sandbox-thay-docker"/>
-      <w:bookmarkStart w:id="34" w:name="_Toc243923774"/>
+      <w:bookmarkStart w:id="34" w:name="_Toc243925929"/>
       <w:bookmarkEnd w:id="31"/>
       <w:r>
         <w:t>5. Sandbox chạy bot</w:t>
@@ -7737,7 +7737,7 @@
         <w:pStyle w:val="Heading2"/>
       </w:pPr>
       <w:bookmarkStart w:id="35" w:name="b6-quỹ-giờ-và-khả-năng-đối-chiếu"/>
-      <w:bookmarkStart w:id="36" w:name="_Toc243923775"/>
+      <w:bookmarkStart w:id="36" w:name="_Toc243925930"/>
       <w:bookmarkEnd w:id="33"/>
       <w:r>
         <w:t>6. Quỹ giờ và khả năng đối chiếu</w:t>
@@ -7786,7 +7786,7 @@
         <w:pStyle w:val="Heading2"/>
       </w:pPr>
       <w:bookmarkStart w:id="37" w:name="b7-chịu-lỗi-và-sao-lưu"/>
-      <w:bookmarkStart w:id="38" w:name="_Toc243923776"/>
+      <w:bookmarkStart w:id="38" w:name="_Toc243925931"/>
       <w:bookmarkEnd w:id="35"/>
       <w:r>
         <w:t>7. Chịu lỗi và sao lưu</w:t>
@@ -8171,7 +8171,7 @@
         <w:pStyle w:val="Heading2"/>
       </w:pPr>
       <w:bookmarkStart w:id="39" w:name="b8-bảo-mật"/>
-      <w:bookmarkStart w:id="40" w:name="_Toc243923777"/>
+      <w:bookmarkStart w:id="40" w:name="_Toc243925932"/>
       <w:bookmarkEnd w:id="37"/>
       <w:r>
         <w:t>8. Bảo mật</w:t>
@@ -8229,7 +8229,7 @@
         <w:pStyle w:val="Heading2"/>
       </w:pPr>
       <w:bookmarkStart w:id="41" w:name="b9-sức-tải-và-thời-gian-đã-đo"/>
-      <w:bookmarkStart w:id="42" w:name="_Toc243923778"/>
+      <w:bookmarkStart w:id="42" w:name="_Toc243925933"/>
       <w:bookmarkEnd w:id="39"/>
       <w:r>
         <w:t>9. Sức tải và thời gian đã đo</w:t>
@@ -9416,7 +9416,7 @@
       <w:pPr>
         <w:pStyle w:val="Heading2"/>
       </w:pPr>
-      <w:bookmarkStart w:id="43" w:name="_Toc243923779"/>
+      <w:bookmarkStart w:id="43" w:name="_Toc243925934"/>
       <w:bookmarkEnd w:id="41"/>
       <w:r>
         <w:t>10. Cài đặt và vận hành</w:t>
@@ -9530,7 +9530,7 @@
       <w:pPr>
         <w:pStyle w:val="Heading2"/>
       </w:pPr>
-      <w:bookmarkStart w:id="44" w:name="_Toc243923780"/>
+      <w:bookmarkStart w:id="44" w:name="_Toc243925935"/>
       <w:r>
         <w:t>11. Mạng LAN ngày chung kết</w:t>
       </w:r>
@@ -9644,7 +9644,7 @@
     </w:p>
     <w:p>
       <w:r>
-        <w:t>Trong lượt thử LAN, tạo và nạp bốn đội mất 8.7 giây; tính từ lúc bắt đầu nạp tới khi đủ bốn bản Đạt mất 33.0 giây. Bảng 12 ván mất 11.7 giây, cặp hai ván mất 2.2 giây trên hai luồng Windows với bot mẫu, dù mỗi bot được cấp năm phút. Các số này chỉ xác nhận luồng chạy; lịch dự phòng vẫn tính theo hai quỹ giờ đầy đủ.</w:t>
+        <w:t>Trong lượt thử LAN, tạo và nạp bốn đội mất 8,7 giây; tính từ lúc bắt đầu nạp tới khi đủ bốn bản Đạt mất 33,0 giây. Bảng 12 ván mất 11,7 giây, cặp hai ván mất 2,2 giây trên hai luồng Windows với bot mẫu, dù mỗi bot được cấp năm phút. Các số này chỉ xác nhận luồng chạy; lịch dự phòng vẫn tính theo hai quỹ giờ đầy đủ.</w:t>
       </w:r>
     </w:p>
     <w:p>
@@ -9652,7 +9652,7 @@
         <w:pStyle w:val="Heading2"/>
         <w:pageBreakBefore/>
       </w:pPr>
-      <w:bookmarkStart w:id="45" w:name="_Toc243923781"/>
+      <w:bookmarkStart w:id="45" w:name="_Toc243925936"/>
       <w:r>
         <w:lastRenderedPageBreak/>
         <w:t>12. Giới hạn và hướng tiếp</w:t>
@@ -9746,7 +9746,7 @@
         <w:pageBreakBefore/>
       </w:pPr>
       <w:bookmarkStart w:id="46" w:name="phần-c-hướng-dẫn-demo-từng-bước"/>
-      <w:bookmarkStart w:id="47" w:name="_Toc243923782"/>
+      <w:bookmarkStart w:id="47" w:name="_Toc243925937"/>
       <w:bookmarkEnd w:id="23"/>
       <w:r>
         <w:lastRenderedPageBreak/>
@@ -9764,7 +9764,7 @@
         <w:pStyle w:val="Heading2"/>
       </w:pPr>
       <w:bookmarkStart w:id="48" w:name="c1-khách-xem-giải"/>
-      <w:bookmarkStart w:id="49" w:name="_Toc243923783"/>
+      <w:bookmarkStart w:id="49" w:name="_Toc243925938"/>
       <w:r>
         <w:t>1. Khách xem giải</w:t>
       </w:r>
@@ -9775,7 +9775,7 @@
         <w:pStyle w:val="Heading3"/>
       </w:pPr>
       <w:bookmarkStart w:id="50" w:name="bước-1-mở-giải-công-khai"/>
-      <w:bookmarkStart w:id="51" w:name="_Toc243923784"/>
+      <w:bookmarkStart w:id="51" w:name="_Toc243925939"/>
       <w:r>
         <w:t>Bước 1. Mở giải công khai</w:t>
       </w:r>
@@ -9863,7 +9863,7 @@
         <w:pStyle w:val="Heading3"/>
       </w:pPr>
       <w:bookmarkStart w:id="52" w:name="bước-2-xem-bảng-điểm-và-ma-trận"/>
-      <w:bookmarkStart w:id="53" w:name="_Toc243923785"/>
+      <w:bookmarkStart w:id="53" w:name="_Toc243925940"/>
       <w:bookmarkEnd w:id="50"/>
       <w:r>
         <w:t>Bước 2. Xem bảng điểm và ma trận</w:t>
@@ -9973,7 +9973,7 @@
         <w:pageBreakBefore/>
       </w:pPr>
       <w:bookmarkStart w:id="54" w:name="bước-3-xem-lại-từng-nước"/>
-      <w:bookmarkStart w:id="55" w:name="_Toc243923786"/>
+      <w:bookmarkStart w:id="55" w:name="_Toc243925941"/>
       <w:bookmarkEnd w:id="52"/>
       <w:r>
         <w:lastRenderedPageBreak/>
@@ -10054,7 +10054,7 @@
         <w:pageBreakBefore/>
       </w:pPr>
       <w:bookmarkStart w:id="56" w:name="c2-thí-sinh-đăng-ký-và-nộp-bot"/>
-      <w:bookmarkStart w:id="57" w:name="_Toc243923787"/>
+      <w:bookmarkStart w:id="57" w:name="_Toc243925942"/>
       <w:bookmarkEnd w:id="54"/>
       <w:bookmarkEnd w:id="48"/>
       <w:r>
@@ -10067,7 +10067,7 @@
       <w:pPr>
         <w:pStyle w:val="Heading3"/>
       </w:pPr>
-      <w:bookmarkStart w:id="58" w:name="_Toc243923788"/>
+      <w:bookmarkStart w:id="58" w:name="_Toc243925943"/>
       <w:r>
         <w:t>Bước 4. Đăng ký bằng email trường</w:t>
       </w:r>
@@ -10168,7 +10168,7 @@
         <w:pStyle w:val="Heading3"/>
         <w:pageBreakBefore/>
       </w:pPr>
-      <w:bookmarkStart w:id="59" w:name="_Toc243923789"/>
+      <w:bookmarkStart w:id="59" w:name="_Toc243925944"/>
       <w:r>
         <w:lastRenderedPageBreak/>
         <w:t>Bước 5. Mở email lấy mã</w:t>
@@ -10251,7 +10251,7 @@
         <w:pStyle w:val="Heading3"/>
         <w:pageBreakBefore/>
       </w:pPr>
-      <w:bookmarkStart w:id="60" w:name="_Toc243923790"/>
+      <w:bookmarkStart w:id="60" w:name="_Toc243925945"/>
       <w:r>
         <w:lastRenderedPageBreak/>
         <w:t>Bước 6. Xác minh email</w:t>
@@ -10343,7 +10343,7 @@
         <w:pStyle w:val="Heading3"/>
         <w:pageBreakBefore/>
       </w:pPr>
-      <w:bookmarkStart w:id="61" w:name="_Toc243923791"/>
+      <w:bookmarkStart w:id="61" w:name="_Toc243925946"/>
       <w:r>
         <w:lastRenderedPageBreak/>
         <w:t>Bước 7. Đặt mật khẩu và đăng nhập</w:t>
@@ -10434,7 +10434,7 @@
       <w:pPr>
         <w:pStyle w:val="Heading3"/>
       </w:pPr>
-      <w:bookmarkStart w:id="62" w:name="_Toc243923792"/>
+      <w:bookmarkStart w:id="62" w:name="_Toc243925947"/>
       <w:r>
         <w:t>Bước 8. Tạo đội</w:t>
       </w:r>
@@ -10532,7 +10532,7 @@
         <w:pStyle w:val="Heading3"/>
         <w:pageBreakBefore/>
       </w:pPr>
-      <w:bookmarkStart w:id="63" w:name="_Toc243923793"/>
+      <w:bookmarkStart w:id="63" w:name="_Toc243925948"/>
       <w:r>
         <w:lastRenderedPageBreak/>
         <w:t>Bước 9. Mời các thành viên</w:t>
@@ -10620,7 +10620,7 @@
       <w:pPr>
         <w:pStyle w:val="Heading3"/>
       </w:pPr>
-      <w:bookmarkStart w:id="64" w:name="_Toc243923794"/>
+      <w:bookmarkStart w:id="64" w:name="_Toc243925949"/>
       <w:r>
         <w:t>Bước 10. Vào đội bằng mã mời</w:t>
       </w:r>
@@ -10708,7 +10708,7 @@
         <w:pStyle w:val="Heading3"/>
         <w:pageBreakBefore/>
       </w:pPr>
-      <w:bookmarkStart w:id="65" w:name="_Toc243923795"/>
+      <w:bookmarkStart w:id="65" w:name="_Toc243925950"/>
       <w:r>
         <w:lastRenderedPageBreak/>
         <w:t>Bước 11. Tạo repo từ mẫu</w:t>
@@ -10796,7 +10796,7 @@
       <w:pPr>
         <w:pStyle w:val="Heading3"/>
       </w:pPr>
-      <w:bookmarkStart w:id="66" w:name="_Toc243923796"/>
+      <w:bookmarkStart w:id="66" w:name="_Toc243925951"/>
       <w:r>
         <w:t>Bước 12. Cho App truy cập đúng repo</w:t>
       </w:r>
@@ -10894,7 +10894,7 @@
         <w:pStyle w:val="Heading3"/>
         <w:pageBreakBefore/>
       </w:pPr>
-      <w:bookmarkStart w:id="67" w:name="_Toc243923797"/>
+      <w:bookmarkStart w:id="67" w:name="_Toc243925952"/>
       <w:r>
         <w:lastRenderedPageBreak/>
         <w:t>Bước 13. Gắn link repo với đội</w:t>
@@ -10992,7 +10992,7 @@
       <w:pPr>
         <w:pStyle w:val="Heading3"/>
       </w:pPr>
-      <w:bookmarkStart w:id="68" w:name="_Toc243923798"/>
+      <w:bookmarkStart w:id="68" w:name="_Toc243925953"/>
       <w:r>
         <w:t>Bước 14. Theo dõi kiểm tra 72 mẫu</w:t>
       </w:r>
@@ -11130,7 +11130,7 @@
         <w:pStyle w:val="Heading3"/>
         <w:pageBreakBefore/>
       </w:pPr>
-      <w:bookmarkStart w:id="69" w:name="_Toc243923799"/>
+      <w:bookmarkStart w:id="69" w:name="_Toc243925954"/>
       <w:r>
         <w:lastRenderedPageBreak/>
         <w:t>Bước 15. Xem giải của đội</w:t>
@@ -11248,7 +11248,7 @@
       <w:pPr>
         <w:pStyle w:val="Heading3"/>
       </w:pPr>
-      <w:bookmarkStart w:id="70" w:name="_Toc243923800"/>
+      <w:bookmarkStart w:id="70" w:name="_Toc243925955"/>
       <w:r>
         <w:t>Bước 16. Luyện tập với bot mẫu</w:t>
       </w:r>
@@ -11357,7 +11357,7 @@
         <w:pageBreakBefore/>
       </w:pPr>
       <w:bookmarkStart w:id="71" w:name="c3-ban-tổ-chức-điều-hành"/>
-      <w:bookmarkStart w:id="72" w:name="_Toc243923801"/>
+      <w:bookmarkStart w:id="72" w:name="_Toc243925956"/>
       <w:bookmarkEnd w:id="56"/>
       <w:r>
         <w:lastRenderedPageBreak/>
@@ -11369,7 +11369,7 @@
       <w:pPr>
         <w:pStyle w:val="Heading3"/>
       </w:pPr>
-      <w:bookmarkStart w:id="73" w:name="_Toc243923802"/>
+      <w:bookmarkStart w:id="73" w:name="_Toc243925957"/>
       <w:r>
         <w:t>Bước 17. Xem tổng quan ban tổ chức</w:t>
       </w:r>
@@ -11447,7 +11447,7 @@
         <w:pStyle w:val="Heading3"/>
         <w:pageBreakBefore/>
       </w:pPr>
-      <w:bookmarkStart w:id="74" w:name="_Toc243923803"/>
+      <w:bookmarkStart w:id="74" w:name="_Toc243925958"/>
       <w:r>
         <w:lastRenderedPageBreak/>
         <w:t>Bước 18. Chọn giải ở Tổng quan</w:t>
@@ -11566,7 +11566,7 @@
         <w:pStyle w:val="Heading3"/>
         <w:pageBreakBefore/>
       </w:pPr>
-      <w:bookmarkStart w:id="75" w:name="_Toc243923804"/>
+      <w:bookmarkStart w:id="75" w:name="_Toc243925959"/>
       <w:r>
         <w:lastRenderedPageBreak/>
         <w:t>Bước 19. Chuẩn bị giải mới</w:t>
@@ -11654,7 +11654,7 @@
       <w:pPr>
         <w:pStyle w:val="Heading3"/>
       </w:pPr>
-      <w:bookmarkStart w:id="76" w:name="_Toc243923805"/>
+      <w:bookmarkStart w:id="76" w:name="_Toc243925960"/>
       <w:r>
         <w:t>Bước 20. Cài máy chấm Windows hoặc Linux</w:t>
       </w:r>
@@ -11762,7 +11762,7 @@
         <w:pStyle w:val="Heading3"/>
         <w:pageBreakBefore/>
       </w:pPr>
-      <w:bookmarkStart w:id="77" w:name="_Toc243923806"/>
+      <w:bookmarkStart w:id="77" w:name="_Toc243925961"/>
       <w:r>
         <w:lastRenderedPageBreak/>
         <w:t>Bước 21. Kiểm tình trạng chấm và hàng đợi</w:t>
@@ -11850,7 +11850,7 @@
       <w:pPr>
         <w:pStyle w:val="Heading3"/>
       </w:pPr>
-      <w:bookmarkStart w:id="78" w:name="_Toc243923807"/>
+      <w:bookmarkStart w:id="78" w:name="_Toc243925962"/>
       <w:r>
         <w:t>Bước 22. Soạn thông báo</w:t>
       </w:r>
@@ -11948,7 +11948,7 @@
         <w:pStyle w:val="Heading3"/>
         <w:pageBreakBefore/>
       </w:pPr>
-      <w:bookmarkStart w:id="79" w:name="_Toc243923808"/>
+      <w:bookmarkStart w:id="79" w:name="_Toc243925963"/>
       <w:r>
         <w:lastRenderedPageBreak/>
         <w:t>Bước 23. Xuất bảng điểm CSV</w:t>
@@ -12037,7 +12037,7 @@
         <w:pStyle w:val="Heading2"/>
         <w:pageBreakBefore/>
       </w:pPr>
-      <w:bookmarkStart w:id="80" w:name="_Toc243923809"/>
+      <w:bookmarkStart w:id="80" w:name="_Toc243925964"/>
       <w:bookmarkEnd w:id="71"/>
       <w:bookmarkEnd w:id="46"/>
       <w:r>
@@ -12050,7 +12050,7 @@
       <w:pPr>
         <w:pStyle w:val="Heading3"/>
       </w:pPr>
-      <w:bookmarkStart w:id="81" w:name="_Toc243923810"/>
+      <w:bookmarkStart w:id="81" w:name="_Toc243925965"/>
       <w:r>
         <w:t>Bước 24. Tạo tài khoản và phát giấy cho đội</w:t>
       </w:r>
@@ -12124,7 +12124,7 @@
         <w:pStyle w:val="Heading3"/>
         <w:pageBreakBefore/>
       </w:pPr>
-      <w:bookmarkStart w:id="82" w:name="_Toc243923811"/>
+      <w:bookmarkStart w:id="82" w:name="_Toc243925966"/>
       <w:r>
         <w:lastRenderedPageBreak/>
         <w:t>Bước 25. Đội tự nạp ZIP và kiểm tra</w:t>
@@ -12199,7 +12199,7 @@
         <w:pStyle w:val="Heading3"/>
         <w:pageBreakBefore/>
       </w:pPr>
-      <w:bookmarkStart w:id="83" w:name="_Toc243923812"/>
+      <w:bookmarkStart w:id="83" w:name="_Toc243925967"/>
       <w:r>
         <w:lastRenderedPageBreak/>
         <w:t>Bước 26. Tạo bảng và thêm các đội</w:t>
@@ -12274,7 +12274,7 @@
         <w:pStyle w:val="Heading3"/>
         <w:pageBreakBefore/>
       </w:pPr>
-      <w:bookmarkStart w:id="84" w:name="_Toc243923813"/>
+      <w:bookmarkStart w:id="84" w:name="_Toc243925968"/>
       <w:r>
         <w:lastRenderedPageBreak/>
         <w:t>Bước 27. Chiếu bảng điểm và replay</w:t>
@@ -12349,7 +12349,7 @@
         <w:pStyle w:val="Heading3"/>
         <w:pageBreakBefore/>
       </w:pPr>
-      <w:bookmarkStart w:id="85" w:name="_Toc243923814"/>
+      <w:bookmarkStart w:id="85" w:name="_Toc243925969"/>
       <w:r>
         <w:lastRenderedPageBreak/>
         <w:t>Bước 28. Tạo cặp loại trực tiếp</w:t>
@@ -12424,7 +12424,7 @@
         <w:pStyle w:val="Heading3"/>
         <w:pageBreakBefore/>
       </w:pPr>
-      <w:bookmarkStart w:id="86" w:name="_Toc243923815"/>
+      <w:bookmarkStart w:id="86" w:name="_Toc243925970"/>
       <w:r>
         <w:lastRenderedPageBreak/>
         <w:t>Bước 29. Xuất CSV và đăng kết quả</w:t>

</xml_diff>

<commit_message>
Hướng dẫn thử nhanh và phân quyền máy chấm
</commit_message>
<xml_diff>
--- a/TAI-LIEU.docx
+++ b/TAI-LIEU.docx
@@ -62,10 +62,22 @@
         <w:jc w:val="center"/>
       </w:pPr>
       <w:r>
-        <w:t xml:space="preserve">Website  </w:t>
+        <w:t>Website</w:t>
+      </w:r>
+      <w:r>
+        <w:rPr>
+          <w:lang w:val="en-US"/>
+        </w:rPr>
+        <w:t>:</w:t>
+      </w:r>
+      <w:r>
+        <w:t xml:space="preserve">  </w:t>
       </w:r>
       <w:hyperlink r:id="rId7">
         <w:r>
+          <w:rPr>
+            <w:color w:val="548DD4" w:themeColor="text2" w:themeTint="99"/>
+          </w:rPr>
           <w:t>https://uetbotarena.id.vn</w:t>
         </w:r>
       </w:hyperlink>
@@ -76,193 +88,26 @@
         <w:jc w:val="center"/>
       </w:pPr>
       <w:r>
-        <w:t xml:space="preserve">Mã nguồn  </w:t>
+        <w:t>Mã nguồn</w:t>
+      </w:r>
+      <w:r>
+        <w:rPr>
+          <w:lang w:val="en-US"/>
+        </w:rPr>
+        <w:t>:</w:t>
+      </w:r>
+      <w:r>
+        <w:t xml:space="preserve">  </w:t>
       </w:r>
       <w:hyperlink r:id="rId8">
         <w:r>
+          <w:rPr>
+            <w:color w:val="548DD4" w:themeColor="text2" w:themeTint="99"/>
+          </w:rPr>
           <w:t>https://github.com/uet-bot-arena/platform</w:t>
         </w:r>
       </w:hyperlink>
     </w:p>
-    <w:tbl>
-      <w:tblPr>
-        <w:tblStyle w:val="TableGrid"/>
-        <w:tblW w:w="9071" w:type="dxa"/>
-        <w:jc w:val="center"/>
-        <w:tblBorders>
-          <w:top w:val="single" w:sz="4" w:space="0" w:color="7F7F7F"/>
-          <w:left w:val="single" w:sz="4" w:space="0" w:color="7F7F7F"/>
-          <w:bottom w:val="single" w:sz="4" w:space="0" w:color="7F7F7F"/>
-          <w:right w:val="single" w:sz="4" w:space="0" w:color="7F7F7F"/>
-          <w:insideH w:val="single" w:sz="4" w:space="0" w:color="7F7F7F"/>
-          <w:insideV w:val="single" w:sz="4" w:space="0" w:color="7F7F7F"/>
-        </w:tblBorders>
-        <w:tblLayout w:type="fixed"/>
-        <w:tblLook w:val="04A0" w:firstRow="1" w:lastRow="0" w:firstColumn="1" w:lastColumn="0" w:noHBand="0" w:noVBand="1"/>
-      </w:tblPr>
-      <w:tblGrid>
-        <w:gridCol w:w="4535"/>
-        <w:gridCol w:w="4536"/>
-      </w:tblGrid>
-      <w:tr>
-        <w:trPr>
-          <w:cantSplit/>
-          <w:trHeight w:val="397"/>
-          <w:tblHeader/>
-          <w:jc w:val="center"/>
-        </w:trPr>
-        <w:tc>
-          <w:tcPr>
-            <w:tcW w:w="4535" w:type="dxa"/>
-            <w:shd w:val="clear" w:color="auto" w:fill="F2F2F2"/>
-          </w:tcPr>
-          <w:p>
-            <w:pPr>
-              <w:keepNext/>
-              <w:spacing w:before="60" w:after="100"/>
-            </w:pPr>
-            <w:r>
-              <w:rPr>
-                <w:b/>
-              </w:rPr>
-              <w:t>Họ tên</w:t>
-            </w:r>
-          </w:p>
-        </w:tc>
-        <w:tc>
-          <w:tcPr>
-            <w:tcW w:w="4535" w:type="dxa"/>
-            <w:shd w:val="clear" w:color="auto" w:fill="F2F2F2"/>
-          </w:tcPr>
-          <w:p>
-            <w:pPr>
-              <w:keepNext/>
-              <w:spacing w:before="60" w:after="100"/>
-            </w:pPr>
-            <w:r>
-              <w:rPr>
-                <w:b/>
-              </w:rPr>
-              <w:t>MSSV</w:t>
-            </w:r>
-          </w:p>
-        </w:tc>
-      </w:tr>
-      <w:tr>
-        <w:trPr>
-          <w:cantSplit/>
-          <w:trHeight w:val="397"/>
-          <w:jc w:val="center"/>
-        </w:trPr>
-        <w:tc>
-          <w:tcPr>
-            <w:tcW w:w="4535" w:type="dxa"/>
-          </w:tcPr>
-          <w:p>
-            <w:pPr>
-              <w:keepNext/>
-              <w:spacing w:before="60" w:after="100"/>
-            </w:pPr>
-          </w:p>
-        </w:tc>
-        <w:tc>
-          <w:tcPr>
-            <w:tcW w:w="4535" w:type="dxa"/>
-          </w:tcPr>
-          <w:p>
-            <w:pPr>
-              <w:keepNext/>
-              <w:spacing w:before="60" w:after="100"/>
-            </w:pPr>
-          </w:p>
-        </w:tc>
-      </w:tr>
-      <w:tr>
-        <w:trPr>
-          <w:cantSplit/>
-          <w:trHeight w:val="397"/>
-          <w:jc w:val="center"/>
-        </w:trPr>
-        <w:tc>
-          <w:tcPr>
-            <w:tcW w:w="4535" w:type="dxa"/>
-          </w:tcPr>
-          <w:p>
-            <w:pPr>
-              <w:keepNext/>
-              <w:spacing w:before="60" w:after="100"/>
-            </w:pPr>
-          </w:p>
-        </w:tc>
-        <w:tc>
-          <w:tcPr>
-            <w:tcW w:w="4535" w:type="dxa"/>
-          </w:tcPr>
-          <w:p>
-            <w:pPr>
-              <w:keepNext/>
-              <w:spacing w:before="60" w:after="100"/>
-            </w:pPr>
-          </w:p>
-        </w:tc>
-      </w:tr>
-      <w:tr>
-        <w:trPr>
-          <w:cantSplit/>
-          <w:trHeight w:val="397"/>
-          <w:jc w:val="center"/>
-        </w:trPr>
-        <w:tc>
-          <w:tcPr>
-            <w:tcW w:w="4535" w:type="dxa"/>
-          </w:tcPr>
-          <w:p>
-            <w:pPr>
-              <w:keepNext/>
-              <w:spacing w:before="60" w:after="100"/>
-            </w:pPr>
-          </w:p>
-        </w:tc>
-        <w:tc>
-          <w:tcPr>
-            <w:tcW w:w="4535" w:type="dxa"/>
-          </w:tcPr>
-          <w:p>
-            <w:pPr>
-              <w:keepNext/>
-              <w:spacing w:before="60" w:after="100"/>
-            </w:pPr>
-          </w:p>
-        </w:tc>
-      </w:tr>
-      <w:tr>
-        <w:trPr>
-          <w:cantSplit/>
-          <w:trHeight w:val="397"/>
-          <w:jc w:val="center"/>
-        </w:trPr>
-        <w:tc>
-          <w:tcPr>
-            <w:tcW w:w="4535" w:type="dxa"/>
-          </w:tcPr>
-          <w:p>
-            <w:pPr>
-              <w:spacing w:before="60" w:after="100"/>
-            </w:pPr>
-          </w:p>
-        </w:tc>
-        <w:tc>
-          <w:tcPr>
-            <w:tcW w:w="4535" w:type="dxa"/>
-          </w:tcPr>
-          <w:p>
-            <w:pPr>
-              <w:spacing w:before="60" w:after="100"/>
-            </w:pPr>
-          </w:p>
-        </w:tc>
-      </w:tr>
-    </w:tbl>
     <w:sdt>
       <w:sdtPr>
         <w:rPr>
@@ -314,7 +159,7 @@
           <w:r>
             <w:fldChar w:fldCharType="separate"/>
           </w:r>
-          <w:hyperlink w:anchor="_Toc243925912" w:history="1">
+          <w:hyperlink w:anchor="_Toc244093766" w:history="1">
             <w:r>
               <w:rPr>
                 <w:rStyle w:val="Hyperlink"/>
@@ -341,7 +186,7 @@
                 <w:noProof/>
                 <w:webHidden/>
               </w:rPr>
-              <w:instrText xml:space="preserve"> PAGEREF _Toc243925912 \h </w:instrText>
+              <w:instrText xml:space="preserve"> PAGEREF _Toc244093766 \h </w:instrText>
             </w:r>
             <w:r>
               <w:rPr>
@@ -388,7 +233,7 @@
               <w14:ligatures w14:val="standardContextual"/>
             </w:rPr>
           </w:pPr>
-          <w:hyperlink w:anchor="_Toc243925913" w:history="1">
+          <w:hyperlink w:anchor="_Toc244093767" w:history="1">
             <w:r>
               <w:rPr>
                 <w:rStyle w:val="Hyperlink"/>
@@ -415,7 +260,7 @@
                 <w:noProof/>
                 <w:webHidden/>
               </w:rPr>
-              <w:instrText xml:space="preserve"> PAGEREF _Toc243925913 \h </w:instrText>
+              <w:instrText xml:space="preserve"> PAGEREF _Toc244093767 \h </w:instrText>
             </w:r>
             <w:r>
               <w:rPr>
@@ -462,7 +307,7 @@
               <w14:ligatures w14:val="standardContextual"/>
             </w:rPr>
           </w:pPr>
-          <w:hyperlink w:anchor="_Toc243925914" w:history="1">
+          <w:hyperlink w:anchor="_Toc244093768" w:history="1">
             <w:r>
               <w:rPr>
                 <w:rStyle w:val="Hyperlink"/>
@@ -489,7 +334,7 @@
                 <w:noProof/>
                 <w:webHidden/>
               </w:rPr>
-              <w:instrText xml:space="preserve"> PAGEREF _Toc243925914 \h </w:instrText>
+              <w:instrText xml:space="preserve"> PAGEREF _Toc244093768 \h </w:instrText>
             </w:r>
             <w:r>
               <w:rPr>
@@ -536,7 +381,7 @@
               <w14:ligatures w14:val="standardContextual"/>
             </w:rPr>
           </w:pPr>
-          <w:hyperlink w:anchor="_Toc243925915" w:history="1">
+          <w:hyperlink w:anchor="_Toc244093769" w:history="1">
             <w:r>
               <w:rPr>
                 <w:rStyle w:val="Hyperlink"/>
@@ -563,7 +408,7 @@
                 <w:noProof/>
                 <w:webHidden/>
               </w:rPr>
-              <w:instrText xml:space="preserve"> PAGEREF _Toc243925915 \h </w:instrText>
+              <w:instrText xml:space="preserve"> PAGEREF _Toc244093769 \h </w:instrText>
             </w:r>
             <w:r>
               <w:rPr>
@@ -610,7 +455,7 @@
               <w14:ligatures w14:val="standardContextual"/>
             </w:rPr>
           </w:pPr>
-          <w:hyperlink w:anchor="_Toc243925916" w:history="1">
+          <w:hyperlink w:anchor="_Toc244093770" w:history="1">
             <w:r>
               <w:rPr>
                 <w:rStyle w:val="Hyperlink"/>
@@ -637,7 +482,7 @@
                 <w:noProof/>
                 <w:webHidden/>
               </w:rPr>
-              <w:instrText xml:space="preserve"> PAGEREF _Toc243925916 \h </w:instrText>
+              <w:instrText xml:space="preserve"> PAGEREF _Toc244093770 \h </w:instrText>
             </w:r>
             <w:r>
               <w:rPr>
@@ -684,7 +529,7 @@
               <w14:ligatures w14:val="standardContextual"/>
             </w:rPr>
           </w:pPr>
-          <w:hyperlink w:anchor="_Toc243925917" w:history="1">
+          <w:hyperlink w:anchor="_Toc244093771" w:history="1">
             <w:r>
               <w:rPr>
                 <w:rStyle w:val="Hyperlink"/>
@@ -711,7 +556,7 @@
                 <w:noProof/>
                 <w:webHidden/>
               </w:rPr>
-              <w:instrText xml:space="preserve"> PAGEREF _Toc243925917 \h </w:instrText>
+              <w:instrText xml:space="preserve"> PAGEREF _Toc244093771 \h </w:instrText>
             </w:r>
             <w:r>
               <w:rPr>
@@ -758,7 +603,7 @@
               <w14:ligatures w14:val="standardContextual"/>
             </w:rPr>
           </w:pPr>
-          <w:hyperlink w:anchor="_Toc243925918" w:history="1">
+          <w:hyperlink w:anchor="_Toc244093772" w:history="1">
             <w:r>
               <w:rPr>
                 <w:rStyle w:val="Hyperlink"/>
@@ -785,7 +630,7 @@
                 <w:noProof/>
                 <w:webHidden/>
               </w:rPr>
-              <w:instrText xml:space="preserve"> PAGEREF _Toc243925918 \h </w:instrText>
+              <w:instrText xml:space="preserve"> PAGEREF _Toc244093772 \h </w:instrText>
             </w:r>
             <w:r>
               <w:rPr>
@@ -832,7 +677,7 @@
               <w14:ligatures w14:val="standardContextual"/>
             </w:rPr>
           </w:pPr>
-          <w:hyperlink w:anchor="_Toc243925919" w:history="1">
+          <w:hyperlink w:anchor="_Toc244093773" w:history="1">
             <w:r>
               <w:rPr>
                 <w:rStyle w:val="Hyperlink"/>
@@ -859,7 +704,7 @@
                 <w:noProof/>
                 <w:webHidden/>
               </w:rPr>
-              <w:instrText xml:space="preserve"> PAGEREF _Toc243925919 \h </w:instrText>
+              <w:instrText xml:space="preserve"> PAGEREF _Toc244093773 \h </w:instrText>
             </w:r>
             <w:r>
               <w:rPr>
@@ -906,7 +751,7 @@
               <w14:ligatures w14:val="standardContextual"/>
             </w:rPr>
           </w:pPr>
-          <w:hyperlink w:anchor="_Toc243925920" w:history="1">
+          <w:hyperlink w:anchor="_Toc244093774" w:history="1">
             <w:r>
               <w:rPr>
                 <w:rStyle w:val="Hyperlink"/>
@@ -933,7 +778,7 @@
                 <w:noProof/>
                 <w:webHidden/>
               </w:rPr>
-              <w:instrText xml:space="preserve"> PAGEREF _Toc243925920 \h </w:instrText>
+              <w:instrText xml:space="preserve"> PAGEREF _Toc244093774 \h </w:instrText>
             </w:r>
             <w:r>
               <w:rPr>
@@ -980,7 +825,7 @@
               <w14:ligatures w14:val="standardContextual"/>
             </w:rPr>
           </w:pPr>
-          <w:hyperlink w:anchor="_Toc243925921" w:history="1">
+          <w:hyperlink w:anchor="_Toc244093775" w:history="1">
             <w:r>
               <w:rPr>
                 <w:rStyle w:val="Hyperlink"/>
@@ -1007,7 +852,7 @@
                 <w:noProof/>
                 <w:webHidden/>
               </w:rPr>
-              <w:instrText xml:space="preserve"> PAGEREF _Toc243925921 \h </w:instrText>
+              <w:instrText xml:space="preserve"> PAGEREF _Toc244093775 \h </w:instrText>
             </w:r>
             <w:r>
               <w:rPr>
@@ -1054,7 +899,7 @@
               <w14:ligatures w14:val="standardContextual"/>
             </w:rPr>
           </w:pPr>
-          <w:hyperlink w:anchor="_Toc243925922" w:history="1">
+          <w:hyperlink w:anchor="_Toc244093776" w:history="1">
             <w:r>
               <w:rPr>
                 <w:rStyle w:val="Hyperlink"/>
@@ -1081,7 +926,7 @@
                 <w:noProof/>
                 <w:webHidden/>
               </w:rPr>
-              <w:instrText xml:space="preserve"> PAGEREF _Toc243925922 \h </w:instrText>
+              <w:instrText xml:space="preserve"> PAGEREF _Toc244093776 \h </w:instrText>
             </w:r>
             <w:r>
               <w:rPr>
@@ -1128,7 +973,7 @@
               <w14:ligatures w14:val="standardContextual"/>
             </w:rPr>
           </w:pPr>
-          <w:hyperlink w:anchor="_Toc243925923" w:history="1">
+          <w:hyperlink w:anchor="_Toc244093777" w:history="1">
             <w:r>
               <w:rPr>
                 <w:rStyle w:val="Hyperlink"/>
@@ -1155,7 +1000,7 @@
                 <w:noProof/>
                 <w:webHidden/>
               </w:rPr>
-              <w:instrText xml:space="preserve"> PAGEREF _Toc243925923 \h </w:instrText>
+              <w:instrText xml:space="preserve"> PAGEREF _Toc244093777 \h </w:instrText>
             </w:r>
             <w:r>
               <w:rPr>
@@ -1202,7 +1047,7 @@
               <w14:ligatures w14:val="standardContextual"/>
             </w:rPr>
           </w:pPr>
-          <w:hyperlink w:anchor="_Toc243925924" w:history="1">
+          <w:hyperlink w:anchor="_Toc244093778" w:history="1">
             <w:r>
               <w:rPr>
                 <w:rStyle w:val="Hyperlink"/>
@@ -1229,7 +1074,7 @@
                 <w:noProof/>
                 <w:webHidden/>
               </w:rPr>
-              <w:instrText xml:space="preserve"> PAGEREF _Toc243925924 \h </w:instrText>
+              <w:instrText xml:space="preserve"> PAGEREF _Toc244093778 \h </w:instrText>
             </w:r>
             <w:r>
               <w:rPr>
@@ -1276,7 +1121,7 @@
               <w14:ligatures w14:val="standardContextual"/>
             </w:rPr>
           </w:pPr>
-          <w:hyperlink w:anchor="_Toc243925925" w:history="1">
+          <w:hyperlink w:anchor="_Toc244093779" w:history="1">
             <w:r>
               <w:rPr>
                 <w:rStyle w:val="Hyperlink"/>
@@ -1303,7 +1148,7 @@
                 <w:noProof/>
                 <w:webHidden/>
               </w:rPr>
-              <w:instrText xml:space="preserve"> PAGEREF _Toc243925925 \h </w:instrText>
+              <w:instrText xml:space="preserve"> PAGEREF _Toc244093779 \h </w:instrText>
             </w:r>
             <w:r>
               <w:rPr>
@@ -1350,7 +1195,7 @@
               <w14:ligatures w14:val="standardContextual"/>
             </w:rPr>
           </w:pPr>
-          <w:hyperlink w:anchor="_Toc243925926" w:history="1">
+          <w:hyperlink w:anchor="_Toc244093780" w:history="1">
             <w:r>
               <w:rPr>
                 <w:rStyle w:val="Hyperlink"/>
@@ -1377,7 +1222,7 @@
                 <w:noProof/>
                 <w:webHidden/>
               </w:rPr>
-              <w:instrText xml:space="preserve"> PAGEREF _Toc243925926 \h </w:instrText>
+              <w:instrText xml:space="preserve"> PAGEREF _Toc244093780 \h </w:instrText>
             </w:r>
             <w:r>
               <w:rPr>
@@ -1424,7 +1269,7 @@
               <w14:ligatures w14:val="standardContextual"/>
             </w:rPr>
           </w:pPr>
-          <w:hyperlink w:anchor="_Toc243925927" w:history="1">
+          <w:hyperlink w:anchor="_Toc244093781" w:history="1">
             <w:r>
               <w:rPr>
                 <w:rStyle w:val="Hyperlink"/>
@@ -1451,7 +1296,7 @@
                 <w:noProof/>
                 <w:webHidden/>
               </w:rPr>
-              <w:instrText xml:space="preserve"> PAGEREF _Toc243925927 \h </w:instrText>
+              <w:instrText xml:space="preserve"> PAGEREF _Toc244093781 \h </w:instrText>
             </w:r>
             <w:r>
               <w:rPr>
@@ -1498,7 +1343,7 @@
               <w14:ligatures w14:val="standardContextual"/>
             </w:rPr>
           </w:pPr>
-          <w:hyperlink w:anchor="_Toc243925928" w:history="1">
+          <w:hyperlink w:anchor="_Toc244093782" w:history="1">
             <w:r>
               <w:rPr>
                 <w:rStyle w:val="Hyperlink"/>
@@ -1525,7 +1370,7 @@
                 <w:noProof/>
                 <w:webHidden/>
               </w:rPr>
-              <w:instrText xml:space="preserve"> PAGEREF _Toc243925928 \h </w:instrText>
+              <w:instrText xml:space="preserve"> PAGEREF _Toc244093782 \h </w:instrText>
             </w:r>
             <w:r>
               <w:rPr>
@@ -1572,7 +1417,7 @@
               <w14:ligatures w14:val="standardContextual"/>
             </w:rPr>
           </w:pPr>
-          <w:hyperlink w:anchor="_Toc243925929" w:history="1">
+          <w:hyperlink w:anchor="_Toc244093783" w:history="1">
             <w:r>
               <w:rPr>
                 <w:rStyle w:val="Hyperlink"/>
@@ -1599,7 +1444,7 @@
                 <w:noProof/>
                 <w:webHidden/>
               </w:rPr>
-              <w:instrText xml:space="preserve"> PAGEREF _Toc243925929 \h </w:instrText>
+              <w:instrText xml:space="preserve"> PAGEREF _Toc244093783 \h </w:instrText>
             </w:r>
             <w:r>
               <w:rPr>
@@ -1646,7 +1491,7 @@
               <w14:ligatures w14:val="standardContextual"/>
             </w:rPr>
           </w:pPr>
-          <w:hyperlink w:anchor="_Toc243925930" w:history="1">
+          <w:hyperlink w:anchor="_Toc244093784" w:history="1">
             <w:r>
               <w:rPr>
                 <w:rStyle w:val="Hyperlink"/>
@@ -1673,7 +1518,7 @@
                 <w:noProof/>
                 <w:webHidden/>
               </w:rPr>
-              <w:instrText xml:space="preserve"> PAGEREF _Toc243925930 \h </w:instrText>
+              <w:instrText xml:space="preserve"> PAGEREF _Toc244093784 \h </w:instrText>
             </w:r>
             <w:r>
               <w:rPr>
@@ -1720,7 +1565,7 @@
               <w14:ligatures w14:val="standardContextual"/>
             </w:rPr>
           </w:pPr>
-          <w:hyperlink w:anchor="_Toc243925931" w:history="1">
+          <w:hyperlink w:anchor="_Toc244093785" w:history="1">
             <w:r>
               <w:rPr>
                 <w:rStyle w:val="Hyperlink"/>
@@ -1747,7 +1592,7 @@
                 <w:noProof/>
                 <w:webHidden/>
               </w:rPr>
-              <w:instrText xml:space="preserve"> PAGEREF _Toc243925931 \h </w:instrText>
+              <w:instrText xml:space="preserve"> PAGEREF _Toc244093785 \h </w:instrText>
             </w:r>
             <w:r>
               <w:rPr>
@@ -1794,7 +1639,7 @@
               <w14:ligatures w14:val="standardContextual"/>
             </w:rPr>
           </w:pPr>
-          <w:hyperlink w:anchor="_Toc243925932" w:history="1">
+          <w:hyperlink w:anchor="_Toc244093786" w:history="1">
             <w:r>
               <w:rPr>
                 <w:rStyle w:val="Hyperlink"/>
@@ -1821,7 +1666,7 @@
                 <w:noProof/>
                 <w:webHidden/>
               </w:rPr>
-              <w:instrText xml:space="preserve"> PAGEREF _Toc243925932 \h </w:instrText>
+              <w:instrText xml:space="preserve"> PAGEREF _Toc244093786 \h </w:instrText>
             </w:r>
             <w:r>
               <w:rPr>
@@ -1868,7 +1713,7 @@
               <w14:ligatures w14:val="standardContextual"/>
             </w:rPr>
           </w:pPr>
-          <w:hyperlink w:anchor="_Toc243925933" w:history="1">
+          <w:hyperlink w:anchor="_Toc244093787" w:history="1">
             <w:r>
               <w:rPr>
                 <w:rStyle w:val="Hyperlink"/>
@@ -1895,7 +1740,7 @@
                 <w:noProof/>
                 <w:webHidden/>
               </w:rPr>
-              <w:instrText xml:space="preserve"> PAGEREF _Toc243925933 \h </w:instrText>
+              <w:instrText xml:space="preserve"> PAGEREF _Toc244093787 \h </w:instrText>
             </w:r>
             <w:r>
               <w:rPr>
@@ -1942,7 +1787,7 @@
               <w14:ligatures w14:val="standardContextual"/>
             </w:rPr>
           </w:pPr>
-          <w:hyperlink w:anchor="_Toc243925934" w:history="1">
+          <w:hyperlink w:anchor="_Toc244093788" w:history="1">
             <w:r>
               <w:rPr>
                 <w:rStyle w:val="Hyperlink"/>
@@ -1969,7 +1814,7 @@
                 <w:noProof/>
                 <w:webHidden/>
               </w:rPr>
-              <w:instrText xml:space="preserve"> PAGEREF _Toc243925934 \h </w:instrText>
+              <w:instrText xml:space="preserve"> PAGEREF _Toc244093788 \h </w:instrText>
             </w:r>
             <w:r>
               <w:rPr>
@@ -2016,7 +1861,7 @@
               <w14:ligatures w14:val="standardContextual"/>
             </w:rPr>
           </w:pPr>
-          <w:hyperlink w:anchor="_Toc243925935" w:history="1">
+          <w:hyperlink w:anchor="_Toc244093789" w:history="1">
             <w:r>
               <w:rPr>
                 <w:rStyle w:val="Hyperlink"/>
@@ -2043,7 +1888,7 @@
                 <w:noProof/>
                 <w:webHidden/>
               </w:rPr>
-              <w:instrText xml:space="preserve"> PAGEREF _Toc243925935 \h </w:instrText>
+              <w:instrText xml:space="preserve"> PAGEREF _Toc244093789 \h </w:instrText>
             </w:r>
             <w:r>
               <w:rPr>
@@ -2090,7 +1935,7 @@
               <w14:ligatures w14:val="standardContextual"/>
             </w:rPr>
           </w:pPr>
-          <w:hyperlink w:anchor="_Toc243925936" w:history="1">
+          <w:hyperlink w:anchor="_Toc244093790" w:history="1">
             <w:r>
               <w:rPr>
                 <w:rStyle w:val="Hyperlink"/>
@@ -2117,7 +1962,7 @@
                 <w:noProof/>
                 <w:webHidden/>
               </w:rPr>
-              <w:instrText xml:space="preserve"> PAGEREF _Toc243925936 \h </w:instrText>
+              <w:instrText xml:space="preserve"> PAGEREF _Toc244093790 \h </w:instrText>
             </w:r>
             <w:r>
               <w:rPr>
@@ -2164,7 +2009,7 @@
               <w14:ligatures w14:val="standardContextual"/>
             </w:rPr>
           </w:pPr>
-          <w:hyperlink w:anchor="_Toc243925937" w:history="1">
+          <w:hyperlink w:anchor="_Toc244093791" w:history="1">
             <w:r>
               <w:rPr>
                 <w:rStyle w:val="Hyperlink"/>
@@ -2191,7 +2036,7 @@
                 <w:noProof/>
                 <w:webHidden/>
               </w:rPr>
-              <w:instrText xml:space="preserve"> PAGEREF _Toc243925937 \h </w:instrText>
+              <w:instrText xml:space="preserve"> PAGEREF _Toc244093791 \h </w:instrText>
             </w:r>
             <w:r>
               <w:rPr>
@@ -2238,7 +2083,7 @@
               <w14:ligatures w14:val="standardContextual"/>
             </w:rPr>
           </w:pPr>
-          <w:hyperlink w:anchor="_Toc243925938" w:history="1">
+          <w:hyperlink w:anchor="_Toc244093792" w:history="1">
             <w:r>
               <w:rPr>
                 <w:rStyle w:val="Hyperlink"/>
@@ -2265,7 +2110,7 @@
                 <w:noProof/>
                 <w:webHidden/>
               </w:rPr>
-              <w:instrText xml:space="preserve"> PAGEREF _Toc243925938 \h </w:instrText>
+              <w:instrText xml:space="preserve"> PAGEREF _Toc244093792 \h </w:instrText>
             </w:r>
             <w:r>
               <w:rPr>
@@ -2312,7 +2157,7 @@
               <w14:ligatures w14:val="standardContextual"/>
             </w:rPr>
           </w:pPr>
-          <w:hyperlink w:anchor="_Toc243925939" w:history="1">
+          <w:hyperlink w:anchor="_Toc244093793" w:history="1">
             <w:r>
               <w:rPr>
                 <w:rStyle w:val="Hyperlink"/>
@@ -2339,7 +2184,7 @@
                 <w:noProof/>
                 <w:webHidden/>
               </w:rPr>
-              <w:instrText xml:space="preserve"> PAGEREF _Toc243925939 \h </w:instrText>
+              <w:instrText xml:space="preserve"> PAGEREF _Toc244093793 \h </w:instrText>
             </w:r>
             <w:r>
               <w:rPr>
@@ -2386,7 +2231,7 @@
               <w14:ligatures w14:val="standardContextual"/>
             </w:rPr>
           </w:pPr>
-          <w:hyperlink w:anchor="_Toc243925940" w:history="1">
+          <w:hyperlink w:anchor="_Toc244093794" w:history="1">
             <w:r>
               <w:rPr>
                 <w:rStyle w:val="Hyperlink"/>
@@ -2413,7 +2258,7 @@
                 <w:noProof/>
                 <w:webHidden/>
               </w:rPr>
-              <w:instrText xml:space="preserve"> PAGEREF _Toc243925940 \h </w:instrText>
+              <w:instrText xml:space="preserve"> PAGEREF _Toc244093794 \h </w:instrText>
             </w:r>
             <w:r>
               <w:rPr>
@@ -2460,7 +2305,7 @@
               <w14:ligatures w14:val="standardContextual"/>
             </w:rPr>
           </w:pPr>
-          <w:hyperlink w:anchor="_Toc243925941" w:history="1">
+          <w:hyperlink w:anchor="_Toc244093795" w:history="1">
             <w:r>
               <w:rPr>
                 <w:rStyle w:val="Hyperlink"/>
@@ -2487,7 +2332,7 @@
                 <w:noProof/>
                 <w:webHidden/>
               </w:rPr>
-              <w:instrText xml:space="preserve"> PAGEREF _Toc243925941 \h </w:instrText>
+              <w:instrText xml:space="preserve"> PAGEREF _Toc244093795 \h </w:instrText>
             </w:r>
             <w:r>
               <w:rPr>
@@ -2507,7 +2352,7 @@
                 <w:noProof/>
                 <w:webHidden/>
               </w:rPr>
-              <w:t>24</w:t>
+              <w:t>25</w:t>
             </w:r>
             <w:r>
               <w:rPr>
@@ -2534,7 +2379,7 @@
               <w14:ligatures w14:val="standardContextual"/>
             </w:rPr>
           </w:pPr>
-          <w:hyperlink w:anchor="_Toc243925942" w:history="1">
+          <w:hyperlink w:anchor="_Toc244093796" w:history="1">
             <w:r>
               <w:rPr>
                 <w:rStyle w:val="Hyperlink"/>
@@ -2561,7 +2406,7 @@
                 <w:noProof/>
                 <w:webHidden/>
               </w:rPr>
-              <w:instrText xml:space="preserve"> PAGEREF _Toc243925942 \h </w:instrText>
+              <w:instrText xml:space="preserve"> PAGEREF _Toc244093796 \h </w:instrText>
             </w:r>
             <w:r>
               <w:rPr>
@@ -2581,7 +2426,7 @@
                 <w:noProof/>
                 <w:webHidden/>
               </w:rPr>
-              <w:t>25</w:t>
+              <w:t>26</w:t>
             </w:r>
             <w:r>
               <w:rPr>
@@ -2608,7 +2453,7 @@
               <w14:ligatures w14:val="standardContextual"/>
             </w:rPr>
           </w:pPr>
-          <w:hyperlink w:anchor="_Toc243925943" w:history="1">
+          <w:hyperlink w:anchor="_Toc244093797" w:history="1">
             <w:r>
               <w:rPr>
                 <w:rStyle w:val="Hyperlink"/>
@@ -2635,7 +2480,7 @@
                 <w:noProof/>
                 <w:webHidden/>
               </w:rPr>
-              <w:instrText xml:space="preserve"> PAGEREF _Toc243925943 \h </w:instrText>
+              <w:instrText xml:space="preserve"> PAGEREF _Toc244093797 \h </w:instrText>
             </w:r>
             <w:r>
               <w:rPr>
@@ -2655,7 +2500,7 @@
                 <w:noProof/>
                 <w:webHidden/>
               </w:rPr>
-              <w:t>25</w:t>
+              <w:t>26</w:t>
             </w:r>
             <w:r>
               <w:rPr>
@@ -2682,7 +2527,7 @@
               <w14:ligatures w14:val="standardContextual"/>
             </w:rPr>
           </w:pPr>
-          <w:hyperlink w:anchor="_Toc243925944" w:history="1">
+          <w:hyperlink w:anchor="_Toc244093798" w:history="1">
             <w:r>
               <w:rPr>
                 <w:rStyle w:val="Hyperlink"/>
@@ -2709,7 +2554,7 @@
                 <w:noProof/>
                 <w:webHidden/>
               </w:rPr>
-              <w:instrText xml:space="preserve"> PAGEREF _Toc243925944 \h </w:instrText>
+              <w:instrText xml:space="preserve"> PAGEREF _Toc244093798 \h </w:instrText>
             </w:r>
             <w:r>
               <w:rPr>
@@ -2729,7 +2574,7 @@
                 <w:noProof/>
                 <w:webHidden/>
               </w:rPr>
-              <w:t>26</w:t>
+              <w:t>27</w:t>
             </w:r>
             <w:r>
               <w:rPr>
@@ -2756,7 +2601,7 @@
               <w14:ligatures w14:val="standardContextual"/>
             </w:rPr>
           </w:pPr>
-          <w:hyperlink w:anchor="_Toc243925945" w:history="1">
+          <w:hyperlink w:anchor="_Toc244093799" w:history="1">
             <w:r>
               <w:rPr>
                 <w:rStyle w:val="Hyperlink"/>
@@ -2783,7 +2628,7 @@
                 <w:noProof/>
                 <w:webHidden/>
               </w:rPr>
-              <w:instrText xml:space="preserve"> PAGEREF _Toc243925945 \h </w:instrText>
+              <w:instrText xml:space="preserve"> PAGEREF _Toc244093799 \h </w:instrText>
             </w:r>
             <w:r>
               <w:rPr>
@@ -2803,7 +2648,7 @@
                 <w:noProof/>
                 <w:webHidden/>
               </w:rPr>
-              <w:t>27</w:t>
+              <w:t>28</w:t>
             </w:r>
             <w:r>
               <w:rPr>
@@ -2830,7 +2675,7 @@
               <w14:ligatures w14:val="standardContextual"/>
             </w:rPr>
           </w:pPr>
-          <w:hyperlink w:anchor="_Toc243925946" w:history="1">
+          <w:hyperlink w:anchor="_Toc244093800" w:history="1">
             <w:r>
               <w:rPr>
                 <w:rStyle w:val="Hyperlink"/>
@@ -2857,7 +2702,7 @@
                 <w:noProof/>
                 <w:webHidden/>
               </w:rPr>
-              <w:instrText xml:space="preserve"> PAGEREF _Toc243925946 \h </w:instrText>
+              <w:instrText xml:space="preserve"> PAGEREF _Toc244093800 \h </w:instrText>
             </w:r>
             <w:r>
               <w:rPr>
@@ -2877,7 +2722,7 @@
                 <w:noProof/>
                 <w:webHidden/>
               </w:rPr>
-              <w:t>28</w:t>
+              <w:t>29</w:t>
             </w:r>
             <w:r>
               <w:rPr>
@@ -2904,7 +2749,7 @@
               <w14:ligatures w14:val="standardContextual"/>
             </w:rPr>
           </w:pPr>
-          <w:hyperlink w:anchor="_Toc243925947" w:history="1">
+          <w:hyperlink w:anchor="_Toc244093801" w:history="1">
             <w:r>
               <w:rPr>
                 <w:rStyle w:val="Hyperlink"/>
@@ -2931,7 +2776,7 @@
                 <w:noProof/>
                 <w:webHidden/>
               </w:rPr>
-              <w:instrText xml:space="preserve"> PAGEREF _Toc243925947 \h </w:instrText>
+              <w:instrText xml:space="preserve"> PAGEREF _Toc244093801 \h </w:instrText>
             </w:r>
             <w:r>
               <w:rPr>
@@ -2951,7 +2796,7 @@
                 <w:noProof/>
                 <w:webHidden/>
               </w:rPr>
-              <w:t>28</w:t>
+              <w:t>29</w:t>
             </w:r>
             <w:r>
               <w:rPr>
@@ -2978,7 +2823,7 @@
               <w14:ligatures w14:val="standardContextual"/>
             </w:rPr>
           </w:pPr>
-          <w:hyperlink w:anchor="_Toc243925948" w:history="1">
+          <w:hyperlink w:anchor="_Toc244093802" w:history="1">
             <w:r>
               <w:rPr>
                 <w:rStyle w:val="Hyperlink"/>
@@ -3005,7 +2850,7 @@
                 <w:noProof/>
                 <w:webHidden/>
               </w:rPr>
-              <w:instrText xml:space="preserve"> PAGEREF _Toc243925948 \h </w:instrText>
+              <w:instrText xml:space="preserve"> PAGEREF _Toc244093802 \h </w:instrText>
             </w:r>
             <w:r>
               <w:rPr>
@@ -3025,7 +2870,7 @@
                 <w:noProof/>
                 <w:webHidden/>
               </w:rPr>
-              <w:t>29</w:t>
+              <w:t>30</w:t>
             </w:r>
             <w:r>
               <w:rPr>
@@ -3052,7 +2897,7 @@
               <w14:ligatures w14:val="standardContextual"/>
             </w:rPr>
           </w:pPr>
-          <w:hyperlink w:anchor="_Toc243925949" w:history="1">
+          <w:hyperlink w:anchor="_Toc244093803" w:history="1">
             <w:r>
               <w:rPr>
                 <w:rStyle w:val="Hyperlink"/>
@@ -3079,7 +2924,7 @@
                 <w:noProof/>
                 <w:webHidden/>
               </w:rPr>
-              <w:instrText xml:space="preserve"> PAGEREF _Toc243925949 \h </w:instrText>
+              <w:instrText xml:space="preserve"> PAGEREF _Toc244093803 \h </w:instrText>
             </w:r>
             <w:r>
               <w:rPr>
@@ -3099,7 +2944,7 @@
                 <w:noProof/>
                 <w:webHidden/>
               </w:rPr>
-              <w:t>29</w:t>
+              <w:t>30</w:t>
             </w:r>
             <w:r>
               <w:rPr>
@@ -3126,7 +2971,7 @@
               <w14:ligatures w14:val="standardContextual"/>
             </w:rPr>
           </w:pPr>
-          <w:hyperlink w:anchor="_Toc243925950" w:history="1">
+          <w:hyperlink w:anchor="_Toc244093804" w:history="1">
             <w:r>
               <w:rPr>
                 <w:rStyle w:val="Hyperlink"/>
@@ -3153,7 +2998,7 @@
                 <w:noProof/>
                 <w:webHidden/>
               </w:rPr>
-              <w:instrText xml:space="preserve"> PAGEREF _Toc243925950 \h </w:instrText>
+              <w:instrText xml:space="preserve"> PAGEREF _Toc244093804 \h </w:instrText>
             </w:r>
             <w:r>
               <w:rPr>
@@ -3173,7 +3018,7 @@
                 <w:noProof/>
                 <w:webHidden/>
               </w:rPr>
-              <w:t>30</w:t>
+              <w:t>31</w:t>
             </w:r>
             <w:r>
               <w:rPr>
@@ -3200,7 +3045,7 @@
               <w14:ligatures w14:val="standardContextual"/>
             </w:rPr>
           </w:pPr>
-          <w:hyperlink w:anchor="_Toc243925951" w:history="1">
+          <w:hyperlink w:anchor="_Toc244093805" w:history="1">
             <w:r>
               <w:rPr>
                 <w:rStyle w:val="Hyperlink"/>
@@ -3227,7 +3072,7 @@
                 <w:noProof/>
                 <w:webHidden/>
               </w:rPr>
-              <w:instrText xml:space="preserve"> PAGEREF _Toc243925951 \h </w:instrText>
+              <w:instrText xml:space="preserve"> PAGEREF _Toc244093805 \h </w:instrText>
             </w:r>
             <w:r>
               <w:rPr>
@@ -3247,7 +3092,7 @@
                 <w:noProof/>
                 <w:webHidden/>
               </w:rPr>
-              <w:t>30</w:t>
+              <w:t>31</w:t>
             </w:r>
             <w:r>
               <w:rPr>
@@ -3274,7 +3119,7 @@
               <w14:ligatures w14:val="standardContextual"/>
             </w:rPr>
           </w:pPr>
-          <w:hyperlink w:anchor="_Toc243925952" w:history="1">
+          <w:hyperlink w:anchor="_Toc244093806" w:history="1">
             <w:r>
               <w:rPr>
                 <w:rStyle w:val="Hyperlink"/>
@@ -3301,7 +3146,7 @@
                 <w:noProof/>
                 <w:webHidden/>
               </w:rPr>
-              <w:instrText xml:space="preserve"> PAGEREF _Toc243925952 \h </w:instrText>
+              <w:instrText xml:space="preserve"> PAGEREF _Toc244093806 \h </w:instrText>
             </w:r>
             <w:r>
               <w:rPr>
@@ -3321,7 +3166,7 @@
                 <w:noProof/>
                 <w:webHidden/>
               </w:rPr>
-              <w:t>31</w:t>
+              <w:t>32</w:t>
             </w:r>
             <w:r>
               <w:rPr>
@@ -3348,7 +3193,7 @@
               <w14:ligatures w14:val="standardContextual"/>
             </w:rPr>
           </w:pPr>
-          <w:hyperlink w:anchor="_Toc243925953" w:history="1">
+          <w:hyperlink w:anchor="_Toc244093807" w:history="1">
             <w:r>
               <w:rPr>
                 <w:rStyle w:val="Hyperlink"/>
@@ -3375,7 +3220,7 @@
                 <w:noProof/>
                 <w:webHidden/>
               </w:rPr>
-              <w:instrText xml:space="preserve"> PAGEREF _Toc243925953 \h </w:instrText>
+              <w:instrText xml:space="preserve"> PAGEREF _Toc244093807 \h </w:instrText>
             </w:r>
             <w:r>
               <w:rPr>
@@ -3395,7 +3240,7 @@
                 <w:noProof/>
                 <w:webHidden/>
               </w:rPr>
-              <w:t>31</w:t>
+              <w:t>32</w:t>
             </w:r>
             <w:r>
               <w:rPr>
@@ -3422,13 +3267,13 @@
               <w14:ligatures w14:val="standardContextual"/>
             </w:rPr>
           </w:pPr>
-          <w:hyperlink w:anchor="_Toc243925954" w:history="1">
+          <w:hyperlink w:anchor="_Toc244093808" w:history="1">
             <w:r>
               <w:rPr>
                 <w:rStyle w:val="Hyperlink"/>
                 <w:noProof/>
               </w:rPr>
-              <w:t>Bước 15. Xem giải của đội</w:t>
+              <w:t>Bước 15. Thử nhanh không cần GitHub</w:t>
             </w:r>
             <w:r>
               <w:rPr>
@@ -3449,7 +3294,7 @@
                 <w:noProof/>
                 <w:webHidden/>
               </w:rPr>
-              <w:instrText xml:space="preserve"> PAGEREF _Toc243925954 \h </w:instrText>
+              <w:instrText xml:space="preserve"> PAGEREF _Toc244093808 \h </w:instrText>
             </w:r>
             <w:r>
               <w:rPr>
@@ -3469,7 +3314,7 @@
                 <w:noProof/>
                 <w:webHidden/>
               </w:rPr>
-              <w:t>32</w:t>
+              <w:t>33</w:t>
             </w:r>
             <w:r>
               <w:rPr>
@@ -3496,13 +3341,13 @@
               <w14:ligatures w14:val="standardContextual"/>
             </w:rPr>
           </w:pPr>
-          <w:hyperlink w:anchor="_Toc243925955" w:history="1">
+          <w:hyperlink w:anchor="_Toc244093809" w:history="1">
             <w:r>
               <w:rPr>
                 <w:rStyle w:val="Hyperlink"/>
                 <w:noProof/>
               </w:rPr>
-              <w:t>Bước 16. Luyện tập với bot mẫu</w:t>
+              <w:t>Bước 16. Xem giải của đội</w:t>
             </w:r>
             <w:r>
               <w:rPr>
@@ -3523,7 +3368,7 @@
                 <w:noProof/>
                 <w:webHidden/>
               </w:rPr>
-              <w:instrText xml:space="preserve"> PAGEREF _Toc243925955 \h </w:instrText>
+              <w:instrText xml:space="preserve"> PAGEREF _Toc244093809 \h </w:instrText>
             </w:r>
             <w:r>
               <w:rPr>
@@ -3543,7 +3388,81 @@
                 <w:noProof/>
                 <w:webHidden/>
               </w:rPr>
-              <w:t>32</w:t>
+              <w:t>34</w:t>
+            </w:r>
+            <w:r>
+              <w:rPr>
+                <w:noProof/>
+                <w:webHidden/>
+              </w:rPr>
+              <w:fldChar w:fldCharType="end"/>
+            </w:r>
+          </w:hyperlink>
+        </w:p>
+        <w:p>
+          <w:pPr>
+            <w:pStyle w:val="TOC3"/>
+            <w:tabs>
+              <w:tab w:val="right" w:leader="dot" w:pos="9739"/>
+            </w:tabs>
+            <w:rPr>
+              <w:rFonts w:asciiTheme="minorHAnsi" w:hAnsiTheme="minorHAnsi" w:cstheme="minorBidi"/>
+              <w:noProof/>
+              <w:color w:val="auto"/>
+              <w:kern w:val="2"/>
+              <w:sz w:val="22"/>
+              <w:lang w:val="en-US"/>
+              <w14:ligatures w14:val="standardContextual"/>
+            </w:rPr>
+          </w:pPr>
+          <w:hyperlink w:anchor="_Toc244093810" w:history="1">
+            <w:r>
+              <w:rPr>
+                <w:rStyle w:val="Hyperlink"/>
+                <w:noProof/>
+              </w:rPr>
+              <w:t>Bước 17. Luyện tập với bot mẫu</w:t>
+            </w:r>
+            <w:r>
+              <w:rPr>
+                <w:noProof/>
+                <w:webHidden/>
+              </w:rPr>
+              <w:tab/>
+            </w:r>
+            <w:r>
+              <w:rPr>
+                <w:noProof/>
+                <w:webHidden/>
+              </w:rPr>
+              <w:fldChar w:fldCharType="begin"/>
+            </w:r>
+            <w:r>
+              <w:rPr>
+                <w:noProof/>
+                <w:webHidden/>
+              </w:rPr>
+              <w:instrText xml:space="preserve"> PAGEREF _Toc244093810 \h </w:instrText>
+            </w:r>
+            <w:r>
+              <w:rPr>
+                <w:noProof/>
+                <w:webHidden/>
+              </w:rPr>
+            </w:r>
+            <w:r>
+              <w:rPr>
+                <w:noProof/>
+                <w:webHidden/>
+              </w:rPr>
+              <w:fldChar w:fldCharType="separate"/>
+            </w:r>
+            <w:r>
+              <w:rPr>
+                <w:noProof/>
+                <w:webHidden/>
+              </w:rPr>
+              <w:t>34</w:t>
             </w:r>
             <w:r>
               <w:rPr>
@@ -3570,7 +3489,7 @@
               <w14:ligatures w14:val="standardContextual"/>
             </w:rPr>
           </w:pPr>
-          <w:hyperlink w:anchor="_Toc243925956" w:history="1">
+          <w:hyperlink w:anchor="_Toc244093811" w:history="1">
             <w:r>
               <w:rPr>
                 <w:rStyle w:val="Hyperlink"/>
@@ -3597,7 +3516,7 @@
                 <w:noProof/>
                 <w:webHidden/>
               </w:rPr>
-              <w:instrText xml:space="preserve"> PAGEREF _Toc243925956 \h </w:instrText>
+              <w:instrText xml:space="preserve"> PAGEREF _Toc244093811 \h </w:instrText>
             </w:r>
             <w:r>
               <w:rPr>
@@ -3617,7 +3536,7 @@
                 <w:noProof/>
                 <w:webHidden/>
               </w:rPr>
-              <w:t>33</w:t>
+              <w:t>35</w:t>
             </w:r>
             <w:r>
               <w:rPr>
@@ -3644,13 +3563,13 @@
               <w14:ligatures w14:val="standardContextual"/>
             </w:rPr>
           </w:pPr>
-          <w:hyperlink w:anchor="_Toc243925957" w:history="1">
+          <w:hyperlink w:anchor="_Toc244093812" w:history="1">
             <w:r>
               <w:rPr>
                 <w:rStyle w:val="Hyperlink"/>
                 <w:noProof/>
               </w:rPr>
-              <w:t>Bước 17. Xem tổng quan ban tổ chức</w:t>
+              <w:t>Bước 18. Xem tổng quan ban tổ chức</w:t>
             </w:r>
             <w:r>
               <w:rPr>
@@ -3671,7 +3590,7 @@
                 <w:noProof/>
                 <w:webHidden/>
               </w:rPr>
-              <w:instrText xml:space="preserve"> PAGEREF _Toc243925957 \h </w:instrText>
+              <w:instrText xml:space="preserve"> PAGEREF _Toc244093812 \h </w:instrText>
             </w:r>
             <w:r>
               <w:rPr>
@@ -3691,7 +3610,7 @@
                 <w:noProof/>
                 <w:webHidden/>
               </w:rPr>
-              <w:t>33</w:t>
+              <w:t>35</w:t>
             </w:r>
             <w:r>
               <w:rPr>
@@ -3718,13 +3637,13 @@
               <w14:ligatures w14:val="standardContextual"/>
             </w:rPr>
           </w:pPr>
-          <w:hyperlink w:anchor="_Toc243925958" w:history="1">
+          <w:hyperlink w:anchor="_Toc244093813" w:history="1">
             <w:r>
               <w:rPr>
                 <w:rStyle w:val="Hyperlink"/>
                 <w:noProof/>
               </w:rPr>
-              <w:t>Bước 18. Chọn giải ở Tổng quan</w:t>
+              <w:t>Bước 19. Chọn giải ở Tổng quan</w:t>
             </w:r>
             <w:r>
               <w:rPr>
@@ -3745,7 +3664,7 @@
                 <w:noProof/>
                 <w:webHidden/>
               </w:rPr>
-              <w:instrText xml:space="preserve"> PAGEREF _Toc243925958 \h </w:instrText>
+              <w:instrText xml:space="preserve"> PAGEREF _Toc244093813 \h </w:instrText>
             </w:r>
             <w:r>
               <w:rPr>
@@ -3765,7 +3684,7 @@
                 <w:noProof/>
                 <w:webHidden/>
               </w:rPr>
-              <w:t>34</w:t>
+              <w:t>36</w:t>
             </w:r>
             <w:r>
               <w:rPr>
@@ -3792,13 +3711,13 @@
               <w14:ligatures w14:val="standardContextual"/>
             </w:rPr>
           </w:pPr>
-          <w:hyperlink w:anchor="_Toc243925959" w:history="1">
+          <w:hyperlink w:anchor="_Toc244093814" w:history="1">
             <w:r>
               <w:rPr>
                 <w:rStyle w:val="Hyperlink"/>
                 <w:noProof/>
               </w:rPr>
-              <w:t>Bước 19. Chuẩn bị giải mới</w:t>
+              <w:t>Bước 20. Chuẩn bị giải mới</w:t>
             </w:r>
             <w:r>
               <w:rPr>
@@ -3819,7 +3738,7 @@
                 <w:noProof/>
                 <w:webHidden/>
               </w:rPr>
-              <w:instrText xml:space="preserve"> PAGEREF _Toc243925959 \h </w:instrText>
+              <w:instrText xml:space="preserve"> PAGEREF _Toc244093814 \h </w:instrText>
             </w:r>
             <w:r>
               <w:rPr>
@@ -3839,7 +3758,7 @@
                 <w:noProof/>
                 <w:webHidden/>
               </w:rPr>
-              <w:t>35</w:t>
+              <w:t>37</w:t>
             </w:r>
             <w:r>
               <w:rPr>
@@ -3866,13 +3785,13 @@
               <w14:ligatures w14:val="standardContextual"/>
             </w:rPr>
           </w:pPr>
-          <w:hyperlink w:anchor="_Toc243925960" w:history="1">
+          <w:hyperlink w:anchor="_Toc244093815" w:history="1">
             <w:r>
               <w:rPr>
                 <w:rStyle w:val="Hyperlink"/>
                 <w:noProof/>
               </w:rPr>
-              <w:t>Bước 20. Cài máy chấm Windows hoặc Linux</w:t>
+              <w:t>Bước 21. Cài máy chấm Windows hoặc Linux</w:t>
             </w:r>
             <w:r>
               <w:rPr>
@@ -3893,7 +3812,7 @@
                 <w:noProof/>
                 <w:webHidden/>
               </w:rPr>
-              <w:instrText xml:space="preserve"> PAGEREF _Toc243925960 \h </w:instrText>
+              <w:instrText xml:space="preserve"> PAGEREF _Toc244093815 \h </w:instrText>
             </w:r>
             <w:r>
               <w:rPr>
@@ -3913,7 +3832,7 @@
                 <w:noProof/>
                 <w:webHidden/>
               </w:rPr>
-              <w:t>35</w:t>
+              <w:t>37</w:t>
             </w:r>
             <w:r>
               <w:rPr>
@@ -3940,13 +3859,13 @@
               <w14:ligatures w14:val="standardContextual"/>
             </w:rPr>
           </w:pPr>
-          <w:hyperlink w:anchor="_Toc243925961" w:history="1">
+          <w:hyperlink w:anchor="_Toc244093816" w:history="1">
             <w:r>
               <w:rPr>
                 <w:rStyle w:val="Hyperlink"/>
                 <w:noProof/>
               </w:rPr>
-              <w:t>Bước 21. Kiểm tình trạng chấm và hàng đợi</w:t>
+              <w:t>Bước 22. Kiểm tình trạng chấm và hàng đợi</w:t>
             </w:r>
             <w:r>
               <w:rPr>
@@ -3967,7 +3886,7 @@
                 <w:noProof/>
                 <w:webHidden/>
               </w:rPr>
-              <w:instrText xml:space="preserve"> PAGEREF _Toc243925961 \h </w:instrText>
+              <w:instrText xml:space="preserve"> PAGEREF _Toc244093816 \h </w:instrText>
             </w:r>
             <w:r>
               <w:rPr>
@@ -3987,7 +3906,7 @@
                 <w:noProof/>
                 <w:webHidden/>
               </w:rPr>
-              <w:t>36</w:t>
+              <w:t>38</w:t>
             </w:r>
             <w:r>
               <w:rPr>
@@ -4014,13 +3933,13 @@
               <w14:ligatures w14:val="standardContextual"/>
             </w:rPr>
           </w:pPr>
-          <w:hyperlink w:anchor="_Toc243925962" w:history="1">
+          <w:hyperlink w:anchor="_Toc244093817" w:history="1">
             <w:r>
               <w:rPr>
                 <w:rStyle w:val="Hyperlink"/>
                 <w:noProof/>
               </w:rPr>
-              <w:t>Bước 22. Soạn thông báo</w:t>
+              <w:t>Bước 23. Soạn thông báo</w:t>
             </w:r>
             <w:r>
               <w:rPr>
@@ -4041,7 +3960,7 @@
                 <w:noProof/>
                 <w:webHidden/>
               </w:rPr>
-              <w:instrText xml:space="preserve"> PAGEREF _Toc243925962 \h </w:instrText>
+              <w:instrText xml:space="preserve"> PAGEREF _Toc244093817 \h </w:instrText>
             </w:r>
             <w:r>
               <w:rPr>
@@ -4061,7 +3980,7 @@
                 <w:noProof/>
                 <w:webHidden/>
               </w:rPr>
-              <w:t>36</w:t>
+              <w:t>38</w:t>
             </w:r>
             <w:r>
               <w:rPr>
@@ -4088,13 +4007,13 @@
               <w14:ligatures w14:val="standardContextual"/>
             </w:rPr>
           </w:pPr>
-          <w:hyperlink w:anchor="_Toc243925963" w:history="1">
+          <w:hyperlink w:anchor="_Toc244093818" w:history="1">
             <w:r>
               <w:rPr>
                 <w:rStyle w:val="Hyperlink"/>
                 <w:noProof/>
               </w:rPr>
-              <w:t>Bước 23. Xuất bảng điểm CSV</w:t>
+              <w:t>Bước 24. Xuất bảng điểm CSV</w:t>
             </w:r>
             <w:r>
               <w:rPr>
@@ -4115,7 +4034,7 @@
                 <w:noProof/>
                 <w:webHidden/>
               </w:rPr>
-              <w:instrText xml:space="preserve"> PAGEREF _Toc243925963 \h </w:instrText>
+              <w:instrText xml:space="preserve"> PAGEREF _Toc244093818 \h </w:instrText>
             </w:r>
             <w:r>
               <w:rPr>
@@ -4135,7 +4054,7 @@
                 <w:noProof/>
                 <w:webHidden/>
               </w:rPr>
-              <w:t>37</w:t>
+              <w:t>39</w:t>
             </w:r>
             <w:r>
               <w:rPr>
@@ -4162,7 +4081,7 @@
               <w14:ligatures w14:val="standardContextual"/>
             </w:rPr>
           </w:pPr>
-          <w:hyperlink w:anchor="_Toc243925964" w:history="1">
+          <w:hyperlink w:anchor="_Toc244093819" w:history="1">
             <w:r>
               <w:rPr>
                 <w:rStyle w:val="Hyperlink"/>
@@ -4189,7 +4108,7 @@
                 <w:noProof/>
                 <w:webHidden/>
               </w:rPr>
-              <w:instrText xml:space="preserve"> PAGEREF _Toc243925964 \h </w:instrText>
+              <w:instrText xml:space="preserve"> PAGEREF _Toc244093819 \h </w:instrText>
             </w:r>
             <w:r>
               <w:rPr>
@@ -4209,7 +4128,7 @@
                 <w:noProof/>
                 <w:webHidden/>
               </w:rPr>
-              <w:t>38</w:t>
+              <w:t>40</w:t>
             </w:r>
             <w:r>
               <w:rPr>
@@ -4236,13 +4155,13 @@
               <w14:ligatures w14:val="standardContextual"/>
             </w:rPr>
           </w:pPr>
-          <w:hyperlink w:anchor="_Toc243925965" w:history="1">
+          <w:hyperlink w:anchor="_Toc244093820" w:history="1">
             <w:r>
               <w:rPr>
                 <w:rStyle w:val="Hyperlink"/>
                 <w:noProof/>
               </w:rPr>
-              <w:t>Bước 24. Tạo tài khoản và phát giấy cho đội</w:t>
+              <w:t>Bước 25. Tạo tài khoản và phát giấy cho đội</w:t>
             </w:r>
             <w:r>
               <w:rPr>
@@ -4263,7 +4182,7 @@
                 <w:noProof/>
                 <w:webHidden/>
               </w:rPr>
-              <w:instrText xml:space="preserve"> PAGEREF _Toc243925965 \h </w:instrText>
+              <w:instrText xml:space="preserve"> PAGEREF _Toc244093820 \h </w:instrText>
             </w:r>
             <w:r>
               <w:rPr>
@@ -4283,7 +4202,7 @@
                 <w:noProof/>
                 <w:webHidden/>
               </w:rPr>
-              <w:t>38</w:t>
+              <w:t>40</w:t>
             </w:r>
             <w:r>
               <w:rPr>
@@ -4310,13 +4229,13 @@
               <w14:ligatures w14:val="standardContextual"/>
             </w:rPr>
           </w:pPr>
-          <w:hyperlink w:anchor="_Toc243925966" w:history="1">
+          <w:hyperlink w:anchor="_Toc244093821" w:history="1">
             <w:r>
               <w:rPr>
                 <w:rStyle w:val="Hyperlink"/>
                 <w:noProof/>
               </w:rPr>
-              <w:t>Bước 25. Đội tự nạp ZIP và kiểm tra</w:t>
+              <w:t>Bước 26. Đội tự nạp ZIP và kiểm tra</w:t>
             </w:r>
             <w:r>
               <w:rPr>
@@ -4337,7 +4256,7 @@
                 <w:noProof/>
                 <w:webHidden/>
               </w:rPr>
-              <w:instrText xml:space="preserve"> PAGEREF _Toc243925966 \h </w:instrText>
+              <w:instrText xml:space="preserve"> PAGEREF _Toc244093821 \h </w:instrText>
             </w:r>
             <w:r>
               <w:rPr>
@@ -4357,7 +4276,7 @@
                 <w:noProof/>
                 <w:webHidden/>
               </w:rPr>
-              <w:t>39</w:t>
+              <w:t>41</w:t>
             </w:r>
             <w:r>
               <w:rPr>
@@ -4384,13 +4303,13 @@
               <w14:ligatures w14:val="standardContextual"/>
             </w:rPr>
           </w:pPr>
-          <w:hyperlink w:anchor="_Toc243925967" w:history="1">
+          <w:hyperlink w:anchor="_Toc244093822" w:history="1">
             <w:r>
               <w:rPr>
                 <w:rStyle w:val="Hyperlink"/>
                 <w:noProof/>
               </w:rPr>
-              <w:t>Bước 26. Tạo bảng và thêm các đội</w:t>
+              <w:t>Bước 27. Tạo bảng và thêm các đội</w:t>
             </w:r>
             <w:r>
               <w:rPr>
@@ -4411,7 +4330,7 @@
                 <w:noProof/>
                 <w:webHidden/>
               </w:rPr>
-              <w:instrText xml:space="preserve"> PAGEREF _Toc243925967 \h </w:instrText>
+              <w:instrText xml:space="preserve"> PAGEREF _Toc244093822 \h </w:instrText>
             </w:r>
             <w:r>
               <w:rPr>
@@ -4431,7 +4350,7 @@
                 <w:noProof/>
                 <w:webHidden/>
               </w:rPr>
-              <w:t>40</w:t>
+              <w:t>42</w:t>
             </w:r>
             <w:r>
               <w:rPr>
@@ -4458,13 +4377,13 @@
               <w14:ligatures w14:val="standardContextual"/>
             </w:rPr>
           </w:pPr>
-          <w:hyperlink w:anchor="_Toc243925968" w:history="1">
+          <w:hyperlink w:anchor="_Toc244093823" w:history="1">
             <w:r>
               <w:rPr>
                 <w:rStyle w:val="Hyperlink"/>
                 <w:noProof/>
               </w:rPr>
-              <w:t>Bước 27. Chiếu bảng điểm và replay</w:t>
+              <w:t>Bước 28. Chiếu bảng điểm và replay</w:t>
             </w:r>
             <w:r>
               <w:rPr>
@@ -4485,7 +4404,7 @@
                 <w:noProof/>
                 <w:webHidden/>
               </w:rPr>
-              <w:instrText xml:space="preserve"> PAGEREF _Toc243925968 \h </w:instrText>
+              <w:instrText xml:space="preserve"> PAGEREF _Toc244093823 \h </w:instrText>
             </w:r>
             <w:r>
               <w:rPr>
@@ -4505,7 +4424,7 @@
                 <w:noProof/>
                 <w:webHidden/>
               </w:rPr>
-              <w:t>41</w:t>
+              <w:t>43</w:t>
             </w:r>
             <w:r>
               <w:rPr>
@@ -4532,13 +4451,13 @@
               <w14:ligatures w14:val="standardContextual"/>
             </w:rPr>
           </w:pPr>
-          <w:hyperlink w:anchor="_Toc243925969" w:history="1">
+          <w:hyperlink w:anchor="_Toc244093824" w:history="1">
             <w:r>
               <w:rPr>
                 <w:rStyle w:val="Hyperlink"/>
                 <w:noProof/>
               </w:rPr>
-              <w:t>Bước 28. Tạo cặp loại trực tiếp</w:t>
+              <w:t>Bước 29. Tạo cặp loại trực tiếp</w:t>
             </w:r>
             <w:r>
               <w:rPr>
@@ -4559,7 +4478,7 @@
                 <w:noProof/>
                 <w:webHidden/>
               </w:rPr>
-              <w:instrText xml:space="preserve"> PAGEREF _Toc243925969 \h </w:instrText>
+              <w:instrText xml:space="preserve"> PAGEREF _Toc244093824 \h </w:instrText>
             </w:r>
             <w:r>
               <w:rPr>
@@ -4579,7 +4498,7 @@
                 <w:noProof/>
                 <w:webHidden/>
               </w:rPr>
-              <w:t>42</w:t>
+              <w:t>44</w:t>
             </w:r>
             <w:r>
               <w:rPr>
@@ -4606,13 +4525,13 @@
               <w14:ligatures w14:val="standardContextual"/>
             </w:rPr>
           </w:pPr>
-          <w:hyperlink w:anchor="_Toc243925970" w:history="1">
+          <w:hyperlink w:anchor="_Toc244093825" w:history="1">
             <w:r>
               <w:rPr>
                 <w:rStyle w:val="Hyperlink"/>
                 <w:noProof/>
               </w:rPr>
-              <w:t>Bước 29. Xuất CSV và đăng kết quả</w:t>
+              <w:t>Bước 30. Xuất CSV và đăng kết quả</w:t>
             </w:r>
             <w:r>
               <w:rPr>
@@ -4633,7 +4552,7 @@
                 <w:noProof/>
                 <w:webHidden/>
               </w:rPr>
-              <w:instrText xml:space="preserve"> PAGEREF _Toc243925970 \h </w:instrText>
+              <w:instrText xml:space="preserve"> PAGEREF _Toc244093825 \h </w:instrText>
             </w:r>
             <w:r>
               <w:rPr>
@@ -4653,7 +4572,7 @@
                 <w:noProof/>
                 <w:webHidden/>
               </w:rPr>
-              <w:t>43</w:t>
+              <w:t>45</w:t>
             </w:r>
             <w:r>
               <w:rPr>
@@ -4677,7 +4596,7 @@
         <w:pageBreakBefore/>
       </w:pPr>
       <w:bookmarkStart w:id="0" w:name="mở-đầu"/>
-      <w:bookmarkStart w:id="1" w:name="_Toc243925912"/>
+      <w:bookmarkStart w:id="1" w:name="_Toc244093766"/>
       <w:r>
         <w:lastRenderedPageBreak/>
         <w:t>Mở đầu</w:t>
@@ -4694,7 +4613,16 @@
         <w:pStyle w:val="BodyText"/>
       </w:pPr>
       <w:r>
-        <w:t xml:space="preserve">Hệ thống đang phục vụ tại </w:t>
+        <w:t xml:space="preserve">Hệ thống đang </w:t>
+      </w:r>
+      <w:r>
+        <w:rPr>
+          <w:lang w:val="en-US"/>
+        </w:rPr>
+        <w:t>chạy</w:t>
+      </w:r>
+      <w:r>
+        <w:t xml:space="preserve"> tại </w:t>
       </w:r>
       <w:r>
         <w:rPr>
@@ -4743,8 +4671,8 @@
           <w:noProof/>
         </w:rPr>
         <w:drawing>
-          <wp:inline distT="0" distB="0" distL="0" distR="0" wp14:anchorId="5DF3DC8F" wp14:editId="6F613236">
-            <wp:extent cx="5759999" cy="4391052"/>
+          <wp:inline distT="0" distB="0" distL="0" distR="0" wp14:anchorId="7762D94D" wp14:editId="263767F2">
+            <wp:extent cx="5760000" cy="3922758"/>
             <wp:effectExtent l="0" t="0" r="0" b="0"/>
             <wp:docPr id="19" name="Picture" descr="Hình 1 Trang chủ công khai với hai giải demo đã hoàn tất"/>
             <wp:cNvGraphicFramePr/>
@@ -4766,7 +4694,7 @@
                   <pic:spPr bwMode="auto">
                     <a:xfrm>
                       <a:off x="0" y="0"/>
-                      <a:ext cx="5759999" cy="4391052"/>
+                      <a:ext cx="5760000" cy="3922758"/>
                     </a:xfrm>
                     <a:prstGeom prst="rect">
                       <a:avLst/>
@@ -4792,7 +4720,7 @@
         <w:jc w:val="center"/>
       </w:pPr>
       <w:r>
-        <w:t>Hình 1. Trang chủ công khai với hai giải demo đã hoàn tất</w:t>
+        <w:t>Hình 1. Trang khách với bàn cờ một ván thật đã hoàn tất</w:t>
       </w:r>
     </w:p>
     <w:p>
@@ -4832,7 +4760,7 @@
         <w:pageBreakBefore/>
       </w:pPr>
       <w:bookmarkStart w:id="2" w:name="phần-a-giải-đấu"/>
-      <w:bookmarkStart w:id="3" w:name="_Toc243925913"/>
+      <w:bookmarkStart w:id="3" w:name="_Toc244093767"/>
       <w:bookmarkEnd w:id="0"/>
       <w:r>
         <w:lastRenderedPageBreak/>
@@ -4845,7 +4773,7 @@
         <w:pStyle w:val="Heading2"/>
       </w:pPr>
       <w:bookmarkStart w:id="4" w:name="a1-trò-chơi-ottv2"/>
-      <w:bookmarkStart w:id="5" w:name="_Toc243925914"/>
+      <w:bookmarkStart w:id="5" w:name="_Toc244093768"/>
       <w:r>
         <w:t>1. Trò chơi OTTv2</w:t>
       </w:r>
@@ -5126,7 +5054,7 @@
         <w:pStyle w:val="Heading2"/>
       </w:pPr>
       <w:bookmarkStart w:id="6" w:name="a2-tài-khoản-và-đội"/>
-      <w:bookmarkStart w:id="7" w:name="_Toc243925915"/>
+      <w:bookmarkStart w:id="7" w:name="_Toc244093769"/>
       <w:bookmarkEnd w:id="4"/>
       <w:r>
         <w:t>2. Tài khoản và đội</w:t>
@@ -5445,7 +5373,7 @@
         <w:pStyle w:val="Heading2"/>
       </w:pPr>
       <w:bookmarkStart w:id="8" w:name="a3-nộp-bot-qua-github"/>
-      <w:bookmarkStart w:id="9" w:name="_Toc243925916"/>
+      <w:bookmarkStart w:id="9" w:name="_Toc244093770"/>
       <w:bookmarkEnd w:id="6"/>
       <w:r>
         <w:t>3. Nộp bot qua GitHub</w:t>
@@ -5861,17 +5789,7 @@
         <w:pStyle w:val="BodyText"/>
       </w:pPr>
       <w:r>
-        <w:t xml:space="preserve">Sinh viên </w:t>
-      </w:r>
-      <w:r>
-        <w:rPr>
-          <w:b/>
-          <w:bCs/>
-        </w:rPr>
-        <w:t>chỉ nộp qua GitHub</w:t>
-      </w:r>
-      <w:r>
-        <w:t>. Đường nạp ZIP là công cụ nội bộ của ban tổ chức, không phải cách tham gia giải Elo. GitHub đồng thời giúp sinh viên tập chia sẻ mã và xem lại quá trình phát triển của nhóm.</w:t>
+        <w:t>Giải chính thức chỉ nhận commit GitHub. Để thử nhanh, sinh viên dán mã nguồn hoặc chọn một file C++17, C11 hay Python 3 trên web; bản này chỉ dùng để kiểm 72 mẫu và luyện tập, tối đa 10 bản mỗi giờ. Đội một người đã thử được; đủ bốn người mới dự giải. GitHub đồng thời giúp sinh viên tập chia sẻ mã và xem lại quá trình phát triển của nhóm.</w:t>
       </w:r>
     </w:p>
     <w:p>
@@ -5879,7 +5797,7 @@
         <w:pStyle w:val="Heading2"/>
       </w:pPr>
       <w:bookmarkStart w:id="10" w:name="a4-thể-lệ-và-lịch-đấu"/>
-      <w:bookmarkStart w:id="11" w:name="_Toc243925917"/>
+      <w:bookmarkStart w:id="11" w:name="_Toc244093771"/>
       <w:bookmarkEnd w:id="8"/>
       <w:r>
         <w:t>4. Thể lệ và lịch đấu</w:t>
@@ -5891,7 +5809,7 @@
         <w:pStyle w:val="Heading3"/>
       </w:pPr>
       <w:bookmarkStart w:id="12" w:name="ladder-trước-hạn"/>
-      <w:bookmarkStart w:id="13" w:name="_Toc243925918"/>
+      <w:bookmarkStart w:id="13" w:name="_Toc244093772"/>
       <w:r>
         <w:t>4.1. Ladder trước hạn</w:t>
       </w:r>
@@ -5951,7 +5869,7 @@
         <w:pStyle w:val="Heading3"/>
       </w:pPr>
       <w:bookmarkStart w:id="14" w:name="chốt-bài-tại-hạn"/>
-      <w:bookmarkStart w:id="15" w:name="_Toc243925919"/>
+      <w:bookmarkStart w:id="15" w:name="_Toc244093773"/>
       <w:bookmarkEnd w:id="12"/>
       <w:r>
         <w:lastRenderedPageBreak/>
@@ -5977,7 +5895,7 @@
         <w:pStyle w:val="Heading3"/>
       </w:pPr>
       <w:bookmarkStart w:id="16" w:name="xếp-hạng-chính-thức"/>
-      <w:bookmarkStart w:id="17" w:name="_Toc243925920"/>
+      <w:bookmarkStart w:id="17" w:name="_Toc244093774"/>
       <w:bookmarkEnd w:id="14"/>
       <w:r>
         <w:t>4.3. Xếp hạng chính thức</w:t>
@@ -6328,9 +6246,9 @@
         <w:pStyle w:val="Heading2"/>
       </w:pPr>
       <w:bookmarkStart w:id="18" w:name="a5-xem-kết-quả"/>
-      <w:bookmarkStart w:id="19" w:name="_Toc243925921"/>
+      <w:bookmarkStart w:id="19" w:name="_Toc244093775"/>
+      <w:bookmarkEnd w:id="10"/>
       <w:bookmarkEnd w:id="16"/>
-      <w:bookmarkEnd w:id="10"/>
       <w:r>
         <w:t>5. Xem kết quả</w:t>
       </w:r>
@@ -6352,7 +6270,7 @@
         </w:rPr>
         <w:lastRenderedPageBreak/>
         <w:drawing>
-          <wp:inline distT="0" distB="0" distL="0" distR="0" wp14:anchorId="7ED040C4" wp14:editId="1651A8D9">
+          <wp:inline distT="0" distB="0" distL="0" distR="0" wp14:anchorId="369B63E4" wp14:editId="0253E56B">
             <wp:extent cx="5759999" cy="5603684"/>
             <wp:effectExtent l="0" t="0" r="0" b="0"/>
             <wp:docPr id="35" name="Picture" descr="Hình 2 Bảng điểm vòng tròn của giải qua GitHub sau khi hoàn tất 12 ván"/>
@@ -6431,7 +6349,7 @@
         </w:rPr>
         <w:lastRenderedPageBreak/>
         <w:drawing>
-          <wp:inline distT="0" distB="0" distL="0" distR="0" wp14:anchorId="55C75A3B" wp14:editId="5BDD7B9F">
+          <wp:inline distT="0" distB="0" distL="0" distR="0" wp14:anchorId="6794E733" wp14:editId="56768B9C">
             <wp:extent cx="5579999" cy="7011709"/>
             <wp:effectExtent l="0" t="0" r="0" b="0"/>
             <wp:docPr id="38" name="Picture" descr="Hình 3 Replay một ván đã kết thúc bằng chiếm căn cứ"/>
@@ -6496,7 +6414,7 @@
         <w:pStyle w:val="Heading2"/>
       </w:pPr>
       <w:bookmarkStart w:id="20" w:name="a6-ban-tổ-chức-và-điều-hành"/>
-      <w:bookmarkStart w:id="21" w:name="_Toc243925922"/>
+      <w:bookmarkStart w:id="21" w:name="_Toc244093776"/>
       <w:bookmarkEnd w:id="18"/>
       <w:r>
         <w:t>6. Ban tổ chức và điều hành</w:t>
@@ -6527,7 +6445,7 @@
         </w:rPr>
         <w:lastRenderedPageBreak/>
         <w:drawing>
-          <wp:inline distT="0" distB="0" distL="0" distR="0" wp14:anchorId="5ADC7C12" wp14:editId="57909B4D">
+          <wp:inline distT="0" distB="0" distL="0" distR="0" wp14:anchorId="1CD6C8B9" wp14:editId="76DF2E01">
             <wp:extent cx="5759999" cy="3254999"/>
             <wp:effectExtent l="0" t="0" r="0" b="0"/>
             <wp:docPr id="42" name="Picture" descr="Hình 4 Phần chính của biểu mẫu tạo giải với các giá trị mặc định"/>
@@ -6592,7 +6510,7 @@
         <w:pStyle w:val="BodyText"/>
       </w:pPr>
       <w:r>
-        <w:t>Mỗi máy chấm được cấp một mã riêng ở trang Máy chấm. Ban tổ chức gửi mã riêng cho người vận hành, kiểm nền tảng, phiên bản, số slot và trạng thái online trước khi cho nhận trận tính điểm. Thu hồi mã khi máy không dùng nữa; máy đã thu hồi có thể xóa khỏi danh sách nhưng lịch sử ván vẫn giữ tên máy. Không mở cửa sổ cấp mã khi đang quay hoặc chụp màn hình công khai.</w:t>
+        <w:t>Mỗi máy chấm được cấp một mã riêng ở trang Máy chấm. Ban tổ chức gửi mã riêng cho người vận hành, kiểm nền tảng, phiên bản, số slot và trạng thái online trước khi cho nhận trận tính điểm. Thu hồi mã khi máy không dùng nữa; máy đã thu hồi có thể xóa khỏi danh sách nhưng lịch sử ván vẫn giữ tên máy. Không mở cửa sổ cấp mã khi đang quay hoặc chụp màn hình công khai. Chỉ tài khoản BTC organizer được tạo, thu hồi, xóa máy chấm và lấy gói cài; BTC khác xem đầy đủ trạng thái nhưng không điều khiển máy chấm.</w:t>
       </w:r>
     </w:p>
     <w:p>
@@ -6615,7 +6533,7 @@
       <w:pPr>
         <w:pStyle w:val="Heading2"/>
       </w:pPr>
-      <w:bookmarkStart w:id="22" w:name="_Toc243925923"/>
+      <w:bookmarkStart w:id="22" w:name="_Toc244093777"/>
       <w:r>
         <w:t>7. Chung kết tại hội trường</w:t>
       </w:r>
@@ -6638,11 +6556,8 @@
     </w:p>
     <w:p>
       <w:r>
-        <w:t xml:space="preserve">Tứ kết gồm 1A–2B, 1C–2D, 1B–2A, 1D–2C, rồi bán kết, tranh hạng ba và chung kết. Mỗi cặp là một giải vòng tròn hai đội, hai ván đổi màu. Nếu tổng điểm hòa, đội đứng cao hơn ở vòng bảng đi tiếp; cùng </w:t>
-      </w:r>
-      <w:r>
         <w:lastRenderedPageBreak/>
-        <w:t>hạng thì xét điểm vòng bảng, rồi thứ hạng online. Trọng tài áp dụng các hệ số này và tạo cặp tiếp theo; hub không tự dựng nhánh loại trực tiếp.</w:t>
+        <w:t>Tứ kết gồm 1A–2B, 1C–2D, 1B–2A, 1D–2C, rồi bán kết, tranh hạng ba và chung kết. Mỗi cặp là một giải vòng tròn hai đội, hai ván đổi màu. Nếu tổng điểm hòa, đội đứng cao hơn ở vòng bảng đi tiếp; cùng hạng thì xét điểm vòng bảng, rồi thứ hạng online. Trọng tài áp dụng các hệ số này và tạo cặp tiếp theo; hub không tự dựng nhánh loại trực tiếp.</w:t>
       </w:r>
     </w:p>
     <w:p>
@@ -7045,9 +6960,9 @@
         <w:pageBreakBefore/>
       </w:pPr>
       <w:bookmarkStart w:id="23" w:name="phần-b-thiết-kế-kỹ-thuật"/>
-      <w:bookmarkStart w:id="24" w:name="_Toc243925924"/>
+      <w:bookmarkStart w:id="24" w:name="_Toc244093778"/>
+      <w:bookmarkEnd w:id="2"/>
       <w:bookmarkEnd w:id="20"/>
-      <w:bookmarkEnd w:id="2"/>
       <w:r>
         <w:lastRenderedPageBreak/>
         <w:t>B. THIẾT KẾ KỸ THUẬT</w:t>
@@ -7059,7 +6974,7 @@
         <w:pStyle w:val="Heading2"/>
       </w:pPr>
       <w:bookmarkStart w:id="25" w:name="b1-kiến-trúc-tổng-thể"/>
-      <w:bookmarkStart w:id="26" w:name="_Toc243925925"/>
+      <w:bookmarkStart w:id="26" w:name="_Toc244093779"/>
       <w:r>
         <w:t>1. Kiến trúc tổng thể</w:t>
       </w:r>
@@ -7080,7 +6995,7 @@
           <w:noProof/>
         </w:rPr>
         <w:drawing>
-          <wp:inline distT="0" distB="0" distL="0" distR="0" wp14:anchorId="61A2ADDD" wp14:editId="38F4EFC5">
+          <wp:inline distT="0" distB="0" distL="0" distR="0" wp14:anchorId="6AF4E388" wp14:editId="4FC9CC52">
             <wp:extent cx="5759999" cy="3702857"/>
             <wp:effectExtent l="0" t="0" r="0" b="0"/>
             <wp:docPr id="47" name="Picture" descr="Hình 5 Kiến trúc triển khai; các mũi tên biểu diễn kết nối hoặc yêu cầu giữa các thành phần"/>
@@ -7161,7 +7076,7 @@
         <w:pStyle w:val="Heading2"/>
       </w:pPr>
       <w:bookmarkStart w:id="27" w:name="b2-dịch-vụ-được-dùng"/>
-      <w:bookmarkStart w:id="28" w:name="_Toc243925926"/>
+      <w:bookmarkStart w:id="28" w:name="_Toc244093780"/>
       <w:bookmarkEnd w:id="25"/>
       <w:r>
         <w:lastRenderedPageBreak/>
@@ -7493,7 +7408,7 @@
         <w:pStyle w:val="Heading2"/>
       </w:pPr>
       <w:bookmarkStart w:id="29" w:name="b3-hub-và-cách-phục-vụ-dữ-liệu"/>
-      <w:bookmarkStart w:id="30" w:name="_Toc243925927"/>
+      <w:bookmarkStart w:id="30" w:name="_Toc244093781"/>
       <w:bookmarkEnd w:id="27"/>
       <w:r>
         <w:t>3. Hub và cách phục vụ dữ liệu</w:t>
@@ -7572,7 +7487,7 @@
         <w:pStyle w:val="Heading2"/>
       </w:pPr>
       <w:bookmarkStart w:id="31" w:name="b4-máy-chấm-và-chia-việc"/>
-      <w:bookmarkStart w:id="32" w:name="_Toc243925928"/>
+      <w:bookmarkStart w:id="32" w:name="_Toc244093782"/>
       <w:bookmarkEnd w:id="29"/>
       <w:r>
         <w:t>4. Máy chấm và chia việc</w:t>
@@ -7614,7 +7529,7 @@
           <w:noProof/>
         </w:rPr>
         <w:drawing>
-          <wp:inline distT="0" distB="0" distL="0" distR="0" wp14:anchorId="279F3568" wp14:editId="21D08C48">
+          <wp:inline distT="0" distB="0" distL="0" distR="0" wp14:anchorId="0BB03FA2" wp14:editId="0385D52A">
             <wp:extent cx="5759999" cy="3543157"/>
             <wp:effectExtent l="0" t="0" r="0" b="0"/>
             <wp:docPr id="53" name="Picture" descr="Hình 6 Trang quản lý máy chấm trên web thật; tên máy được che, trạng thái phản ánh thời điểm chụp"/>
@@ -7695,7 +7610,7 @@
         <w:pStyle w:val="Heading2"/>
       </w:pPr>
       <w:bookmarkStart w:id="33" w:name="b5-sandbox-thay-docker"/>
-      <w:bookmarkStart w:id="34" w:name="_Toc243925929"/>
+      <w:bookmarkStart w:id="34" w:name="_Toc244093783"/>
       <w:bookmarkEnd w:id="31"/>
       <w:r>
         <w:t>5. Sandbox chạy bot</w:t>
@@ -7737,7 +7652,7 @@
         <w:pStyle w:val="Heading2"/>
       </w:pPr>
       <w:bookmarkStart w:id="35" w:name="b6-quỹ-giờ-và-khả-năng-đối-chiếu"/>
-      <w:bookmarkStart w:id="36" w:name="_Toc243925930"/>
+      <w:bookmarkStart w:id="36" w:name="_Toc244093784"/>
       <w:bookmarkEnd w:id="33"/>
       <w:r>
         <w:t>6. Quỹ giờ và khả năng đối chiếu</w:t>
@@ -7786,7 +7701,7 @@
         <w:pStyle w:val="Heading2"/>
       </w:pPr>
       <w:bookmarkStart w:id="37" w:name="b7-chịu-lỗi-và-sao-lưu"/>
-      <w:bookmarkStart w:id="38" w:name="_Toc243925931"/>
+      <w:bookmarkStart w:id="38" w:name="_Toc244093785"/>
       <w:bookmarkEnd w:id="35"/>
       <w:r>
         <w:t>7. Chịu lỗi và sao lưu</w:t>
@@ -8171,7 +8086,7 @@
         <w:pStyle w:val="Heading2"/>
       </w:pPr>
       <w:bookmarkStart w:id="39" w:name="b8-bảo-mật"/>
-      <w:bookmarkStart w:id="40" w:name="_Toc243925932"/>
+      <w:bookmarkStart w:id="40" w:name="_Toc244093786"/>
       <w:bookmarkEnd w:id="37"/>
       <w:r>
         <w:t>8. Bảo mật</w:t>
@@ -8188,7 +8103,7 @@
         <w:pStyle w:val="BodyText"/>
       </w:pPr>
       <w:r>
-        <w:t>Giới hạn đăng nhập theo tài khoản chỉ đếm lần sai: tối đa 10 lần trong 15 phút, đăng nhập đúng xóa bộ đếm sai trước đó. Khi cửa sổ khóa đã có hiệu lực thì phải đợi hết hạn. Theo IP có giới hạn 600 lần trong 15 phút để giảm thử hàng loạt mà vẫn chừa mạng chung của lớp. Giới hạn email là năm mã mỗi giờ, mười mã mỗi ngày cùng khoảng cách tối thiểu 60 giây và hạn mã 10 phút.</w:t>
+        <w:t>Tài khoản sinh viên, đội và khách bị giới hạn 10 lần đăng nhập sai trong 15 phút; đăng nhập đúng xóa bộ đếm sai. Tài khoản BTC không bị khóa theo số lần sai, chỉ chịu giới hạn theo IP. Mỗi IP tối đa 1000 lượt đăng nhập trong 15 phút. Người tạo tài khoản BTC đặt mật khẩu ngẫu nhiên dài ít nhất 16 ký tự. Giới hạn email là năm mã mỗi giờ, mười mã mỗi ngày cùng khoảng cách tối thiểu 60 giây và hạn mã 10 phút.</w:t>
       </w:r>
     </w:p>
     <w:p>
@@ -8196,6 +8111,7 @@
         <w:pStyle w:val="BodyText"/>
       </w:pPr>
       <w:r>
+        <w:lastRenderedPageBreak/>
         <w:t>Gói máy chấm chỉ tải qua link có chữ ký hết hạn sau bảy ngày; mã máy chấm gửi riêng và thu hồi được mới là thông tin cấp quyền nhận việc.</w:t>
       </w:r>
     </w:p>
@@ -8204,7 +8120,6 @@
         <w:pStyle w:val="BodyText"/>
       </w:pPr>
       <w:r>
-        <w:lastRenderedPageBreak/>
         <w:t>Mã xác minh được lưu dưới dạng HMAC; khóa, SMTP và khóa GitHub App nằm ngoài repo. Giới hạn quyền App vào repo được chọn giảm phạm vi khi một cấu hình bị lộ. Webhook phải có chữ ký hợp lệ, còn việc nhận nguồn chỉ đi qua các host GitHub được phép. Hub kiểm đường dẫn giải nén, liên kết và giới hạn kích thước để chặn ghi ra ngoài thư mục hoặc bom nén.</w:t>
       </w:r>
     </w:p>
@@ -8229,7 +8144,7 @@
         <w:pStyle w:val="Heading2"/>
       </w:pPr>
       <w:bookmarkStart w:id="41" w:name="b9-sức-tải-và-thời-gian-đã-đo"/>
-      <w:bookmarkStart w:id="42" w:name="_Toc243925933"/>
+      <w:bookmarkStart w:id="42" w:name="_Toc244093787"/>
       <w:bookmarkEnd w:id="39"/>
       <w:r>
         <w:t>9. Sức tải và thời gian đã đo</w:t>
@@ -8825,11 +8740,8 @@
         <w:pStyle w:val="BodyText"/>
       </w:pPr>
       <w:r>
-        <w:t xml:space="preserve">Đợt ladder mở cứ một khoảng giờ do ban tổ chức chọn (mặc định hai giờ), tính từ 0:00 giờ Việt Nam. Hub ghép các đội có bản Đạt thành cặp, mỗi cặp hai ván đổi màu; N đội có N ván. Thời gian một đợt là thời gian chạy hết các ván đó, không phải khoảng cách giữa hai mốc mở đợt. Xong sớm thì máy chấm </w:t>
-      </w:r>
-      <w:r>
         <w:lastRenderedPageBreak/>
-        <w:t>dùng thời gian còn lại cho kiểm bài và luyện tập. Đến mốc sau mà đợt trước chưa xong thì bỏ mốc đó, như mục 4 phần A.</w:t>
+        <w:t>Đợt ladder mở cứ một khoảng giờ do ban tổ chức chọn (mặc định hai giờ), tính từ 0:00 giờ Việt Nam. Hub ghép các đội có bản Đạt thành cặp, mỗi cặp hai ván đổi màu; N đội có N ván. Thời gian một đợt là thời gian chạy hết các ván đó, không phải khoảng cách giữa hai mốc mở đợt. Xong sớm thì máy chấm dùng thời gian còn lại cho kiểm bài và luyện tập. Đến mốc sau mà đợt trước chưa xong thì bỏ mốc đó, như mục 4 phần A.</w:t>
       </w:r>
     </w:p>
     <w:p>
@@ -9416,7 +9328,7 @@
       <w:pPr>
         <w:pStyle w:val="Heading2"/>
       </w:pPr>
-      <w:bookmarkStart w:id="43" w:name="_Toc243925934"/>
+      <w:bookmarkStart w:id="43" w:name="_Toc244093788"/>
       <w:bookmarkEnd w:id="41"/>
       <w:r>
         <w:t>10. Cài đặt và vận hành</w:t>
@@ -9459,6 +9371,7 @@
           <w:b/>
           <w:bCs/>
         </w:rPr>
+        <w:lastRenderedPageBreak/>
         <w:t>Đặt bí mật và đường chuyển tiếp.</w:t>
       </w:r>
       <w:r>
@@ -9474,7 +9387,6 @@
           <w:b/>
           <w:bCs/>
         </w:rPr>
-        <w:lastRenderedPageBreak/>
         <w:t>Tạo tài khoản và nối máy chấm.</w:t>
       </w:r>
       <w:r>
@@ -9530,7 +9442,7 @@
       <w:pPr>
         <w:pStyle w:val="Heading2"/>
       </w:pPr>
-      <w:bookmarkStart w:id="44" w:name="_Toc243925935"/>
+      <w:bookmarkStart w:id="44" w:name="_Toc244093789"/>
       <w:r>
         <w:t>11. Mạng LAN ngày chung kết</w:t>
       </w:r>
@@ -9551,7 +9463,7 @@
           <w:noProof/>
         </w:rPr>
         <w:drawing>
-          <wp:inline distT="0" distB="0" distL="0" distR="0" wp14:anchorId="58A27428" wp14:editId="6B4EFFBD">
+          <wp:inline distT="0" distB="0" distL="0" distR="0" wp14:anchorId="404F5F49" wp14:editId="400741BF">
             <wp:extent cx="5760000" cy="2720000"/>
             <wp:effectExtent l="0" t="0" r="0" b="0"/>
             <wp:docPr id="155" name="Picture 155"/>
@@ -9625,11 +9537,8 @@
     </w:p>
     <w:p>
       <w:r>
-        <w:t xml:space="preserve">Nếu hub là Windows 11 với WSL2, dùng Ubuntu 24.04, đặt networkingMode=mirrored trong phần [wsl2] của .wslconfig, khởi động lại WSL rồi mở cổng đã chọn trên Windows Firewall bằng tài khoản quản trị. Nếu Hyper-V Firewall đang chặn WSL, cũng cho phép cổng đó tới WSL. Chọn IP LAN của máy </w:t>
-      </w:r>
-      <w:r>
         <w:lastRenderedPageBreak/>
-        <w:t>Windows làm origin và thử từ một máy thi khác. Việc đổi cấu hình mạng cần người vận hành thực hiện trước; không coi thử trên cùng PC là đã kiểm nhiều máy.</w:t>
+        <w:t>Nếu hub là Windows 11 với WSL2, dùng Ubuntu 24.04, đặt networkingMode=mirrored trong phần [wsl2] của .wslconfig, khởi động lại WSL rồi mở cổng đã chọn trên Windows Firewall bằng tài khoản quản trị. Nếu Hyper-V Firewall đang chặn WSL, cũng cho phép cổng đó tới WSL. Chọn IP LAN của máy Windows làm origin và thử từ một máy thi khác. Việc đổi cấu hình mạng cần người vận hành thực hiện trước; không coi thử trên cùng PC là đã kiểm nhiều máy.</w:t>
       </w:r>
     </w:p>
     <w:p>
@@ -9652,7 +9561,7 @@
         <w:pStyle w:val="Heading2"/>
         <w:pageBreakBefore/>
       </w:pPr>
-      <w:bookmarkStart w:id="45" w:name="_Toc243925936"/>
+      <w:bookmarkStart w:id="45" w:name="_Toc244093790"/>
       <w:r>
         <w:lastRenderedPageBreak/>
         <w:t>12. Giới hạn và hướng tiếp</w:t>
@@ -9746,7 +9655,7 @@
         <w:pageBreakBefore/>
       </w:pPr>
       <w:bookmarkStart w:id="46" w:name="phần-c-hướng-dẫn-demo-từng-bước"/>
-      <w:bookmarkStart w:id="47" w:name="_Toc243925937"/>
+      <w:bookmarkStart w:id="47" w:name="_Toc244093791"/>
       <w:bookmarkEnd w:id="23"/>
       <w:r>
         <w:lastRenderedPageBreak/>
@@ -9756,7 +9665,7 @@
     </w:p>
     <w:p>
       <w:r>
-        <w:t>Phần này đi theo ba vai trò để người đọc biết bấm ở đâu và kết quả mong đợi. Viền đỏ đánh dấu chỗ cần chú ý; các ô xám che thông tin hoặc mã không cần công khai. Ảnh tạo tài khoản, đội và luyện tập lấy trên hub local cùng phiên bản, email đi qua hộp thư thử; ảnh giải, kết quả và ban tổ chức lấy trên web thật. Các biểu mẫu quản trị chỉ được điền để chụp, không gửi thay đổi vào giải demo. Ảnh ngày chung kết lấy trên hub LAN thử trong WSL, thao tác từ Windows; chỉ dữ liệu thử được tạo và chấm, không gửi kết quả lên web thật.</w:t>
+        <w:t xml:space="preserve">Phần này đi theo ba vai trò để người đọc biết bấm ở đâu và kết quả mong đợi. Viền đỏ đánh dấu chỗ cần chú ý; các ô xám che thông tin hoặc mã không cần công khai. Ảnh tạo tài khoản, đội và luyện tập lấy trên hub local cùng phiên bản, email đi qua hộp thư thử; ảnh giải, kết quả và ban tổ chức lấy trên web thật. Các biểu mẫu quản trị chỉ được điền để chụp, không gửi thay đổi vào giải demo. </w:t>
       </w:r>
     </w:p>
     <w:p>
@@ -9764,7 +9673,7 @@
         <w:pStyle w:val="Heading2"/>
       </w:pPr>
       <w:bookmarkStart w:id="48" w:name="c1-khách-xem-giải"/>
-      <w:bookmarkStart w:id="49" w:name="_Toc243925938"/>
+      <w:bookmarkStart w:id="49" w:name="_Toc244093792"/>
       <w:r>
         <w:t>1. Khách xem giải</w:t>
       </w:r>
@@ -9775,7 +9684,7 @@
         <w:pStyle w:val="Heading3"/>
       </w:pPr>
       <w:bookmarkStart w:id="50" w:name="bước-1-mở-giải-công-khai"/>
-      <w:bookmarkStart w:id="51" w:name="_Toc243925939"/>
+      <w:bookmarkStart w:id="51" w:name="_Toc244093793"/>
       <w:r>
         <w:t>Bước 1. Mở giải công khai</w:t>
       </w:r>
@@ -9806,8 +9715,8 @@
           <w:noProof/>
         </w:rPr>
         <w:drawing>
-          <wp:inline distT="0" distB="0" distL="0" distR="0" wp14:anchorId="50B5F45D" wp14:editId="6F6C739E">
-            <wp:extent cx="3400077" cy="2592000"/>
+          <wp:inline distT="0" distB="0" distL="0" distR="0" wp14:anchorId="71720823" wp14:editId="3EAF190E">
+            <wp:extent cx="5760000" cy="3922758"/>
             <wp:effectExtent l="0" t="0" r="0" b="0"/>
             <wp:docPr id="65" name="Picture" descr="Hình 7 Mở giải công khai"/>
             <wp:cNvGraphicFramePr/>
@@ -9829,7 +9738,7 @@
                   <pic:spPr bwMode="auto">
                     <a:xfrm>
                       <a:off x="0" y="0"/>
-                      <a:ext cx="3400077" cy="2592000"/>
+                      <a:ext cx="5760000" cy="3922758"/>
                     </a:xfrm>
                     <a:prstGeom prst="rect">
                       <a:avLst/>
@@ -9863,7 +9772,7 @@
         <w:pStyle w:val="Heading3"/>
       </w:pPr>
       <w:bookmarkStart w:id="52" w:name="bước-2-xem-bảng-điểm-và-ma-trận"/>
-      <w:bookmarkStart w:id="53" w:name="_Toc243925940"/>
+      <w:bookmarkStart w:id="53" w:name="_Toc244093794"/>
       <w:bookmarkEnd w:id="50"/>
       <w:r>
         <w:t>Bước 2. Xem bảng điểm và ma trận</w:t>
@@ -9914,8 +9823,9 @@
         <w:rPr>
           <w:noProof/>
         </w:rPr>
+        <w:lastRenderedPageBreak/>
         <w:drawing>
-          <wp:inline distT="0" distB="0" distL="0" distR="0" wp14:anchorId="2E9C5A74" wp14:editId="3F46D6E7">
+          <wp:inline distT="0" distB="0" distL="0" distR="0" wp14:anchorId="5E610F1E" wp14:editId="4C8DD45B">
             <wp:extent cx="2664303" cy="2592000"/>
             <wp:effectExtent l="0" t="0" r="0" b="0"/>
             <wp:docPr id="69" name="Picture" descr="Hình 8 Xem bảng điểm và ma trận"/>
@@ -9973,7 +9883,7 @@
         <w:pageBreakBefore/>
       </w:pPr>
       <w:bookmarkStart w:id="54" w:name="bước-3-xem-lại-từng-nước"/>
-      <w:bookmarkStart w:id="55" w:name="_Toc243925941"/>
+      <w:bookmarkStart w:id="55" w:name="_Toc244093795"/>
       <w:bookmarkEnd w:id="52"/>
       <w:r>
         <w:lastRenderedPageBreak/>
@@ -9996,7 +9906,7 @@
           <w:noProof/>
         </w:rPr>
         <w:drawing>
-          <wp:inline distT="0" distB="0" distL="0" distR="0" wp14:anchorId="1BAF2FB1" wp14:editId="2AC54FA0">
+          <wp:inline distT="0" distB="0" distL="0" distR="0" wp14:anchorId="78187475" wp14:editId="5D389EB1">
             <wp:extent cx="4297381" cy="5399998"/>
             <wp:effectExtent l="0" t="0" r="0" b="0"/>
             <wp:docPr id="73" name="Picture" descr="Hình 9 Xem lại từng nước"/>
@@ -10054,9 +9964,9 @@
         <w:pageBreakBefore/>
       </w:pPr>
       <w:bookmarkStart w:id="56" w:name="c2-thí-sinh-đăng-ký-và-nộp-bot"/>
-      <w:bookmarkStart w:id="57" w:name="_Toc243925942"/>
+      <w:bookmarkStart w:id="57" w:name="_Toc244093796"/>
+      <w:bookmarkEnd w:id="48"/>
       <w:bookmarkEnd w:id="54"/>
-      <w:bookmarkEnd w:id="48"/>
       <w:r>
         <w:lastRenderedPageBreak/>
         <w:t>2. Thí sinh đăng ký và nộp bot</w:t>
@@ -10067,7 +9977,7 @@
       <w:pPr>
         <w:pStyle w:val="Heading3"/>
       </w:pPr>
-      <w:bookmarkStart w:id="58" w:name="_Toc243925943"/>
+      <w:bookmarkStart w:id="58" w:name="_Toc244093797"/>
       <w:r>
         <w:t>Bước 4. Đăng ký bằng email trường</w:t>
       </w:r>
@@ -10111,7 +10021,7 @@
           <w:noProof/>
         </w:rPr>
         <w:drawing>
-          <wp:inline distT="0" distB="0" distL="0" distR="0" wp14:anchorId="6E8C7B0C" wp14:editId="1E5977F8">
+          <wp:inline distT="0" distB="0" distL="0" distR="0" wp14:anchorId="602CE59C" wp14:editId="35716E6F">
             <wp:extent cx="3960000" cy="3160235"/>
             <wp:effectExtent l="0" t="0" r="0" b="0"/>
             <wp:docPr id="78" name="Picture" descr="Hình 10 Đăng ký bằng email trường"/>
@@ -10168,7 +10078,7 @@
         <w:pStyle w:val="Heading3"/>
         <w:pageBreakBefore/>
       </w:pPr>
-      <w:bookmarkStart w:id="59" w:name="_Toc243925944"/>
+      <w:bookmarkStart w:id="59" w:name="_Toc244093798"/>
       <w:r>
         <w:lastRenderedPageBreak/>
         <w:t>Bước 5. Mở email lấy mã</w:t>
@@ -10194,7 +10104,7 @@
           <w:noProof/>
         </w:rPr>
         <w:drawing>
-          <wp:inline distT="0" distB="0" distL="0" distR="0" wp14:anchorId="695C1B44" wp14:editId="0D8EE60F">
+          <wp:inline distT="0" distB="0" distL="0" distR="0" wp14:anchorId="5BA66D37" wp14:editId="1AB8CF78">
             <wp:extent cx="5760000" cy="2531025"/>
             <wp:effectExtent l="0" t="0" r="0" b="0"/>
             <wp:docPr id="153" name="Picture" descr="Hình 11 Email chứa mã xác minh"/>
@@ -10251,7 +10161,7 @@
         <w:pStyle w:val="Heading3"/>
         <w:pageBreakBefore/>
       </w:pPr>
-      <w:bookmarkStart w:id="60" w:name="_Toc243925945"/>
+      <w:bookmarkStart w:id="60" w:name="_Toc244093799"/>
       <w:r>
         <w:lastRenderedPageBreak/>
         <w:t>Bước 6. Xác minh email</w:t>
@@ -10286,7 +10196,7 @@
           <w:noProof/>
         </w:rPr>
         <w:drawing>
-          <wp:inline distT="0" distB="0" distL="0" distR="0" wp14:anchorId="3E1C8592" wp14:editId="673D0DC0">
+          <wp:inline distT="0" distB="0" distL="0" distR="0" wp14:anchorId="3EFBE511" wp14:editId="608F9909">
             <wp:extent cx="3960000" cy="4356000"/>
             <wp:effectExtent l="0" t="0" r="0" b="0"/>
             <wp:docPr id="82" name="Picture" descr="Hình 11 Xác minh email"/>
@@ -10343,7 +10253,7 @@
         <w:pStyle w:val="Heading3"/>
         <w:pageBreakBefore/>
       </w:pPr>
-      <w:bookmarkStart w:id="61" w:name="_Toc243925946"/>
+      <w:bookmarkStart w:id="61" w:name="_Toc244093800"/>
       <w:r>
         <w:lastRenderedPageBreak/>
         <w:t>Bước 7. Đặt mật khẩu và đăng nhập</w:t>
@@ -10378,7 +10288,7 @@
           <w:noProof/>
         </w:rPr>
         <w:drawing>
-          <wp:inline distT="0" distB="0" distL="0" distR="0" wp14:anchorId="2C45652E" wp14:editId="7D4754CC">
+          <wp:inline distT="0" distB="0" distL="0" distR="0" wp14:anchorId="7FEEE2A1" wp14:editId="0A793E11">
             <wp:extent cx="3960000" cy="5023764"/>
             <wp:effectExtent l="0" t="0" r="0" b="0"/>
             <wp:docPr id="86" name="Picture" descr="Hình 12 Đặt mật khẩu và đăng nhập"/>
@@ -10434,7 +10344,7 @@
       <w:pPr>
         <w:pStyle w:val="Heading3"/>
       </w:pPr>
-      <w:bookmarkStart w:id="62" w:name="_Toc243925947"/>
+      <w:bookmarkStart w:id="62" w:name="_Toc244093801"/>
       <w:r>
         <w:t>Bước 8. Tạo đội</w:t>
       </w:r>
@@ -10475,7 +10385,7 @@
           <w:noProof/>
         </w:rPr>
         <w:drawing>
-          <wp:inline distT="0" distB="0" distL="0" distR="0" wp14:anchorId="348D1411" wp14:editId="234790B1">
+          <wp:inline distT="0" distB="0" distL="0" distR="0" wp14:anchorId="684EC427" wp14:editId="30C7EBED">
             <wp:extent cx="5012628" cy="2592000"/>
             <wp:effectExtent l="0" t="0" r="0" b="0"/>
             <wp:docPr id="90" name="Picture" descr="Hình 13 Tạo đội"/>
@@ -10532,7 +10442,7 @@
         <w:pStyle w:val="Heading3"/>
         <w:pageBreakBefore/>
       </w:pPr>
-      <w:bookmarkStart w:id="63" w:name="_Toc243925948"/>
+      <w:bookmarkStart w:id="63" w:name="_Toc244093802"/>
       <w:r>
         <w:lastRenderedPageBreak/>
         <w:t>Bước 9. Mời các thành viên</w:t>
@@ -10564,7 +10474,7 @@
           <w:noProof/>
         </w:rPr>
         <w:drawing>
-          <wp:inline distT="0" distB="0" distL="0" distR="0" wp14:anchorId="0B8698D7" wp14:editId="45A22EF8">
+          <wp:inline distT="0" distB="0" distL="0" distR="0" wp14:anchorId="00B2C230" wp14:editId="64D04BCE">
             <wp:extent cx="4187916" cy="2592000"/>
             <wp:effectExtent l="0" t="0" r="0" b="0"/>
             <wp:docPr id="94" name="Picture" descr="Hình 14 Mời các thành viên"/>
@@ -10620,7 +10530,7 @@
       <w:pPr>
         <w:pStyle w:val="Heading3"/>
       </w:pPr>
-      <w:bookmarkStart w:id="64" w:name="_Toc243925949"/>
+      <w:bookmarkStart w:id="64" w:name="_Toc244093803"/>
       <w:r>
         <w:t>Bước 10. Vào đội bằng mã mời</w:t>
       </w:r>
@@ -10651,7 +10561,7 @@
           <w:noProof/>
         </w:rPr>
         <w:drawing>
-          <wp:inline distT="0" distB="0" distL="0" distR="0" wp14:anchorId="79F0C924" wp14:editId="25615D3F">
+          <wp:inline distT="0" distB="0" distL="0" distR="0" wp14:anchorId="25F909A9" wp14:editId="5DF465F2">
             <wp:extent cx="5012628" cy="2592000"/>
             <wp:effectExtent l="0" t="0" r="0" b="0"/>
             <wp:docPr id="98" name="Picture" descr="Hình 15 Vào đội bằng mã mời"/>
@@ -10708,7 +10618,7 @@
         <w:pStyle w:val="Heading3"/>
         <w:pageBreakBefore/>
       </w:pPr>
-      <w:bookmarkStart w:id="65" w:name="_Toc243925950"/>
+      <w:bookmarkStart w:id="65" w:name="_Toc244093804"/>
       <w:r>
         <w:lastRenderedPageBreak/>
         <w:t>Bước 11. Tạo repo từ mẫu</w:t>
@@ -10740,7 +10650,7 @@
           <w:noProof/>
         </w:rPr>
         <w:drawing>
-          <wp:inline distT="0" distB="0" distL="0" distR="0" wp14:anchorId="2342F468" wp14:editId="5AA70E4D">
+          <wp:inline distT="0" distB="0" distL="0" distR="0" wp14:anchorId="03F7CEAF" wp14:editId="54C0B3EA">
             <wp:extent cx="5682461" cy="2592000"/>
             <wp:effectExtent l="0" t="0" r="0" b="0"/>
             <wp:docPr id="102" name="Picture" descr="Hình 16 Tạo repo từ mẫu"/>
@@ -10796,7 +10706,7 @@
       <w:pPr>
         <w:pStyle w:val="Heading3"/>
       </w:pPr>
-      <w:bookmarkStart w:id="66" w:name="_Toc243925951"/>
+      <w:bookmarkStart w:id="66" w:name="_Toc244093805"/>
       <w:r>
         <w:t>Bước 12. Cho App truy cập đúng repo</w:t>
       </w:r>
@@ -10837,7 +10747,7 @@
           <w:noProof/>
         </w:rPr>
         <w:drawing>
-          <wp:inline distT="0" distB="0" distL="0" distR="0" wp14:anchorId="55DC759D" wp14:editId="0598F97B">
+          <wp:inline distT="0" distB="0" distL="0" distR="0" wp14:anchorId="7FC2F584" wp14:editId="7551BD2A">
             <wp:extent cx="5759999" cy="1755999"/>
             <wp:effectExtent l="0" t="0" r="0" b="0"/>
             <wp:docPr id="106" name="Picture" descr="Hình 17 Cho App truy cập đúng repo"/>
@@ -10894,7 +10804,7 @@
         <w:pStyle w:val="Heading3"/>
         <w:pageBreakBefore/>
       </w:pPr>
-      <w:bookmarkStart w:id="67" w:name="_Toc243925952"/>
+      <w:bookmarkStart w:id="67" w:name="_Toc244093806"/>
       <w:r>
         <w:lastRenderedPageBreak/>
         <w:t>Bước 13. Gắn link repo với đội</w:t>
@@ -10936,7 +10846,7 @@
           <w:noProof/>
         </w:rPr>
         <w:drawing>
-          <wp:inline distT="0" distB="0" distL="0" distR="0" wp14:anchorId="58A7974F" wp14:editId="3064914F">
+          <wp:inline distT="0" distB="0" distL="0" distR="0" wp14:anchorId="5BD2E9F8" wp14:editId="4566B6B8">
             <wp:extent cx="5284928" cy="2592000"/>
             <wp:effectExtent l="0" t="0" r="0" b="0"/>
             <wp:docPr id="110" name="Picture" descr="Hình 18 Gắn link repo với đội"/>
@@ -10992,7 +10902,7 @@
       <w:pPr>
         <w:pStyle w:val="Heading3"/>
       </w:pPr>
-      <w:bookmarkStart w:id="68" w:name="_Toc243925953"/>
+      <w:bookmarkStart w:id="68" w:name="_Toc244093807"/>
       <w:r>
         <w:t>Bước 14. Theo dõi kiểm tra 72 mẫu</w:t>
       </w:r>
@@ -11073,7 +10983,7 @@
           <w:noProof/>
         </w:rPr>
         <w:drawing>
-          <wp:inline distT="0" distB="0" distL="0" distR="0" wp14:anchorId="1D2754D9" wp14:editId="08EED7CF">
+          <wp:inline distT="0" distB="0" distL="0" distR="0" wp14:anchorId="107C92B4" wp14:editId="1614BF69">
             <wp:extent cx="3093102" cy="2592000"/>
             <wp:effectExtent l="0" t="0" r="0" b="0"/>
             <wp:docPr id="114" name="Picture" descr="Hình 19 Theo dõi kiểm tra 72 mẫu"/>
@@ -11130,12 +11040,85 @@
         <w:pStyle w:val="Heading3"/>
         <w:pageBreakBefore/>
       </w:pPr>
-      <w:bookmarkStart w:id="69" w:name="_Toc243925954"/>
+      <w:bookmarkStart w:id="69" w:name="_Toc244093808"/>
       <w:r>
         <w:lastRenderedPageBreak/>
-        <w:t>Bước 15. Xem giải của đội</w:t>
+        <w:t>Bước 15. Thử nhanh không cần GitHub</w:t>
       </w:r>
       <w:bookmarkEnd w:id="69"/>
+    </w:p>
+    <w:p>
+      <w:pPr>
+        <w:keepNext/>
+      </w:pPr>
+      <w:r>
+        <w:t>Mở Nộp bot, xuống khung Thử nhanh không cần GitHub. Chọn ngôn ngữ rồi dán mã hoặc chọn file; có thể bấm Điền bot mẫu C++. Bấm Nạp và kiểm tra, mở log của bản thu-xxxxxxx để xem 72 mẫu. Khi Đạt, sang Luyện tập để đấu bot mẫu hoặc phiên bản khác của đội. Bản thử nhanh không được dùng để đăng ký giải.</w:t>
+      </w:r>
+    </w:p>
+    <w:p>
+      <w:pPr>
+        <w:keepNext/>
+      </w:pPr>
+      <w:r>
+        <w:rPr>
+          <w:noProof/>
+        </w:rPr>
+        <w:drawing>
+          <wp:inline distT="0" distB="0" distL="0" distR="0" wp14:anchorId="34FFE594" wp14:editId="58172EB7">
+            <wp:extent cx="5760000" cy="4876138"/>
+            <wp:effectExtent l="0" t="0" r="0" b="0"/>
+            <wp:docPr id="162" name="Picture 162"/>
+            <wp:cNvGraphicFramePr>
+              <a:graphicFrameLocks xmlns:a="http://schemas.openxmlformats.org/drawingml/2006/main" noChangeAspect="1"/>
+            </wp:cNvGraphicFramePr>
+            <a:graphic xmlns:a="http://schemas.openxmlformats.org/drawingml/2006/main">
+              <a:graphicData uri="http://schemas.openxmlformats.org/drawingml/2006/picture">
+                <pic:pic xmlns:pic="http://schemas.openxmlformats.org/drawingml/2006/picture">
+                  <pic:nvPicPr>
+                    <pic:cNvPr id="0" name="quick-trial.png"/>
+                    <pic:cNvPicPr/>
+                  </pic:nvPicPr>
+                  <pic:blipFill>
+                    <a:blip r:embed="rId34"/>
+                    <a:stretch>
+                      <a:fillRect/>
+                    </a:stretch>
+                  </pic:blipFill>
+                  <pic:spPr>
+                    <a:xfrm>
+                      <a:off x="0" y="0"/>
+                      <a:ext cx="5760000" cy="4876138"/>
+                    </a:xfrm>
+                    <a:prstGeom prst="rect">
+                      <a:avLst/>
+                    </a:prstGeom>
+                  </pic:spPr>
+                </pic:pic>
+              </a:graphicData>
+            </a:graphic>
+          </wp:inline>
+        </w:drawing>
+      </w:r>
+    </w:p>
+    <w:p>
+      <w:pPr>
+        <w:pStyle w:val="Caption"/>
+      </w:pPr>
+      <w:r>
+        <w:t>Hình 22. Thử nhanh bằng mã nguồn hoặc một file</w:t>
+      </w:r>
+    </w:p>
+    <w:p>
+      <w:pPr>
+        <w:pStyle w:val="Heading3"/>
+        <w:pageBreakBefore/>
+      </w:pPr>
+      <w:bookmarkStart w:id="70" w:name="_Toc244093809"/>
+      <w:r>
+        <w:lastRenderedPageBreak/>
+        <w:t>Bước 16. Xem giải của đội</w:t>
+      </w:r>
+      <w:bookmarkEnd w:id="70"/>
     </w:p>
     <w:p>
       <w:r>
@@ -11192,7 +11175,7 @@
           <w:noProof/>
         </w:rPr>
         <w:drawing>
-          <wp:inline distT="0" distB="0" distL="0" distR="0" wp14:anchorId="4DD9E4E8" wp14:editId="3B2F87C6">
+          <wp:inline distT="0" distB="0" distL="0" distR="0" wp14:anchorId="0C67F50E" wp14:editId="0B30D402">
             <wp:extent cx="5759999" cy="1024999"/>
             <wp:effectExtent l="0" t="0" r="0" b="0"/>
             <wp:docPr id="118" name="Picture" descr="Hình 20 Xem giải của đội"/>
@@ -11207,7 +11190,7 @@
                     </pic:cNvPicPr>
                   </pic:nvPicPr>
                   <pic:blipFill>
-                    <a:blip r:embed="rId34"/>
+                    <a:blip r:embed="rId35"/>
                     <a:stretch>
                       <a:fillRect/>
                     </a:stretch>
@@ -11241,18 +11224,18 @@
         <w:jc w:val="center"/>
       </w:pPr>
       <w:r>
-        <w:t>Hình 22. Xem giải của đội</w:t>
+        <w:t>Hình 23. Xem giải của đội</w:t>
       </w:r>
     </w:p>
     <w:p>
       <w:pPr>
         <w:pStyle w:val="Heading3"/>
       </w:pPr>
-      <w:bookmarkStart w:id="70" w:name="_Toc243925955"/>
-      <w:r>
-        <w:t>Bước 16. Luyện tập với bot mẫu</w:t>
-      </w:r>
-      <w:bookmarkEnd w:id="70"/>
+      <w:bookmarkStart w:id="71" w:name="_Toc244093810"/>
+      <w:r>
+        <w:t>Bước 17. Luyện tập với bot mẫu</w:t>
+      </w:r>
+      <w:bookmarkEnd w:id="71"/>
     </w:p>
     <w:p>
       <w:r>
@@ -11299,7 +11282,7 @@
           <w:noProof/>
         </w:rPr>
         <w:drawing>
-          <wp:inline distT="0" distB="0" distL="0" distR="0" wp14:anchorId="29789B8F" wp14:editId="12F4949E">
+          <wp:inline distT="0" distB="0" distL="0" distR="0" wp14:anchorId="6B4213DC" wp14:editId="6100D588">
             <wp:extent cx="5759999" cy="3774999"/>
             <wp:effectExtent l="0" t="0" r="0" b="0"/>
             <wp:docPr id="122" name="Picture" descr="Hình 21 Luyện tập với bot mẫu"/>
@@ -11314,7 +11297,7 @@
                     </pic:cNvPicPr>
                   </pic:nvPicPr>
                   <pic:blipFill>
-                    <a:blip r:embed="rId35"/>
+                    <a:blip r:embed="rId36"/>
                     <a:stretch>
                       <a:fillRect/>
                     </a:stretch>
@@ -11348,7 +11331,7 @@
         <w:jc w:val="center"/>
       </w:pPr>
       <w:r>
-        <w:t>Hình 23. Luyện tập với bot mẫu</w:t>
+        <w:t>Hình 24. Luyện tập với bot mẫu</w:t>
       </w:r>
     </w:p>
     <w:p>
@@ -11356,24 +11339,24 @@
         <w:pStyle w:val="Heading2"/>
         <w:pageBreakBefore/>
       </w:pPr>
-      <w:bookmarkStart w:id="71" w:name="c3-ban-tổ-chức-điều-hành"/>
-      <w:bookmarkStart w:id="72" w:name="_Toc243925956"/>
+      <w:bookmarkStart w:id="72" w:name="c3-ban-tổ-chức-điều-hành"/>
+      <w:bookmarkStart w:id="73" w:name="_Toc244093811"/>
       <w:bookmarkEnd w:id="56"/>
       <w:r>
         <w:lastRenderedPageBreak/>
         <w:t>3. Ban tổ chức điều hành</w:t>
       </w:r>
-      <w:bookmarkEnd w:id="72"/>
+      <w:bookmarkEnd w:id="73"/>
     </w:p>
     <w:p>
       <w:pPr>
         <w:pStyle w:val="Heading3"/>
       </w:pPr>
-      <w:bookmarkStart w:id="73" w:name="_Toc243925957"/>
-      <w:r>
-        <w:t>Bước 17. Xem tổng quan ban tổ chức</w:t>
-      </w:r>
-      <w:bookmarkEnd w:id="73"/>
+      <w:bookmarkStart w:id="74" w:name="_Toc244093812"/>
+      <w:r>
+        <w:t>Bước 18. Xem tổng quan ban tổ chức</w:t>
+      </w:r>
+      <w:bookmarkEnd w:id="74"/>
     </w:p>
     <w:p>
       <w:r>
@@ -11390,7 +11373,7 @@
           <w:noProof/>
         </w:rPr>
         <w:drawing>
-          <wp:inline distT="0" distB="0" distL="0" distR="0" wp14:anchorId="4BF638CE" wp14:editId="3FEE14A6">
+          <wp:inline distT="0" distB="0" distL="0" distR="0" wp14:anchorId="780CB0EC" wp14:editId="19EC4ADE">
             <wp:extent cx="5759999" cy="3505263"/>
             <wp:effectExtent l="0" t="0" r="0" b="0"/>
             <wp:docPr id="127" name="Picture" descr="Hình 22 Xem tổng quan ban tổ chức"/>
@@ -11405,7 +11388,7 @@
                     </pic:cNvPicPr>
                   </pic:nvPicPr>
                   <pic:blipFill>
-                    <a:blip r:embed="rId36"/>
+                    <a:blip r:embed="rId37"/>
                     <a:stretch>
                       <a:fillRect/>
                     </a:stretch>
@@ -11439,7 +11422,7 @@
         <w:jc w:val="center"/>
       </w:pPr>
       <w:r>
-        <w:t>Hình 24. Xem tổng quan ban tổ chức</w:t>
+        <w:t>Hình 25. Xem tổng quan ban tổ chức</w:t>
       </w:r>
     </w:p>
     <w:p>
@@ -11447,12 +11430,12 @@
         <w:pStyle w:val="Heading3"/>
         <w:pageBreakBefore/>
       </w:pPr>
-      <w:bookmarkStart w:id="74" w:name="_Toc243925958"/>
+      <w:bookmarkStart w:id="75" w:name="_Toc244093813"/>
       <w:r>
         <w:lastRenderedPageBreak/>
-        <w:t>Bước 18. Chọn giải ở Tổng quan</w:t>
-      </w:r>
-      <w:bookmarkEnd w:id="74"/>
+        <w:t>Bước 19. Chọn giải ở Tổng quan</w:t>
+      </w:r>
+      <w:bookmarkEnd w:id="75"/>
     </w:p>
     <w:p>
       <w:r>
@@ -11509,7 +11492,7 @@
           <w:noProof/>
         </w:rPr>
         <w:drawing>
-          <wp:inline distT="0" distB="0" distL="0" distR="0" wp14:anchorId="2B9AE7AB" wp14:editId="70B649E9">
+          <wp:inline distT="0" distB="0" distL="0" distR="0" wp14:anchorId="1900E750" wp14:editId="52B6B889">
             <wp:extent cx="5759999" cy="4012104"/>
             <wp:effectExtent l="0" t="0" r="0" b="0"/>
             <wp:docPr id="131" name="Picture" descr="Hình 23 Chọn giải ở Tổng quan"/>
@@ -11524,7 +11507,7 @@
                     </pic:cNvPicPr>
                   </pic:nvPicPr>
                   <pic:blipFill>
-                    <a:blip r:embed="rId37"/>
+                    <a:blip r:embed="rId38"/>
                     <a:stretch>
                       <a:fillRect/>
                     </a:stretch>
@@ -11558,7 +11541,7 @@
         <w:jc w:val="center"/>
       </w:pPr>
       <w:r>
-        <w:t>Hình 25. Chọn giải ở Tổng quan</w:t>
+        <w:t>Hình 26. Chọn giải ở Tổng quan</w:t>
       </w:r>
     </w:p>
     <w:p>
@@ -11566,12 +11549,12 @@
         <w:pStyle w:val="Heading3"/>
         <w:pageBreakBefore/>
       </w:pPr>
-      <w:bookmarkStart w:id="75" w:name="_Toc243925959"/>
+      <w:bookmarkStart w:id="76" w:name="_Toc244093814"/>
       <w:r>
         <w:lastRenderedPageBreak/>
-        <w:t>Bước 19. Chuẩn bị giải mới</w:t>
-      </w:r>
-      <w:bookmarkEnd w:id="75"/>
+        <w:t>Bước 20. Chuẩn bị giải mới</w:t>
+      </w:r>
+      <w:bookmarkEnd w:id="76"/>
     </w:p>
     <w:p>
       <w:r>
@@ -11598,7 +11581,7 @@
           <w:noProof/>
         </w:rPr>
         <w:drawing>
-          <wp:inline distT="0" distB="0" distL="0" distR="0" wp14:anchorId="1C3E51BA" wp14:editId="1DD21D92">
+          <wp:inline distT="0" distB="0" distL="0" distR="0" wp14:anchorId="46D23CC1" wp14:editId="0A71A1EA">
             <wp:extent cx="4586765" cy="2592000"/>
             <wp:effectExtent l="0" t="0" r="0" b="0"/>
             <wp:docPr id="135" name="Picture" descr="Hình 24 Chuẩn bị giải mới"/>
@@ -11647,18 +11630,18 @@
         <w:jc w:val="center"/>
       </w:pPr>
       <w:r>
-        <w:t>Hình 26. Chuẩn bị giải mới</w:t>
+        <w:t>Hình 27. Chuẩn bị giải mới</w:t>
       </w:r>
     </w:p>
     <w:p>
       <w:pPr>
         <w:pStyle w:val="Heading3"/>
       </w:pPr>
-      <w:bookmarkStart w:id="76" w:name="_Toc243925960"/>
-      <w:r>
-        <w:t>Bước 20. Cài máy chấm Windows hoặc Linux</w:t>
-      </w:r>
-      <w:bookmarkEnd w:id="76"/>
+      <w:bookmarkStart w:id="77" w:name="_Toc244093815"/>
+      <w:r>
+        <w:t>Bước 21. Cài máy chấm Windows hoặc Linux</w:t>
+      </w:r>
+      <w:bookmarkEnd w:id="77"/>
     </w:p>
     <w:p>
       <w:r>
@@ -11705,7 +11688,7 @@
           <w:noProof/>
         </w:rPr>
         <w:drawing>
-          <wp:inline distT="0" distB="0" distL="0" distR="0" wp14:anchorId="20C52B14" wp14:editId="47126B38">
+          <wp:inline distT="0" distB="0" distL="0" distR="0" wp14:anchorId="445D53C4" wp14:editId="4B63642A">
             <wp:extent cx="5759999" cy="1196950"/>
             <wp:effectExtent l="0" t="0" r="0" b="0"/>
             <wp:docPr id="139" name="Picture" descr="Hình 25 Cài máy chấm Windows hoặc Linux"/>
@@ -11720,7 +11703,7 @@
                     </pic:cNvPicPr>
                   </pic:nvPicPr>
                   <pic:blipFill>
-                    <a:blip r:embed="rId38"/>
+                    <a:blip r:embed="rId39"/>
                     <a:stretch>
                       <a:fillRect/>
                     </a:stretch>
@@ -11754,7 +11737,7 @@
         <w:jc w:val="center"/>
       </w:pPr>
       <w:r>
-        <w:t>Hình 27. Cài máy chấm Windows hoặc Linux</w:t>
+        <w:t>Hình 28. Cài máy chấm Windows hoặc Linux</w:t>
       </w:r>
     </w:p>
     <w:p>
@@ -11762,12 +11745,12 @@
         <w:pStyle w:val="Heading3"/>
         <w:pageBreakBefore/>
       </w:pPr>
-      <w:bookmarkStart w:id="77" w:name="_Toc243925961"/>
+      <w:bookmarkStart w:id="78" w:name="_Toc244093816"/>
       <w:r>
         <w:lastRenderedPageBreak/>
-        <w:t>Bước 21. Kiểm tình trạng chấm và hàng đợi</w:t>
-      </w:r>
-      <w:bookmarkEnd w:id="77"/>
+        <w:t>Bước 22. Kiểm tình trạng chấm và hàng đợi</w:t>
+      </w:r>
+      <w:bookmarkEnd w:id="78"/>
     </w:p>
     <w:p>
       <w:r>
@@ -11794,7 +11777,7 @@
           <w:noProof/>
         </w:rPr>
         <w:drawing>
-          <wp:inline distT="0" distB="0" distL="0" distR="0" wp14:anchorId="28A80BBA" wp14:editId="51D6A3E1">
+          <wp:inline distT="0" distB="0" distL="0" distR="0" wp14:anchorId="3F06708E" wp14:editId="7518D47E">
             <wp:extent cx="4213732" cy="2592000"/>
             <wp:effectExtent l="0" t="0" r="0" b="0"/>
             <wp:docPr id="143" name="Picture" descr="Hình 26 Kiểm tình trạng chấm và hàng đợi"/>
@@ -11843,18 +11826,18 @@
         <w:jc w:val="center"/>
       </w:pPr>
       <w:r>
-        <w:t>Hình 28. Kiểm tình trạng chấm và hàng đợi</w:t>
+        <w:t>Hình 29. Kiểm tình trạng chấm và hàng đợi</w:t>
       </w:r>
     </w:p>
     <w:p>
       <w:pPr>
         <w:pStyle w:val="Heading3"/>
       </w:pPr>
-      <w:bookmarkStart w:id="78" w:name="_Toc243925962"/>
-      <w:r>
-        <w:t>Bước 22. Soạn thông báo</w:t>
-      </w:r>
-      <w:bookmarkEnd w:id="78"/>
+      <w:bookmarkStart w:id="79" w:name="_Toc244093817"/>
+      <w:r>
+        <w:t>Bước 23. Soạn thông báo</w:t>
+      </w:r>
+      <w:bookmarkEnd w:id="79"/>
     </w:p>
     <w:p>
       <w:r>
@@ -11891,7 +11874,7 @@
           <w:noProof/>
         </w:rPr>
         <w:drawing>
-          <wp:inline distT="0" distB="0" distL="0" distR="0" wp14:anchorId="3259C941" wp14:editId="398A8646">
+          <wp:inline distT="0" distB="0" distL="0" distR="0" wp14:anchorId="549CEEF7" wp14:editId="23886A0D">
             <wp:extent cx="5759999" cy="2369999"/>
             <wp:effectExtent l="0" t="0" r="0" b="0"/>
             <wp:docPr id="147" name="Picture" descr="Hình 27 Soạn thông báo"/>
@@ -11906,7 +11889,7 @@
                     </pic:cNvPicPr>
                   </pic:nvPicPr>
                   <pic:blipFill>
-                    <a:blip r:embed="rId39"/>
+                    <a:blip r:embed="rId40"/>
                     <a:stretch>
                       <a:fillRect/>
                     </a:stretch>
@@ -11940,7 +11923,7 @@
         <w:jc w:val="center"/>
       </w:pPr>
       <w:r>
-        <w:t>Hình 29. Soạn thông báo</w:t>
+        <w:t>Hình 30. Soạn thông báo</w:t>
       </w:r>
     </w:p>
     <w:p>
@@ -11948,12 +11931,12 @@
         <w:pStyle w:val="Heading3"/>
         <w:pageBreakBefore/>
       </w:pPr>
-      <w:bookmarkStart w:id="79" w:name="_Toc243925963"/>
+      <w:bookmarkStart w:id="80" w:name="_Toc244093818"/>
       <w:r>
         <w:lastRenderedPageBreak/>
-        <w:t>Bước 23. Xuất bảng điểm CSV</w:t>
-      </w:r>
-      <w:bookmarkEnd w:id="79"/>
+        <w:t>Bước 24. Xuất bảng điểm CSV</w:t>
+      </w:r>
+      <w:bookmarkEnd w:id="80"/>
     </w:p>
     <w:p>
       <w:r>
@@ -11980,7 +11963,7 @@
           <w:noProof/>
         </w:rPr>
         <w:drawing>
-          <wp:inline distT="0" distB="0" distL="0" distR="0" wp14:anchorId="124E0619" wp14:editId="564C9851">
+          <wp:inline distT="0" distB="0" distL="0" distR="0" wp14:anchorId="435932EA" wp14:editId="50030BB4">
             <wp:extent cx="4559999" cy="5400000"/>
             <wp:effectExtent l="0" t="0" r="0" b="0"/>
             <wp:docPr id="151" name="Picture" descr="Hình 28 Xuất bảng điểm CSV"/>
@@ -11995,7 +11978,7 @@
                     </pic:cNvPicPr>
                   </pic:nvPicPr>
                   <pic:blipFill>
-                    <a:blip r:embed="rId40"/>
+                    <a:blip r:embed="rId41"/>
                     <a:stretch>
                       <a:fillRect/>
                     </a:stretch>
@@ -12029,7 +12012,7 @@
         <w:jc w:val="center"/>
       </w:pPr>
       <w:r>
-        <w:t>Hình 30. Xuất bảng điểm CSV</w:t>
+        <w:t>Hình 31. Xuất bảng điểm CSV</w:t>
       </w:r>
     </w:p>
     <w:p>
@@ -12037,24 +12020,24 @@
         <w:pStyle w:val="Heading2"/>
         <w:pageBreakBefore/>
       </w:pPr>
-      <w:bookmarkStart w:id="80" w:name="_Toc243925964"/>
-      <w:bookmarkEnd w:id="71"/>
+      <w:bookmarkStart w:id="81" w:name="_Toc244093819"/>
       <w:bookmarkEnd w:id="46"/>
+      <w:bookmarkEnd w:id="72"/>
       <w:r>
         <w:lastRenderedPageBreak/>
         <w:t>4. Ngày chung kết</w:t>
       </w:r>
-      <w:bookmarkEnd w:id="80"/>
+      <w:bookmarkEnd w:id="81"/>
     </w:p>
     <w:p>
       <w:pPr>
         <w:pStyle w:val="Heading3"/>
       </w:pPr>
-      <w:bookmarkStart w:id="81" w:name="_Toc243925965"/>
-      <w:r>
-        <w:t>Bước 24. Tạo tài khoản và phát giấy cho đội</w:t>
-      </w:r>
-      <w:bookmarkEnd w:id="81"/>
+      <w:bookmarkStart w:id="82" w:name="_Toc244093820"/>
+      <w:r>
+        <w:t>Bước 25. Tạo tài khoản và phát giấy cho đội</w:t>
+      </w:r>
+      <w:bookmarkEnd w:id="82"/>
     </w:p>
     <w:p>
       <w:pPr>
@@ -12074,7 +12057,7 @@
           <w:noProof/>
         </w:rPr>
         <w:drawing>
-          <wp:inline distT="0" distB="0" distL="0" distR="0" wp14:anchorId="537C2DD9" wp14:editId="5DF7B02D">
+          <wp:inline distT="0" distB="0" distL="0" distR="0" wp14:anchorId="1FE4EA49" wp14:editId="2BFCA998">
             <wp:extent cx="3600000" cy="5992258"/>
             <wp:effectExtent l="0" t="0" r="0" b="0"/>
             <wp:docPr id="156" name="Picture 156"/>
@@ -12089,7 +12072,7 @@
                     <pic:cNvPicPr/>
                   </pic:nvPicPr>
                   <pic:blipFill>
-                    <a:blip r:embed="rId41"/>
+                    <a:blip r:embed="rId42"/>
                     <a:stretch>
                       <a:fillRect/>
                     </a:stretch>
@@ -12116,7 +12099,7 @@
         <w:jc w:val="center"/>
       </w:pPr>
       <w:r>
-        <w:t>Hình 31. Phần đầu biểu mẫu tạo đội trên hub LAN</w:t>
+        <w:t>Hình 32. Phần đầu biểu mẫu tạo đội trên hub LAN</w:t>
       </w:r>
     </w:p>
     <w:p>
@@ -12124,12 +12107,12 @@
         <w:pStyle w:val="Heading3"/>
         <w:pageBreakBefore/>
       </w:pPr>
-      <w:bookmarkStart w:id="82" w:name="_Toc243925966"/>
+      <w:bookmarkStart w:id="83" w:name="_Toc244093821"/>
       <w:r>
         <w:lastRenderedPageBreak/>
-        <w:t>Bước 25. Đội tự nạp ZIP và kiểm tra</w:t>
-      </w:r>
-      <w:bookmarkEnd w:id="82"/>
+        <w:t>Bước 26. Đội tự nạp ZIP và kiểm tra</w:t>
+      </w:r>
+      <w:bookmarkEnd w:id="83"/>
     </w:p>
     <w:p>
       <w:pPr>
@@ -12149,7 +12132,7 @@
           <w:noProof/>
         </w:rPr>
         <w:drawing>
-          <wp:inline distT="0" distB="0" distL="0" distR="0" wp14:anchorId="022EA018" wp14:editId="51C061DB">
+          <wp:inline distT="0" distB="0" distL="0" distR="0" wp14:anchorId="1702F31B" wp14:editId="6734FFD7">
             <wp:extent cx="5760000" cy="4826842"/>
             <wp:effectExtent l="0" t="0" r="0" b="0"/>
             <wp:docPr id="157" name="Picture 157"/>
@@ -12164,7 +12147,7 @@
                     <pic:cNvPicPr/>
                   </pic:nvPicPr>
                   <pic:blipFill>
-                    <a:blip r:embed="rId42"/>
+                    <a:blip r:embed="rId43"/>
                     <a:stretch>
                       <a:fillRect/>
                     </a:stretch>
@@ -12191,7 +12174,7 @@
         <w:jc w:val="center"/>
       </w:pPr>
       <w:r>
-        <w:t>Hình 32. Nạp ZIP trên hub LAN</w:t>
+        <w:t>Hình 33. Nạp ZIP trên hub LAN</w:t>
       </w:r>
     </w:p>
     <w:p>
@@ -12199,12 +12182,12 @@
         <w:pStyle w:val="Heading3"/>
         <w:pageBreakBefore/>
       </w:pPr>
-      <w:bookmarkStart w:id="83" w:name="_Toc243925967"/>
+      <w:bookmarkStart w:id="84" w:name="_Toc244093822"/>
       <w:r>
         <w:lastRenderedPageBreak/>
-        <w:t>Bước 26. Tạo bảng và thêm các đội</w:t>
-      </w:r>
-      <w:bookmarkEnd w:id="83"/>
+        <w:t>Bước 27. Tạo bảng và thêm các đội</w:t>
+      </w:r>
+      <w:bookmarkEnd w:id="84"/>
     </w:p>
     <w:p>
       <w:pPr>
@@ -12224,7 +12207,7 @@
           <w:noProof/>
         </w:rPr>
         <w:drawing>
-          <wp:inline distT="0" distB="0" distL="0" distR="0" wp14:anchorId="5C76DDAF" wp14:editId="57236C39">
+          <wp:inline distT="0" distB="0" distL="0" distR="0" wp14:anchorId="7747BB4F" wp14:editId="15E9CE99">
             <wp:extent cx="5040000" cy="5595395"/>
             <wp:effectExtent l="0" t="0" r="0" b="0"/>
             <wp:docPr id="158" name="Picture 158"/>
@@ -12239,7 +12222,7 @@
                     <pic:cNvPicPr/>
                   </pic:nvPicPr>
                   <pic:blipFill>
-                    <a:blip r:embed="rId43"/>
+                    <a:blip r:embed="rId44"/>
                     <a:stretch>
                       <a:fillRect/>
                     </a:stretch>
@@ -12266,7 +12249,7 @@
         <w:jc w:val="center"/>
       </w:pPr>
       <w:r>
-        <w:t>Hình 33. Giải bảng và nút thêm đội của ban tổ chức</w:t>
+        <w:t>Hình 34. Giải bảng và nút thêm đội của ban tổ chức</w:t>
       </w:r>
     </w:p>
     <w:p>
@@ -12274,12 +12257,12 @@
         <w:pStyle w:val="Heading3"/>
         <w:pageBreakBefore/>
       </w:pPr>
-      <w:bookmarkStart w:id="84" w:name="_Toc243925968"/>
+      <w:bookmarkStart w:id="85" w:name="_Toc244093823"/>
       <w:r>
         <w:lastRenderedPageBreak/>
-        <w:t>Bước 27. Chiếu bảng điểm và replay</w:t>
-      </w:r>
-      <w:bookmarkEnd w:id="84"/>
+        <w:t>Bước 28. Chiếu bảng điểm và replay</w:t>
+      </w:r>
+      <w:bookmarkEnd w:id="85"/>
     </w:p>
     <w:p>
       <w:pPr>
@@ -12299,7 +12282,7 @@
           <w:noProof/>
         </w:rPr>
         <w:drawing>
-          <wp:inline distT="0" distB="0" distL="0" distR="0" wp14:anchorId="04FBA4E5" wp14:editId="44F1A508">
+          <wp:inline distT="0" distB="0" distL="0" distR="0" wp14:anchorId="45A771AA" wp14:editId="43C0556F">
             <wp:extent cx="5760000" cy="5532632"/>
             <wp:effectExtent l="0" t="0" r="0" b="0"/>
             <wp:docPr id="159" name="Picture 159"/>
@@ -12314,7 +12297,7 @@
                     <pic:cNvPicPr/>
                   </pic:nvPicPr>
                   <pic:blipFill>
-                    <a:blip r:embed="rId44"/>
+                    <a:blip r:embed="rId45"/>
                     <a:stretch>
                       <a:fillRect/>
                     </a:stretch>
@@ -12341,7 +12324,7 @@
         <w:jc w:val="center"/>
       </w:pPr>
       <w:r>
-        <w:t>Hình 34. Bảng điểm vòng bảng đã hoàn tất</w:t>
+        <w:t>Hình 35. Bảng điểm vòng bảng đã hoàn tất</w:t>
       </w:r>
     </w:p>
     <w:p>
@@ -12349,12 +12332,12 @@
         <w:pStyle w:val="Heading3"/>
         <w:pageBreakBefore/>
       </w:pPr>
-      <w:bookmarkStart w:id="85" w:name="_Toc243925969"/>
+      <w:bookmarkStart w:id="86" w:name="_Toc244093824"/>
       <w:r>
         <w:lastRenderedPageBreak/>
-        <w:t>Bước 28. Tạo cặp loại trực tiếp</w:t>
-      </w:r>
-      <w:bookmarkEnd w:id="85"/>
+        <w:t>Bước 29. Tạo cặp loại trực tiếp</w:t>
+      </w:r>
+      <w:bookmarkEnd w:id="86"/>
     </w:p>
     <w:p>
       <w:pPr>
@@ -12374,7 +12357,7 @@
           <w:noProof/>
         </w:rPr>
         <w:drawing>
-          <wp:inline distT="0" distB="0" distL="0" distR="0" wp14:anchorId="0554F475" wp14:editId="2732EA19">
+          <wp:inline distT="0" distB="0" distL="0" distR="0" wp14:anchorId="449A5286" wp14:editId="6F5CB84B">
             <wp:extent cx="5040000" cy="5197500"/>
             <wp:effectExtent l="0" t="0" r="0" b="0"/>
             <wp:docPr id="160" name="Picture 160"/>
@@ -12389,7 +12372,7 @@
                     <pic:cNvPicPr/>
                   </pic:nvPicPr>
                   <pic:blipFill>
-                    <a:blip r:embed="rId45"/>
+                    <a:blip r:embed="rId46"/>
                     <a:stretch>
                       <a:fillRect/>
                     </a:stretch>
@@ -12416,7 +12399,7 @@
         <w:jc w:val="center"/>
       </w:pPr>
       <w:r>
-        <w:t>Hình 35. Cặp loại trực tiếp gồm hai đội</w:t>
+        <w:t>Hình 36. Cặp loại trực tiếp gồm hai đội</w:t>
       </w:r>
     </w:p>
     <w:p>
@@ -12424,12 +12407,12 @@
         <w:pStyle w:val="Heading3"/>
         <w:pageBreakBefore/>
       </w:pPr>
-      <w:bookmarkStart w:id="86" w:name="_Toc243925970"/>
+      <w:bookmarkStart w:id="87" w:name="_Toc244093825"/>
       <w:r>
         <w:lastRenderedPageBreak/>
-        <w:t>Bước 29. Xuất CSV và đăng kết quả</w:t>
-      </w:r>
-      <w:bookmarkEnd w:id="86"/>
+        <w:t>Bước 30. Xuất CSV và đăng kết quả</w:t>
+      </w:r>
+      <w:bookmarkEnd w:id="87"/>
     </w:p>
     <w:p>
       <w:pPr>
@@ -12449,7 +12432,7 @@
           <w:noProof/>
         </w:rPr>
         <w:drawing>
-          <wp:inline distT="0" distB="0" distL="0" distR="0" wp14:anchorId="674B8065" wp14:editId="56898F30">
+          <wp:inline distT="0" distB="0" distL="0" distR="0" wp14:anchorId="5316F860" wp14:editId="334360B4">
             <wp:extent cx="5760000" cy="4135263"/>
             <wp:effectExtent l="0" t="0" r="0" b="0"/>
             <wp:docPr id="161" name="Picture 161"/>
@@ -12464,7 +12447,7 @@
                     <pic:cNvPicPr/>
                   </pic:nvPicPr>
                   <pic:blipFill>
-                    <a:blip r:embed="rId46"/>
+                    <a:blip r:embed="rId47"/>
                     <a:stretch>
                       <a:fillRect/>
                     </a:stretch>
@@ -12491,13 +12474,13 @@
         <w:jc w:val="center"/>
       </w:pPr>
       <w:r>
-        <w:t>Hình 36. Soạn thông báo kết quả sau khi xuất CSV</w:t>
+        <w:t>Hình 37. Soạn thông báo kết quả sau khi xuất CSV</w:t>
       </w:r>
     </w:p>
     <w:sectPr>
-      <w:headerReference w:type="default" r:id="rId47"/>
-      <w:footerReference w:type="default" r:id="rId48"/>
-      <w:footerReference w:type="first" r:id="rId49"/>
+      <w:headerReference w:type="default" r:id="rId48"/>
+      <w:footerReference w:type="default" r:id="rId49"/>
+      <w:footerReference w:type="first" r:id="rId50"/>
       <w:pgSz w:w="11909" w:h="16834"/>
       <w:pgMar w:top="1037" w:right="1080" w:bottom="936" w:left="1080" w:header="432" w:footer="432" w:gutter="0"/>
       <w:cols w:space="720"/>

</xml_diff>

<commit_message>
Hướng dẫn xuất và nạp kết quả chung kết
</commit_message>
<xml_diff>
--- a/TAI-LIEU.docx
+++ b/TAI-LIEU.docx
@@ -159,7 +159,7 @@
           <w:r>
             <w:fldChar w:fldCharType="separate"/>
           </w:r>
-          <w:hyperlink w:anchor="_Toc244093766" w:history="1">
+          <w:hyperlink w:anchor="_Toc244098207" w:history="1">
             <w:r>
               <w:rPr>
                 <w:rStyle w:val="Hyperlink"/>
@@ -186,7 +186,7 @@
                 <w:noProof/>
                 <w:webHidden/>
               </w:rPr>
-              <w:instrText xml:space="preserve"> PAGEREF _Toc244093766 \h </w:instrText>
+              <w:instrText xml:space="preserve"> PAGEREF _Toc244098207 \h </w:instrText>
             </w:r>
             <w:r>
               <w:rPr>
@@ -233,7 +233,7 @@
               <w14:ligatures w14:val="standardContextual"/>
             </w:rPr>
           </w:pPr>
-          <w:hyperlink w:anchor="_Toc244093767" w:history="1">
+          <w:hyperlink w:anchor="_Toc244098208" w:history="1">
             <w:r>
               <w:rPr>
                 <w:rStyle w:val="Hyperlink"/>
@@ -260,7 +260,7 @@
                 <w:noProof/>
                 <w:webHidden/>
               </w:rPr>
-              <w:instrText xml:space="preserve"> PAGEREF _Toc244093767 \h </w:instrText>
+              <w:instrText xml:space="preserve"> PAGEREF _Toc244098208 \h </w:instrText>
             </w:r>
             <w:r>
               <w:rPr>
@@ -307,7 +307,7 @@
               <w14:ligatures w14:val="standardContextual"/>
             </w:rPr>
           </w:pPr>
-          <w:hyperlink w:anchor="_Toc244093768" w:history="1">
+          <w:hyperlink w:anchor="_Toc244098209" w:history="1">
             <w:r>
               <w:rPr>
                 <w:rStyle w:val="Hyperlink"/>
@@ -334,7 +334,7 @@
                 <w:noProof/>
                 <w:webHidden/>
               </w:rPr>
-              <w:instrText xml:space="preserve"> PAGEREF _Toc244093768 \h </w:instrText>
+              <w:instrText xml:space="preserve"> PAGEREF _Toc244098209 \h </w:instrText>
             </w:r>
             <w:r>
               <w:rPr>
@@ -381,7 +381,7 @@
               <w14:ligatures w14:val="standardContextual"/>
             </w:rPr>
           </w:pPr>
-          <w:hyperlink w:anchor="_Toc244093769" w:history="1">
+          <w:hyperlink w:anchor="_Toc244098210" w:history="1">
             <w:r>
               <w:rPr>
                 <w:rStyle w:val="Hyperlink"/>
@@ -408,7 +408,7 @@
                 <w:noProof/>
                 <w:webHidden/>
               </w:rPr>
-              <w:instrText xml:space="preserve"> PAGEREF _Toc244093769 \h </w:instrText>
+              <w:instrText xml:space="preserve"> PAGEREF _Toc244098210 \h </w:instrText>
             </w:r>
             <w:r>
               <w:rPr>
@@ -455,7 +455,7 @@
               <w14:ligatures w14:val="standardContextual"/>
             </w:rPr>
           </w:pPr>
-          <w:hyperlink w:anchor="_Toc244093770" w:history="1">
+          <w:hyperlink w:anchor="_Toc244098211" w:history="1">
             <w:r>
               <w:rPr>
                 <w:rStyle w:val="Hyperlink"/>
@@ -482,7 +482,7 @@
                 <w:noProof/>
                 <w:webHidden/>
               </w:rPr>
-              <w:instrText xml:space="preserve"> PAGEREF _Toc244093770 \h </w:instrText>
+              <w:instrText xml:space="preserve"> PAGEREF _Toc244098211 \h </w:instrText>
             </w:r>
             <w:r>
               <w:rPr>
@@ -529,7 +529,7 @@
               <w14:ligatures w14:val="standardContextual"/>
             </w:rPr>
           </w:pPr>
-          <w:hyperlink w:anchor="_Toc244093771" w:history="1">
+          <w:hyperlink w:anchor="_Toc244098212" w:history="1">
             <w:r>
               <w:rPr>
                 <w:rStyle w:val="Hyperlink"/>
@@ -556,7 +556,7 @@
                 <w:noProof/>
                 <w:webHidden/>
               </w:rPr>
-              <w:instrText xml:space="preserve"> PAGEREF _Toc244093771 \h </w:instrText>
+              <w:instrText xml:space="preserve"> PAGEREF _Toc244098212 \h </w:instrText>
             </w:r>
             <w:r>
               <w:rPr>
@@ -603,7 +603,7 @@
               <w14:ligatures w14:val="standardContextual"/>
             </w:rPr>
           </w:pPr>
-          <w:hyperlink w:anchor="_Toc244093772" w:history="1">
+          <w:hyperlink w:anchor="_Toc244098213" w:history="1">
             <w:r>
               <w:rPr>
                 <w:rStyle w:val="Hyperlink"/>
@@ -630,7 +630,7 @@
                 <w:noProof/>
                 <w:webHidden/>
               </w:rPr>
-              <w:instrText xml:space="preserve"> PAGEREF _Toc244093772 \h </w:instrText>
+              <w:instrText xml:space="preserve"> PAGEREF _Toc244098213 \h </w:instrText>
             </w:r>
             <w:r>
               <w:rPr>
@@ -677,7 +677,7 @@
               <w14:ligatures w14:val="standardContextual"/>
             </w:rPr>
           </w:pPr>
-          <w:hyperlink w:anchor="_Toc244093773" w:history="1">
+          <w:hyperlink w:anchor="_Toc244098214" w:history="1">
             <w:r>
               <w:rPr>
                 <w:rStyle w:val="Hyperlink"/>
@@ -704,7 +704,7 @@
                 <w:noProof/>
                 <w:webHidden/>
               </w:rPr>
-              <w:instrText xml:space="preserve"> PAGEREF _Toc244093773 \h </w:instrText>
+              <w:instrText xml:space="preserve"> PAGEREF _Toc244098214 \h </w:instrText>
             </w:r>
             <w:r>
               <w:rPr>
@@ -751,7 +751,7 @@
               <w14:ligatures w14:val="standardContextual"/>
             </w:rPr>
           </w:pPr>
-          <w:hyperlink w:anchor="_Toc244093774" w:history="1">
+          <w:hyperlink w:anchor="_Toc244098215" w:history="1">
             <w:r>
               <w:rPr>
                 <w:rStyle w:val="Hyperlink"/>
@@ -778,7 +778,7 @@
                 <w:noProof/>
                 <w:webHidden/>
               </w:rPr>
-              <w:instrText xml:space="preserve"> PAGEREF _Toc244093774 \h </w:instrText>
+              <w:instrText xml:space="preserve"> PAGEREF _Toc244098215 \h </w:instrText>
             </w:r>
             <w:r>
               <w:rPr>
@@ -825,7 +825,7 @@
               <w14:ligatures w14:val="standardContextual"/>
             </w:rPr>
           </w:pPr>
-          <w:hyperlink w:anchor="_Toc244093775" w:history="1">
+          <w:hyperlink w:anchor="_Toc244098216" w:history="1">
             <w:r>
               <w:rPr>
                 <w:rStyle w:val="Hyperlink"/>
@@ -852,7 +852,7 @@
                 <w:noProof/>
                 <w:webHidden/>
               </w:rPr>
-              <w:instrText xml:space="preserve"> PAGEREF _Toc244093775 \h </w:instrText>
+              <w:instrText xml:space="preserve"> PAGEREF _Toc244098216 \h </w:instrText>
             </w:r>
             <w:r>
               <w:rPr>
@@ -899,7 +899,7 @@
               <w14:ligatures w14:val="standardContextual"/>
             </w:rPr>
           </w:pPr>
-          <w:hyperlink w:anchor="_Toc244093776" w:history="1">
+          <w:hyperlink w:anchor="_Toc244098217" w:history="1">
             <w:r>
               <w:rPr>
                 <w:rStyle w:val="Hyperlink"/>
@@ -926,7 +926,7 @@
                 <w:noProof/>
                 <w:webHidden/>
               </w:rPr>
-              <w:instrText xml:space="preserve"> PAGEREF _Toc244093776 \h </w:instrText>
+              <w:instrText xml:space="preserve"> PAGEREF _Toc244098217 \h </w:instrText>
             </w:r>
             <w:r>
               <w:rPr>
@@ -973,7 +973,7 @@
               <w14:ligatures w14:val="standardContextual"/>
             </w:rPr>
           </w:pPr>
-          <w:hyperlink w:anchor="_Toc244093777" w:history="1">
+          <w:hyperlink w:anchor="_Toc244098218" w:history="1">
             <w:r>
               <w:rPr>
                 <w:rStyle w:val="Hyperlink"/>
@@ -1000,7 +1000,7 @@
                 <w:noProof/>
                 <w:webHidden/>
               </w:rPr>
-              <w:instrText xml:space="preserve"> PAGEREF _Toc244093777 \h </w:instrText>
+              <w:instrText xml:space="preserve"> PAGEREF _Toc244098218 \h </w:instrText>
             </w:r>
             <w:r>
               <w:rPr>
@@ -1047,7 +1047,7 @@
               <w14:ligatures w14:val="standardContextual"/>
             </w:rPr>
           </w:pPr>
-          <w:hyperlink w:anchor="_Toc244093778" w:history="1">
+          <w:hyperlink w:anchor="_Toc244098219" w:history="1">
             <w:r>
               <w:rPr>
                 <w:rStyle w:val="Hyperlink"/>
@@ -1074,7 +1074,7 @@
                 <w:noProof/>
                 <w:webHidden/>
               </w:rPr>
-              <w:instrText xml:space="preserve"> PAGEREF _Toc244093778 \h </w:instrText>
+              <w:instrText xml:space="preserve"> PAGEREF _Toc244098219 \h </w:instrText>
             </w:r>
             <w:r>
               <w:rPr>
@@ -1121,7 +1121,7 @@
               <w14:ligatures w14:val="standardContextual"/>
             </w:rPr>
           </w:pPr>
-          <w:hyperlink w:anchor="_Toc244093779" w:history="1">
+          <w:hyperlink w:anchor="_Toc244098220" w:history="1">
             <w:r>
               <w:rPr>
                 <w:rStyle w:val="Hyperlink"/>
@@ -1148,7 +1148,7 @@
                 <w:noProof/>
                 <w:webHidden/>
               </w:rPr>
-              <w:instrText xml:space="preserve"> PAGEREF _Toc244093779 \h </w:instrText>
+              <w:instrText xml:space="preserve"> PAGEREF _Toc244098220 \h </w:instrText>
             </w:r>
             <w:r>
               <w:rPr>
@@ -1195,7 +1195,7 @@
               <w14:ligatures w14:val="standardContextual"/>
             </w:rPr>
           </w:pPr>
-          <w:hyperlink w:anchor="_Toc244093780" w:history="1">
+          <w:hyperlink w:anchor="_Toc244098221" w:history="1">
             <w:r>
               <w:rPr>
                 <w:rStyle w:val="Hyperlink"/>
@@ -1222,7 +1222,7 @@
                 <w:noProof/>
                 <w:webHidden/>
               </w:rPr>
-              <w:instrText xml:space="preserve"> PAGEREF _Toc244093780 \h </w:instrText>
+              <w:instrText xml:space="preserve"> PAGEREF _Toc244098221 \h </w:instrText>
             </w:r>
             <w:r>
               <w:rPr>
@@ -1269,7 +1269,7 @@
               <w14:ligatures w14:val="standardContextual"/>
             </w:rPr>
           </w:pPr>
-          <w:hyperlink w:anchor="_Toc244093781" w:history="1">
+          <w:hyperlink w:anchor="_Toc244098222" w:history="1">
             <w:r>
               <w:rPr>
                 <w:rStyle w:val="Hyperlink"/>
@@ -1296,7 +1296,7 @@
                 <w:noProof/>
                 <w:webHidden/>
               </w:rPr>
-              <w:instrText xml:space="preserve"> PAGEREF _Toc244093781 \h </w:instrText>
+              <w:instrText xml:space="preserve"> PAGEREF _Toc244098222 \h </w:instrText>
             </w:r>
             <w:r>
               <w:rPr>
@@ -1343,7 +1343,7 @@
               <w14:ligatures w14:val="standardContextual"/>
             </w:rPr>
           </w:pPr>
-          <w:hyperlink w:anchor="_Toc244093782" w:history="1">
+          <w:hyperlink w:anchor="_Toc244098223" w:history="1">
             <w:r>
               <w:rPr>
                 <w:rStyle w:val="Hyperlink"/>
@@ -1370,7 +1370,7 @@
                 <w:noProof/>
                 <w:webHidden/>
               </w:rPr>
-              <w:instrText xml:space="preserve"> PAGEREF _Toc244093782 \h </w:instrText>
+              <w:instrText xml:space="preserve"> PAGEREF _Toc244098223 \h </w:instrText>
             </w:r>
             <w:r>
               <w:rPr>
@@ -1417,7 +1417,7 @@
               <w14:ligatures w14:val="standardContextual"/>
             </w:rPr>
           </w:pPr>
-          <w:hyperlink w:anchor="_Toc244093783" w:history="1">
+          <w:hyperlink w:anchor="_Toc244098224" w:history="1">
             <w:r>
               <w:rPr>
                 <w:rStyle w:val="Hyperlink"/>
@@ -1444,7 +1444,7 @@
                 <w:noProof/>
                 <w:webHidden/>
               </w:rPr>
-              <w:instrText xml:space="preserve"> PAGEREF _Toc244093783 \h </w:instrText>
+              <w:instrText xml:space="preserve"> PAGEREF _Toc244098224 \h </w:instrText>
             </w:r>
             <w:r>
               <w:rPr>
@@ -1491,7 +1491,7 @@
               <w14:ligatures w14:val="standardContextual"/>
             </w:rPr>
           </w:pPr>
-          <w:hyperlink w:anchor="_Toc244093784" w:history="1">
+          <w:hyperlink w:anchor="_Toc244098225" w:history="1">
             <w:r>
               <w:rPr>
                 <w:rStyle w:val="Hyperlink"/>
@@ -1518,7 +1518,7 @@
                 <w:noProof/>
                 <w:webHidden/>
               </w:rPr>
-              <w:instrText xml:space="preserve"> PAGEREF _Toc244093784 \h </w:instrText>
+              <w:instrText xml:space="preserve"> PAGEREF _Toc244098225 \h </w:instrText>
             </w:r>
             <w:r>
               <w:rPr>
@@ -1565,7 +1565,7 @@
               <w14:ligatures w14:val="standardContextual"/>
             </w:rPr>
           </w:pPr>
-          <w:hyperlink w:anchor="_Toc244093785" w:history="1">
+          <w:hyperlink w:anchor="_Toc244098226" w:history="1">
             <w:r>
               <w:rPr>
                 <w:rStyle w:val="Hyperlink"/>
@@ -1592,7 +1592,7 @@
                 <w:noProof/>
                 <w:webHidden/>
               </w:rPr>
-              <w:instrText xml:space="preserve"> PAGEREF _Toc244093785 \h </w:instrText>
+              <w:instrText xml:space="preserve"> PAGEREF _Toc244098226 \h </w:instrText>
             </w:r>
             <w:r>
               <w:rPr>
@@ -1639,7 +1639,7 @@
               <w14:ligatures w14:val="standardContextual"/>
             </w:rPr>
           </w:pPr>
-          <w:hyperlink w:anchor="_Toc244093786" w:history="1">
+          <w:hyperlink w:anchor="_Toc244098227" w:history="1">
             <w:r>
               <w:rPr>
                 <w:rStyle w:val="Hyperlink"/>
@@ -1666,7 +1666,7 @@
                 <w:noProof/>
                 <w:webHidden/>
               </w:rPr>
-              <w:instrText xml:space="preserve"> PAGEREF _Toc244093786 \h </w:instrText>
+              <w:instrText xml:space="preserve"> PAGEREF _Toc244098227 \h </w:instrText>
             </w:r>
             <w:r>
               <w:rPr>
@@ -1713,7 +1713,7 @@
               <w14:ligatures w14:val="standardContextual"/>
             </w:rPr>
           </w:pPr>
-          <w:hyperlink w:anchor="_Toc244093787" w:history="1">
+          <w:hyperlink w:anchor="_Toc244098228" w:history="1">
             <w:r>
               <w:rPr>
                 <w:rStyle w:val="Hyperlink"/>
@@ -1740,7 +1740,7 @@
                 <w:noProof/>
                 <w:webHidden/>
               </w:rPr>
-              <w:instrText xml:space="preserve"> PAGEREF _Toc244093787 \h </w:instrText>
+              <w:instrText xml:space="preserve"> PAGEREF _Toc244098228 \h </w:instrText>
             </w:r>
             <w:r>
               <w:rPr>
@@ -1787,7 +1787,7 @@
               <w14:ligatures w14:val="standardContextual"/>
             </w:rPr>
           </w:pPr>
-          <w:hyperlink w:anchor="_Toc244093788" w:history="1">
+          <w:hyperlink w:anchor="_Toc244098229" w:history="1">
             <w:r>
               <w:rPr>
                 <w:rStyle w:val="Hyperlink"/>
@@ -1814,7 +1814,7 @@
                 <w:noProof/>
                 <w:webHidden/>
               </w:rPr>
-              <w:instrText xml:space="preserve"> PAGEREF _Toc244093788 \h </w:instrText>
+              <w:instrText xml:space="preserve"> PAGEREF _Toc244098229 \h </w:instrText>
             </w:r>
             <w:r>
               <w:rPr>
@@ -1861,7 +1861,7 @@
               <w14:ligatures w14:val="standardContextual"/>
             </w:rPr>
           </w:pPr>
-          <w:hyperlink w:anchor="_Toc244093789" w:history="1">
+          <w:hyperlink w:anchor="_Toc244098230" w:history="1">
             <w:r>
               <w:rPr>
                 <w:rStyle w:val="Hyperlink"/>
@@ -1888,7 +1888,7 @@
                 <w:noProof/>
                 <w:webHidden/>
               </w:rPr>
-              <w:instrText xml:space="preserve"> PAGEREF _Toc244093789 \h </w:instrText>
+              <w:instrText xml:space="preserve"> PAGEREF _Toc244098230 \h </w:instrText>
             </w:r>
             <w:r>
               <w:rPr>
@@ -1935,7 +1935,7 @@
               <w14:ligatures w14:val="standardContextual"/>
             </w:rPr>
           </w:pPr>
-          <w:hyperlink w:anchor="_Toc244093790" w:history="1">
+          <w:hyperlink w:anchor="_Toc244098231" w:history="1">
             <w:r>
               <w:rPr>
                 <w:rStyle w:val="Hyperlink"/>
@@ -1962,7 +1962,7 @@
                 <w:noProof/>
                 <w:webHidden/>
               </w:rPr>
-              <w:instrText xml:space="preserve"> PAGEREF _Toc244093790 \h </w:instrText>
+              <w:instrText xml:space="preserve"> PAGEREF _Toc244098231 \h </w:instrText>
             </w:r>
             <w:r>
               <w:rPr>
@@ -2009,7 +2009,7 @@
               <w14:ligatures w14:val="standardContextual"/>
             </w:rPr>
           </w:pPr>
-          <w:hyperlink w:anchor="_Toc244093791" w:history="1">
+          <w:hyperlink w:anchor="_Toc244098232" w:history="1">
             <w:r>
               <w:rPr>
                 <w:rStyle w:val="Hyperlink"/>
@@ -2036,7 +2036,7 @@
                 <w:noProof/>
                 <w:webHidden/>
               </w:rPr>
-              <w:instrText xml:space="preserve"> PAGEREF _Toc244093791 \h </w:instrText>
+              <w:instrText xml:space="preserve"> PAGEREF _Toc244098232 \h </w:instrText>
             </w:r>
             <w:r>
               <w:rPr>
@@ -2083,7 +2083,7 @@
               <w14:ligatures w14:val="standardContextual"/>
             </w:rPr>
           </w:pPr>
-          <w:hyperlink w:anchor="_Toc244093792" w:history="1">
+          <w:hyperlink w:anchor="_Toc244098233" w:history="1">
             <w:r>
               <w:rPr>
                 <w:rStyle w:val="Hyperlink"/>
@@ -2110,7 +2110,7 @@
                 <w:noProof/>
                 <w:webHidden/>
               </w:rPr>
-              <w:instrText xml:space="preserve"> PAGEREF _Toc244093792 \h </w:instrText>
+              <w:instrText xml:space="preserve"> PAGEREF _Toc244098233 \h </w:instrText>
             </w:r>
             <w:r>
               <w:rPr>
@@ -2157,7 +2157,7 @@
               <w14:ligatures w14:val="standardContextual"/>
             </w:rPr>
           </w:pPr>
-          <w:hyperlink w:anchor="_Toc244093793" w:history="1">
+          <w:hyperlink w:anchor="_Toc244098234" w:history="1">
             <w:r>
               <w:rPr>
                 <w:rStyle w:val="Hyperlink"/>
@@ -2184,7 +2184,7 @@
                 <w:noProof/>
                 <w:webHidden/>
               </w:rPr>
-              <w:instrText xml:space="preserve"> PAGEREF _Toc244093793 \h </w:instrText>
+              <w:instrText xml:space="preserve"> PAGEREF _Toc244098234 \h </w:instrText>
             </w:r>
             <w:r>
               <w:rPr>
@@ -2231,7 +2231,7 @@
               <w14:ligatures w14:val="standardContextual"/>
             </w:rPr>
           </w:pPr>
-          <w:hyperlink w:anchor="_Toc244093794" w:history="1">
+          <w:hyperlink w:anchor="_Toc244098235" w:history="1">
             <w:r>
               <w:rPr>
                 <w:rStyle w:val="Hyperlink"/>
@@ -2258,7 +2258,7 @@
                 <w:noProof/>
                 <w:webHidden/>
               </w:rPr>
-              <w:instrText xml:space="preserve"> PAGEREF _Toc244093794 \h </w:instrText>
+              <w:instrText xml:space="preserve"> PAGEREF _Toc244098235 \h </w:instrText>
             </w:r>
             <w:r>
               <w:rPr>
@@ -2305,7 +2305,7 @@
               <w14:ligatures w14:val="standardContextual"/>
             </w:rPr>
           </w:pPr>
-          <w:hyperlink w:anchor="_Toc244093795" w:history="1">
+          <w:hyperlink w:anchor="_Toc244098236" w:history="1">
             <w:r>
               <w:rPr>
                 <w:rStyle w:val="Hyperlink"/>
@@ -2332,7 +2332,7 @@
                 <w:noProof/>
                 <w:webHidden/>
               </w:rPr>
-              <w:instrText xml:space="preserve"> PAGEREF _Toc244093795 \h </w:instrText>
+              <w:instrText xml:space="preserve"> PAGEREF _Toc244098236 \h </w:instrText>
             </w:r>
             <w:r>
               <w:rPr>
@@ -2379,7 +2379,7 @@
               <w14:ligatures w14:val="standardContextual"/>
             </w:rPr>
           </w:pPr>
-          <w:hyperlink w:anchor="_Toc244093796" w:history="1">
+          <w:hyperlink w:anchor="_Toc244098237" w:history="1">
             <w:r>
               <w:rPr>
                 <w:rStyle w:val="Hyperlink"/>
@@ -2406,7 +2406,7 @@
                 <w:noProof/>
                 <w:webHidden/>
               </w:rPr>
-              <w:instrText xml:space="preserve"> PAGEREF _Toc244093796 \h </w:instrText>
+              <w:instrText xml:space="preserve"> PAGEREF _Toc244098237 \h </w:instrText>
             </w:r>
             <w:r>
               <w:rPr>
@@ -2453,7 +2453,7 @@
               <w14:ligatures w14:val="standardContextual"/>
             </w:rPr>
           </w:pPr>
-          <w:hyperlink w:anchor="_Toc244093797" w:history="1">
+          <w:hyperlink w:anchor="_Toc244098238" w:history="1">
             <w:r>
               <w:rPr>
                 <w:rStyle w:val="Hyperlink"/>
@@ -2480,7 +2480,7 @@
                 <w:noProof/>
                 <w:webHidden/>
               </w:rPr>
-              <w:instrText xml:space="preserve"> PAGEREF _Toc244093797 \h </w:instrText>
+              <w:instrText xml:space="preserve"> PAGEREF _Toc244098238 \h </w:instrText>
             </w:r>
             <w:r>
               <w:rPr>
@@ -2527,7 +2527,7 @@
               <w14:ligatures w14:val="standardContextual"/>
             </w:rPr>
           </w:pPr>
-          <w:hyperlink w:anchor="_Toc244093798" w:history="1">
+          <w:hyperlink w:anchor="_Toc244098239" w:history="1">
             <w:r>
               <w:rPr>
                 <w:rStyle w:val="Hyperlink"/>
@@ -2554,7 +2554,7 @@
                 <w:noProof/>
                 <w:webHidden/>
               </w:rPr>
-              <w:instrText xml:space="preserve"> PAGEREF _Toc244093798 \h </w:instrText>
+              <w:instrText xml:space="preserve"> PAGEREF _Toc244098239 \h </w:instrText>
             </w:r>
             <w:r>
               <w:rPr>
@@ -2601,7 +2601,7 @@
               <w14:ligatures w14:val="standardContextual"/>
             </w:rPr>
           </w:pPr>
-          <w:hyperlink w:anchor="_Toc244093799" w:history="1">
+          <w:hyperlink w:anchor="_Toc244098240" w:history="1">
             <w:r>
               <w:rPr>
                 <w:rStyle w:val="Hyperlink"/>
@@ -2628,7 +2628,7 @@
                 <w:noProof/>
                 <w:webHidden/>
               </w:rPr>
-              <w:instrText xml:space="preserve"> PAGEREF _Toc244093799 \h </w:instrText>
+              <w:instrText xml:space="preserve"> PAGEREF _Toc244098240 \h </w:instrText>
             </w:r>
             <w:r>
               <w:rPr>
@@ -2675,7 +2675,7 @@
               <w14:ligatures w14:val="standardContextual"/>
             </w:rPr>
           </w:pPr>
-          <w:hyperlink w:anchor="_Toc244093800" w:history="1">
+          <w:hyperlink w:anchor="_Toc244098241" w:history="1">
             <w:r>
               <w:rPr>
                 <w:rStyle w:val="Hyperlink"/>
@@ -2702,7 +2702,7 @@
                 <w:noProof/>
                 <w:webHidden/>
               </w:rPr>
-              <w:instrText xml:space="preserve"> PAGEREF _Toc244093800 \h </w:instrText>
+              <w:instrText xml:space="preserve"> PAGEREF _Toc244098241 \h </w:instrText>
             </w:r>
             <w:r>
               <w:rPr>
@@ -2749,7 +2749,7 @@
               <w14:ligatures w14:val="standardContextual"/>
             </w:rPr>
           </w:pPr>
-          <w:hyperlink w:anchor="_Toc244093801" w:history="1">
+          <w:hyperlink w:anchor="_Toc244098242" w:history="1">
             <w:r>
               <w:rPr>
                 <w:rStyle w:val="Hyperlink"/>
@@ -2776,7 +2776,7 @@
                 <w:noProof/>
                 <w:webHidden/>
               </w:rPr>
-              <w:instrText xml:space="preserve"> PAGEREF _Toc244093801 \h </w:instrText>
+              <w:instrText xml:space="preserve"> PAGEREF _Toc244098242 \h </w:instrText>
             </w:r>
             <w:r>
               <w:rPr>
@@ -2823,7 +2823,7 @@
               <w14:ligatures w14:val="standardContextual"/>
             </w:rPr>
           </w:pPr>
-          <w:hyperlink w:anchor="_Toc244093802" w:history="1">
+          <w:hyperlink w:anchor="_Toc244098243" w:history="1">
             <w:r>
               <w:rPr>
                 <w:rStyle w:val="Hyperlink"/>
@@ -2850,7 +2850,7 @@
                 <w:noProof/>
                 <w:webHidden/>
               </w:rPr>
-              <w:instrText xml:space="preserve"> PAGEREF _Toc244093802 \h </w:instrText>
+              <w:instrText xml:space="preserve"> PAGEREF _Toc244098243 \h </w:instrText>
             </w:r>
             <w:r>
               <w:rPr>
@@ -2897,7 +2897,7 @@
               <w14:ligatures w14:val="standardContextual"/>
             </w:rPr>
           </w:pPr>
-          <w:hyperlink w:anchor="_Toc244093803" w:history="1">
+          <w:hyperlink w:anchor="_Toc244098244" w:history="1">
             <w:r>
               <w:rPr>
                 <w:rStyle w:val="Hyperlink"/>
@@ -2924,7 +2924,7 @@
                 <w:noProof/>
                 <w:webHidden/>
               </w:rPr>
-              <w:instrText xml:space="preserve"> PAGEREF _Toc244093803 \h </w:instrText>
+              <w:instrText xml:space="preserve"> PAGEREF _Toc244098244 \h </w:instrText>
             </w:r>
             <w:r>
               <w:rPr>
@@ -2971,7 +2971,7 @@
               <w14:ligatures w14:val="standardContextual"/>
             </w:rPr>
           </w:pPr>
-          <w:hyperlink w:anchor="_Toc244093804" w:history="1">
+          <w:hyperlink w:anchor="_Toc244098245" w:history="1">
             <w:r>
               <w:rPr>
                 <w:rStyle w:val="Hyperlink"/>
@@ -2998,7 +2998,7 @@
                 <w:noProof/>
                 <w:webHidden/>
               </w:rPr>
-              <w:instrText xml:space="preserve"> PAGEREF _Toc244093804 \h </w:instrText>
+              <w:instrText xml:space="preserve"> PAGEREF _Toc244098245 \h </w:instrText>
             </w:r>
             <w:r>
               <w:rPr>
@@ -3045,7 +3045,7 @@
               <w14:ligatures w14:val="standardContextual"/>
             </w:rPr>
           </w:pPr>
-          <w:hyperlink w:anchor="_Toc244093805" w:history="1">
+          <w:hyperlink w:anchor="_Toc244098246" w:history="1">
             <w:r>
               <w:rPr>
                 <w:rStyle w:val="Hyperlink"/>
@@ -3072,7 +3072,7 @@
                 <w:noProof/>
                 <w:webHidden/>
               </w:rPr>
-              <w:instrText xml:space="preserve"> PAGEREF _Toc244093805 \h </w:instrText>
+              <w:instrText xml:space="preserve"> PAGEREF _Toc244098246 \h </w:instrText>
             </w:r>
             <w:r>
               <w:rPr>
@@ -3119,7 +3119,7 @@
               <w14:ligatures w14:val="standardContextual"/>
             </w:rPr>
           </w:pPr>
-          <w:hyperlink w:anchor="_Toc244093806" w:history="1">
+          <w:hyperlink w:anchor="_Toc244098247" w:history="1">
             <w:r>
               <w:rPr>
                 <w:rStyle w:val="Hyperlink"/>
@@ -3146,7 +3146,7 @@
                 <w:noProof/>
                 <w:webHidden/>
               </w:rPr>
-              <w:instrText xml:space="preserve"> PAGEREF _Toc244093806 \h </w:instrText>
+              <w:instrText xml:space="preserve"> PAGEREF _Toc244098247 \h </w:instrText>
             </w:r>
             <w:r>
               <w:rPr>
@@ -3193,7 +3193,7 @@
               <w14:ligatures w14:val="standardContextual"/>
             </w:rPr>
           </w:pPr>
-          <w:hyperlink w:anchor="_Toc244093807" w:history="1">
+          <w:hyperlink w:anchor="_Toc244098248" w:history="1">
             <w:r>
               <w:rPr>
                 <w:rStyle w:val="Hyperlink"/>
@@ -3220,7 +3220,7 @@
                 <w:noProof/>
                 <w:webHidden/>
               </w:rPr>
-              <w:instrText xml:space="preserve"> PAGEREF _Toc244093807 \h </w:instrText>
+              <w:instrText xml:space="preserve"> PAGEREF _Toc244098248 \h </w:instrText>
             </w:r>
             <w:r>
               <w:rPr>
@@ -3267,7 +3267,7 @@
               <w14:ligatures w14:val="standardContextual"/>
             </w:rPr>
           </w:pPr>
-          <w:hyperlink w:anchor="_Toc244093808" w:history="1">
+          <w:hyperlink w:anchor="_Toc244098249" w:history="1">
             <w:r>
               <w:rPr>
                 <w:rStyle w:val="Hyperlink"/>
@@ -3294,7 +3294,7 @@
                 <w:noProof/>
                 <w:webHidden/>
               </w:rPr>
-              <w:instrText xml:space="preserve"> PAGEREF _Toc244093808 \h </w:instrText>
+              <w:instrText xml:space="preserve"> PAGEREF _Toc244098249 \h </w:instrText>
             </w:r>
             <w:r>
               <w:rPr>
@@ -3341,7 +3341,7 @@
               <w14:ligatures w14:val="standardContextual"/>
             </w:rPr>
           </w:pPr>
-          <w:hyperlink w:anchor="_Toc244093809" w:history="1">
+          <w:hyperlink w:anchor="_Toc244098250" w:history="1">
             <w:r>
               <w:rPr>
                 <w:rStyle w:val="Hyperlink"/>
@@ -3368,7 +3368,7 @@
                 <w:noProof/>
                 <w:webHidden/>
               </w:rPr>
-              <w:instrText xml:space="preserve"> PAGEREF _Toc244093809 \h </w:instrText>
+              <w:instrText xml:space="preserve"> PAGEREF _Toc244098250 \h </w:instrText>
             </w:r>
             <w:r>
               <w:rPr>
@@ -3415,7 +3415,7 @@
               <w14:ligatures w14:val="standardContextual"/>
             </w:rPr>
           </w:pPr>
-          <w:hyperlink w:anchor="_Toc244093810" w:history="1">
+          <w:hyperlink w:anchor="_Toc244098251" w:history="1">
             <w:r>
               <w:rPr>
                 <w:rStyle w:val="Hyperlink"/>
@@ -3442,7 +3442,7 @@
                 <w:noProof/>
                 <w:webHidden/>
               </w:rPr>
-              <w:instrText xml:space="preserve"> PAGEREF _Toc244093810 \h </w:instrText>
+              <w:instrText xml:space="preserve"> PAGEREF _Toc244098251 \h </w:instrText>
             </w:r>
             <w:r>
               <w:rPr>
@@ -3489,7 +3489,7 @@
               <w14:ligatures w14:val="standardContextual"/>
             </w:rPr>
           </w:pPr>
-          <w:hyperlink w:anchor="_Toc244093811" w:history="1">
+          <w:hyperlink w:anchor="_Toc244098252" w:history="1">
             <w:r>
               <w:rPr>
                 <w:rStyle w:val="Hyperlink"/>
@@ -3516,7 +3516,7 @@
                 <w:noProof/>
                 <w:webHidden/>
               </w:rPr>
-              <w:instrText xml:space="preserve"> PAGEREF _Toc244093811 \h </w:instrText>
+              <w:instrText xml:space="preserve"> PAGEREF _Toc244098252 \h </w:instrText>
             </w:r>
             <w:r>
               <w:rPr>
@@ -3563,7 +3563,7 @@
               <w14:ligatures w14:val="standardContextual"/>
             </w:rPr>
           </w:pPr>
-          <w:hyperlink w:anchor="_Toc244093812" w:history="1">
+          <w:hyperlink w:anchor="_Toc244098253" w:history="1">
             <w:r>
               <w:rPr>
                 <w:rStyle w:val="Hyperlink"/>
@@ -3590,7 +3590,7 @@
                 <w:noProof/>
                 <w:webHidden/>
               </w:rPr>
-              <w:instrText xml:space="preserve"> PAGEREF _Toc244093812 \h </w:instrText>
+              <w:instrText xml:space="preserve"> PAGEREF _Toc244098253 \h </w:instrText>
             </w:r>
             <w:r>
               <w:rPr>
@@ -3637,7 +3637,7 @@
               <w14:ligatures w14:val="standardContextual"/>
             </w:rPr>
           </w:pPr>
-          <w:hyperlink w:anchor="_Toc244093813" w:history="1">
+          <w:hyperlink w:anchor="_Toc244098254" w:history="1">
             <w:r>
               <w:rPr>
                 <w:rStyle w:val="Hyperlink"/>
@@ -3664,7 +3664,7 @@
                 <w:noProof/>
                 <w:webHidden/>
               </w:rPr>
-              <w:instrText xml:space="preserve"> PAGEREF _Toc244093813 \h </w:instrText>
+              <w:instrText xml:space="preserve"> PAGEREF _Toc244098254 \h </w:instrText>
             </w:r>
             <w:r>
               <w:rPr>
@@ -3711,7 +3711,7 @@
               <w14:ligatures w14:val="standardContextual"/>
             </w:rPr>
           </w:pPr>
-          <w:hyperlink w:anchor="_Toc244093814" w:history="1">
+          <w:hyperlink w:anchor="_Toc244098255" w:history="1">
             <w:r>
               <w:rPr>
                 <w:rStyle w:val="Hyperlink"/>
@@ -3738,7 +3738,7 @@
                 <w:noProof/>
                 <w:webHidden/>
               </w:rPr>
-              <w:instrText xml:space="preserve"> PAGEREF _Toc244093814 \h </w:instrText>
+              <w:instrText xml:space="preserve"> PAGEREF _Toc244098255 \h </w:instrText>
             </w:r>
             <w:r>
               <w:rPr>
@@ -3785,7 +3785,7 @@
               <w14:ligatures w14:val="standardContextual"/>
             </w:rPr>
           </w:pPr>
-          <w:hyperlink w:anchor="_Toc244093815" w:history="1">
+          <w:hyperlink w:anchor="_Toc244098256" w:history="1">
             <w:r>
               <w:rPr>
                 <w:rStyle w:val="Hyperlink"/>
@@ -3812,7 +3812,7 @@
                 <w:noProof/>
                 <w:webHidden/>
               </w:rPr>
-              <w:instrText xml:space="preserve"> PAGEREF _Toc244093815 \h </w:instrText>
+              <w:instrText xml:space="preserve"> PAGEREF _Toc244098256 \h </w:instrText>
             </w:r>
             <w:r>
               <w:rPr>
@@ -3859,7 +3859,7 @@
               <w14:ligatures w14:val="standardContextual"/>
             </w:rPr>
           </w:pPr>
-          <w:hyperlink w:anchor="_Toc244093816" w:history="1">
+          <w:hyperlink w:anchor="_Toc244098257" w:history="1">
             <w:r>
               <w:rPr>
                 <w:rStyle w:val="Hyperlink"/>
@@ -3886,7 +3886,7 @@
                 <w:noProof/>
                 <w:webHidden/>
               </w:rPr>
-              <w:instrText xml:space="preserve"> PAGEREF _Toc244093816 \h </w:instrText>
+              <w:instrText xml:space="preserve"> PAGEREF _Toc244098257 \h </w:instrText>
             </w:r>
             <w:r>
               <w:rPr>
@@ -3933,7 +3933,7 @@
               <w14:ligatures w14:val="standardContextual"/>
             </w:rPr>
           </w:pPr>
-          <w:hyperlink w:anchor="_Toc244093817" w:history="1">
+          <w:hyperlink w:anchor="_Toc244098258" w:history="1">
             <w:r>
               <w:rPr>
                 <w:rStyle w:val="Hyperlink"/>
@@ -3960,7 +3960,7 @@
                 <w:noProof/>
                 <w:webHidden/>
               </w:rPr>
-              <w:instrText xml:space="preserve"> PAGEREF _Toc244093817 \h </w:instrText>
+              <w:instrText xml:space="preserve"> PAGEREF _Toc244098258 \h </w:instrText>
             </w:r>
             <w:r>
               <w:rPr>
@@ -4007,7 +4007,7 @@
               <w14:ligatures w14:val="standardContextual"/>
             </w:rPr>
           </w:pPr>
-          <w:hyperlink w:anchor="_Toc244093818" w:history="1">
+          <w:hyperlink w:anchor="_Toc244098259" w:history="1">
             <w:r>
               <w:rPr>
                 <w:rStyle w:val="Hyperlink"/>
@@ -4034,7 +4034,7 @@
                 <w:noProof/>
                 <w:webHidden/>
               </w:rPr>
-              <w:instrText xml:space="preserve"> PAGEREF _Toc244093818 \h </w:instrText>
+              <w:instrText xml:space="preserve"> PAGEREF _Toc244098259 \h </w:instrText>
             </w:r>
             <w:r>
               <w:rPr>
@@ -4081,7 +4081,7 @@
               <w14:ligatures w14:val="standardContextual"/>
             </w:rPr>
           </w:pPr>
-          <w:hyperlink w:anchor="_Toc244093819" w:history="1">
+          <w:hyperlink w:anchor="_Toc244098260" w:history="1">
             <w:r>
               <w:rPr>
                 <w:rStyle w:val="Hyperlink"/>
@@ -4108,7 +4108,7 @@
                 <w:noProof/>
                 <w:webHidden/>
               </w:rPr>
-              <w:instrText xml:space="preserve"> PAGEREF _Toc244093819 \h </w:instrText>
+              <w:instrText xml:space="preserve"> PAGEREF _Toc244098260 \h </w:instrText>
             </w:r>
             <w:r>
               <w:rPr>
@@ -4155,7 +4155,7 @@
               <w14:ligatures w14:val="standardContextual"/>
             </w:rPr>
           </w:pPr>
-          <w:hyperlink w:anchor="_Toc244093820" w:history="1">
+          <w:hyperlink w:anchor="_Toc244098261" w:history="1">
             <w:r>
               <w:rPr>
                 <w:rStyle w:val="Hyperlink"/>
@@ -4182,7 +4182,7 @@
                 <w:noProof/>
                 <w:webHidden/>
               </w:rPr>
-              <w:instrText xml:space="preserve"> PAGEREF _Toc244093820 \h </w:instrText>
+              <w:instrText xml:space="preserve"> PAGEREF _Toc244098261 \h </w:instrText>
             </w:r>
             <w:r>
               <w:rPr>
@@ -4229,7 +4229,7 @@
               <w14:ligatures w14:val="standardContextual"/>
             </w:rPr>
           </w:pPr>
-          <w:hyperlink w:anchor="_Toc244093821" w:history="1">
+          <w:hyperlink w:anchor="_Toc244098262" w:history="1">
             <w:r>
               <w:rPr>
                 <w:rStyle w:val="Hyperlink"/>
@@ -4256,7 +4256,7 @@
                 <w:noProof/>
                 <w:webHidden/>
               </w:rPr>
-              <w:instrText xml:space="preserve"> PAGEREF _Toc244093821 \h </w:instrText>
+              <w:instrText xml:space="preserve"> PAGEREF _Toc244098262 \h </w:instrText>
             </w:r>
             <w:r>
               <w:rPr>
@@ -4303,7 +4303,7 @@
               <w14:ligatures w14:val="standardContextual"/>
             </w:rPr>
           </w:pPr>
-          <w:hyperlink w:anchor="_Toc244093822" w:history="1">
+          <w:hyperlink w:anchor="_Toc244098263" w:history="1">
             <w:r>
               <w:rPr>
                 <w:rStyle w:val="Hyperlink"/>
@@ -4330,7 +4330,7 @@
                 <w:noProof/>
                 <w:webHidden/>
               </w:rPr>
-              <w:instrText xml:space="preserve"> PAGEREF _Toc244093822 \h </w:instrText>
+              <w:instrText xml:space="preserve"> PAGEREF _Toc244098263 \h </w:instrText>
             </w:r>
             <w:r>
               <w:rPr>
@@ -4377,7 +4377,7 @@
               <w14:ligatures w14:val="standardContextual"/>
             </w:rPr>
           </w:pPr>
-          <w:hyperlink w:anchor="_Toc244093823" w:history="1">
+          <w:hyperlink w:anchor="_Toc244098264" w:history="1">
             <w:r>
               <w:rPr>
                 <w:rStyle w:val="Hyperlink"/>
@@ -4404,7 +4404,7 @@
                 <w:noProof/>
                 <w:webHidden/>
               </w:rPr>
-              <w:instrText xml:space="preserve"> PAGEREF _Toc244093823 \h </w:instrText>
+              <w:instrText xml:space="preserve"> PAGEREF _Toc244098264 \h </w:instrText>
             </w:r>
             <w:r>
               <w:rPr>
@@ -4451,7 +4451,7 @@
               <w14:ligatures w14:val="standardContextual"/>
             </w:rPr>
           </w:pPr>
-          <w:hyperlink w:anchor="_Toc244093824" w:history="1">
+          <w:hyperlink w:anchor="_Toc244098265" w:history="1">
             <w:r>
               <w:rPr>
                 <w:rStyle w:val="Hyperlink"/>
@@ -4478,7 +4478,7 @@
                 <w:noProof/>
                 <w:webHidden/>
               </w:rPr>
-              <w:instrText xml:space="preserve"> PAGEREF _Toc244093824 \h </w:instrText>
+              <w:instrText xml:space="preserve"> PAGEREF _Toc244098265 \h </w:instrText>
             </w:r>
             <w:r>
               <w:rPr>
@@ -4525,13 +4525,13 @@
               <w14:ligatures w14:val="standardContextual"/>
             </w:rPr>
           </w:pPr>
-          <w:hyperlink w:anchor="_Toc244093825" w:history="1">
+          <w:hyperlink w:anchor="_Toc244098266" w:history="1">
             <w:r>
               <w:rPr>
                 <w:rStyle w:val="Hyperlink"/>
                 <w:noProof/>
               </w:rPr>
-              <w:t>Bước 30. Xuất CSV và đăng kết quả</w:t>
+              <w:t>Bước 30. Xuất kết quả trên hub LAN</w:t>
             </w:r>
             <w:r>
               <w:rPr>
@@ -4552,7 +4552,7 @@
                 <w:noProof/>
                 <w:webHidden/>
               </w:rPr>
-              <w:instrText xml:space="preserve"> PAGEREF _Toc244093825 \h </w:instrText>
+              <w:instrText xml:space="preserve"> PAGEREF _Toc244098266 \h </w:instrText>
             </w:r>
             <w:r>
               <w:rPr>
@@ -4573,6 +4573,80 @@
                 <w:webHidden/>
               </w:rPr>
               <w:t>45</w:t>
+            </w:r>
+            <w:r>
+              <w:rPr>
+                <w:noProof/>
+                <w:webHidden/>
+              </w:rPr>
+              <w:fldChar w:fldCharType="end"/>
+            </w:r>
+          </w:hyperlink>
+        </w:p>
+        <w:p>
+          <w:pPr>
+            <w:pStyle w:val="TOC3"/>
+            <w:tabs>
+              <w:tab w:val="right" w:leader="dot" w:pos="9739"/>
+            </w:tabs>
+            <w:rPr>
+              <w:rFonts w:asciiTheme="minorHAnsi" w:hAnsiTheme="minorHAnsi" w:cstheme="minorBidi"/>
+              <w:noProof/>
+              <w:color w:val="auto"/>
+              <w:kern w:val="2"/>
+              <w:sz w:val="22"/>
+              <w:lang w:val="en-US"/>
+              <w14:ligatures w14:val="standardContextual"/>
+            </w:rPr>
+          </w:pPr>
+          <w:hyperlink w:anchor="_Toc244098267" w:history="1">
+            <w:r>
+              <w:rPr>
+                <w:rStyle w:val="Hyperlink"/>
+                <w:noProof/>
+              </w:rPr>
+              <w:t>Bước 31. Nạp kết quả lên web thật</w:t>
+            </w:r>
+            <w:r>
+              <w:rPr>
+                <w:noProof/>
+                <w:webHidden/>
+              </w:rPr>
+              <w:tab/>
+            </w:r>
+            <w:r>
+              <w:rPr>
+                <w:noProof/>
+                <w:webHidden/>
+              </w:rPr>
+              <w:fldChar w:fldCharType="begin"/>
+            </w:r>
+            <w:r>
+              <w:rPr>
+                <w:noProof/>
+                <w:webHidden/>
+              </w:rPr>
+              <w:instrText xml:space="preserve"> PAGEREF _Toc244098267 \h </w:instrText>
+            </w:r>
+            <w:r>
+              <w:rPr>
+                <w:noProof/>
+                <w:webHidden/>
+              </w:rPr>
+            </w:r>
+            <w:r>
+              <w:rPr>
+                <w:noProof/>
+                <w:webHidden/>
+              </w:rPr>
+              <w:fldChar w:fldCharType="separate"/>
+            </w:r>
+            <w:r>
+              <w:rPr>
+                <w:noProof/>
+                <w:webHidden/>
+              </w:rPr>
+              <w:t>46</w:t>
             </w:r>
             <w:r>
               <w:rPr>
@@ -4596,7 +4670,7 @@
         <w:pageBreakBefore/>
       </w:pPr>
       <w:bookmarkStart w:id="0" w:name="mở-đầu"/>
-      <w:bookmarkStart w:id="1" w:name="_Toc244093766"/>
+      <w:bookmarkStart w:id="1" w:name="_Toc244098207"/>
       <w:r>
         <w:lastRenderedPageBreak/>
         <w:t>Mở đầu</w:t>
@@ -4671,7 +4745,7 @@
           <w:noProof/>
         </w:rPr>
         <w:drawing>
-          <wp:inline distT="0" distB="0" distL="0" distR="0" wp14:anchorId="7762D94D" wp14:editId="263767F2">
+          <wp:inline distT="0" distB="0" distL="0" distR="0" wp14:anchorId="222B0466" wp14:editId="6754929F">
             <wp:extent cx="5760000" cy="3922758"/>
             <wp:effectExtent l="0" t="0" r="0" b="0"/>
             <wp:docPr id="19" name="Picture" descr="Hình 1 Trang chủ công khai với hai giải demo đã hoàn tất"/>
@@ -4760,7 +4834,7 @@
         <w:pageBreakBefore/>
       </w:pPr>
       <w:bookmarkStart w:id="2" w:name="phần-a-giải-đấu"/>
-      <w:bookmarkStart w:id="3" w:name="_Toc244093767"/>
+      <w:bookmarkStart w:id="3" w:name="_Toc244098208"/>
       <w:bookmarkEnd w:id="0"/>
       <w:r>
         <w:lastRenderedPageBreak/>
@@ -4773,7 +4847,7 @@
         <w:pStyle w:val="Heading2"/>
       </w:pPr>
       <w:bookmarkStart w:id="4" w:name="a1-trò-chơi-ottv2"/>
-      <w:bookmarkStart w:id="5" w:name="_Toc244093768"/>
+      <w:bookmarkStart w:id="5" w:name="_Toc244098209"/>
       <w:r>
         <w:t>1. Trò chơi OTTv2</w:t>
       </w:r>
@@ -5054,7 +5128,7 @@
         <w:pStyle w:val="Heading2"/>
       </w:pPr>
       <w:bookmarkStart w:id="6" w:name="a2-tài-khoản-và-đội"/>
-      <w:bookmarkStart w:id="7" w:name="_Toc244093769"/>
+      <w:bookmarkStart w:id="7" w:name="_Toc244098210"/>
       <w:bookmarkEnd w:id="4"/>
       <w:r>
         <w:t>2. Tài khoản và đội</w:t>
@@ -5373,7 +5447,7 @@
         <w:pStyle w:val="Heading2"/>
       </w:pPr>
       <w:bookmarkStart w:id="8" w:name="a3-nộp-bot-qua-github"/>
-      <w:bookmarkStart w:id="9" w:name="_Toc244093770"/>
+      <w:bookmarkStart w:id="9" w:name="_Toc244098211"/>
       <w:bookmarkEnd w:id="6"/>
       <w:r>
         <w:t>3. Nộp bot qua GitHub</w:t>
@@ -5797,7 +5871,7 @@
         <w:pStyle w:val="Heading2"/>
       </w:pPr>
       <w:bookmarkStart w:id="10" w:name="a4-thể-lệ-và-lịch-đấu"/>
-      <w:bookmarkStart w:id="11" w:name="_Toc244093771"/>
+      <w:bookmarkStart w:id="11" w:name="_Toc244098212"/>
       <w:bookmarkEnd w:id="8"/>
       <w:r>
         <w:t>4. Thể lệ và lịch đấu</w:t>
@@ -5809,7 +5883,7 @@
         <w:pStyle w:val="Heading3"/>
       </w:pPr>
       <w:bookmarkStart w:id="12" w:name="ladder-trước-hạn"/>
-      <w:bookmarkStart w:id="13" w:name="_Toc244093772"/>
+      <w:bookmarkStart w:id="13" w:name="_Toc244098213"/>
       <w:r>
         <w:t>4.1. Ladder trước hạn</w:t>
       </w:r>
@@ -5869,7 +5943,7 @@
         <w:pStyle w:val="Heading3"/>
       </w:pPr>
       <w:bookmarkStart w:id="14" w:name="chốt-bài-tại-hạn"/>
-      <w:bookmarkStart w:id="15" w:name="_Toc244093773"/>
+      <w:bookmarkStart w:id="15" w:name="_Toc244098214"/>
       <w:bookmarkEnd w:id="12"/>
       <w:r>
         <w:lastRenderedPageBreak/>
@@ -5895,7 +5969,7 @@
         <w:pStyle w:val="Heading3"/>
       </w:pPr>
       <w:bookmarkStart w:id="16" w:name="xếp-hạng-chính-thức"/>
-      <w:bookmarkStart w:id="17" w:name="_Toc244093774"/>
+      <w:bookmarkStart w:id="17" w:name="_Toc244098215"/>
       <w:bookmarkEnd w:id="14"/>
       <w:r>
         <w:t>4.3. Xếp hạng chính thức</w:t>
@@ -6246,7 +6320,7 @@
         <w:pStyle w:val="Heading2"/>
       </w:pPr>
       <w:bookmarkStart w:id="18" w:name="a5-xem-kết-quả"/>
-      <w:bookmarkStart w:id="19" w:name="_Toc244093775"/>
+      <w:bookmarkStart w:id="19" w:name="_Toc244098216"/>
       <w:bookmarkEnd w:id="10"/>
       <w:bookmarkEnd w:id="16"/>
       <w:r>
@@ -6270,7 +6344,7 @@
         </w:rPr>
         <w:lastRenderedPageBreak/>
         <w:drawing>
-          <wp:inline distT="0" distB="0" distL="0" distR="0" wp14:anchorId="369B63E4" wp14:editId="0253E56B">
+          <wp:inline distT="0" distB="0" distL="0" distR="0" wp14:anchorId="3289C83C" wp14:editId="6AD383E8">
             <wp:extent cx="5759999" cy="5603684"/>
             <wp:effectExtent l="0" t="0" r="0" b="0"/>
             <wp:docPr id="35" name="Picture" descr="Hình 2 Bảng điểm vòng tròn của giải qua GitHub sau khi hoàn tất 12 ván"/>
@@ -6349,7 +6423,7 @@
         </w:rPr>
         <w:lastRenderedPageBreak/>
         <w:drawing>
-          <wp:inline distT="0" distB="0" distL="0" distR="0" wp14:anchorId="6794E733" wp14:editId="56768B9C">
+          <wp:inline distT="0" distB="0" distL="0" distR="0" wp14:anchorId="4F783A84" wp14:editId="5269AEB2">
             <wp:extent cx="5579999" cy="7011709"/>
             <wp:effectExtent l="0" t="0" r="0" b="0"/>
             <wp:docPr id="38" name="Picture" descr="Hình 3 Replay một ván đã kết thúc bằng chiếm căn cứ"/>
@@ -6414,7 +6488,7 @@
         <w:pStyle w:val="Heading2"/>
       </w:pPr>
       <w:bookmarkStart w:id="20" w:name="a6-ban-tổ-chức-và-điều-hành"/>
-      <w:bookmarkStart w:id="21" w:name="_Toc244093776"/>
+      <w:bookmarkStart w:id="21" w:name="_Toc244098217"/>
       <w:bookmarkEnd w:id="18"/>
       <w:r>
         <w:t>6. Ban tổ chức và điều hành</w:t>
@@ -6445,7 +6519,7 @@
         </w:rPr>
         <w:lastRenderedPageBreak/>
         <w:drawing>
-          <wp:inline distT="0" distB="0" distL="0" distR="0" wp14:anchorId="1CD6C8B9" wp14:editId="76DF2E01">
+          <wp:inline distT="0" distB="0" distL="0" distR="0" wp14:anchorId="3B5FCD36" wp14:editId="655075B2">
             <wp:extent cx="5759999" cy="3254999"/>
             <wp:effectExtent l="0" t="0" r="0" b="0"/>
             <wp:docPr id="42" name="Picture" descr="Hình 4 Phần chính của biểu mẫu tạo giải với các giá trị mặc định"/>
@@ -6533,7 +6607,7 @@
       <w:pPr>
         <w:pStyle w:val="Heading2"/>
       </w:pPr>
-      <w:bookmarkStart w:id="22" w:name="_Toc244093777"/>
+      <w:bookmarkStart w:id="22" w:name="_Toc244098218"/>
       <w:r>
         <w:t>7. Chung kết tại hội trường</w:t>
       </w:r>
@@ -6955,12 +7029,17 @@
       </w:tr>
     </w:tbl>
     <w:p>
+      <w:r>
+        <w:t>Sau chung kết, BTC xuất gói kết quả từ hub LAN rồi nạp lên web thật bằng một thiết bị có Internet riêng. Người xem mở lại bảng điểm, từng cặp và replay trên web; mạng thi vẫn không có Internet. Việc chuyển là một chiều và cần BTC xác nhận, không đồng bộ tài khoản, mã bot hay DB.</w:t>
+      </w:r>
+    </w:p>
+    <w:p>
       <w:pPr>
         <w:pStyle w:val="Heading1"/>
         <w:pageBreakBefore/>
       </w:pPr>
       <w:bookmarkStart w:id="23" w:name="phần-b-thiết-kế-kỹ-thuật"/>
-      <w:bookmarkStart w:id="24" w:name="_Toc244093778"/>
+      <w:bookmarkStart w:id="24" w:name="_Toc244098219"/>
       <w:bookmarkEnd w:id="2"/>
       <w:bookmarkEnd w:id="20"/>
       <w:r>
@@ -6974,7 +7053,7 @@
         <w:pStyle w:val="Heading2"/>
       </w:pPr>
       <w:bookmarkStart w:id="25" w:name="b1-kiến-trúc-tổng-thể"/>
-      <w:bookmarkStart w:id="26" w:name="_Toc244093779"/>
+      <w:bookmarkStart w:id="26" w:name="_Toc244098220"/>
       <w:r>
         <w:t>1. Kiến trúc tổng thể</w:t>
       </w:r>
@@ -6995,7 +7074,7 @@
           <w:noProof/>
         </w:rPr>
         <w:drawing>
-          <wp:inline distT="0" distB="0" distL="0" distR="0" wp14:anchorId="6AF4E388" wp14:editId="4FC9CC52">
+          <wp:inline distT="0" distB="0" distL="0" distR="0" wp14:anchorId="5AC008C7" wp14:editId="141D8F57">
             <wp:extent cx="5759999" cy="3702857"/>
             <wp:effectExtent l="0" t="0" r="0" b="0"/>
             <wp:docPr id="47" name="Picture" descr="Hình 5 Kiến trúc triển khai; các mũi tên biểu diễn kết nối hoặc yêu cầu giữa các thành phần"/>
@@ -7076,7 +7155,7 @@
         <w:pStyle w:val="Heading2"/>
       </w:pPr>
       <w:bookmarkStart w:id="27" w:name="b2-dịch-vụ-được-dùng"/>
-      <w:bookmarkStart w:id="28" w:name="_Toc244093780"/>
+      <w:bookmarkStart w:id="28" w:name="_Toc244098221"/>
       <w:bookmarkEnd w:id="25"/>
       <w:r>
         <w:lastRenderedPageBreak/>
@@ -7408,7 +7487,7 @@
         <w:pStyle w:val="Heading2"/>
       </w:pPr>
       <w:bookmarkStart w:id="29" w:name="b3-hub-và-cách-phục-vụ-dữ-liệu"/>
-      <w:bookmarkStart w:id="30" w:name="_Toc244093781"/>
+      <w:bookmarkStart w:id="30" w:name="_Toc244098222"/>
       <w:bookmarkEnd w:id="27"/>
       <w:r>
         <w:t>3. Hub và cách phục vụ dữ liệu</w:t>
@@ -7487,7 +7566,7 @@
         <w:pStyle w:val="Heading2"/>
       </w:pPr>
       <w:bookmarkStart w:id="31" w:name="b4-máy-chấm-và-chia-việc"/>
-      <w:bookmarkStart w:id="32" w:name="_Toc244093782"/>
+      <w:bookmarkStart w:id="32" w:name="_Toc244098223"/>
       <w:bookmarkEnd w:id="29"/>
       <w:r>
         <w:t>4. Máy chấm và chia việc</w:t>
@@ -7529,7 +7608,7 @@
           <w:noProof/>
         </w:rPr>
         <w:drawing>
-          <wp:inline distT="0" distB="0" distL="0" distR="0" wp14:anchorId="0BB03FA2" wp14:editId="0385D52A">
+          <wp:inline distT="0" distB="0" distL="0" distR="0" wp14:anchorId="4D10B64D" wp14:editId="152E7C92">
             <wp:extent cx="5759999" cy="3543157"/>
             <wp:effectExtent l="0" t="0" r="0" b="0"/>
             <wp:docPr id="53" name="Picture" descr="Hình 6 Trang quản lý máy chấm trên web thật; tên máy được che, trạng thái phản ánh thời điểm chụp"/>
@@ -7610,7 +7689,7 @@
         <w:pStyle w:val="Heading2"/>
       </w:pPr>
       <w:bookmarkStart w:id="33" w:name="b5-sandbox-thay-docker"/>
-      <w:bookmarkStart w:id="34" w:name="_Toc244093783"/>
+      <w:bookmarkStart w:id="34" w:name="_Toc244098224"/>
       <w:bookmarkEnd w:id="31"/>
       <w:r>
         <w:t>5. Sandbox chạy bot</w:t>
@@ -7652,7 +7731,7 @@
         <w:pStyle w:val="Heading2"/>
       </w:pPr>
       <w:bookmarkStart w:id="35" w:name="b6-quỹ-giờ-và-khả-năng-đối-chiếu"/>
-      <w:bookmarkStart w:id="36" w:name="_Toc244093784"/>
+      <w:bookmarkStart w:id="36" w:name="_Toc244098225"/>
       <w:bookmarkEnd w:id="33"/>
       <w:r>
         <w:t>6. Quỹ giờ và khả năng đối chiếu</w:t>
@@ -7701,7 +7780,7 @@
         <w:pStyle w:val="Heading2"/>
       </w:pPr>
       <w:bookmarkStart w:id="37" w:name="b7-chịu-lỗi-và-sao-lưu"/>
-      <w:bookmarkStart w:id="38" w:name="_Toc244093785"/>
+      <w:bookmarkStart w:id="38" w:name="_Toc244098226"/>
       <w:bookmarkEnd w:id="35"/>
       <w:r>
         <w:t>7. Chịu lỗi và sao lưu</w:t>
@@ -8086,7 +8165,7 @@
         <w:pStyle w:val="Heading2"/>
       </w:pPr>
       <w:bookmarkStart w:id="39" w:name="b8-bảo-mật"/>
-      <w:bookmarkStart w:id="40" w:name="_Toc244093786"/>
+      <w:bookmarkStart w:id="40" w:name="_Toc244098227"/>
       <w:bookmarkEnd w:id="37"/>
       <w:r>
         <w:t>8. Bảo mật</w:t>
@@ -8144,7 +8223,7 @@
         <w:pStyle w:val="Heading2"/>
       </w:pPr>
       <w:bookmarkStart w:id="41" w:name="b9-sức-tải-và-thời-gian-đã-đo"/>
-      <w:bookmarkStart w:id="42" w:name="_Toc244093787"/>
+      <w:bookmarkStart w:id="42" w:name="_Toc244098228"/>
       <w:bookmarkEnd w:id="39"/>
       <w:r>
         <w:t>9. Sức tải và thời gian đã đo</w:t>
@@ -9328,7 +9407,7 @@
       <w:pPr>
         <w:pStyle w:val="Heading2"/>
       </w:pPr>
-      <w:bookmarkStart w:id="43" w:name="_Toc244093788"/>
+      <w:bookmarkStart w:id="43" w:name="_Toc244098229"/>
       <w:bookmarkEnd w:id="41"/>
       <w:r>
         <w:t>10. Cài đặt và vận hành</w:t>
@@ -9442,7 +9521,7 @@
       <w:pPr>
         <w:pStyle w:val="Heading2"/>
       </w:pPr>
-      <w:bookmarkStart w:id="44" w:name="_Toc244093789"/>
+      <w:bookmarkStart w:id="44" w:name="_Toc244098230"/>
       <w:r>
         <w:t>11. Mạng LAN ngày chung kết</w:t>
       </w:r>
@@ -9463,7 +9542,7 @@
           <w:noProof/>
         </w:rPr>
         <w:drawing>
-          <wp:inline distT="0" distB="0" distL="0" distR="0" wp14:anchorId="404F5F49" wp14:editId="400741BF">
+          <wp:inline distT="0" distB="0" distL="0" distR="0" wp14:anchorId="336DA34A" wp14:editId="101E14D8">
             <wp:extent cx="5760000" cy="2720000"/>
             <wp:effectExtent l="0" t="0" r="0" b="0"/>
             <wp:docPr id="155" name="Picture 155"/>
@@ -9543,12 +9622,12 @@
     </w:p>
     <w:p>
       <w:r>
-        <w:t>Laptop chiếu mở bảng điểm hoặc replay từ hub LAN và livestream qua 4G. Không bật chia sẻ Internet, cầu nối mạng hoặc tính năng phát mạng từ laptop này sang mạng thi. Người xem bên ngoài theo livestream; ban tổ chức xuất CSV, chuyển bằng kênh riêng rồi đăng Thông báo và kết quả lên web thật. Hub không tự đồng bộ kết quả LAN với VPS.</w:t>
-      </w:r>
-    </w:p>
-    <w:p>
-      <w:r>
-        <w:t>Trước ngày thi, nhóm cần diễn tập với router đã rút Internet, laptop hub, một PC và một laptop làm máy chấm, hai máy đóng vai đội: kiểm máy đội không vào Internet; đội nạp ZIP và Đạt 72 mẫu; chạy một bảng mini và một cặp loại trực tiếp; laptop chiếu mở replay và livestream thử qua 4G; rút điện một máy chấm giữa ván để kiểm nhận việc lại; xuất CSV rồi đăng web thật. Ghi thời gian thật, người trực và cách phục hồi để cập nhật lịch ngày thi.</w:t>
+        <w:t>Laptop chiếu mở bảng điểm hoặc replay từ hub LAN và livestream qua 4G. Không bật chia sẻ Internet, cầu nối mạng hoặc tính năng phát mạng từ laptop này sang mạng thi. Sau giải, BTC xuất một gói kết quả trên hub LAN, dùng thiết bị có Internet riêng để nạp lên web thật. Khách xem bảng điểm, kết quả từng cặp và replay. Đây là công bố một chiều do BTC bấm, chỉ chuyển dữ liệu công khai; không nhập tài khoản, mã bot hoặc cơ sở dữ liệu. BTC xem trước tên giải, số đội, số ván, số replay và SHA-256 rồi xác nhận. Nạp lại cùng file không nhân đôi; có thể ẩn sự kiện nạp nhầm và nạp bản sửa.</w:t>
+      </w:r>
+    </w:p>
+    <w:p>
+      <w:r>
+        <w:t>Trước ngày thi, nhóm cần diễn tập với router đã rút Internet, laptop hub, một PC và một laptop làm máy chấm, hai máy đóng vai đội: kiểm máy đội không vào Internet; đội nạp ZIP và Đạt 72 mẫu; chạy một bảng mini và một cặp loại trực tiếp; laptop chiếu mở replay và livestream thử qua 4G; rút điện một máy chấm giữa ván để kiểm nhận việc lại; xuất file kết quả, nạp lên web thật và mở một replay trên web thật. Ghi thời gian thật, người trực và cách phục hồi để cập nhật lịch ngày thi.</w:t>
       </w:r>
     </w:p>
     <w:p>
@@ -9561,7 +9640,7 @@
         <w:pStyle w:val="Heading2"/>
         <w:pageBreakBefore/>
       </w:pPr>
-      <w:bookmarkStart w:id="45" w:name="_Toc244093790"/>
+      <w:bookmarkStart w:id="45" w:name="_Toc244098231"/>
       <w:r>
         <w:lastRenderedPageBreak/>
         <w:t>12. Giới hạn và hướng tiếp</w:t>
@@ -9636,7 +9715,7 @@
         </w:numPr>
       </w:pPr>
       <w:r>
-        <w:t>Đồng bộ giải Internet với chung kết LAN thuộc hướng phát triển tiếp. Cụm nhiều hub, chống máy chấm cố ý gian lận và tính công bằng tuyệt đối giữa các CPU chưa được giải quyết.</w:t>
+        <w:t>Kết quả chung kết được công bố lên web bằng xuất/nạp một chiều; chưa đồng bộ tài khoản, mã bot hoặc DB. Cụm nhiều hub, chống máy chấm cố ý gian lận và tính công bằng tuyệt đối giữa các CPU chưa được giải quyết.</w:t>
       </w:r>
     </w:p>
     <w:p>
@@ -9646,7 +9725,7 @@
     </w:p>
     <w:p>
       <w:r>
-        <w:t>Chế độ LAN đã thử trên một PC: trình duyệt và máy chấm Windows kết nối hub trong WSL qua IPv4 riêng, bốn đội tự nạp ZIP và Đạt đủ 72 mẫu, bảng bốn đội hoàn tất 12 ván, cặp hai đội hoàn tất hai ván, xuất được CSV. Chưa diễn tập nhiều máy khi router không có Internet; nhóm cần làm danh sách ở mục 11 phần B. Kết quả LAN không tự đồng bộ lên web thật.</w:t>
+        <w:t>Chế độ LAN đã thử trên một PC: trình duyệt và máy chấm Windows kết nối hub trong WSL qua IPv4 riêng, bốn đội tự nạp ZIP và Đạt đủ 72 mẫu, bảng bốn đội hoàn tất 12 ván, cặp hai đội hoàn tất hai ván, xuất được CSV. Chưa diễn tập nhiều máy khi router không có Internet; nhóm cần làm danh sách ở mục 11 phần B. Kết quả LAN đã có đường xuất/nạp một chiều bằng file công khai, gồm bảng điểm, các cặp và replay; không chuyển tài khoản, mã bot hoặc DB.</w:t>
       </w:r>
     </w:p>
     <w:p>
@@ -9655,7 +9734,7 @@
         <w:pageBreakBefore/>
       </w:pPr>
       <w:bookmarkStart w:id="46" w:name="phần-c-hướng-dẫn-demo-từng-bước"/>
-      <w:bookmarkStart w:id="47" w:name="_Toc244093791"/>
+      <w:bookmarkStart w:id="47" w:name="_Toc244098232"/>
       <w:bookmarkEnd w:id="23"/>
       <w:r>
         <w:lastRenderedPageBreak/>
@@ -9673,7 +9752,7 @@
         <w:pStyle w:val="Heading2"/>
       </w:pPr>
       <w:bookmarkStart w:id="48" w:name="c1-khách-xem-giải"/>
-      <w:bookmarkStart w:id="49" w:name="_Toc244093792"/>
+      <w:bookmarkStart w:id="49" w:name="_Toc244098233"/>
       <w:r>
         <w:t>1. Khách xem giải</w:t>
       </w:r>
@@ -9684,7 +9763,7 @@
         <w:pStyle w:val="Heading3"/>
       </w:pPr>
       <w:bookmarkStart w:id="50" w:name="bước-1-mở-giải-công-khai"/>
-      <w:bookmarkStart w:id="51" w:name="_Toc244093793"/>
+      <w:bookmarkStart w:id="51" w:name="_Toc244098234"/>
       <w:r>
         <w:t>Bước 1. Mở giải công khai</w:t>
       </w:r>
@@ -9715,7 +9794,7 @@
           <w:noProof/>
         </w:rPr>
         <w:drawing>
-          <wp:inline distT="0" distB="0" distL="0" distR="0" wp14:anchorId="71720823" wp14:editId="3EAF190E">
+          <wp:inline distT="0" distB="0" distL="0" distR="0" wp14:anchorId="6D125677" wp14:editId="738C15AE">
             <wp:extent cx="5760000" cy="3922758"/>
             <wp:effectExtent l="0" t="0" r="0" b="0"/>
             <wp:docPr id="65" name="Picture" descr="Hình 7 Mở giải công khai"/>
@@ -9772,7 +9851,7 @@
         <w:pStyle w:val="Heading3"/>
       </w:pPr>
       <w:bookmarkStart w:id="52" w:name="bước-2-xem-bảng-điểm-và-ma-trận"/>
-      <w:bookmarkStart w:id="53" w:name="_Toc244093794"/>
+      <w:bookmarkStart w:id="53" w:name="_Toc244098235"/>
       <w:bookmarkEnd w:id="50"/>
       <w:r>
         <w:t>Bước 2. Xem bảng điểm và ma trận</w:t>
@@ -9825,7 +9904,7 @@
         </w:rPr>
         <w:lastRenderedPageBreak/>
         <w:drawing>
-          <wp:inline distT="0" distB="0" distL="0" distR="0" wp14:anchorId="5E610F1E" wp14:editId="4C8DD45B">
+          <wp:inline distT="0" distB="0" distL="0" distR="0" wp14:anchorId="60289731" wp14:editId="103D0AB2">
             <wp:extent cx="2664303" cy="2592000"/>
             <wp:effectExtent l="0" t="0" r="0" b="0"/>
             <wp:docPr id="69" name="Picture" descr="Hình 8 Xem bảng điểm và ma trận"/>
@@ -9883,7 +9962,7 @@
         <w:pageBreakBefore/>
       </w:pPr>
       <w:bookmarkStart w:id="54" w:name="bước-3-xem-lại-từng-nước"/>
-      <w:bookmarkStart w:id="55" w:name="_Toc244093795"/>
+      <w:bookmarkStart w:id="55" w:name="_Toc244098236"/>
       <w:bookmarkEnd w:id="52"/>
       <w:r>
         <w:lastRenderedPageBreak/>
@@ -9906,7 +9985,7 @@
           <w:noProof/>
         </w:rPr>
         <w:drawing>
-          <wp:inline distT="0" distB="0" distL="0" distR="0" wp14:anchorId="78187475" wp14:editId="5D389EB1">
+          <wp:inline distT="0" distB="0" distL="0" distR="0" wp14:anchorId="10D0049E" wp14:editId="174DCC7C">
             <wp:extent cx="4297381" cy="5399998"/>
             <wp:effectExtent l="0" t="0" r="0" b="0"/>
             <wp:docPr id="73" name="Picture" descr="Hình 9 Xem lại từng nước"/>
@@ -9964,7 +10043,7 @@
         <w:pageBreakBefore/>
       </w:pPr>
       <w:bookmarkStart w:id="56" w:name="c2-thí-sinh-đăng-ký-và-nộp-bot"/>
-      <w:bookmarkStart w:id="57" w:name="_Toc244093796"/>
+      <w:bookmarkStart w:id="57" w:name="_Toc244098237"/>
       <w:bookmarkEnd w:id="48"/>
       <w:bookmarkEnd w:id="54"/>
       <w:r>
@@ -9977,7 +10056,7 @@
       <w:pPr>
         <w:pStyle w:val="Heading3"/>
       </w:pPr>
-      <w:bookmarkStart w:id="58" w:name="_Toc244093797"/>
+      <w:bookmarkStart w:id="58" w:name="_Toc244098238"/>
       <w:r>
         <w:t>Bước 4. Đăng ký bằng email trường</w:t>
       </w:r>
@@ -10021,7 +10100,7 @@
           <w:noProof/>
         </w:rPr>
         <w:drawing>
-          <wp:inline distT="0" distB="0" distL="0" distR="0" wp14:anchorId="602CE59C" wp14:editId="35716E6F">
+          <wp:inline distT="0" distB="0" distL="0" distR="0" wp14:anchorId="1EAA7589" wp14:editId="0C6BBCFF">
             <wp:extent cx="3960000" cy="3160235"/>
             <wp:effectExtent l="0" t="0" r="0" b="0"/>
             <wp:docPr id="78" name="Picture" descr="Hình 10 Đăng ký bằng email trường"/>
@@ -10078,7 +10157,7 @@
         <w:pStyle w:val="Heading3"/>
         <w:pageBreakBefore/>
       </w:pPr>
-      <w:bookmarkStart w:id="59" w:name="_Toc244093798"/>
+      <w:bookmarkStart w:id="59" w:name="_Toc244098239"/>
       <w:r>
         <w:lastRenderedPageBreak/>
         <w:t>Bước 5. Mở email lấy mã</w:t>
@@ -10104,7 +10183,7 @@
           <w:noProof/>
         </w:rPr>
         <w:drawing>
-          <wp:inline distT="0" distB="0" distL="0" distR="0" wp14:anchorId="5BA66D37" wp14:editId="1AB8CF78">
+          <wp:inline distT="0" distB="0" distL="0" distR="0" wp14:anchorId="1C3E4D45" wp14:editId="1D27003F">
             <wp:extent cx="5760000" cy="2531025"/>
             <wp:effectExtent l="0" t="0" r="0" b="0"/>
             <wp:docPr id="153" name="Picture" descr="Hình 11 Email chứa mã xác minh"/>
@@ -10161,7 +10240,7 @@
         <w:pStyle w:val="Heading3"/>
         <w:pageBreakBefore/>
       </w:pPr>
-      <w:bookmarkStart w:id="60" w:name="_Toc244093799"/>
+      <w:bookmarkStart w:id="60" w:name="_Toc244098240"/>
       <w:r>
         <w:lastRenderedPageBreak/>
         <w:t>Bước 6. Xác minh email</w:t>
@@ -10196,7 +10275,7 @@
           <w:noProof/>
         </w:rPr>
         <w:drawing>
-          <wp:inline distT="0" distB="0" distL="0" distR="0" wp14:anchorId="3EFBE511" wp14:editId="608F9909">
+          <wp:inline distT="0" distB="0" distL="0" distR="0" wp14:anchorId="7C4142DB" wp14:editId="6EAEC0D2">
             <wp:extent cx="3960000" cy="4356000"/>
             <wp:effectExtent l="0" t="0" r="0" b="0"/>
             <wp:docPr id="82" name="Picture" descr="Hình 11 Xác minh email"/>
@@ -10253,7 +10332,7 @@
         <w:pStyle w:val="Heading3"/>
         <w:pageBreakBefore/>
       </w:pPr>
-      <w:bookmarkStart w:id="61" w:name="_Toc244093800"/>
+      <w:bookmarkStart w:id="61" w:name="_Toc244098241"/>
       <w:r>
         <w:lastRenderedPageBreak/>
         <w:t>Bước 7. Đặt mật khẩu và đăng nhập</w:t>
@@ -10288,7 +10367,7 @@
           <w:noProof/>
         </w:rPr>
         <w:drawing>
-          <wp:inline distT="0" distB="0" distL="0" distR="0" wp14:anchorId="7FEEE2A1" wp14:editId="0A793E11">
+          <wp:inline distT="0" distB="0" distL="0" distR="0" wp14:anchorId="41281C78" wp14:editId="3AD8FBE4">
             <wp:extent cx="3960000" cy="5023764"/>
             <wp:effectExtent l="0" t="0" r="0" b="0"/>
             <wp:docPr id="86" name="Picture" descr="Hình 12 Đặt mật khẩu và đăng nhập"/>
@@ -10344,7 +10423,7 @@
       <w:pPr>
         <w:pStyle w:val="Heading3"/>
       </w:pPr>
-      <w:bookmarkStart w:id="62" w:name="_Toc244093801"/>
+      <w:bookmarkStart w:id="62" w:name="_Toc244098242"/>
       <w:r>
         <w:t>Bước 8. Tạo đội</w:t>
       </w:r>
@@ -10385,7 +10464,7 @@
           <w:noProof/>
         </w:rPr>
         <w:drawing>
-          <wp:inline distT="0" distB="0" distL="0" distR="0" wp14:anchorId="684EC427" wp14:editId="30C7EBED">
+          <wp:inline distT="0" distB="0" distL="0" distR="0" wp14:anchorId="31441A91" wp14:editId="1CBC041F">
             <wp:extent cx="5012628" cy="2592000"/>
             <wp:effectExtent l="0" t="0" r="0" b="0"/>
             <wp:docPr id="90" name="Picture" descr="Hình 13 Tạo đội"/>
@@ -10442,7 +10521,7 @@
         <w:pStyle w:val="Heading3"/>
         <w:pageBreakBefore/>
       </w:pPr>
-      <w:bookmarkStart w:id="63" w:name="_Toc244093802"/>
+      <w:bookmarkStart w:id="63" w:name="_Toc244098243"/>
       <w:r>
         <w:lastRenderedPageBreak/>
         <w:t>Bước 9. Mời các thành viên</w:t>
@@ -10474,7 +10553,7 @@
           <w:noProof/>
         </w:rPr>
         <w:drawing>
-          <wp:inline distT="0" distB="0" distL="0" distR="0" wp14:anchorId="00B2C230" wp14:editId="64D04BCE">
+          <wp:inline distT="0" distB="0" distL="0" distR="0" wp14:anchorId="73F6CBC3" wp14:editId="5DF3E203">
             <wp:extent cx="4187916" cy="2592000"/>
             <wp:effectExtent l="0" t="0" r="0" b="0"/>
             <wp:docPr id="94" name="Picture" descr="Hình 14 Mời các thành viên"/>
@@ -10530,7 +10609,7 @@
       <w:pPr>
         <w:pStyle w:val="Heading3"/>
       </w:pPr>
-      <w:bookmarkStart w:id="64" w:name="_Toc244093803"/>
+      <w:bookmarkStart w:id="64" w:name="_Toc244098244"/>
       <w:r>
         <w:t>Bước 10. Vào đội bằng mã mời</w:t>
       </w:r>
@@ -10561,7 +10640,7 @@
           <w:noProof/>
         </w:rPr>
         <w:drawing>
-          <wp:inline distT="0" distB="0" distL="0" distR="0" wp14:anchorId="25F909A9" wp14:editId="5DF465F2">
+          <wp:inline distT="0" distB="0" distL="0" distR="0" wp14:anchorId="703275C3" wp14:editId="5ADCB086">
             <wp:extent cx="5012628" cy="2592000"/>
             <wp:effectExtent l="0" t="0" r="0" b="0"/>
             <wp:docPr id="98" name="Picture" descr="Hình 15 Vào đội bằng mã mời"/>
@@ -10618,7 +10697,7 @@
         <w:pStyle w:val="Heading3"/>
         <w:pageBreakBefore/>
       </w:pPr>
-      <w:bookmarkStart w:id="65" w:name="_Toc244093804"/>
+      <w:bookmarkStart w:id="65" w:name="_Toc244098245"/>
       <w:r>
         <w:lastRenderedPageBreak/>
         <w:t>Bước 11. Tạo repo từ mẫu</w:t>
@@ -10650,7 +10729,7 @@
           <w:noProof/>
         </w:rPr>
         <w:drawing>
-          <wp:inline distT="0" distB="0" distL="0" distR="0" wp14:anchorId="03F7CEAF" wp14:editId="54C0B3EA">
+          <wp:inline distT="0" distB="0" distL="0" distR="0" wp14:anchorId="5F6CFA17" wp14:editId="72C33665">
             <wp:extent cx="5682461" cy="2592000"/>
             <wp:effectExtent l="0" t="0" r="0" b="0"/>
             <wp:docPr id="102" name="Picture" descr="Hình 16 Tạo repo từ mẫu"/>
@@ -10706,7 +10785,7 @@
       <w:pPr>
         <w:pStyle w:val="Heading3"/>
       </w:pPr>
-      <w:bookmarkStart w:id="66" w:name="_Toc244093805"/>
+      <w:bookmarkStart w:id="66" w:name="_Toc244098246"/>
       <w:r>
         <w:t>Bước 12. Cho App truy cập đúng repo</w:t>
       </w:r>
@@ -10747,7 +10826,7 @@
           <w:noProof/>
         </w:rPr>
         <w:drawing>
-          <wp:inline distT="0" distB="0" distL="0" distR="0" wp14:anchorId="7FC2F584" wp14:editId="7551BD2A">
+          <wp:inline distT="0" distB="0" distL="0" distR="0" wp14:anchorId="460AAC10" wp14:editId="2277C6E5">
             <wp:extent cx="5759999" cy="1755999"/>
             <wp:effectExtent l="0" t="0" r="0" b="0"/>
             <wp:docPr id="106" name="Picture" descr="Hình 17 Cho App truy cập đúng repo"/>
@@ -10804,7 +10883,7 @@
         <w:pStyle w:val="Heading3"/>
         <w:pageBreakBefore/>
       </w:pPr>
-      <w:bookmarkStart w:id="67" w:name="_Toc244093806"/>
+      <w:bookmarkStart w:id="67" w:name="_Toc244098247"/>
       <w:r>
         <w:lastRenderedPageBreak/>
         <w:t>Bước 13. Gắn link repo với đội</w:t>
@@ -10846,7 +10925,7 @@
           <w:noProof/>
         </w:rPr>
         <w:drawing>
-          <wp:inline distT="0" distB="0" distL="0" distR="0" wp14:anchorId="5BD2E9F8" wp14:editId="4566B6B8">
+          <wp:inline distT="0" distB="0" distL="0" distR="0" wp14:anchorId="6815F3F0" wp14:editId="2D3C3999">
             <wp:extent cx="5284928" cy="2592000"/>
             <wp:effectExtent l="0" t="0" r="0" b="0"/>
             <wp:docPr id="110" name="Picture" descr="Hình 18 Gắn link repo với đội"/>
@@ -10902,7 +10981,7 @@
       <w:pPr>
         <w:pStyle w:val="Heading3"/>
       </w:pPr>
-      <w:bookmarkStart w:id="68" w:name="_Toc244093807"/>
+      <w:bookmarkStart w:id="68" w:name="_Toc244098248"/>
       <w:r>
         <w:t>Bước 14. Theo dõi kiểm tra 72 mẫu</w:t>
       </w:r>
@@ -10983,7 +11062,7 @@
           <w:noProof/>
         </w:rPr>
         <w:drawing>
-          <wp:inline distT="0" distB="0" distL="0" distR="0" wp14:anchorId="107C92B4" wp14:editId="1614BF69">
+          <wp:inline distT="0" distB="0" distL="0" distR="0" wp14:anchorId="7A7A5C46" wp14:editId="4332E463">
             <wp:extent cx="3093102" cy="2592000"/>
             <wp:effectExtent l="0" t="0" r="0" b="0"/>
             <wp:docPr id="114" name="Picture" descr="Hình 19 Theo dõi kiểm tra 72 mẫu"/>
@@ -11040,7 +11119,7 @@
         <w:pStyle w:val="Heading3"/>
         <w:pageBreakBefore/>
       </w:pPr>
-      <w:bookmarkStart w:id="69" w:name="_Toc244093808"/>
+      <w:bookmarkStart w:id="69" w:name="_Toc244098249"/>
       <w:r>
         <w:lastRenderedPageBreak/>
         <w:t>Bước 15. Thử nhanh không cần GitHub</w:t>
@@ -11064,7 +11143,7 @@
           <w:noProof/>
         </w:rPr>
         <w:drawing>
-          <wp:inline distT="0" distB="0" distL="0" distR="0" wp14:anchorId="34FFE594" wp14:editId="58172EB7">
+          <wp:inline distT="0" distB="0" distL="0" distR="0" wp14:anchorId="127086A7" wp14:editId="01EA8299">
             <wp:extent cx="5760000" cy="4876138"/>
             <wp:effectExtent l="0" t="0" r="0" b="0"/>
             <wp:docPr id="162" name="Picture 162"/>
@@ -11113,7 +11192,7 @@
         <w:pStyle w:val="Heading3"/>
         <w:pageBreakBefore/>
       </w:pPr>
-      <w:bookmarkStart w:id="70" w:name="_Toc244093809"/>
+      <w:bookmarkStart w:id="70" w:name="_Toc244098250"/>
       <w:r>
         <w:lastRenderedPageBreak/>
         <w:t>Bước 16. Xem giải của đội</w:t>
@@ -11175,7 +11254,7 @@
           <w:noProof/>
         </w:rPr>
         <w:drawing>
-          <wp:inline distT="0" distB="0" distL="0" distR="0" wp14:anchorId="0C67F50E" wp14:editId="0B30D402">
+          <wp:inline distT="0" distB="0" distL="0" distR="0" wp14:anchorId="1CA0D777" wp14:editId="6176A654">
             <wp:extent cx="5759999" cy="1024999"/>
             <wp:effectExtent l="0" t="0" r="0" b="0"/>
             <wp:docPr id="118" name="Picture" descr="Hình 20 Xem giải của đội"/>
@@ -11231,7 +11310,7 @@
       <w:pPr>
         <w:pStyle w:val="Heading3"/>
       </w:pPr>
-      <w:bookmarkStart w:id="71" w:name="_Toc244093810"/>
+      <w:bookmarkStart w:id="71" w:name="_Toc244098251"/>
       <w:r>
         <w:t>Bước 17. Luyện tập với bot mẫu</w:t>
       </w:r>
@@ -11282,7 +11361,7 @@
           <w:noProof/>
         </w:rPr>
         <w:drawing>
-          <wp:inline distT="0" distB="0" distL="0" distR="0" wp14:anchorId="6B4213DC" wp14:editId="6100D588">
+          <wp:inline distT="0" distB="0" distL="0" distR="0" wp14:anchorId="1FD7DAE8" wp14:editId="36F5A975">
             <wp:extent cx="5759999" cy="3774999"/>
             <wp:effectExtent l="0" t="0" r="0" b="0"/>
             <wp:docPr id="122" name="Picture" descr="Hình 21 Luyện tập với bot mẫu"/>
@@ -11340,7 +11419,7 @@
         <w:pageBreakBefore/>
       </w:pPr>
       <w:bookmarkStart w:id="72" w:name="c3-ban-tổ-chức-điều-hành"/>
-      <w:bookmarkStart w:id="73" w:name="_Toc244093811"/>
+      <w:bookmarkStart w:id="73" w:name="_Toc244098252"/>
       <w:bookmarkEnd w:id="56"/>
       <w:r>
         <w:lastRenderedPageBreak/>
@@ -11352,7 +11431,7 @@
       <w:pPr>
         <w:pStyle w:val="Heading3"/>
       </w:pPr>
-      <w:bookmarkStart w:id="74" w:name="_Toc244093812"/>
+      <w:bookmarkStart w:id="74" w:name="_Toc244098253"/>
       <w:r>
         <w:t>Bước 18. Xem tổng quan ban tổ chức</w:t>
       </w:r>
@@ -11373,7 +11452,7 @@
           <w:noProof/>
         </w:rPr>
         <w:drawing>
-          <wp:inline distT="0" distB="0" distL="0" distR="0" wp14:anchorId="780CB0EC" wp14:editId="19EC4ADE">
+          <wp:inline distT="0" distB="0" distL="0" distR="0" wp14:anchorId="0972C9AB" wp14:editId="13AF68A2">
             <wp:extent cx="5759999" cy="3505263"/>
             <wp:effectExtent l="0" t="0" r="0" b="0"/>
             <wp:docPr id="127" name="Picture" descr="Hình 22 Xem tổng quan ban tổ chức"/>
@@ -11430,7 +11509,7 @@
         <w:pStyle w:val="Heading3"/>
         <w:pageBreakBefore/>
       </w:pPr>
-      <w:bookmarkStart w:id="75" w:name="_Toc244093813"/>
+      <w:bookmarkStart w:id="75" w:name="_Toc244098254"/>
       <w:r>
         <w:lastRenderedPageBreak/>
         <w:t>Bước 19. Chọn giải ở Tổng quan</w:t>
@@ -11492,7 +11571,7 @@
           <w:noProof/>
         </w:rPr>
         <w:drawing>
-          <wp:inline distT="0" distB="0" distL="0" distR="0" wp14:anchorId="1900E750" wp14:editId="52B6B889">
+          <wp:inline distT="0" distB="0" distL="0" distR="0" wp14:anchorId="4B4DDB94" wp14:editId="04ED969C">
             <wp:extent cx="5759999" cy="4012104"/>
             <wp:effectExtent l="0" t="0" r="0" b="0"/>
             <wp:docPr id="131" name="Picture" descr="Hình 23 Chọn giải ở Tổng quan"/>
@@ -11549,7 +11628,7 @@
         <w:pStyle w:val="Heading3"/>
         <w:pageBreakBefore/>
       </w:pPr>
-      <w:bookmarkStart w:id="76" w:name="_Toc244093814"/>
+      <w:bookmarkStart w:id="76" w:name="_Toc244098255"/>
       <w:r>
         <w:lastRenderedPageBreak/>
         <w:t>Bước 20. Chuẩn bị giải mới</w:t>
@@ -11581,7 +11660,7 @@
           <w:noProof/>
         </w:rPr>
         <w:drawing>
-          <wp:inline distT="0" distB="0" distL="0" distR="0" wp14:anchorId="46D23CC1" wp14:editId="0A71A1EA">
+          <wp:inline distT="0" distB="0" distL="0" distR="0" wp14:anchorId="29B789FB" wp14:editId="01353B94">
             <wp:extent cx="4586765" cy="2592000"/>
             <wp:effectExtent l="0" t="0" r="0" b="0"/>
             <wp:docPr id="135" name="Picture" descr="Hình 24 Chuẩn bị giải mới"/>
@@ -11637,7 +11716,7 @@
       <w:pPr>
         <w:pStyle w:val="Heading3"/>
       </w:pPr>
-      <w:bookmarkStart w:id="77" w:name="_Toc244093815"/>
+      <w:bookmarkStart w:id="77" w:name="_Toc244098256"/>
       <w:r>
         <w:t>Bước 21. Cài máy chấm Windows hoặc Linux</w:t>
       </w:r>
@@ -11688,7 +11767,7 @@
           <w:noProof/>
         </w:rPr>
         <w:drawing>
-          <wp:inline distT="0" distB="0" distL="0" distR="0" wp14:anchorId="445D53C4" wp14:editId="4B63642A">
+          <wp:inline distT="0" distB="0" distL="0" distR="0" wp14:anchorId="723B44A0" wp14:editId="66C4A03D">
             <wp:extent cx="5759999" cy="1196950"/>
             <wp:effectExtent l="0" t="0" r="0" b="0"/>
             <wp:docPr id="139" name="Picture" descr="Hình 25 Cài máy chấm Windows hoặc Linux"/>
@@ -11745,7 +11824,7 @@
         <w:pStyle w:val="Heading3"/>
         <w:pageBreakBefore/>
       </w:pPr>
-      <w:bookmarkStart w:id="78" w:name="_Toc244093816"/>
+      <w:bookmarkStart w:id="78" w:name="_Toc244098257"/>
       <w:r>
         <w:lastRenderedPageBreak/>
         <w:t>Bước 22. Kiểm tình trạng chấm và hàng đợi</w:t>
@@ -11777,7 +11856,7 @@
           <w:noProof/>
         </w:rPr>
         <w:drawing>
-          <wp:inline distT="0" distB="0" distL="0" distR="0" wp14:anchorId="3F06708E" wp14:editId="7518D47E">
+          <wp:inline distT="0" distB="0" distL="0" distR="0" wp14:anchorId="2044421E" wp14:editId="75A93955">
             <wp:extent cx="4213732" cy="2592000"/>
             <wp:effectExtent l="0" t="0" r="0" b="0"/>
             <wp:docPr id="143" name="Picture" descr="Hình 26 Kiểm tình trạng chấm và hàng đợi"/>
@@ -11833,7 +11912,7 @@
       <w:pPr>
         <w:pStyle w:val="Heading3"/>
       </w:pPr>
-      <w:bookmarkStart w:id="79" w:name="_Toc244093817"/>
+      <w:bookmarkStart w:id="79" w:name="_Toc244098258"/>
       <w:r>
         <w:t>Bước 23. Soạn thông báo</w:t>
       </w:r>
@@ -11874,7 +11953,7 @@
           <w:noProof/>
         </w:rPr>
         <w:drawing>
-          <wp:inline distT="0" distB="0" distL="0" distR="0" wp14:anchorId="549CEEF7" wp14:editId="23886A0D">
+          <wp:inline distT="0" distB="0" distL="0" distR="0" wp14:anchorId="78097A2C" wp14:editId="1EA0D369">
             <wp:extent cx="5759999" cy="2369999"/>
             <wp:effectExtent l="0" t="0" r="0" b="0"/>
             <wp:docPr id="147" name="Picture" descr="Hình 27 Soạn thông báo"/>
@@ -11931,7 +12010,7 @@
         <w:pStyle w:val="Heading3"/>
         <w:pageBreakBefore/>
       </w:pPr>
-      <w:bookmarkStart w:id="80" w:name="_Toc244093818"/>
+      <w:bookmarkStart w:id="80" w:name="_Toc244098259"/>
       <w:r>
         <w:lastRenderedPageBreak/>
         <w:t>Bước 24. Xuất bảng điểm CSV</w:t>
@@ -11963,7 +12042,7 @@
           <w:noProof/>
         </w:rPr>
         <w:drawing>
-          <wp:inline distT="0" distB="0" distL="0" distR="0" wp14:anchorId="435932EA" wp14:editId="50030BB4">
+          <wp:inline distT="0" distB="0" distL="0" distR="0" wp14:anchorId="1ADB2C80" wp14:editId="6546FDAB">
             <wp:extent cx="4559999" cy="5400000"/>
             <wp:effectExtent l="0" t="0" r="0" b="0"/>
             <wp:docPr id="151" name="Picture" descr="Hình 28 Xuất bảng điểm CSV"/>
@@ -12020,7 +12099,7 @@
         <w:pStyle w:val="Heading2"/>
         <w:pageBreakBefore/>
       </w:pPr>
-      <w:bookmarkStart w:id="81" w:name="_Toc244093819"/>
+      <w:bookmarkStart w:id="81" w:name="_Toc244098260"/>
       <w:bookmarkEnd w:id="46"/>
       <w:bookmarkEnd w:id="72"/>
       <w:r>
@@ -12033,7 +12112,7 @@
       <w:pPr>
         <w:pStyle w:val="Heading3"/>
       </w:pPr>
-      <w:bookmarkStart w:id="82" w:name="_Toc244093820"/>
+      <w:bookmarkStart w:id="82" w:name="_Toc244098261"/>
       <w:r>
         <w:t>Bước 25. Tạo tài khoản và phát giấy cho đội</w:t>
       </w:r>
@@ -12057,7 +12136,7 @@
           <w:noProof/>
         </w:rPr>
         <w:drawing>
-          <wp:inline distT="0" distB="0" distL="0" distR="0" wp14:anchorId="1FE4EA49" wp14:editId="2BFCA998">
+          <wp:inline distT="0" distB="0" distL="0" distR="0" wp14:anchorId="6F7E7AC9" wp14:editId="62395FE9">
             <wp:extent cx="3600000" cy="5992258"/>
             <wp:effectExtent l="0" t="0" r="0" b="0"/>
             <wp:docPr id="156" name="Picture 156"/>
@@ -12107,7 +12186,7 @@
         <w:pStyle w:val="Heading3"/>
         <w:pageBreakBefore/>
       </w:pPr>
-      <w:bookmarkStart w:id="83" w:name="_Toc244093821"/>
+      <w:bookmarkStart w:id="83" w:name="_Toc244098262"/>
       <w:r>
         <w:lastRenderedPageBreak/>
         <w:t>Bước 26. Đội tự nạp ZIP và kiểm tra</w:t>
@@ -12132,7 +12211,7 @@
           <w:noProof/>
         </w:rPr>
         <w:drawing>
-          <wp:inline distT="0" distB="0" distL="0" distR="0" wp14:anchorId="1702F31B" wp14:editId="6734FFD7">
+          <wp:inline distT="0" distB="0" distL="0" distR="0" wp14:anchorId="4E216741" wp14:editId="7282FAE2">
             <wp:extent cx="5760000" cy="4826842"/>
             <wp:effectExtent l="0" t="0" r="0" b="0"/>
             <wp:docPr id="157" name="Picture 157"/>
@@ -12182,7 +12261,7 @@
         <w:pStyle w:val="Heading3"/>
         <w:pageBreakBefore/>
       </w:pPr>
-      <w:bookmarkStart w:id="84" w:name="_Toc244093822"/>
+      <w:bookmarkStart w:id="84" w:name="_Toc244098263"/>
       <w:r>
         <w:lastRenderedPageBreak/>
         <w:t>Bước 27. Tạo bảng và thêm các đội</w:t>
@@ -12207,7 +12286,7 @@
           <w:noProof/>
         </w:rPr>
         <w:drawing>
-          <wp:inline distT="0" distB="0" distL="0" distR="0" wp14:anchorId="7747BB4F" wp14:editId="15E9CE99">
+          <wp:inline distT="0" distB="0" distL="0" distR="0" wp14:anchorId="25DF9AE0" wp14:editId="0E455713">
             <wp:extent cx="5040000" cy="5595395"/>
             <wp:effectExtent l="0" t="0" r="0" b="0"/>
             <wp:docPr id="158" name="Picture 158"/>
@@ -12257,7 +12336,7 @@
         <w:pStyle w:val="Heading3"/>
         <w:pageBreakBefore/>
       </w:pPr>
-      <w:bookmarkStart w:id="85" w:name="_Toc244093823"/>
+      <w:bookmarkStart w:id="85" w:name="_Toc244098264"/>
       <w:r>
         <w:lastRenderedPageBreak/>
         <w:t>Bước 28. Chiếu bảng điểm và replay</w:t>
@@ -12282,7 +12361,7 @@
           <w:noProof/>
         </w:rPr>
         <w:drawing>
-          <wp:inline distT="0" distB="0" distL="0" distR="0" wp14:anchorId="45A771AA" wp14:editId="43C0556F">
+          <wp:inline distT="0" distB="0" distL="0" distR="0" wp14:anchorId="152A2343" wp14:editId="0C976D07">
             <wp:extent cx="5760000" cy="5532632"/>
             <wp:effectExtent l="0" t="0" r="0" b="0"/>
             <wp:docPr id="159" name="Picture 159"/>
@@ -12332,7 +12411,7 @@
         <w:pStyle w:val="Heading3"/>
         <w:pageBreakBefore/>
       </w:pPr>
-      <w:bookmarkStart w:id="86" w:name="_Toc244093824"/>
+      <w:bookmarkStart w:id="86" w:name="_Toc244098265"/>
       <w:r>
         <w:lastRenderedPageBreak/>
         <w:t>Bước 29. Tạo cặp loại trực tiếp</w:t>
@@ -12357,7 +12436,7 @@
           <w:noProof/>
         </w:rPr>
         <w:drawing>
-          <wp:inline distT="0" distB="0" distL="0" distR="0" wp14:anchorId="449A5286" wp14:editId="6F5CB84B">
+          <wp:inline distT="0" distB="0" distL="0" distR="0" wp14:anchorId="283E550D" wp14:editId="7A518D57">
             <wp:extent cx="5040000" cy="5197500"/>
             <wp:effectExtent l="0" t="0" r="0" b="0"/>
             <wp:docPr id="160" name="Picture 160"/>
@@ -12407,10 +12486,10 @@
         <w:pStyle w:val="Heading3"/>
         <w:pageBreakBefore/>
       </w:pPr>
-      <w:bookmarkStart w:id="87" w:name="_Toc244093825"/>
+      <w:bookmarkStart w:id="87" w:name="_Toc244098266"/>
       <w:r>
         <w:lastRenderedPageBreak/>
-        <w:t>Bước 30. Xuất CSV và đăng kết quả</w:t>
+        <w:t>Bước 30. Xuất kết quả trên hub LAN</w:t>
       </w:r>
       <w:bookmarkEnd w:id="87"/>
     </w:p>
@@ -12419,7 +12498,7 @@
         <w:keepNext/>
       </w:pPr>
       <w:r>
-        <w:t>Xuất CSV ở bảng điểm, giữ bản gốc cùng lịch và replay để đối chiếu. Ban tổ chức dùng thiết bị có Internet riêng để đưa kết quả lên web thật và đăng Thông báo; không nối Internet vào router thi. Ảnh là form thông báo trên hub thử, chưa gửi lên web thật.</w:t>
+        <w:t>Trên hub LAN, mở Giải đấu rồi bấm Xuất kết quả lên web. Nhập tên sự kiện, chọn Bảng A và các bảng/cặp cần chuyển theo thứ tự muốn công bố, rồi tải file .json.gz. Chỉ xuất giải đã hoàn tất; giữ file gốc để đối chiếu.</w:t>
       </w:r>
     </w:p>
     <w:p>
@@ -12432,8 +12511,8 @@
           <w:noProof/>
         </w:rPr>
         <w:drawing>
-          <wp:inline distT="0" distB="0" distL="0" distR="0" wp14:anchorId="5316F860" wp14:editId="334360B4">
-            <wp:extent cx="5760000" cy="4135263"/>
+          <wp:inline distT="0" distB="0" distL="0" distR="0" wp14:anchorId="25A83699" wp14:editId="414345F4">
+            <wp:extent cx="5040000" cy="5560258"/>
             <wp:effectExtent l="0" t="0" r="0" b="0"/>
             <wp:docPr id="161" name="Picture 161"/>
             <wp:cNvGraphicFramePr>
@@ -12455,7 +12534,7 @@
                   <pic:spPr>
                     <a:xfrm>
                       <a:off x="0" y="0"/>
-                      <a:ext cx="5760000" cy="4135263"/>
+                      <a:ext cx="5040000" cy="5560258"/>
                     </a:xfrm>
                     <a:prstGeom prst="rect">
                       <a:avLst/>
@@ -12474,13 +12553,83 @@
         <w:jc w:val="center"/>
       </w:pPr>
       <w:r>
-        <w:t>Hình 37. Soạn thông báo kết quả sau khi xuất CSV</w:t>
+        <w:t>Hình 37. Chọn các giải đã hoàn tất để xuất từ hub LAN</w:t>
+      </w:r>
+    </w:p>
+    <w:p>
+      <w:pPr>
+        <w:pStyle w:val="Heading3"/>
+        <w:pageBreakBefore/>
+      </w:pPr>
+      <w:bookmarkStart w:id="88" w:name="_Toc244098267"/>
+      <w:r>
+        <w:lastRenderedPageBreak/>
+        <w:t>Bước 31. Nạp kết quả lên web thật</w:t>
+      </w:r>
+      <w:bookmarkEnd w:id="88"/>
+    </w:p>
+    <w:p>
+      <w:r>
+        <w:t>Trên web thật, BTC mở Giải đấu → Nạp kết quả từ hub LAN, chọn file rồi bấm Kiểm tra &amp; xem trước. Đối chiếu tên, thứ tự giải, số đội, số ván, replay và SHA trước khi bấm Đăng lên web. Khách mở sự kiện ở Kết quả từ hub chung kết để xem bảng điểm và replay; giải nhập chỉ để xem, không có nút điều hành.</w:t>
+      </w:r>
+    </w:p>
+    <w:p>
+      <w:pPr>
+        <w:keepNext/>
+      </w:pPr>
+      <w:r>
+        <w:rPr>
+          <w:noProof/>
+        </w:rPr>
+        <w:drawing>
+          <wp:inline distT="0" distB="0" distL="0" distR="0" wp14:anchorId="4CDF6839" wp14:editId="31AE3098">
+            <wp:extent cx="5040000" cy="4893677"/>
+            <wp:effectExtent l="0" t="0" r="0" b="0"/>
+            <wp:docPr id="163" name="Picture 163"/>
+            <wp:cNvGraphicFramePr>
+              <a:graphicFrameLocks xmlns:a="http://schemas.openxmlformats.org/drawingml/2006/main" noChangeAspect="1"/>
+            </wp:cNvGraphicFramePr>
+            <a:graphic xmlns:a="http://schemas.openxmlformats.org/drawingml/2006/main">
+              <a:graphicData uri="http://schemas.openxmlformats.org/drawingml/2006/picture">
+                <pic:pic xmlns:pic="http://schemas.openxmlformats.org/drawingml/2006/picture">
+                  <pic:nvPicPr>
+                    <pic:cNvPr id="0" name="import.png"/>
+                    <pic:cNvPicPr/>
+                  </pic:nvPicPr>
+                  <pic:blipFill>
+                    <a:blip r:embed="rId48"/>
+                    <a:stretch>
+                      <a:fillRect/>
+                    </a:stretch>
+                  </pic:blipFill>
+                  <pic:spPr>
+                    <a:xfrm>
+                      <a:off x="0" y="0"/>
+                      <a:ext cx="5040000" cy="4893677"/>
+                    </a:xfrm>
+                    <a:prstGeom prst="rect">
+                      <a:avLst/>
+                    </a:prstGeom>
+                  </pic:spPr>
+                </pic:pic>
+              </a:graphicData>
+            </a:graphic>
+          </wp:inline>
+        </w:drawing>
+      </w:r>
+    </w:p>
+    <w:p>
+      <w:pPr>
+        <w:pStyle w:val="Caption"/>
+      </w:pPr>
+      <w:r>
+        <w:t>Hình 38. Xem trước rồi xác nhận nạp kết quả lên web</w:t>
       </w:r>
     </w:p>
     <w:sectPr>
-      <w:headerReference w:type="default" r:id="rId48"/>
-      <w:footerReference w:type="default" r:id="rId49"/>
-      <w:footerReference w:type="first" r:id="rId50"/>
+      <w:headerReference w:type="default" r:id="rId49"/>
+      <w:footerReference w:type="default" r:id="rId50"/>
+      <w:footerReference w:type="first" r:id="rId51"/>
       <w:pgSz w:w="11909" w:h="16834"/>
       <w:pgMar w:top="1037" w:right="1080" w:bottom="936" w:left="1080" w:header="432" w:footer="432" w:gutter="0"/>
       <w:cols w:space="720"/>

</xml_diff>

<commit_message>
Hướng dẫn chung kết tự động và phân hạng
</commit_message>
<xml_diff>
--- a/TAI-LIEU.docx
+++ b/TAI-LIEU.docx
@@ -159,7 +159,7 @@
           <w:r>
             <w:fldChar w:fldCharType="separate"/>
           </w:r>
-          <w:hyperlink w:anchor="_Toc244098207" w:history="1">
+          <w:hyperlink w:anchor="_Toc244101513" w:history="1">
             <w:r>
               <w:rPr>
                 <w:rStyle w:val="Hyperlink"/>
@@ -186,7 +186,7 @@
                 <w:noProof/>
                 <w:webHidden/>
               </w:rPr>
-              <w:instrText xml:space="preserve"> PAGEREF _Toc244098207 \h </w:instrText>
+              <w:instrText xml:space="preserve"> PAGEREF _Toc244101513 \h </w:instrText>
             </w:r>
             <w:r>
               <w:rPr>
@@ -233,7 +233,7 @@
               <w14:ligatures w14:val="standardContextual"/>
             </w:rPr>
           </w:pPr>
-          <w:hyperlink w:anchor="_Toc244098208" w:history="1">
+          <w:hyperlink w:anchor="_Toc244101514" w:history="1">
             <w:r>
               <w:rPr>
                 <w:rStyle w:val="Hyperlink"/>
@@ -260,7 +260,7 @@
                 <w:noProof/>
                 <w:webHidden/>
               </w:rPr>
-              <w:instrText xml:space="preserve"> PAGEREF _Toc244098208 \h </w:instrText>
+              <w:instrText xml:space="preserve"> PAGEREF _Toc244101514 \h </w:instrText>
             </w:r>
             <w:r>
               <w:rPr>
@@ -307,7 +307,7 @@
               <w14:ligatures w14:val="standardContextual"/>
             </w:rPr>
           </w:pPr>
-          <w:hyperlink w:anchor="_Toc244098209" w:history="1">
+          <w:hyperlink w:anchor="_Toc244101515" w:history="1">
             <w:r>
               <w:rPr>
                 <w:rStyle w:val="Hyperlink"/>
@@ -334,7 +334,7 @@
                 <w:noProof/>
                 <w:webHidden/>
               </w:rPr>
-              <w:instrText xml:space="preserve"> PAGEREF _Toc244098209 \h </w:instrText>
+              <w:instrText xml:space="preserve"> PAGEREF _Toc244101515 \h </w:instrText>
             </w:r>
             <w:r>
               <w:rPr>
@@ -381,7 +381,7 @@
               <w14:ligatures w14:val="standardContextual"/>
             </w:rPr>
           </w:pPr>
-          <w:hyperlink w:anchor="_Toc244098210" w:history="1">
+          <w:hyperlink w:anchor="_Toc244101516" w:history="1">
             <w:r>
               <w:rPr>
                 <w:rStyle w:val="Hyperlink"/>
@@ -408,7 +408,7 @@
                 <w:noProof/>
                 <w:webHidden/>
               </w:rPr>
-              <w:instrText xml:space="preserve"> PAGEREF _Toc244098210 \h </w:instrText>
+              <w:instrText xml:space="preserve"> PAGEREF _Toc244101516 \h </w:instrText>
             </w:r>
             <w:r>
               <w:rPr>
@@ -455,7 +455,7 @@
               <w14:ligatures w14:val="standardContextual"/>
             </w:rPr>
           </w:pPr>
-          <w:hyperlink w:anchor="_Toc244098211" w:history="1">
+          <w:hyperlink w:anchor="_Toc244101517" w:history="1">
             <w:r>
               <w:rPr>
                 <w:rStyle w:val="Hyperlink"/>
@@ -482,7 +482,7 @@
                 <w:noProof/>
                 <w:webHidden/>
               </w:rPr>
-              <w:instrText xml:space="preserve"> PAGEREF _Toc244098211 \h </w:instrText>
+              <w:instrText xml:space="preserve"> PAGEREF _Toc244101517 \h </w:instrText>
             </w:r>
             <w:r>
               <w:rPr>
@@ -529,7 +529,7 @@
               <w14:ligatures w14:val="standardContextual"/>
             </w:rPr>
           </w:pPr>
-          <w:hyperlink w:anchor="_Toc244098212" w:history="1">
+          <w:hyperlink w:anchor="_Toc244101518" w:history="1">
             <w:r>
               <w:rPr>
                 <w:rStyle w:val="Hyperlink"/>
@@ -556,7 +556,7 @@
                 <w:noProof/>
                 <w:webHidden/>
               </w:rPr>
-              <w:instrText xml:space="preserve"> PAGEREF _Toc244098212 \h </w:instrText>
+              <w:instrText xml:space="preserve"> PAGEREF _Toc244101518 \h </w:instrText>
             </w:r>
             <w:r>
               <w:rPr>
@@ -603,7 +603,7 @@
               <w14:ligatures w14:val="standardContextual"/>
             </w:rPr>
           </w:pPr>
-          <w:hyperlink w:anchor="_Toc244098213" w:history="1">
+          <w:hyperlink w:anchor="_Toc244101519" w:history="1">
             <w:r>
               <w:rPr>
                 <w:rStyle w:val="Hyperlink"/>
@@ -630,7 +630,7 @@
                 <w:noProof/>
                 <w:webHidden/>
               </w:rPr>
-              <w:instrText xml:space="preserve"> PAGEREF _Toc244098213 \h </w:instrText>
+              <w:instrText xml:space="preserve"> PAGEREF _Toc244101519 \h </w:instrText>
             </w:r>
             <w:r>
               <w:rPr>
@@ -677,7 +677,7 @@
               <w14:ligatures w14:val="standardContextual"/>
             </w:rPr>
           </w:pPr>
-          <w:hyperlink w:anchor="_Toc244098214" w:history="1">
+          <w:hyperlink w:anchor="_Toc244101520" w:history="1">
             <w:r>
               <w:rPr>
                 <w:rStyle w:val="Hyperlink"/>
@@ -704,7 +704,7 @@
                 <w:noProof/>
                 <w:webHidden/>
               </w:rPr>
-              <w:instrText xml:space="preserve"> PAGEREF _Toc244098214 \h </w:instrText>
+              <w:instrText xml:space="preserve"> PAGEREF _Toc244101520 \h </w:instrText>
             </w:r>
             <w:r>
               <w:rPr>
@@ -751,7 +751,7 @@
               <w14:ligatures w14:val="standardContextual"/>
             </w:rPr>
           </w:pPr>
-          <w:hyperlink w:anchor="_Toc244098215" w:history="1">
+          <w:hyperlink w:anchor="_Toc244101521" w:history="1">
             <w:r>
               <w:rPr>
                 <w:rStyle w:val="Hyperlink"/>
@@ -778,7 +778,7 @@
                 <w:noProof/>
                 <w:webHidden/>
               </w:rPr>
-              <w:instrText xml:space="preserve"> PAGEREF _Toc244098215 \h </w:instrText>
+              <w:instrText xml:space="preserve"> PAGEREF _Toc244101521 \h </w:instrText>
             </w:r>
             <w:r>
               <w:rPr>
@@ -825,7 +825,7 @@
               <w14:ligatures w14:val="standardContextual"/>
             </w:rPr>
           </w:pPr>
-          <w:hyperlink w:anchor="_Toc244098216" w:history="1">
+          <w:hyperlink w:anchor="_Toc244101522" w:history="1">
             <w:r>
               <w:rPr>
                 <w:rStyle w:val="Hyperlink"/>
@@ -852,7 +852,7 @@
                 <w:noProof/>
                 <w:webHidden/>
               </w:rPr>
-              <w:instrText xml:space="preserve"> PAGEREF _Toc244098216 \h </w:instrText>
+              <w:instrText xml:space="preserve"> PAGEREF _Toc244101522 \h </w:instrText>
             </w:r>
             <w:r>
               <w:rPr>
@@ -899,7 +899,7 @@
               <w14:ligatures w14:val="standardContextual"/>
             </w:rPr>
           </w:pPr>
-          <w:hyperlink w:anchor="_Toc244098217" w:history="1">
+          <w:hyperlink w:anchor="_Toc244101523" w:history="1">
             <w:r>
               <w:rPr>
                 <w:rStyle w:val="Hyperlink"/>
@@ -926,7 +926,7 @@
                 <w:noProof/>
                 <w:webHidden/>
               </w:rPr>
-              <w:instrText xml:space="preserve"> PAGEREF _Toc244098217 \h </w:instrText>
+              <w:instrText xml:space="preserve"> PAGEREF _Toc244101523 \h </w:instrText>
             </w:r>
             <w:r>
               <w:rPr>
@@ -973,7 +973,7 @@
               <w14:ligatures w14:val="standardContextual"/>
             </w:rPr>
           </w:pPr>
-          <w:hyperlink w:anchor="_Toc244098218" w:history="1">
+          <w:hyperlink w:anchor="_Toc244101524" w:history="1">
             <w:r>
               <w:rPr>
                 <w:rStyle w:val="Hyperlink"/>
@@ -1000,7 +1000,7 @@
                 <w:noProof/>
                 <w:webHidden/>
               </w:rPr>
-              <w:instrText xml:space="preserve"> PAGEREF _Toc244098218 \h </w:instrText>
+              <w:instrText xml:space="preserve"> PAGEREF _Toc244101524 \h </w:instrText>
             </w:r>
             <w:r>
               <w:rPr>
@@ -1047,7 +1047,7 @@
               <w14:ligatures w14:val="standardContextual"/>
             </w:rPr>
           </w:pPr>
-          <w:hyperlink w:anchor="_Toc244098219" w:history="1">
+          <w:hyperlink w:anchor="_Toc244101525" w:history="1">
             <w:r>
               <w:rPr>
                 <w:rStyle w:val="Hyperlink"/>
@@ -1074,7 +1074,7 @@
                 <w:noProof/>
                 <w:webHidden/>
               </w:rPr>
-              <w:instrText xml:space="preserve"> PAGEREF _Toc244098219 \h </w:instrText>
+              <w:instrText xml:space="preserve"> PAGEREF _Toc244101525 \h </w:instrText>
             </w:r>
             <w:r>
               <w:rPr>
@@ -1121,7 +1121,7 @@
               <w14:ligatures w14:val="standardContextual"/>
             </w:rPr>
           </w:pPr>
-          <w:hyperlink w:anchor="_Toc244098220" w:history="1">
+          <w:hyperlink w:anchor="_Toc244101526" w:history="1">
             <w:r>
               <w:rPr>
                 <w:rStyle w:val="Hyperlink"/>
@@ -1148,7 +1148,7 @@
                 <w:noProof/>
                 <w:webHidden/>
               </w:rPr>
-              <w:instrText xml:space="preserve"> PAGEREF _Toc244098220 \h </w:instrText>
+              <w:instrText xml:space="preserve"> PAGEREF _Toc244101526 \h </w:instrText>
             </w:r>
             <w:r>
               <w:rPr>
@@ -1195,7 +1195,7 @@
               <w14:ligatures w14:val="standardContextual"/>
             </w:rPr>
           </w:pPr>
-          <w:hyperlink w:anchor="_Toc244098221" w:history="1">
+          <w:hyperlink w:anchor="_Toc244101527" w:history="1">
             <w:r>
               <w:rPr>
                 <w:rStyle w:val="Hyperlink"/>
@@ -1222,7 +1222,7 @@
                 <w:noProof/>
                 <w:webHidden/>
               </w:rPr>
-              <w:instrText xml:space="preserve"> PAGEREF _Toc244098221 \h </w:instrText>
+              <w:instrText xml:space="preserve"> PAGEREF _Toc244101527 \h </w:instrText>
             </w:r>
             <w:r>
               <w:rPr>
@@ -1269,7 +1269,7 @@
               <w14:ligatures w14:val="standardContextual"/>
             </w:rPr>
           </w:pPr>
-          <w:hyperlink w:anchor="_Toc244098222" w:history="1">
+          <w:hyperlink w:anchor="_Toc244101528" w:history="1">
             <w:r>
               <w:rPr>
                 <w:rStyle w:val="Hyperlink"/>
@@ -1296,7 +1296,7 @@
                 <w:noProof/>
                 <w:webHidden/>
               </w:rPr>
-              <w:instrText xml:space="preserve"> PAGEREF _Toc244098222 \h </w:instrText>
+              <w:instrText xml:space="preserve"> PAGEREF _Toc244101528 \h </w:instrText>
             </w:r>
             <w:r>
               <w:rPr>
@@ -1343,7 +1343,7 @@
               <w14:ligatures w14:val="standardContextual"/>
             </w:rPr>
           </w:pPr>
-          <w:hyperlink w:anchor="_Toc244098223" w:history="1">
+          <w:hyperlink w:anchor="_Toc244101529" w:history="1">
             <w:r>
               <w:rPr>
                 <w:rStyle w:val="Hyperlink"/>
@@ -1370,7 +1370,7 @@
                 <w:noProof/>
                 <w:webHidden/>
               </w:rPr>
-              <w:instrText xml:space="preserve"> PAGEREF _Toc244098223 \h </w:instrText>
+              <w:instrText xml:space="preserve"> PAGEREF _Toc244101529 \h </w:instrText>
             </w:r>
             <w:r>
               <w:rPr>
@@ -1417,7 +1417,7 @@
               <w14:ligatures w14:val="standardContextual"/>
             </w:rPr>
           </w:pPr>
-          <w:hyperlink w:anchor="_Toc244098224" w:history="1">
+          <w:hyperlink w:anchor="_Toc244101530" w:history="1">
             <w:r>
               <w:rPr>
                 <w:rStyle w:val="Hyperlink"/>
@@ -1444,7 +1444,7 @@
                 <w:noProof/>
                 <w:webHidden/>
               </w:rPr>
-              <w:instrText xml:space="preserve"> PAGEREF _Toc244098224 \h </w:instrText>
+              <w:instrText xml:space="preserve"> PAGEREF _Toc244101530 \h </w:instrText>
             </w:r>
             <w:r>
               <w:rPr>
@@ -1491,7 +1491,7 @@
               <w14:ligatures w14:val="standardContextual"/>
             </w:rPr>
           </w:pPr>
-          <w:hyperlink w:anchor="_Toc244098225" w:history="1">
+          <w:hyperlink w:anchor="_Toc244101531" w:history="1">
             <w:r>
               <w:rPr>
                 <w:rStyle w:val="Hyperlink"/>
@@ -1518,7 +1518,7 @@
                 <w:noProof/>
                 <w:webHidden/>
               </w:rPr>
-              <w:instrText xml:space="preserve"> PAGEREF _Toc244098225 \h </w:instrText>
+              <w:instrText xml:space="preserve"> PAGEREF _Toc244101531 \h </w:instrText>
             </w:r>
             <w:r>
               <w:rPr>
@@ -1565,7 +1565,7 @@
               <w14:ligatures w14:val="standardContextual"/>
             </w:rPr>
           </w:pPr>
-          <w:hyperlink w:anchor="_Toc244098226" w:history="1">
+          <w:hyperlink w:anchor="_Toc244101532" w:history="1">
             <w:r>
               <w:rPr>
                 <w:rStyle w:val="Hyperlink"/>
@@ -1592,7 +1592,7 @@
                 <w:noProof/>
                 <w:webHidden/>
               </w:rPr>
-              <w:instrText xml:space="preserve"> PAGEREF _Toc244098226 \h </w:instrText>
+              <w:instrText xml:space="preserve"> PAGEREF _Toc244101532 \h </w:instrText>
             </w:r>
             <w:r>
               <w:rPr>
@@ -1639,7 +1639,7 @@
               <w14:ligatures w14:val="standardContextual"/>
             </w:rPr>
           </w:pPr>
-          <w:hyperlink w:anchor="_Toc244098227" w:history="1">
+          <w:hyperlink w:anchor="_Toc244101533" w:history="1">
             <w:r>
               <w:rPr>
                 <w:rStyle w:val="Hyperlink"/>
@@ -1666,7 +1666,7 @@
                 <w:noProof/>
                 <w:webHidden/>
               </w:rPr>
-              <w:instrText xml:space="preserve"> PAGEREF _Toc244098227 \h </w:instrText>
+              <w:instrText xml:space="preserve"> PAGEREF _Toc244101533 \h </w:instrText>
             </w:r>
             <w:r>
               <w:rPr>
@@ -1713,7 +1713,7 @@
               <w14:ligatures w14:val="standardContextual"/>
             </w:rPr>
           </w:pPr>
-          <w:hyperlink w:anchor="_Toc244098228" w:history="1">
+          <w:hyperlink w:anchor="_Toc244101534" w:history="1">
             <w:r>
               <w:rPr>
                 <w:rStyle w:val="Hyperlink"/>
@@ -1740,7 +1740,7 @@
                 <w:noProof/>
                 <w:webHidden/>
               </w:rPr>
-              <w:instrText xml:space="preserve"> PAGEREF _Toc244098228 \h </w:instrText>
+              <w:instrText xml:space="preserve"> PAGEREF _Toc244101534 \h </w:instrText>
             </w:r>
             <w:r>
               <w:rPr>
@@ -1787,7 +1787,7 @@
               <w14:ligatures w14:val="standardContextual"/>
             </w:rPr>
           </w:pPr>
-          <w:hyperlink w:anchor="_Toc244098229" w:history="1">
+          <w:hyperlink w:anchor="_Toc244101535" w:history="1">
             <w:r>
               <w:rPr>
                 <w:rStyle w:val="Hyperlink"/>
@@ -1814,7 +1814,7 @@
                 <w:noProof/>
                 <w:webHidden/>
               </w:rPr>
-              <w:instrText xml:space="preserve"> PAGEREF _Toc244098229 \h </w:instrText>
+              <w:instrText xml:space="preserve"> PAGEREF _Toc244101535 \h </w:instrText>
             </w:r>
             <w:r>
               <w:rPr>
@@ -1861,7 +1861,7 @@
               <w14:ligatures w14:val="standardContextual"/>
             </w:rPr>
           </w:pPr>
-          <w:hyperlink w:anchor="_Toc244098230" w:history="1">
+          <w:hyperlink w:anchor="_Toc244101536" w:history="1">
             <w:r>
               <w:rPr>
                 <w:rStyle w:val="Hyperlink"/>
@@ -1888,7 +1888,7 @@
                 <w:noProof/>
                 <w:webHidden/>
               </w:rPr>
-              <w:instrText xml:space="preserve"> PAGEREF _Toc244098230 \h </w:instrText>
+              <w:instrText xml:space="preserve"> PAGEREF _Toc244101536 \h </w:instrText>
             </w:r>
             <w:r>
               <w:rPr>
@@ -1935,7 +1935,7 @@
               <w14:ligatures w14:val="standardContextual"/>
             </w:rPr>
           </w:pPr>
-          <w:hyperlink w:anchor="_Toc244098231" w:history="1">
+          <w:hyperlink w:anchor="_Toc244101537" w:history="1">
             <w:r>
               <w:rPr>
                 <w:rStyle w:val="Hyperlink"/>
@@ -1962,7 +1962,7 @@
                 <w:noProof/>
                 <w:webHidden/>
               </w:rPr>
-              <w:instrText xml:space="preserve"> PAGEREF _Toc244098231 \h </w:instrText>
+              <w:instrText xml:space="preserve"> PAGEREF _Toc244101537 \h </w:instrText>
             </w:r>
             <w:r>
               <w:rPr>
@@ -2009,7 +2009,7 @@
               <w14:ligatures w14:val="standardContextual"/>
             </w:rPr>
           </w:pPr>
-          <w:hyperlink w:anchor="_Toc244098232" w:history="1">
+          <w:hyperlink w:anchor="_Toc244101538" w:history="1">
             <w:r>
               <w:rPr>
                 <w:rStyle w:val="Hyperlink"/>
@@ -2036,7 +2036,7 @@
                 <w:noProof/>
                 <w:webHidden/>
               </w:rPr>
-              <w:instrText xml:space="preserve"> PAGEREF _Toc244098232 \h </w:instrText>
+              <w:instrText xml:space="preserve"> PAGEREF _Toc244101538 \h </w:instrText>
             </w:r>
             <w:r>
               <w:rPr>
@@ -2083,7 +2083,7 @@
               <w14:ligatures w14:val="standardContextual"/>
             </w:rPr>
           </w:pPr>
-          <w:hyperlink w:anchor="_Toc244098233" w:history="1">
+          <w:hyperlink w:anchor="_Toc244101539" w:history="1">
             <w:r>
               <w:rPr>
                 <w:rStyle w:val="Hyperlink"/>
@@ -2110,7 +2110,7 @@
                 <w:noProof/>
                 <w:webHidden/>
               </w:rPr>
-              <w:instrText xml:space="preserve"> PAGEREF _Toc244098233 \h </w:instrText>
+              <w:instrText xml:space="preserve"> PAGEREF _Toc244101539 \h </w:instrText>
             </w:r>
             <w:r>
               <w:rPr>
@@ -2157,7 +2157,7 @@
               <w14:ligatures w14:val="standardContextual"/>
             </w:rPr>
           </w:pPr>
-          <w:hyperlink w:anchor="_Toc244098234" w:history="1">
+          <w:hyperlink w:anchor="_Toc244101540" w:history="1">
             <w:r>
               <w:rPr>
                 <w:rStyle w:val="Hyperlink"/>
@@ -2184,7 +2184,7 @@
                 <w:noProof/>
                 <w:webHidden/>
               </w:rPr>
-              <w:instrText xml:space="preserve"> PAGEREF _Toc244098234 \h </w:instrText>
+              <w:instrText xml:space="preserve"> PAGEREF _Toc244101540 \h </w:instrText>
             </w:r>
             <w:r>
               <w:rPr>
@@ -2231,7 +2231,7 @@
               <w14:ligatures w14:val="standardContextual"/>
             </w:rPr>
           </w:pPr>
-          <w:hyperlink w:anchor="_Toc244098235" w:history="1">
+          <w:hyperlink w:anchor="_Toc244101541" w:history="1">
             <w:r>
               <w:rPr>
                 <w:rStyle w:val="Hyperlink"/>
@@ -2258,7 +2258,7 @@
                 <w:noProof/>
                 <w:webHidden/>
               </w:rPr>
-              <w:instrText xml:space="preserve"> PAGEREF _Toc244098235 \h </w:instrText>
+              <w:instrText xml:space="preserve"> PAGEREF _Toc244101541 \h </w:instrText>
             </w:r>
             <w:r>
               <w:rPr>
@@ -2305,7 +2305,7 @@
               <w14:ligatures w14:val="standardContextual"/>
             </w:rPr>
           </w:pPr>
-          <w:hyperlink w:anchor="_Toc244098236" w:history="1">
+          <w:hyperlink w:anchor="_Toc244101542" w:history="1">
             <w:r>
               <w:rPr>
                 <w:rStyle w:val="Hyperlink"/>
@@ -2332,7 +2332,7 @@
                 <w:noProof/>
                 <w:webHidden/>
               </w:rPr>
-              <w:instrText xml:space="preserve"> PAGEREF _Toc244098236 \h </w:instrText>
+              <w:instrText xml:space="preserve"> PAGEREF _Toc244101542 \h </w:instrText>
             </w:r>
             <w:r>
               <w:rPr>
@@ -2379,7 +2379,7 @@
               <w14:ligatures w14:val="standardContextual"/>
             </w:rPr>
           </w:pPr>
-          <w:hyperlink w:anchor="_Toc244098237" w:history="1">
+          <w:hyperlink w:anchor="_Toc244101543" w:history="1">
             <w:r>
               <w:rPr>
                 <w:rStyle w:val="Hyperlink"/>
@@ -2406,7 +2406,7 @@
                 <w:noProof/>
                 <w:webHidden/>
               </w:rPr>
-              <w:instrText xml:space="preserve"> PAGEREF _Toc244098237 \h </w:instrText>
+              <w:instrText xml:space="preserve"> PAGEREF _Toc244101543 \h </w:instrText>
             </w:r>
             <w:r>
               <w:rPr>
@@ -2453,7 +2453,7 @@
               <w14:ligatures w14:val="standardContextual"/>
             </w:rPr>
           </w:pPr>
-          <w:hyperlink w:anchor="_Toc244098238" w:history="1">
+          <w:hyperlink w:anchor="_Toc244101544" w:history="1">
             <w:r>
               <w:rPr>
                 <w:rStyle w:val="Hyperlink"/>
@@ -2480,7 +2480,7 @@
                 <w:noProof/>
                 <w:webHidden/>
               </w:rPr>
-              <w:instrText xml:space="preserve"> PAGEREF _Toc244098238 \h </w:instrText>
+              <w:instrText xml:space="preserve"> PAGEREF _Toc244101544 \h </w:instrText>
             </w:r>
             <w:r>
               <w:rPr>
@@ -2527,7 +2527,7 @@
               <w14:ligatures w14:val="standardContextual"/>
             </w:rPr>
           </w:pPr>
-          <w:hyperlink w:anchor="_Toc244098239" w:history="1">
+          <w:hyperlink w:anchor="_Toc244101545" w:history="1">
             <w:r>
               <w:rPr>
                 <w:rStyle w:val="Hyperlink"/>
@@ -2554,7 +2554,7 @@
                 <w:noProof/>
                 <w:webHidden/>
               </w:rPr>
-              <w:instrText xml:space="preserve"> PAGEREF _Toc244098239 \h </w:instrText>
+              <w:instrText xml:space="preserve"> PAGEREF _Toc244101545 \h </w:instrText>
             </w:r>
             <w:r>
               <w:rPr>
@@ -2601,7 +2601,7 @@
               <w14:ligatures w14:val="standardContextual"/>
             </w:rPr>
           </w:pPr>
-          <w:hyperlink w:anchor="_Toc244098240" w:history="1">
+          <w:hyperlink w:anchor="_Toc244101546" w:history="1">
             <w:r>
               <w:rPr>
                 <w:rStyle w:val="Hyperlink"/>
@@ -2628,7 +2628,7 @@
                 <w:noProof/>
                 <w:webHidden/>
               </w:rPr>
-              <w:instrText xml:space="preserve"> PAGEREF _Toc244098240 \h </w:instrText>
+              <w:instrText xml:space="preserve"> PAGEREF _Toc244101546 \h </w:instrText>
             </w:r>
             <w:r>
               <w:rPr>
@@ -2675,7 +2675,7 @@
               <w14:ligatures w14:val="standardContextual"/>
             </w:rPr>
           </w:pPr>
-          <w:hyperlink w:anchor="_Toc244098241" w:history="1">
+          <w:hyperlink w:anchor="_Toc244101547" w:history="1">
             <w:r>
               <w:rPr>
                 <w:rStyle w:val="Hyperlink"/>
@@ -2702,7 +2702,7 @@
                 <w:noProof/>
                 <w:webHidden/>
               </w:rPr>
-              <w:instrText xml:space="preserve"> PAGEREF _Toc244098241 \h </w:instrText>
+              <w:instrText xml:space="preserve"> PAGEREF _Toc244101547 \h </w:instrText>
             </w:r>
             <w:r>
               <w:rPr>
@@ -2749,7 +2749,7 @@
               <w14:ligatures w14:val="standardContextual"/>
             </w:rPr>
           </w:pPr>
-          <w:hyperlink w:anchor="_Toc244098242" w:history="1">
+          <w:hyperlink w:anchor="_Toc244101548" w:history="1">
             <w:r>
               <w:rPr>
                 <w:rStyle w:val="Hyperlink"/>
@@ -2776,7 +2776,7 @@
                 <w:noProof/>
                 <w:webHidden/>
               </w:rPr>
-              <w:instrText xml:space="preserve"> PAGEREF _Toc244098242 \h </w:instrText>
+              <w:instrText xml:space="preserve"> PAGEREF _Toc244101548 \h </w:instrText>
             </w:r>
             <w:r>
               <w:rPr>
@@ -2823,7 +2823,7 @@
               <w14:ligatures w14:val="standardContextual"/>
             </w:rPr>
           </w:pPr>
-          <w:hyperlink w:anchor="_Toc244098243" w:history="1">
+          <w:hyperlink w:anchor="_Toc244101549" w:history="1">
             <w:r>
               <w:rPr>
                 <w:rStyle w:val="Hyperlink"/>
@@ -2850,7 +2850,7 @@
                 <w:noProof/>
                 <w:webHidden/>
               </w:rPr>
-              <w:instrText xml:space="preserve"> PAGEREF _Toc244098243 \h </w:instrText>
+              <w:instrText xml:space="preserve"> PAGEREF _Toc244101549 \h </w:instrText>
             </w:r>
             <w:r>
               <w:rPr>
@@ -2897,7 +2897,7 @@
               <w14:ligatures w14:val="standardContextual"/>
             </w:rPr>
           </w:pPr>
-          <w:hyperlink w:anchor="_Toc244098244" w:history="1">
+          <w:hyperlink w:anchor="_Toc244101550" w:history="1">
             <w:r>
               <w:rPr>
                 <w:rStyle w:val="Hyperlink"/>
@@ -2924,7 +2924,7 @@
                 <w:noProof/>
                 <w:webHidden/>
               </w:rPr>
-              <w:instrText xml:space="preserve"> PAGEREF _Toc244098244 \h </w:instrText>
+              <w:instrText xml:space="preserve"> PAGEREF _Toc244101550 \h </w:instrText>
             </w:r>
             <w:r>
               <w:rPr>
@@ -2971,7 +2971,7 @@
               <w14:ligatures w14:val="standardContextual"/>
             </w:rPr>
           </w:pPr>
-          <w:hyperlink w:anchor="_Toc244098245" w:history="1">
+          <w:hyperlink w:anchor="_Toc244101551" w:history="1">
             <w:r>
               <w:rPr>
                 <w:rStyle w:val="Hyperlink"/>
@@ -2998,7 +2998,7 @@
                 <w:noProof/>
                 <w:webHidden/>
               </w:rPr>
-              <w:instrText xml:space="preserve"> PAGEREF _Toc244098245 \h </w:instrText>
+              <w:instrText xml:space="preserve"> PAGEREF _Toc244101551 \h </w:instrText>
             </w:r>
             <w:r>
               <w:rPr>
@@ -3045,7 +3045,7 @@
               <w14:ligatures w14:val="standardContextual"/>
             </w:rPr>
           </w:pPr>
-          <w:hyperlink w:anchor="_Toc244098246" w:history="1">
+          <w:hyperlink w:anchor="_Toc244101552" w:history="1">
             <w:r>
               <w:rPr>
                 <w:rStyle w:val="Hyperlink"/>
@@ -3072,7 +3072,7 @@
                 <w:noProof/>
                 <w:webHidden/>
               </w:rPr>
-              <w:instrText xml:space="preserve"> PAGEREF _Toc244098246 \h </w:instrText>
+              <w:instrText xml:space="preserve"> PAGEREF _Toc244101552 \h </w:instrText>
             </w:r>
             <w:r>
               <w:rPr>
@@ -3119,7 +3119,7 @@
               <w14:ligatures w14:val="standardContextual"/>
             </w:rPr>
           </w:pPr>
-          <w:hyperlink w:anchor="_Toc244098247" w:history="1">
+          <w:hyperlink w:anchor="_Toc244101553" w:history="1">
             <w:r>
               <w:rPr>
                 <w:rStyle w:val="Hyperlink"/>
@@ -3146,7 +3146,7 @@
                 <w:noProof/>
                 <w:webHidden/>
               </w:rPr>
-              <w:instrText xml:space="preserve"> PAGEREF _Toc244098247 \h </w:instrText>
+              <w:instrText xml:space="preserve"> PAGEREF _Toc244101553 \h </w:instrText>
             </w:r>
             <w:r>
               <w:rPr>
@@ -3193,7 +3193,7 @@
               <w14:ligatures w14:val="standardContextual"/>
             </w:rPr>
           </w:pPr>
-          <w:hyperlink w:anchor="_Toc244098248" w:history="1">
+          <w:hyperlink w:anchor="_Toc244101554" w:history="1">
             <w:r>
               <w:rPr>
                 <w:rStyle w:val="Hyperlink"/>
@@ -3220,7 +3220,7 @@
                 <w:noProof/>
                 <w:webHidden/>
               </w:rPr>
-              <w:instrText xml:space="preserve"> PAGEREF _Toc244098248 \h </w:instrText>
+              <w:instrText xml:space="preserve"> PAGEREF _Toc244101554 \h </w:instrText>
             </w:r>
             <w:r>
               <w:rPr>
@@ -3267,7 +3267,7 @@
               <w14:ligatures w14:val="standardContextual"/>
             </w:rPr>
           </w:pPr>
-          <w:hyperlink w:anchor="_Toc244098249" w:history="1">
+          <w:hyperlink w:anchor="_Toc244101555" w:history="1">
             <w:r>
               <w:rPr>
                 <w:rStyle w:val="Hyperlink"/>
@@ -3294,7 +3294,7 @@
                 <w:noProof/>
                 <w:webHidden/>
               </w:rPr>
-              <w:instrText xml:space="preserve"> PAGEREF _Toc244098249 \h </w:instrText>
+              <w:instrText xml:space="preserve"> PAGEREF _Toc244101555 \h </w:instrText>
             </w:r>
             <w:r>
               <w:rPr>
@@ -3341,7 +3341,7 @@
               <w14:ligatures w14:val="standardContextual"/>
             </w:rPr>
           </w:pPr>
-          <w:hyperlink w:anchor="_Toc244098250" w:history="1">
+          <w:hyperlink w:anchor="_Toc244101556" w:history="1">
             <w:r>
               <w:rPr>
                 <w:rStyle w:val="Hyperlink"/>
@@ -3368,7 +3368,7 @@
                 <w:noProof/>
                 <w:webHidden/>
               </w:rPr>
-              <w:instrText xml:space="preserve"> PAGEREF _Toc244098250 \h </w:instrText>
+              <w:instrText xml:space="preserve"> PAGEREF _Toc244101556 \h </w:instrText>
             </w:r>
             <w:r>
               <w:rPr>
@@ -3415,7 +3415,7 @@
               <w14:ligatures w14:val="standardContextual"/>
             </w:rPr>
           </w:pPr>
-          <w:hyperlink w:anchor="_Toc244098251" w:history="1">
+          <w:hyperlink w:anchor="_Toc244101557" w:history="1">
             <w:r>
               <w:rPr>
                 <w:rStyle w:val="Hyperlink"/>
@@ -3442,7 +3442,7 @@
                 <w:noProof/>
                 <w:webHidden/>
               </w:rPr>
-              <w:instrText xml:space="preserve"> PAGEREF _Toc244098251 \h </w:instrText>
+              <w:instrText xml:space="preserve"> PAGEREF _Toc244101557 \h </w:instrText>
             </w:r>
             <w:r>
               <w:rPr>
@@ -3489,7 +3489,7 @@
               <w14:ligatures w14:val="standardContextual"/>
             </w:rPr>
           </w:pPr>
-          <w:hyperlink w:anchor="_Toc244098252" w:history="1">
+          <w:hyperlink w:anchor="_Toc244101558" w:history="1">
             <w:r>
               <w:rPr>
                 <w:rStyle w:val="Hyperlink"/>
@@ -3516,7 +3516,7 @@
                 <w:noProof/>
                 <w:webHidden/>
               </w:rPr>
-              <w:instrText xml:space="preserve"> PAGEREF _Toc244098252 \h </w:instrText>
+              <w:instrText xml:space="preserve"> PAGEREF _Toc244101558 \h </w:instrText>
             </w:r>
             <w:r>
               <w:rPr>
@@ -3563,7 +3563,7 @@
               <w14:ligatures w14:val="standardContextual"/>
             </w:rPr>
           </w:pPr>
-          <w:hyperlink w:anchor="_Toc244098253" w:history="1">
+          <w:hyperlink w:anchor="_Toc244101559" w:history="1">
             <w:r>
               <w:rPr>
                 <w:rStyle w:val="Hyperlink"/>
@@ -3590,7 +3590,7 @@
                 <w:noProof/>
                 <w:webHidden/>
               </w:rPr>
-              <w:instrText xml:space="preserve"> PAGEREF _Toc244098253 \h </w:instrText>
+              <w:instrText xml:space="preserve"> PAGEREF _Toc244101559 \h </w:instrText>
             </w:r>
             <w:r>
               <w:rPr>
@@ -3637,7 +3637,7 @@
               <w14:ligatures w14:val="standardContextual"/>
             </w:rPr>
           </w:pPr>
-          <w:hyperlink w:anchor="_Toc244098254" w:history="1">
+          <w:hyperlink w:anchor="_Toc244101560" w:history="1">
             <w:r>
               <w:rPr>
                 <w:rStyle w:val="Hyperlink"/>
@@ -3664,7 +3664,7 @@
                 <w:noProof/>
                 <w:webHidden/>
               </w:rPr>
-              <w:instrText xml:space="preserve"> PAGEREF _Toc244098254 \h </w:instrText>
+              <w:instrText xml:space="preserve"> PAGEREF _Toc244101560 \h </w:instrText>
             </w:r>
             <w:r>
               <w:rPr>
@@ -3711,7 +3711,7 @@
               <w14:ligatures w14:val="standardContextual"/>
             </w:rPr>
           </w:pPr>
-          <w:hyperlink w:anchor="_Toc244098255" w:history="1">
+          <w:hyperlink w:anchor="_Toc244101561" w:history="1">
             <w:r>
               <w:rPr>
                 <w:rStyle w:val="Hyperlink"/>
@@ -3738,7 +3738,7 @@
                 <w:noProof/>
                 <w:webHidden/>
               </w:rPr>
-              <w:instrText xml:space="preserve"> PAGEREF _Toc244098255 \h </w:instrText>
+              <w:instrText xml:space="preserve"> PAGEREF _Toc244101561 \h </w:instrText>
             </w:r>
             <w:r>
               <w:rPr>
@@ -3785,7 +3785,7 @@
               <w14:ligatures w14:val="standardContextual"/>
             </w:rPr>
           </w:pPr>
-          <w:hyperlink w:anchor="_Toc244098256" w:history="1">
+          <w:hyperlink w:anchor="_Toc244101562" w:history="1">
             <w:r>
               <w:rPr>
                 <w:rStyle w:val="Hyperlink"/>
@@ -3812,7 +3812,7 @@
                 <w:noProof/>
                 <w:webHidden/>
               </w:rPr>
-              <w:instrText xml:space="preserve"> PAGEREF _Toc244098256 \h </w:instrText>
+              <w:instrText xml:space="preserve"> PAGEREF _Toc244101562 \h </w:instrText>
             </w:r>
             <w:r>
               <w:rPr>
@@ -3859,7 +3859,7 @@
               <w14:ligatures w14:val="standardContextual"/>
             </w:rPr>
           </w:pPr>
-          <w:hyperlink w:anchor="_Toc244098257" w:history="1">
+          <w:hyperlink w:anchor="_Toc244101563" w:history="1">
             <w:r>
               <w:rPr>
                 <w:rStyle w:val="Hyperlink"/>
@@ -3886,7 +3886,7 @@
                 <w:noProof/>
                 <w:webHidden/>
               </w:rPr>
-              <w:instrText xml:space="preserve"> PAGEREF _Toc244098257 \h </w:instrText>
+              <w:instrText xml:space="preserve"> PAGEREF _Toc244101563 \h </w:instrText>
             </w:r>
             <w:r>
               <w:rPr>
@@ -3933,7 +3933,7 @@
               <w14:ligatures w14:val="standardContextual"/>
             </w:rPr>
           </w:pPr>
-          <w:hyperlink w:anchor="_Toc244098258" w:history="1">
+          <w:hyperlink w:anchor="_Toc244101564" w:history="1">
             <w:r>
               <w:rPr>
                 <w:rStyle w:val="Hyperlink"/>
@@ -3960,7 +3960,7 @@
                 <w:noProof/>
                 <w:webHidden/>
               </w:rPr>
-              <w:instrText xml:space="preserve"> PAGEREF _Toc244098258 \h </w:instrText>
+              <w:instrText xml:space="preserve"> PAGEREF _Toc244101564 \h </w:instrText>
             </w:r>
             <w:r>
               <w:rPr>
@@ -4007,7 +4007,7 @@
               <w14:ligatures w14:val="standardContextual"/>
             </w:rPr>
           </w:pPr>
-          <w:hyperlink w:anchor="_Toc244098259" w:history="1">
+          <w:hyperlink w:anchor="_Toc244101565" w:history="1">
             <w:r>
               <w:rPr>
                 <w:rStyle w:val="Hyperlink"/>
@@ -4034,7 +4034,7 @@
                 <w:noProof/>
                 <w:webHidden/>
               </w:rPr>
-              <w:instrText xml:space="preserve"> PAGEREF _Toc244098259 \h </w:instrText>
+              <w:instrText xml:space="preserve"> PAGEREF _Toc244101565 \h </w:instrText>
             </w:r>
             <w:r>
               <w:rPr>
@@ -4081,7 +4081,7 @@
               <w14:ligatures w14:val="standardContextual"/>
             </w:rPr>
           </w:pPr>
-          <w:hyperlink w:anchor="_Toc244098260" w:history="1">
+          <w:hyperlink w:anchor="_Toc244101566" w:history="1">
             <w:r>
               <w:rPr>
                 <w:rStyle w:val="Hyperlink"/>
@@ -4108,7 +4108,7 @@
                 <w:noProof/>
                 <w:webHidden/>
               </w:rPr>
-              <w:instrText xml:space="preserve"> PAGEREF _Toc244098260 \h </w:instrText>
+              <w:instrText xml:space="preserve"> PAGEREF _Toc244101566 \h </w:instrText>
             </w:r>
             <w:r>
               <w:rPr>
@@ -4155,7 +4155,7 @@
               <w14:ligatures w14:val="standardContextual"/>
             </w:rPr>
           </w:pPr>
-          <w:hyperlink w:anchor="_Toc244098261" w:history="1">
+          <w:hyperlink w:anchor="_Toc244101567" w:history="1">
             <w:r>
               <w:rPr>
                 <w:rStyle w:val="Hyperlink"/>
@@ -4182,7 +4182,7 @@
                 <w:noProof/>
                 <w:webHidden/>
               </w:rPr>
-              <w:instrText xml:space="preserve"> PAGEREF _Toc244098261 \h </w:instrText>
+              <w:instrText xml:space="preserve"> PAGEREF _Toc244101567 \h </w:instrText>
             </w:r>
             <w:r>
               <w:rPr>
@@ -4229,7 +4229,7 @@
               <w14:ligatures w14:val="standardContextual"/>
             </w:rPr>
           </w:pPr>
-          <w:hyperlink w:anchor="_Toc244098262" w:history="1">
+          <w:hyperlink w:anchor="_Toc244101568" w:history="1">
             <w:r>
               <w:rPr>
                 <w:rStyle w:val="Hyperlink"/>
@@ -4256,7 +4256,7 @@
                 <w:noProof/>
                 <w:webHidden/>
               </w:rPr>
-              <w:instrText xml:space="preserve"> PAGEREF _Toc244098262 \h </w:instrText>
+              <w:instrText xml:space="preserve"> PAGEREF _Toc244101568 \h </w:instrText>
             </w:r>
             <w:r>
               <w:rPr>
@@ -4303,13 +4303,13 @@
               <w14:ligatures w14:val="standardContextual"/>
             </w:rPr>
           </w:pPr>
-          <w:hyperlink w:anchor="_Toc244098263" w:history="1">
+          <w:hyperlink w:anchor="_Toc244101569" w:history="1">
             <w:r>
               <w:rPr>
                 <w:rStyle w:val="Hyperlink"/>
                 <w:noProof/>
               </w:rPr>
-              <w:t>Bước 27. Tạo bảng và thêm các đội</w:t>
+              <w:t>Bước 27. BTC tạo chung kết</w:t>
             </w:r>
             <w:r>
               <w:rPr>
@@ -4330,7 +4330,7 @@
                 <w:noProof/>
                 <w:webHidden/>
               </w:rPr>
-              <w:instrText xml:space="preserve"> PAGEREF _Toc244098263 \h </w:instrText>
+              <w:instrText xml:space="preserve"> PAGEREF _Toc244101569 \h </w:instrText>
             </w:r>
             <w:r>
               <w:rPr>
@@ -4377,13 +4377,13 @@
               <w14:ligatures w14:val="standardContextual"/>
             </w:rPr>
           </w:pPr>
-          <w:hyperlink w:anchor="_Toc244098264" w:history="1">
+          <w:hyperlink w:anchor="_Toc244101570" w:history="1">
             <w:r>
               <w:rPr>
                 <w:rStyle w:val="Hyperlink"/>
                 <w:noProof/>
               </w:rPr>
-              <w:t>Bước 28. Chiếu bảng điểm và replay</w:t>
+              <w:t>Bước 28. Theo dõi vòng bảng và replay</w:t>
             </w:r>
             <w:r>
               <w:rPr>
@@ -4404,7 +4404,7 @@
                 <w:noProof/>
                 <w:webHidden/>
               </w:rPr>
-              <w:instrText xml:space="preserve"> PAGEREF _Toc244098264 \h </w:instrText>
+              <w:instrText xml:space="preserve"> PAGEREF _Toc244101570 \h </w:instrText>
             </w:r>
             <w:r>
               <w:rPr>
@@ -4451,13 +4451,13 @@
               <w14:ligatures w14:val="standardContextual"/>
             </w:rPr>
           </w:pPr>
-          <w:hyperlink w:anchor="_Toc244098265" w:history="1">
+          <w:hyperlink w:anchor="_Toc244101571" w:history="1">
             <w:r>
               <w:rPr>
                 <w:rStyle w:val="Hyperlink"/>
                 <w:noProof/>
               </w:rPr>
-              <w:t>Bước 29. Tạo cặp loại trực tiếp</w:t>
+              <w:t>Bước 29. Trang nhánh đấu và màn hình chiếu</w:t>
             </w:r>
             <w:r>
               <w:rPr>
@@ -4478,7 +4478,7 @@
                 <w:noProof/>
                 <w:webHidden/>
               </w:rPr>
-              <w:instrText xml:space="preserve"> PAGEREF _Toc244098265 \h </w:instrText>
+              <w:instrText xml:space="preserve"> PAGEREF _Toc244101571 \h </w:instrText>
             </w:r>
             <w:r>
               <w:rPr>
@@ -4525,7 +4525,7 @@
               <w14:ligatures w14:val="standardContextual"/>
             </w:rPr>
           </w:pPr>
-          <w:hyperlink w:anchor="_Toc244098266" w:history="1">
+          <w:hyperlink w:anchor="_Toc244101572" w:history="1">
             <w:r>
               <w:rPr>
                 <w:rStyle w:val="Hyperlink"/>
@@ -4552,7 +4552,7 @@
                 <w:noProof/>
                 <w:webHidden/>
               </w:rPr>
-              <w:instrText xml:space="preserve"> PAGEREF _Toc244098266 \h </w:instrText>
+              <w:instrText xml:space="preserve"> PAGEREF _Toc244101572 \h </w:instrText>
             </w:r>
             <w:r>
               <w:rPr>
@@ -4599,7 +4599,7 @@
               <w14:ligatures w14:val="standardContextual"/>
             </w:rPr>
           </w:pPr>
-          <w:hyperlink w:anchor="_Toc244098267" w:history="1">
+          <w:hyperlink w:anchor="_Toc244101573" w:history="1">
             <w:r>
               <w:rPr>
                 <w:rStyle w:val="Hyperlink"/>
@@ -4626,7 +4626,7 @@
                 <w:noProof/>
                 <w:webHidden/>
               </w:rPr>
-              <w:instrText xml:space="preserve"> PAGEREF _Toc244098267 \h </w:instrText>
+              <w:instrText xml:space="preserve"> PAGEREF _Toc244101573 \h </w:instrText>
             </w:r>
             <w:r>
               <w:rPr>
@@ -4670,7 +4670,7 @@
         <w:pageBreakBefore/>
       </w:pPr>
       <w:bookmarkStart w:id="0" w:name="mở-đầu"/>
-      <w:bookmarkStart w:id="1" w:name="_Toc244098207"/>
+      <w:bookmarkStart w:id="1" w:name="_Toc244101513"/>
       <w:r>
         <w:lastRenderedPageBreak/>
         <w:t>Mở đầu</w:t>
@@ -4745,7 +4745,7 @@
           <w:noProof/>
         </w:rPr>
         <w:drawing>
-          <wp:inline distT="0" distB="0" distL="0" distR="0" wp14:anchorId="222B0466" wp14:editId="6754929F">
+          <wp:inline distT="0" distB="0" distL="0" distR="0" wp14:anchorId="3133E714" wp14:editId="2F34B2A6">
             <wp:extent cx="5760000" cy="3922758"/>
             <wp:effectExtent l="0" t="0" r="0" b="0"/>
             <wp:docPr id="19" name="Picture" descr="Hình 1 Trang chủ công khai với hai giải demo đã hoàn tất"/>
@@ -4834,7 +4834,7 @@
         <w:pageBreakBefore/>
       </w:pPr>
       <w:bookmarkStart w:id="2" w:name="phần-a-giải-đấu"/>
-      <w:bookmarkStart w:id="3" w:name="_Toc244098208"/>
+      <w:bookmarkStart w:id="3" w:name="_Toc244101514"/>
       <w:bookmarkEnd w:id="0"/>
       <w:r>
         <w:lastRenderedPageBreak/>
@@ -4847,7 +4847,7 @@
         <w:pStyle w:val="Heading2"/>
       </w:pPr>
       <w:bookmarkStart w:id="4" w:name="a1-trò-chơi-ottv2"/>
-      <w:bookmarkStart w:id="5" w:name="_Toc244098209"/>
+      <w:bookmarkStart w:id="5" w:name="_Toc244101515"/>
       <w:r>
         <w:t>1. Trò chơi OTTv2</w:t>
       </w:r>
@@ -5128,7 +5128,7 @@
         <w:pStyle w:val="Heading2"/>
       </w:pPr>
       <w:bookmarkStart w:id="6" w:name="a2-tài-khoản-và-đội"/>
-      <w:bookmarkStart w:id="7" w:name="_Toc244098210"/>
+      <w:bookmarkStart w:id="7" w:name="_Toc244101516"/>
       <w:bookmarkEnd w:id="4"/>
       <w:r>
         <w:t>2. Tài khoản và đội</w:t>
@@ -5447,7 +5447,7 @@
         <w:pStyle w:val="Heading2"/>
       </w:pPr>
       <w:bookmarkStart w:id="8" w:name="a3-nộp-bot-qua-github"/>
-      <w:bookmarkStart w:id="9" w:name="_Toc244098211"/>
+      <w:bookmarkStart w:id="9" w:name="_Toc244101517"/>
       <w:bookmarkEnd w:id="6"/>
       <w:r>
         <w:t>3. Nộp bot qua GitHub</w:t>
@@ -5871,7 +5871,7 @@
         <w:pStyle w:val="Heading2"/>
       </w:pPr>
       <w:bookmarkStart w:id="10" w:name="a4-thể-lệ-và-lịch-đấu"/>
-      <w:bookmarkStart w:id="11" w:name="_Toc244098212"/>
+      <w:bookmarkStart w:id="11" w:name="_Toc244101518"/>
       <w:bookmarkEnd w:id="8"/>
       <w:r>
         <w:t>4. Thể lệ và lịch đấu</w:t>
@@ -5883,7 +5883,7 @@
         <w:pStyle w:val="Heading3"/>
       </w:pPr>
       <w:bookmarkStart w:id="12" w:name="ladder-trước-hạn"/>
-      <w:bookmarkStart w:id="13" w:name="_Toc244098213"/>
+      <w:bookmarkStart w:id="13" w:name="_Toc244101519"/>
       <w:r>
         <w:t>4.1. Ladder trước hạn</w:t>
       </w:r>
@@ -5943,7 +5943,7 @@
         <w:pStyle w:val="Heading3"/>
       </w:pPr>
       <w:bookmarkStart w:id="14" w:name="chốt-bài-tại-hạn"/>
-      <w:bookmarkStart w:id="15" w:name="_Toc244098214"/>
+      <w:bookmarkStart w:id="15" w:name="_Toc244101520"/>
       <w:bookmarkEnd w:id="12"/>
       <w:r>
         <w:lastRenderedPageBreak/>
@@ -5969,7 +5969,7 @@
         <w:pStyle w:val="Heading3"/>
       </w:pPr>
       <w:bookmarkStart w:id="16" w:name="xếp-hạng-chính-thức"/>
-      <w:bookmarkStart w:id="17" w:name="_Toc244098215"/>
+      <w:bookmarkStart w:id="17" w:name="_Toc244101521"/>
       <w:bookmarkEnd w:id="14"/>
       <w:r>
         <w:t>4.3. Xếp hạng chính thức</w:t>
@@ -6320,7 +6320,7 @@
         <w:pStyle w:val="Heading2"/>
       </w:pPr>
       <w:bookmarkStart w:id="18" w:name="a5-xem-kết-quả"/>
-      <w:bookmarkStart w:id="19" w:name="_Toc244098216"/>
+      <w:bookmarkStart w:id="19" w:name="_Toc244101522"/>
       <w:bookmarkEnd w:id="10"/>
       <w:bookmarkEnd w:id="16"/>
       <w:r>
@@ -6344,7 +6344,7 @@
         </w:rPr>
         <w:lastRenderedPageBreak/>
         <w:drawing>
-          <wp:inline distT="0" distB="0" distL="0" distR="0" wp14:anchorId="3289C83C" wp14:editId="6AD383E8">
+          <wp:inline distT="0" distB="0" distL="0" distR="0" wp14:anchorId="13B64F9E" wp14:editId="5419148C">
             <wp:extent cx="5759999" cy="5603684"/>
             <wp:effectExtent l="0" t="0" r="0" b="0"/>
             <wp:docPr id="35" name="Picture" descr="Hình 2 Bảng điểm vòng tròn của giải qua GitHub sau khi hoàn tất 12 ván"/>
@@ -6423,7 +6423,7 @@
         </w:rPr>
         <w:lastRenderedPageBreak/>
         <w:drawing>
-          <wp:inline distT="0" distB="0" distL="0" distR="0" wp14:anchorId="4F783A84" wp14:editId="5269AEB2">
+          <wp:inline distT="0" distB="0" distL="0" distR="0" wp14:anchorId="613628E2" wp14:editId="75CB40C3">
             <wp:extent cx="5579999" cy="7011709"/>
             <wp:effectExtent l="0" t="0" r="0" b="0"/>
             <wp:docPr id="38" name="Picture" descr="Hình 3 Replay một ván đã kết thúc bằng chiếm căn cứ"/>
@@ -6488,7 +6488,7 @@
         <w:pStyle w:val="Heading2"/>
       </w:pPr>
       <w:bookmarkStart w:id="20" w:name="a6-ban-tổ-chức-và-điều-hành"/>
-      <w:bookmarkStart w:id="21" w:name="_Toc244098217"/>
+      <w:bookmarkStart w:id="21" w:name="_Toc244101523"/>
       <w:bookmarkEnd w:id="18"/>
       <w:r>
         <w:t>6. Ban tổ chức và điều hành</w:t>
@@ -6519,7 +6519,7 @@
         </w:rPr>
         <w:lastRenderedPageBreak/>
         <w:drawing>
-          <wp:inline distT="0" distB="0" distL="0" distR="0" wp14:anchorId="3B5FCD36" wp14:editId="655075B2">
+          <wp:inline distT="0" distB="0" distL="0" distR="0" wp14:anchorId="118070CE" wp14:editId="07743AF9">
             <wp:extent cx="5759999" cy="3254999"/>
             <wp:effectExtent l="0" t="0" r="0" b="0"/>
             <wp:docPr id="42" name="Picture" descr="Hình 4 Phần chính của biểu mẫu tạo giải với các giá trị mặc định"/>
@@ -6576,7 +6576,7 @@
         <w:pStyle w:val="BodyText"/>
       </w:pPr>
       <w:r>
-        <w:t>Với Elo, ban tổ chức mở giải trước hạn để hub nhận bài và chạy ladder; sau hạn hệ thống tự khóa và xếp hạng theo điều kiện đã nêu. Với vòng tròn hoặc Swiss nội bộ, đội đăng ký bài đã kiểm đúng cấu hình, ban tổ chức chốt lịch rồi bấm bắt đầu. Hai thể thức dùng thang điểm khác nhau: vòng tròn chính thức của Elo dùng một, nửa, không điểm; giải nội bộ cũ dùng ba, một, không điểm.</w:t>
+        <w:t>Với Elo, ban tổ chức mở giải trước hạn để hub nhận bài và chạy ladder; sau hạn hệ thống tự khóa và xếp hạng theo điều kiện đã nêu. Với vòng tròn hoặc Swiss nội bộ, đội đăng ký bài đã kiểm đúng cấu hình, ban tổ chức chốt lịch rồi bấm bắt đầu. Hai thể thức dùng thang điểm khác nhau: vòng tròn chính thức của Elo dùng một, nửa, không điểm; giải nội bộ cũ dùng ba, một, không điểm. Giải vòng tròn nội bộ xếp theo điểm, điểm đối đầu chỉ tính trong nhóm bằng điểm, rồi tổng số ván thắng; vẫn bằng thì đồng hạng. Hệ số đối đầu được tính một lần trong nhóm bằng điểm ban đầu, không chia nhóm để tính lại. Swiss giữ cách xét Buchholz; vòng tròn chính thức của Elo giữ hệ số Elo cuối cùng đã nêu ở mục 4.3.</w:t>
       </w:r>
     </w:p>
     <w:p>
@@ -6607,7 +6607,7 @@
       <w:pPr>
         <w:pStyle w:val="Heading2"/>
       </w:pPr>
-      <w:bookmarkStart w:id="22" w:name="_Toc244098218"/>
+      <w:bookmarkStart w:id="22" w:name="_Toc244101524"/>
       <w:r>
         <w:t>7. Chung kết tại hội trường</w:t>
       </w:r>
@@ -6620,18 +6620,21 @@
     </w:p>
     <w:p>
       <w:r>
-        <w:t>Buổi sáng, đội sửa bot và tự nạp ZIP lên hub trong hội trường. Hub giữ ba bản nguồn gần nhất mỗi đội. Khi hết giờ, ban tổ chức dùng bản Đạt mới nhất hợp cấu hình giải; bản đang kiểm hoặc Lỗi không thay bản Đạt trước. Ban tổ chức có thể công bố biến thể bằng chức năng luật đã có; nếu không công bố, giữ luật mùa online. Với biến thể, đội chạy kiểm 72 mẫu theo cấu hình giải trước khi chốt.</w:t>
-      </w:r>
-    </w:p>
-    <w:p>
-      <w:r>
-        <w:t>Chia bốn bảng theo thứ hạng online kiểu con rắn: A gồm 1–8–9–16, B gồm 2–7–10–15, C gồm 3–6–11–14, D gồm 4–5–12–13. Mỗi bảng bốn đội đá vòng tròn hai lượt: sáu cặp, 12 ván đổi màu; thắng một điểm, hòa nửa điểm, thua không điểm. Lấy nhất và nhì mỗi bảng vào tứ kết. Bảng điểm của hub giữ đồng hạng khi bằng điểm; trọng tài ghi rõ đội nhất, nhì và hạt giống trước khi tạo các cặp tiếp theo.</w:t>
-      </w:r>
-    </w:p>
-    <w:p>
+        <w:t>Buổi sáng, đội sửa bot và tự nạp ZIP lên hub trong hội trường. Ban tổ chức mở Chung kết, chọn 16 đội và nhập hạng online 1–16 không trùng, rồi chọn thời gian, bộ luật và nền tảng chấm dùng chung. Mặc định là năm phút mỗi bot. Hệ thống kiểm từng đội đã có bản Đạt hợp cấu hình trước khi nhận bản nháp. Nếu công bố biến thể, đội phải kiểm đủ 72 mẫu theo bộ luật đó.</w:t>
+      </w:r>
+    </w:p>
+    <w:p>
+      <w:r>
+        <w:t xml:space="preserve">Khi BTC bấm Bắt đầu vòng bảng, hệ thống ghim bản Đạt mới nhất của mỗi đội tại đúng lúc đó và dùng một bản bot ấy suốt ngày; bản nạp mới hơn về sau không thay bot ở các vòng loại trực tiếp. Hệ thống tự </w:t>
+      </w:r>
       <w:r>
         <w:lastRenderedPageBreak/>
-        <w:t>Tứ kết gồm 1A–2B, 1C–2D, 1B–2A, 1D–2C, rồi bán kết, tranh hạng ba và chung kết. Mỗi cặp là một giải vòng tròn hai đội, hai ván đổi màu. Nếu tổng điểm hòa, đội đứng cao hơn ở vòng bảng đi tiếp; cùng hạng thì xét điểm vòng bảng, rồi thứ hạng online. Trọng tài áp dụng các hệ số này và tạo cặp tiếp theo; hub không tự dựng nhánh loại trực tiếp.</w:t>
+        <w:t>chia bảng theo con rắn: A gồm 1–8–9–16, B gồm 2–7–10–15, C gồm 3–6–11–14, D gồm 4–5–12–13. Mỗi bảng đá vòng tròn hai lượt, 12 ván; thắng một điểm, hòa nửa điểm, thua không điểm. Xếp theo điểm → điểm đối đầu trong nhóm bằng điểm → tổng số ván thắng → hạng online. Hạng online duy nhất giúp chọn rõ nhất, nhì mỗi bảng vào tứ kết.</w:t>
+      </w:r>
+    </w:p>
+    <w:p>
+      <w:r>
+        <w:t>Hệ thống tự tạo tứ kết: TK1 là 1A–2B, TK2 là 1C–2D, TK3 là 1B–2A, TK4 là 1D–2C. BK1 nhận đội thắng TK1 và TK2; BK2 nhận đội thắng TK3 và TK4. Hai đội thắng bán kết vào chung kết, hai đội thua tranh hạng ba. Mỗi cặp vẫn là một giải vòng tròn hai đội, hai ván đổi màu. Hơn điểm thì đi tiếp; hòa điểm xét vị trí vòng bảng tốt hơn, rồi điểm vòng bảng, cuối cùng hạng online. Trang nhánh ghi đội đi tiếp và lý do, có đường mở lịch và replay của từng cặp.</w:t>
       </w:r>
     </w:p>
     <w:p>
@@ -6862,7 +6865,7 @@
     </w:tbl>
     <w:p>
       <w:r>
-        <w:t>Lịch mẫu: 07:30 nhận máy và kiểm mạng; 08:00–11:00 sửa bot, nạp và kiểm bài; 11:00 chốt bản Đạt; 13:00 bắt đầu vòng bảng; khoảng 15:00 chuyển sang loại trực tiếp nếu dùng bốn luồng. Các vòng sau chỉ mở khi đã xác nhận đủ kết quả; dành thêm thời gian dự phòng sự cố, nghỉ và trao giải.</w:t>
+        <w:t>Lịch mẫu: 07:30 nhận máy và kiểm mạng; 08:00–11:00 sửa bot, nạp và kiểm bài; 11:00 chốt bản Đạt; 13:00 bắt đầu vòng bảng; khoảng 15:00 chuyển sang loại trực tiếp nếu dùng bốn luồng. Mặc định hệ thống mở cặp vòng sau khi đủ kết quả nguồn. Nếu bật chờ giữa vòng, các cặp được tạo và chốt nhưng chờ BTC bấm Bắt đầu vòng. Dành thêm thời gian dự phòng sự cố, nghỉ và trao giải. Khi bấm Dừng tự động, hệ thống giữ nguyên các giải con; BTC tiếp tục bằng tay, không sửa đội thắng trên nhánh.</w:t>
       </w:r>
     </w:p>
     <w:tbl>
@@ -7022,7 +7025,7 @@
               <w:keepLines/>
             </w:pPr>
             <w:r>
-              <w:t>Thu điện thoại, theo dõi đội, xác nhận điểm và hệ số hòa, lập cặp loại trực tiếp</w:t>
+              <w:t>Thu điện thoại, theo dõi đội, kiểm điểm và hệ số hòa; giám sát nhánh tự động, điều hành tay khi cần</w:t>
             </w:r>
           </w:p>
         </w:tc>
@@ -7039,7 +7042,7 @@
         <w:pageBreakBefore/>
       </w:pPr>
       <w:bookmarkStart w:id="23" w:name="phần-b-thiết-kế-kỹ-thuật"/>
-      <w:bookmarkStart w:id="24" w:name="_Toc244098219"/>
+      <w:bookmarkStart w:id="24" w:name="_Toc244101525"/>
       <w:bookmarkEnd w:id="2"/>
       <w:bookmarkEnd w:id="20"/>
       <w:r>
@@ -7053,7 +7056,7 @@
         <w:pStyle w:val="Heading2"/>
       </w:pPr>
       <w:bookmarkStart w:id="25" w:name="b1-kiến-trúc-tổng-thể"/>
-      <w:bookmarkStart w:id="26" w:name="_Toc244098220"/>
+      <w:bookmarkStart w:id="26" w:name="_Toc244101526"/>
       <w:r>
         <w:t>1. Kiến trúc tổng thể</w:t>
       </w:r>
@@ -7074,7 +7077,7 @@
           <w:noProof/>
         </w:rPr>
         <w:drawing>
-          <wp:inline distT="0" distB="0" distL="0" distR="0" wp14:anchorId="5AC008C7" wp14:editId="141D8F57">
+          <wp:inline distT="0" distB="0" distL="0" distR="0" wp14:anchorId="11071569" wp14:editId="57CD2466">
             <wp:extent cx="5759999" cy="3702857"/>
             <wp:effectExtent l="0" t="0" r="0" b="0"/>
             <wp:docPr id="47" name="Picture" descr="Hình 5 Kiến trúc triển khai; các mũi tên biểu diễn kết nối hoặc yêu cầu giữa các thành phần"/>
@@ -7155,7 +7158,7 @@
         <w:pStyle w:val="Heading2"/>
       </w:pPr>
       <w:bookmarkStart w:id="27" w:name="b2-dịch-vụ-được-dùng"/>
-      <w:bookmarkStart w:id="28" w:name="_Toc244098221"/>
+      <w:bookmarkStart w:id="28" w:name="_Toc244101527"/>
       <w:bookmarkEnd w:id="25"/>
       <w:r>
         <w:lastRenderedPageBreak/>
@@ -7487,7 +7490,7 @@
         <w:pStyle w:val="Heading2"/>
       </w:pPr>
       <w:bookmarkStart w:id="29" w:name="b3-hub-và-cách-phục-vụ-dữ-liệu"/>
-      <w:bookmarkStart w:id="30" w:name="_Toc244098222"/>
+      <w:bookmarkStart w:id="30" w:name="_Toc244101528"/>
       <w:bookmarkEnd w:id="27"/>
       <w:r>
         <w:t>3. Hub và cách phục vụ dữ liệu</w:t>
@@ -7566,7 +7569,7 @@
         <w:pStyle w:val="Heading2"/>
       </w:pPr>
       <w:bookmarkStart w:id="31" w:name="b4-máy-chấm-và-chia-việc"/>
-      <w:bookmarkStart w:id="32" w:name="_Toc244098223"/>
+      <w:bookmarkStart w:id="32" w:name="_Toc244101529"/>
       <w:bookmarkEnd w:id="29"/>
       <w:r>
         <w:t>4. Máy chấm và chia việc</w:t>
@@ -7608,7 +7611,7 @@
           <w:noProof/>
         </w:rPr>
         <w:drawing>
-          <wp:inline distT="0" distB="0" distL="0" distR="0" wp14:anchorId="4D10B64D" wp14:editId="152E7C92">
+          <wp:inline distT="0" distB="0" distL="0" distR="0" wp14:anchorId="73FA534A" wp14:editId="655A2FD9">
             <wp:extent cx="5759999" cy="3543157"/>
             <wp:effectExtent l="0" t="0" r="0" b="0"/>
             <wp:docPr id="53" name="Picture" descr="Hình 6 Trang quản lý máy chấm trên web thật; tên máy được che, trạng thái phản ánh thời điểm chụp"/>
@@ -7689,7 +7692,7 @@
         <w:pStyle w:val="Heading2"/>
       </w:pPr>
       <w:bookmarkStart w:id="33" w:name="b5-sandbox-thay-docker"/>
-      <w:bookmarkStart w:id="34" w:name="_Toc244098224"/>
+      <w:bookmarkStart w:id="34" w:name="_Toc244101530"/>
       <w:bookmarkEnd w:id="31"/>
       <w:r>
         <w:t>5. Sandbox chạy bot</w:t>
@@ -7731,7 +7734,7 @@
         <w:pStyle w:val="Heading2"/>
       </w:pPr>
       <w:bookmarkStart w:id="35" w:name="b6-quỹ-giờ-và-khả-năng-đối-chiếu"/>
-      <w:bookmarkStart w:id="36" w:name="_Toc244098225"/>
+      <w:bookmarkStart w:id="36" w:name="_Toc244101531"/>
       <w:bookmarkEnd w:id="33"/>
       <w:r>
         <w:t>6. Quỹ giờ và khả năng đối chiếu</w:t>
@@ -7780,7 +7783,7 @@
         <w:pStyle w:val="Heading2"/>
       </w:pPr>
       <w:bookmarkStart w:id="37" w:name="b7-chịu-lỗi-và-sao-lưu"/>
-      <w:bookmarkStart w:id="38" w:name="_Toc244098226"/>
+      <w:bookmarkStart w:id="38" w:name="_Toc244101532"/>
       <w:bookmarkEnd w:id="35"/>
       <w:r>
         <w:t>7. Chịu lỗi và sao lưu</w:t>
@@ -8165,7 +8168,7 @@
         <w:pStyle w:val="Heading2"/>
       </w:pPr>
       <w:bookmarkStart w:id="39" w:name="b8-bảo-mật"/>
-      <w:bookmarkStart w:id="40" w:name="_Toc244098227"/>
+      <w:bookmarkStart w:id="40" w:name="_Toc244101533"/>
       <w:bookmarkEnd w:id="37"/>
       <w:r>
         <w:t>8. Bảo mật</w:t>
@@ -8223,7 +8226,7 @@
         <w:pStyle w:val="Heading2"/>
       </w:pPr>
       <w:bookmarkStart w:id="41" w:name="b9-sức-tải-và-thời-gian-đã-đo"/>
-      <w:bookmarkStart w:id="42" w:name="_Toc244098228"/>
+      <w:bookmarkStart w:id="42" w:name="_Toc244101534"/>
       <w:bookmarkEnd w:id="39"/>
       <w:r>
         <w:t>9. Sức tải và thời gian đã đo</w:t>
@@ -9407,7 +9410,7 @@
       <w:pPr>
         <w:pStyle w:val="Heading2"/>
       </w:pPr>
-      <w:bookmarkStart w:id="43" w:name="_Toc244098229"/>
+      <w:bookmarkStart w:id="43" w:name="_Toc244101535"/>
       <w:bookmarkEnd w:id="41"/>
       <w:r>
         <w:t>10. Cài đặt và vận hành</w:t>
@@ -9521,7 +9524,7 @@
       <w:pPr>
         <w:pStyle w:val="Heading2"/>
       </w:pPr>
-      <w:bookmarkStart w:id="44" w:name="_Toc244098230"/>
+      <w:bookmarkStart w:id="44" w:name="_Toc244101536"/>
       <w:r>
         <w:t>11. Mạng LAN ngày chung kết</w:t>
       </w:r>
@@ -9530,6 +9533,11 @@
     <w:p>
       <w:r>
         <w:t>Router trong hội trường không cắm dây Internet; thêm switch nếu cần nhiều cổng. Hub, máy chấm, máy thi và laptop chiếu cùng nối mạng riêng. Hub phát giao diện, snapshot, nhận ZIP và giao việc ngay trong mạng này; không cần tên miền, Cloudflare hay GitHub. Máy chấm vẫn có mã riêng, thu hồi được. Mạng này dành cho thi có giám sát; HTTP chỉ dùng trên IPv4 riêng, không dùng thay HTTPS cho web công khai.</w:t>
+      </w:r>
+    </w:p>
+    <w:p>
+      <w:r>
+        <w:t>Mỗi bảng và cặp vẫn dùng bộ chạy giải vòng tròn đã có; lớp điều phối chỉ tạo, ghim bot, chốt và mở vòng theo kết quả. Mỗi bước có khóa cố định lưu trong DB nên tick lặp hoặc hub khởi động lại không tạo giải trùng. Cặp có ván cần xử lý hoặc bị tạm dừng thì nhánh chờ tới khi giải con hoàn tất. Nút Dừng tự động giữ các giải con để BTC tiếp tục bằng tay. Màn hình chiếu đọc snapshot ba giây một lần, vừa khung 1920×1080; điện thoại xếp các vòng theo chiều dọc.</w:t>
       </w:r>
     </w:p>
     <w:p>
@@ -9542,7 +9550,7 @@
           <w:noProof/>
         </w:rPr>
         <w:drawing>
-          <wp:inline distT="0" distB="0" distL="0" distR="0" wp14:anchorId="336DA34A" wp14:editId="101E14D8">
+          <wp:inline distT="0" distB="0" distL="0" distR="0" wp14:anchorId="4FEA7C4F" wp14:editId="71AFD2CA">
             <wp:extent cx="5760000" cy="2720000"/>
             <wp:effectExtent l="0" t="0" r="0" b="0"/>
             <wp:docPr id="155" name="Picture 155"/>
@@ -9593,7 +9601,11 @@
       </w:r>
     </w:p>
     <w:p>
-      <w:r>
+      <w:pPr>
+        <w:keepNext/>
+      </w:pPr>
+      <w:r>
+        <w:lastRenderedPageBreak/>
         <w:t>Ví dụ sau dùng IP minh họa của hub trong hội trường; thay bằng IP và cổng đã chốt:</w:t>
       </w:r>
     </w:p>
@@ -9616,7 +9628,6 @@
     </w:p>
     <w:p>
       <w:r>
-        <w:lastRenderedPageBreak/>
         <w:t>Nếu hub là Windows 11 với WSL2, dùng Ubuntu 24.04, đặt networkingMode=mirrored trong phần [wsl2] của .wslconfig, khởi động lại WSL rồi mở cổng đã chọn trên Windows Firewall bằng tài khoản quản trị. Nếu Hyper-V Firewall đang chặn WSL, cũng cho phép cổng đó tới WSL. Chọn IP LAN của máy Windows làm origin và thử từ một máy thi khác. Việc đổi cấu hình mạng cần người vận hành thực hiện trước; không coi thử trên cùng PC là đã kiểm nhiều máy.</w:t>
       </w:r>
     </w:p>
@@ -9627,7 +9638,7 @@
     </w:p>
     <w:p>
       <w:r>
-        <w:t>Trước ngày thi, nhóm cần diễn tập với router đã rút Internet, laptop hub, một PC và một laptop làm máy chấm, hai máy đóng vai đội: kiểm máy đội không vào Internet; đội nạp ZIP và Đạt 72 mẫu; chạy một bảng mini và một cặp loại trực tiếp; laptop chiếu mở replay và livestream thử qua 4G; rút điện một máy chấm giữa ván để kiểm nhận việc lại; xuất file kết quả, nạp lên web thật và mở một replay trên web thật. Ghi thời gian thật, người trực và cách phục hồi để cập nhật lịch ngày thi.</w:t>
+        <w:t>Trước ngày thi, nhóm cần diễn tập với router đã rút Internet, laptop hub, một PC và một laptop làm máy chấm, hai máy đóng vai đội: kiểm máy đội không vào Internet; đội nạp ZIP và Đạt 72 mẫu; tạo một chung kết 16 đội (hai đội là máy thật, 14 đội BTC nạp bot mẫu), chạy hết vòng bảng và ít nhất tứ kết; laptop chiếu mở replay và livestream thử qua 4G; rút điện một máy chấm giữa ván để kiểm nhận việc lại; xuất file kết quả, nạp lên web thật và mở một replay trên web thật. Ghi thời gian thật, người trực và cách phục hồi để cập nhật lịch ngày thi.</w:t>
       </w:r>
     </w:p>
     <w:p>
@@ -9640,7 +9651,7 @@
         <w:pStyle w:val="Heading2"/>
         <w:pageBreakBefore/>
       </w:pPr>
-      <w:bookmarkStart w:id="45" w:name="_Toc244098231"/>
+      <w:bookmarkStart w:id="45" w:name="_Toc244101537"/>
       <w:r>
         <w:lastRenderedPageBreak/>
         <w:t>12. Giới hạn và hướng tiếp</w:t>
@@ -9725,7 +9736,7 @@
     </w:p>
     <w:p>
       <w:r>
-        <w:t>Chế độ LAN đã thử trên một PC: trình duyệt và máy chấm Windows kết nối hub trong WSL qua IPv4 riêng, bốn đội tự nạp ZIP và Đạt đủ 72 mẫu, bảng bốn đội hoàn tất 12 ván, cặp hai đội hoàn tất hai ván, xuất được CSV. Chưa diễn tập nhiều máy khi router không có Internet; nhóm cần làm danh sách ở mục 11 phần B. Kết quả LAN đã có đường xuất/nạp một chiều bằng file công khai, gồm bảng điểm, các cặp và replay; không chuyển tài khoản, mã bot hoặc DB.</w:t>
+        <w:t>Chế độ LAN đã thử trên một PC: trình duyệt và máy chấm Windows kết nối hub trong WSL qua IPv4 riêng. Ngoài lượt thử bốn đội, một chung kết 16 bot mẫu đã kiểm đủ 72 mẫu mỗi đội và tự chạy đủ 64 ván trên hai slot Windows: 48 ván bảng, 16 ván loại trực tiếp. Cả 12 giải con và 64 replay được xuất rồi nạp vào hub chế độ thường local qua nginx, xem lại được nhánh và replay. Chưa diễn tập nhiều máy khi router không có Internet; nhóm cần làm danh sách ở mục 11 phần B. Chuyển kết quả chỉ là một chiều, không chuyển tài khoản, mã bot hoặc DB.</w:t>
       </w:r>
     </w:p>
     <w:p>
@@ -9734,7 +9745,7 @@
         <w:pageBreakBefore/>
       </w:pPr>
       <w:bookmarkStart w:id="46" w:name="phần-c-hướng-dẫn-demo-từng-bước"/>
-      <w:bookmarkStart w:id="47" w:name="_Toc244098232"/>
+      <w:bookmarkStart w:id="47" w:name="_Toc244101538"/>
       <w:bookmarkEnd w:id="23"/>
       <w:r>
         <w:lastRenderedPageBreak/>
@@ -9752,7 +9763,7 @@
         <w:pStyle w:val="Heading2"/>
       </w:pPr>
       <w:bookmarkStart w:id="48" w:name="c1-khách-xem-giải"/>
-      <w:bookmarkStart w:id="49" w:name="_Toc244098233"/>
+      <w:bookmarkStart w:id="49" w:name="_Toc244101539"/>
       <w:r>
         <w:t>1. Khách xem giải</w:t>
       </w:r>
@@ -9763,7 +9774,7 @@
         <w:pStyle w:val="Heading3"/>
       </w:pPr>
       <w:bookmarkStart w:id="50" w:name="bước-1-mở-giải-công-khai"/>
-      <w:bookmarkStart w:id="51" w:name="_Toc244098234"/>
+      <w:bookmarkStart w:id="51" w:name="_Toc244101540"/>
       <w:r>
         <w:t>Bước 1. Mở giải công khai</w:t>
       </w:r>
@@ -9794,7 +9805,7 @@
           <w:noProof/>
         </w:rPr>
         <w:drawing>
-          <wp:inline distT="0" distB="0" distL="0" distR="0" wp14:anchorId="6D125677" wp14:editId="738C15AE">
+          <wp:inline distT="0" distB="0" distL="0" distR="0" wp14:anchorId="01368566" wp14:editId="23A850D4">
             <wp:extent cx="5760000" cy="3922758"/>
             <wp:effectExtent l="0" t="0" r="0" b="0"/>
             <wp:docPr id="65" name="Picture" descr="Hình 7 Mở giải công khai"/>
@@ -9851,7 +9862,7 @@
         <w:pStyle w:val="Heading3"/>
       </w:pPr>
       <w:bookmarkStart w:id="52" w:name="bước-2-xem-bảng-điểm-và-ma-trận"/>
-      <w:bookmarkStart w:id="53" w:name="_Toc244098235"/>
+      <w:bookmarkStart w:id="53" w:name="_Toc244101541"/>
       <w:bookmarkEnd w:id="50"/>
       <w:r>
         <w:t>Bước 2. Xem bảng điểm và ma trận</w:t>
@@ -9904,7 +9915,7 @@
         </w:rPr>
         <w:lastRenderedPageBreak/>
         <w:drawing>
-          <wp:inline distT="0" distB="0" distL="0" distR="0" wp14:anchorId="60289731" wp14:editId="103D0AB2">
+          <wp:inline distT="0" distB="0" distL="0" distR="0" wp14:anchorId="0B31A664" wp14:editId="0AC91359">
             <wp:extent cx="2664303" cy="2592000"/>
             <wp:effectExtent l="0" t="0" r="0" b="0"/>
             <wp:docPr id="69" name="Picture" descr="Hình 8 Xem bảng điểm và ma trận"/>
@@ -9962,7 +9973,7 @@
         <w:pageBreakBefore/>
       </w:pPr>
       <w:bookmarkStart w:id="54" w:name="bước-3-xem-lại-từng-nước"/>
-      <w:bookmarkStart w:id="55" w:name="_Toc244098236"/>
+      <w:bookmarkStart w:id="55" w:name="_Toc244101542"/>
       <w:bookmarkEnd w:id="52"/>
       <w:r>
         <w:lastRenderedPageBreak/>
@@ -9985,7 +9996,7 @@
           <w:noProof/>
         </w:rPr>
         <w:drawing>
-          <wp:inline distT="0" distB="0" distL="0" distR="0" wp14:anchorId="10D0049E" wp14:editId="174DCC7C">
+          <wp:inline distT="0" distB="0" distL="0" distR="0" wp14:anchorId="5EF80453" wp14:editId="6BCAD52E">
             <wp:extent cx="4297381" cy="5399998"/>
             <wp:effectExtent l="0" t="0" r="0" b="0"/>
             <wp:docPr id="73" name="Picture" descr="Hình 9 Xem lại từng nước"/>
@@ -10043,7 +10054,7 @@
         <w:pageBreakBefore/>
       </w:pPr>
       <w:bookmarkStart w:id="56" w:name="c2-thí-sinh-đăng-ký-và-nộp-bot"/>
-      <w:bookmarkStart w:id="57" w:name="_Toc244098237"/>
+      <w:bookmarkStart w:id="57" w:name="_Toc244101543"/>
       <w:bookmarkEnd w:id="48"/>
       <w:bookmarkEnd w:id="54"/>
       <w:r>
@@ -10056,7 +10067,7 @@
       <w:pPr>
         <w:pStyle w:val="Heading3"/>
       </w:pPr>
-      <w:bookmarkStart w:id="58" w:name="_Toc244098238"/>
+      <w:bookmarkStart w:id="58" w:name="_Toc244101544"/>
       <w:r>
         <w:t>Bước 4. Đăng ký bằng email trường</w:t>
       </w:r>
@@ -10100,7 +10111,7 @@
           <w:noProof/>
         </w:rPr>
         <w:drawing>
-          <wp:inline distT="0" distB="0" distL="0" distR="0" wp14:anchorId="1EAA7589" wp14:editId="0C6BBCFF">
+          <wp:inline distT="0" distB="0" distL="0" distR="0" wp14:anchorId="5F6132F4" wp14:editId="2EECB48D">
             <wp:extent cx="3960000" cy="3160235"/>
             <wp:effectExtent l="0" t="0" r="0" b="0"/>
             <wp:docPr id="78" name="Picture" descr="Hình 10 Đăng ký bằng email trường"/>
@@ -10157,7 +10168,7 @@
         <w:pStyle w:val="Heading3"/>
         <w:pageBreakBefore/>
       </w:pPr>
-      <w:bookmarkStart w:id="59" w:name="_Toc244098239"/>
+      <w:bookmarkStart w:id="59" w:name="_Toc244101545"/>
       <w:r>
         <w:lastRenderedPageBreak/>
         <w:t>Bước 5. Mở email lấy mã</w:t>
@@ -10183,7 +10194,7 @@
           <w:noProof/>
         </w:rPr>
         <w:drawing>
-          <wp:inline distT="0" distB="0" distL="0" distR="0" wp14:anchorId="1C3E4D45" wp14:editId="1D27003F">
+          <wp:inline distT="0" distB="0" distL="0" distR="0" wp14:anchorId="49D74D01" wp14:editId="63B1F9A6">
             <wp:extent cx="5760000" cy="2531025"/>
             <wp:effectExtent l="0" t="0" r="0" b="0"/>
             <wp:docPr id="153" name="Picture" descr="Hình 11 Email chứa mã xác minh"/>
@@ -10240,7 +10251,7 @@
         <w:pStyle w:val="Heading3"/>
         <w:pageBreakBefore/>
       </w:pPr>
-      <w:bookmarkStart w:id="60" w:name="_Toc244098240"/>
+      <w:bookmarkStart w:id="60" w:name="_Toc244101546"/>
       <w:r>
         <w:lastRenderedPageBreak/>
         <w:t>Bước 6. Xác minh email</w:t>
@@ -10275,7 +10286,7 @@
           <w:noProof/>
         </w:rPr>
         <w:drawing>
-          <wp:inline distT="0" distB="0" distL="0" distR="0" wp14:anchorId="7C4142DB" wp14:editId="6EAEC0D2">
+          <wp:inline distT="0" distB="0" distL="0" distR="0" wp14:anchorId="3DC350C9" wp14:editId="08FF160D">
             <wp:extent cx="3960000" cy="4356000"/>
             <wp:effectExtent l="0" t="0" r="0" b="0"/>
             <wp:docPr id="82" name="Picture" descr="Hình 11 Xác minh email"/>
@@ -10332,7 +10343,7 @@
         <w:pStyle w:val="Heading3"/>
         <w:pageBreakBefore/>
       </w:pPr>
-      <w:bookmarkStart w:id="61" w:name="_Toc244098241"/>
+      <w:bookmarkStart w:id="61" w:name="_Toc244101547"/>
       <w:r>
         <w:lastRenderedPageBreak/>
         <w:t>Bước 7. Đặt mật khẩu và đăng nhập</w:t>
@@ -10367,7 +10378,7 @@
           <w:noProof/>
         </w:rPr>
         <w:drawing>
-          <wp:inline distT="0" distB="0" distL="0" distR="0" wp14:anchorId="41281C78" wp14:editId="3AD8FBE4">
+          <wp:inline distT="0" distB="0" distL="0" distR="0" wp14:anchorId="3CFD9AD5" wp14:editId="6829BA5D">
             <wp:extent cx="3960000" cy="5023764"/>
             <wp:effectExtent l="0" t="0" r="0" b="0"/>
             <wp:docPr id="86" name="Picture" descr="Hình 12 Đặt mật khẩu và đăng nhập"/>
@@ -10423,7 +10434,7 @@
       <w:pPr>
         <w:pStyle w:val="Heading3"/>
       </w:pPr>
-      <w:bookmarkStart w:id="62" w:name="_Toc244098242"/>
+      <w:bookmarkStart w:id="62" w:name="_Toc244101548"/>
       <w:r>
         <w:t>Bước 8. Tạo đội</w:t>
       </w:r>
@@ -10464,7 +10475,7 @@
           <w:noProof/>
         </w:rPr>
         <w:drawing>
-          <wp:inline distT="0" distB="0" distL="0" distR="0" wp14:anchorId="31441A91" wp14:editId="1CBC041F">
+          <wp:inline distT="0" distB="0" distL="0" distR="0" wp14:anchorId="23DF6B96" wp14:editId="4D2F1F40">
             <wp:extent cx="5012628" cy="2592000"/>
             <wp:effectExtent l="0" t="0" r="0" b="0"/>
             <wp:docPr id="90" name="Picture" descr="Hình 13 Tạo đội"/>
@@ -10521,7 +10532,7 @@
         <w:pStyle w:val="Heading3"/>
         <w:pageBreakBefore/>
       </w:pPr>
-      <w:bookmarkStart w:id="63" w:name="_Toc244098243"/>
+      <w:bookmarkStart w:id="63" w:name="_Toc244101549"/>
       <w:r>
         <w:lastRenderedPageBreak/>
         <w:t>Bước 9. Mời các thành viên</w:t>
@@ -10553,7 +10564,7 @@
           <w:noProof/>
         </w:rPr>
         <w:drawing>
-          <wp:inline distT="0" distB="0" distL="0" distR="0" wp14:anchorId="73F6CBC3" wp14:editId="5DF3E203">
+          <wp:inline distT="0" distB="0" distL="0" distR="0" wp14:anchorId="23CEB836" wp14:editId="4C7DC0EA">
             <wp:extent cx="4187916" cy="2592000"/>
             <wp:effectExtent l="0" t="0" r="0" b="0"/>
             <wp:docPr id="94" name="Picture" descr="Hình 14 Mời các thành viên"/>
@@ -10609,7 +10620,7 @@
       <w:pPr>
         <w:pStyle w:val="Heading3"/>
       </w:pPr>
-      <w:bookmarkStart w:id="64" w:name="_Toc244098244"/>
+      <w:bookmarkStart w:id="64" w:name="_Toc244101550"/>
       <w:r>
         <w:t>Bước 10. Vào đội bằng mã mời</w:t>
       </w:r>
@@ -10640,7 +10651,7 @@
           <w:noProof/>
         </w:rPr>
         <w:drawing>
-          <wp:inline distT="0" distB="0" distL="0" distR="0" wp14:anchorId="703275C3" wp14:editId="5ADCB086">
+          <wp:inline distT="0" distB="0" distL="0" distR="0" wp14:anchorId="0F5EADEC" wp14:editId="3E42F334">
             <wp:extent cx="5012628" cy="2592000"/>
             <wp:effectExtent l="0" t="0" r="0" b="0"/>
             <wp:docPr id="98" name="Picture" descr="Hình 15 Vào đội bằng mã mời"/>
@@ -10697,7 +10708,7 @@
         <w:pStyle w:val="Heading3"/>
         <w:pageBreakBefore/>
       </w:pPr>
-      <w:bookmarkStart w:id="65" w:name="_Toc244098245"/>
+      <w:bookmarkStart w:id="65" w:name="_Toc244101551"/>
       <w:r>
         <w:lastRenderedPageBreak/>
         <w:t>Bước 11. Tạo repo từ mẫu</w:t>
@@ -10729,7 +10740,7 @@
           <w:noProof/>
         </w:rPr>
         <w:drawing>
-          <wp:inline distT="0" distB="0" distL="0" distR="0" wp14:anchorId="5F6CFA17" wp14:editId="72C33665">
+          <wp:inline distT="0" distB="0" distL="0" distR="0" wp14:anchorId="2978DBC6" wp14:editId="1C93F228">
             <wp:extent cx="5682461" cy="2592000"/>
             <wp:effectExtent l="0" t="0" r="0" b="0"/>
             <wp:docPr id="102" name="Picture" descr="Hình 16 Tạo repo từ mẫu"/>
@@ -10785,7 +10796,7 @@
       <w:pPr>
         <w:pStyle w:val="Heading3"/>
       </w:pPr>
-      <w:bookmarkStart w:id="66" w:name="_Toc244098246"/>
+      <w:bookmarkStart w:id="66" w:name="_Toc244101552"/>
       <w:r>
         <w:t>Bước 12. Cho App truy cập đúng repo</w:t>
       </w:r>
@@ -10826,7 +10837,7 @@
           <w:noProof/>
         </w:rPr>
         <w:drawing>
-          <wp:inline distT="0" distB="0" distL="0" distR="0" wp14:anchorId="460AAC10" wp14:editId="2277C6E5">
+          <wp:inline distT="0" distB="0" distL="0" distR="0" wp14:anchorId="72BD96FC" wp14:editId="6E563310">
             <wp:extent cx="5759999" cy="1755999"/>
             <wp:effectExtent l="0" t="0" r="0" b="0"/>
             <wp:docPr id="106" name="Picture" descr="Hình 17 Cho App truy cập đúng repo"/>
@@ -10883,7 +10894,7 @@
         <w:pStyle w:val="Heading3"/>
         <w:pageBreakBefore/>
       </w:pPr>
-      <w:bookmarkStart w:id="67" w:name="_Toc244098247"/>
+      <w:bookmarkStart w:id="67" w:name="_Toc244101553"/>
       <w:r>
         <w:lastRenderedPageBreak/>
         <w:t>Bước 13. Gắn link repo với đội</w:t>
@@ -10925,7 +10936,7 @@
           <w:noProof/>
         </w:rPr>
         <w:drawing>
-          <wp:inline distT="0" distB="0" distL="0" distR="0" wp14:anchorId="6815F3F0" wp14:editId="2D3C3999">
+          <wp:inline distT="0" distB="0" distL="0" distR="0" wp14:anchorId="7BF1CDD7" wp14:editId="0672BA01">
             <wp:extent cx="5284928" cy="2592000"/>
             <wp:effectExtent l="0" t="0" r="0" b="0"/>
             <wp:docPr id="110" name="Picture" descr="Hình 18 Gắn link repo với đội"/>
@@ -10981,7 +10992,7 @@
       <w:pPr>
         <w:pStyle w:val="Heading3"/>
       </w:pPr>
-      <w:bookmarkStart w:id="68" w:name="_Toc244098248"/>
+      <w:bookmarkStart w:id="68" w:name="_Toc244101554"/>
       <w:r>
         <w:t>Bước 14. Theo dõi kiểm tra 72 mẫu</w:t>
       </w:r>
@@ -11062,7 +11073,7 @@
           <w:noProof/>
         </w:rPr>
         <w:drawing>
-          <wp:inline distT="0" distB="0" distL="0" distR="0" wp14:anchorId="7A7A5C46" wp14:editId="4332E463">
+          <wp:inline distT="0" distB="0" distL="0" distR="0" wp14:anchorId="7A566671" wp14:editId="5FA4F216">
             <wp:extent cx="3093102" cy="2592000"/>
             <wp:effectExtent l="0" t="0" r="0" b="0"/>
             <wp:docPr id="114" name="Picture" descr="Hình 19 Theo dõi kiểm tra 72 mẫu"/>
@@ -11119,7 +11130,7 @@
         <w:pStyle w:val="Heading3"/>
         <w:pageBreakBefore/>
       </w:pPr>
-      <w:bookmarkStart w:id="69" w:name="_Toc244098249"/>
+      <w:bookmarkStart w:id="69" w:name="_Toc244101555"/>
       <w:r>
         <w:lastRenderedPageBreak/>
         <w:t>Bước 15. Thử nhanh không cần GitHub</w:t>
@@ -11143,7 +11154,7 @@
           <w:noProof/>
         </w:rPr>
         <w:drawing>
-          <wp:inline distT="0" distB="0" distL="0" distR="0" wp14:anchorId="127086A7" wp14:editId="01EA8299">
+          <wp:inline distT="0" distB="0" distL="0" distR="0" wp14:anchorId="55E82BB4" wp14:editId="46E17FF1">
             <wp:extent cx="5760000" cy="4876138"/>
             <wp:effectExtent l="0" t="0" r="0" b="0"/>
             <wp:docPr id="162" name="Picture 162"/>
@@ -11192,7 +11203,7 @@
         <w:pStyle w:val="Heading3"/>
         <w:pageBreakBefore/>
       </w:pPr>
-      <w:bookmarkStart w:id="70" w:name="_Toc244098250"/>
+      <w:bookmarkStart w:id="70" w:name="_Toc244101556"/>
       <w:r>
         <w:lastRenderedPageBreak/>
         <w:t>Bước 16. Xem giải của đội</w:t>
@@ -11254,7 +11265,7 @@
           <w:noProof/>
         </w:rPr>
         <w:drawing>
-          <wp:inline distT="0" distB="0" distL="0" distR="0" wp14:anchorId="1CA0D777" wp14:editId="6176A654">
+          <wp:inline distT="0" distB="0" distL="0" distR="0" wp14:anchorId="53F61B70" wp14:editId="23877E31">
             <wp:extent cx="5759999" cy="1024999"/>
             <wp:effectExtent l="0" t="0" r="0" b="0"/>
             <wp:docPr id="118" name="Picture" descr="Hình 20 Xem giải của đội"/>
@@ -11310,7 +11321,7 @@
       <w:pPr>
         <w:pStyle w:val="Heading3"/>
       </w:pPr>
-      <w:bookmarkStart w:id="71" w:name="_Toc244098251"/>
+      <w:bookmarkStart w:id="71" w:name="_Toc244101557"/>
       <w:r>
         <w:t>Bước 17. Luyện tập với bot mẫu</w:t>
       </w:r>
@@ -11361,7 +11372,7 @@
           <w:noProof/>
         </w:rPr>
         <w:drawing>
-          <wp:inline distT="0" distB="0" distL="0" distR="0" wp14:anchorId="1FD7DAE8" wp14:editId="36F5A975">
+          <wp:inline distT="0" distB="0" distL="0" distR="0" wp14:anchorId="2000E3DC" wp14:editId="5D324264">
             <wp:extent cx="5759999" cy="3774999"/>
             <wp:effectExtent l="0" t="0" r="0" b="0"/>
             <wp:docPr id="122" name="Picture" descr="Hình 21 Luyện tập với bot mẫu"/>
@@ -11419,7 +11430,7 @@
         <w:pageBreakBefore/>
       </w:pPr>
       <w:bookmarkStart w:id="72" w:name="c3-ban-tổ-chức-điều-hành"/>
-      <w:bookmarkStart w:id="73" w:name="_Toc244098252"/>
+      <w:bookmarkStart w:id="73" w:name="_Toc244101558"/>
       <w:bookmarkEnd w:id="56"/>
       <w:r>
         <w:lastRenderedPageBreak/>
@@ -11431,7 +11442,7 @@
       <w:pPr>
         <w:pStyle w:val="Heading3"/>
       </w:pPr>
-      <w:bookmarkStart w:id="74" w:name="_Toc244098253"/>
+      <w:bookmarkStart w:id="74" w:name="_Toc244101559"/>
       <w:r>
         <w:t>Bước 18. Xem tổng quan ban tổ chức</w:t>
       </w:r>
@@ -11452,7 +11463,7 @@
           <w:noProof/>
         </w:rPr>
         <w:drawing>
-          <wp:inline distT="0" distB="0" distL="0" distR="0" wp14:anchorId="0972C9AB" wp14:editId="13AF68A2">
+          <wp:inline distT="0" distB="0" distL="0" distR="0" wp14:anchorId="6C29DD81" wp14:editId="1D237C46">
             <wp:extent cx="5759999" cy="3505263"/>
             <wp:effectExtent l="0" t="0" r="0" b="0"/>
             <wp:docPr id="127" name="Picture" descr="Hình 22 Xem tổng quan ban tổ chức"/>
@@ -11509,7 +11520,7 @@
         <w:pStyle w:val="Heading3"/>
         <w:pageBreakBefore/>
       </w:pPr>
-      <w:bookmarkStart w:id="75" w:name="_Toc244098254"/>
+      <w:bookmarkStart w:id="75" w:name="_Toc244101560"/>
       <w:r>
         <w:lastRenderedPageBreak/>
         <w:t>Bước 19. Chọn giải ở Tổng quan</w:t>
@@ -11571,7 +11582,7 @@
           <w:noProof/>
         </w:rPr>
         <w:drawing>
-          <wp:inline distT="0" distB="0" distL="0" distR="0" wp14:anchorId="4B4DDB94" wp14:editId="04ED969C">
+          <wp:inline distT="0" distB="0" distL="0" distR="0" wp14:anchorId="75635E2C" wp14:editId="0020A889">
             <wp:extent cx="5759999" cy="4012104"/>
             <wp:effectExtent l="0" t="0" r="0" b="0"/>
             <wp:docPr id="131" name="Picture" descr="Hình 23 Chọn giải ở Tổng quan"/>
@@ -11628,7 +11639,7 @@
         <w:pStyle w:val="Heading3"/>
         <w:pageBreakBefore/>
       </w:pPr>
-      <w:bookmarkStart w:id="76" w:name="_Toc244098255"/>
+      <w:bookmarkStart w:id="76" w:name="_Toc244101561"/>
       <w:r>
         <w:lastRenderedPageBreak/>
         <w:t>Bước 20. Chuẩn bị giải mới</w:t>
@@ -11660,7 +11671,7 @@
           <w:noProof/>
         </w:rPr>
         <w:drawing>
-          <wp:inline distT="0" distB="0" distL="0" distR="0" wp14:anchorId="29B789FB" wp14:editId="01353B94">
+          <wp:inline distT="0" distB="0" distL="0" distR="0" wp14:anchorId="7FEE4EA1" wp14:editId="744B85E6">
             <wp:extent cx="4586765" cy="2592000"/>
             <wp:effectExtent l="0" t="0" r="0" b="0"/>
             <wp:docPr id="135" name="Picture" descr="Hình 24 Chuẩn bị giải mới"/>
@@ -11716,7 +11727,7 @@
       <w:pPr>
         <w:pStyle w:val="Heading3"/>
       </w:pPr>
-      <w:bookmarkStart w:id="77" w:name="_Toc244098256"/>
+      <w:bookmarkStart w:id="77" w:name="_Toc244101562"/>
       <w:r>
         <w:t>Bước 21. Cài máy chấm Windows hoặc Linux</w:t>
       </w:r>
@@ -11767,7 +11778,7 @@
           <w:noProof/>
         </w:rPr>
         <w:drawing>
-          <wp:inline distT="0" distB="0" distL="0" distR="0" wp14:anchorId="723B44A0" wp14:editId="66C4A03D">
+          <wp:inline distT="0" distB="0" distL="0" distR="0" wp14:anchorId="105CCA1C" wp14:editId="52C249E5">
             <wp:extent cx="5759999" cy="1196950"/>
             <wp:effectExtent l="0" t="0" r="0" b="0"/>
             <wp:docPr id="139" name="Picture" descr="Hình 25 Cài máy chấm Windows hoặc Linux"/>
@@ -11824,7 +11835,7 @@
         <w:pStyle w:val="Heading3"/>
         <w:pageBreakBefore/>
       </w:pPr>
-      <w:bookmarkStart w:id="78" w:name="_Toc244098257"/>
+      <w:bookmarkStart w:id="78" w:name="_Toc244101563"/>
       <w:r>
         <w:lastRenderedPageBreak/>
         <w:t>Bước 22. Kiểm tình trạng chấm và hàng đợi</w:t>
@@ -11856,7 +11867,7 @@
           <w:noProof/>
         </w:rPr>
         <w:drawing>
-          <wp:inline distT="0" distB="0" distL="0" distR="0" wp14:anchorId="2044421E" wp14:editId="75A93955">
+          <wp:inline distT="0" distB="0" distL="0" distR="0" wp14:anchorId="0299B91A" wp14:editId="5E5EC4EE">
             <wp:extent cx="4213732" cy="2592000"/>
             <wp:effectExtent l="0" t="0" r="0" b="0"/>
             <wp:docPr id="143" name="Picture" descr="Hình 26 Kiểm tình trạng chấm và hàng đợi"/>
@@ -11912,7 +11923,7 @@
       <w:pPr>
         <w:pStyle w:val="Heading3"/>
       </w:pPr>
-      <w:bookmarkStart w:id="79" w:name="_Toc244098258"/>
+      <w:bookmarkStart w:id="79" w:name="_Toc244101564"/>
       <w:r>
         <w:t>Bước 23. Soạn thông báo</w:t>
       </w:r>
@@ -11953,7 +11964,7 @@
           <w:noProof/>
         </w:rPr>
         <w:drawing>
-          <wp:inline distT="0" distB="0" distL="0" distR="0" wp14:anchorId="78097A2C" wp14:editId="1EA0D369">
+          <wp:inline distT="0" distB="0" distL="0" distR="0" wp14:anchorId="74B5B7ED" wp14:editId="7A5DEB4A">
             <wp:extent cx="5759999" cy="2369999"/>
             <wp:effectExtent l="0" t="0" r="0" b="0"/>
             <wp:docPr id="147" name="Picture" descr="Hình 27 Soạn thông báo"/>
@@ -12010,7 +12021,7 @@
         <w:pStyle w:val="Heading3"/>
         <w:pageBreakBefore/>
       </w:pPr>
-      <w:bookmarkStart w:id="80" w:name="_Toc244098259"/>
+      <w:bookmarkStart w:id="80" w:name="_Toc244101565"/>
       <w:r>
         <w:lastRenderedPageBreak/>
         <w:t>Bước 24. Xuất bảng điểm CSV</w:t>
@@ -12042,8 +12053,8 @@
           <w:noProof/>
         </w:rPr>
         <w:drawing>
-          <wp:inline distT="0" distB="0" distL="0" distR="0" wp14:anchorId="1ADB2C80" wp14:editId="6546FDAB">
-            <wp:extent cx="4559999" cy="5400000"/>
+          <wp:inline distT="0" distB="0" distL="0" distR="0" wp14:anchorId="0018812E" wp14:editId="47206899">
+            <wp:extent cx="5760000" cy="6821052"/>
             <wp:effectExtent l="0" t="0" r="0" b="0"/>
             <wp:docPr id="151" name="Picture" descr="Hình 28 Xuất bảng điểm CSV"/>
             <wp:cNvGraphicFramePr/>
@@ -12065,7 +12076,7 @@
                   <pic:spPr bwMode="auto">
                     <a:xfrm>
                       <a:off x="0" y="0"/>
-                      <a:ext cx="4559999" cy="5400000"/>
+                      <a:ext cx="5760000" cy="6821052"/>
                     </a:xfrm>
                     <a:prstGeom prst="rect">
                       <a:avLst/>
@@ -12099,7 +12110,7 @@
         <w:pStyle w:val="Heading2"/>
         <w:pageBreakBefore/>
       </w:pPr>
-      <w:bookmarkStart w:id="81" w:name="_Toc244098260"/>
+      <w:bookmarkStart w:id="81" w:name="_Toc244101566"/>
       <w:bookmarkEnd w:id="46"/>
       <w:bookmarkEnd w:id="72"/>
       <w:r>
@@ -12112,7 +12123,7 @@
       <w:pPr>
         <w:pStyle w:val="Heading3"/>
       </w:pPr>
-      <w:bookmarkStart w:id="82" w:name="_Toc244098261"/>
+      <w:bookmarkStart w:id="82" w:name="_Toc244101567"/>
       <w:r>
         <w:t>Bước 25. Tạo tài khoản và phát giấy cho đội</w:t>
       </w:r>
@@ -12136,7 +12147,7 @@
           <w:noProof/>
         </w:rPr>
         <w:drawing>
-          <wp:inline distT="0" distB="0" distL="0" distR="0" wp14:anchorId="6F7E7AC9" wp14:editId="62395FE9">
+          <wp:inline distT="0" distB="0" distL="0" distR="0" wp14:anchorId="415999D6" wp14:editId="256F8F92">
             <wp:extent cx="3600000" cy="5992258"/>
             <wp:effectExtent l="0" t="0" r="0" b="0"/>
             <wp:docPr id="156" name="Picture 156"/>
@@ -12186,7 +12197,7 @@
         <w:pStyle w:val="Heading3"/>
         <w:pageBreakBefore/>
       </w:pPr>
-      <w:bookmarkStart w:id="83" w:name="_Toc244098262"/>
+      <w:bookmarkStart w:id="83" w:name="_Toc244101568"/>
       <w:r>
         <w:lastRenderedPageBreak/>
         <w:t>Bước 26. Đội tự nạp ZIP và kiểm tra</w:t>
@@ -12211,7 +12222,7 @@
           <w:noProof/>
         </w:rPr>
         <w:drawing>
-          <wp:inline distT="0" distB="0" distL="0" distR="0" wp14:anchorId="4E216741" wp14:editId="7282FAE2">
+          <wp:inline distT="0" distB="0" distL="0" distR="0" wp14:anchorId="43E38BF0" wp14:editId="0B7C3D00">
             <wp:extent cx="5760000" cy="4826842"/>
             <wp:effectExtent l="0" t="0" r="0" b="0"/>
             <wp:docPr id="157" name="Picture 157"/>
@@ -12261,10 +12272,10 @@
         <w:pStyle w:val="Heading3"/>
         <w:pageBreakBefore/>
       </w:pPr>
-      <w:bookmarkStart w:id="84" w:name="_Toc244098263"/>
+      <w:bookmarkStart w:id="84" w:name="_Toc244101569"/>
       <w:r>
         <w:lastRenderedPageBreak/>
-        <w:t>Bước 27. Tạo bảng và thêm các đội</w:t>
+        <w:t>Bước 27. BTC tạo chung kết</w:t>
       </w:r>
       <w:bookmarkEnd w:id="84"/>
     </w:p>
@@ -12273,7 +12284,7 @@
         <w:keepNext/>
       </w:pPr>
       <w:r>
-        <w:t>Ban tổ chức tạo giải vòng tròn hai lượt, chọn năm phút mỗi bot, bốn đội và nền tảng máy chấm đã nối. Ở trang giải, chọn từng đội rồi Thêm đội; hub lấy bản Đạt mới nhất đúng cấu hình. Mở đăng ký, kiểm danh sách, Chốt bot và tạo lịch, rồi Bắt đầu giải. Mỗi bảng có 12 ván; lặp lại cho bốn bảng theo hạt giống.</w:t>
+        <w:t>Mở Chung kết bằng tài khoản BTC, chọn 16 đội, nhập hạng online 1–16, chọn năm phút mỗi bot cùng bộ luật và nền tảng chấm. Bấm Tạo bản nháp, kiểm lại danh sách rồi Bắt đầu vòng bảng. Hệ thống lấy bản Đạt mới nhất lúc bắt đầu, tự chia bốn bảng, chốt và chạy 48 ván. Bật chờ giữa vòng nếu cần BTC điều khiển giờ mở vòng sau.</w:t>
       </w:r>
     </w:p>
     <w:p>
@@ -12286,8 +12297,8 @@
           <w:noProof/>
         </w:rPr>
         <w:drawing>
-          <wp:inline distT="0" distB="0" distL="0" distR="0" wp14:anchorId="25DF9AE0" wp14:editId="0E455713">
-            <wp:extent cx="5040000" cy="5595395"/>
+          <wp:inline distT="0" distB="0" distL="0" distR="0" wp14:anchorId="383CCF10" wp14:editId="0FE07D25">
+            <wp:extent cx="5040000" cy="6277894"/>
             <wp:effectExtent l="0" t="0" r="0" b="0"/>
             <wp:docPr id="158" name="Picture 158"/>
             <wp:cNvGraphicFramePr>
@@ -12309,7 +12320,7 @@
                   <pic:spPr>
                     <a:xfrm>
                       <a:off x="0" y="0"/>
-                      <a:ext cx="5040000" cy="5595395"/>
+                      <a:ext cx="5040000" cy="6277894"/>
                     </a:xfrm>
                     <a:prstGeom prst="rect">
                       <a:avLst/>
@@ -12328,7 +12339,7 @@
         <w:jc w:val="center"/>
       </w:pPr>
       <w:r>
-        <w:t>Hình 34. Giải bảng và nút thêm đội của ban tổ chức</w:t>
+        <w:t>Hình 34. Tạo chung kết với 16 đội và hạng online</w:t>
       </w:r>
     </w:p>
     <w:p>
@@ -12336,10 +12347,10 @@
         <w:pStyle w:val="Heading3"/>
         <w:pageBreakBefore/>
       </w:pPr>
-      <w:bookmarkStart w:id="85" w:name="_Toc244098264"/>
+      <w:bookmarkStart w:id="85" w:name="_Toc244101570"/>
       <w:r>
         <w:lastRenderedPageBreak/>
-        <w:t>Bước 28. Chiếu bảng điểm và replay</w:t>
+        <w:t>Bước 28. Theo dõi vòng bảng và replay</w:t>
       </w:r>
       <w:bookmarkEnd w:id="85"/>
     </w:p>
@@ -12348,7 +12359,7 @@
         <w:keepNext/>
       </w:pPr>
       <w:r>
-        <w:t>Laptop chiếu mở Bảng xếp hạng của bảng đang thi; mở từng ván để xem trực tiếp hoặc replay. Trọng tài kiểm số ván, điểm, thứ hạng và chốt hai đội đi tiếp trước khi tạo vòng sau. Không dùng ván luyện tập để tính điểm.</w:t>
+        <w:t>Từ thẻ bảng trên trang Chung kết, mở Lịch / replay hoặc Bảng xếp hạng để xem từng ván. Điểm đối đầu, số ván thắng và hạng online quyết định thứ tự bảng khi bằng điểm; hai đội đầu được đánh dấu Vào tứ kết khi bảng hoàn tất. Ván lỗi chờ BTC xử lý và chạy lại bằng công cụ của giải con; hệ thống không tự đổi lỗi hạ tầng thành thua.</w:t>
       </w:r>
     </w:p>
     <w:p>
@@ -12361,8 +12372,8 @@
           <w:noProof/>
         </w:rPr>
         <w:drawing>
-          <wp:inline distT="0" distB="0" distL="0" distR="0" wp14:anchorId="152A2343" wp14:editId="0C976D07">
-            <wp:extent cx="5760000" cy="5532632"/>
+          <wp:inline distT="0" distB="0" distL="0" distR="0" wp14:anchorId="322DB03C" wp14:editId="1DCEC5B1">
+            <wp:extent cx="5760000" cy="5532631"/>
             <wp:effectExtent l="0" t="0" r="0" b="0"/>
             <wp:docPr id="159" name="Picture 159"/>
             <wp:cNvGraphicFramePr>
@@ -12384,7 +12395,7 @@
                   <pic:spPr>
                     <a:xfrm>
                       <a:off x="0" y="0"/>
-                      <a:ext cx="5760000" cy="5532632"/>
+                      <a:ext cx="5760000" cy="5532631"/>
                     </a:xfrm>
                     <a:prstGeom prst="rect">
                       <a:avLst/>
@@ -12403,7 +12414,7 @@
         <w:jc w:val="center"/>
       </w:pPr>
       <w:r>
-        <w:t>Hình 35. Bảng điểm vòng bảng đã hoàn tất</w:t>
+        <w:t>Hình 35. Bảng hoàn tất, xếp theo các hệ số đã công bố</w:t>
       </w:r>
     </w:p>
     <w:p>
@@ -12411,10 +12422,10 @@
         <w:pStyle w:val="Heading3"/>
         <w:pageBreakBefore/>
       </w:pPr>
-      <w:bookmarkStart w:id="86" w:name="_Toc244098265"/>
+      <w:bookmarkStart w:id="86" w:name="_Toc244101571"/>
       <w:r>
         <w:lastRenderedPageBreak/>
-        <w:t>Bước 29. Tạo cặp loại trực tiếp</w:t>
+        <w:t>Bước 29. Trang nhánh đấu và màn hình chiếu</w:t>
       </w:r>
       <w:bookmarkEnd w:id="86"/>
     </w:p>
@@ -12423,7 +12434,7 @@
         <w:keepNext/>
       </w:pPr>
       <w:r>
-        <w:t>Với mỗi cặp tứ kết, tạo một giải vòng tròn hai đội, năm phút mỗi bot, thêm đúng hai đội rồi chốt và chạy hai ván đổi màu. Trọng tài áp dụng quy tắc phá hòa ở mục 7 phần A, sau đó tạo bán kết, tranh hạng ba và chung kết theo kết quả.</w:t>
+        <w:t>Trang Chung kết tự nối tứ kết, bán kết, chung kết và tranh hạng ba; cặp đang đấu được tô nổi. Bấm cặp để mở lịch và replay; xem lý do đi tiếp khi hòa hai ván. Mở Màn hình chiếu để có nền tối, chữ lớn, không thanh bên và tự cập nhật mỗi ba giây. BTC có thể Dừng tự động để giữ nguyên các giải con và làm tiếp bằng tay; không có nút sửa đội thắng.</w:t>
       </w:r>
     </w:p>
     <w:p>
@@ -12436,8 +12447,8 @@
           <w:noProof/>
         </w:rPr>
         <w:drawing>
-          <wp:inline distT="0" distB="0" distL="0" distR="0" wp14:anchorId="283E550D" wp14:editId="7A518D57">
-            <wp:extent cx="5040000" cy="5197500"/>
+          <wp:inline distT="0" distB="0" distL="0" distR="0" wp14:anchorId="2082CD40" wp14:editId="5508E1B2">
+            <wp:extent cx="5760000" cy="3240000"/>
             <wp:effectExtent l="0" t="0" r="0" b="0"/>
             <wp:docPr id="160" name="Picture 160"/>
             <wp:cNvGraphicFramePr>
@@ -12459,7 +12470,7 @@
                   <pic:spPr>
                     <a:xfrm>
                       <a:off x="0" y="0"/>
-                      <a:ext cx="5040000" cy="5197500"/>
+                      <a:ext cx="5760000" cy="3240000"/>
                     </a:xfrm>
                     <a:prstGeom prst="rect">
                       <a:avLst/>
@@ -12478,7 +12489,7 @@
         <w:jc w:val="center"/>
       </w:pPr>
       <w:r>
-        <w:t>Hình 36. Cặp loại trực tiếp gồm hai đội</w:t>
+        <w:t>Hình 36. Nhánh chung kết và tranh hạng ba trên màn hình chiếu</w:t>
       </w:r>
     </w:p>
     <w:p>
@@ -12486,7 +12497,7 @@
         <w:pStyle w:val="Heading3"/>
         <w:pageBreakBefore/>
       </w:pPr>
-      <w:bookmarkStart w:id="87" w:name="_Toc244098266"/>
+      <w:bookmarkStart w:id="87" w:name="_Toc244101572"/>
       <w:r>
         <w:lastRenderedPageBreak/>
         <w:t>Bước 30. Xuất kết quả trên hub LAN</w:t>
@@ -12498,7 +12509,7 @@
         <w:keepNext/>
       </w:pPr>
       <w:r>
-        <w:t>Trên hub LAN, mở Giải đấu rồi bấm Xuất kết quả lên web. Nhập tên sự kiện, chọn Bảng A và các bảng/cặp cần chuyển theo thứ tự muốn công bố, rồi tải file .json.gz. Chỉ xuất giải đã hoàn tất; giữ file gốc để đối chiếu.</w:t>
+        <w:t>Trên hub LAN, mở Giải đấu rồi bấm Xuất kết quả lên web. Nhập tên sự kiện; chọn chung kết tự động để lấy toàn bộ bảng, cặp và nhánh, hoặc chọn từng giải đã xong theo thứ tự muốn công bố. Tải file .json.gz và giữ bản gốc để đối chiếu. Chỉ xuất giải hoặc chung kết đã hoàn tất.</w:t>
       </w:r>
     </w:p>
     <w:p>
@@ -12511,7 +12522,7 @@
           <w:noProof/>
         </w:rPr>
         <w:drawing>
-          <wp:inline distT="0" distB="0" distL="0" distR="0" wp14:anchorId="25A83699" wp14:editId="414345F4">
+          <wp:inline distT="0" distB="0" distL="0" distR="0" wp14:anchorId="50C75483" wp14:editId="0A02002F">
             <wp:extent cx="5040000" cy="5560258"/>
             <wp:effectExtent l="0" t="0" r="0" b="0"/>
             <wp:docPr id="161" name="Picture 161"/>
@@ -12561,7 +12572,7 @@
         <w:pStyle w:val="Heading3"/>
         <w:pageBreakBefore/>
       </w:pPr>
-      <w:bookmarkStart w:id="88" w:name="_Toc244098267"/>
+      <w:bookmarkStart w:id="88" w:name="_Toc244101573"/>
       <w:r>
         <w:lastRenderedPageBreak/>
         <w:t>Bước 31. Nạp kết quả lên web thật</w:t>
@@ -12582,7 +12593,7 @@
           <w:noProof/>
         </w:rPr>
         <w:drawing>
-          <wp:inline distT="0" distB="0" distL="0" distR="0" wp14:anchorId="4CDF6839" wp14:editId="31AE3098">
+          <wp:inline distT="0" distB="0" distL="0" distR="0" wp14:anchorId="09CDAF58" wp14:editId="32CC7326">
             <wp:extent cx="5040000" cy="4893677"/>
             <wp:effectExtent l="0" t="0" r="0" b="0"/>
             <wp:docPr id="163" name="Picture 163"/>

</xml_diff>

<commit_message>
Bổ sung cách xem chung kết thử trên web
</commit_message>
<xml_diff>
--- a/TAI-LIEU.docx
+++ b/TAI-LIEU.docx
@@ -159,7 +159,7 @@
           <w:r>
             <w:fldChar w:fldCharType="separate"/>
           </w:r>
-          <w:hyperlink w:anchor="_Toc244101513" w:history="1">
+          <w:hyperlink w:anchor="_Toc244106646" w:history="1">
             <w:r>
               <w:rPr>
                 <w:rStyle w:val="Hyperlink"/>
@@ -186,7 +186,7 @@
                 <w:noProof/>
                 <w:webHidden/>
               </w:rPr>
-              <w:instrText xml:space="preserve"> PAGEREF _Toc244101513 \h </w:instrText>
+              <w:instrText xml:space="preserve"> PAGEREF _Toc244106646 \h </w:instrText>
             </w:r>
             <w:r>
               <w:rPr>
@@ -233,7 +233,7 @@
               <w14:ligatures w14:val="standardContextual"/>
             </w:rPr>
           </w:pPr>
-          <w:hyperlink w:anchor="_Toc244101514" w:history="1">
+          <w:hyperlink w:anchor="_Toc244106647" w:history="1">
             <w:r>
               <w:rPr>
                 <w:rStyle w:val="Hyperlink"/>
@@ -260,7 +260,7 @@
                 <w:noProof/>
                 <w:webHidden/>
               </w:rPr>
-              <w:instrText xml:space="preserve"> PAGEREF _Toc244101514 \h </w:instrText>
+              <w:instrText xml:space="preserve"> PAGEREF _Toc244106647 \h </w:instrText>
             </w:r>
             <w:r>
               <w:rPr>
@@ -307,7 +307,7 @@
               <w14:ligatures w14:val="standardContextual"/>
             </w:rPr>
           </w:pPr>
-          <w:hyperlink w:anchor="_Toc244101515" w:history="1">
+          <w:hyperlink w:anchor="_Toc244106648" w:history="1">
             <w:r>
               <w:rPr>
                 <w:rStyle w:val="Hyperlink"/>
@@ -334,7 +334,7 @@
                 <w:noProof/>
                 <w:webHidden/>
               </w:rPr>
-              <w:instrText xml:space="preserve"> PAGEREF _Toc244101515 \h </w:instrText>
+              <w:instrText xml:space="preserve"> PAGEREF _Toc244106648 \h </w:instrText>
             </w:r>
             <w:r>
               <w:rPr>
@@ -381,7 +381,7 @@
               <w14:ligatures w14:val="standardContextual"/>
             </w:rPr>
           </w:pPr>
-          <w:hyperlink w:anchor="_Toc244101516" w:history="1">
+          <w:hyperlink w:anchor="_Toc244106649" w:history="1">
             <w:r>
               <w:rPr>
                 <w:rStyle w:val="Hyperlink"/>
@@ -408,7 +408,7 @@
                 <w:noProof/>
                 <w:webHidden/>
               </w:rPr>
-              <w:instrText xml:space="preserve"> PAGEREF _Toc244101516 \h </w:instrText>
+              <w:instrText xml:space="preserve"> PAGEREF _Toc244106649 \h </w:instrText>
             </w:r>
             <w:r>
               <w:rPr>
@@ -455,7 +455,7 @@
               <w14:ligatures w14:val="standardContextual"/>
             </w:rPr>
           </w:pPr>
-          <w:hyperlink w:anchor="_Toc244101517" w:history="1">
+          <w:hyperlink w:anchor="_Toc244106650" w:history="1">
             <w:r>
               <w:rPr>
                 <w:rStyle w:val="Hyperlink"/>
@@ -482,7 +482,7 @@
                 <w:noProof/>
                 <w:webHidden/>
               </w:rPr>
-              <w:instrText xml:space="preserve"> PAGEREF _Toc244101517 \h </w:instrText>
+              <w:instrText xml:space="preserve"> PAGEREF _Toc244106650 \h </w:instrText>
             </w:r>
             <w:r>
               <w:rPr>
@@ -529,7 +529,7 @@
               <w14:ligatures w14:val="standardContextual"/>
             </w:rPr>
           </w:pPr>
-          <w:hyperlink w:anchor="_Toc244101518" w:history="1">
+          <w:hyperlink w:anchor="_Toc244106651" w:history="1">
             <w:r>
               <w:rPr>
                 <w:rStyle w:val="Hyperlink"/>
@@ -556,7 +556,7 @@
                 <w:noProof/>
                 <w:webHidden/>
               </w:rPr>
-              <w:instrText xml:space="preserve"> PAGEREF _Toc244101518 \h </w:instrText>
+              <w:instrText xml:space="preserve"> PAGEREF _Toc244106651 \h </w:instrText>
             </w:r>
             <w:r>
               <w:rPr>
@@ -603,7 +603,7 @@
               <w14:ligatures w14:val="standardContextual"/>
             </w:rPr>
           </w:pPr>
-          <w:hyperlink w:anchor="_Toc244101519" w:history="1">
+          <w:hyperlink w:anchor="_Toc244106652" w:history="1">
             <w:r>
               <w:rPr>
                 <w:rStyle w:val="Hyperlink"/>
@@ -630,7 +630,7 @@
                 <w:noProof/>
                 <w:webHidden/>
               </w:rPr>
-              <w:instrText xml:space="preserve"> PAGEREF _Toc244101519 \h </w:instrText>
+              <w:instrText xml:space="preserve"> PAGEREF _Toc244106652 \h </w:instrText>
             </w:r>
             <w:r>
               <w:rPr>
@@ -677,7 +677,7 @@
               <w14:ligatures w14:val="standardContextual"/>
             </w:rPr>
           </w:pPr>
-          <w:hyperlink w:anchor="_Toc244101520" w:history="1">
+          <w:hyperlink w:anchor="_Toc244106653" w:history="1">
             <w:r>
               <w:rPr>
                 <w:rStyle w:val="Hyperlink"/>
@@ -704,7 +704,7 @@
                 <w:noProof/>
                 <w:webHidden/>
               </w:rPr>
-              <w:instrText xml:space="preserve"> PAGEREF _Toc244101520 \h </w:instrText>
+              <w:instrText xml:space="preserve"> PAGEREF _Toc244106653 \h </w:instrText>
             </w:r>
             <w:r>
               <w:rPr>
@@ -751,7 +751,7 @@
               <w14:ligatures w14:val="standardContextual"/>
             </w:rPr>
           </w:pPr>
-          <w:hyperlink w:anchor="_Toc244101521" w:history="1">
+          <w:hyperlink w:anchor="_Toc244106654" w:history="1">
             <w:r>
               <w:rPr>
                 <w:rStyle w:val="Hyperlink"/>
@@ -778,7 +778,7 @@
                 <w:noProof/>
                 <w:webHidden/>
               </w:rPr>
-              <w:instrText xml:space="preserve"> PAGEREF _Toc244101521 \h </w:instrText>
+              <w:instrText xml:space="preserve"> PAGEREF _Toc244106654 \h </w:instrText>
             </w:r>
             <w:r>
               <w:rPr>
@@ -825,7 +825,7 @@
               <w14:ligatures w14:val="standardContextual"/>
             </w:rPr>
           </w:pPr>
-          <w:hyperlink w:anchor="_Toc244101522" w:history="1">
+          <w:hyperlink w:anchor="_Toc244106655" w:history="1">
             <w:r>
               <w:rPr>
                 <w:rStyle w:val="Hyperlink"/>
@@ -852,7 +852,7 @@
                 <w:noProof/>
                 <w:webHidden/>
               </w:rPr>
-              <w:instrText xml:space="preserve"> PAGEREF _Toc244101522 \h </w:instrText>
+              <w:instrText xml:space="preserve"> PAGEREF _Toc244106655 \h </w:instrText>
             </w:r>
             <w:r>
               <w:rPr>
@@ -899,7 +899,7 @@
               <w14:ligatures w14:val="standardContextual"/>
             </w:rPr>
           </w:pPr>
-          <w:hyperlink w:anchor="_Toc244101523" w:history="1">
+          <w:hyperlink w:anchor="_Toc244106656" w:history="1">
             <w:r>
               <w:rPr>
                 <w:rStyle w:val="Hyperlink"/>
@@ -926,7 +926,7 @@
                 <w:noProof/>
                 <w:webHidden/>
               </w:rPr>
-              <w:instrText xml:space="preserve"> PAGEREF _Toc244101523 \h </w:instrText>
+              <w:instrText xml:space="preserve"> PAGEREF _Toc244106656 \h </w:instrText>
             </w:r>
             <w:r>
               <w:rPr>
@@ -973,7 +973,7 @@
               <w14:ligatures w14:val="standardContextual"/>
             </w:rPr>
           </w:pPr>
-          <w:hyperlink w:anchor="_Toc244101524" w:history="1">
+          <w:hyperlink w:anchor="_Toc244106657" w:history="1">
             <w:r>
               <w:rPr>
                 <w:rStyle w:val="Hyperlink"/>
@@ -1000,7 +1000,7 @@
                 <w:noProof/>
                 <w:webHidden/>
               </w:rPr>
-              <w:instrText xml:space="preserve"> PAGEREF _Toc244101524 \h </w:instrText>
+              <w:instrText xml:space="preserve"> PAGEREF _Toc244106657 \h </w:instrText>
             </w:r>
             <w:r>
               <w:rPr>
@@ -1047,7 +1047,7 @@
               <w14:ligatures w14:val="standardContextual"/>
             </w:rPr>
           </w:pPr>
-          <w:hyperlink w:anchor="_Toc244101525" w:history="1">
+          <w:hyperlink w:anchor="_Toc244106658" w:history="1">
             <w:r>
               <w:rPr>
                 <w:rStyle w:val="Hyperlink"/>
@@ -1074,7 +1074,7 @@
                 <w:noProof/>
                 <w:webHidden/>
               </w:rPr>
-              <w:instrText xml:space="preserve"> PAGEREF _Toc244101525 \h </w:instrText>
+              <w:instrText xml:space="preserve"> PAGEREF _Toc244106658 \h </w:instrText>
             </w:r>
             <w:r>
               <w:rPr>
@@ -1121,7 +1121,7 @@
               <w14:ligatures w14:val="standardContextual"/>
             </w:rPr>
           </w:pPr>
-          <w:hyperlink w:anchor="_Toc244101526" w:history="1">
+          <w:hyperlink w:anchor="_Toc244106659" w:history="1">
             <w:r>
               <w:rPr>
                 <w:rStyle w:val="Hyperlink"/>
@@ -1148,7 +1148,7 @@
                 <w:noProof/>
                 <w:webHidden/>
               </w:rPr>
-              <w:instrText xml:space="preserve"> PAGEREF _Toc244101526 \h </w:instrText>
+              <w:instrText xml:space="preserve"> PAGEREF _Toc244106659 \h </w:instrText>
             </w:r>
             <w:r>
               <w:rPr>
@@ -1195,7 +1195,7 @@
               <w14:ligatures w14:val="standardContextual"/>
             </w:rPr>
           </w:pPr>
-          <w:hyperlink w:anchor="_Toc244101527" w:history="1">
+          <w:hyperlink w:anchor="_Toc244106660" w:history="1">
             <w:r>
               <w:rPr>
                 <w:rStyle w:val="Hyperlink"/>
@@ -1222,7 +1222,7 @@
                 <w:noProof/>
                 <w:webHidden/>
               </w:rPr>
-              <w:instrText xml:space="preserve"> PAGEREF _Toc244101527 \h </w:instrText>
+              <w:instrText xml:space="preserve"> PAGEREF _Toc244106660 \h </w:instrText>
             </w:r>
             <w:r>
               <w:rPr>
@@ -1269,7 +1269,7 @@
               <w14:ligatures w14:val="standardContextual"/>
             </w:rPr>
           </w:pPr>
-          <w:hyperlink w:anchor="_Toc244101528" w:history="1">
+          <w:hyperlink w:anchor="_Toc244106661" w:history="1">
             <w:r>
               <w:rPr>
                 <w:rStyle w:val="Hyperlink"/>
@@ -1296,7 +1296,7 @@
                 <w:noProof/>
                 <w:webHidden/>
               </w:rPr>
-              <w:instrText xml:space="preserve"> PAGEREF _Toc244101528 \h </w:instrText>
+              <w:instrText xml:space="preserve"> PAGEREF _Toc244106661 \h </w:instrText>
             </w:r>
             <w:r>
               <w:rPr>
@@ -1343,7 +1343,7 @@
               <w14:ligatures w14:val="standardContextual"/>
             </w:rPr>
           </w:pPr>
-          <w:hyperlink w:anchor="_Toc244101529" w:history="1">
+          <w:hyperlink w:anchor="_Toc244106662" w:history="1">
             <w:r>
               <w:rPr>
                 <w:rStyle w:val="Hyperlink"/>
@@ -1370,7 +1370,7 @@
                 <w:noProof/>
                 <w:webHidden/>
               </w:rPr>
-              <w:instrText xml:space="preserve"> PAGEREF _Toc244101529 \h </w:instrText>
+              <w:instrText xml:space="preserve"> PAGEREF _Toc244106662 \h </w:instrText>
             </w:r>
             <w:r>
               <w:rPr>
@@ -1417,7 +1417,7 @@
               <w14:ligatures w14:val="standardContextual"/>
             </w:rPr>
           </w:pPr>
-          <w:hyperlink w:anchor="_Toc244101530" w:history="1">
+          <w:hyperlink w:anchor="_Toc244106663" w:history="1">
             <w:r>
               <w:rPr>
                 <w:rStyle w:val="Hyperlink"/>
@@ -1444,7 +1444,7 @@
                 <w:noProof/>
                 <w:webHidden/>
               </w:rPr>
-              <w:instrText xml:space="preserve"> PAGEREF _Toc244101530 \h </w:instrText>
+              <w:instrText xml:space="preserve"> PAGEREF _Toc244106663 \h </w:instrText>
             </w:r>
             <w:r>
               <w:rPr>
@@ -1491,7 +1491,7 @@
               <w14:ligatures w14:val="standardContextual"/>
             </w:rPr>
           </w:pPr>
-          <w:hyperlink w:anchor="_Toc244101531" w:history="1">
+          <w:hyperlink w:anchor="_Toc244106664" w:history="1">
             <w:r>
               <w:rPr>
                 <w:rStyle w:val="Hyperlink"/>
@@ -1518,7 +1518,7 @@
                 <w:noProof/>
                 <w:webHidden/>
               </w:rPr>
-              <w:instrText xml:space="preserve"> PAGEREF _Toc244101531 \h </w:instrText>
+              <w:instrText xml:space="preserve"> PAGEREF _Toc244106664 \h </w:instrText>
             </w:r>
             <w:r>
               <w:rPr>
@@ -1565,7 +1565,7 @@
               <w14:ligatures w14:val="standardContextual"/>
             </w:rPr>
           </w:pPr>
-          <w:hyperlink w:anchor="_Toc244101532" w:history="1">
+          <w:hyperlink w:anchor="_Toc244106665" w:history="1">
             <w:r>
               <w:rPr>
                 <w:rStyle w:val="Hyperlink"/>
@@ -1592,7 +1592,7 @@
                 <w:noProof/>
                 <w:webHidden/>
               </w:rPr>
-              <w:instrText xml:space="preserve"> PAGEREF _Toc244101532 \h </w:instrText>
+              <w:instrText xml:space="preserve"> PAGEREF _Toc244106665 \h </w:instrText>
             </w:r>
             <w:r>
               <w:rPr>
@@ -1639,7 +1639,7 @@
               <w14:ligatures w14:val="standardContextual"/>
             </w:rPr>
           </w:pPr>
-          <w:hyperlink w:anchor="_Toc244101533" w:history="1">
+          <w:hyperlink w:anchor="_Toc244106666" w:history="1">
             <w:r>
               <w:rPr>
                 <w:rStyle w:val="Hyperlink"/>
@@ -1666,7 +1666,7 @@
                 <w:noProof/>
                 <w:webHidden/>
               </w:rPr>
-              <w:instrText xml:space="preserve"> PAGEREF _Toc244101533 \h </w:instrText>
+              <w:instrText xml:space="preserve"> PAGEREF _Toc244106666 \h </w:instrText>
             </w:r>
             <w:r>
               <w:rPr>
@@ -1713,7 +1713,7 @@
               <w14:ligatures w14:val="standardContextual"/>
             </w:rPr>
           </w:pPr>
-          <w:hyperlink w:anchor="_Toc244101534" w:history="1">
+          <w:hyperlink w:anchor="_Toc244106667" w:history="1">
             <w:r>
               <w:rPr>
                 <w:rStyle w:val="Hyperlink"/>
@@ -1740,7 +1740,7 @@
                 <w:noProof/>
                 <w:webHidden/>
               </w:rPr>
-              <w:instrText xml:space="preserve"> PAGEREF _Toc244101534 \h </w:instrText>
+              <w:instrText xml:space="preserve"> PAGEREF _Toc244106667 \h </w:instrText>
             </w:r>
             <w:r>
               <w:rPr>
@@ -1787,7 +1787,7 @@
               <w14:ligatures w14:val="standardContextual"/>
             </w:rPr>
           </w:pPr>
-          <w:hyperlink w:anchor="_Toc244101535" w:history="1">
+          <w:hyperlink w:anchor="_Toc244106668" w:history="1">
             <w:r>
               <w:rPr>
                 <w:rStyle w:val="Hyperlink"/>
@@ -1814,7 +1814,7 @@
                 <w:noProof/>
                 <w:webHidden/>
               </w:rPr>
-              <w:instrText xml:space="preserve"> PAGEREF _Toc244101535 \h </w:instrText>
+              <w:instrText xml:space="preserve"> PAGEREF _Toc244106668 \h </w:instrText>
             </w:r>
             <w:r>
               <w:rPr>
@@ -1861,7 +1861,7 @@
               <w14:ligatures w14:val="standardContextual"/>
             </w:rPr>
           </w:pPr>
-          <w:hyperlink w:anchor="_Toc244101536" w:history="1">
+          <w:hyperlink w:anchor="_Toc244106669" w:history="1">
             <w:r>
               <w:rPr>
                 <w:rStyle w:val="Hyperlink"/>
@@ -1888,7 +1888,7 @@
                 <w:noProof/>
                 <w:webHidden/>
               </w:rPr>
-              <w:instrText xml:space="preserve"> PAGEREF _Toc244101536 \h </w:instrText>
+              <w:instrText xml:space="preserve"> PAGEREF _Toc244106669 \h </w:instrText>
             </w:r>
             <w:r>
               <w:rPr>
@@ -1935,7 +1935,7 @@
               <w14:ligatures w14:val="standardContextual"/>
             </w:rPr>
           </w:pPr>
-          <w:hyperlink w:anchor="_Toc244101537" w:history="1">
+          <w:hyperlink w:anchor="_Toc244106670" w:history="1">
             <w:r>
               <w:rPr>
                 <w:rStyle w:val="Hyperlink"/>
@@ -1962,7 +1962,7 @@
                 <w:noProof/>
                 <w:webHidden/>
               </w:rPr>
-              <w:instrText xml:space="preserve"> PAGEREF _Toc244101537 \h </w:instrText>
+              <w:instrText xml:space="preserve"> PAGEREF _Toc244106670 \h </w:instrText>
             </w:r>
             <w:r>
               <w:rPr>
@@ -2009,7 +2009,7 @@
               <w14:ligatures w14:val="standardContextual"/>
             </w:rPr>
           </w:pPr>
-          <w:hyperlink w:anchor="_Toc244101538" w:history="1">
+          <w:hyperlink w:anchor="_Toc244106671" w:history="1">
             <w:r>
               <w:rPr>
                 <w:rStyle w:val="Hyperlink"/>
@@ -2036,7 +2036,7 @@
                 <w:noProof/>
                 <w:webHidden/>
               </w:rPr>
-              <w:instrText xml:space="preserve"> PAGEREF _Toc244101538 \h </w:instrText>
+              <w:instrText xml:space="preserve"> PAGEREF _Toc244106671 \h </w:instrText>
             </w:r>
             <w:r>
               <w:rPr>
@@ -2083,7 +2083,7 @@
               <w14:ligatures w14:val="standardContextual"/>
             </w:rPr>
           </w:pPr>
-          <w:hyperlink w:anchor="_Toc244101539" w:history="1">
+          <w:hyperlink w:anchor="_Toc244106672" w:history="1">
             <w:r>
               <w:rPr>
                 <w:rStyle w:val="Hyperlink"/>
@@ -2110,7 +2110,7 @@
                 <w:noProof/>
                 <w:webHidden/>
               </w:rPr>
-              <w:instrText xml:space="preserve"> PAGEREF _Toc244101539 \h </w:instrText>
+              <w:instrText xml:space="preserve"> PAGEREF _Toc244106672 \h </w:instrText>
             </w:r>
             <w:r>
               <w:rPr>
@@ -2157,7 +2157,7 @@
               <w14:ligatures w14:val="standardContextual"/>
             </w:rPr>
           </w:pPr>
-          <w:hyperlink w:anchor="_Toc244101540" w:history="1">
+          <w:hyperlink w:anchor="_Toc244106673" w:history="1">
             <w:r>
               <w:rPr>
                 <w:rStyle w:val="Hyperlink"/>
@@ -2184,7 +2184,7 @@
                 <w:noProof/>
                 <w:webHidden/>
               </w:rPr>
-              <w:instrText xml:space="preserve"> PAGEREF _Toc244101540 \h </w:instrText>
+              <w:instrText xml:space="preserve"> PAGEREF _Toc244106673 \h </w:instrText>
             </w:r>
             <w:r>
               <w:rPr>
@@ -2231,7 +2231,7 @@
               <w14:ligatures w14:val="standardContextual"/>
             </w:rPr>
           </w:pPr>
-          <w:hyperlink w:anchor="_Toc244101541" w:history="1">
+          <w:hyperlink w:anchor="_Toc244106674" w:history="1">
             <w:r>
               <w:rPr>
                 <w:rStyle w:val="Hyperlink"/>
@@ -2258,7 +2258,7 @@
                 <w:noProof/>
                 <w:webHidden/>
               </w:rPr>
-              <w:instrText xml:space="preserve"> PAGEREF _Toc244101541 \h </w:instrText>
+              <w:instrText xml:space="preserve"> PAGEREF _Toc244106674 \h </w:instrText>
             </w:r>
             <w:r>
               <w:rPr>
@@ -2305,7 +2305,7 @@
               <w14:ligatures w14:val="standardContextual"/>
             </w:rPr>
           </w:pPr>
-          <w:hyperlink w:anchor="_Toc244101542" w:history="1">
+          <w:hyperlink w:anchor="_Toc244106675" w:history="1">
             <w:r>
               <w:rPr>
                 <w:rStyle w:val="Hyperlink"/>
@@ -2332,7 +2332,7 @@
                 <w:noProof/>
                 <w:webHidden/>
               </w:rPr>
-              <w:instrText xml:space="preserve"> PAGEREF _Toc244101542 \h </w:instrText>
+              <w:instrText xml:space="preserve"> PAGEREF _Toc244106675 \h </w:instrText>
             </w:r>
             <w:r>
               <w:rPr>
@@ -2379,7 +2379,7 @@
               <w14:ligatures w14:val="standardContextual"/>
             </w:rPr>
           </w:pPr>
-          <w:hyperlink w:anchor="_Toc244101543" w:history="1">
+          <w:hyperlink w:anchor="_Toc244106676" w:history="1">
             <w:r>
               <w:rPr>
                 <w:rStyle w:val="Hyperlink"/>
@@ -2406,7 +2406,7 @@
                 <w:noProof/>
                 <w:webHidden/>
               </w:rPr>
-              <w:instrText xml:space="preserve"> PAGEREF _Toc244101543 \h </w:instrText>
+              <w:instrText xml:space="preserve"> PAGEREF _Toc244106676 \h </w:instrText>
             </w:r>
             <w:r>
               <w:rPr>
@@ -2453,7 +2453,7 @@
               <w14:ligatures w14:val="standardContextual"/>
             </w:rPr>
           </w:pPr>
-          <w:hyperlink w:anchor="_Toc244101544" w:history="1">
+          <w:hyperlink w:anchor="_Toc244106677" w:history="1">
             <w:r>
               <w:rPr>
                 <w:rStyle w:val="Hyperlink"/>
@@ -2480,7 +2480,7 @@
                 <w:noProof/>
                 <w:webHidden/>
               </w:rPr>
-              <w:instrText xml:space="preserve"> PAGEREF _Toc244101544 \h </w:instrText>
+              <w:instrText xml:space="preserve"> PAGEREF _Toc244106677 \h </w:instrText>
             </w:r>
             <w:r>
               <w:rPr>
@@ -2527,7 +2527,7 @@
               <w14:ligatures w14:val="standardContextual"/>
             </w:rPr>
           </w:pPr>
-          <w:hyperlink w:anchor="_Toc244101545" w:history="1">
+          <w:hyperlink w:anchor="_Toc244106678" w:history="1">
             <w:r>
               <w:rPr>
                 <w:rStyle w:val="Hyperlink"/>
@@ -2554,7 +2554,7 @@
                 <w:noProof/>
                 <w:webHidden/>
               </w:rPr>
-              <w:instrText xml:space="preserve"> PAGEREF _Toc244101545 \h </w:instrText>
+              <w:instrText xml:space="preserve"> PAGEREF _Toc244106678 \h </w:instrText>
             </w:r>
             <w:r>
               <w:rPr>
@@ -2601,7 +2601,7 @@
               <w14:ligatures w14:val="standardContextual"/>
             </w:rPr>
           </w:pPr>
-          <w:hyperlink w:anchor="_Toc244101546" w:history="1">
+          <w:hyperlink w:anchor="_Toc244106679" w:history="1">
             <w:r>
               <w:rPr>
                 <w:rStyle w:val="Hyperlink"/>
@@ -2628,7 +2628,7 @@
                 <w:noProof/>
                 <w:webHidden/>
               </w:rPr>
-              <w:instrText xml:space="preserve"> PAGEREF _Toc244101546 \h </w:instrText>
+              <w:instrText xml:space="preserve"> PAGEREF _Toc244106679 \h </w:instrText>
             </w:r>
             <w:r>
               <w:rPr>
@@ -2675,7 +2675,7 @@
               <w14:ligatures w14:val="standardContextual"/>
             </w:rPr>
           </w:pPr>
-          <w:hyperlink w:anchor="_Toc244101547" w:history="1">
+          <w:hyperlink w:anchor="_Toc244106680" w:history="1">
             <w:r>
               <w:rPr>
                 <w:rStyle w:val="Hyperlink"/>
@@ -2702,7 +2702,7 @@
                 <w:noProof/>
                 <w:webHidden/>
               </w:rPr>
-              <w:instrText xml:space="preserve"> PAGEREF _Toc244101547 \h </w:instrText>
+              <w:instrText xml:space="preserve"> PAGEREF _Toc244106680 \h </w:instrText>
             </w:r>
             <w:r>
               <w:rPr>
@@ -2749,7 +2749,7 @@
               <w14:ligatures w14:val="standardContextual"/>
             </w:rPr>
           </w:pPr>
-          <w:hyperlink w:anchor="_Toc244101548" w:history="1">
+          <w:hyperlink w:anchor="_Toc244106681" w:history="1">
             <w:r>
               <w:rPr>
                 <w:rStyle w:val="Hyperlink"/>
@@ -2776,7 +2776,7 @@
                 <w:noProof/>
                 <w:webHidden/>
               </w:rPr>
-              <w:instrText xml:space="preserve"> PAGEREF _Toc244101548 \h </w:instrText>
+              <w:instrText xml:space="preserve"> PAGEREF _Toc244106681 \h </w:instrText>
             </w:r>
             <w:r>
               <w:rPr>
@@ -2823,7 +2823,7 @@
               <w14:ligatures w14:val="standardContextual"/>
             </w:rPr>
           </w:pPr>
-          <w:hyperlink w:anchor="_Toc244101549" w:history="1">
+          <w:hyperlink w:anchor="_Toc244106682" w:history="1">
             <w:r>
               <w:rPr>
                 <w:rStyle w:val="Hyperlink"/>
@@ -2850,7 +2850,7 @@
                 <w:noProof/>
                 <w:webHidden/>
               </w:rPr>
-              <w:instrText xml:space="preserve"> PAGEREF _Toc244101549 \h </w:instrText>
+              <w:instrText xml:space="preserve"> PAGEREF _Toc244106682 \h </w:instrText>
             </w:r>
             <w:r>
               <w:rPr>
@@ -2897,7 +2897,7 @@
               <w14:ligatures w14:val="standardContextual"/>
             </w:rPr>
           </w:pPr>
-          <w:hyperlink w:anchor="_Toc244101550" w:history="1">
+          <w:hyperlink w:anchor="_Toc244106683" w:history="1">
             <w:r>
               <w:rPr>
                 <w:rStyle w:val="Hyperlink"/>
@@ -2924,7 +2924,7 @@
                 <w:noProof/>
                 <w:webHidden/>
               </w:rPr>
-              <w:instrText xml:space="preserve"> PAGEREF _Toc244101550 \h </w:instrText>
+              <w:instrText xml:space="preserve"> PAGEREF _Toc244106683 \h </w:instrText>
             </w:r>
             <w:r>
               <w:rPr>
@@ -2971,7 +2971,7 @@
               <w14:ligatures w14:val="standardContextual"/>
             </w:rPr>
           </w:pPr>
-          <w:hyperlink w:anchor="_Toc244101551" w:history="1">
+          <w:hyperlink w:anchor="_Toc244106684" w:history="1">
             <w:r>
               <w:rPr>
                 <w:rStyle w:val="Hyperlink"/>
@@ -2998,7 +2998,7 @@
                 <w:noProof/>
                 <w:webHidden/>
               </w:rPr>
-              <w:instrText xml:space="preserve"> PAGEREF _Toc244101551 \h </w:instrText>
+              <w:instrText xml:space="preserve"> PAGEREF _Toc244106684 \h </w:instrText>
             </w:r>
             <w:r>
               <w:rPr>
@@ -3045,7 +3045,7 @@
               <w14:ligatures w14:val="standardContextual"/>
             </w:rPr>
           </w:pPr>
-          <w:hyperlink w:anchor="_Toc244101552" w:history="1">
+          <w:hyperlink w:anchor="_Toc244106685" w:history="1">
             <w:r>
               <w:rPr>
                 <w:rStyle w:val="Hyperlink"/>
@@ -3072,7 +3072,7 @@
                 <w:noProof/>
                 <w:webHidden/>
               </w:rPr>
-              <w:instrText xml:space="preserve"> PAGEREF _Toc244101552 \h </w:instrText>
+              <w:instrText xml:space="preserve"> PAGEREF _Toc244106685 \h </w:instrText>
             </w:r>
             <w:r>
               <w:rPr>
@@ -3119,7 +3119,7 @@
               <w14:ligatures w14:val="standardContextual"/>
             </w:rPr>
           </w:pPr>
-          <w:hyperlink w:anchor="_Toc244101553" w:history="1">
+          <w:hyperlink w:anchor="_Toc244106686" w:history="1">
             <w:r>
               <w:rPr>
                 <w:rStyle w:val="Hyperlink"/>
@@ -3146,7 +3146,7 @@
                 <w:noProof/>
                 <w:webHidden/>
               </w:rPr>
-              <w:instrText xml:space="preserve"> PAGEREF _Toc244101553 \h </w:instrText>
+              <w:instrText xml:space="preserve"> PAGEREF _Toc244106686 \h </w:instrText>
             </w:r>
             <w:r>
               <w:rPr>
@@ -3193,7 +3193,7 @@
               <w14:ligatures w14:val="standardContextual"/>
             </w:rPr>
           </w:pPr>
-          <w:hyperlink w:anchor="_Toc244101554" w:history="1">
+          <w:hyperlink w:anchor="_Toc244106687" w:history="1">
             <w:r>
               <w:rPr>
                 <w:rStyle w:val="Hyperlink"/>
@@ -3220,7 +3220,7 @@
                 <w:noProof/>
                 <w:webHidden/>
               </w:rPr>
-              <w:instrText xml:space="preserve"> PAGEREF _Toc244101554 \h </w:instrText>
+              <w:instrText xml:space="preserve"> PAGEREF _Toc244106687 \h </w:instrText>
             </w:r>
             <w:r>
               <w:rPr>
@@ -3267,7 +3267,7 @@
               <w14:ligatures w14:val="standardContextual"/>
             </w:rPr>
           </w:pPr>
-          <w:hyperlink w:anchor="_Toc244101555" w:history="1">
+          <w:hyperlink w:anchor="_Toc244106688" w:history="1">
             <w:r>
               <w:rPr>
                 <w:rStyle w:val="Hyperlink"/>
@@ -3294,7 +3294,7 @@
                 <w:noProof/>
                 <w:webHidden/>
               </w:rPr>
-              <w:instrText xml:space="preserve"> PAGEREF _Toc244101555 \h </w:instrText>
+              <w:instrText xml:space="preserve"> PAGEREF _Toc244106688 \h </w:instrText>
             </w:r>
             <w:r>
               <w:rPr>
@@ -3341,7 +3341,7 @@
               <w14:ligatures w14:val="standardContextual"/>
             </w:rPr>
           </w:pPr>
-          <w:hyperlink w:anchor="_Toc244101556" w:history="1">
+          <w:hyperlink w:anchor="_Toc244106689" w:history="1">
             <w:r>
               <w:rPr>
                 <w:rStyle w:val="Hyperlink"/>
@@ -3368,7 +3368,7 @@
                 <w:noProof/>
                 <w:webHidden/>
               </w:rPr>
-              <w:instrText xml:space="preserve"> PAGEREF _Toc244101556 \h </w:instrText>
+              <w:instrText xml:space="preserve"> PAGEREF _Toc244106689 \h </w:instrText>
             </w:r>
             <w:r>
               <w:rPr>
@@ -3415,7 +3415,7 @@
               <w14:ligatures w14:val="standardContextual"/>
             </w:rPr>
           </w:pPr>
-          <w:hyperlink w:anchor="_Toc244101557" w:history="1">
+          <w:hyperlink w:anchor="_Toc244106690" w:history="1">
             <w:r>
               <w:rPr>
                 <w:rStyle w:val="Hyperlink"/>
@@ -3442,7 +3442,7 @@
                 <w:noProof/>
                 <w:webHidden/>
               </w:rPr>
-              <w:instrText xml:space="preserve"> PAGEREF _Toc244101557 \h </w:instrText>
+              <w:instrText xml:space="preserve"> PAGEREF _Toc244106690 \h </w:instrText>
             </w:r>
             <w:r>
               <w:rPr>
@@ -3489,7 +3489,7 @@
               <w14:ligatures w14:val="standardContextual"/>
             </w:rPr>
           </w:pPr>
-          <w:hyperlink w:anchor="_Toc244101558" w:history="1">
+          <w:hyperlink w:anchor="_Toc244106691" w:history="1">
             <w:r>
               <w:rPr>
                 <w:rStyle w:val="Hyperlink"/>
@@ -3516,7 +3516,7 @@
                 <w:noProof/>
                 <w:webHidden/>
               </w:rPr>
-              <w:instrText xml:space="preserve"> PAGEREF _Toc244101558 \h </w:instrText>
+              <w:instrText xml:space="preserve"> PAGEREF _Toc244106691 \h </w:instrText>
             </w:r>
             <w:r>
               <w:rPr>
@@ -3563,7 +3563,7 @@
               <w14:ligatures w14:val="standardContextual"/>
             </w:rPr>
           </w:pPr>
-          <w:hyperlink w:anchor="_Toc244101559" w:history="1">
+          <w:hyperlink w:anchor="_Toc244106692" w:history="1">
             <w:r>
               <w:rPr>
                 <w:rStyle w:val="Hyperlink"/>
@@ -3590,7 +3590,7 @@
                 <w:noProof/>
                 <w:webHidden/>
               </w:rPr>
-              <w:instrText xml:space="preserve"> PAGEREF _Toc244101559 \h </w:instrText>
+              <w:instrText xml:space="preserve"> PAGEREF _Toc244106692 \h </w:instrText>
             </w:r>
             <w:r>
               <w:rPr>
@@ -3637,7 +3637,7 @@
               <w14:ligatures w14:val="standardContextual"/>
             </w:rPr>
           </w:pPr>
-          <w:hyperlink w:anchor="_Toc244101560" w:history="1">
+          <w:hyperlink w:anchor="_Toc244106693" w:history="1">
             <w:r>
               <w:rPr>
                 <w:rStyle w:val="Hyperlink"/>
@@ -3664,7 +3664,7 @@
                 <w:noProof/>
                 <w:webHidden/>
               </w:rPr>
-              <w:instrText xml:space="preserve"> PAGEREF _Toc244101560 \h </w:instrText>
+              <w:instrText xml:space="preserve"> PAGEREF _Toc244106693 \h </w:instrText>
             </w:r>
             <w:r>
               <w:rPr>
@@ -3711,7 +3711,7 @@
               <w14:ligatures w14:val="standardContextual"/>
             </w:rPr>
           </w:pPr>
-          <w:hyperlink w:anchor="_Toc244101561" w:history="1">
+          <w:hyperlink w:anchor="_Toc244106694" w:history="1">
             <w:r>
               <w:rPr>
                 <w:rStyle w:val="Hyperlink"/>
@@ -3738,7 +3738,7 @@
                 <w:noProof/>
                 <w:webHidden/>
               </w:rPr>
-              <w:instrText xml:space="preserve"> PAGEREF _Toc244101561 \h </w:instrText>
+              <w:instrText xml:space="preserve"> PAGEREF _Toc244106694 \h </w:instrText>
             </w:r>
             <w:r>
               <w:rPr>
@@ -3785,7 +3785,7 @@
               <w14:ligatures w14:val="standardContextual"/>
             </w:rPr>
           </w:pPr>
-          <w:hyperlink w:anchor="_Toc244101562" w:history="1">
+          <w:hyperlink w:anchor="_Toc244106695" w:history="1">
             <w:r>
               <w:rPr>
                 <w:rStyle w:val="Hyperlink"/>
@@ -3812,7 +3812,7 @@
                 <w:noProof/>
                 <w:webHidden/>
               </w:rPr>
-              <w:instrText xml:space="preserve"> PAGEREF _Toc244101562 \h </w:instrText>
+              <w:instrText xml:space="preserve"> PAGEREF _Toc244106695 \h </w:instrText>
             </w:r>
             <w:r>
               <w:rPr>
@@ -3859,7 +3859,7 @@
               <w14:ligatures w14:val="standardContextual"/>
             </w:rPr>
           </w:pPr>
-          <w:hyperlink w:anchor="_Toc244101563" w:history="1">
+          <w:hyperlink w:anchor="_Toc244106696" w:history="1">
             <w:r>
               <w:rPr>
                 <w:rStyle w:val="Hyperlink"/>
@@ -3886,7 +3886,7 @@
                 <w:noProof/>
                 <w:webHidden/>
               </w:rPr>
-              <w:instrText xml:space="preserve"> PAGEREF _Toc244101563 \h </w:instrText>
+              <w:instrText xml:space="preserve"> PAGEREF _Toc244106696 \h </w:instrText>
             </w:r>
             <w:r>
               <w:rPr>
@@ -3933,7 +3933,7 @@
               <w14:ligatures w14:val="standardContextual"/>
             </w:rPr>
           </w:pPr>
-          <w:hyperlink w:anchor="_Toc244101564" w:history="1">
+          <w:hyperlink w:anchor="_Toc244106697" w:history="1">
             <w:r>
               <w:rPr>
                 <w:rStyle w:val="Hyperlink"/>
@@ -3960,7 +3960,7 @@
                 <w:noProof/>
                 <w:webHidden/>
               </w:rPr>
-              <w:instrText xml:space="preserve"> PAGEREF _Toc244101564 \h </w:instrText>
+              <w:instrText xml:space="preserve"> PAGEREF _Toc244106697 \h </w:instrText>
             </w:r>
             <w:r>
               <w:rPr>
@@ -4007,7 +4007,7 @@
               <w14:ligatures w14:val="standardContextual"/>
             </w:rPr>
           </w:pPr>
-          <w:hyperlink w:anchor="_Toc244101565" w:history="1">
+          <w:hyperlink w:anchor="_Toc244106698" w:history="1">
             <w:r>
               <w:rPr>
                 <w:rStyle w:val="Hyperlink"/>
@@ -4034,7 +4034,7 @@
                 <w:noProof/>
                 <w:webHidden/>
               </w:rPr>
-              <w:instrText xml:space="preserve"> PAGEREF _Toc244101565 \h </w:instrText>
+              <w:instrText xml:space="preserve"> PAGEREF _Toc244106698 \h </w:instrText>
             </w:r>
             <w:r>
               <w:rPr>
@@ -4081,7 +4081,7 @@
               <w14:ligatures w14:val="standardContextual"/>
             </w:rPr>
           </w:pPr>
-          <w:hyperlink w:anchor="_Toc244101566" w:history="1">
+          <w:hyperlink w:anchor="_Toc244106699" w:history="1">
             <w:r>
               <w:rPr>
                 <w:rStyle w:val="Hyperlink"/>
@@ -4108,7 +4108,7 @@
                 <w:noProof/>
                 <w:webHidden/>
               </w:rPr>
-              <w:instrText xml:space="preserve"> PAGEREF _Toc244101566 \h </w:instrText>
+              <w:instrText xml:space="preserve"> PAGEREF _Toc244106699 \h </w:instrText>
             </w:r>
             <w:r>
               <w:rPr>
@@ -4155,7 +4155,7 @@
               <w14:ligatures w14:val="standardContextual"/>
             </w:rPr>
           </w:pPr>
-          <w:hyperlink w:anchor="_Toc244101567" w:history="1">
+          <w:hyperlink w:anchor="_Toc244106700" w:history="1">
             <w:r>
               <w:rPr>
                 <w:rStyle w:val="Hyperlink"/>
@@ -4182,7 +4182,7 @@
                 <w:noProof/>
                 <w:webHidden/>
               </w:rPr>
-              <w:instrText xml:space="preserve"> PAGEREF _Toc244101567 \h </w:instrText>
+              <w:instrText xml:space="preserve"> PAGEREF _Toc244106700 \h </w:instrText>
             </w:r>
             <w:r>
               <w:rPr>
@@ -4229,7 +4229,7 @@
               <w14:ligatures w14:val="standardContextual"/>
             </w:rPr>
           </w:pPr>
-          <w:hyperlink w:anchor="_Toc244101568" w:history="1">
+          <w:hyperlink w:anchor="_Toc244106701" w:history="1">
             <w:r>
               <w:rPr>
                 <w:rStyle w:val="Hyperlink"/>
@@ -4256,7 +4256,7 @@
                 <w:noProof/>
                 <w:webHidden/>
               </w:rPr>
-              <w:instrText xml:space="preserve"> PAGEREF _Toc244101568 \h </w:instrText>
+              <w:instrText xml:space="preserve"> PAGEREF _Toc244106701 \h </w:instrText>
             </w:r>
             <w:r>
               <w:rPr>
@@ -4303,7 +4303,7 @@
               <w14:ligatures w14:val="standardContextual"/>
             </w:rPr>
           </w:pPr>
-          <w:hyperlink w:anchor="_Toc244101569" w:history="1">
+          <w:hyperlink w:anchor="_Toc244106702" w:history="1">
             <w:r>
               <w:rPr>
                 <w:rStyle w:val="Hyperlink"/>
@@ -4330,7 +4330,7 @@
                 <w:noProof/>
                 <w:webHidden/>
               </w:rPr>
-              <w:instrText xml:space="preserve"> PAGEREF _Toc244101569 \h </w:instrText>
+              <w:instrText xml:space="preserve"> PAGEREF _Toc244106702 \h </w:instrText>
             </w:r>
             <w:r>
               <w:rPr>
@@ -4377,7 +4377,7 @@
               <w14:ligatures w14:val="standardContextual"/>
             </w:rPr>
           </w:pPr>
-          <w:hyperlink w:anchor="_Toc244101570" w:history="1">
+          <w:hyperlink w:anchor="_Toc244106703" w:history="1">
             <w:r>
               <w:rPr>
                 <w:rStyle w:val="Hyperlink"/>
@@ -4404,7 +4404,7 @@
                 <w:noProof/>
                 <w:webHidden/>
               </w:rPr>
-              <w:instrText xml:space="preserve"> PAGEREF _Toc244101570 \h </w:instrText>
+              <w:instrText xml:space="preserve"> PAGEREF _Toc244106703 \h </w:instrText>
             </w:r>
             <w:r>
               <w:rPr>
@@ -4451,7 +4451,7 @@
               <w14:ligatures w14:val="standardContextual"/>
             </w:rPr>
           </w:pPr>
-          <w:hyperlink w:anchor="_Toc244101571" w:history="1">
+          <w:hyperlink w:anchor="_Toc244106704" w:history="1">
             <w:r>
               <w:rPr>
                 <w:rStyle w:val="Hyperlink"/>
@@ -4478,7 +4478,7 @@
                 <w:noProof/>
                 <w:webHidden/>
               </w:rPr>
-              <w:instrText xml:space="preserve"> PAGEREF _Toc244101571 \h </w:instrText>
+              <w:instrText xml:space="preserve"> PAGEREF _Toc244106704 \h </w:instrText>
             </w:r>
             <w:r>
               <w:rPr>
@@ -4525,7 +4525,7 @@
               <w14:ligatures w14:val="standardContextual"/>
             </w:rPr>
           </w:pPr>
-          <w:hyperlink w:anchor="_Toc244101572" w:history="1">
+          <w:hyperlink w:anchor="_Toc244106705" w:history="1">
             <w:r>
               <w:rPr>
                 <w:rStyle w:val="Hyperlink"/>
@@ -4552,7 +4552,7 @@
                 <w:noProof/>
                 <w:webHidden/>
               </w:rPr>
-              <w:instrText xml:space="preserve"> PAGEREF _Toc244101572 \h </w:instrText>
+              <w:instrText xml:space="preserve"> PAGEREF _Toc244106705 \h </w:instrText>
             </w:r>
             <w:r>
               <w:rPr>
@@ -4599,7 +4599,7 @@
               <w14:ligatures w14:val="standardContextual"/>
             </w:rPr>
           </w:pPr>
-          <w:hyperlink w:anchor="_Toc244101573" w:history="1">
+          <w:hyperlink w:anchor="_Toc244106706" w:history="1">
             <w:r>
               <w:rPr>
                 <w:rStyle w:val="Hyperlink"/>
@@ -4626,7 +4626,7 @@
                 <w:noProof/>
                 <w:webHidden/>
               </w:rPr>
-              <w:instrText xml:space="preserve"> PAGEREF _Toc244101573 \h </w:instrText>
+              <w:instrText xml:space="preserve"> PAGEREF _Toc244106706 \h </w:instrText>
             </w:r>
             <w:r>
               <w:rPr>
@@ -4670,7 +4670,7 @@
         <w:pageBreakBefore/>
       </w:pPr>
       <w:bookmarkStart w:id="0" w:name="mở-đầu"/>
-      <w:bookmarkStart w:id="1" w:name="_Toc244101513"/>
+      <w:bookmarkStart w:id="1" w:name="_Toc244106646"/>
       <w:r>
         <w:lastRenderedPageBreak/>
         <w:t>Mở đầu</w:t>
@@ -4745,7 +4745,7 @@
           <w:noProof/>
         </w:rPr>
         <w:drawing>
-          <wp:inline distT="0" distB="0" distL="0" distR="0" wp14:anchorId="3133E714" wp14:editId="2F34B2A6">
+          <wp:inline distT="0" distB="0" distL="0" distR="0" wp14:anchorId="0F1FA575" wp14:editId="4C1B3213">
             <wp:extent cx="5760000" cy="3922758"/>
             <wp:effectExtent l="0" t="0" r="0" b="0"/>
             <wp:docPr id="19" name="Picture" descr="Hình 1 Trang chủ công khai với hai giải demo đã hoàn tất"/>
@@ -4834,7 +4834,7 @@
         <w:pageBreakBefore/>
       </w:pPr>
       <w:bookmarkStart w:id="2" w:name="phần-a-giải-đấu"/>
-      <w:bookmarkStart w:id="3" w:name="_Toc244101514"/>
+      <w:bookmarkStart w:id="3" w:name="_Toc244106647"/>
       <w:bookmarkEnd w:id="0"/>
       <w:r>
         <w:lastRenderedPageBreak/>
@@ -4847,7 +4847,7 @@
         <w:pStyle w:val="Heading2"/>
       </w:pPr>
       <w:bookmarkStart w:id="4" w:name="a1-trò-chơi-ottv2"/>
-      <w:bookmarkStart w:id="5" w:name="_Toc244101515"/>
+      <w:bookmarkStart w:id="5" w:name="_Toc244106648"/>
       <w:r>
         <w:t>1. Trò chơi OTTv2</w:t>
       </w:r>
@@ -5128,7 +5128,7 @@
         <w:pStyle w:val="Heading2"/>
       </w:pPr>
       <w:bookmarkStart w:id="6" w:name="a2-tài-khoản-và-đội"/>
-      <w:bookmarkStart w:id="7" w:name="_Toc244101516"/>
+      <w:bookmarkStart w:id="7" w:name="_Toc244106649"/>
       <w:bookmarkEnd w:id="4"/>
       <w:r>
         <w:t>2. Tài khoản và đội</w:t>
@@ -5447,7 +5447,7 @@
         <w:pStyle w:val="Heading2"/>
       </w:pPr>
       <w:bookmarkStart w:id="8" w:name="a3-nộp-bot-qua-github"/>
-      <w:bookmarkStart w:id="9" w:name="_Toc244101517"/>
+      <w:bookmarkStart w:id="9" w:name="_Toc244106650"/>
       <w:bookmarkEnd w:id="6"/>
       <w:r>
         <w:t>3. Nộp bot qua GitHub</w:t>
@@ -5871,7 +5871,7 @@
         <w:pStyle w:val="Heading2"/>
       </w:pPr>
       <w:bookmarkStart w:id="10" w:name="a4-thể-lệ-và-lịch-đấu"/>
-      <w:bookmarkStart w:id="11" w:name="_Toc244101518"/>
+      <w:bookmarkStart w:id="11" w:name="_Toc244106651"/>
       <w:bookmarkEnd w:id="8"/>
       <w:r>
         <w:t>4. Thể lệ và lịch đấu</w:t>
@@ -5883,7 +5883,7 @@
         <w:pStyle w:val="Heading3"/>
       </w:pPr>
       <w:bookmarkStart w:id="12" w:name="ladder-trước-hạn"/>
-      <w:bookmarkStart w:id="13" w:name="_Toc244101519"/>
+      <w:bookmarkStart w:id="13" w:name="_Toc244106652"/>
       <w:r>
         <w:t>4.1. Ladder trước hạn</w:t>
       </w:r>
@@ -5943,7 +5943,7 @@
         <w:pStyle w:val="Heading3"/>
       </w:pPr>
       <w:bookmarkStart w:id="14" w:name="chốt-bài-tại-hạn"/>
-      <w:bookmarkStart w:id="15" w:name="_Toc244101520"/>
+      <w:bookmarkStart w:id="15" w:name="_Toc244106653"/>
       <w:bookmarkEnd w:id="12"/>
       <w:r>
         <w:lastRenderedPageBreak/>
@@ -5969,7 +5969,7 @@
         <w:pStyle w:val="Heading3"/>
       </w:pPr>
       <w:bookmarkStart w:id="16" w:name="xếp-hạng-chính-thức"/>
-      <w:bookmarkStart w:id="17" w:name="_Toc244101521"/>
+      <w:bookmarkStart w:id="17" w:name="_Toc244106654"/>
       <w:bookmarkEnd w:id="14"/>
       <w:r>
         <w:t>4.3. Xếp hạng chính thức</w:t>
@@ -6320,7 +6320,7 @@
         <w:pStyle w:val="Heading2"/>
       </w:pPr>
       <w:bookmarkStart w:id="18" w:name="a5-xem-kết-quả"/>
-      <w:bookmarkStart w:id="19" w:name="_Toc244101522"/>
+      <w:bookmarkStart w:id="19" w:name="_Toc244106655"/>
       <w:bookmarkEnd w:id="10"/>
       <w:bookmarkEnd w:id="16"/>
       <w:r>
@@ -6344,7 +6344,7 @@
         </w:rPr>
         <w:lastRenderedPageBreak/>
         <w:drawing>
-          <wp:inline distT="0" distB="0" distL="0" distR="0" wp14:anchorId="13B64F9E" wp14:editId="5419148C">
+          <wp:inline distT="0" distB="0" distL="0" distR="0" wp14:anchorId="4A5CE210" wp14:editId="68594D83">
             <wp:extent cx="5759999" cy="5603684"/>
             <wp:effectExtent l="0" t="0" r="0" b="0"/>
             <wp:docPr id="35" name="Picture" descr="Hình 2 Bảng điểm vòng tròn của giải qua GitHub sau khi hoàn tất 12 ván"/>
@@ -6423,7 +6423,7 @@
         </w:rPr>
         <w:lastRenderedPageBreak/>
         <w:drawing>
-          <wp:inline distT="0" distB="0" distL="0" distR="0" wp14:anchorId="613628E2" wp14:editId="75CB40C3">
+          <wp:inline distT="0" distB="0" distL="0" distR="0" wp14:anchorId="44FF824A" wp14:editId="193639B6">
             <wp:extent cx="5579999" cy="7011709"/>
             <wp:effectExtent l="0" t="0" r="0" b="0"/>
             <wp:docPr id="38" name="Picture" descr="Hình 3 Replay một ván đã kết thúc bằng chiếm căn cứ"/>
@@ -6488,7 +6488,7 @@
         <w:pStyle w:val="Heading2"/>
       </w:pPr>
       <w:bookmarkStart w:id="20" w:name="a6-ban-tổ-chức-và-điều-hành"/>
-      <w:bookmarkStart w:id="21" w:name="_Toc244101523"/>
+      <w:bookmarkStart w:id="21" w:name="_Toc244106656"/>
       <w:bookmarkEnd w:id="18"/>
       <w:r>
         <w:t>6. Ban tổ chức và điều hành</w:t>
@@ -6519,7 +6519,7 @@
         </w:rPr>
         <w:lastRenderedPageBreak/>
         <w:drawing>
-          <wp:inline distT="0" distB="0" distL="0" distR="0" wp14:anchorId="118070CE" wp14:editId="07743AF9">
+          <wp:inline distT="0" distB="0" distL="0" distR="0" wp14:anchorId="5050B303" wp14:editId="42F06743">
             <wp:extent cx="5759999" cy="3254999"/>
             <wp:effectExtent l="0" t="0" r="0" b="0"/>
             <wp:docPr id="42" name="Picture" descr="Hình 4 Phần chính của biểu mẫu tạo giải với các giá trị mặc định"/>
@@ -6607,7 +6607,7 @@
       <w:pPr>
         <w:pStyle w:val="Heading2"/>
       </w:pPr>
-      <w:bookmarkStart w:id="22" w:name="_Toc244101524"/>
+      <w:bookmarkStart w:id="22" w:name="_Toc244106657"/>
       <w:r>
         <w:t>7. Chung kết tại hội trường</w:t>
       </w:r>
@@ -7042,7 +7042,7 @@
         <w:pageBreakBefore/>
       </w:pPr>
       <w:bookmarkStart w:id="23" w:name="phần-b-thiết-kế-kỹ-thuật"/>
-      <w:bookmarkStart w:id="24" w:name="_Toc244101525"/>
+      <w:bookmarkStart w:id="24" w:name="_Toc244106658"/>
       <w:bookmarkEnd w:id="2"/>
       <w:bookmarkEnd w:id="20"/>
       <w:r>
@@ -7056,7 +7056,7 @@
         <w:pStyle w:val="Heading2"/>
       </w:pPr>
       <w:bookmarkStart w:id="25" w:name="b1-kiến-trúc-tổng-thể"/>
-      <w:bookmarkStart w:id="26" w:name="_Toc244101526"/>
+      <w:bookmarkStart w:id="26" w:name="_Toc244106659"/>
       <w:r>
         <w:t>1. Kiến trúc tổng thể</w:t>
       </w:r>
@@ -7077,7 +7077,7 @@
           <w:noProof/>
         </w:rPr>
         <w:drawing>
-          <wp:inline distT="0" distB="0" distL="0" distR="0" wp14:anchorId="11071569" wp14:editId="57CD2466">
+          <wp:inline distT="0" distB="0" distL="0" distR="0" wp14:anchorId="1BB641C5" wp14:editId="3A05E088">
             <wp:extent cx="5759999" cy="3702857"/>
             <wp:effectExtent l="0" t="0" r="0" b="0"/>
             <wp:docPr id="47" name="Picture" descr="Hình 5 Kiến trúc triển khai; các mũi tên biểu diễn kết nối hoặc yêu cầu giữa các thành phần"/>
@@ -7158,7 +7158,7 @@
         <w:pStyle w:val="Heading2"/>
       </w:pPr>
       <w:bookmarkStart w:id="27" w:name="b2-dịch-vụ-được-dùng"/>
-      <w:bookmarkStart w:id="28" w:name="_Toc244101527"/>
+      <w:bookmarkStart w:id="28" w:name="_Toc244106660"/>
       <w:bookmarkEnd w:id="25"/>
       <w:r>
         <w:lastRenderedPageBreak/>
@@ -7490,7 +7490,7 @@
         <w:pStyle w:val="Heading2"/>
       </w:pPr>
       <w:bookmarkStart w:id="29" w:name="b3-hub-và-cách-phục-vụ-dữ-liệu"/>
-      <w:bookmarkStart w:id="30" w:name="_Toc244101528"/>
+      <w:bookmarkStart w:id="30" w:name="_Toc244106661"/>
       <w:bookmarkEnd w:id="27"/>
       <w:r>
         <w:t>3. Hub và cách phục vụ dữ liệu</w:t>
@@ -7569,7 +7569,7 @@
         <w:pStyle w:val="Heading2"/>
       </w:pPr>
       <w:bookmarkStart w:id="31" w:name="b4-máy-chấm-và-chia-việc"/>
-      <w:bookmarkStart w:id="32" w:name="_Toc244101529"/>
+      <w:bookmarkStart w:id="32" w:name="_Toc244106662"/>
       <w:bookmarkEnd w:id="29"/>
       <w:r>
         <w:t>4. Máy chấm và chia việc</w:t>
@@ -7611,7 +7611,7 @@
           <w:noProof/>
         </w:rPr>
         <w:drawing>
-          <wp:inline distT="0" distB="0" distL="0" distR="0" wp14:anchorId="73FA534A" wp14:editId="655A2FD9">
+          <wp:inline distT="0" distB="0" distL="0" distR="0" wp14:anchorId="0E83A391" wp14:editId="6B26A333">
             <wp:extent cx="5759999" cy="3543157"/>
             <wp:effectExtent l="0" t="0" r="0" b="0"/>
             <wp:docPr id="53" name="Picture" descr="Hình 6 Trang quản lý máy chấm trên web thật; tên máy được che, trạng thái phản ánh thời điểm chụp"/>
@@ -7692,7 +7692,7 @@
         <w:pStyle w:val="Heading2"/>
       </w:pPr>
       <w:bookmarkStart w:id="33" w:name="b5-sandbox-thay-docker"/>
-      <w:bookmarkStart w:id="34" w:name="_Toc244101530"/>
+      <w:bookmarkStart w:id="34" w:name="_Toc244106663"/>
       <w:bookmarkEnd w:id="31"/>
       <w:r>
         <w:t>5. Sandbox chạy bot</w:t>
@@ -7734,7 +7734,7 @@
         <w:pStyle w:val="Heading2"/>
       </w:pPr>
       <w:bookmarkStart w:id="35" w:name="b6-quỹ-giờ-và-khả-năng-đối-chiếu"/>
-      <w:bookmarkStart w:id="36" w:name="_Toc244101531"/>
+      <w:bookmarkStart w:id="36" w:name="_Toc244106664"/>
       <w:bookmarkEnd w:id="33"/>
       <w:r>
         <w:t>6. Quỹ giờ và khả năng đối chiếu</w:t>
@@ -7783,7 +7783,7 @@
         <w:pStyle w:val="Heading2"/>
       </w:pPr>
       <w:bookmarkStart w:id="37" w:name="b7-chịu-lỗi-và-sao-lưu"/>
-      <w:bookmarkStart w:id="38" w:name="_Toc244101532"/>
+      <w:bookmarkStart w:id="38" w:name="_Toc244106665"/>
       <w:bookmarkEnd w:id="35"/>
       <w:r>
         <w:t>7. Chịu lỗi và sao lưu</w:t>
@@ -8168,7 +8168,7 @@
         <w:pStyle w:val="Heading2"/>
       </w:pPr>
       <w:bookmarkStart w:id="39" w:name="b8-bảo-mật"/>
-      <w:bookmarkStart w:id="40" w:name="_Toc244101533"/>
+      <w:bookmarkStart w:id="40" w:name="_Toc244106666"/>
       <w:bookmarkEnd w:id="37"/>
       <w:r>
         <w:t>8. Bảo mật</w:t>
@@ -8226,7 +8226,7 @@
         <w:pStyle w:val="Heading2"/>
       </w:pPr>
       <w:bookmarkStart w:id="41" w:name="b9-sức-tải-và-thời-gian-đã-đo"/>
-      <w:bookmarkStart w:id="42" w:name="_Toc244101534"/>
+      <w:bookmarkStart w:id="42" w:name="_Toc244106667"/>
       <w:bookmarkEnd w:id="39"/>
       <w:r>
         <w:t>9. Sức tải và thời gian đã đo</w:t>
@@ -9410,7 +9410,7 @@
       <w:pPr>
         <w:pStyle w:val="Heading2"/>
       </w:pPr>
-      <w:bookmarkStart w:id="43" w:name="_Toc244101535"/>
+      <w:bookmarkStart w:id="43" w:name="_Toc244106668"/>
       <w:bookmarkEnd w:id="41"/>
       <w:r>
         <w:t>10. Cài đặt và vận hành</w:t>
@@ -9524,7 +9524,7 @@
       <w:pPr>
         <w:pStyle w:val="Heading2"/>
       </w:pPr>
-      <w:bookmarkStart w:id="44" w:name="_Toc244101536"/>
+      <w:bookmarkStart w:id="44" w:name="_Toc244106669"/>
       <w:r>
         <w:t>11. Mạng LAN ngày chung kết</w:t>
       </w:r>
@@ -9550,7 +9550,7 @@
           <w:noProof/>
         </w:rPr>
         <w:drawing>
-          <wp:inline distT="0" distB="0" distL="0" distR="0" wp14:anchorId="4FEA7C4F" wp14:editId="71AFD2CA">
+          <wp:inline distT="0" distB="0" distL="0" distR="0" wp14:anchorId="444FDE34" wp14:editId="470C4256">
             <wp:extent cx="5760000" cy="2720000"/>
             <wp:effectExtent l="0" t="0" r="0" b="0"/>
             <wp:docPr id="155" name="Picture 155"/>
@@ -9651,7 +9651,7 @@
         <w:pStyle w:val="Heading2"/>
         <w:pageBreakBefore/>
       </w:pPr>
-      <w:bookmarkStart w:id="45" w:name="_Toc244101537"/>
+      <w:bookmarkStart w:id="45" w:name="_Toc244106670"/>
       <w:r>
         <w:lastRenderedPageBreak/>
         <w:t>12. Giới hạn và hướng tiếp</w:t>
@@ -9745,7 +9745,7 @@
         <w:pageBreakBefore/>
       </w:pPr>
       <w:bookmarkStart w:id="46" w:name="phần-c-hướng-dẫn-demo-từng-bước"/>
-      <w:bookmarkStart w:id="47" w:name="_Toc244101538"/>
+      <w:bookmarkStart w:id="47" w:name="_Toc244106671"/>
       <w:bookmarkEnd w:id="23"/>
       <w:r>
         <w:lastRenderedPageBreak/>
@@ -9763,7 +9763,7 @@
         <w:pStyle w:val="Heading2"/>
       </w:pPr>
       <w:bookmarkStart w:id="48" w:name="c1-khách-xem-giải"/>
-      <w:bookmarkStart w:id="49" w:name="_Toc244101539"/>
+      <w:bookmarkStart w:id="49" w:name="_Toc244106672"/>
       <w:r>
         <w:t>1. Khách xem giải</w:t>
       </w:r>
@@ -9774,7 +9774,7 @@
         <w:pStyle w:val="Heading3"/>
       </w:pPr>
       <w:bookmarkStart w:id="50" w:name="bước-1-mở-giải-công-khai"/>
-      <w:bookmarkStart w:id="51" w:name="_Toc244101540"/>
+      <w:bookmarkStart w:id="51" w:name="_Toc244106673"/>
       <w:r>
         <w:t>Bước 1. Mở giải công khai</w:t>
       </w:r>
@@ -9805,7 +9805,7 @@
           <w:noProof/>
         </w:rPr>
         <w:drawing>
-          <wp:inline distT="0" distB="0" distL="0" distR="0" wp14:anchorId="01368566" wp14:editId="23A850D4">
+          <wp:inline distT="0" distB="0" distL="0" distR="0" wp14:anchorId="3C59C817" wp14:editId="5B5DF4F1">
             <wp:extent cx="5760000" cy="3922758"/>
             <wp:effectExtent l="0" t="0" r="0" b="0"/>
             <wp:docPr id="65" name="Picture" descr="Hình 7 Mở giải công khai"/>
@@ -9862,7 +9862,7 @@
         <w:pStyle w:val="Heading3"/>
       </w:pPr>
       <w:bookmarkStart w:id="52" w:name="bước-2-xem-bảng-điểm-và-ma-trận"/>
-      <w:bookmarkStart w:id="53" w:name="_Toc244101541"/>
+      <w:bookmarkStart w:id="53" w:name="_Toc244106674"/>
       <w:bookmarkEnd w:id="50"/>
       <w:r>
         <w:t>Bước 2. Xem bảng điểm và ma trận</w:t>
@@ -9915,7 +9915,7 @@
         </w:rPr>
         <w:lastRenderedPageBreak/>
         <w:drawing>
-          <wp:inline distT="0" distB="0" distL="0" distR="0" wp14:anchorId="0B31A664" wp14:editId="0AC91359">
+          <wp:inline distT="0" distB="0" distL="0" distR="0" wp14:anchorId="3E8AB28B" wp14:editId="69F05509">
             <wp:extent cx="2664303" cy="2592000"/>
             <wp:effectExtent l="0" t="0" r="0" b="0"/>
             <wp:docPr id="69" name="Picture" descr="Hình 8 Xem bảng điểm và ma trận"/>
@@ -9973,7 +9973,7 @@
         <w:pageBreakBefore/>
       </w:pPr>
       <w:bookmarkStart w:id="54" w:name="bước-3-xem-lại-từng-nước"/>
-      <w:bookmarkStart w:id="55" w:name="_Toc244101542"/>
+      <w:bookmarkStart w:id="55" w:name="_Toc244106675"/>
       <w:bookmarkEnd w:id="52"/>
       <w:r>
         <w:lastRenderedPageBreak/>
@@ -9996,7 +9996,7 @@
           <w:noProof/>
         </w:rPr>
         <w:drawing>
-          <wp:inline distT="0" distB="0" distL="0" distR="0" wp14:anchorId="5EF80453" wp14:editId="6BCAD52E">
+          <wp:inline distT="0" distB="0" distL="0" distR="0" wp14:anchorId="43FB329B" wp14:editId="16D13336">
             <wp:extent cx="4297381" cy="5399998"/>
             <wp:effectExtent l="0" t="0" r="0" b="0"/>
             <wp:docPr id="73" name="Picture" descr="Hình 9 Xem lại từng nước"/>
@@ -10054,7 +10054,7 @@
         <w:pageBreakBefore/>
       </w:pPr>
       <w:bookmarkStart w:id="56" w:name="c2-thí-sinh-đăng-ký-và-nộp-bot"/>
-      <w:bookmarkStart w:id="57" w:name="_Toc244101543"/>
+      <w:bookmarkStart w:id="57" w:name="_Toc244106676"/>
       <w:bookmarkEnd w:id="48"/>
       <w:bookmarkEnd w:id="54"/>
       <w:r>
@@ -10067,7 +10067,7 @@
       <w:pPr>
         <w:pStyle w:val="Heading3"/>
       </w:pPr>
-      <w:bookmarkStart w:id="58" w:name="_Toc244101544"/>
+      <w:bookmarkStart w:id="58" w:name="_Toc244106677"/>
       <w:r>
         <w:t>Bước 4. Đăng ký bằng email trường</w:t>
       </w:r>
@@ -10111,7 +10111,7 @@
           <w:noProof/>
         </w:rPr>
         <w:drawing>
-          <wp:inline distT="0" distB="0" distL="0" distR="0" wp14:anchorId="5F6132F4" wp14:editId="2EECB48D">
+          <wp:inline distT="0" distB="0" distL="0" distR="0" wp14:anchorId="72A65C5B" wp14:editId="733202AC">
             <wp:extent cx="3960000" cy="3160235"/>
             <wp:effectExtent l="0" t="0" r="0" b="0"/>
             <wp:docPr id="78" name="Picture" descr="Hình 10 Đăng ký bằng email trường"/>
@@ -10168,7 +10168,7 @@
         <w:pStyle w:val="Heading3"/>
         <w:pageBreakBefore/>
       </w:pPr>
-      <w:bookmarkStart w:id="59" w:name="_Toc244101545"/>
+      <w:bookmarkStart w:id="59" w:name="_Toc244106678"/>
       <w:r>
         <w:lastRenderedPageBreak/>
         <w:t>Bước 5. Mở email lấy mã</w:t>
@@ -10194,7 +10194,7 @@
           <w:noProof/>
         </w:rPr>
         <w:drawing>
-          <wp:inline distT="0" distB="0" distL="0" distR="0" wp14:anchorId="49D74D01" wp14:editId="63B1F9A6">
+          <wp:inline distT="0" distB="0" distL="0" distR="0" wp14:anchorId="609D64D0" wp14:editId="113161CC">
             <wp:extent cx="5760000" cy="2531025"/>
             <wp:effectExtent l="0" t="0" r="0" b="0"/>
             <wp:docPr id="153" name="Picture" descr="Hình 11 Email chứa mã xác minh"/>
@@ -10251,7 +10251,7 @@
         <w:pStyle w:val="Heading3"/>
         <w:pageBreakBefore/>
       </w:pPr>
-      <w:bookmarkStart w:id="60" w:name="_Toc244101546"/>
+      <w:bookmarkStart w:id="60" w:name="_Toc244106679"/>
       <w:r>
         <w:lastRenderedPageBreak/>
         <w:t>Bước 6. Xác minh email</w:t>
@@ -10286,7 +10286,7 @@
           <w:noProof/>
         </w:rPr>
         <w:drawing>
-          <wp:inline distT="0" distB="0" distL="0" distR="0" wp14:anchorId="3DC350C9" wp14:editId="08FF160D">
+          <wp:inline distT="0" distB="0" distL="0" distR="0" wp14:anchorId="2E81879B" wp14:editId="3A3C1D80">
             <wp:extent cx="3960000" cy="4356000"/>
             <wp:effectExtent l="0" t="0" r="0" b="0"/>
             <wp:docPr id="82" name="Picture" descr="Hình 11 Xác minh email"/>
@@ -10343,7 +10343,7 @@
         <w:pStyle w:val="Heading3"/>
         <w:pageBreakBefore/>
       </w:pPr>
-      <w:bookmarkStart w:id="61" w:name="_Toc244101547"/>
+      <w:bookmarkStart w:id="61" w:name="_Toc244106680"/>
       <w:r>
         <w:lastRenderedPageBreak/>
         <w:t>Bước 7. Đặt mật khẩu và đăng nhập</w:t>
@@ -10378,7 +10378,7 @@
           <w:noProof/>
         </w:rPr>
         <w:drawing>
-          <wp:inline distT="0" distB="0" distL="0" distR="0" wp14:anchorId="3CFD9AD5" wp14:editId="6829BA5D">
+          <wp:inline distT="0" distB="0" distL="0" distR="0" wp14:anchorId="2F448953" wp14:editId="7354F61D">
             <wp:extent cx="3960000" cy="5023764"/>
             <wp:effectExtent l="0" t="0" r="0" b="0"/>
             <wp:docPr id="86" name="Picture" descr="Hình 12 Đặt mật khẩu và đăng nhập"/>
@@ -10434,7 +10434,7 @@
       <w:pPr>
         <w:pStyle w:val="Heading3"/>
       </w:pPr>
-      <w:bookmarkStart w:id="62" w:name="_Toc244101548"/>
+      <w:bookmarkStart w:id="62" w:name="_Toc244106681"/>
       <w:r>
         <w:t>Bước 8. Tạo đội</w:t>
       </w:r>
@@ -10475,7 +10475,7 @@
           <w:noProof/>
         </w:rPr>
         <w:drawing>
-          <wp:inline distT="0" distB="0" distL="0" distR="0" wp14:anchorId="23DF6B96" wp14:editId="4D2F1F40">
+          <wp:inline distT="0" distB="0" distL="0" distR="0" wp14:anchorId="1D72A2E2" wp14:editId="51DF84C1">
             <wp:extent cx="5012628" cy="2592000"/>
             <wp:effectExtent l="0" t="0" r="0" b="0"/>
             <wp:docPr id="90" name="Picture" descr="Hình 13 Tạo đội"/>
@@ -10532,7 +10532,7 @@
         <w:pStyle w:val="Heading3"/>
         <w:pageBreakBefore/>
       </w:pPr>
-      <w:bookmarkStart w:id="63" w:name="_Toc244101549"/>
+      <w:bookmarkStart w:id="63" w:name="_Toc244106682"/>
       <w:r>
         <w:lastRenderedPageBreak/>
         <w:t>Bước 9. Mời các thành viên</w:t>
@@ -10564,7 +10564,7 @@
           <w:noProof/>
         </w:rPr>
         <w:drawing>
-          <wp:inline distT="0" distB="0" distL="0" distR="0" wp14:anchorId="23CEB836" wp14:editId="4C7DC0EA">
+          <wp:inline distT="0" distB="0" distL="0" distR="0" wp14:anchorId="06F4B2FD" wp14:editId="74834356">
             <wp:extent cx="4187916" cy="2592000"/>
             <wp:effectExtent l="0" t="0" r="0" b="0"/>
             <wp:docPr id="94" name="Picture" descr="Hình 14 Mời các thành viên"/>
@@ -10620,7 +10620,7 @@
       <w:pPr>
         <w:pStyle w:val="Heading3"/>
       </w:pPr>
-      <w:bookmarkStart w:id="64" w:name="_Toc244101550"/>
+      <w:bookmarkStart w:id="64" w:name="_Toc244106683"/>
       <w:r>
         <w:t>Bước 10. Vào đội bằng mã mời</w:t>
       </w:r>
@@ -10651,7 +10651,7 @@
           <w:noProof/>
         </w:rPr>
         <w:drawing>
-          <wp:inline distT="0" distB="0" distL="0" distR="0" wp14:anchorId="0F5EADEC" wp14:editId="3E42F334">
+          <wp:inline distT="0" distB="0" distL="0" distR="0" wp14:anchorId="6ABB399E" wp14:editId="2B9E5A83">
             <wp:extent cx="5012628" cy="2592000"/>
             <wp:effectExtent l="0" t="0" r="0" b="0"/>
             <wp:docPr id="98" name="Picture" descr="Hình 15 Vào đội bằng mã mời"/>
@@ -10708,7 +10708,7 @@
         <w:pStyle w:val="Heading3"/>
         <w:pageBreakBefore/>
       </w:pPr>
-      <w:bookmarkStart w:id="65" w:name="_Toc244101551"/>
+      <w:bookmarkStart w:id="65" w:name="_Toc244106684"/>
       <w:r>
         <w:lastRenderedPageBreak/>
         <w:t>Bước 11. Tạo repo từ mẫu</w:t>
@@ -10740,7 +10740,7 @@
           <w:noProof/>
         </w:rPr>
         <w:drawing>
-          <wp:inline distT="0" distB="0" distL="0" distR="0" wp14:anchorId="2978DBC6" wp14:editId="1C93F228">
+          <wp:inline distT="0" distB="0" distL="0" distR="0" wp14:anchorId="75030D95" wp14:editId="112CFD99">
             <wp:extent cx="5682461" cy="2592000"/>
             <wp:effectExtent l="0" t="0" r="0" b="0"/>
             <wp:docPr id="102" name="Picture" descr="Hình 16 Tạo repo từ mẫu"/>
@@ -10796,7 +10796,7 @@
       <w:pPr>
         <w:pStyle w:val="Heading3"/>
       </w:pPr>
-      <w:bookmarkStart w:id="66" w:name="_Toc244101552"/>
+      <w:bookmarkStart w:id="66" w:name="_Toc244106685"/>
       <w:r>
         <w:t>Bước 12. Cho App truy cập đúng repo</w:t>
       </w:r>
@@ -10837,7 +10837,7 @@
           <w:noProof/>
         </w:rPr>
         <w:drawing>
-          <wp:inline distT="0" distB="0" distL="0" distR="0" wp14:anchorId="72BD96FC" wp14:editId="6E563310">
+          <wp:inline distT="0" distB="0" distL="0" distR="0" wp14:anchorId="0609A2CA" wp14:editId="3AB6C872">
             <wp:extent cx="5759999" cy="1755999"/>
             <wp:effectExtent l="0" t="0" r="0" b="0"/>
             <wp:docPr id="106" name="Picture" descr="Hình 17 Cho App truy cập đúng repo"/>
@@ -10894,7 +10894,7 @@
         <w:pStyle w:val="Heading3"/>
         <w:pageBreakBefore/>
       </w:pPr>
-      <w:bookmarkStart w:id="67" w:name="_Toc244101553"/>
+      <w:bookmarkStart w:id="67" w:name="_Toc244106686"/>
       <w:r>
         <w:lastRenderedPageBreak/>
         <w:t>Bước 13. Gắn link repo với đội</w:t>
@@ -10936,7 +10936,7 @@
           <w:noProof/>
         </w:rPr>
         <w:drawing>
-          <wp:inline distT="0" distB="0" distL="0" distR="0" wp14:anchorId="7BF1CDD7" wp14:editId="0672BA01">
+          <wp:inline distT="0" distB="0" distL="0" distR="0" wp14:anchorId="11348593" wp14:editId="26F508CF">
             <wp:extent cx="5284928" cy="2592000"/>
             <wp:effectExtent l="0" t="0" r="0" b="0"/>
             <wp:docPr id="110" name="Picture" descr="Hình 18 Gắn link repo với đội"/>
@@ -10992,7 +10992,7 @@
       <w:pPr>
         <w:pStyle w:val="Heading3"/>
       </w:pPr>
-      <w:bookmarkStart w:id="68" w:name="_Toc244101554"/>
+      <w:bookmarkStart w:id="68" w:name="_Toc244106687"/>
       <w:r>
         <w:t>Bước 14. Theo dõi kiểm tra 72 mẫu</w:t>
       </w:r>
@@ -11073,7 +11073,7 @@
           <w:noProof/>
         </w:rPr>
         <w:drawing>
-          <wp:inline distT="0" distB="0" distL="0" distR="0" wp14:anchorId="7A566671" wp14:editId="5FA4F216">
+          <wp:inline distT="0" distB="0" distL="0" distR="0" wp14:anchorId="215FADB7" wp14:editId="6E980804">
             <wp:extent cx="3093102" cy="2592000"/>
             <wp:effectExtent l="0" t="0" r="0" b="0"/>
             <wp:docPr id="114" name="Picture" descr="Hình 19 Theo dõi kiểm tra 72 mẫu"/>
@@ -11130,7 +11130,7 @@
         <w:pStyle w:val="Heading3"/>
         <w:pageBreakBefore/>
       </w:pPr>
-      <w:bookmarkStart w:id="69" w:name="_Toc244101555"/>
+      <w:bookmarkStart w:id="69" w:name="_Toc244106688"/>
       <w:r>
         <w:lastRenderedPageBreak/>
         <w:t>Bước 15. Thử nhanh không cần GitHub</w:t>
@@ -11154,7 +11154,7 @@
           <w:noProof/>
         </w:rPr>
         <w:drawing>
-          <wp:inline distT="0" distB="0" distL="0" distR="0" wp14:anchorId="55E82BB4" wp14:editId="46E17FF1">
+          <wp:inline distT="0" distB="0" distL="0" distR="0" wp14:anchorId="597866AE" wp14:editId="7B080A55">
             <wp:extent cx="5760000" cy="4876138"/>
             <wp:effectExtent l="0" t="0" r="0" b="0"/>
             <wp:docPr id="162" name="Picture 162"/>
@@ -11203,7 +11203,7 @@
         <w:pStyle w:val="Heading3"/>
         <w:pageBreakBefore/>
       </w:pPr>
-      <w:bookmarkStart w:id="70" w:name="_Toc244101556"/>
+      <w:bookmarkStart w:id="70" w:name="_Toc244106689"/>
       <w:r>
         <w:lastRenderedPageBreak/>
         <w:t>Bước 16. Xem giải của đội</w:t>
@@ -11265,7 +11265,7 @@
           <w:noProof/>
         </w:rPr>
         <w:drawing>
-          <wp:inline distT="0" distB="0" distL="0" distR="0" wp14:anchorId="53F61B70" wp14:editId="23877E31">
+          <wp:inline distT="0" distB="0" distL="0" distR="0" wp14:anchorId="7E815902" wp14:editId="4340A4ED">
             <wp:extent cx="5759999" cy="1024999"/>
             <wp:effectExtent l="0" t="0" r="0" b="0"/>
             <wp:docPr id="118" name="Picture" descr="Hình 20 Xem giải của đội"/>
@@ -11321,7 +11321,7 @@
       <w:pPr>
         <w:pStyle w:val="Heading3"/>
       </w:pPr>
-      <w:bookmarkStart w:id="71" w:name="_Toc244101557"/>
+      <w:bookmarkStart w:id="71" w:name="_Toc244106690"/>
       <w:r>
         <w:t>Bước 17. Luyện tập với bot mẫu</w:t>
       </w:r>
@@ -11372,7 +11372,7 @@
           <w:noProof/>
         </w:rPr>
         <w:drawing>
-          <wp:inline distT="0" distB="0" distL="0" distR="0" wp14:anchorId="2000E3DC" wp14:editId="5D324264">
+          <wp:inline distT="0" distB="0" distL="0" distR="0" wp14:anchorId="2203F409" wp14:editId="0CB5D23E">
             <wp:extent cx="5759999" cy="3774999"/>
             <wp:effectExtent l="0" t="0" r="0" b="0"/>
             <wp:docPr id="122" name="Picture" descr="Hình 21 Luyện tập với bot mẫu"/>
@@ -11430,7 +11430,7 @@
         <w:pageBreakBefore/>
       </w:pPr>
       <w:bookmarkStart w:id="72" w:name="c3-ban-tổ-chức-điều-hành"/>
-      <w:bookmarkStart w:id="73" w:name="_Toc244101558"/>
+      <w:bookmarkStart w:id="73" w:name="_Toc244106691"/>
       <w:bookmarkEnd w:id="56"/>
       <w:r>
         <w:lastRenderedPageBreak/>
@@ -11442,7 +11442,7 @@
       <w:pPr>
         <w:pStyle w:val="Heading3"/>
       </w:pPr>
-      <w:bookmarkStart w:id="74" w:name="_Toc244101559"/>
+      <w:bookmarkStart w:id="74" w:name="_Toc244106692"/>
       <w:r>
         <w:t>Bước 18. Xem tổng quan ban tổ chức</w:t>
       </w:r>
@@ -11463,7 +11463,7 @@
           <w:noProof/>
         </w:rPr>
         <w:drawing>
-          <wp:inline distT="0" distB="0" distL="0" distR="0" wp14:anchorId="6C29DD81" wp14:editId="1D237C46">
+          <wp:inline distT="0" distB="0" distL="0" distR="0" wp14:anchorId="364F4740" wp14:editId="1A6D3AF8">
             <wp:extent cx="5759999" cy="3505263"/>
             <wp:effectExtent l="0" t="0" r="0" b="0"/>
             <wp:docPr id="127" name="Picture" descr="Hình 22 Xem tổng quan ban tổ chức"/>
@@ -11520,7 +11520,7 @@
         <w:pStyle w:val="Heading3"/>
         <w:pageBreakBefore/>
       </w:pPr>
-      <w:bookmarkStart w:id="75" w:name="_Toc244101560"/>
+      <w:bookmarkStart w:id="75" w:name="_Toc244106693"/>
       <w:r>
         <w:lastRenderedPageBreak/>
         <w:t>Bước 19. Chọn giải ở Tổng quan</w:t>
@@ -11582,7 +11582,7 @@
           <w:noProof/>
         </w:rPr>
         <w:drawing>
-          <wp:inline distT="0" distB="0" distL="0" distR="0" wp14:anchorId="75635E2C" wp14:editId="0020A889">
+          <wp:inline distT="0" distB="0" distL="0" distR="0" wp14:anchorId="6B7BF1F7" wp14:editId="0CFE8193">
             <wp:extent cx="5759999" cy="4012104"/>
             <wp:effectExtent l="0" t="0" r="0" b="0"/>
             <wp:docPr id="131" name="Picture" descr="Hình 23 Chọn giải ở Tổng quan"/>
@@ -11639,7 +11639,7 @@
         <w:pStyle w:val="Heading3"/>
         <w:pageBreakBefore/>
       </w:pPr>
-      <w:bookmarkStart w:id="76" w:name="_Toc244101561"/>
+      <w:bookmarkStart w:id="76" w:name="_Toc244106694"/>
       <w:r>
         <w:lastRenderedPageBreak/>
         <w:t>Bước 20. Chuẩn bị giải mới</w:t>
@@ -11671,7 +11671,7 @@
           <w:noProof/>
         </w:rPr>
         <w:drawing>
-          <wp:inline distT="0" distB="0" distL="0" distR="0" wp14:anchorId="7FEE4EA1" wp14:editId="744B85E6">
+          <wp:inline distT="0" distB="0" distL="0" distR="0" wp14:anchorId="1ABDAD29" wp14:editId="79A8BFAE">
             <wp:extent cx="4586765" cy="2592000"/>
             <wp:effectExtent l="0" t="0" r="0" b="0"/>
             <wp:docPr id="135" name="Picture" descr="Hình 24 Chuẩn bị giải mới"/>
@@ -11727,7 +11727,7 @@
       <w:pPr>
         <w:pStyle w:val="Heading3"/>
       </w:pPr>
-      <w:bookmarkStart w:id="77" w:name="_Toc244101562"/>
+      <w:bookmarkStart w:id="77" w:name="_Toc244106695"/>
       <w:r>
         <w:t>Bước 21. Cài máy chấm Windows hoặc Linux</w:t>
       </w:r>
@@ -11778,7 +11778,7 @@
           <w:noProof/>
         </w:rPr>
         <w:drawing>
-          <wp:inline distT="0" distB="0" distL="0" distR="0" wp14:anchorId="105CCA1C" wp14:editId="52C249E5">
+          <wp:inline distT="0" distB="0" distL="0" distR="0" wp14:anchorId="59CE627B" wp14:editId="5DA4F4A7">
             <wp:extent cx="5759999" cy="1196950"/>
             <wp:effectExtent l="0" t="0" r="0" b="0"/>
             <wp:docPr id="139" name="Picture" descr="Hình 25 Cài máy chấm Windows hoặc Linux"/>
@@ -11835,7 +11835,7 @@
         <w:pStyle w:val="Heading3"/>
         <w:pageBreakBefore/>
       </w:pPr>
-      <w:bookmarkStart w:id="78" w:name="_Toc244101563"/>
+      <w:bookmarkStart w:id="78" w:name="_Toc244106696"/>
       <w:r>
         <w:lastRenderedPageBreak/>
         <w:t>Bước 22. Kiểm tình trạng chấm và hàng đợi</w:t>
@@ -11867,7 +11867,7 @@
           <w:noProof/>
         </w:rPr>
         <w:drawing>
-          <wp:inline distT="0" distB="0" distL="0" distR="0" wp14:anchorId="0299B91A" wp14:editId="5E5EC4EE">
+          <wp:inline distT="0" distB="0" distL="0" distR="0" wp14:anchorId="1C4AA10F" wp14:editId="76116F9F">
             <wp:extent cx="4213732" cy="2592000"/>
             <wp:effectExtent l="0" t="0" r="0" b="0"/>
             <wp:docPr id="143" name="Picture" descr="Hình 26 Kiểm tình trạng chấm và hàng đợi"/>
@@ -11923,7 +11923,7 @@
       <w:pPr>
         <w:pStyle w:val="Heading3"/>
       </w:pPr>
-      <w:bookmarkStart w:id="79" w:name="_Toc244101564"/>
+      <w:bookmarkStart w:id="79" w:name="_Toc244106697"/>
       <w:r>
         <w:t>Bước 23. Soạn thông báo</w:t>
       </w:r>
@@ -11964,7 +11964,7 @@
           <w:noProof/>
         </w:rPr>
         <w:drawing>
-          <wp:inline distT="0" distB="0" distL="0" distR="0" wp14:anchorId="74B5B7ED" wp14:editId="7A5DEB4A">
+          <wp:inline distT="0" distB="0" distL="0" distR="0" wp14:anchorId="15F4294A" wp14:editId="52E0BF8B">
             <wp:extent cx="5759999" cy="2369999"/>
             <wp:effectExtent l="0" t="0" r="0" b="0"/>
             <wp:docPr id="147" name="Picture" descr="Hình 27 Soạn thông báo"/>
@@ -12021,7 +12021,7 @@
         <w:pStyle w:val="Heading3"/>
         <w:pageBreakBefore/>
       </w:pPr>
-      <w:bookmarkStart w:id="80" w:name="_Toc244101565"/>
+      <w:bookmarkStart w:id="80" w:name="_Toc244106698"/>
       <w:r>
         <w:lastRenderedPageBreak/>
         <w:t>Bước 24. Xuất bảng điểm CSV</w:t>
@@ -12053,7 +12053,7 @@
           <w:noProof/>
         </w:rPr>
         <w:drawing>
-          <wp:inline distT="0" distB="0" distL="0" distR="0" wp14:anchorId="0018812E" wp14:editId="47206899">
+          <wp:inline distT="0" distB="0" distL="0" distR="0" wp14:anchorId="1321122A" wp14:editId="76C2807D">
             <wp:extent cx="5760000" cy="6821052"/>
             <wp:effectExtent l="0" t="0" r="0" b="0"/>
             <wp:docPr id="151" name="Picture" descr="Hình 28 Xuất bảng điểm CSV"/>
@@ -12110,7 +12110,7 @@
         <w:pStyle w:val="Heading2"/>
         <w:pageBreakBefore/>
       </w:pPr>
-      <w:bookmarkStart w:id="81" w:name="_Toc244101566"/>
+      <w:bookmarkStart w:id="81" w:name="_Toc244106699"/>
       <w:bookmarkEnd w:id="46"/>
       <w:bookmarkEnd w:id="72"/>
       <w:r>
@@ -12121,9 +12121,125 @@
     </w:p>
     <w:p>
       <w:pPr>
+        <w:keepNext/>
+      </w:pPr>
+      <w:r>
+        <w:t>Web th</w:t>
+      </w:r>
+      <w:r>
+        <w:t>ậ</w:t>
+      </w:r>
+      <w:r>
+        <w:t>t có m</w:t>
+      </w:r>
+      <w:r>
+        <w:t>ộ</w:t>
+      </w:r>
+      <w:r>
+        <w:t>t chung k</w:t>
+      </w:r>
+      <w:r>
+        <w:t>ế</w:t>
+      </w:r>
+      <w:r>
+        <w:t>t th</w:t>
+      </w:r>
+      <w:r>
+        <w:t>ử</w:t>
+      </w:r>
+      <w:r>
+        <w:t xml:space="preserve"> 16 đ</w:t>
+      </w:r>
+      <w:r>
+        <w:t>ộ</w:t>
+      </w:r>
+      <w:r>
+        <w:t>i bot m</w:t>
+      </w:r>
+      <w:r>
+        <w:t>ẫ</w:t>
+      </w:r>
+      <w:r>
+        <w:t>u đã ch</w:t>
+      </w:r>
+      <w:r>
+        <w:t>ạ</w:t>
+      </w:r>
+      <w:r>
+        <w:t>y trên hub LAN r</w:t>
+      </w:r>
+      <w:r>
+        <w:t>ồ</w:t>
+      </w:r>
+      <w:r>
+        <w:t>i n</w:t>
+      </w:r>
+      <w:r>
+        <w:t>ạ</w:t>
+      </w:r>
+      <w:r>
+        <w:t>p lên (Gi</w:t>
+      </w:r>
+      <w:r>
+        <w:t>ả</w:t>
+      </w:r>
+      <w:r>
+        <w:t>i đ</w:t>
+      </w:r>
+      <w:r>
+        <w:t>ấ</w:t>
+      </w:r>
+      <w:r>
+        <w:t>u → K</w:t>
+      </w:r>
+      <w:r>
+        <w:t>ế</w:t>
+      </w:r>
+      <w:r>
+        <w:t>t qu</w:t>
+      </w:r>
+      <w:r>
+        <w:t>ả</w:t>
+      </w:r>
+      <w:r>
+        <w:t xml:space="preserve"> t</w:t>
+      </w:r>
+      <w:r>
+        <w:t>ừ</w:t>
+      </w:r>
+      <w:r>
+        <w:t xml:space="preserve"> hub chung k</w:t>
+      </w:r>
+      <w:r>
+        <w:t>ế</w:t>
+      </w:r>
+      <w:r>
+        <w:t>t) đ</w:t>
+      </w:r>
+      <w:r>
+        <w:t>ể</w:t>
+      </w:r>
+      <w:r>
+        <w:t xml:space="preserve"> xem nhánh đ</w:t>
+      </w:r>
+      <w:r>
+        <w:t>ấ</w:t>
+      </w:r>
+      <w:r>
+        <w:t>u, màn hình chi</w:t>
+      </w:r>
+      <w:r>
+        <w:t>ế</w:t>
+      </w:r>
+      <w:r>
+        <w:t>u và replay.</w:t>
+      </w:r>
+    </w:p>
+    <w:p>
+      <w:pPr>
         <w:pStyle w:val="Heading3"/>
       </w:pPr>
-      <w:bookmarkStart w:id="82" w:name="_Toc244101567"/>
+      <w:bookmarkStart w:id="82" w:name="_Toc244106700"/>
       <w:r>
         <w:t>Bước 25. Tạo tài khoản và phát giấy cho đội</w:t>
       </w:r>
@@ -12147,7 +12263,7 @@
           <w:noProof/>
         </w:rPr>
         <w:drawing>
-          <wp:inline distT="0" distB="0" distL="0" distR="0" wp14:anchorId="415999D6" wp14:editId="256F8F92">
+          <wp:inline distT="0" distB="0" distL="0" distR="0" wp14:anchorId="1EC83432" wp14:editId="01873484">
             <wp:extent cx="3600000" cy="5992258"/>
             <wp:effectExtent l="0" t="0" r="0" b="0"/>
             <wp:docPr id="156" name="Picture 156"/>
@@ -12197,7 +12313,7 @@
         <w:pStyle w:val="Heading3"/>
         <w:pageBreakBefore/>
       </w:pPr>
-      <w:bookmarkStart w:id="83" w:name="_Toc244101568"/>
+      <w:bookmarkStart w:id="83" w:name="_Toc244106701"/>
       <w:r>
         <w:lastRenderedPageBreak/>
         <w:t>Bước 26. Đội tự nạp ZIP và kiểm tra</w:t>
@@ -12222,7 +12338,7 @@
           <w:noProof/>
         </w:rPr>
         <w:drawing>
-          <wp:inline distT="0" distB="0" distL="0" distR="0" wp14:anchorId="43E38BF0" wp14:editId="0B7C3D00">
+          <wp:inline distT="0" distB="0" distL="0" distR="0" wp14:anchorId="3AF650F8" wp14:editId="168D0999">
             <wp:extent cx="5760000" cy="4826842"/>
             <wp:effectExtent l="0" t="0" r="0" b="0"/>
             <wp:docPr id="157" name="Picture 157"/>
@@ -12272,7 +12388,7 @@
         <w:pStyle w:val="Heading3"/>
         <w:pageBreakBefore/>
       </w:pPr>
-      <w:bookmarkStart w:id="84" w:name="_Toc244101569"/>
+      <w:bookmarkStart w:id="84" w:name="_Toc244106702"/>
       <w:r>
         <w:lastRenderedPageBreak/>
         <w:t>Bước 27. BTC tạo chung kết</w:t>
@@ -12297,7 +12413,7 @@
           <w:noProof/>
         </w:rPr>
         <w:drawing>
-          <wp:inline distT="0" distB="0" distL="0" distR="0" wp14:anchorId="383CCF10" wp14:editId="0FE07D25">
+          <wp:inline distT="0" distB="0" distL="0" distR="0" wp14:anchorId="3BB5E6CF" wp14:editId="4C645DD4">
             <wp:extent cx="5040000" cy="6277894"/>
             <wp:effectExtent l="0" t="0" r="0" b="0"/>
             <wp:docPr id="158" name="Picture 158"/>
@@ -12347,7 +12463,7 @@
         <w:pStyle w:val="Heading3"/>
         <w:pageBreakBefore/>
       </w:pPr>
-      <w:bookmarkStart w:id="85" w:name="_Toc244101570"/>
+      <w:bookmarkStart w:id="85" w:name="_Toc244106703"/>
       <w:r>
         <w:lastRenderedPageBreak/>
         <w:t>Bước 28. Theo dõi vòng bảng và replay</w:t>
@@ -12372,7 +12488,7 @@
           <w:noProof/>
         </w:rPr>
         <w:drawing>
-          <wp:inline distT="0" distB="0" distL="0" distR="0" wp14:anchorId="322DB03C" wp14:editId="1DCEC5B1">
+          <wp:inline distT="0" distB="0" distL="0" distR="0" wp14:anchorId="4170648F" wp14:editId="0FCE93ED">
             <wp:extent cx="5760000" cy="5532631"/>
             <wp:effectExtent l="0" t="0" r="0" b="0"/>
             <wp:docPr id="159" name="Picture 159"/>
@@ -12422,7 +12538,7 @@
         <w:pStyle w:val="Heading3"/>
         <w:pageBreakBefore/>
       </w:pPr>
-      <w:bookmarkStart w:id="86" w:name="_Toc244101571"/>
+      <w:bookmarkStart w:id="86" w:name="_Toc244106704"/>
       <w:r>
         <w:lastRenderedPageBreak/>
         <w:t>Bước 29. Trang nhánh đấu và màn hình chiếu</w:t>
@@ -12447,7 +12563,7 @@
           <w:noProof/>
         </w:rPr>
         <w:drawing>
-          <wp:inline distT="0" distB="0" distL="0" distR="0" wp14:anchorId="2082CD40" wp14:editId="5508E1B2">
+          <wp:inline distT="0" distB="0" distL="0" distR="0" wp14:anchorId="030D93A3" wp14:editId="3AE591F5">
             <wp:extent cx="5760000" cy="3240000"/>
             <wp:effectExtent l="0" t="0" r="0" b="0"/>
             <wp:docPr id="160" name="Picture 160"/>
@@ -12497,7 +12613,7 @@
         <w:pStyle w:val="Heading3"/>
         <w:pageBreakBefore/>
       </w:pPr>
-      <w:bookmarkStart w:id="87" w:name="_Toc244101572"/>
+      <w:bookmarkStart w:id="87" w:name="_Toc244106705"/>
       <w:r>
         <w:lastRenderedPageBreak/>
         <w:t>Bước 30. Xuất kết quả trên hub LAN</w:t>
@@ -12522,7 +12638,7 @@
           <w:noProof/>
         </w:rPr>
         <w:drawing>
-          <wp:inline distT="0" distB="0" distL="0" distR="0" wp14:anchorId="50C75483" wp14:editId="0A02002F">
+          <wp:inline distT="0" distB="0" distL="0" distR="0" wp14:anchorId="141D3143" wp14:editId="3EF785DF">
             <wp:extent cx="5040000" cy="5560258"/>
             <wp:effectExtent l="0" t="0" r="0" b="0"/>
             <wp:docPr id="161" name="Picture 161"/>
@@ -12572,7 +12688,7 @@
         <w:pStyle w:val="Heading3"/>
         <w:pageBreakBefore/>
       </w:pPr>
-      <w:bookmarkStart w:id="88" w:name="_Toc244101573"/>
+      <w:bookmarkStart w:id="88" w:name="_Toc244106706"/>
       <w:r>
         <w:lastRenderedPageBreak/>
         <w:t>Bước 31. Nạp kết quả lên web thật</w:t>
@@ -12593,7 +12709,7 @@
           <w:noProof/>
         </w:rPr>
         <w:drawing>
-          <wp:inline distT="0" distB="0" distL="0" distR="0" wp14:anchorId="09CDAF58" wp14:editId="32CC7326">
+          <wp:inline distT="0" distB="0" distL="0" distR="0" wp14:anchorId="38D78E22" wp14:editId="40748B30">
             <wp:extent cx="5040000" cy="4893677"/>
             <wp:effectExtent l="0" t="0" r="0" b="0"/>
             <wp:docPr id="163" name="Picture 163"/>

</xml_diff>

<commit_message>
Cập nhật luật hòa và hình chung kết
</commit_message>
<xml_diff>
--- a/TAI-LIEU.docx
+++ b/TAI-LIEU.docx
@@ -159,7 +159,7 @@
           <w:r>
             <w:fldChar w:fldCharType="separate"/>
           </w:r>
-          <w:hyperlink w:anchor="_Toc244106646" w:history="1">
+          <w:hyperlink w:anchor="_Toc244117427" w:history="1">
             <w:r>
               <w:rPr>
                 <w:rStyle w:val="Hyperlink"/>
@@ -186,7 +186,7 @@
                 <w:noProof/>
                 <w:webHidden/>
               </w:rPr>
-              <w:instrText xml:space="preserve"> PAGEREF _Toc244106646 \h </w:instrText>
+              <w:instrText xml:space="preserve"> PAGEREF _Toc244117427 \h </w:instrText>
             </w:r>
             <w:r>
               <w:rPr>
@@ -233,7 +233,7 @@
               <w14:ligatures w14:val="standardContextual"/>
             </w:rPr>
           </w:pPr>
-          <w:hyperlink w:anchor="_Toc244106647" w:history="1">
+          <w:hyperlink w:anchor="_Toc244117428" w:history="1">
             <w:r>
               <w:rPr>
                 <w:rStyle w:val="Hyperlink"/>
@@ -260,7 +260,7 @@
                 <w:noProof/>
                 <w:webHidden/>
               </w:rPr>
-              <w:instrText xml:space="preserve"> PAGEREF _Toc244106647 \h </w:instrText>
+              <w:instrText xml:space="preserve"> PAGEREF _Toc244117428 \h </w:instrText>
             </w:r>
             <w:r>
               <w:rPr>
@@ -307,7 +307,7 @@
               <w14:ligatures w14:val="standardContextual"/>
             </w:rPr>
           </w:pPr>
-          <w:hyperlink w:anchor="_Toc244106648" w:history="1">
+          <w:hyperlink w:anchor="_Toc244117429" w:history="1">
             <w:r>
               <w:rPr>
                 <w:rStyle w:val="Hyperlink"/>
@@ -334,7 +334,7 @@
                 <w:noProof/>
                 <w:webHidden/>
               </w:rPr>
-              <w:instrText xml:space="preserve"> PAGEREF _Toc244106648 \h </w:instrText>
+              <w:instrText xml:space="preserve"> PAGEREF _Toc244117429 \h </w:instrText>
             </w:r>
             <w:r>
               <w:rPr>
@@ -381,7 +381,7 @@
               <w14:ligatures w14:val="standardContextual"/>
             </w:rPr>
           </w:pPr>
-          <w:hyperlink w:anchor="_Toc244106649" w:history="1">
+          <w:hyperlink w:anchor="_Toc244117430" w:history="1">
             <w:r>
               <w:rPr>
                 <w:rStyle w:val="Hyperlink"/>
@@ -408,7 +408,7 @@
                 <w:noProof/>
                 <w:webHidden/>
               </w:rPr>
-              <w:instrText xml:space="preserve"> PAGEREF _Toc244106649 \h </w:instrText>
+              <w:instrText xml:space="preserve"> PAGEREF _Toc244117430 \h </w:instrText>
             </w:r>
             <w:r>
               <w:rPr>
@@ -455,7 +455,7 @@
               <w14:ligatures w14:val="standardContextual"/>
             </w:rPr>
           </w:pPr>
-          <w:hyperlink w:anchor="_Toc244106650" w:history="1">
+          <w:hyperlink w:anchor="_Toc244117431" w:history="1">
             <w:r>
               <w:rPr>
                 <w:rStyle w:val="Hyperlink"/>
@@ -482,7 +482,7 @@
                 <w:noProof/>
                 <w:webHidden/>
               </w:rPr>
-              <w:instrText xml:space="preserve"> PAGEREF _Toc244106650 \h </w:instrText>
+              <w:instrText xml:space="preserve"> PAGEREF _Toc244117431 \h </w:instrText>
             </w:r>
             <w:r>
               <w:rPr>
@@ -529,7 +529,7 @@
               <w14:ligatures w14:val="standardContextual"/>
             </w:rPr>
           </w:pPr>
-          <w:hyperlink w:anchor="_Toc244106651" w:history="1">
+          <w:hyperlink w:anchor="_Toc244117432" w:history="1">
             <w:r>
               <w:rPr>
                 <w:rStyle w:val="Hyperlink"/>
@@ -556,7 +556,7 @@
                 <w:noProof/>
                 <w:webHidden/>
               </w:rPr>
-              <w:instrText xml:space="preserve"> PAGEREF _Toc244106651 \h </w:instrText>
+              <w:instrText xml:space="preserve"> PAGEREF _Toc244117432 \h </w:instrText>
             </w:r>
             <w:r>
               <w:rPr>
@@ -603,7 +603,7 @@
               <w14:ligatures w14:val="standardContextual"/>
             </w:rPr>
           </w:pPr>
-          <w:hyperlink w:anchor="_Toc244106652" w:history="1">
+          <w:hyperlink w:anchor="_Toc244117433" w:history="1">
             <w:r>
               <w:rPr>
                 <w:rStyle w:val="Hyperlink"/>
@@ -630,7 +630,7 @@
                 <w:noProof/>
                 <w:webHidden/>
               </w:rPr>
-              <w:instrText xml:space="preserve"> PAGEREF _Toc244106652 \h </w:instrText>
+              <w:instrText xml:space="preserve"> PAGEREF _Toc244117433 \h </w:instrText>
             </w:r>
             <w:r>
               <w:rPr>
@@ -677,7 +677,7 @@
               <w14:ligatures w14:val="standardContextual"/>
             </w:rPr>
           </w:pPr>
-          <w:hyperlink w:anchor="_Toc244106653" w:history="1">
+          <w:hyperlink w:anchor="_Toc244117434" w:history="1">
             <w:r>
               <w:rPr>
                 <w:rStyle w:val="Hyperlink"/>
@@ -704,7 +704,7 @@
                 <w:noProof/>
                 <w:webHidden/>
               </w:rPr>
-              <w:instrText xml:space="preserve"> PAGEREF _Toc244106653 \h </w:instrText>
+              <w:instrText xml:space="preserve"> PAGEREF _Toc244117434 \h </w:instrText>
             </w:r>
             <w:r>
               <w:rPr>
@@ -751,7 +751,7 @@
               <w14:ligatures w14:val="standardContextual"/>
             </w:rPr>
           </w:pPr>
-          <w:hyperlink w:anchor="_Toc244106654" w:history="1">
+          <w:hyperlink w:anchor="_Toc244117435" w:history="1">
             <w:r>
               <w:rPr>
                 <w:rStyle w:val="Hyperlink"/>
@@ -778,7 +778,7 @@
                 <w:noProof/>
                 <w:webHidden/>
               </w:rPr>
-              <w:instrText xml:space="preserve"> PAGEREF _Toc244106654 \h </w:instrText>
+              <w:instrText xml:space="preserve"> PAGEREF _Toc244117435 \h </w:instrText>
             </w:r>
             <w:r>
               <w:rPr>
@@ -825,7 +825,7 @@
               <w14:ligatures w14:val="standardContextual"/>
             </w:rPr>
           </w:pPr>
-          <w:hyperlink w:anchor="_Toc244106655" w:history="1">
+          <w:hyperlink w:anchor="_Toc244117436" w:history="1">
             <w:r>
               <w:rPr>
                 <w:rStyle w:val="Hyperlink"/>
@@ -852,7 +852,7 @@
                 <w:noProof/>
                 <w:webHidden/>
               </w:rPr>
-              <w:instrText xml:space="preserve"> PAGEREF _Toc244106655 \h </w:instrText>
+              <w:instrText xml:space="preserve"> PAGEREF _Toc244117436 \h </w:instrText>
             </w:r>
             <w:r>
               <w:rPr>
@@ -899,7 +899,7 @@
               <w14:ligatures w14:val="standardContextual"/>
             </w:rPr>
           </w:pPr>
-          <w:hyperlink w:anchor="_Toc244106656" w:history="1">
+          <w:hyperlink w:anchor="_Toc244117437" w:history="1">
             <w:r>
               <w:rPr>
                 <w:rStyle w:val="Hyperlink"/>
@@ -926,7 +926,7 @@
                 <w:noProof/>
                 <w:webHidden/>
               </w:rPr>
-              <w:instrText xml:space="preserve"> PAGEREF _Toc244106656 \h </w:instrText>
+              <w:instrText xml:space="preserve"> PAGEREF _Toc244117437 \h </w:instrText>
             </w:r>
             <w:r>
               <w:rPr>
@@ -973,7 +973,7 @@
               <w14:ligatures w14:val="standardContextual"/>
             </w:rPr>
           </w:pPr>
-          <w:hyperlink w:anchor="_Toc244106657" w:history="1">
+          <w:hyperlink w:anchor="_Toc244117438" w:history="1">
             <w:r>
               <w:rPr>
                 <w:rStyle w:val="Hyperlink"/>
@@ -1000,7 +1000,7 @@
                 <w:noProof/>
                 <w:webHidden/>
               </w:rPr>
-              <w:instrText xml:space="preserve"> PAGEREF _Toc244106657 \h </w:instrText>
+              <w:instrText xml:space="preserve"> PAGEREF _Toc244117438 \h </w:instrText>
             </w:r>
             <w:r>
               <w:rPr>
@@ -1047,7 +1047,7 @@
               <w14:ligatures w14:val="standardContextual"/>
             </w:rPr>
           </w:pPr>
-          <w:hyperlink w:anchor="_Toc244106658" w:history="1">
+          <w:hyperlink w:anchor="_Toc244117439" w:history="1">
             <w:r>
               <w:rPr>
                 <w:rStyle w:val="Hyperlink"/>
@@ -1074,7 +1074,7 @@
                 <w:noProof/>
                 <w:webHidden/>
               </w:rPr>
-              <w:instrText xml:space="preserve"> PAGEREF _Toc244106658 \h </w:instrText>
+              <w:instrText xml:space="preserve"> PAGEREF _Toc244117439 \h </w:instrText>
             </w:r>
             <w:r>
               <w:rPr>
@@ -1121,7 +1121,7 @@
               <w14:ligatures w14:val="standardContextual"/>
             </w:rPr>
           </w:pPr>
-          <w:hyperlink w:anchor="_Toc244106659" w:history="1">
+          <w:hyperlink w:anchor="_Toc244117440" w:history="1">
             <w:r>
               <w:rPr>
                 <w:rStyle w:val="Hyperlink"/>
@@ -1148,7 +1148,7 @@
                 <w:noProof/>
                 <w:webHidden/>
               </w:rPr>
-              <w:instrText xml:space="preserve"> PAGEREF _Toc244106659 \h </w:instrText>
+              <w:instrText xml:space="preserve"> PAGEREF _Toc244117440 \h </w:instrText>
             </w:r>
             <w:r>
               <w:rPr>
@@ -1195,7 +1195,7 @@
               <w14:ligatures w14:val="standardContextual"/>
             </w:rPr>
           </w:pPr>
-          <w:hyperlink w:anchor="_Toc244106660" w:history="1">
+          <w:hyperlink w:anchor="_Toc244117441" w:history="1">
             <w:r>
               <w:rPr>
                 <w:rStyle w:val="Hyperlink"/>
@@ -1222,7 +1222,7 @@
                 <w:noProof/>
                 <w:webHidden/>
               </w:rPr>
-              <w:instrText xml:space="preserve"> PAGEREF _Toc244106660 \h </w:instrText>
+              <w:instrText xml:space="preserve"> PAGEREF _Toc244117441 \h </w:instrText>
             </w:r>
             <w:r>
               <w:rPr>
@@ -1269,7 +1269,7 @@
               <w14:ligatures w14:val="standardContextual"/>
             </w:rPr>
           </w:pPr>
-          <w:hyperlink w:anchor="_Toc244106661" w:history="1">
+          <w:hyperlink w:anchor="_Toc244117442" w:history="1">
             <w:r>
               <w:rPr>
                 <w:rStyle w:val="Hyperlink"/>
@@ -1296,7 +1296,7 @@
                 <w:noProof/>
                 <w:webHidden/>
               </w:rPr>
-              <w:instrText xml:space="preserve"> PAGEREF _Toc244106661 \h </w:instrText>
+              <w:instrText xml:space="preserve"> PAGEREF _Toc244117442 \h </w:instrText>
             </w:r>
             <w:r>
               <w:rPr>
@@ -1343,7 +1343,7 @@
               <w14:ligatures w14:val="standardContextual"/>
             </w:rPr>
           </w:pPr>
-          <w:hyperlink w:anchor="_Toc244106662" w:history="1">
+          <w:hyperlink w:anchor="_Toc244117443" w:history="1">
             <w:r>
               <w:rPr>
                 <w:rStyle w:val="Hyperlink"/>
@@ -1370,7 +1370,7 @@
                 <w:noProof/>
                 <w:webHidden/>
               </w:rPr>
-              <w:instrText xml:space="preserve"> PAGEREF _Toc244106662 \h </w:instrText>
+              <w:instrText xml:space="preserve"> PAGEREF _Toc244117443 \h </w:instrText>
             </w:r>
             <w:r>
               <w:rPr>
@@ -1417,7 +1417,7 @@
               <w14:ligatures w14:val="standardContextual"/>
             </w:rPr>
           </w:pPr>
-          <w:hyperlink w:anchor="_Toc244106663" w:history="1">
+          <w:hyperlink w:anchor="_Toc244117444" w:history="1">
             <w:r>
               <w:rPr>
                 <w:rStyle w:val="Hyperlink"/>
@@ -1444,7 +1444,7 @@
                 <w:noProof/>
                 <w:webHidden/>
               </w:rPr>
-              <w:instrText xml:space="preserve"> PAGEREF _Toc244106663 \h </w:instrText>
+              <w:instrText xml:space="preserve"> PAGEREF _Toc244117444 \h </w:instrText>
             </w:r>
             <w:r>
               <w:rPr>
@@ -1491,7 +1491,7 @@
               <w14:ligatures w14:val="standardContextual"/>
             </w:rPr>
           </w:pPr>
-          <w:hyperlink w:anchor="_Toc244106664" w:history="1">
+          <w:hyperlink w:anchor="_Toc244117445" w:history="1">
             <w:r>
               <w:rPr>
                 <w:rStyle w:val="Hyperlink"/>
@@ -1518,7 +1518,7 @@
                 <w:noProof/>
                 <w:webHidden/>
               </w:rPr>
-              <w:instrText xml:space="preserve"> PAGEREF _Toc244106664 \h </w:instrText>
+              <w:instrText xml:space="preserve"> PAGEREF _Toc244117445 \h </w:instrText>
             </w:r>
             <w:r>
               <w:rPr>
@@ -1565,7 +1565,7 @@
               <w14:ligatures w14:val="standardContextual"/>
             </w:rPr>
           </w:pPr>
-          <w:hyperlink w:anchor="_Toc244106665" w:history="1">
+          <w:hyperlink w:anchor="_Toc244117446" w:history="1">
             <w:r>
               <w:rPr>
                 <w:rStyle w:val="Hyperlink"/>
@@ -1592,7 +1592,7 @@
                 <w:noProof/>
                 <w:webHidden/>
               </w:rPr>
-              <w:instrText xml:space="preserve"> PAGEREF _Toc244106665 \h </w:instrText>
+              <w:instrText xml:space="preserve"> PAGEREF _Toc244117446 \h </w:instrText>
             </w:r>
             <w:r>
               <w:rPr>
@@ -1639,7 +1639,7 @@
               <w14:ligatures w14:val="standardContextual"/>
             </w:rPr>
           </w:pPr>
-          <w:hyperlink w:anchor="_Toc244106666" w:history="1">
+          <w:hyperlink w:anchor="_Toc244117447" w:history="1">
             <w:r>
               <w:rPr>
                 <w:rStyle w:val="Hyperlink"/>
@@ -1666,7 +1666,7 @@
                 <w:noProof/>
                 <w:webHidden/>
               </w:rPr>
-              <w:instrText xml:space="preserve"> PAGEREF _Toc244106666 \h </w:instrText>
+              <w:instrText xml:space="preserve"> PAGEREF _Toc244117447 \h </w:instrText>
             </w:r>
             <w:r>
               <w:rPr>
@@ -1713,7 +1713,7 @@
               <w14:ligatures w14:val="standardContextual"/>
             </w:rPr>
           </w:pPr>
-          <w:hyperlink w:anchor="_Toc244106667" w:history="1">
+          <w:hyperlink w:anchor="_Toc244117448" w:history="1">
             <w:r>
               <w:rPr>
                 <w:rStyle w:val="Hyperlink"/>
@@ -1740,7 +1740,7 @@
                 <w:noProof/>
                 <w:webHidden/>
               </w:rPr>
-              <w:instrText xml:space="preserve"> PAGEREF _Toc244106667 \h </w:instrText>
+              <w:instrText xml:space="preserve"> PAGEREF _Toc244117448 \h </w:instrText>
             </w:r>
             <w:r>
               <w:rPr>
@@ -1787,7 +1787,7 @@
               <w14:ligatures w14:val="standardContextual"/>
             </w:rPr>
           </w:pPr>
-          <w:hyperlink w:anchor="_Toc244106668" w:history="1">
+          <w:hyperlink w:anchor="_Toc244117449" w:history="1">
             <w:r>
               <w:rPr>
                 <w:rStyle w:val="Hyperlink"/>
@@ -1814,7 +1814,7 @@
                 <w:noProof/>
                 <w:webHidden/>
               </w:rPr>
-              <w:instrText xml:space="preserve"> PAGEREF _Toc244106668 \h </w:instrText>
+              <w:instrText xml:space="preserve"> PAGEREF _Toc244117449 \h </w:instrText>
             </w:r>
             <w:r>
               <w:rPr>
@@ -1861,7 +1861,7 @@
               <w14:ligatures w14:val="standardContextual"/>
             </w:rPr>
           </w:pPr>
-          <w:hyperlink w:anchor="_Toc244106669" w:history="1">
+          <w:hyperlink w:anchor="_Toc244117450" w:history="1">
             <w:r>
               <w:rPr>
                 <w:rStyle w:val="Hyperlink"/>
@@ -1888,7 +1888,7 @@
                 <w:noProof/>
                 <w:webHidden/>
               </w:rPr>
-              <w:instrText xml:space="preserve"> PAGEREF _Toc244106669 \h </w:instrText>
+              <w:instrText xml:space="preserve"> PAGEREF _Toc244117450 \h </w:instrText>
             </w:r>
             <w:r>
               <w:rPr>
@@ -1935,7 +1935,7 @@
               <w14:ligatures w14:val="standardContextual"/>
             </w:rPr>
           </w:pPr>
-          <w:hyperlink w:anchor="_Toc244106670" w:history="1">
+          <w:hyperlink w:anchor="_Toc244117451" w:history="1">
             <w:r>
               <w:rPr>
                 <w:rStyle w:val="Hyperlink"/>
@@ -1962,7 +1962,7 @@
                 <w:noProof/>
                 <w:webHidden/>
               </w:rPr>
-              <w:instrText xml:space="preserve"> PAGEREF _Toc244106670 \h </w:instrText>
+              <w:instrText xml:space="preserve"> PAGEREF _Toc244117451 \h </w:instrText>
             </w:r>
             <w:r>
               <w:rPr>
@@ -2009,7 +2009,7 @@
               <w14:ligatures w14:val="standardContextual"/>
             </w:rPr>
           </w:pPr>
-          <w:hyperlink w:anchor="_Toc244106671" w:history="1">
+          <w:hyperlink w:anchor="_Toc244117452" w:history="1">
             <w:r>
               <w:rPr>
                 <w:rStyle w:val="Hyperlink"/>
@@ -2036,7 +2036,7 @@
                 <w:noProof/>
                 <w:webHidden/>
               </w:rPr>
-              <w:instrText xml:space="preserve"> PAGEREF _Toc244106671 \h </w:instrText>
+              <w:instrText xml:space="preserve"> PAGEREF _Toc244117452 \h </w:instrText>
             </w:r>
             <w:r>
               <w:rPr>
@@ -2083,7 +2083,7 @@
               <w14:ligatures w14:val="standardContextual"/>
             </w:rPr>
           </w:pPr>
-          <w:hyperlink w:anchor="_Toc244106672" w:history="1">
+          <w:hyperlink w:anchor="_Toc244117453" w:history="1">
             <w:r>
               <w:rPr>
                 <w:rStyle w:val="Hyperlink"/>
@@ -2110,7 +2110,7 @@
                 <w:noProof/>
                 <w:webHidden/>
               </w:rPr>
-              <w:instrText xml:space="preserve"> PAGEREF _Toc244106672 \h </w:instrText>
+              <w:instrText xml:space="preserve"> PAGEREF _Toc244117453 \h </w:instrText>
             </w:r>
             <w:r>
               <w:rPr>
@@ -2157,7 +2157,7 @@
               <w14:ligatures w14:val="standardContextual"/>
             </w:rPr>
           </w:pPr>
-          <w:hyperlink w:anchor="_Toc244106673" w:history="1">
+          <w:hyperlink w:anchor="_Toc244117454" w:history="1">
             <w:r>
               <w:rPr>
                 <w:rStyle w:val="Hyperlink"/>
@@ -2184,7 +2184,7 @@
                 <w:noProof/>
                 <w:webHidden/>
               </w:rPr>
-              <w:instrText xml:space="preserve"> PAGEREF _Toc244106673 \h </w:instrText>
+              <w:instrText xml:space="preserve"> PAGEREF _Toc244117454 \h </w:instrText>
             </w:r>
             <w:r>
               <w:rPr>
@@ -2231,7 +2231,7 @@
               <w14:ligatures w14:val="standardContextual"/>
             </w:rPr>
           </w:pPr>
-          <w:hyperlink w:anchor="_Toc244106674" w:history="1">
+          <w:hyperlink w:anchor="_Toc244117455" w:history="1">
             <w:r>
               <w:rPr>
                 <w:rStyle w:val="Hyperlink"/>
@@ -2258,7 +2258,7 @@
                 <w:noProof/>
                 <w:webHidden/>
               </w:rPr>
-              <w:instrText xml:space="preserve"> PAGEREF _Toc244106674 \h </w:instrText>
+              <w:instrText xml:space="preserve"> PAGEREF _Toc244117455 \h </w:instrText>
             </w:r>
             <w:r>
               <w:rPr>
@@ -2305,7 +2305,7 @@
               <w14:ligatures w14:val="standardContextual"/>
             </w:rPr>
           </w:pPr>
-          <w:hyperlink w:anchor="_Toc244106675" w:history="1">
+          <w:hyperlink w:anchor="_Toc244117456" w:history="1">
             <w:r>
               <w:rPr>
                 <w:rStyle w:val="Hyperlink"/>
@@ -2332,7 +2332,7 @@
                 <w:noProof/>
                 <w:webHidden/>
               </w:rPr>
-              <w:instrText xml:space="preserve"> PAGEREF _Toc244106675 \h </w:instrText>
+              <w:instrText xml:space="preserve"> PAGEREF _Toc244117456 \h </w:instrText>
             </w:r>
             <w:r>
               <w:rPr>
@@ -2379,7 +2379,7 @@
               <w14:ligatures w14:val="standardContextual"/>
             </w:rPr>
           </w:pPr>
-          <w:hyperlink w:anchor="_Toc244106676" w:history="1">
+          <w:hyperlink w:anchor="_Toc244117457" w:history="1">
             <w:r>
               <w:rPr>
                 <w:rStyle w:val="Hyperlink"/>
@@ -2406,7 +2406,7 @@
                 <w:noProof/>
                 <w:webHidden/>
               </w:rPr>
-              <w:instrText xml:space="preserve"> PAGEREF _Toc244106676 \h </w:instrText>
+              <w:instrText xml:space="preserve"> PAGEREF _Toc244117457 \h </w:instrText>
             </w:r>
             <w:r>
               <w:rPr>
@@ -2453,7 +2453,7 @@
               <w14:ligatures w14:val="standardContextual"/>
             </w:rPr>
           </w:pPr>
-          <w:hyperlink w:anchor="_Toc244106677" w:history="1">
+          <w:hyperlink w:anchor="_Toc244117458" w:history="1">
             <w:r>
               <w:rPr>
                 <w:rStyle w:val="Hyperlink"/>
@@ -2480,7 +2480,7 @@
                 <w:noProof/>
                 <w:webHidden/>
               </w:rPr>
-              <w:instrText xml:space="preserve"> PAGEREF _Toc244106677 \h </w:instrText>
+              <w:instrText xml:space="preserve"> PAGEREF _Toc244117458 \h </w:instrText>
             </w:r>
             <w:r>
               <w:rPr>
@@ -2527,7 +2527,7 @@
               <w14:ligatures w14:val="standardContextual"/>
             </w:rPr>
           </w:pPr>
-          <w:hyperlink w:anchor="_Toc244106678" w:history="1">
+          <w:hyperlink w:anchor="_Toc244117459" w:history="1">
             <w:r>
               <w:rPr>
                 <w:rStyle w:val="Hyperlink"/>
@@ -2554,7 +2554,7 @@
                 <w:noProof/>
                 <w:webHidden/>
               </w:rPr>
-              <w:instrText xml:space="preserve"> PAGEREF _Toc244106678 \h </w:instrText>
+              <w:instrText xml:space="preserve"> PAGEREF _Toc244117459 \h </w:instrText>
             </w:r>
             <w:r>
               <w:rPr>
@@ -2601,7 +2601,7 @@
               <w14:ligatures w14:val="standardContextual"/>
             </w:rPr>
           </w:pPr>
-          <w:hyperlink w:anchor="_Toc244106679" w:history="1">
+          <w:hyperlink w:anchor="_Toc244117460" w:history="1">
             <w:r>
               <w:rPr>
                 <w:rStyle w:val="Hyperlink"/>
@@ -2628,7 +2628,7 @@
                 <w:noProof/>
                 <w:webHidden/>
               </w:rPr>
-              <w:instrText xml:space="preserve"> PAGEREF _Toc244106679 \h </w:instrText>
+              <w:instrText xml:space="preserve"> PAGEREF _Toc244117460 \h </w:instrText>
             </w:r>
             <w:r>
               <w:rPr>
@@ -2675,7 +2675,7 @@
               <w14:ligatures w14:val="standardContextual"/>
             </w:rPr>
           </w:pPr>
-          <w:hyperlink w:anchor="_Toc244106680" w:history="1">
+          <w:hyperlink w:anchor="_Toc244117461" w:history="1">
             <w:r>
               <w:rPr>
                 <w:rStyle w:val="Hyperlink"/>
@@ -2702,7 +2702,7 @@
                 <w:noProof/>
                 <w:webHidden/>
               </w:rPr>
-              <w:instrText xml:space="preserve"> PAGEREF _Toc244106680 \h </w:instrText>
+              <w:instrText xml:space="preserve"> PAGEREF _Toc244117461 \h </w:instrText>
             </w:r>
             <w:r>
               <w:rPr>
@@ -2749,7 +2749,7 @@
               <w14:ligatures w14:val="standardContextual"/>
             </w:rPr>
           </w:pPr>
-          <w:hyperlink w:anchor="_Toc244106681" w:history="1">
+          <w:hyperlink w:anchor="_Toc244117462" w:history="1">
             <w:r>
               <w:rPr>
                 <w:rStyle w:val="Hyperlink"/>
@@ -2776,7 +2776,7 @@
                 <w:noProof/>
                 <w:webHidden/>
               </w:rPr>
-              <w:instrText xml:space="preserve"> PAGEREF _Toc244106681 \h </w:instrText>
+              <w:instrText xml:space="preserve"> PAGEREF _Toc244117462 \h </w:instrText>
             </w:r>
             <w:r>
               <w:rPr>
@@ -2823,7 +2823,7 @@
               <w14:ligatures w14:val="standardContextual"/>
             </w:rPr>
           </w:pPr>
-          <w:hyperlink w:anchor="_Toc244106682" w:history="1">
+          <w:hyperlink w:anchor="_Toc244117463" w:history="1">
             <w:r>
               <w:rPr>
                 <w:rStyle w:val="Hyperlink"/>
@@ -2850,7 +2850,7 @@
                 <w:noProof/>
                 <w:webHidden/>
               </w:rPr>
-              <w:instrText xml:space="preserve"> PAGEREF _Toc244106682 \h </w:instrText>
+              <w:instrText xml:space="preserve"> PAGEREF _Toc244117463 \h </w:instrText>
             </w:r>
             <w:r>
               <w:rPr>
@@ -2897,7 +2897,7 @@
               <w14:ligatures w14:val="standardContextual"/>
             </w:rPr>
           </w:pPr>
-          <w:hyperlink w:anchor="_Toc244106683" w:history="1">
+          <w:hyperlink w:anchor="_Toc244117464" w:history="1">
             <w:r>
               <w:rPr>
                 <w:rStyle w:val="Hyperlink"/>
@@ -2924,7 +2924,7 @@
                 <w:noProof/>
                 <w:webHidden/>
               </w:rPr>
-              <w:instrText xml:space="preserve"> PAGEREF _Toc244106683 \h </w:instrText>
+              <w:instrText xml:space="preserve"> PAGEREF _Toc244117464 \h </w:instrText>
             </w:r>
             <w:r>
               <w:rPr>
@@ -2971,7 +2971,7 @@
               <w14:ligatures w14:val="standardContextual"/>
             </w:rPr>
           </w:pPr>
-          <w:hyperlink w:anchor="_Toc244106684" w:history="1">
+          <w:hyperlink w:anchor="_Toc244117465" w:history="1">
             <w:r>
               <w:rPr>
                 <w:rStyle w:val="Hyperlink"/>
@@ -2998,7 +2998,7 @@
                 <w:noProof/>
                 <w:webHidden/>
               </w:rPr>
-              <w:instrText xml:space="preserve"> PAGEREF _Toc244106684 \h </w:instrText>
+              <w:instrText xml:space="preserve"> PAGEREF _Toc244117465 \h </w:instrText>
             </w:r>
             <w:r>
               <w:rPr>
@@ -3045,7 +3045,7 @@
               <w14:ligatures w14:val="standardContextual"/>
             </w:rPr>
           </w:pPr>
-          <w:hyperlink w:anchor="_Toc244106685" w:history="1">
+          <w:hyperlink w:anchor="_Toc244117466" w:history="1">
             <w:r>
               <w:rPr>
                 <w:rStyle w:val="Hyperlink"/>
@@ -3072,7 +3072,7 @@
                 <w:noProof/>
                 <w:webHidden/>
               </w:rPr>
-              <w:instrText xml:space="preserve"> PAGEREF _Toc244106685 \h </w:instrText>
+              <w:instrText xml:space="preserve"> PAGEREF _Toc244117466 \h </w:instrText>
             </w:r>
             <w:r>
               <w:rPr>
@@ -3119,7 +3119,7 @@
               <w14:ligatures w14:val="standardContextual"/>
             </w:rPr>
           </w:pPr>
-          <w:hyperlink w:anchor="_Toc244106686" w:history="1">
+          <w:hyperlink w:anchor="_Toc244117467" w:history="1">
             <w:r>
               <w:rPr>
                 <w:rStyle w:val="Hyperlink"/>
@@ -3146,7 +3146,7 @@
                 <w:noProof/>
                 <w:webHidden/>
               </w:rPr>
-              <w:instrText xml:space="preserve"> PAGEREF _Toc244106686 \h </w:instrText>
+              <w:instrText xml:space="preserve"> PAGEREF _Toc244117467 \h </w:instrText>
             </w:r>
             <w:r>
               <w:rPr>
@@ -3193,7 +3193,7 @@
               <w14:ligatures w14:val="standardContextual"/>
             </w:rPr>
           </w:pPr>
-          <w:hyperlink w:anchor="_Toc244106687" w:history="1">
+          <w:hyperlink w:anchor="_Toc244117468" w:history="1">
             <w:r>
               <w:rPr>
                 <w:rStyle w:val="Hyperlink"/>
@@ -3220,7 +3220,7 @@
                 <w:noProof/>
                 <w:webHidden/>
               </w:rPr>
-              <w:instrText xml:space="preserve"> PAGEREF _Toc244106687 \h </w:instrText>
+              <w:instrText xml:space="preserve"> PAGEREF _Toc244117468 \h </w:instrText>
             </w:r>
             <w:r>
               <w:rPr>
@@ -3267,7 +3267,7 @@
               <w14:ligatures w14:val="standardContextual"/>
             </w:rPr>
           </w:pPr>
-          <w:hyperlink w:anchor="_Toc244106688" w:history="1">
+          <w:hyperlink w:anchor="_Toc244117469" w:history="1">
             <w:r>
               <w:rPr>
                 <w:rStyle w:val="Hyperlink"/>
@@ -3294,7 +3294,7 @@
                 <w:noProof/>
                 <w:webHidden/>
               </w:rPr>
-              <w:instrText xml:space="preserve"> PAGEREF _Toc244106688 \h </w:instrText>
+              <w:instrText xml:space="preserve"> PAGEREF _Toc244117469 \h </w:instrText>
             </w:r>
             <w:r>
               <w:rPr>
@@ -3341,7 +3341,7 @@
               <w14:ligatures w14:val="standardContextual"/>
             </w:rPr>
           </w:pPr>
-          <w:hyperlink w:anchor="_Toc244106689" w:history="1">
+          <w:hyperlink w:anchor="_Toc244117470" w:history="1">
             <w:r>
               <w:rPr>
                 <w:rStyle w:val="Hyperlink"/>
@@ -3368,7 +3368,7 @@
                 <w:noProof/>
                 <w:webHidden/>
               </w:rPr>
-              <w:instrText xml:space="preserve"> PAGEREF _Toc244106689 \h </w:instrText>
+              <w:instrText xml:space="preserve"> PAGEREF _Toc244117470 \h </w:instrText>
             </w:r>
             <w:r>
               <w:rPr>
@@ -3415,7 +3415,7 @@
               <w14:ligatures w14:val="standardContextual"/>
             </w:rPr>
           </w:pPr>
-          <w:hyperlink w:anchor="_Toc244106690" w:history="1">
+          <w:hyperlink w:anchor="_Toc244117471" w:history="1">
             <w:r>
               <w:rPr>
                 <w:rStyle w:val="Hyperlink"/>
@@ -3442,7 +3442,7 @@
                 <w:noProof/>
                 <w:webHidden/>
               </w:rPr>
-              <w:instrText xml:space="preserve"> PAGEREF _Toc244106690 \h </w:instrText>
+              <w:instrText xml:space="preserve"> PAGEREF _Toc244117471 \h </w:instrText>
             </w:r>
             <w:r>
               <w:rPr>
@@ -3489,7 +3489,7 @@
               <w14:ligatures w14:val="standardContextual"/>
             </w:rPr>
           </w:pPr>
-          <w:hyperlink w:anchor="_Toc244106691" w:history="1">
+          <w:hyperlink w:anchor="_Toc244117472" w:history="1">
             <w:r>
               <w:rPr>
                 <w:rStyle w:val="Hyperlink"/>
@@ -3516,7 +3516,7 @@
                 <w:noProof/>
                 <w:webHidden/>
               </w:rPr>
-              <w:instrText xml:space="preserve"> PAGEREF _Toc244106691 \h </w:instrText>
+              <w:instrText xml:space="preserve"> PAGEREF _Toc244117472 \h </w:instrText>
             </w:r>
             <w:r>
               <w:rPr>
@@ -3563,7 +3563,7 @@
               <w14:ligatures w14:val="standardContextual"/>
             </w:rPr>
           </w:pPr>
-          <w:hyperlink w:anchor="_Toc244106692" w:history="1">
+          <w:hyperlink w:anchor="_Toc244117473" w:history="1">
             <w:r>
               <w:rPr>
                 <w:rStyle w:val="Hyperlink"/>
@@ -3590,7 +3590,7 @@
                 <w:noProof/>
                 <w:webHidden/>
               </w:rPr>
-              <w:instrText xml:space="preserve"> PAGEREF _Toc244106692 \h </w:instrText>
+              <w:instrText xml:space="preserve"> PAGEREF _Toc244117473 \h </w:instrText>
             </w:r>
             <w:r>
               <w:rPr>
@@ -3637,7 +3637,7 @@
               <w14:ligatures w14:val="standardContextual"/>
             </w:rPr>
           </w:pPr>
-          <w:hyperlink w:anchor="_Toc244106693" w:history="1">
+          <w:hyperlink w:anchor="_Toc244117474" w:history="1">
             <w:r>
               <w:rPr>
                 <w:rStyle w:val="Hyperlink"/>
@@ -3664,7 +3664,7 @@
                 <w:noProof/>
                 <w:webHidden/>
               </w:rPr>
-              <w:instrText xml:space="preserve"> PAGEREF _Toc244106693 \h </w:instrText>
+              <w:instrText xml:space="preserve"> PAGEREF _Toc244117474 \h </w:instrText>
             </w:r>
             <w:r>
               <w:rPr>
@@ -3711,7 +3711,7 @@
               <w14:ligatures w14:val="standardContextual"/>
             </w:rPr>
           </w:pPr>
-          <w:hyperlink w:anchor="_Toc244106694" w:history="1">
+          <w:hyperlink w:anchor="_Toc244117475" w:history="1">
             <w:r>
               <w:rPr>
                 <w:rStyle w:val="Hyperlink"/>
@@ -3738,7 +3738,7 @@
                 <w:noProof/>
                 <w:webHidden/>
               </w:rPr>
-              <w:instrText xml:space="preserve"> PAGEREF _Toc244106694 \h </w:instrText>
+              <w:instrText xml:space="preserve"> PAGEREF _Toc244117475 \h </w:instrText>
             </w:r>
             <w:r>
               <w:rPr>
@@ -3785,7 +3785,7 @@
               <w14:ligatures w14:val="standardContextual"/>
             </w:rPr>
           </w:pPr>
-          <w:hyperlink w:anchor="_Toc244106695" w:history="1">
+          <w:hyperlink w:anchor="_Toc244117476" w:history="1">
             <w:r>
               <w:rPr>
                 <w:rStyle w:val="Hyperlink"/>
@@ -3812,7 +3812,7 @@
                 <w:noProof/>
                 <w:webHidden/>
               </w:rPr>
-              <w:instrText xml:space="preserve"> PAGEREF _Toc244106695 \h </w:instrText>
+              <w:instrText xml:space="preserve"> PAGEREF _Toc244117476 \h </w:instrText>
             </w:r>
             <w:r>
               <w:rPr>
@@ -3859,7 +3859,7 @@
               <w14:ligatures w14:val="standardContextual"/>
             </w:rPr>
           </w:pPr>
-          <w:hyperlink w:anchor="_Toc244106696" w:history="1">
+          <w:hyperlink w:anchor="_Toc244117477" w:history="1">
             <w:r>
               <w:rPr>
                 <w:rStyle w:val="Hyperlink"/>
@@ -3886,7 +3886,7 @@
                 <w:noProof/>
                 <w:webHidden/>
               </w:rPr>
-              <w:instrText xml:space="preserve"> PAGEREF _Toc244106696 \h </w:instrText>
+              <w:instrText xml:space="preserve"> PAGEREF _Toc244117477 \h </w:instrText>
             </w:r>
             <w:r>
               <w:rPr>
@@ -3933,7 +3933,7 @@
               <w14:ligatures w14:val="standardContextual"/>
             </w:rPr>
           </w:pPr>
-          <w:hyperlink w:anchor="_Toc244106697" w:history="1">
+          <w:hyperlink w:anchor="_Toc244117478" w:history="1">
             <w:r>
               <w:rPr>
                 <w:rStyle w:val="Hyperlink"/>
@@ -3960,7 +3960,7 @@
                 <w:noProof/>
                 <w:webHidden/>
               </w:rPr>
-              <w:instrText xml:space="preserve"> PAGEREF _Toc244106697 \h </w:instrText>
+              <w:instrText xml:space="preserve"> PAGEREF _Toc244117478 \h </w:instrText>
             </w:r>
             <w:r>
               <w:rPr>
@@ -4007,7 +4007,7 @@
               <w14:ligatures w14:val="standardContextual"/>
             </w:rPr>
           </w:pPr>
-          <w:hyperlink w:anchor="_Toc244106698" w:history="1">
+          <w:hyperlink w:anchor="_Toc244117479" w:history="1">
             <w:r>
               <w:rPr>
                 <w:rStyle w:val="Hyperlink"/>
@@ -4034,7 +4034,7 @@
                 <w:noProof/>
                 <w:webHidden/>
               </w:rPr>
-              <w:instrText xml:space="preserve"> PAGEREF _Toc244106698 \h </w:instrText>
+              <w:instrText xml:space="preserve"> PAGEREF _Toc244117479 \h </w:instrText>
             </w:r>
             <w:r>
               <w:rPr>
@@ -4081,7 +4081,7 @@
               <w14:ligatures w14:val="standardContextual"/>
             </w:rPr>
           </w:pPr>
-          <w:hyperlink w:anchor="_Toc244106699" w:history="1">
+          <w:hyperlink w:anchor="_Toc244117480" w:history="1">
             <w:r>
               <w:rPr>
                 <w:rStyle w:val="Hyperlink"/>
@@ -4108,7 +4108,7 @@
                 <w:noProof/>
                 <w:webHidden/>
               </w:rPr>
-              <w:instrText xml:space="preserve"> PAGEREF _Toc244106699 \h </w:instrText>
+              <w:instrText xml:space="preserve"> PAGEREF _Toc244117480 \h </w:instrText>
             </w:r>
             <w:r>
               <w:rPr>
@@ -4155,7 +4155,7 @@
               <w14:ligatures w14:val="standardContextual"/>
             </w:rPr>
           </w:pPr>
-          <w:hyperlink w:anchor="_Toc244106700" w:history="1">
+          <w:hyperlink w:anchor="_Toc244117481" w:history="1">
             <w:r>
               <w:rPr>
                 <w:rStyle w:val="Hyperlink"/>
@@ -4182,7 +4182,7 @@
                 <w:noProof/>
                 <w:webHidden/>
               </w:rPr>
-              <w:instrText xml:space="preserve"> PAGEREF _Toc244106700 \h </w:instrText>
+              <w:instrText xml:space="preserve"> PAGEREF _Toc244117481 \h </w:instrText>
             </w:r>
             <w:r>
               <w:rPr>
@@ -4229,7 +4229,7 @@
               <w14:ligatures w14:val="standardContextual"/>
             </w:rPr>
           </w:pPr>
-          <w:hyperlink w:anchor="_Toc244106701" w:history="1">
+          <w:hyperlink w:anchor="_Toc244117482" w:history="1">
             <w:r>
               <w:rPr>
                 <w:rStyle w:val="Hyperlink"/>
@@ -4256,7 +4256,7 @@
                 <w:noProof/>
                 <w:webHidden/>
               </w:rPr>
-              <w:instrText xml:space="preserve"> PAGEREF _Toc244106701 \h </w:instrText>
+              <w:instrText xml:space="preserve"> PAGEREF _Toc244117482 \h </w:instrText>
             </w:r>
             <w:r>
               <w:rPr>
@@ -4303,7 +4303,7 @@
               <w14:ligatures w14:val="standardContextual"/>
             </w:rPr>
           </w:pPr>
-          <w:hyperlink w:anchor="_Toc244106702" w:history="1">
+          <w:hyperlink w:anchor="_Toc244117483" w:history="1">
             <w:r>
               <w:rPr>
                 <w:rStyle w:val="Hyperlink"/>
@@ -4330,7 +4330,7 @@
                 <w:noProof/>
                 <w:webHidden/>
               </w:rPr>
-              <w:instrText xml:space="preserve"> PAGEREF _Toc244106702 \h </w:instrText>
+              <w:instrText xml:space="preserve"> PAGEREF _Toc244117483 \h </w:instrText>
             </w:r>
             <w:r>
               <w:rPr>
@@ -4377,7 +4377,7 @@
               <w14:ligatures w14:val="standardContextual"/>
             </w:rPr>
           </w:pPr>
-          <w:hyperlink w:anchor="_Toc244106703" w:history="1">
+          <w:hyperlink w:anchor="_Toc244117484" w:history="1">
             <w:r>
               <w:rPr>
                 <w:rStyle w:val="Hyperlink"/>
@@ -4404,7 +4404,7 @@
                 <w:noProof/>
                 <w:webHidden/>
               </w:rPr>
-              <w:instrText xml:space="preserve"> PAGEREF _Toc244106703 \h </w:instrText>
+              <w:instrText xml:space="preserve"> PAGEREF _Toc244117484 \h </w:instrText>
             </w:r>
             <w:r>
               <w:rPr>
@@ -4451,7 +4451,7 @@
               <w14:ligatures w14:val="standardContextual"/>
             </w:rPr>
           </w:pPr>
-          <w:hyperlink w:anchor="_Toc244106704" w:history="1">
+          <w:hyperlink w:anchor="_Toc244117485" w:history="1">
             <w:r>
               <w:rPr>
                 <w:rStyle w:val="Hyperlink"/>
@@ -4478,7 +4478,7 @@
                 <w:noProof/>
                 <w:webHidden/>
               </w:rPr>
-              <w:instrText xml:space="preserve"> PAGEREF _Toc244106704 \h </w:instrText>
+              <w:instrText xml:space="preserve"> PAGEREF _Toc244117485 \h </w:instrText>
             </w:r>
             <w:r>
               <w:rPr>
@@ -4525,7 +4525,7 @@
               <w14:ligatures w14:val="standardContextual"/>
             </w:rPr>
           </w:pPr>
-          <w:hyperlink w:anchor="_Toc244106705" w:history="1">
+          <w:hyperlink w:anchor="_Toc244117486" w:history="1">
             <w:r>
               <w:rPr>
                 <w:rStyle w:val="Hyperlink"/>
@@ -4552,7 +4552,7 @@
                 <w:noProof/>
                 <w:webHidden/>
               </w:rPr>
-              <w:instrText xml:space="preserve"> PAGEREF _Toc244106705 \h </w:instrText>
+              <w:instrText xml:space="preserve"> PAGEREF _Toc244117486 \h </w:instrText>
             </w:r>
             <w:r>
               <w:rPr>
@@ -4599,7 +4599,7 @@
               <w14:ligatures w14:val="standardContextual"/>
             </w:rPr>
           </w:pPr>
-          <w:hyperlink w:anchor="_Toc244106706" w:history="1">
+          <w:hyperlink w:anchor="_Toc244117487" w:history="1">
             <w:r>
               <w:rPr>
                 <w:rStyle w:val="Hyperlink"/>
@@ -4626,7 +4626,7 @@
                 <w:noProof/>
                 <w:webHidden/>
               </w:rPr>
-              <w:instrText xml:space="preserve"> PAGEREF _Toc244106706 \h </w:instrText>
+              <w:instrText xml:space="preserve"> PAGEREF _Toc244117487 \h </w:instrText>
             </w:r>
             <w:r>
               <w:rPr>
@@ -4670,7 +4670,7 @@
         <w:pageBreakBefore/>
       </w:pPr>
       <w:bookmarkStart w:id="0" w:name="mở-đầu"/>
-      <w:bookmarkStart w:id="1" w:name="_Toc244106646"/>
+      <w:bookmarkStart w:id="1" w:name="_Toc244117427"/>
       <w:r>
         <w:lastRenderedPageBreak/>
         <w:t>Mở đầu</w:t>
@@ -4834,7 +4834,7 @@
         <w:pageBreakBefore/>
       </w:pPr>
       <w:bookmarkStart w:id="2" w:name="phần-a-giải-đấu"/>
-      <w:bookmarkStart w:id="3" w:name="_Toc244106647"/>
+      <w:bookmarkStart w:id="3" w:name="_Toc244117428"/>
       <w:bookmarkEnd w:id="0"/>
       <w:r>
         <w:lastRenderedPageBreak/>
@@ -4847,7 +4847,7 @@
         <w:pStyle w:val="Heading2"/>
       </w:pPr>
       <w:bookmarkStart w:id="4" w:name="a1-trò-chơi-ottv2"/>
-      <w:bookmarkStart w:id="5" w:name="_Toc244106648"/>
+      <w:bookmarkStart w:id="5" w:name="_Toc244117429"/>
       <w:r>
         <w:t>1. Trò chơi OTTv2</w:t>
       </w:r>
@@ -5128,7 +5128,7 @@
         <w:pStyle w:val="Heading2"/>
       </w:pPr>
       <w:bookmarkStart w:id="6" w:name="a2-tài-khoản-và-đội"/>
-      <w:bookmarkStart w:id="7" w:name="_Toc244106649"/>
+      <w:bookmarkStart w:id="7" w:name="_Toc244117430"/>
       <w:bookmarkEnd w:id="4"/>
       <w:r>
         <w:t>2. Tài khoản và đội</w:t>
@@ -5447,7 +5447,7 @@
         <w:pStyle w:val="Heading2"/>
       </w:pPr>
       <w:bookmarkStart w:id="8" w:name="a3-nộp-bot-qua-github"/>
-      <w:bookmarkStart w:id="9" w:name="_Toc244106650"/>
+      <w:bookmarkStart w:id="9" w:name="_Toc244117431"/>
       <w:bookmarkEnd w:id="6"/>
       <w:r>
         <w:t>3. Nộp bot qua GitHub</w:t>
@@ -5871,7 +5871,7 @@
         <w:pStyle w:val="Heading2"/>
       </w:pPr>
       <w:bookmarkStart w:id="10" w:name="a4-thể-lệ-và-lịch-đấu"/>
-      <w:bookmarkStart w:id="11" w:name="_Toc244106651"/>
+      <w:bookmarkStart w:id="11" w:name="_Toc244117432"/>
       <w:bookmarkEnd w:id="8"/>
       <w:r>
         <w:t>4. Thể lệ và lịch đấu</w:t>
@@ -5883,7 +5883,7 @@
         <w:pStyle w:val="Heading3"/>
       </w:pPr>
       <w:bookmarkStart w:id="12" w:name="ladder-trước-hạn"/>
-      <w:bookmarkStart w:id="13" w:name="_Toc244106652"/>
+      <w:bookmarkStart w:id="13" w:name="_Toc244117433"/>
       <w:r>
         <w:t>4.1. Ladder trước hạn</w:t>
       </w:r>
@@ -5943,7 +5943,7 @@
         <w:pStyle w:val="Heading3"/>
       </w:pPr>
       <w:bookmarkStart w:id="14" w:name="chốt-bài-tại-hạn"/>
-      <w:bookmarkStart w:id="15" w:name="_Toc244106653"/>
+      <w:bookmarkStart w:id="15" w:name="_Toc244117434"/>
       <w:bookmarkEnd w:id="12"/>
       <w:r>
         <w:lastRenderedPageBreak/>
@@ -5969,7 +5969,7 @@
         <w:pStyle w:val="Heading3"/>
       </w:pPr>
       <w:bookmarkStart w:id="16" w:name="xếp-hạng-chính-thức"/>
-      <w:bookmarkStart w:id="17" w:name="_Toc244106654"/>
+      <w:bookmarkStart w:id="17" w:name="_Toc244117435"/>
       <w:bookmarkEnd w:id="14"/>
       <w:r>
         <w:t>4.3. Xếp hạng chính thức</w:t>
@@ -6320,7 +6320,7 @@
         <w:pStyle w:val="Heading2"/>
       </w:pPr>
       <w:bookmarkStart w:id="18" w:name="a5-xem-kết-quả"/>
-      <w:bookmarkStart w:id="19" w:name="_Toc244106655"/>
+      <w:bookmarkStart w:id="19" w:name="_Toc244117436"/>
       <w:bookmarkEnd w:id="10"/>
       <w:bookmarkEnd w:id="16"/>
       <w:r>
@@ -6488,7 +6488,7 @@
         <w:pStyle w:val="Heading2"/>
       </w:pPr>
       <w:bookmarkStart w:id="20" w:name="a6-ban-tổ-chức-và-điều-hành"/>
-      <w:bookmarkStart w:id="21" w:name="_Toc244106656"/>
+      <w:bookmarkStart w:id="21" w:name="_Toc244117437"/>
       <w:bookmarkEnd w:id="18"/>
       <w:r>
         <w:t>6. Ban tổ chức và điều hành</w:t>
@@ -6607,7 +6607,7 @@
       <w:pPr>
         <w:pStyle w:val="Heading2"/>
       </w:pPr>
-      <w:bookmarkStart w:id="22" w:name="_Toc244106657"/>
+      <w:bookmarkStart w:id="22" w:name="_Toc244117438"/>
       <w:r>
         <w:t>7. Chung kết tại hội trường</w:t>
       </w:r>
@@ -6634,7 +6634,7 @@
     </w:p>
     <w:p>
       <w:r>
-        <w:t>Hệ thống tự tạo tứ kết: TK1 là 1A–2B, TK2 là 1C–2D, TK3 là 1B–2A, TK4 là 1D–2C. BK1 nhận đội thắng TK1 và TK2; BK2 nhận đội thắng TK3 và TK4. Hai đội thắng bán kết vào chung kết, hai đội thua tranh hạng ba. Mỗi cặp vẫn là một giải vòng tròn hai đội, hai ván đổi màu. Hơn điểm thì đi tiếp; hòa điểm xét vị trí vòng bảng tốt hơn, rồi điểm vòng bảng, cuối cùng hạng online. Trang nhánh ghi đội đi tiếp và lý do, có đường mở lịch và replay của từng cặp.</w:t>
+        <w:t>Hệ thống tự tạo tứ kết: TK1 là 1A–2B, TK2 là 1C–2D, TK3 là 1B–2A, TK4 là 1D–2C. BK1 nhận đội thắng TK1 và TK2; BK2 nhận đội thắng TK3 và TK4. Hai đội thắng bán kết vào chung kết, hai đội thua tranh hạng ba. Mỗi cặp vẫn là một giải vòng tròn hai đội, hai ván đổi màu. Hơn điểm thì đi tiếp; hòa điểm thì nếu mỗi đội thắng đúng một ván, đội thắng bằng ít nước hơn đi tiếp; vẫn bằng hoặc hai ván hòa thì xét hiệu số quân cộng hai ván, cuối cùng bốc thăm cố định. Bot đi nước cố định nên đá thêm ván cùng thế cờ, cùng màu sẽ ra y hệt; vì vậy chỉ xét hai ván của chính cặp, không dùng vòng bảng hay hạng online. Trang nhánh ghi đội đi tiếp và lý do, có đường mở lịch và replay của từng cặp.</w:t>
       </w:r>
     </w:p>
     <w:p>
@@ -7042,7 +7042,7 @@
         <w:pageBreakBefore/>
       </w:pPr>
       <w:bookmarkStart w:id="23" w:name="phần-b-thiết-kế-kỹ-thuật"/>
-      <w:bookmarkStart w:id="24" w:name="_Toc244106658"/>
+      <w:bookmarkStart w:id="24" w:name="_Toc244117439"/>
       <w:bookmarkEnd w:id="2"/>
       <w:bookmarkEnd w:id="20"/>
       <w:r>
@@ -7056,7 +7056,7 @@
         <w:pStyle w:val="Heading2"/>
       </w:pPr>
       <w:bookmarkStart w:id="25" w:name="b1-kiến-trúc-tổng-thể"/>
-      <w:bookmarkStart w:id="26" w:name="_Toc244106659"/>
+      <w:bookmarkStart w:id="26" w:name="_Toc244117440"/>
       <w:r>
         <w:t>1. Kiến trúc tổng thể</w:t>
       </w:r>
@@ -7158,7 +7158,7 @@
         <w:pStyle w:val="Heading2"/>
       </w:pPr>
       <w:bookmarkStart w:id="27" w:name="b2-dịch-vụ-được-dùng"/>
-      <w:bookmarkStart w:id="28" w:name="_Toc244106660"/>
+      <w:bookmarkStart w:id="28" w:name="_Toc244117441"/>
       <w:bookmarkEnd w:id="25"/>
       <w:r>
         <w:lastRenderedPageBreak/>
@@ -7490,7 +7490,7 @@
         <w:pStyle w:val="Heading2"/>
       </w:pPr>
       <w:bookmarkStart w:id="29" w:name="b3-hub-và-cách-phục-vụ-dữ-liệu"/>
-      <w:bookmarkStart w:id="30" w:name="_Toc244106661"/>
+      <w:bookmarkStart w:id="30" w:name="_Toc244117442"/>
       <w:bookmarkEnd w:id="27"/>
       <w:r>
         <w:t>3. Hub và cách phục vụ dữ liệu</w:t>
@@ -7569,7 +7569,7 @@
         <w:pStyle w:val="Heading2"/>
       </w:pPr>
       <w:bookmarkStart w:id="31" w:name="b4-máy-chấm-và-chia-việc"/>
-      <w:bookmarkStart w:id="32" w:name="_Toc244106662"/>
+      <w:bookmarkStart w:id="32" w:name="_Toc244117443"/>
       <w:bookmarkEnd w:id="29"/>
       <w:r>
         <w:t>4. Máy chấm và chia việc</w:t>
@@ -7692,7 +7692,7 @@
         <w:pStyle w:val="Heading2"/>
       </w:pPr>
       <w:bookmarkStart w:id="33" w:name="b5-sandbox-thay-docker"/>
-      <w:bookmarkStart w:id="34" w:name="_Toc244106663"/>
+      <w:bookmarkStart w:id="34" w:name="_Toc244117444"/>
       <w:bookmarkEnd w:id="31"/>
       <w:r>
         <w:t>5. Sandbox chạy bot</w:t>
@@ -7734,7 +7734,7 @@
         <w:pStyle w:val="Heading2"/>
       </w:pPr>
       <w:bookmarkStart w:id="35" w:name="b6-quỹ-giờ-và-khả-năng-đối-chiếu"/>
-      <w:bookmarkStart w:id="36" w:name="_Toc244106664"/>
+      <w:bookmarkStart w:id="36" w:name="_Toc244117445"/>
       <w:bookmarkEnd w:id="33"/>
       <w:r>
         <w:t>6. Quỹ giờ và khả năng đối chiếu</w:t>
@@ -7783,7 +7783,7 @@
         <w:pStyle w:val="Heading2"/>
       </w:pPr>
       <w:bookmarkStart w:id="37" w:name="b7-chịu-lỗi-và-sao-lưu"/>
-      <w:bookmarkStart w:id="38" w:name="_Toc244106665"/>
+      <w:bookmarkStart w:id="38" w:name="_Toc244117446"/>
       <w:bookmarkEnd w:id="35"/>
       <w:r>
         <w:t>7. Chịu lỗi và sao lưu</w:t>
@@ -8168,7 +8168,7 @@
         <w:pStyle w:val="Heading2"/>
       </w:pPr>
       <w:bookmarkStart w:id="39" w:name="b8-bảo-mật"/>
-      <w:bookmarkStart w:id="40" w:name="_Toc244106666"/>
+      <w:bookmarkStart w:id="40" w:name="_Toc244117447"/>
       <w:bookmarkEnd w:id="37"/>
       <w:r>
         <w:t>8. Bảo mật</w:t>
@@ -8226,7 +8226,7 @@
         <w:pStyle w:val="Heading2"/>
       </w:pPr>
       <w:bookmarkStart w:id="41" w:name="b9-sức-tải-và-thời-gian-đã-đo"/>
-      <w:bookmarkStart w:id="42" w:name="_Toc244106667"/>
+      <w:bookmarkStart w:id="42" w:name="_Toc244117448"/>
       <w:bookmarkEnd w:id="39"/>
       <w:r>
         <w:t>9. Sức tải và thời gian đã đo</w:t>
@@ -9410,7 +9410,7 @@
       <w:pPr>
         <w:pStyle w:val="Heading2"/>
       </w:pPr>
-      <w:bookmarkStart w:id="43" w:name="_Toc244106668"/>
+      <w:bookmarkStart w:id="43" w:name="_Toc244117449"/>
       <w:bookmarkEnd w:id="41"/>
       <w:r>
         <w:t>10. Cài đặt và vận hành</w:t>
@@ -9524,7 +9524,7 @@
       <w:pPr>
         <w:pStyle w:val="Heading2"/>
       </w:pPr>
-      <w:bookmarkStart w:id="44" w:name="_Toc244106669"/>
+      <w:bookmarkStart w:id="44" w:name="_Toc244117450"/>
       <w:r>
         <w:t>11. Mạng LAN ngày chung kết</w:t>
       </w:r>
@@ -9651,7 +9651,7 @@
         <w:pStyle w:val="Heading2"/>
         <w:pageBreakBefore/>
       </w:pPr>
-      <w:bookmarkStart w:id="45" w:name="_Toc244106670"/>
+      <w:bookmarkStart w:id="45" w:name="_Toc244117451"/>
       <w:r>
         <w:lastRenderedPageBreak/>
         <w:t>12. Giới hạn và hướng tiếp</w:t>
@@ -9745,7 +9745,7 @@
         <w:pageBreakBefore/>
       </w:pPr>
       <w:bookmarkStart w:id="46" w:name="phần-c-hướng-dẫn-demo-từng-bước"/>
-      <w:bookmarkStart w:id="47" w:name="_Toc244106671"/>
+      <w:bookmarkStart w:id="47" w:name="_Toc244117452"/>
       <w:bookmarkEnd w:id="23"/>
       <w:r>
         <w:lastRenderedPageBreak/>
@@ -9763,7 +9763,7 @@
         <w:pStyle w:val="Heading2"/>
       </w:pPr>
       <w:bookmarkStart w:id="48" w:name="c1-khách-xem-giải"/>
-      <w:bookmarkStart w:id="49" w:name="_Toc244106672"/>
+      <w:bookmarkStart w:id="49" w:name="_Toc244117453"/>
       <w:r>
         <w:t>1. Khách xem giải</w:t>
       </w:r>
@@ -9774,7 +9774,7 @@
         <w:pStyle w:val="Heading3"/>
       </w:pPr>
       <w:bookmarkStart w:id="50" w:name="bước-1-mở-giải-công-khai"/>
-      <w:bookmarkStart w:id="51" w:name="_Toc244106673"/>
+      <w:bookmarkStart w:id="51" w:name="_Toc244117454"/>
       <w:r>
         <w:t>Bước 1. Mở giải công khai</w:t>
       </w:r>
@@ -9862,7 +9862,7 @@
         <w:pStyle w:val="Heading3"/>
       </w:pPr>
       <w:bookmarkStart w:id="52" w:name="bước-2-xem-bảng-điểm-và-ma-trận"/>
-      <w:bookmarkStart w:id="53" w:name="_Toc244106674"/>
+      <w:bookmarkStart w:id="53" w:name="_Toc244117455"/>
       <w:bookmarkEnd w:id="50"/>
       <w:r>
         <w:t>Bước 2. Xem bảng điểm và ma trận</w:t>
@@ -9973,7 +9973,7 @@
         <w:pageBreakBefore/>
       </w:pPr>
       <w:bookmarkStart w:id="54" w:name="bước-3-xem-lại-từng-nước"/>
-      <w:bookmarkStart w:id="55" w:name="_Toc244106675"/>
+      <w:bookmarkStart w:id="55" w:name="_Toc244117456"/>
       <w:bookmarkEnd w:id="52"/>
       <w:r>
         <w:lastRenderedPageBreak/>
@@ -10054,7 +10054,7 @@
         <w:pageBreakBefore/>
       </w:pPr>
       <w:bookmarkStart w:id="56" w:name="c2-thí-sinh-đăng-ký-và-nộp-bot"/>
-      <w:bookmarkStart w:id="57" w:name="_Toc244106676"/>
+      <w:bookmarkStart w:id="57" w:name="_Toc244117457"/>
       <w:bookmarkEnd w:id="48"/>
       <w:bookmarkEnd w:id="54"/>
       <w:r>
@@ -10067,7 +10067,7 @@
       <w:pPr>
         <w:pStyle w:val="Heading3"/>
       </w:pPr>
-      <w:bookmarkStart w:id="58" w:name="_Toc244106677"/>
+      <w:bookmarkStart w:id="58" w:name="_Toc244117458"/>
       <w:r>
         <w:t>Bước 4. Đăng ký bằng email trường</w:t>
       </w:r>
@@ -10168,7 +10168,7 @@
         <w:pStyle w:val="Heading3"/>
         <w:pageBreakBefore/>
       </w:pPr>
-      <w:bookmarkStart w:id="59" w:name="_Toc244106678"/>
+      <w:bookmarkStart w:id="59" w:name="_Toc244117459"/>
       <w:r>
         <w:lastRenderedPageBreak/>
         <w:t>Bước 5. Mở email lấy mã</w:t>
@@ -10251,7 +10251,7 @@
         <w:pStyle w:val="Heading3"/>
         <w:pageBreakBefore/>
       </w:pPr>
-      <w:bookmarkStart w:id="60" w:name="_Toc244106679"/>
+      <w:bookmarkStart w:id="60" w:name="_Toc244117460"/>
       <w:r>
         <w:lastRenderedPageBreak/>
         <w:t>Bước 6. Xác minh email</w:t>
@@ -10343,7 +10343,7 @@
         <w:pStyle w:val="Heading3"/>
         <w:pageBreakBefore/>
       </w:pPr>
-      <w:bookmarkStart w:id="61" w:name="_Toc244106680"/>
+      <w:bookmarkStart w:id="61" w:name="_Toc244117461"/>
       <w:r>
         <w:lastRenderedPageBreak/>
         <w:t>Bước 7. Đặt mật khẩu và đăng nhập</w:t>
@@ -10434,7 +10434,7 @@
       <w:pPr>
         <w:pStyle w:val="Heading3"/>
       </w:pPr>
-      <w:bookmarkStart w:id="62" w:name="_Toc244106681"/>
+      <w:bookmarkStart w:id="62" w:name="_Toc244117462"/>
       <w:r>
         <w:t>Bước 8. Tạo đội</w:t>
       </w:r>
@@ -10532,7 +10532,7 @@
         <w:pStyle w:val="Heading3"/>
         <w:pageBreakBefore/>
       </w:pPr>
-      <w:bookmarkStart w:id="63" w:name="_Toc244106682"/>
+      <w:bookmarkStart w:id="63" w:name="_Toc244117463"/>
       <w:r>
         <w:lastRenderedPageBreak/>
         <w:t>Bước 9. Mời các thành viên</w:t>
@@ -10620,7 +10620,7 @@
       <w:pPr>
         <w:pStyle w:val="Heading3"/>
       </w:pPr>
-      <w:bookmarkStart w:id="64" w:name="_Toc244106683"/>
+      <w:bookmarkStart w:id="64" w:name="_Toc244117464"/>
       <w:r>
         <w:t>Bước 10. Vào đội bằng mã mời</w:t>
       </w:r>
@@ -10708,7 +10708,7 @@
         <w:pStyle w:val="Heading3"/>
         <w:pageBreakBefore/>
       </w:pPr>
-      <w:bookmarkStart w:id="65" w:name="_Toc244106684"/>
+      <w:bookmarkStart w:id="65" w:name="_Toc244117465"/>
       <w:r>
         <w:lastRenderedPageBreak/>
         <w:t>Bước 11. Tạo repo từ mẫu</w:t>
@@ -10796,7 +10796,7 @@
       <w:pPr>
         <w:pStyle w:val="Heading3"/>
       </w:pPr>
-      <w:bookmarkStart w:id="66" w:name="_Toc244106685"/>
+      <w:bookmarkStart w:id="66" w:name="_Toc244117466"/>
       <w:r>
         <w:t>Bước 12. Cho App truy cập đúng repo</w:t>
       </w:r>
@@ -10894,7 +10894,7 @@
         <w:pStyle w:val="Heading3"/>
         <w:pageBreakBefore/>
       </w:pPr>
-      <w:bookmarkStart w:id="67" w:name="_Toc244106686"/>
+      <w:bookmarkStart w:id="67" w:name="_Toc244117467"/>
       <w:r>
         <w:lastRenderedPageBreak/>
         <w:t>Bước 13. Gắn link repo với đội</w:t>
@@ -10992,7 +10992,7 @@
       <w:pPr>
         <w:pStyle w:val="Heading3"/>
       </w:pPr>
-      <w:bookmarkStart w:id="68" w:name="_Toc244106687"/>
+      <w:bookmarkStart w:id="68" w:name="_Toc244117468"/>
       <w:r>
         <w:t>Bước 14. Theo dõi kiểm tra 72 mẫu</w:t>
       </w:r>
@@ -11130,7 +11130,7 @@
         <w:pStyle w:val="Heading3"/>
         <w:pageBreakBefore/>
       </w:pPr>
-      <w:bookmarkStart w:id="69" w:name="_Toc244106688"/>
+      <w:bookmarkStart w:id="69" w:name="_Toc244117469"/>
       <w:r>
         <w:lastRenderedPageBreak/>
         <w:t>Bước 15. Thử nhanh không cần GitHub</w:t>
@@ -11203,7 +11203,7 @@
         <w:pStyle w:val="Heading3"/>
         <w:pageBreakBefore/>
       </w:pPr>
-      <w:bookmarkStart w:id="70" w:name="_Toc244106689"/>
+      <w:bookmarkStart w:id="70" w:name="_Toc244117470"/>
       <w:r>
         <w:lastRenderedPageBreak/>
         <w:t>Bước 16. Xem giải của đội</w:t>
@@ -11321,7 +11321,7 @@
       <w:pPr>
         <w:pStyle w:val="Heading3"/>
       </w:pPr>
-      <w:bookmarkStart w:id="71" w:name="_Toc244106690"/>
+      <w:bookmarkStart w:id="71" w:name="_Toc244117471"/>
       <w:r>
         <w:t>Bước 17. Luyện tập với bot mẫu</w:t>
       </w:r>
@@ -11430,7 +11430,7 @@
         <w:pageBreakBefore/>
       </w:pPr>
       <w:bookmarkStart w:id="72" w:name="c3-ban-tổ-chức-điều-hành"/>
-      <w:bookmarkStart w:id="73" w:name="_Toc244106691"/>
+      <w:bookmarkStart w:id="73" w:name="_Toc244117472"/>
       <w:bookmarkEnd w:id="56"/>
       <w:r>
         <w:lastRenderedPageBreak/>
@@ -11442,7 +11442,7 @@
       <w:pPr>
         <w:pStyle w:val="Heading3"/>
       </w:pPr>
-      <w:bookmarkStart w:id="74" w:name="_Toc244106692"/>
+      <w:bookmarkStart w:id="74" w:name="_Toc244117473"/>
       <w:r>
         <w:t>Bước 18. Xem tổng quan ban tổ chức</w:t>
       </w:r>
@@ -11520,7 +11520,7 @@
         <w:pStyle w:val="Heading3"/>
         <w:pageBreakBefore/>
       </w:pPr>
-      <w:bookmarkStart w:id="75" w:name="_Toc244106693"/>
+      <w:bookmarkStart w:id="75" w:name="_Toc244117474"/>
       <w:r>
         <w:lastRenderedPageBreak/>
         <w:t>Bước 19. Chọn giải ở Tổng quan</w:t>
@@ -11639,7 +11639,7 @@
         <w:pStyle w:val="Heading3"/>
         <w:pageBreakBefore/>
       </w:pPr>
-      <w:bookmarkStart w:id="76" w:name="_Toc244106694"/>
+      <w:bookmarkStart w:id="76" w:name="_Toc244117475"/>
       <w:r>
         <w:lastRenderedPageBreak/>
         <w:t>Bước 20. Chuẩn bị giải mới</w:t>
@@ -11727,7 +11727,7 @@
       <w:pPr>
         <w:pStyle w:val="Heading3"/>
       </w:pPr>
-      <w:bookmarkStart w:id="77" w:name="_Toc244106695"/>
+      <w:bookmarkStart w:id="77" w:name="_Toc244117476"/>
       <w:r>
         <w:t>Bước 21. Cài máy chấm Windows hoặc Linux</w:t>
       </w:r>
@@ -11835,7 +11835,7 @@
         <w:pStyle w:val="Heading3"/>
         <w:pageBreakBefore/>
       </w:pPr>
-      <w:bookmarkStart w:id="78" w:name="_Toc244106696"/>
+      <w:bookmarkStart w:id="78" w:name="_Toc244117477"/>
       <w:r>
         <w:lastRenderedPageBreak/>
         <w:t>Bước 22. Kiểm tình trạng chấm và hàng đợi</w:t>
@@ -11923,7 +11923,7 @@
       <w:pPr>
         <w:pStyle w:val="Heading3"/>
       </w:pPr>
-      <w:bookmarkStart w:id="79" w:name="_Toc244106697"/>
+      <w:bookmarkStart w:id="79" w:name="_Toc244117478"/>
       <w:r>
         <w:t>Bước 23. Soạn thông báo</w:t>
       </w:r>
@@ -12021,7 +12021,7 @@
         <w:pStyle w:val="Heading3"/>
         <w:pageBreakBefore/>
       </w:pPr>
-      <w:bookmarkStart w:id="80" w:name="_Toc244106698"/>
+      <w:bookmarkStart w:id="80" w:name="_Toc244117479"/>
       <w:r>
         <w:lastRenderedPageBreak/>
         <w:t>Bước 24. Xuất bảng điểm CSV</w:t>
@@ -12110,7 +12110,7 @@
         <w:pStyle w:val="Heading2"/>
         <w:pageBreakBefore/>
       </w:pPr>
-      <w:bookmarkStart w:id="81" w:name="_Toc244106699"/>
+      <w:bookmarkStart w:id="81" w:name="_Toc244117480"/>
       <w:bookmarkEnd w:id="46"/>
       <w:bookmarkEnd w:id="72"/>
       <w:r>
@@ -12124,122 +12124,14 @@
         <w:keepNext/>
       </w:pPr>
       <w:r>
-        <w:t>Web th</w:t>
-      </w:r>
-      <w:r>
-        <w:t>ậ</w:t>
-      </w:r>
-      <w:r>
-        <w:t>t có m</w:t>
-      </w:r>
-      <w:r>
-        <w:t>ộ</w:t>
-      </w:r>
-      <w:r>
-        <w:t>t chung k</w:t>
-      </w:r>
-      <w:r>
-        <w:t>ế</w:t>
-      </w:r>
-      <w:r>
-        <w:t>t th</w:t>
-      </w:r>
-      <w:r>
-        <w:t>ử</w:t>
-      </w:r>
-      <w:r>
-        <w:t xml:space="preserve"> 16 đ</w:t>
-      </w:r>
-      <w:r>
-        <w:t>ộ</w:t>
-      </w:r>
-      <w:r>
-        <w:t>i bot m</w:t>
-      </w:r>
-      <w:r>
-        <w:t>ẫ</w:t>
-      </w:r>
-      <w:r>
-        <w:t>u đã ch</w:t>
-      </w:r>
-      <w:r>
-        <w:t>ạ</w:t>
-      </w:r>
-      <w:r>
-        <w:t>y trên hub LAN r</w:t>
-      </w:r>
-      <w:r>
-        <w:t>ồ</w:t>
-      </w:r>
-      <w:r>
-        <w:t>i n</w:t>
-      </w:r>
-      <w:r>
-        <w:t>ạ</w:t>
-      </w:r>
-      <w:r>
-        <w:t>p lên (Gi</w:t>
-      </w:r>
-      <w:r>
-        <w:t>ả</w:t>
-      </w:r>
-      <w:r>
-        <w:t>i đ</w:t>
-      </w:r>
-      <w:r>
-        <w:t>ấ</w:t>
-      </w:r>
-      <w:r>
-        <w:t>u → K</w:t>
-      </w:r>
-      <w:r>
-        <w:t>ế</w:t>
-      </w:r>
-      <w:r>
-        <w:t>t qu</w:t>
-      </w:r>
-      <w:r>
-        <w:t>ả</w:t>
-      </w:r>
-      <w:r>
-        <w:t xml:space="preserve"> t</w:t>
-      </w:r>
-      <w:r>
-        <w:t>ừ</w:t>
-      </w:r>
-      <w:r>
-        <w:t xml:space="preserve"> hub chung k</w:t>
-      </w:r>
-      <w:r>
-        <w:t>ế</w:t>
-      </w:r>
-      <w:r>
-        <w:t>t) đ</w:t>
-      </w:r>
-      <w:r>
-        <w:t>ể</w:t>
-      </w:r>
-      <w:r>
-        <w:t xml:space="preserve"> xem nhánh đ</w:t>
-      </w:r>
-      <w:r>
-        <w:t>ấ</w:t>
-      </w:r>
-      <w:r>
-        <w:t>u, màn hình chi</w:t>
-      </w:r>
-      <w:r>
-        <w:t>ế</w:t>
-      </w:r>
-      <w:r>
-        <w:t>u và replay.</w:t>
+        <w:t>Web thật có một chung kết thử 16 đội bot mẫu đã chạy trên hub LAN rồi nạp lên (thẻ chung kết trong Giải đấu) để xem nhánh đấu, màn hình chiếu và replay.</w:t>
       </w:r>
     </w:p>
     <w:p>
       <w:pPr>
         <w:pStyle w:val="Heading3"/>
       </w:pPr>
-      <w:bookmarkStart w:id="82" w:name="_Toc244106700"/>
+      <w:bookmarkStart w:id="82" w:name="_Toc244117481"/>
       <w:r>
         <w:t>Bước 25. Tạo tài khoản và phát giấy cho đội</w:t>
       </w:r>
@@ -12313,7 +12205,7 @@
         <w:pStyle w:val="Heading3"/>
         <w:pageBreakBefore/>
       </w:pPr>
-      <w:bookmarkStart w:id="83" w:name="_Toc244106701"/>
+      <w:bookmarkStart w:id="83" w:name="_Toc244117482"/>
       <w:r>
         <w:lastRenderedPageBreak/>
         <w:t>Bước 26. Đội tự nạp ZIP và kiểm tra</w:t>
@@ -12388,7 +12280,7 @@
         <w:pStyle w:val="Heading3"/>
         <w:pageBreakBefore/>
       </w:pPr>
-      <w:bookmarkStart w:id="84" w:name="_Toc244106702"/>
+      <w:bookmarkStart w:id="84" w:name="_Toc244117483"/>
       <w:r>
         <w:lastRenderedPageBreak/>
         <w:t>Bước 27. BTC tạo chung kết</w:t>
@@ -12463,7 +12355,7 @@
         <w:pStyle w:val="Heading3"/>
         <w:pageBreakBefore/>
       </w:pPr>
-      <w:bookmarkStart w:id="85" w:name="_Toc244106703"/>
+      <w:bookmarkStart w:id="85" w:name="_Toc244117484"/>
       <w:r>
         <w:lastRenderedPageBreak/>
         <w:t>Bước 28. Theo dõi vòng bảng và replay</w:t>
@@ -12538,7 +12430,7 @@
         <w:pStyle w:val="Heading3"/>
         <w:pageBreakBefore/>
       </w:pPr>
-      <w:bookmarkStart w:id="86" w:name="_Toc244106704"/>
+      <w:bookmarkStart w:id="86" w:name="_Toc244117485"/>
       <w:r>
         <w:lastRenderedPageBreak/>
         <w:t>Bước 29. Trang nhánh đấu và màn hình chiếu</w:t>
@@ -12550,7 +12442,7 @@
         <w:keepNext/>
       </w:pPr>
       <w:r>
-        <w:t>Trang Chung kết tự nối tứ kết, bán kết, chung kết và tranh hạng ba; cặp đang đấu được tô nổi. Bấm cặp để mở lịch và replay; xem lý do đi tiếp khi hòa hai ván. Mở Màn hình chiếu để có nền tối, chữ lớn, không thanh bên và tự cập nhật mỗi ba giây. BTC có thể Dừng tự động để giữ nguyên các giải con và làm tiếp bằng tay; không có nút sửa đội thắng.</w:t>
+        <w:t>Trang Chung kết tự nối tứ kết, bán kết, chung kết và tranh hạng ba; cặp đang đấu được tô nổi. Bấm ô cặp để xem 2 ván, lý do đi tiếp và replay; xem lý do đi tiếp khi hòa hai ván. Mở Màn hình chiếu để có nền tối, chữ lớn, không thanh bên và tự cập nhật mỗi ba giây. BTC có thể Dừng tự động để giữ nguyên các giải con và làm tiếp bằng tay; không có nút sửa đội thắng.</w:t>
       </w:r>
     </w:p>
     <w:p>
@@ -12613,7 +12505,7 @@
         <w:pStyle w:val="Heading3"/>
         <w:pageBreakBefore/>
       </w:pPr>
-      <w:bookmarkStart w:id="87" w:name="_Toc244106705"/>
+      <w:bookmarkStart w:id="87" w:name="_Toc244117486"/>
       <w:r>
         <w:lastRenderedPageBreak/>
         <w:t>Bước 30. Xuất kết quả trên hub LAN</w:t>
@@ -12688,7 +12580,7 @@
         <w:pStyle w:val="Heading3"/>
         <w:pageBreakBefore/>
       </w:pPr>
-      <w:bookmarkStart w:id="88" w:name="_Toc244106706"/>
+      <w:bookmarkStart w:id="88" w:name="_Toc244117487"/>
       <w:r>
         <w:lastRenderedPageBreak/>
         <w:t>Bước 31. Nạp kết quả lên web thật</w:t>
@@ -12697,7 +12589,7 @@
     </w:p>
     <w:p>
       <w:r>
-        <w:t>Trên web thật, BTC mở Giải đấu → Nạp kết quả từ hub LAN, chọn file rồi bấm Kiểm tra &amp; xem trước. Đối chiếu tên, thứ tự giải, số đội, số ván, replay và SHA trước khi bấm Đăng lên web. Khách mở sự kiện ở Kết quả từ hub chung kết để xem bảng điểm và replay; giải nhập chỉ để xem, không có nút điều hành.</w:t>
+        <w:t>Trên web thật, BTC mở Giải đấu → Nạp kết quả từ hub LAN, chọn file rồi bấm Kiểm tra &amp; xem trước. Đối chiếu tên, thứ tự giải, số đội, số ván, replay và SHA trước khi bấm Đăng lên web. Khách mở thẻ chung kết trong Giải đấu để xem bảng điểm và replay; giải nhập chỉ để xem, không có nút điều hành.</w:t>
       </w:r>
     </w:p>
     <w:p>

</xml_diff>

<commit_message>
Làm rõ cách dùng màn hình chiếu trong tài liệu
</commit_message>
<xml_diff>
--- a/TAI-LIEU.docx
+++ b/TAI-LIEU.docx
@@ -159,7 +159,7 @@
           <w:r>
             <w:fldChar w:fldCharType="separate"/>
           </w:r>
-          <w:hyperlink w:anchor="_Toc244117427" w:history="1">
+          <w:hyperlink w:anchor="_Toc244118974" w:history="1">
             <w:r>
               <w:rPr>
                 <w:rStyle w:val="Hyperlink"/>
@@ -186,7 +186,7 @@
                 <w:noProof/>
                 <w:webHidden/>
               </w:rPr>
-              <w:instrText xml:space="preserve"> PAGEREF _Toc244117427 \h </w:instrText>
+              <w:instrText xml:space="preserve"> PAGEREF _Toc244118974 \h </w:instrText>
             </w:r>
             <w:r>
               <w:rPr>
@@ -233,7 +233,7 @@
               <w14:ligatures w14:val="standardContextual"/>
             </w:rPr>
           </w:pPr>
-          <w:hyperlink w:anchor="_Toc244117428" w:history="1">
+          <w:hyperlink w:anchor="_Toc244118975" w:history="1">
             <w:r>
               <w:rPr>
                 <w:rStyle w:val="Hyperlink"/>
@@ -260,7 +260,7 @@
                 <w:noProof/>
                 <w:webHidden/>
               </w:rPr>
-              <w:instrText xml:space="preserve"> PAGEREF _Toc244117428 \h </w:instrText>
+              <w:instrText xml:space="preserve"> PAGEREF _Toc244118975 \h </w:instrText>
             </w:r>
             <w:r>
               <w:rPr>
@@ -307,7 +307,7 @@
               <w14:ligatures w14:val="standardContextual"/>
             </w:rPr>
           </w:pPr>
-          <w:hyperlink w:anchor="_Toc244117429" w:history="1">
+          <w:hyperlink w:anchor="_Toc244118976" w:history="1">
             <w:r>
               <w:rPr>
                 <w:rStyle w:val="Hyperlink"/>
@@ -334,7 +334,7 @@
                 <w:noProof/>
                 <w:webHidden/>
               </w:rPr>
-              <w:instrText xml:space="preserve"> PAGEREF _Toc244117429 \h </w:instrText>
+              <w:instrText xml:space="preserve"> PAGEREF _Toc244118976 \h </w:instrText>
             </w:r>
             <w:r>
               <w:rPr>
@@ -381,7 +381,7 @@
               <w14:ligatures w14:val="standardContextual"/>
             </w:rPr>
           </w:pPr>
-          <w:hyperlink w:anchor="_Toc244117430" w:history="1">
+          <w:hyperlink w:anchor="_Toc244118977" w:history="1">
             <w:r>
               <w:rPr>
                 <w:rStyle w:val="Hyperlink"/>
@@ -408,7 +408,7 @@
                 <w:noProof/>
                 <w:webHidden/>
               </w:rPr>
-              <w:instrText xml:space="preserve"> PAGEREF _Toc244117430 \h </w:instrText>
+              <w:instrText xml:space="preserve"> PAGEREF _Toc244118977 \h </w:instrText>
             </w:r>
             <w:r>
               <w:rPr>
@@ -455,7 +455,7 @@
               <w14:ligatures w14:val="standardContextual"/>
             </w:rPr>
           </w:pPr>
-          <w:hyperlink w:anchor="_Toc244117431" w:history="1">
+          <w:hyperlink w:anchor="_Toc244118978" w:history="1">
             <w:r>
               <w:rPr>
                 <w:rStyle w:val="Hyperlink"/>
@@ -482,7 +482,7 @@
                 <w:noProof/>
                 <w:webHidden/>
               </w:rPr>
-              <w:instrText xml:space="preserve"> PAGEREF _Toc244117431 \h </w:instrText>
+              <w:instrText xml:space="preserve"> PAGEREF _Toc244118978 \h </w:instrText>
             </w:r>
             <w:r>
               <w:rPr>
@@ -529,7 +529,7 @@
               <w14:ligatures w14:val="standardContextual"/>
             </w:rPr>
           </w:pPr>
-          <w:hyperlink w:anchor="_Toc244117432" w:history="1">
+          <w:hyperlink w:anchor="_Toc244118979" w:history="1">
             <w:r>
               <w:rPr>
                 <w:rStyle w:val="Hyperlink"/>
@@ -556,7 +556,7 @@
                 <w:noProof/>
                 <w:webHidden/>
               </w:rPr>
-              <w:instrText xml:space="preserve"> PAGEREF _Toc244117432 \h </w:instrText>
+              <w:instrText xml:space="preserve"> PAGEREF _Toc244118979 \h </w:instrText>
             </w:r>
             <w:r>
               <w:rPr>
@@ -603,7 +603,7 @@
               <w14:ligatures w14:val="standardContextual"/>
             </w:rPr>
           </w:pPr>
-          <w:hyperlink w:anchor="_Toc244117433" w:history="1">
+          <w:hyperlink w:anchor="_Toc244118980" w:history="1">
             <w:r>
               <w:rPr>
                 <w:rStyle w:val="Hyperlink"/>
@@ -630,7 +630,7 @@
                 <w:noProof/>
                 <w:webHidden/>
               </w:rPr>
-              <w:instrText xml:space="preserve"> PAGEREF _Toc244117433 \h </w:instrText>
+              <w:instrText xml:space="preserve"> PAGEREF _Toc244118980 \h </w:instrText>
             </w:r>
             <w:r>
               <w:rPr>
@@ -677,7 +677,7 @@
               <w14:ligatures w14:val="standardContextual"/>
             </w:rPr>
           </w:pPr>
-          <w:hyperlink w:anchor="_Toc244117434" w:history="1">
+          <w:hyperlink w:anchor="_Toc244118981" w:history="1">
             <w:r>
               <w:rPr>
                 <w:rStyle w:val="Hyperlink"/>
@@ -704,7 +704,7 @@
                 <w:noProof/>
                 <w:webHidden/>
               </w:rPr>
-              <w:instrText xml:space="preserve"> PAGEREF _Toc244117434 \h </w:instrText>
+              <w:instrText xml:space="preserve"> PAGEREF _Toc244118981 \h </w:instrText>
             </w:r>
             <w:r>
               <w:rPr>
@@ -751,7 +751,7 @@
               <w14:ligatures w14:val="standardContextual"/>
             </w:rPr>
           </w:pPr>
-          <w:hyperlink w:anchor="_Toc244117435" w:history="1">
+          <w:hyperlink w:anchor="_Toc244118982" w:history="1">
             <w:r>
               <w:rPr>
                 <w:rStyle w:val="Hyperlink"/>
@@ -778,7 +778,7 @@
                 <w:noProof/>
                 <w:webHidden/>
               </w:rPr>
-              <w:instrText xml:space="preserve"> PAGEREF _Toc244117435 \h </w:instrText>
+              <w:instrText xml:space="preserve"> PAGEREF _Toc244118982 \h </w:instrText>
             </w:r>
             <w:r>
               <w:rPr>
@@ -825,7 +825,7 @@
               <w14:ligatures w14:val="standardContextual"/>
             </w:rPr>
           </w:pPr>
-          <w:hyperlink w:anchor="_Toc244117436" w:history="1">
+          <w:hyperlink w:anchor="_Toc244118983" w:history="1">
             <w:r>
               <w:rPr>
                 <w:rStyle w:val="Hyperlink"/>
@@ -852,7 +852,7 @@
                 <w:noProof/>
                 <w:webHidden/>
               </w:rPr>
-              <w:instrText xml:space="preserve"> PAGEREF _Toc244117436 \h </w:instrText>
+              <w:instrText xml:space="preserve"> PAGEREF _Toc244118983 \h </w:instrText>
             </w:r>
             <w:r>
               <w:rPr>
@@ -899,7 +899,7 @@
               <w14:ligatures w14:val="standardContextual"/>
             </w:rPr>
           </w:pPr>
-          <w:hyperlink w:anchor="_Toc244117437" w:history="1">
+          <w:hyperlink w:anchor="_Toc244118984" w:history="1">
             <w:r>
               <w:rPr>
                 <w:rStyle w:val="Hyperlink"/>
@@ -926,7 +926,7 @@
                 <w:noProof/>
                 <w:webHidden/>
               </w:rPr>
-              <w:instrText xml:space="preserve"> PAGEREF _Toc244117437 \h </w:instrText>
+              <w:instrText xml:space="preserve"> PAGEREF _Toc244118984 \h </w:instrText>
             </w:r>
             <w:r>
               <w:rPr>
@@ -973,7 +973,7 @@
               <w14:ligatures w14:val="standardContextual"/>
             </w:rPr>
           </w:pPr>
-          <w:hyperlink w:anchor="_Toc244117438" w:history="1">
+          <w:hyperlink w:anchor="_Toc244118985" w:history="1">
             <w:r>
               <w:rPr>
                 <w:rStyle w:val="Hyperlink"/>
@@ -1000,7 +1000,7 @@
                 <w:noProof/>
                 <w:webHidden/>
               </w:rPr>
-              <w:instrText xml:space="preserve"> PAGEREF _Toc244117438 \h </w:instrText>
+              <w:instrText xml:space="preserve"> PAGEREF _Toc244118985 \h </w:instrText>
             </w:r>
             <w:r>
               <w:rPr>
@@ -1047,7 +1047,7 @@
               <w14:ligatures w14:val="standardContextual"/>
             </w:rPr>
           </w:pPr>
-          <w:hyperlink w:anchor="_Toc244117439" w:history="1">
+          <w:hyperlink w:anchor="_Toc244118986" w:history="1">
             <w:r>
               <w:rPr>
                 <w:rStyle w:val="Hyperlink"/>
@@ -1074,7 +1074,7 @@
                 <w:noProof/>
                 <w:webHidden/>
               </w:rPr>
-              <w:instrText xml:space="preserve"> PAGEREF _Toc244117439 \h </w:instrText>
+              <w:instrText xml:space="preserve"> PAGEREF _Toc244118986 \h </w:instrText>
             </w:r>
             <w:r>
               <w:rPr>
@@ -1121,7 +1121,7 @@
               <w14:ligatures w14:val="standardContextual"/>
             </w:rPr>
           </w:pPr>
-          <w:hyperlink w:anchor="_Toc244117440" w:history="1">
+          <w:hyperlink w:anchor="_Toc244118987" w:history="1">
             <w:r>
               <w:rPr>
                 <w:rStyle w:val="Hyperlink"/>
@@ -1148,7 +1148,7 @@
                 <w:noProof/>
                 <w:webHidden/>
               </w:rPr>
-              <w:instrText xml:space="preserve"> PAGEREF _Toc244117440 \h </w:instrText>
+              <w:instrText xml:space="preserve"> PAGEREF _Toc244118987 \h </w:instrText>
             </w:r>
             <w:r>
               <w:rPr>
@@ -1195,7 +1195,7 @@
               <w14:ligatures w14:val="standardContextual"/>
             </w:rPr>
           </w:pPr>
-          <w:hyperlink w:anchor="_Toc244117441" w:history="1">
+          <w:hyperlink w:anchor="_Toc244118988" w:history="1">
             <w:r>
               <w:rPr>
                 <w:rStyle w:val="Hyperlink"/>
@@ -1222,7 +1222,7 @@
                 <w:noProof/>
                 <w:webHidden/>
               </w:rPr>
-              <w:instrText xml:space="preserve"> PAGEREF _Toc244117441 \h </w:instrText>
+              <w:instrText xml:space="preserve"> PAGEREF _Toc244118988 \h </w:instrText>
             </w:r>
             <w:r>
               <w:rPr>
@@ -1269,7 +1269,7 @@
               <w14:ligatures w14:val="standardContextual"/>
             </w:rPr>
           </w:pPr>
-          <w:hyperlink w:anchor="_Toc244117442" w:history="1">
+          <w:hyperlink w:anchor="_Toc244118989" w:history="1">
             <w:r>
               <w:rPr>
                 <w:rStyle w:val="Hyperlink"/>
@@ -1296,7 +1296,7 @@
                 <w:noProof/>
                 <w:webHidden/>
               </w:rPr>
-              <w:instrText xml:space="preserve"> PAGEREF _Toc244117442 \h </w:instrText>
+              <w:instrText xml:space="preserve"> PAGEREF _Toc244118989 \h </w:instrText>
             </w:r>
             <w:r>
               <w:rPr>
@@ -1343,7 +1343,7 @@
               <w14:ligatures w14:val="standardContextual"/>
             </w:rPr>
           </w:pPr>
-          <w:hyperlink w:anchor="_Toc244117443" w:history="1">
+          <w:hyperlink w:anchor="_Toc244118990" w:history="1">
             <w:r>
               <w:rPr>
                 <w:rStyle w:val="Hyperlink"/>
@@ -1370,7 +1370,7 @@
                 <w:noProof/>
                 <w:webHidden/>
               </w:rPr>
-              <w:instrText xml:space="preserve"> PAGEREF _Toc244117443 \h </w:instrText>
+              <w:instrText xml:space="preserve"> PAGEREF _Toc244118990 \h </w:instrText>
             </w:r>
             <w:r>
               <w:rPr>
@@ -1417,7 +1417,7 @@
               <w14:ligatures w14:val="standardContextual"/>
             </w:rPr>
           </w:pPr>
-          <w:hyperlink w:anchor="_Toc244117444" w:history="1">
+          <w:hyperlink w:anchor="_Toc244118991" w:history="1">
             <w:r>
               <w:rPr>
                 <w:rStyle w:val="Hyperlink"/>
@@ -1444,7 +1444,7 @@
                 <w:noProof/>
                 <w:webHidden/>
               </w:rPr>
-              <w:instrText xml:space="preserve"> PAGEREF _Toc244117444 \h </w:instrText>
+              <w:instrText xml:space="preserve"> PAGEREF _Toc244118991 \h </w:instrText>
             </w:r>
             <w:r>
               <w:rPr>
@@ -1491,7 +1491,7 @@
               <w14:ligatures w14:val="standardContextual"/>
             </w:rPr>
           </w:pPr>
-          <w:hyperlink w:anchor="_Toc244117445" w:history="1">
+          <w:hyperlink w:anchor="_Toc244118992" w:history="1">
             <w:r>
               <w:rPr>
                 <w:rStyle w:val="Hyperlink"/>
@@ -1518,7 +1518,7 @@
                 <w:noProof/>
                 <w:webHidden/>
               </w:rPr>
-              <w:instrText xml:space="preserve"> PAGEREF _Toc244117445 \h </w:instrText>
+              <w:instrText xml:space="preserve"> PAGEREF _Toc244118992 \h </w:instrText>
             </w:r>
             <w:r>
               <w:rPr>
@@ -1565,7 +1565,7 @@
               <w14:ligatures w14:val="standardContextual"/>
             </w:rPr>
           </w:pPr>
-          <w:hyperlink w:anchor="_Toc244117446" w:history="1">
+          <w:hyperlink w:anchor="_Toc244118993" w:history="1">
             <w:r>
               <w:rPr>
                 <w:rStyle w:val="Hyperlink"/>
@@ -1592,7 +1592,7 @@
                 <w:noProof/>
                 <w:webHidden/>
               </w:rPr>
-              <w:instrText xml:space="preserve"> PAGEREF _Toc244117446 \h </w:instrText>
+              <w:instrText xml:space="preserve"> PAGEREF _Toc244118993 \h </w:instrText>
             </w:r>
             <w:r>
               <w:rPr>
@@ -1639,7 +1639,7 @@
               <w14:ligatures w14:val="standardContextual"/>
             </w:rPr>
           </w:pPr>
-          <w:hyperlink w:anchor="_Toc244117447" w:history="1">
+          <w:hyperlink w:anchor="_Toc244118994" w:history="1">
             <w:r>
               <w:rPr>
                 <w:rStyle w:val="Hyperlink"/>
@@ -1666,7 +1666,7 @@
                 <w:noProof/>
                 <w:webHidden/>
               </w:rPr>
-              <w:instrText xml:space="preserve"> PAGEREF _Toc244117447 \h </w:instrText>
+              <w:instrText xml:space="preserve"> PAGEREF _Toc244118994 \h </w:instrText>
             </w:r>
             <w:r>
               <w:rPr>
@@ -1713,7 +1713,7 @@
               <w14:ligatures w14:val="standardContextual"/>
             </w:rPr>
           </w:pPr>
-          <w:hyperlink w:anchor="_Toc244117448" w:history="1">
+          <w:hyperlink w:anchor="_Toc244118995" w:history="1">
             <w:r>
               <w:rPr>
                 <w:rStyle w:val="Hyperlink"/>
@@ -1740,7 +1740,7 @@
                 <w:noProof/>
                 <w:webHidden/>
               </w:rPr>
-              <w:instrText xml:space="preserve"> PAGEREF _Toc244117448 \h </w:instrText>
+              <w:instrText xml:space="preserve"> PAGEREF _Toc244118995 \h </w:instrText>
             </w:r>
             <w:r>
               <w:rPr>
@@ -1787,7 +1787,7 @@
               <w14:ligatures w14:val="standardContextual"/>
             </w:rPr>
           </w:pPr>
-          <w:hyperlink w:anchor="_Toc244117449" w:history="1">
+          <w:hyperlink w:anchor="_Toc244118996" w:history="1">
             <w:r>
               <w:rPr>
                 <w:rStyle w:val="Hyperlink"/>
@@ -1814,7 +1814,7 @@
                 <w:noProof/>
                 <w:webHidden/>
               </w:rPr>
-              <w:instrText xml:space="preserve"> PAGEREF _Toc244117449 \h </w:instrText>
+              <w:instrText xml:space="preserve"> PAGEREF _Toc244118996 \h </w:instrText>
             </w:r>
             <w:r>
               <w:rPr>
@@ -1861,7 +1861,7 @@
               <w14:ligatures w14:val="standardContextual"/>
             </w:rPr>
           </w:pPr>
-          <w:hyperlink w:anchor="_Toc244117450" w:history="1">
+          <w:hyperlink w:anchor="_Toc244118997" w:history="1">
             <w:r>
               <w:rPr>
                 <w:rStyle w:val="Hyperlink"/>
@@ -1888,7 +1888,7 @@
                 <w:noProof/>
                 <w:webHidden/>
               </w:rPr>
-              <w:instrText xml:space="preserve"> PAGEREF _Toc244117450 \h </w:instrText>
+              <w:instrText xml:space="preserve"> PAGEREF _Toc244118997 \h </w:instrText>
             </w:r>
             <w:r>
               <w:rPr>
@@ -1935,7 +1935,7 @@
               <w14:ligatures w14:val="standardContextual"/>
             </w:rPr>
           </w:pPr>
-          <w:hyperlink w:anchor="_Toc244117451" w:history="1">
+          <w:hyperlink w:anchor="_Toc244118998" w:history="1">
             <w:r>
               <w:rPr>
                 <w:rStyle w:val="Hyperlink"/>
@@ -1962,7 +1962,7 @@
                 <w:noProof/>
                 <w:webHidden/>
               </w:rPr>
-              <w:instrText xml:space="preserve"> PAGEREF _Toc244117451 \h </w:instrText>
+              <w:instrText xml:space="preserve"> PAGEREF _Toc244118998 \h </w:instrText>
             </w:r>
             <w:r>
               <w:rPr>
@@ -2009,7 +2009,7 @@
               <w14:ligatures w14:val="standardContextual"/>
             </w:rPr>
           </w:pPr>
-          <w:hyperlink w:anchor="_Toc244117452" w:history="1">
+          <w:hyperlink w:anchor="_Toc244118999" w:history="1">
             <w:r>
               <w:rPr>
                 <w:rStyle w:val="Hyperlink"/>
@@ -2036,7 +2036,7 @@
                 <w:noProof/>
                 <w:webHidden/>
               </w:rPr>
-              <w:instrText xml:space="preserve"> PAGEREF _Toc244117452 \h </w:instrText>
+              <w:instrText xml:space="preserve"> PAGEREF _Toc244118999 \h </w:instrText>
             </w:r>
             <w:r>
               <w:rPr>
@@ -2083,7 +2083,7 @@
               <w14:ligatures w14:val="standardContextual"/>
             </w:rPr>
           </w:pPr>
-          <w:hyperlink w:anchor="_Toc244117453" w:history="1">
+          <w:hyperlink w:anchor="_Toc244119000" w:history="1">
             <w:r>
               <w:rPr>
                 <w:rStyle w:val="Hyperlink"/>
@@ -2110,7 +2110,7 @@
                 <w:noProof/>
                 <w:webHidden/>
               </w:rPr>
-              <w:instrText xml:space="preserve"> PAGEREF _Toc244117453 \h </w:instrText>
+              <w:instrText xml:space="preserve"> PAGEREF _Toc244119000 \h </w:instrText>
             </w:r>
             <w:r>
               <w:rPr>
@@ -2157,7 +2157,7 @@
               <w14:ligatures w14:val="standardContextual"/>
             </w:rPr>
           </w:pPr>
-          <w:hyperlink w:anchor="_Toc244117454" w:history="1">
+          <w:hyperlink w:anchor="_Toc244119001" w:history="1">
             <w:r>
               <w:rPr>
                 <w:rStyle w:val="Hyperlink"/>
@@ -2184,7 +2184,7 @@
                 <w:noProof/>
                 <w:webHidden/>
               </w:rPr>
-              <w:instrText xml:space="preserve"> PAGEREF _Toc244117454 \h </w:instrText>
+              <w:instrText xml:space="preserve"> PAGEREF _Toc244119001 \h </w:instrText>
             </w:r>
             <w:r>
               <w:rPr>
@@ -2231,7 +2231,7 @@
               <w14:ligatures w14:val="standardContextual"/>
             </w:rPr>
           </w:pPr>
-          <w:hyperlink w:anchor="_Toc244117455" w:history="1">
+          <w:hyperlink w:anchor="_Toc244119002" w:history="1">
             <w:r>
               <w:rPr>
                 <w:rStyle w:val="Hyperlink"/>
@@ -2258,7 +2258,7 @@
                 <w:noProof/>
                 <w:webHidden/>
               </w:rPr>
-              <w:instrText xml:space="preserve"> PAGEREF _Toc244117455 \h </w:instrText>
+              <w:instrText xml:space="preserve"> PAGEREF _Toc244119002 \h </w:instrText>
             </w:r>
             <w:r>
               <w:rPr>
@@ -2305,7 +2305,7 @@
               <w14:ligatures w14:val="standardContextual"/>
             </w:rPr>
           </w:pPr>
-          <w:hyperlink w:anchor="_Toc244117456" w:history="1">
+          <w:hyperlink w:anchor="_Toc244119003" w:history="1">
             <w:r>
               <w:rPr>
                 <w:rStyle w:val="Hyperlink"/>
@@ -2332,7 +2332,7 @@
                 <w:noProof/>
                 <w:webHidden/>
               </w:rPr>
-              <w:instrText xml:space="preserve"> PAGEREF _Toc244117456 \h </w:instrText>
+              <w:instrText xml:space="preserve"> PAGEREF _Toc244119003 \h </w:instrText>
             </w:r>
             <w:r>
               <w:rPr>
@@ -2379,7 +2379,7 @@
               <w14:ligatures w14:val="standardContextual"/>
             </w:rPr>
           </w:pPr>
-          <w:hyperlink w:anchor="_Toc244117457" w:history="1">
+          <w:hyperlink w:anchor="_Toc244119004" w:history="1">
             <w:r>
               <w:rPr>
                 <w:rStyle w:val="Hyperlink"/>
@@ -2406,7 +2406,7 @@
                 <w:noProof/>
                 <w:webHidden/>
               </w:rPr>
-              <w:instrText xml:space="preserve"> PAGEREF _Toc244117457 \h </w:instrText>
+              <w:instrText xml:space="preserve"> PAGEREF _Toc244119004 \h </w:instrText>
             </w:r>
             <w:r>
               <w:rPr>
@@ -2453,7 +2453,7 @@
               <w14:ligatures w14:val="standardContextual"/>
             </w:rPr>
           </w:pPr>
-          <w:hyperlink w:anchor="_Toc244117458" w:history="1">
+          <w:hyperlink w:anchor="_Toc244119005" w:history="1">
             <w:r>
               <w:rPr>
                 <w:rStyle w:val="Hyperlink"/>
@@ -2480,7 +2480,7 @@
                 <w:noProof/>
                 <w:webHidden/>
               </w:rPr>
-              <w:instrText xml:space="preserve"> PAGEREF _Toc244117458 \h </w:instrText>
+              <w:instrText xml:space="preserve"> PAGEREF _Toc244119005 \h </w:instrText>
             </w:r>
             <w:r>
               <w:rPr>
@@ -2527,7 +2527,7 @@
               <w14:ligatures w14:val="standardContextual"/>
             </w:rPr>
           </w:pPr>
-          <w:hyperlink w:anchor="_Toc244117459" w:history="1">
+          <w:hyperlink w:anchor="_Toc244119006" w:history="1">
             <w:r>
               <w:rPr>
                 <w:rStyle w:val="Hyperlink"/>
@@ -2554,7 +2554,7 @@
                 <w:noProof/>
                 <w:webHidden/>
               </w:rPr>
-              <w:instrText xml:space="preserve"> PAGEREF _Toc244117459 \h </w:instrText>
+              <w:instrText xml:space="preserve"> PAGEREF _Toc244119006 \h </w:instrText>
             </w:r>
             <w:r>
               <w:rPr>
@@ -2601,7 +2601,7 @@
               <w14:ligatures w14:val="standardContextual"/>
             </w:rPr>
           </w:pPr>
-          <w:hyperlink w:anchor="_Toc244117460" w:history="1">
+          <w:hyperlink w:anchor="_Toc244119007" w:history="1">
             <w:r>
               <w:rPr>
                 <w:rStyle w:val="Hyperlink"/>
@@ -2628,7 +2628,7 @@
                 <w:noProof/>
                 <w:webHidden/>
               </w:rPr>
-              <w:instrText xml:space="preserve"> PAGEREF _Toc244117460 \h </w:instrText>
+              <w:instrText xml:space="preserve"> PAGEREF _Toc244119007 \h </w:instrText>
             </w:r>
             <w:r>
               <w:rPr>
@@ -2675,7 +2675,7 @@
               <w14:ligatures w14:val="standardContextual"/>
             </w:rPr>
           </w:pPr>
-          <w:hyperlink w:anchor="_Toc244117461" w:history="1">
+          <w:hyperlink w:anchor="_Toc244119008" w:history="1">
             <w:r>
               <w:rPr>
                 <w:rStyle w:val="Hyperlink"/>
@@ -2702,7 +2702,7 @@
                 <w:noProof/>
                 <w:webHidden/>
               </w:rPr>
-              <w:instrText xml:space="preserve"> PAGEREF _Toc244117461 \h </w:instrText>
+              <w:instrText xml:space="preserve"> PAGEREF _Toc244119008 \h </w:instrText>
             </w:r>
             <w:r>
               <w:rPr>
@@ -2749,7 +2749,7 @@
               <w14:ligatures w14:val="standardContextual"/>
             </w:rPr>
           </w:pPr>
-          <w:hyperlink w:anchor="_Toc244117462" w:history="1">
+          <w:hyperlink w:anchor="_Toc244119009" w:history="1">
             <w:r>
               <w:rPr>
                 <w:rStyle w:val="Hyperlink"/>
@@ -2776,7 +2776,7 @@
                 <w:noProof/>
                 <w:webHidden/>
               </w:rPr>
-              <w:instrText xml:space="preserve"> PAGEREF _Toc244117462 \h </w:instrText>
+              <w:instrText xml:space="preserve"> PAGEREF _Toc244119009 \h </w:instrText>
             </w:r>
             <w:r>
               <w:rPr>
@@ -2823,7 +2823,7 @@
               <w14:ligatures w14:val="standardContextual"/>
             </w:rPr>
           </w:pPr>
-          <w:hyperlink w:anchor="_Toc244117463" w:history="1">
+          <w:hyperlink w:anchor="_Toc244119010" w:history="1">
             <w:r>
               <w:rPr>
                 <w:rStyle w:val="Hyperlink"/>
@@ -2850,7 +2850,7 @@
                 <w:noProof/>
                 <w:webHidden/>
               </w:rPr>
-              <w:instrText xml:space="preserve"> PAGEREF _Toc244117463 \h </w:instrText>
+              <w:instrText xml:space="preserve"> PAGEREF _Toc244119010 \h </w:instrText>
             </w:r>
             <w:r>
               <w:rPr>
@@ -2897,7 +2897,7 @@
               <w14:ligatures w14:val="standardContextual"/>
             </w:rPr>
           </w:pPr>
-          <w:hyperlink w:anchor="_Toc244117464" w:history="1">
+          <w:hyperlink w:anchor="_Toc244119011" w:history="1">
             <w:r>
               <w:rPr>
                 <w:rStyle w:val="Hyperlink"/>
@@ -2924,7 +2924,7 @@
                 <w:noProof/>
                 <w:webHidden/>
               </w:rPr>
-              <w:instrText xml:space="preserve"> PAGEREF _Toc244117464 \h </w:instrText>
+              <w:instrText xml:space="preserve"> PAGEREF _Toc244119011 \h </w:instrText>
             </w:r>
             <w:r>
               <w:rPr>
@@ -2971,7 +2971,7 @@
               <w14:ligatures w14:val="standardContextual"/>
             </w:rPr>
           </w:pPr>
-          <w:hyperlink w:anchor="_Toc244117465" w:history="1">
+          <w:hyperlink w:anchor="_Toc244119012" w:history="1">
             <w:r>
               <w:rPr>
                 <w:rStyle w:val="Hyperlink"/>
@@ -2998,7 +2998,7 @@
                 <w:noProof/>
                 <w:webHidden/>
               </w:rPr>
-              <w:instrText xml:space="preserve"> PAGEREF _Toc244117465 \h </w:instrText>
+              <w:instrText xml:space="preserve"> PAGEREF _Toc244119012 \h </w:instrText>
             </w:r>
             <w:r>
               <w:rPr>
@@ -3045,7 +3045,7 @@
               <w14:ligatures w14:val="standardContextual"/>
             </w:rPr>
           </w:pPr>
-          <w:hyperlink w:anchor="_Toc244117466" w:history="1">
+          <w:hyperlink w:anchor="_Toc244119013" w:history="1">
             <w:r>
               <w:rPr>
                 <w:rStyle w:val="Hyperlink"/>
@@ -3072,7 +3072,7 @@
                 <w:noProof/>
                 <w:webHidden/>
               </w:rPr>
-              <w:instrText xml:space="preserve"> PAGEREF _Toc244117466 \h </w:instrText>
+              <w:instrText xml:space="preserve"> PAGEREF _Toc244119013 \h </w:instrText>
             </w:r>
             <w:r>
               <w:rPr>
@@ -3119,7 +3119,7 @@
               <w14:ligatures w14:val="standardContextual"/>
             </w:rPr>
           </w:pPr>
-          <w:hyperlink w:anchor="_Toc244117467" w:history="1">
+          <w:hyperlink w:anchor="_Toc244119014" w:history="1">
             <w:r>
               <w:rPr>
                 <w:rStyle w:val="Hyperlink"/>
@@ -3146,7 +3146,7 @@
                 <w:noProof/>
                 <w:webHidden/>
               </w:rPr>
-              <w:instrText xml:space="preserve"> PAGEREF _Toc244117467 \h </w:instrText>
+              <w:instrText xml:space="preserve"> PAGEREF _Toc244119014 \h </w:instrText>
             </w:r>
             <w:r>
               <w:rPr>
@@ -3193,7 +3193,7 @@
               <w14:ligatures w14:val="standardContextual"/>
             </w:rPr>
           </w:pPr>
-          <w:hyperlink w:anchor="_Toc244117468" w:history="1">
+          <w:hyperlink w:anchor="_Toc244119015" w:history="1">
             <w:r>
               <w:rPr>
                 <w:rStyle w:val="Hyperlink"/>
@@ -3220,7 +3220,7 @@
                 <w:noProof/>
                 <w:webHidden/>
               </w:rPr>
-              <w:instrText xml:space="preserve"> PAGEREF _Toc244117468 \h </w:instrText>
+              <w:instrText xml:space="preserve"> PAGEREF _Toc244119015 \h </w:instrText>
             </w:r>
             <w:r>
               <w:rPr>
@@ -3267,7 +3267,7 @@
               <w14:ligatures w14:val="standardContextual"/>
             </w:rPr>
           </w:pPr>
-          <w:hyperlink w:anchor="_Toc244117469" w:history="1">
+          <w:hyperlink w:anchor="_Toc244119016" w:history="1">
             <w:r>
               <w:rPr>
                 <w:rStyle w:val="Hyperlink"/>
@@ -3294,7 +3294,7 @@
                 <w:noProof/>
                 <w:webHidden/>
               </w:rPr>
-              <w:instrText xml:space="preserve"> PAGEREF _Toc244117469 \h </w:instrText>
+              <w:instrText xml:space="preserve"> PAGEREF _Toc244119016 \h </w:instrText>
             </w:r>
             <w:r>
               <w:rPr>
@@ -3341,7 +3341,7 @@
               <w14:ligatures w14:val="standardContextual"/>
             </w:rPr>
           </w:pPr>
-          <w:hyperlink w:anchor="_Toc244117470" w:history="1">
+          <w:hyperlink w:anchor="_Toc244119017" w:history="1">
             <w:r>
               <w:rPr>
                 <w:rStyle w:val="Hyperlink"/>
@@ -3368,7 +3368,7 @@
                 <w:noProof/>
                 <w:webHidden/>
               </w:rPr>
-              <w:instrText xml:space="preserve"> PAGEREF _Toc244117470 \h </w:instrText>
+              <w:instrText xml:space="preserve"> PAGEREF _Toc244119017 \h </w:instrText>
             </w:r>
             <w:r>
               <w:rPr>
@@ -3415,7 +3415,7 @@
               <w14:ligatures w14:val="standardContextual"/>
             </w:rPr>
           </w:pPr>
-          <w:hyperlink w:anchor="_Toc244117471" w:history="1">
+          <w:hyperlink w:anchor="_Toc244119018" w:history="1">
             <w:r>
               <w:rPr>
                 <w:rStyle w:val="Hyperlink"/>
@@ -3442,7 +3442,7 @@
                 <w:noProof/>
                 <w:webHidden/>
               </w:rPr>
-              <w:instrText xml:space="preserve"> PAGEREF _Toc244117471 \h </w:instrText>
+              <w:instrText xml:space="preserve"> PAGEREF _Toc244119018 \h </w:instrText>
             </w:r>
             <w:r>
               <w:rPr>
@@ -3489,7 +3489,7 @@
               <w14:ligatures w14:val="standardContextual"/>
             </w:rPr>
           </w:pPr>
-          <w:hyperlink w:anchor="_Toc244117472" w:history="1">
+          <w:hyperlink w:anchor="_Toc244119019" w:history="1">
             <w:r>
               <w:rPr>
                 <w:rStyle w:val="Hyperlink"/>
@@ -3516,7 +3516,7 @@
                 <w:noProof/>
                 <w:webHidden/>
               </w:rPr>
-              <w:instrText xml:space="preserve"> PAGEREF _Toc244117472 \h </w:instrText>
+              <w:instrText xml:space="preserve"> PAGEREF _Toc244119019 \h </w:instrText>
             </w:r>
             <w:r>
               <w:rPr>
@@ -3563,7 +3563,7 @@
               <w14:ligatures w14:val="standardContextual"/>
             </w:rPr>
           </w:pPr>
-          <w:hyperlink w:anchor="_Toc244117473" w:history="1">
+          <w:hyperlink w:anchor="_Toc244119020" w:history="1">
             <w:r>
               <w:rPr>
                 <w:rStyle w:val="Hyperlink"/>
@@ -3590,7 +3590,7 @@
                 <w:noProof/>
                 <w:webHidden/>
               </w:rPr>
-              <w:instrText xml:space="preserve"> PAGEREF _Toc244117473 \h </w:instrText>
+              <w:instrText xml:space="preserve"> PAGEREF _Toc244119020 \h </w:instrText>
             </w:r>
             <w:r>
               <w:rPr>
@@ -3637,7 +3637,7 @@
               <w14:ligatures w14:val="standardContextual"/>
             </w:rPr>
           </w:pPr>
-          <w:hyperlink w:anchor="_Toc244117474" w:history="1">
+          <w:hyperlink w:anchor="_Toc244119021" w:history="1">
             <w:r>
               <w:rPr>
                 <w:rStyle w:val="Hyperlink"/>
@@ -3664,7 +3664,7 @@
                 <w:noProof/>
                 <w:webHidden/>
               </w:rPr>
-              <w:instrText xml:space="preserve"> PAGEREF _Toc244117474 \h </w:instrText>
+              <w:instrText xml:space="preserve"> PAGEREF _Toc244119021 \h </w:instrText>
             </w:r>
             <w:r>
               <w:rPr>
@@ -3711,7 +3711,7 @@
               <w14:ligatures w14:val="standardContextual"/>
             </w:rPr>
           </w:pPr>
-          <w:hyperlink w:anchor="_Toc244117475" w:history="1">
+          <w:hyperlink w:anchor="_Toc244119022" w:history="1">
             <w:r>
               <w:rPr>
                 <w:rStyle w:val="Hyperlink"/>
@@ -3738,7 +3738,7 @@
                 <w:noProof/>
                 <w:webHidden/>
               </w:rPr>
-              <w:instrText xml:space="preserve"> PAGEREF _Toc244117475 \h </w:instrText>
+              <w:instrText xml:space="preserve"> PAGEREF _Toc244119022 \h </w:instrText>
             </w:r>
             <w:r>
               <w:rPr>
@@ -3785,7 +3785,7 @@
               <w14:ligatures w14:val="standardContextual"/>
             </w:rPr>
           </w:pPr>
-          <w:hyperlink w:anchor="_Toc244117476" w:history="1">
+          <w:hyperlink w:anchor="_Toc244119023" w:history="1">
             <w:r>
               <w:rPr>
                 <w:rStyle w:val="Hyperlink"/>
@@ -3812,7 +3812,7 @@
                 <w:noProof/>
                 <w:webHidden/>
               </w:rPr>
-              <w:instrText xml:space="preserve"> PAGEREF _Toc244117476 \h </w:instrText>
+              <w:instrText xml:space="preserve"> PAGEREF _Toc244119023 \h </w:instrText>
             </w:r>
             <w:r>
               <w:rPr>
@@ -3859,7 +3859,7 @@
               <w14:ligatures w14:val="standardContextual"/>
             </w:rPr>
           </w:pPr>
-          <w:hyperlink w:anchor="_Toc244117477" w:history="1">
+          <w:hyperlink w:anchor="_Toc244119024" w:history="1">
             <w:r>
               <w:rPr>
                 <w:rStyle w:val="Hyperlink"/>
@@ -3886,7 +3886,7 @@
                 <w:noProof/>
                 <w:webHidden/>
               </w:rPr>
-              <w:instrText xml:space="preserve"> PAGEREF _Toc244117477 \h </w:instrText>
+              <w:instrText xml:space="preserve"> PAGEREF _Toc244119024 \h </w:instrText>
             </w:r>
             <w:r>
               <w:rPr>
@@ -3933,7 +3933,7 @@
               <w14:ligatures w14:val="standardContextual"/>
             </w:rPr>
           </w:pPr>
-          <w:hyperlink w:anchor="_Toc244117478" w:history="1">
+          <w:hyperlink w:anchor="_Toc244119025" w:history="1">
             <w:r>
               <w:rPr>
                 <w:rStyle w:val="Hyperlink"/>
@@ -3960,7 +3960,7 @@
                 <w:noProof/>
                 <w:webHidden/>
               </w:rPr>
-              <w:instrText xml:space="preserve"> PAGEREF _Toc244117478 \h </w:instrText>
+              <w:instrText xml:space="preserve"> PAGEREF _Toc244119025 \h </w:instrText>
             </w:r>
             <w:r>
               <w:rPr>
@@ -4007,7 +4007,7 @@
               <w14:ligatures w14:val="standardContextual"/>
             </w:rPr>
           </w:pPr>
-          <w:hyperlink w:anchor="_Toc244117479" w:history="1">
+          <w:hyperlink w:anchor="_Toc244119026" w:history="1">
             <w:r>
               <w:rPr>
                 <w:rStyle w:val="Hyperlink"/>
@@ -4034,7 +4034,7 @@
                 <w:noProof/>
                 <w:webHidden/>
               </w:rPr>
-              <w:instrText xml:space="preserve"> PAGEREF _Toc244117479 \h </w:instrText>
+              <w:instrText xml:space="preserve"> PAGEREF _Toc244119026 \h </w:instrText>
             </w:r>
             <w:r>
               <w:rPr>
@@ -4081,7 +4081,7 @@
               <w14:ligatures w14:val="standardContextual"/>
             </w:rPr>
           </w:pPr>
-          <w:hyperlink w:anchor="_Toc244117480" w:history="1">
+          <w:hyperlink w:anchor="_Toc244119027" w:history="1">
             <w:r>
               <w:rPr>
                 <w:rStyle w:val="Hyperlink"/>
@@ -4108,7 +4108,7 @@
                 <w:noProof/>
                 <w:webHidden/>
               </w:rPr>
-              <w:instrText xml:space="preserve"> PAGEREF _Toc244117480 \h </w:instrText>
+              <w:instrText xml:space="preserve"> PAGEREF _Toc244119027 \h </w:instrText>
             </w:r>
             <w:r>
               <w:rPr>
@@ -4155,7 +4155,7 @@
               <w14:ligatures w14:val="standardContextual"/>
             </w:rPr>
           </w:pPr>
-          <w:hyperlink w:anchor="_Toc244117481" w:history="1">
+          <w:hyperlink w:anchor="_Toc244119028" w:history="1">
             <w:r>
               <w:rPr>
                 <w:rStyle w:val="Hyperlink"/>
@@ -4182,7 +4182,7 @@
                 <w:noProof/>
                 <w:webHidden/>
               </w:rPr>
-              <w:instrText xml:space="preserve"> PAGEREF _Toc244117481 \h </w:instrText>
+              <w:instrText xml:space="preserve"> PAGEREF _Toc244119028 \h </w:instrText>
             </w:r>
             <w:r>
               <w:rPr>
@@ -4229,7 +4229,7 @@
               <w14:ligatures w14:val="standardContextual"/>
             </w:rPr>
           </w:pPr>
-          <w:hyperlink w:anchor="_Toc244117482" w:history="1">
+          <w:hyperlink w:anchor="_Toc244119029" w:history="1">
             <w:r>
               <w:rPr>
                 <w:rStyle w:val="Hyperlink"/>
@@ -4256,7 +4256,7 @@
                 <w:noProof/>
                 <w:webHidden/>
               </w:rPr>
-              <w:instrText xml:space="preserve"> PAGEREF _Toc244117482 \h </w:instrText>
+              <w:instrText xml:space="preserve"> PAGEREF _Toc244119029 \h </w:instrText>
             </w:r>
             <w:r>
               <w:rPr>
@@ -4303,7 +4303,7 @@
               <w14:ligatures w14:val="standardContextual"/>
             </w:rPr>
           </w:pPr>
-          <w:hyperlink w:anchor="_Toc244117483" w:history="1">
+          <w:hyperlink w:anchor="_Toc244119030" w:history="1">
             <w:r>
               <w:rPr>
                 <w:rStyle w:val="Hyperlink"/>
@@ -4330,7 +4330,7 @@
                 <w:noProof/>
                 <w:webHidden/>
               </w:rPr>
-              <w:instrText xml:space="preserve"> PAGEREF _Toc244117483 \h </w:instrText>
+              <w:instrText xml:space="preserve"> PAGEREF _Toc244119030 \h </w:instrText>
             </w:r>
             <w:r>
               <w:rPr>
@@ -4377,7 +4377,7 @@
               <w14:ligatures w14:val="standardContextual"/>
             </w:rPr>
           </w:pPr>
-          <w:hyperlink w:anchor="_Toc244117484" w:history="1">
+          <w:hyperlink w:anchor="_Toc244119031" w:history="1">
             <w:r>
               <w:rPr>
                 <w:rStyle w:val="Hyperlink"/>
@@ -4404,7 +4404,7 @@
                 <w:noProof/>
                 <w:webHidden/>
               </w:rPr>
-              <w:instrText xml:space="preserve"> PAGEREF _Toc244117484 \h </w:instrText>
+              <w:instrText xml:space="preserve"> PAGEREF _Toc244119031 \h </w:instrText>
             </w:r>
             <w:r>
               <w:rPr>
@@ -4451,7 +4451,7 @@
               <w14:ligatures w14:val="standardContextual"/>
             </w:rPr>
           </w:pPr>
-          <w:hyperlink w:anchor="_Toc244117485" w:history="1">
+          <w:hyperlink w:anchor="_Toc244119032" w:history="1">
             <w:r>
               <w:rPr>
                 <w:rStyle w:val="Hyperlink"/>
@@ -4478,7 +4478,7 @@
                 <w:noProof/>
                 <w:webHidden/>
               </w:rPr>
-              <w:instrText xml:space="preserve"> PAGEREF _Toc244117485 \h </w:instrText>
+              <w:instrText xml:space="preserve"> PAGEREF _Toc244119032 \h </w:instrText>
             </w:r>
             <w:r>
               <w:rPr>
@@ -4525,7 +4525,7 @@
               <w14:ligatures w14:val="standardContextual"/>
             </w:rPr>
           </w:pPr>
-          <w:hyperlink w:anchor="_Toc244117486" w:history="1">
+          <w:hyperlink w:anchor="_Toc244119033" w:history="1">
             <w:r>
               <w:rPr>
                 <w:rStyle w:val="Hyperlink"/>
@@ -4552,7 +4552,7 @@
                 <w:noProof/>
                 <w:webHidden/>
               </w:rPr>
-              <w:instrText xml:space="preserve"> PAGEREF _Toc244117486 \h </w:instrText>
+              <w:instrText xml:space="preserve"> PAGEREF _Toc244119033 \h </w:instrText>
             </w:r>
             <w:r>
               <w:rPr>
@@ -4599,7 +4599,7 @@
               <w14:ligatures w14:val="standardContextual"/>
             </w:rPr>
           </w:pPr>
-          <w:hyperlink w:anchor="_Toc244117487" w:history="1">
+          <w:hyperlink w:anchor="_Toc244119034" w:history="1">
             <w:r>
               <w:rPr>
                 <w:rStyle w:val="Hyperlink"/>
@@ -4626,7 +4626,7 @@
                 <w:noProof/>
                 <w:webHidden/>
               </w:rPr>
-              <w:instrText xml:space="preserve"> PAGEREF _Toc244117487 \h </w:instrText>
+              <w:instrText xml:space="preserve"> PAGEREF _Toc244119034 \h </w:instrText>
             </w:r>
             <w:r>
               <w:rPr>
@@ -4670,7 +4670,7 @@
         <w:pageBreakBefore/>
       </w:pPr>
       <w:bookmarkStart w:id="0" w:name="mở-đầu"/>
-      <w:bookmarkStart w:id="1" w:name="_Toc244117427"/>
+      <w:bookmarkStart w:id="1" w:name="_Toc244118974"/>
       <w:r>
         <w:lastRenderedPageBreak/>
         <w:t>Mở đầu</w:t>
@@ -4834,7 +4834,7 @@
         <w:pageBreakBefore/>
       </w:pPr>
       <w:bookmarkStart w:id="2" w:name="phần-a-giải-đấu"/>
-      <w:bookmarkStart w:id="3" w:name="_Toc244117428"/>
+      <w:bookmarkStart w:id="3" w:name="_Toc244118975"/>
       <w:bookmarkEnd w:id="0"/>
       <w:r>
         <w:lastRenderedPageBreak/>
@@ -4847,7 +4847,7 @@
         <w:pStyle w:val="Heading2"/>
       </w:pPr>
       <w:bookmarkStart w:id="4" w:name="a1-trò-chơi-ottv2"/>
-      <w:bookmarkStart w:id="5" w:name="_Toc244117429"/>
+      <w:bookmarkStart w:id="5" w:name="_Toc244118976"/>
       <w:r>
         <w:t>1. Trò chơi OTTv2</w:t>
       </w:r>
@@ -5128,7 +5128,7 @@
         <w:pStyle w:val="Heading2"/>
       </w:pPr>
       <w:bookmarkStart w:id="6" w:name="a2-tài-khoản-và-đội"/>
-      <w:bookmarkStart w:id="7" w:name="_Toc244117430"/>
+      <w:bookmarkStart w:id="7" w:name="_Toc244118977"/>
       <w:bookmarkEnd w:id="4"/>
       <w:r>
         <w:t>2. Tài khoản và đội</w:t>
@@ -5447,7 +5447,7 @@
         <w:pStyle w:val="Heading2"/>
       </w:pPr>
       <w:bookmarkStart w:id="8" w:name="a3-nộp-bot-qua-github"/>
-      <w:bookmarkStart w:id="9" w:name="_Toc244117431"/>
+      <w:bookmarkStart w:id="9" w:name="_Toc244118978"/>
       <w:bookmarkEnd w:id="6"/>
       <w:r>
         <w:t>3. Nộp bot qua GitHub</w:t>
@@ -5871,7 +5871,7 @@
         <w:pStyle w:val="Heading2"/>
       </w:pPr>
       <w:bookmarkStart w:id="10" w:name="a4-thể-lệ-và-lịch-đấu"/>
-      <w:bookmarkStart w:id="11" w:name="_Toc244117432"/>
+      <w:bookmarkStart w:id="11" w:name="_Toc244118979"/>
       <w:bookmarkEnd w:id="8"/>
       <w:r>
         <w:t>4. Thể lệ và lịch đấu</w:t>
@@ -5883,7 +5883,7 @@
         <w:pStyle w:val="Heading3"/>
       </w:pPr>
       <w:bookmarkStart w:id="12" w:name="ladder-trước-hạn"/>
-      <w:bookmarkStart w:id="13" w:name="_Toc244117433"/>
+      <w:bookmarkStart w:id="13" w:name="_Toc244118980"/>
       <w:r>
         <w:t>4.1. Ladder trước hạn</w:t>
       </w:r>
@@ -5943,7 +5943,7 @@
         <w:pStyle w:val="Heading3"/>
       </w:pPr>
       <w:bookmarkStart w:id="14" w:name="chốt-bài-tại-hạn"/>
-      <w:bookmarkStart w:id="15" w:name="_Toc244117434"/>
+      <w:bookmarkStart w:id="15" w:name="_Toc244118981"/>
       <w:bookmarkEnd w:id="12"/>
       <w:r>
         <w:lastRenderedPageBreak/>
@@ -5969,7 +5969,7 @@
         <w:pStyle w:val="Heading3"/>
       </w:pPr>
       <w:bookmarkStart w:id="16" w:name="xếp-hạng-chính-thức"/>
-      <w:bookmarkStart w:id="17" w:name="_Toc244117435"/>
+      <w:bookmarkStart w:id="17" w:name="_Toc244118982"/>
       <w:bookmarkEnd w:id="14"/>
       <w:r>
         <w:t>4.3. Xếp hạng chính thức</w:t>
@@ -6320,7 +6320,7 @@
         <w:pStyle w:val="Heading2"/>
       </w:pPr>
       <w:bookmarkStart w:id="18" w:name="a5-xem-kết-quả"/>
-      <w:bookmarkStart w:id="19" w:name="_Toc244117436"/>
+      <w:bookmarkStart w:id="19" w:name="_Toc244118983"/>
       <w:bookmarkEnd w:id="10"/>
       <w:bookmarkEnd w:id="16"/>
       <w:r>
@@ -6488,7 +6488,7 @@
         <w:pStyle w:val="Heading2"/>
       </w:pPr>
       <w:bookmarkStart w:id="20" w:name="a6-ban-tổ-chức-và-điều-hành"/>
-      <w:bookmarkStart w:id="21" w:name="_Toc244117437"/>
+      <w:bookmarkStart w:id="21" w:name="_Toc244118984"/>
       <w:bookmarkEnd w:id="18"/>
       <w:r>
         <w:t>6. Ban tổ chức và điều hành</w:t>
@@ -6607,7 +6607,7 @@
       <w:pPr>
         <w:pStyle w:val="Heading2"/>
       </w:pPr>
-      <w:bookmarkStart w:id="22" w:name="_Toc244117438"/>
+      <w:bookmarkStart w:id="22" w:name="_Toc244118985"/>
       <w:r>
         <w:t>7. Chung kết tại hội trường</w:t>
       </w:r>
@@ -7042,7 +7042,7 @@
         <w:pageBreakBefore/>
       </w:pPr>
       <w:bookmarkStart w:id="23" w:name="phần-b-thiết-kế-kỹ-thuật"/>
-      <w:bookmarkStart w:id="24" w:name="_Toc244117439"/>
+      <w:bookmarkStart w:id="24" w:name="_Toc244118986"/>
       <w:bookmarkEnd w:id="2"/>
       <w:bookmarkEnd w:id="20"/>
       <w:r>
@@ -7056,7 +7056,7 @@
         <w:pStyle w:val="Heading2"/>
       </w:pPr>
       <w:bookmarkStart w:id="25" w:name="b1-kiến-trúc-tổng-thể"/>
-      <w:bookmarkStart w:id="26" w:name="_Toc244117440"/>
+      <w:bookmarkStart w:id="26" w:name="_Toc244118987"/>
       <w:r>
         <w:t>1. Kiến trúc tổng thể</w:t>
       </w:r>
@@ -7158,7 +7158,7 @@
         <w:pStyle w:val="Heading2"/>
       </w:pPr>
       <w:bookmarkStart w:id="27" w:name="b2-dịch-vụ-được-dùng"/>
-      <w:bookmarkStart w:id="28" w:name="_Toc244117441"/>
+      <w:bookmarkStart w:id="28" w:name="_Toc244118988"/>
       <w:bookmarkEnd w:id="25"/>
       <w:r>
         <w:lastRenderedPageBreak/>
@@ -7490,7 +7490,7 @@
         <w:pStyle w:val="Heading2"/>
       </w:pPr>
       <w:bookmarkStart w:id="29" w:name="b3-hub-và-cách-phục-vụ-dữ-liệu"/>
-      <w:bookmarkStart w:id="30" w:name="_Toc244117442"/>
+      <w:bookmarkStart w:id="30" w:name="_Toc244118989"/>
       <w:bookmarkEnd w:id="27"/>
       <w:r>
         <w:t>3. Hub và cách phục vụ dữ liệu</w:t>
@@ -7569,7 +7569,7 @@
         <w:pStyle w:val="Heading2"/>
       </w:pPr>
       <w:bookmarkStart w:id="31" w:name="b4-máy-chấm-và-chia-việc"/>
-      <w:bookmarkStart w:id="32" w:name="_Toc244117443"/>
+      <w:bookmarkStart w:id="32" w:name="_Toc244118990"/>
       <w:bookmarkEnd w:id="29"/>
       <w:r>
         <w:t>4. Máy chấm và chia việc</w:t>
@@ -7692,7 +7692,7 @@
         <w:pStyle w:val="Heading2"/>
       </w:pPr>
       <w:bookmarkStart w:id="33" w:name="b5-sandbox-thay-docker"/>
-      <w:bookmarkStart w:id="34" w:name="_Toc244117444"/>
+      <w:bookmarkStart w:id="34" w:name="_Toc244118991"/>
       <w:bookmarkEnd w:id="31"/>
       <w:r>
         <w:t>5. Sandbox chạy bot</w:t>
@@ -7734,7 +7734,7 @@
         <w:pStyle w:val="Heading2"/>
       </w:pPr>
       <w:bookmarkStart w:id="35" w:name="b6-quỹ-giờ-và-khả-năng-đối-chiếu"/>
-      <w:bookmarkStart w:id="36" w:name="_Toc244117445"/>
+      <w:bookmarkStart w:id="36" w:name="_Toc244118992"/>
       <w:bookmarkEnd w:id="33"/>
       <w:r>
         <w:t>6. Quỹ giờ và khả năng đối chiếu</w:t>
@@ -7783,7 +7783,7 @@
         <w:pStyle w:val="Heading2"/>
       </w:pPr>
       <w:bookmarkStart w:id="37" w:name="b7-chịu-lỗi-và-sao-lưu"/>
-      <w:bookmarkStart w:id="38" w:name="_Toc244117446"/>
+      <w:bookmarkStart w:id="38" w:name="_Toc244118993"/>
       <w:bookmarkEnd w:id="35"/>
       <w:r>
         <w:t>7. Chịu lỗi và sao lưu</w:t>
@@ -8168,7 +8168,7 @@
         <w:pStyle w:val="Heading2"/>
       </w:pPr>
       <w:bookmarkStart w:id="39" w:name="b8-bảo-mật"/>
-      <w:bookmarkStart w:id="40" w:name="_Toc244117447"/>
+      <w:bookmarkStart w:id="40" w:name="_Toc244118994"/>
       <w:bookmarkEnd w:id="37"/>
       <w:r>
         <w:t>8. Bảo mật</w:t>
@@ -8226,7 +8226,7 @@
         <w:pStyle w:val="Heading2"/>
       </w:pPr>
       <w:bookmarkStart w:id="41" w:name="b9-sức-tải-và-thời-gian-đã-đo"/>
-      <w:bookmarkStart w:id="42" w:name="_Toc244117448"/>
+      <w:bookmarkStart w:id="42" w:name="_Toc244118995"/>
       <w:bookmarkEnd w:id="39"/>
       <w:r>
         <w:t>9. Sức tải và thời gian đã đo</w:t>
@@ -9410,7 +9410,7 @@
       <w:pPr>
         <w:pStyle w:val="Heading2"/>
       </w:pPr>
-      <w:bookmarkStart w:id="43" w:name="_Toc244117449"/>
+      <w:bookmarkStart w:id="43" w:name="_Toc244118996"/>
       <w:bookmarkEnd w:id="41"/>
       <w:r>
         <w:t>10. Cài đặt và vận hành</w:t>
@@ -9524,7 +9524,7 @@
       <w:pPr>
         <w:pStyle w:val="Heading2"/>
       </w:pPr>
-      <w:bookmarkStart w:id="44" w:name="_Toc244117450"/>
+      <w:bookmarkStart w:id="44" w:name="_Toc244118997"/>
       <w:r>
         <w:t>11. Mạng LAN ngày chung kết</w:t>
       </w:r>
@@ -9651,7 +9651,7 @@
         <w:pStyle w:val="Heading2"/>
         <w:pageBreakBefore/>
       </w:pPr>
-      <w:bookmarkStart w:id="45" w:name="_Toc244117451"/>
+      <w:bookmarkStart w:id="45" w:name="_Toc244118998"/>
       <w:r>
         <w:lastRenderedPageBreak/>
         <w:t>12. Giới hạn và hướng tiếp</w:t>
@@ -9745,7 +9745,7 @@
         <w:pageBreakBefore/>
       </w:pPr>
       <w:bookmarkStart w:id="46" w:name="phần-c-hướng-dẫn-demo-từng-bước"/>
-      <w:bookmarkStart w:id="47" w:name="_Toc244117452"/>
+      <w:bookmarkStart w:id="47" w:name="_Toc244118999"/>
       <w:bookmarkEnd w:id="23"/>
       <w:r>
         <w:lastRenderedPageBreak/>
@@ -9763,7 +9763,7 @@
         <w:pStyle w:val="Heading2"/>
       </w:pPr>
       <w:bookmarkStart w:id="48" w:name="c1-khách-xem-giải"/>
-      <w:bookmarkStart w:id="49" w:name="_Toc244117453"/>
+      <w:bookmarkStart w:id="49" w:name="_Toc244119000"/>
       <w:r>
         <w:t>1. Khách xem giải</w:t>
       </w:r>
@@ -9774,7 +9774,7 @@
         <w:pStyle w:val="Heading3"/>
       </w:pPr>
       <w:bookmarkStart w:id="50" w:name="bước-1-mở-giải-công-khai"/>
-      <w:bookmarkStart w:id="51" w:name="_Toc244117454"/>
+      <w:bookmarkStart w:id="51" w:name="_Toc244119001"/>
       <w:r>
         <w:t>Bước 1. Mở giải công khai</w:t>
       </w:r>
@@ -9862,7 +9862,7 @@
         <w:pStyle w:val="Heading3"/>
       </w:pPr>
       <w:bookmarkStart w:id="52" w:name="bước-2-xem-bảng-điểm-và-ma-trận"/>
-      <w:bookmarkStart w:id="53" w:name="_Toc244117455"/>
+      <w:bookmarkStart w:id="53" w:name="_Toc244119002"/>
       <w:bookmarkEnd w:id="50"/>
       <w:r>
         <w:t>Bước 2. Xem bảng điểm và ma trận</w:t>
@@ -9973,7 +9973,7 @@
         <w:pageBreakBefore/>
       </w:pPr>
       <w:bookmarkStart w:id="54" w:name="bước-3-xem-lại-từng-nước"/>
-      <w:bookmarkStart w:id="55" w:name="_Toc244117456"/>
+      <w:bookmarkStart w:id="55" w:name="_Toc244119003"/>
       <w:bookmarkEnd w:id="52"/>
       <w:r>
         <w:lastRenderedPageBreak/>
@@ -10054,7 +10054,7 @@
         <w:pageBreakBefore/>
       </w:pPr>
       <w:bookmarkStart w:id="56" w:name="c2-thí-sinh-đăng-ký-và-nộp-bot"/>
-      <w:bookmarkStart w:id="57" w:name="_Toc244117457"/>
+      <w:bookmarkStart w:id="57" w:name="_Toc244119004"/>
       <w:bookmarkEnd w:id="48"/>
       <w:bookmarkEnd w:id="54"/>
       <w:r>
@@ -10067,7 +10067,7 @@
       <w:pPr>
         <w:pStyle w:val="Heading3"/>
       </w:pPr>
-      <w:bookmarkStart w:id="58" w:name="_Toc244117458"/>
+      <w:bookmarkStart w:id="58" w:name="_Toc244119005"/>
       <w:r>
         <w:t>Bước 4. Đăng ký bằng email trường</w:t>
       </w:r>
@@ -10168,7 +10168,7 @@
         <w:pStyle w:val="Heading3"/>
         <w:pageBreakBefore/>
       </w:pPr>
-      <w:bookmarkStart w:id="59" w:name="_Toc244117459"/>
+      <w:bookmarkStart w:id="59" w:name="_Toc244119006"/>
       <w:r>
         <w:lastRenderedPageBreak/>
         <w:t>Bước 5. Mở email lấy mã</w:t>
@@ -10251,7 +10251,7 @@
         <w:pStyle w:val="Heading3"/>
         <w:pageBreakBefore/>
       </w:pPr>
-      <w:bookmarkStart w:id="60" w:name="_Toc244117460"/>
+      <w:bookmarkStart w:id="60" w:name="_Toc244119007"/>
       <w:r>
         <w:lastRenderedPageBreak/>
         <w:t>Bước 6. Xác minh email</w:t>
@@ -10343,7 +10343,7 @@
         <w:pStyle w:val="Heading3"/>
         <w:pageBreakBefore/>
       </w:pPr>
-      <w:bookmarkStart w:id="61" w:name="_Toc244117461"/>
+      <w:bookmarkStart w:id="61" w:name="_Toc244119008"/>
       <w:r>
         <w:lastRenderedPageBreak/>
         <w:t>Bước 7. Đặt mật khẩu và đăng nhập</w:t>
@@ -10434,7 +10434,7 @@
       <w:pPr>
         <w:pStyle w:val="Heading3"/>
       </w:pPr>
-      <w:bookmarkStart w:id="62" w:name="_Toc244117462"/>
+      <w:bookmarkStart w:id="62" w:name="_Toc244119009"/>
       <w:r>
         <w:t>Bước 8. Tạo đội</w:t>
       </w:r>
@@ -10532,7 +10532,7 @@
         <w:pStyle w:val="Heading3"/>
         <w:pageBreakBefore/>
       </w:pPr>
-      <w:bookmarkStart w:id="63" w:name="_Toc244117463"/>
+      <w:bookmarkStart w:id="63" w:name="_Toc244119010"/>
       <w:r>
         <w:lastRenderedPageBreak/>
         <w:t>Bước 9. Mời các thành viên</w:t>
@@ -10620,7 +10620,7 @@
       <w:pPr>
         <w:pStyle w:val="Heading3"/>
       </w:pPr>
-      <w:bookmarkStart w:id="64" w:name="_Toc244117464"/>
+      <w:bookmarkStart w:id="64" w:name="_Toc244119011"/>
       <w:r>
         <w:t>Bước 10. Vào đội bằng mã mời</w:t>
       </w:r>
@@ -10708,7 +10708,7 @@
         <w:pStyle w:val="Heading3"/>
         <w:pageBreakBefore/>
       </w:pPr>
-      <w:bookmarkStart w:id="65" w:name="_Toc244117465"/>
+      <w:bookmarkStart w:id="65" w:name="_Toc244119012"/>
       <w:r>
         <w:lastRenderedPageBreak/>
         <w:t>Bước 11. Tạo repo từ mẫu</w:t>
@@ -10796,7 +10796,7 @@
       <w:pPr>
         <w:pStyle w:val="Heading3"/>
       </w:pPr>
-      <w:bookmarkStart w:id="66" w:name="_Toc244117466"/>
+      <w:bookmarkStart w:id="66" w:name="_Toc244119013"/>
       <w:r>
         <w:t>Bước 12. Cho App truy cập đúng repo</w:t>
       </w:r>
@@ -10894,7 +10894,7 @@
         <w:pStyle w:val="Heading3"/>
         <w:pageBreakBefore/>
       </w:pPr>
-      <w:bookmarkStart w:id="67" w:name="_Toc244117467"/>
+      <w:bookmarkStart w:id="67" w:name="_Toc244119014"/>
       <w:r>
         <w:lastRenderedPageBreak/>
         <w:t>Bước 13. Gắn link repo với đội</w:t>
@@ -10992,7 +10992,7 @@
       <w:pPr>
         <w:pStyle w:val="Heading3"/>
       </w:pPr>
-      <w:bookmarkStart w:id="68" w:name="_Toc244117468"/>
+      <w:bookmarkStart w:id="68" w:name="_Toc244119015"/>
       <w:r>
         <w:t>Bước 14. Theo dõi kiểm tra 72 mẫu</w:t>
       </w:r>
@@ -11130,7 +11130,7 @@
         <w:pStyle w:val="Heading3"/>
         <w:pageBreakBefore/>
       </w:pPr>
-      <w:bookmarkStart w:id="69" w:name="_Toc244117469"/>
+      <w:bookmarkStart w:id="69" w:name="_Toc244119016"/>
       <w:r>
         <w:lastRenderedPageBreak/>
         <w:t>Bước 15. Thử nhanh không cần GitHub</w:t>
@@ -11203,7 +11203,7 @@
         <w:pStyle w:val="Heading3"/>
         <w:pageBreakBefore/>
       </w:pPr>
-      <w:bookmarkStart w:id="70" w:name="_Toc244117470"/>
+      <w:bookmarkStart w:id="70" w:name="_Toc244119017"/>
       <w:r>
         <w:lastRenderedPageBreak/>
         <w:t>Bước 16. Xem giải của đội</w:t>
@@ -11321,7 +11321,7 @@
       <w:pPr>
         <w:pStyle w:val="Heading3"/>
       </w:pPr>
-      <w:bookmarkStart w:id="71" w:name="_Toc244117471"/>
+      <w:bookmarkStart w:id="71" w:name="_Toc244119018"/>
       <w:r>
         <w:t>Bước 17. Luyện tập với bot mẫu</w:t>
       </w:r>
@@ -11430,7 +11430,7 @@
         <w:pageBreakBefore/>
       </w:pPr>
       <w:bookmarkStart w:id="72" w:name="c3-ban-tổ-chức-điều-hành"/>
-      <w:bookmarkStart w:id="73" w:name="_Toc244117472"/>
+      <w:bookmarkStart w:id="73" w:name="_Toc244119019"/>
       <w:bookmarkEnd w:id="56"/>
       <w:r>
         <w:lastRenderedPageBreak/>
@@ -11442,7 +11442,7 @@
       <w:pPr>
         <w:pStyle w:val="Heading3"/>
       </w:pPr>
-      <w:bookmarkStart w:id="74" w:name="_Toc244117473"/>
+      <w:bookmarkStart w:id="74" w:name="_Toc244119020"/>
       <w:r>
         <w:t>Bước 18. Xem tổng quan ban tổ chức</w:t>
       </w:r>
@@ -11520,7 +11520,7 @@
         <w:pStyle w:val="Heading3"/>
         <w:pageBreakBefore/>
       </w:pPr>
-      <w:bookmarkStart w:id="75" w:name="_Toc244117474"/>
+      <w:bookmarkStart w:id="75" w:name="_Toc244119021"/>
       <w:r>
         <w:lastRenderedPageBreak/>
         <w:t>Bước 19. Chọn giải ở Tổng quan</w:t>
@@ -11639,7 +11639,7 @@
         <w:pStyle w:val="Heading3"/>
         <w:pageBreakBefore/>
       </w:pPr>
-      <w:bookmarkStart w:id="76" w:name="_Toc244117475"/>
+      <w:bookmarkStart w:id="76" w:name="_Toc244119022"/>
       <w:r>
         <w:lastRenderedPageBreak/>
         <w:t>Bước 20. Chuẩn bị giải mới</w:t>
@@ -11727,7 +11727,7 @@
       <w:pPr>
         <w:pStyle w:val="Heading3"/>
       </w:pPr>
-      <w:bookmarkStart w:id="77" w:name="_Toc244117476"/>
+      <w:bookmarkStart w:id="77" w:name="_Toc244119023"/>
       <w:r>
         <w:t>Bước 21. Cài máy chấm Windows hoặc Linux</w:t>
       </w:r>
@@ -11835,7 +11835,7 @@
         <w:pStyle w:val="Heading3"/>
         <w:pageBreakBefore/>
       </w:pPr>
-      <w:bookmarkStart w:id="78" w:name="_Toc244117477"/>
+      <w:bookmarkStart w:id="78" w:name="_Toc244119024"/>
       <w:r>
         <w:lastRenderedPageBreak/>
         <w:t>Bước 22. Kiểm tình trạng chấm và hàng đợi</w:t>
@@ -11923,7 +11923,7 @@
       <w:pPr>
         <w:pStyle w:val="Heading3"/>
       </w:pPr>
-      <w:bookmarkStart w:id="79" w:name="_Toc244117478"/>
+      <w:bookmarkStart w:id="79" w:name="_Toc244119025"/>
       <w:r>
         <w:t>Bước 23. Soạn thông báo</w:t>
       </w:r>
@@ -12021,7 +12021,7 @@
         <w:pStyle w:val="Heading3"/>
         <w:pageBreakBefore/>
       </w:pPr>
-      <w:bookmarkStart w:id="80" w:name="_Toc244117479"/>
+      <w:bookmarkStart w:id="80" w:name="_Toc244119026"/>
       <w:r>
         <w:lastRenderedPageBreak/>
         <w:t>Bước 24. Xuất bảng điểm CSV</w:t>
@@ -12110,7 +12110,7 @@
         <w:pStyle w:val="Heading2"/>
         <w:pageBreakBefore/>
       </w:pPr>
-      <w:bookmarkStart w:id="81" w:name="_Toc244117480"/>
+      <w:bookmarkStart w:id="81" w:name="_Toc244119027"/>
       <w:bookmarkEnd w:id="46"/>
       <w:bookmarkEnd w:id="72"/>
       <w:r>
@@ -12124,14 +12124,14 @@
         <w:keepNext/>
       </w:pPr>
       <w:r>
-        <w:t>Web thật có một chung kết thử 16 đội bot mẫu đã chạy trên hub LAN rồi nạp lên (thẻ chung kết trong Giải đấu) để xem nhánh đấu, màn hình chiếu và replay.</w:t>
+        <w:t>Web thật có một chung kết thử 16 đội bot mẫu đã chạy trên hub LAN rồi nạp lên (thẻ chung kết trong Giải đấu) để xem nhánh đấu và replay.</w:t>
       </w:r>
     </w:p>
     <w:p>
       <w:pPr>
         <w:pStyle w:val="Heading3"/>
       </w:pPr>
-      <w:bookmarkStart w:id="82" w:name="_Toc244117481"/>
+      <w:bookmarkStart w:id="82" w:name="_Toc244119028"/>
       <w:r>
         <w:t>Bước 25. Tạo tài khoản và phát giấy cho đội</w:t>
       </w:r>
@@ -12205,7 +12205,7 @@
         <w:pStyle w:val="Heading3"/>
         <w:pageBreakBefore/>
       </w:pPr>
-      <w:bookmarkStart w:id="83" w:name="_Toc244117482"/>
+      <w:bookmarkStart w:id="83" w:name="_Toc244119029"/>
       <w:r>
         <w:lastRenderedPageBreak/>
         <w:t>Bước 26. Đội tự nạp ZIP và kiểm tra</w:t>
@@ -12280,7 +12280,7 @@
         <w:pStyle w:val="Heading3"/>
         <w:pageBreakBefore/>
       </w:pPr>
-      <w:bookmarkStart w:id="84" w:name="_Toc244117483"/>
+      <w:bookmarkStart w:id="84" w:name="_Toc244119030"/>
       <w:r>
         <w:lastRenderedPageBreak/>
         <w:t>Bước 27. BTC tạo chung kết</w:t>
@@ -12355,7 +12355,7 @@
         <w:pStyle w:val="Heading3"/>
         <w:pageBreakBefore/>
       </w:pPr>
-      <w:bookmarkStart w:id="85" w:name="_Toc244117484"/>
+      <w:bookmarkStart w:id="85" w:name="_Toc244119031"/>
       <w:r>
         <w:lastRenderedPageBreak/>
         <w:t>Bước 28. Theo dõi vòng bảng và replay</w:t>
@@ -12430,7 +12430,7 @@
         <w:pStyle w:val="Heading3"/>
         <w:pageBreakBefore/>
       </w:pPr>
-      <w:bookmarkStart w:id="86" w:name="_Toc244117485"/>
+      <w:bookmarkStart w:id="86" w:name="_Toc244119032"/>
       <w:r>
         <w:lastRenderedPageBreak/>
         <w:t>Bước 29. Trang nhánh đấu và màn hình chiếu</w:t>
@@ -12442,7 +12442,7 @@
         <w:keepNext/>
       </w:pPr>
       <w:r>
-        <w:t>Trang Chung kết tự nối tứ kết, bán kết, chung kết và tranh hạng ba; cặp đang đấu được tô nổi. Bấm ô cặp để xem 2 ván, lý do đi tiếp và replay; xem lý do đi tiếp khi hòa hai ván. Mở Màn hình chiếu để có nền tối, chữ lớn, không thanh bên và tự cập nhật mỗi ba giây. BTC có thể Dừng tự động để giữ nguyên các giải con và làm tiếp bằng tay; không có nút sửa đội thắng.</w:t>
+        <w:t>Trang Chung kết tự nối tứ kết, bán kết, chung kết và tranh hạng ba; cặp đang đấu được tô nổi. Bấm ô cặp để xem 2 ván, lý do đi tiếp và replay. BTC mở Màn hình chiếu trên hub LAN để có nền tối, chữ lớn, không thanh bên và tự cập nhật mỗi ba giây. BTC có thể Dừng tự động để giữ nguyên các giải con và làm tiếp bằng tay; không có nút sửa đội thắng.</w:t>
       </w:r>
     </w:p>
     <w:p>
@@ -12505,7 +12505,7 @@
         <w:pStyle w:val="Heading3"/>
         <w:pageBreakBefore/>
       </w:pPr>
-      <w:bookmarkStart w:id="87" w:name="_Toc244117486"/>
+      <w:bookmarkStart w:id="87" w:name="_Toc244119033"/>
       <w:r>
         <w:lastRenderedPageBreak/>
         <w:t>Bước 30. Xuất kết quả trên hub LAN</w:t>
@@ -12580,7 +12580,7 @@
         <w:pStyle w:val="Heading3"/>
         <w:pageBreakBefore/>
       </w:pPr>
-      <w:bookmarkStart w:id="88" w:name="_Toc244117487"/>
+      <w:bookmarkStart w:id="88" w:name="_Toc244119034"/>
       <w:r>
         <w:lastRenderedPageBreak/>
         <w:t>Bước 31. Nạp kết quả lên web thật</w:t>

</xml_diff>

<commit_message>
Bổ sung quyền xem nhật ký trong tài liệu
</commit_message>
<xml_diff>
--- a/TAI-LIEU.docx
+++ b/TAI-LIEU.docx
@@ -159,7 +159,7 @@
           <w:r>
             <w:fldChar w:fldCharType="separate"/>
           </w:r>
-          <w:hyperlink w:anchor="_Toc244118974" w:history="1">
+          <w:hyperlink w:anchor="_Toc244123227" w:history="1">
             <w:r>
               <w:rPr>
                 <w:rStyle w:val="Hyperlink"/>
@@ -186,7 +186,7 @@
                 <w:noProof/>
                 <w:webHidden/>
               </w:rPr>
-              <w:instrText xml:space="preserve"> PAGEREF _Toc244118974 \h </w:instrText>
+              <w:instrText xml:space="preserve"> PAGEREF _Toc244123227 \h </w:instrText>
             </w:r>
             <w:r>
               <w:rPr>
@@ -233,7 +233,7 @@
               <w14:ligatures w14:val="standardContextual"/>
             </w:rPr>
           </w:pPr>
-          <w:hyperlink w:anchor="_Toc244118975" w:history="1">
+          <w:hyperlink w:anchor="_Toc244123228" w:history="1">
             <w:r>
               <w:rPr>
                 <w:rStyle w:val="Hyperlink"/>
@@ -260,7 +260,7 @@
                 <w:noProof/>
                 <w:webHidden/>
               </w:rPr>
-              <w:instrText xml:space="preserve"> PAGEREF _Toc244118975 \h </w:instrText>
+              <w:instrText xml:space="preserve"> PAGEREF _Toc244123228 \h </w:instrText>
             </w:r>
             <w:r>
               <w:rPr>
@@ -307,7 +307,7 @@
               <w14:ligatures w14:val="standardContextual"/>
             </w:rPr>
           </w:pPr>
-          <w:hyperlink w:anchor="_Toc244118976" w:history="1">
+          <w:hyperlink w:anchor="_Toc244123229" w:history="1">
             <w:r>
               <w:rPr>
                 <w:rStyle w:val="Hyperlink"/>
@@ -334,7 +334,7 @@
                 <w:noProof/>
                 <w:webHidden/>
               </w:rPr>
-              <w:instrText xml:space="preserve"> PAGEREF _Toc244118976 \h </w:instrText>
+              <w:instrText xml:space="preserve"> PAGEREF _Toc244123229 \h </w:instrText>
             </w:r>
             <w:r>
               <w:rPr>
@@ -381,7 +381,7 @@
               <w14:ligatures w14:val="standardContextual"/>
             </w:rPr>
           </w:pPr>
-          <w:hyperlink w:anchor="_Toc244118977" w:history="1">
+          <w:hyperlink w:anchor="_Toc244123230" w:history="1">
             <w:r>
               <w:rPr>
                 <w:rStyle w:val="Hyperlink"/>
@@ -408,7 +408,7 @@
                 <w:noProof/>
                 <w:webHidden/>
               </w:rPr>
-              <w:instrText xml:space="preserve"> PAGEREF _Toc244118977 \h </w:instrText>
+              <w:instrText xml:space="preserve"> PAGEREF _Toc244123230 \h </w:instrText>
             </w:r>
             <w:r>
               <w:rPr>
@@ -455,7 +455,7 @@
               <w14:ligatures w14:val="standardContextual"/>
             </w:rPr>
           </w:pPr>
-          <w:hyperlink w:anchor="_Toc244118978" w:history="1">
+          <w:hyperlink w:anchor="_Toc244123231" w:history="1">
             <w:r>
               <w:rPr>
                 <w:rStyle w:val="Hyperlink"/>
@@ -482,7 +482,7 @@
                 <w:noProof/>
                 <w:webHidden/>
               </w:rPr>
-              <w:instrText xml:space="preserve"> PAGEREF _Toc244118978 \h </w:instrText>
+              <w:instrText xml:space="preserve"> PAGEREF _Toc244123231 \h </w:instrText>
             </w:r>
             <w:r>
               <w:rPr>
@@ -529,7 +529,7 @@
               <w14:ligatures w14:val="standardContextual"/>
             </w:rPr>
           </w:pPr>
-          <w:hyperlink w:anchor="_Toc244118979" w:history="1">
+          <w:hyperlink w:anchor="_Toc244123232" w:history="1">
             <w:r>
               <w:rPr>
                 <w:rStyle w:val="Hyperlink"/>
@@ -556,7 +556,7 @@
                 <w:noProof/>
                 <w:webHidden/>
               </w:rPr>
-              <w:instrText xml:space="preserve"> PAGEREF _Toc244118979 \h </w:instrText>
+              <w:instrText xml:space="preserve"> PAGEREF _Toc244123232 \h </w:instrText>
             </w:r>
             <w:r>
               <w:rPr>
@@ -603,7 +603,7 @@
               <w14:ligatures w14:val="standardContextual"/>
             </w:rPr>
           </w:pPr>
-          <w:hyperlink w:anchor="_Toc244118980" w:history="1">
+          <w:hyperlink w:anchor="_Toc244123233" w:history="1">
             <w:r>
               <w:rPr>
                 <w:rStyle w:val="Hyperlink"/>
@@ -630,7 +630,7 @@
                 <w:noProof/>
                 <w:webHidden/>
               </w:rPr>
-              <w:instrText xml:space="preserve"> PAGEREF _Toc244118980 \h </w:instrText>
+              <w:instrText xml:space="preserve"> PAGEREF _Toc244123233 \h </w:instrText>
             </w:r>
             <w:r>
               <w:rPr>
@@ -677,7 +677,7 @@
               <w14:ligatures w14:val="standardContextual"/>
             </w:rPr>
           </w:pPr>
-          <w:hyperlink w:anchor="_Toc244118981" w:history="1">
+          <w:hyperlink w:anchor="_Toc244123234" w:history="1">
             <w:r>
               <w:rPr>
                 <w:rStyle w:val="Hyperlink"/>
@@ -704,7 +704,7 @@
                 <w:noProof/>
                 <w:webHidden/>
               </w:rPr>
-              <w:instrText xml:space="preserve"> PAGEREF _Toc244118981 \h </w:instrText>
+              <w:instrText xml:space="preserve"> PAGEREF _Toc244123234 \h </w:instrText>
             </w:r>
             <w:r>
               <w:rPr>
@@ -751,7 +751,7 @@
               <w14:ligatures w14:val="standardContextual"/>
             </w:rPr>
           </w:pPr>
-          <w:hyperlink w:anchor="_Toc244118982" w:history="1">
+          <w:hyperlink w:anchor="_Toc244123235" w:history="1">
             <w:r>
               <w:rPr>
                 <w:rStyle w:val="Hyperlink"/>
@@ -778,7 +778,7 @@
                 <w:noProof/>
                 <w:webHidden/>
               </w:rPr>
-              <w:instrText xml:space="preserve"> PAGEREF _Toc244118982 \h </w:instrText>
+              <w:instrText xml:space="preserve"> PAGEREF _Toc244123235 \h </w:instrText>
             </w:r>
             <w:r>
               <w:rPr>
@@ -825,7 +825,7 @@
               <w14:ligatures w14:val="standardContextual"/>
             </w:rPr>
           </w:pPr>
-          <w:hyperlink w:anchor="_Toc244118983" w:history="1">
+          <w:hyperlink w:anchor="_Toc244123236" w:history="1">
             <w:r>
               <w:rPr>
                 <w:rStyle w:val="Hyperlink"/>
@@ -852,7 +852,7 @@
                 <w:noProof/>
                 <w:webHidden/>
               </w:rPr>
-              <w:instrText xml:space="preserve"> PAGEREF _Toc244118983 \h </w:instrText>
+              <w:instrText xml:space="preserve"> PAGEREF _Toc244123236 \h </w:instrText>
             </w:r>
             <w:r>
               <w:rPr>
@@ -899,7 +899,7 @@
               <w14:ligatures w14:val="standardContextual"/>
             </w:rPr>
           </w:pPr>
-          <w:hyperlink w:anchor="_Toc244118984" w:history="1">
+          <w:hyperlink w:anchor="_Toc244123237" w:history="1">
             <w:r>
               <w:rPr>
                 <w:rStyle w:val="Hyperlink"/>
@@ -926,7 +926,7 @@
                 <w:noProof/>
                 <w:webHidden/>
               </w:rPr>
-              <w:instrText xml:space="preserve"> PAGEREF _Toc244118984 \h </w:instrText>
+              <w:instrText xml:space="preserve"> PAGEREF _Toc244123237 \h </w:instrText>
             </w:r>
             <w:r>
               <w:rPr>
@@ -973,7 +973,7 @@
               <w14:ligatures w14:val="standardContextual"/>
             </w:rPr>
           </w:pPr>
-          <w:hyperlink w:anchor="_Toc244118985" w:history="1">
+          <w:hyperlink w:anchor="_Toc244123238" w:history="1">
             <w:r>
               <w:rPr>
                 <w:rStyle w:val="Hyperlink"/>
@@ -1000,7 +1000,7 @@
                 <w:noProof/>
                 <w:webHidden/>
               </w:rPr>
-              <w:instrText xml:space="preserve"> PAGEREF _Toc244118985 \h </w:instrText>
+              <w:instrText xml:space="preserve"> PAGEREF _Toc244123238 \h </w:instrText>
             </w:r>
             <w:r>
               <w:rPr>
@@ -1047,7 +1047,7 @@
               <w14:ligatures w14:val="standardContextual"/>
             </w:rPr>
           </w:pPr>
-          <w:hyperlink w:anchor="_Toc244118986" w:history="1">
+          <w:hyperlink w:anchor="_Toc244123239" w:history="1">
             <w:r>
               <w:rPr>
                 <w:rStyle w:val="Hyperlink"/>
@@ -1074,7 +1074,7 @@
                 <w:noProof/>
                 <w:webHidden/>
               </w:rPr>
-              <w:instrText xml:space="preserve"> PAGEREF _Toc244118986 \h </w:instrText>
+              <w:instrText xml:space="preserve"> PAGEREF _Toc244123239 \h </w:instrText>
             </w:r>
             <w:r>
               <w:rPr>
@@ -1121,7 +1121,7 @@
               <w14:ligatures w14:val="standardContextual"/>
             </w:rPr>
           </w:pPr>
-          <w:hyperlink w:anchor="_Toc244118987" w:history="1">
+          <w:hyperlink w:anchor="_Toc244123240" w:history="1">
             <w:r>
               <w:rPr>
                 <w:rStyle w:val="Hyperlink"/>
@@ -1148,7 +1148,7 @@
                 <w:noProof/>
                 <w:webHidden/>
               </w:rPr>
-              <w:instrText xml:space="preserve"> PAGEREF _Toc244118987 \h </w:instrText>
+              <w:instrText xml:space="preserve"> PAGEREF _Toc244123240 \h </w:instrText>
             </w:r>
             <w:r>
               <w:rPr>
@@ -1195,7 +1195,7 @@
               <w14:ligatures w14:val="standardContextual"/>
             </w:rPr>
           </w:pPr>
-          <w:hyperlink w:anchor="_Toc244118988" w:history="1">
+          <w:hyperlink w:anchor="_Toc244123241" w:history="1">
             <w:r>
               <w:rPr>
                 <w:rStyle w:val="Hyperlink"/>
@@ -1222,7 +1222,7 @@
                 <w:noProof/>
                 <w:webHidden/>
               </w:rPr>
-              <w:instrText xml:space="preserve"> PAGEREF _Toc244118988 \h </w:instrText>
+              <w:instrText xml:space="preserve"> PAGEREF _Toc244123241 \h </w:instrText>
             </w:r>
             <w:r>
               <w:rPr>
@@ -1269,7 +1269,7 @@
               <w14:ligatures w14:val="standardContextual"/>
             </w:rPr>
           </w:pPr>
-          <w:hyperlink w:anchor="_Toc244118989" w:history="1">
+          <w:hyperlink w:anchor="_Toc244123242" w:history="1">
             <w:r>
               <w:rPr>
                 <w:rStyle w:val="Hyperlink"/>
@@ -1296,7 +1296,7 @@
                 <w:noProof/>
                 <w:webHidden/>
               </w:rPr>
-              <w:instrText xml:space="preserve"> PAGEREF _Toc244118989 \h </w:instrText>
+              <w:instrText xml:space="preserve"> PAGEREF _Toc244123242 \h </w:instrText>
             </w:r>
             <w:r>
               <w:rPr>
@@ -1343,7 +1343,7 @@
               <w14:ligatures w14:val="standardContextual"/>
             </w:rPr>
           </w:pPr>
-          <w:hyperlink w:anchor="_Toc244118990" w:history="1">
+          <w:hyperlink w:anchor="_Toc244123243" w:history="1">
             <w:r>
               <w:rPr>
                 <w:rStyle w:val="Hyperlink"/>
@@ -1370,7 +1370,7 @@
                 <w:noProof/>
                 <w:webHidden/>
               </w:rPr>
-              <w:instrText xml:space="preserve"> PAGEREF _Toc244118990 \h </w:instrText>
+              <w:instrText xml:space="preserve"> PAGEREF _Toc244123243 \h </w:instrText>
             </w:r>
             <w:r>
               <w:rPr>
@@ -1417,7 +1417,7 @@
               <w14:ligatures w14:val="standardContextual"/>
             </w:rPr>
           </w:pPr>
-          <w:hyperlink w:anchor="_Toc244118991" w:history="1">
+          <w:hyperlink w:anchor="_Toc244123244" w:history="1">
             <w:r>
               <w:rPr>
                 <w:rStyle w:val="Hyperlink"/>
@@ -1444,7 +1444,7 @@
                 <w:noProof/>
                 <w:webHidden/>
               </w:rPr>
-              <w:instrText xml:space="preserve"> PAGEREF _Toc244118991 \h </w:instrText>
+              <w:instrText xml:space="preserve"> PAGEREF _Toc244123244 \h </w:instrText>
             </w:r>
             <w:r>
               <w:rPr>
@@ -1491,7 +1491,7 @@
               <w14:ligatures w14:val="standardContextual"/>
             </w:rPr>
           </w:pPr>
-          <w:hyperlink w:anchor="_Toc244118992" w:history="1">
+          <w:hyperlink w:anchor="_Toc244123245" w:history="1">
             <w:r>
               <w:rPr>
                 <w:rStyle w:val="Hyperlink"/>
@@ -1518,7 +1518,7 @@
                 <w:noProof/>
                 <w:webHidden/>
               </w:rPr>
-              <w:instrText xml:space="preserve"> PAGEREF _Toc244118992 \h </w:instrText>
+              <w:instrText xml:space="preserve"> PAGEREF _Toc244123245 \h </w:instrText>
             </w:r>
             <w:r>
               <w:rPr>
@@ -1565,7 +1565,7 @@
               <w14:ligatures w14:val="standardContextual"/>
             </w:rPr>
           </w:pPr>
-          <w:hyperlink w:anchor="_Toc244118993" w:history="1">
+          <w:hyperlink w:anchor="_Toc244123246" w:history="1">
             <w:r>
               <w:rPr>
                 <w:rStyle w:val="Hyperlink"/>
@@ -1592,7 +1592,7 @@
                 <w:noProof/>
                 <w:webHidden/>
               </w:rPr>
-              <w:instrText xml:space="preserve"> PAGEREF _Toc244118993 \h </w:instrText>
+              <w:instrText xml:space="preserve"> PAGEREF _Toc244123246 \h </w:instrText>
             </w:r>
             <w:r>
               <w:rPr>
@@ -1639,7 +1639,7 @@
               <w14:ligatures w14:val="standardContextual"/>
             </w:rPr>
           </w:pPr>
-          <w:hyperlink w:anchor="_Toc244118994" w:history="1">
+          <w:hyperlink w:anchor="_Toc244123247" w:history="1">
             <w:r>
               <w:rPr>
                 <w:rStyle w:val="Hyperlink"/>
@@ -1666,7 +1666,7 @@
                 <w:noProof/>
                 <w:webHidden/>
               </w:rPr>
-              <w:instrText xml:space="preserve"> PAGEREF _Toc244118994 \h </w:instrText>
+              <w:instrText xml:space="preserve"> PAGEREF _Toc244123247 \h </w:instrText>
             </w:r>
             <w:r>
               <w:rPr>
@@ -1713,7 +1713,7 @@
               <w14:ligatures w14:val="standardContextual"/>
             </w:rPr>
           </w:pPr>
-          <w:hyperlink w:anchor="_Toc244118995" w:history="1">
+          <w:hyperlink w:anchor="_Toc244123248" w:history="1">
             <w:r>
               <w:rPr>
                 <w:rStyle w:val="Hyperlink"/>
@@ -1740,7 +1740,7 @@
                 <w:noProof/>
                 <w:webHidden/>
               </w:rPr>
-              <w:instrText xml:space="preserve"> PAGEREF _Toc244118995 \h </w:instrText>
+              <w:instrText xml:space="preserve"> PAGEREF _Toc244123248 \h </w:instrText>
             </w:r>
             <w:r>
               <w:rPr>
@@ -1787,7 +1787,7 @@
               <w14:ligatures w14:val="standardContextual"/>
             </w:rPr>
           </w:pPr>
-          <w:hyperlink w:anchor="_Toc244118996" w:history="1">
+          <w:hyperlink w:anchor="_Toc244123249" w:history="1">
             <w:r>
               <w:rPr>
                 <w:rStyle w:val="Hyperlink"/>
@@ -1814,7 +1814,7 @@
                 <w:noProof/>
                 <w:webHidden/>
               </w:rPr>
-              <w:instrText xml:space="preserve"> PAGEREF _Toc244118996 \h </w:instrText>
+              <w:instrText xml:space="preserve"> PAGEREF _Toc244123249 \h </w:instrText>
             </w:r>
             <w:r>
               <w:rPr>
@@ -1861,7 +1861,7 @@
               <w14:ligatures w14:val="standardContextual"/>
             </w:rPr>
           </w:pPr>
-          <w:hyperlink w:anchor="_Toc244118997" w:history="1">
+          <w:hyperlink w:anchor="_Toc244123250" w:history="1">
             <w:r>
               <w:rPr>
                 <w:rStyle w:val="Hyperlink"/>
@@ -1888,7 +1888,7 @@
                 <w:noProof/>
                 <w:webHidden/>
               </w:rPr>
-              <w:instrText xml:space="preserve"> PAGEREF _Toc244118997 \h </w:instrText>
+              <w:instrText xml:space="preserve"> PAGEREF _Toc244123250 \h </w:instrText>
             </w:r>
             <w:r>
               <w:rPr>
@@ -1935,7 +1935,7 @@
               <w14:ligatures w14:val="standardContextual"/>
             </w:rPr>
           </w:pPr>
-          <w:hyperlink w:anchor="_Toc244118998" w:history="1">
+          <w:hyperlink w:anchor="_Toc244123251" w:history="1">
             <w:r>
               <w:rPr>
                 <w:rStyle w:val="Hyperlink"/>
@@ -1962,7 +1962,7 @@
                 <w:noProof/>
                 <w:webHidden/>
               </w:rPr>
-              <w:instrText xml:space="preserve"> PAGEREF _Toc244118998 \h </w:instrText>
+              <w:instrText xml:space="preserve"> PAGEREF _Toc244123251 \h </w:instrText>
             </w:r>
             <w:r>
               <w:rPr>
@@ -2009,7 +2009,7 @@
               <w14:ligatures w14:val="standardContextual"/>
             </w:rPr>
           </w:pPr>
-          <w:hyperlink w:anchor="_Toc244118999" w:history="1">
+          <w:hyperlink w:anchor="_Toc244123252" w:history="1">
             <w:r>
               <w:rPr>
                 <w:rStyle w:val="Hyperlink"/>
@@ -2036,7 +2036,7 @@
                 <w:noProof/>
                 <w:webHidden/>
               </w:rPr>
-              <w:instrText xml:space="preserve"> PAGEREF _Toc244118999 \h </w:instrText>
+              <w:instrText xml:space="preserve"> PAGEREF _Toc244123252 \h </w:instrText>
             </w:r>
             <w:r>
               <w:rPr>
@@ -2083,7 +2083,7 @@
               <w14:ligatures w14:val="standardContextual"/>
             </w:rPr>
           </w:pPr>
-          <w:hyperlink w:anchor="_Toc244119000" w:history="1">
+          <w:hyperlink w:anchor="_Toc244123253" w:history="1">
             <w:r>
               <w:rPr>
                 <w:rStyle w:val="Hyperlink"/>
@@ -2110,7 +2110,7 @@
                 <w:noProof/>
                 <w:webHidden/>
               </w:rPr>
-              <w:instrText xml:space="preserve"> PAGEREF _Toc244119000 \h </w:instrText>
+              <w:instrText xml:space="preserve"> PAGEREF _Toc244123253 \h </w:instrText>
             </w:r>
             <w:r>
               <w:rPr>
@@ -2157,7 +2157,7 @@
               <w14:ligatures w14:val="standardContextual"/>
             </w:rPr>
           </w:pPr>
-          <w:hyperlink w:anchor="_Toc244119001" w:history="1">
+          <w:hyperlink w:anchor="_Toc244123254" w:history="1">
             <w:r>
               <w:rPr>
                 <w:rStyle w:val="Hyperlink"/>
@@ -2184,7 +2184,7 @@
                 <w:noProof/>
                 <w:webHidden/>
               </w:rPr>
-              <w:instrText xml:space="preserve"> PAGEREF _Toc244119001 \h </w:instrText>
+              <w:instrText xml:space="preserve"> PAGEREF _Toc244123254 \h </w:instrText>
             </w:r>
             <w:r>
               <w:rPr>
@@ -2231,7 +2231,7 @@
               <w14:ligatures w14:val="standardContextual"/>
             </w:rPr>
           </w:pPr>
-          <w:hyperlink w:anchor="_Toc244119002" w:history="1">
+          <w:hyperlink w:anchor="_Toc244123255" w:history="1">
             <w:r>
               <w:rPr>
                 <w:rStyle w:val="Hyperlink"/>
@@ -2258,7 +2258,7 @@
                 <w:noProof/>
                 <w:webHidden/>
               </w:rPr>
-              <w:instrText xml:space="preserve"> PAGEREF _Toc244119002 \h </w:instrText>
+              <w:instrText xml:space="preserve"> PAGEREF _Toc244123255 \h </w:instrText>
             </w:r>
             <w:r>
               <w:rPr>
@@ -2305,7 +2305,7 @@
               <w14:ligatures w14:val="standardContextual"/>
             </w:rPr>
           </w:pPr>
-          <w:hyperlink w:anchor="_Toc244119003" w:history="1">
+          <w:hyperlink w:anchor="_Toc244123256" w:history="1">
             <w:r>
               <w:rPr>
                 <w:rStyle w:val="Hyperlink"/>
@@ -2332,7 +2332,7 @@
                 <w:noProof/>
                 <w:webHidden/>
               </w:rPr>
-              <w:instrText xml:space="preserve"> PAGEREF _Toc244119003 \h </w:instrText>
+              <w:instrText xml:space="preserve"> PAGEREF _Toc244123256 \h </w:instrText>
             </w:r>
             <w:r>
               <w:rPr>
@@ -2379,7 +2379,7 @@
               <w14:ligatures w14:val="standardContextual"/>
             </w:rPr>
           </w:pPr>
-          <w:hyperlink w:anchor="_Toc244119004" w:history="1">
+          <w:hyperlink w:anchor="_Toc244123257" w:history="1">
             <w:r>
               <w:rPr>
                 <w:rStyle w:val="Hyperlink"/>
@@ -2406,7 +2406,7 @@
                 <w:noProof/>
                 <w:webHidden/>
               </w:rPr>
-              <w:instrText xml:space="preserve"> PAGEREF _Toc244119004 \h </w:instrText>
+              <w:instrText xml:space="preserve"> PAGEREF _Toc244123257 \h </w:instrText>
             </w:r>
             <w:r>
               <w:rPr>
@@ -2453,7 +2453,7 @@
               <w14:ligatures w14:val="standardContextual"/>
             </w:rPr>
           </w:pPr>
-          <w:hyperlink w:anchor="_Toc244119005" w:history="1">
+          <w:hyperlink w:anchor="_Toc244123258" w:history="1">
             <w:r>
               <w:rPr>
                 <w:rStyle w:val="Hyperlink"/>
@@ -2480,7 +2480,7 @@
                 <w:noProof/>
                 <w:webHidden/>
               </w:rPr>
-              <w:instrText xml:space="preserve"> PAGEREF _Toc244119005 \h </w:instrText>
+              <w:instrText xml:space="preserve"> PAGEREF _Toc244123258 \h </w:instrText>
             </w:r>
             <w:r>
               <w:rPr>
@@ -2527,7 +2527,7 @@
               <w14:ligatures w14:val="standardContextual"/>
             </w:rPr>
           </w:pPr>
-          <w:hyperlink w:anchor="_Toc244119006" w:history="1">
+          <w:hyperlink w:anchor="_Toc244123259" w:history="1">
             <w:r>
               <w:rPr>
                 <w:rStyle w:val="Hyperlink"/>
@@ -2554,7 +2554,7 @@
                 <w:noProof/>
                 <w:webHidden/>
               </w:rPr>
-              <w:instrText xml:space="preserve"> PAGEREF _Toc244119006 \h </w:instrText>
+              <w:instrText xml:space="preserve"> PAGEREF _Toc244123259 \h </w:instrText>
             </w:r>
             <w:r>
               <w:rPr>
@@ -2601,7 +2601,7 @@
               <w14:ligatures w14:val="standardContextual"/>
             </w:rPr>
           </w:pPr>
-          <w:hyperlink w:anchor="_Toc244119007" w:history="1">
+          <w:hyperlink w:anchor="_Toc244123260" w:history="1">
             <w:r>
               <w:rPr>
                 <w:rStyle w:val="Hyperlink"/>
@@ -2628,7 +2628,7 @@
                 <w:noProof/>
                 <w:webHidden/>
               </w:rPr>
-              <w:instrText xml:space="preserve"> PAGEREF _Toc244119007 \h </w:instrText>
+              <w:instrText xml:space="preserve"> PAGEREF _Toc244123260 \h </w:instrText>
             </w:r>
             <w:r>
               <w:rPr>
@@ -2675,7 +2675,7 @@
               <w14:ligatures w14:val="standardContextual"/>
             </w:rPr>
           </w:pPr>
-          <w:hyperlink w:anchor="_Toc244119008" w:history="1">
+          <w:hyperlink w:anchor="_Toc244123261" w:history="1">
             <w:r>
               <w:rPr>
                 <w:rStyle w:val="Hyperlink"/>
@@ -2702,7 +2702,7 @@
                 <w:noProof/>
                 <w:webHidden/>
               </w:rPr>
-              <w:instrText xml:space="preserve"> PAGEREF _Toc244119008 \h </w:instrText>
+              <w:instrText xml:space="preserve"> PAGEREF _Toc244123261 \h </w:instrText>
             </w:r>
             <w:r>
               <w:rPr>
@@ -2749,7 +2749,7 @@
               <w14:ligatures w14:val="standardContextual"/>
             </w:rPr>
           </w:pPr>
-          <w:hyperlink w:anchor="_Toc244119009" w:history="1">
+          <w:hyperlink w:anchor="_Toc244123262" w:history="1">
             <w:r>
               <w:rPr>
                 <w:rStyle w:val="Hyperlink"/>
@@ -2776,7 +2776,7 @@
                 <w:noProof/>
                 <w:webHidden/>
               </w:rPr>
-              <w:instrText xml:space="preserve"> PAGEREF _Toc244119009 \h </w:instrText>
+              <w:instrText xml:space="preserve"> PAGEREF _Toc244123262 \h </w:instrText>
             </w:r>
             <w:r>
               <w:rPr>
@@ -2823,7 +2823,7 @@
               <w14:ligatures w14:val="standardContextual"/>
             </w:rPr>
           </w:pPr>
-          <w:hyperlink w:anchor="_Toc244119010" w:history="1">
+          <w:hyperlink w:anchor="_Toc244123263" w:history="1">
             <w:r>
               <w:rPr>
                 <w:rStyle w:val="Hyperlink"/>
@@ -2850,7 +2850,7 @@
                 <w:noProof/>
                 <w:webHidden/>
               </w:rPr>
-              <w:instrText xml:space="preserve"> PAGEREF _Toc244119010 \h </w:instrText>
+              <w:instrText xml:space="preserve"> PAGEREF _Toc244123263 \h </w:instrText>
             </w:r>
             <w:r>
               <w:rPr>
@@ -2897,7 +2897,7 @@
               <w14:ligatures w14:val="standardContextual"/>
             </w:rPr>
           </w:pPr>
-          <w:hyperlink w:anchor="_Toc244119011" w:history="1">
+          <w:hyperlink w:anchor="_Toc244123264" w:history="1">
             <w:r>
               <w:rPr>
                 <w:rStyle w:val="Hyperlink"/>
@@ -2924,7 +2924,7 @@
                 <w:noProof/>
                 <w:webHidden/>
               </w:rPr>
-              <w:instrText xml:space="preserve"> PAGEREF _Toc244119011 \h </w:instrText>
+              <w:instrText xml:space="preserve"> PAGEREF _Toc244123264 \h </w:instrText>
             </w:r>
             <w:r>
               <w:rPr>
@@ -2971,7 +2971,7 @@
               <w14:ligatures w14:val="standardContextual"/>
             </w:rPr>
           </w:pPr>
-          <w:hyperlink w:anchor="_Toc244119012" w:history="1">
+          <w:hyperlink w:anchor="_Toc244123265" w:history="1">
             <w:r>
               <w:rPr>
                 <w:rStyle w:val="Hyperlink"/>
@@ -2998,7 +2998,7 @@
                 <w:noProof/>
                 <w:webHidden/>
               </w:rPr>
-              <w:instrText xml:space="preserve"> PAGEREF _Toc244119012 \h </w:instrText>
+              <w:instrText xml:space="preserve"> PAGEREF _Toc244123265 \h </w:instrText>
             </w:r>
             <w:r>
               <w:rPr>
@@ -3045,7 +3045,7 @@
               <w14:ligatures w14:val="standardContextual"/>
             </w:rPr>
           </w:pPr>
-          <w:hyperlink w:anchor="_Toc244119013" w:history="1">
+          <w:hyperlink w:anchor="_Toc244123266" w:history="1">
             <w:r>
               <w:rPr>
                 <w:rStyle w:val="Hyperlink"/>
@@ -3072,7 +3072,7 @@
                 <w:noProof/>
                 <w:webHidden/>
               </w:rPr>
-              <w:instrText xml:space="preserve"> PAGEREF _Toc244119013 \h </w:instrText>
+              <w:instrText xml:space="preserve"> PAGEREF _Toc244123266 \h </w:instrText>
             </w:r>
             <w:r>
               <w:rPr>
@@ -3119,7 +3119,7 @@
               <w14:ligatures w14:val="standardContextual"/>
             </w:rPr>
           </w:pPr>
-          <w:hyperlink w:anchor="_Toc244119014" w:history="1">
+          <w:hyperlink w:anchor="_Toc244123267" w:history="1">
             <w:r>
               <w:rPr>
                 <w:rStyle w:val="Hyperlink"/>
@@ -3146,7 +3146,7 @@
                 <w:noProof/>
                 <w:webHidden/>
               </w:rPr>
-              <w:instrText xml:space="preserve"> PAGEREF _Toc244119014 \h </w:instrText>
+              <w:instrText xml:space="preserve"> PAGEREF _Toc244123267 \h </w:instrText>
             </w:r>
             <w:r>
               <w:rPr>
@@ -3193,7 +3193,7 @@
               <w14:ligatures w14:val="standardContextual"/>
             </w:rPr>
           </w:pPr>
-          <w:hyperlink w:anchor="_Toc244119015" w:history="1">
+          <w:hyperlink w:anchor="_Toc244123268" w:history="1">
             <w:r>
               <w:rPr>
                 <w:rStyle w:val="Hyperlink"/>
@@ -3220,7 +3220,7 @@
                 <w:noProof/>
                 <w:webHidden/>
               </w:rPr>
-              <w:instrText xml:space="preserve"> PAGEREF _Toc244119015 \h </w:instrText>
+              <w:instrText xml:space="preserve"> PAGEREF _Toc244123268 \h </w:instrText>
             </w:r>
             <w:r>
               <w:rPr>
@@ -3267,7 +3267,7 @@
               <w14:ligatures w14:val="standardContextual"/>
             </w:rPr>
           </w:pPr>
-          <w:hyperlink w:anchor="_Toc244119016" w:history="1">
+          <w:hyperlink w:anchor="_Toc244123269" w:history="1">
             <w:r>
               <w:rPr>
                 <w:rStyle w:val="Hyperlink"/>
@@ -3294,7 +3294,7 @@
                 <w:noProof/>
                 <w:webHidden/>
               </w:rPr>
-              <w:instrText xml:space="preserve"> PAGEREF _Toc244119016 \h </w:instrText>
+              <w:instrText xml:space="preserve"> PAGEREF _Toc244123269 \h </w:instrText>
             </w:r>
             <w:r>
               <w:rPr>
@@ -3341,7 +3341,7 @@
               <w14:ligatures w14:val="standardContextual"/>
             </w:rPr>
           </w:pPr>
-          <w:hyperlink w:anchor="_Toc244119017" w:history="1">
+          <w:hyperlink w:anchor="_Toc244123270" w:history="1">
             <w:r>
               <w:rPr>
                 <w:rStyle w:val="Hyperlink"/>
@@ -3368,7 +3368,7 @@
                 <w:noProof/>
                 <w:webHidden/>
               </w:rPr>
-              <w:instrText xml:space="preserve"> PAGEREF _Toc244119017 \h </w:instrText>
+              <w:instrText xml:space="preserve"> PAGEREF _Toc244123270 \h </w:instrText>
             </w:r>
             <w:r>
               <w:rPr>
@@ -3415,7 +3415,7 @@
               <w14:ligatures w14:val="standardContextual"/>
             </w:rPr>
           </w:pPr>
-          <w:hyperlink w:anchor="_Toc244119018" w:history="1">
+          <w:hyperlink w:anchor="_Toc244123271" w:history="1">
             <w:r>
               <w:rPr>
                 <w:rStyle w:val="Hyperlink"/>
@@ -3442,7 +3442,7 @@
                 <w:noProof/>
                 <w:webHidden/>
               </w:rPr>
-              <w:instrText xml:space="preserve"> PAGEREF _Toc244119018 \h </w:instrText>
+              <w:instrText xml:space="preserve"> PAGEREF _Toc244123271 \h </w:instrText>
             </w:r>
             <w:r>
               <w:rPr>
@@ -3489,7 +3489,7 @@
               <w14:ligatures w14:val="standardContextual"/>
             </w:rPr>
           </w:pPr>
-          <w:hyperlink w:anchor="_Toc244119019" w:history="1">
+          <w:hyperlink w:anchor="_Toc244123272" w:history="1">
             <w:r>
               <w:rPr>
                 <w:rStyle w:val="Hyperlink"/>
@@ -3516,7 +3516,7 @@
                 <w:noProof/>
                 <w:webHidden/>
               </w:rPr>
-              <w:instrText xml:space="preserve"> PAGEREF _Toc244119019 \h </w:instrText>
+              <w:instrText xml:space="preserve"> PAGEREF _Toc244123272 \h </w:instrText>
             </w:r>
             <w:r>
               <w:rPr>
@@ -3563,7 +3563,7 @@
               <w14:ligatures w14:val="standardContextual"/>
             </w:rPr>
           </w:pPr>
-          <w:hyperlink w:anchor="_Toc244119020" w:history="1">
+          <w:hyperlink w:anchor="_Toc244123273" w:history="1">
             <w:r>
               <w:rPr>
                 <w:rStyle w:val="Hyperlink"/>
@@ -3590,7 +3590,7 @@
                 <w:noProof/>
                 <w:webHidden/>
               </w:rPr>
-              <w:instrText xml:space="preserve"> PAGEREF _Toc244119020 \h </w:instrText>
+              <w:instrText xml:space="preserve"> PAGEREF _Toc244123273 \h </w:instrText>
             </w:r>
             <w:r>
               <w:rPr>
@@ -3637,7 +3637,7 @@
               <w14:ligatures w14:val="standardContextual"/>
             </w:rPr>
           </w:pPr>
-          <w:hyperlink w:anchor="_Toc244119021" w:history="1">
+          <w:hyperlink w:anchor="_Toc244123274" w:history="1">
             <w:r>
               <w:rPr>
                 <w:rStyle w:val="Hyperlink"/>
@@ -3664,7 +3664,7 @@
                 <w:noProof/>
                 <w:webHidden/>
               </w:rPr>
-              <w:instrText xml:space="preserve"> PAGEREF _Toc244119021 \h </w:instrText>
+              <w:instrText xml:space="preserve"> PAGEREF _Toc244123274 \h </w:instrText>
             </w:r>
             <w:r>
               <w:rPr>
@@ -3711,7 +3711,7 @@
               <w14:ligatures w14:val="standardContextual"/>
             </w:rPr>
           </w:pPr>
-          <w:hyperlink w:anchor="_Toc244119022" w:history="1">
+          <w:hyperlink w:anchor="_Toc244123275" w:history="1">
             <w:r>
               <w:rPr>
                 <w:rStyle w:val="Hyperlink"/>
@@ -3738,7 +3738,7 @@
                 <w:noProof/>
                 <w:webHidden/>
               </w:rPr>
-              <w:instrText xml:space="preserve"> PAGEREF _Toc244119022 \h </w:instrText>
+              <w:instrText xml:space="preserve"> PAGEREF _Toc244123275 \h </w:instrText>
             </w:r>
             <w:r>
               <w:rPr>
@@ -3785,7 +3785,7 @@
               <w14:ligatures w14:val="standardContextual"/>
             </w:rPr>
           </w:pPr>
-          <w:hyperlink w:anchor="_Toc244119023" w:history="1">
+          <w:hyperlink w:anchor="_Toc244123276" w:history="1">
             <w:r>
               <w:rPr>
                 <w:rStyle w:val="Hyperlink"/>
@@ -3812,7 +3812,7 @@
                 <w:noProof/>
                 <w:webHidden/>
               </w:rPr>
-              <w:instrText xml:space="preserve"> PAGEREF _Toc244119023 \h </w:instrText>
+              <w:instrText xml:space="preserve"> PAGEREF _Toc244123276 \h </w:instrText>
             </w:r>
             <w:r>
               <w:rPr>
@@ -3859,7 +3859,7 @@
               <w14:ligatures w14:val="standardContextual"/>
             </w:rPr>
           </w:pPr>
-          <w:hyperlink w:anchor="_Toc244119024" w:history="1">
+          <w:hyperlink w:anchor="_Toc244123277" w:history="1">
             <w:r>
               <w:rPr>
                 <w:rStyle w:val="Hyperlink"/>
@@ -3886,7 +3886,7 @@
                 <w:noProof/>
                 <w:webHidden/>
               </w:rPr>
-              <w:instrText xml:space="preserve"> PAGEREF _Toc244119024 \h </w:instrText>
+              <w:instrText xml:space="preserve"> PAGEREF _Toc244123277 \h </w:instrText>
             </w:r>
             <w:r>
               <w:rPr>
@@ -3933,7 +3933,7 @@
               <w14:ligatures w14:val="standardContextual"/>
             </w:rPr>
           </w:pPr>
-          <w:hyperlink w:anchor="_Toc244119025" w:history="1">
+          <w:hyperlink w:anchor="_Toc244123278" w:history="1">
             <w:r>
               <w:rPr>
                 <w:rStyle w:val="Hyperlink"/>
@@ -3960,7 +3960,7 @@
                 <w:noProof/>
                 <w:webHidden/>
               </w:rPr>
-              <w:instrText xml:space="preserve"> PAGEREF _Toc244119025 \h </w:instrText>
+              <w:instrText xml:space="preserve"> PAGEREF _Toc244123278 \h </w:instrText>
             </w:r>
             <w:r>
               <w:rPr>
@@ -4007,7 +4007,7 @@
               <w14:ligatures w14:val="standardContextual"/>
             </w:rPr>
           </w:pPr>
-          <w:hyperlink w:anchor="_Toc244119026" w:history="1">
+          <w:hyperlink w:anchor="_Toc244123279" w:history="1">
             <w:r>
               <w:rPr>
                 <w:rStyle w:val="Hyperlink"/>
@@ -4034,7 +4034,7 @@
                 <w:noProof/>
                 <w:webHidden/>
               </w:rPr>
-              <w:instrText xml:space="preserve"> PAGEREF _Toc244119026 \h </w:instrText>
+              <w:instrText xml:space="preserve"> PAGEREF _Toc244123279 \h </w:instrText>
             </w:r>
             <w:r>
               <w:rPr>
@@ -4081,7 +4081,7 @@
               <w14:ligatures w14:val="standardContextual"/>
             </w:rPr>
           </w:pPr>
-          <w:hyperlink w:anchor="_Toc244119027" w:history="1">
+          <w:hyperlink w:anchor="_Toc244123280" w:history="1">
             <w:r>
               <w:rPr>
                 <w:rStyle w:val="Hyperlink"/>
@@ -4108,7 +4108,7 @@
                 <w:noProof/>
                 <w:webHidden/>
               </w:rPr>
-              <w:instrText xml:space="preserve"> PAGEREF _Toc244119027 \h </w:instrText>
+              <w:instrText xml:space="preserve"> PAGEREF _Toc244123280 \h </w:instrText>
             </w:r>
             <w:r>
               <w:rPr>
@@ -4155,7 +4155,7 @@
               <w14:ligatures w14:val="standardContextual"/>
             </w:rPr>
           </w:pPr>
-          <w:hyperlink w:anchor="_Toc244119028" w:history="1">
+          <w:hyperlink w:anchor="_Toc244123281" w:history="1">
             <w:r>
               <w:rPr>
                 <w:rStyle w:val="Hyperlink"/>
@@ -4182,7 +4182,7 @@
                 <w:noProof/>
                 <w:webHidden/>
               </w:rPr>
-              <w:instrText xml:space="preserve"> PAGEREF _Toc244119028 \h </w:instrText>
+              <w:instrText xml:space="preserve"> PAGEREF _Toc244123281 \h </w:instrText>
             </w:r>
             <w:r>
               <w:rPr>
@@ -4229,7 +4229,7 @@
               <w14:ligatures w14:val="standardContextual"/>
             </w:rPr>
           </w:pPr>
-          <w:hyperlink w:anchor="_Toc244119029" w:history="1">
+          <w:hyperlink w:anchor="_Toc244123282" w:history="1">
             <w:r>
               <w:rPr>
                 <w:rStyle w:val="Hyperlink"/>
@@ -4256,7 +4256,7 @@
                 <w:noProof/>
                 <w:webHidden/>
               </w:rPr>
-              <w:instrText xml:space="preserve"> PAGEREF _Toc244119029 \h </w:instrText>
+              <w:instrText xml:space="preserve"> PAGEREF _Toc244123282 \h </w:instrText>
             </w:r>
             <w:r>
               <w:rPr>
@@ -4303,7 +4303,7 @@
               <w14:ligatures w14:val="standardContextual"/>
             </w:rPr>
           </w:pPr>
-          <w:hyperlink w:anchor="_Toc244119030" w:history="1">
+          <w:hyperlink w:anchor="_Toc244123283" w:history="1">
             <w:r>
               <w:rPr>
                 <w:rStyle w:val="Hyperlink"/>
@@ -4330,7 +4330,7 @@
                 <w:noProof/>
                 <w:webHidden/>
               </w:rPr>
-              <w:instrText xml:space="preserve"> PAGEREF _Toc244119030 \h </w:instrText>
+              <w:instrText xml:space="preserve"> PAGEREF _Toc244123283 \h </w:instrText>
             </w:r>
             <w:r>
               <w:rPr>
@@ -4377,7 +4377,7 @@
               <w14:ligatures w14:val="standardContextual"/>
             </w:rPr>
           </w:pPr>
-          <w:hyperlink w:anchor="_Toc244119031" w:history="1">
+          <w:hyperlink w:anchor="_Toc244123284" w:history="1">
             <w:r>
               <w:rPr>
                 <w:rStyle w:val="Hyperlink"/>
@@ -4404,7 +4404,7 @@
                 <w:noProof/>
                 <w:webHidden/>
               </w:rPr>
-              <w:instrText xml:space="preserve"> PAGEREF _Toc244119031 \h </w:instrText>
+              <w:instrText xml:space="preserve"> PAGEREF _Toc244123284 \h </w:instrText>
             </w:r>
             <w:r>
               <w:rPr>
@@ -4451,7 +4451,7 @@
               <w14:ligatures w14:val="standardContextual"/>
             </w:rPr>
           </w:pPr>
-          <w:hyperlink w:anchor="_Toc244119032" w:history="1">
+          <w:hyperlink w:anchor="_Toc244123285" w:history="1">
             <w:r>
               <w:rPr>
                 <w:rStyle w:val="Hyperlink"/>
@@ -4478,7 +4478,7 @@
                 <w:noProof/>
                 <w:webHidden/>
               </w:rPr>
-              <w:instrText xml:space="preserve"> PAGEREF _Toc244119032 \h </w:instrText>
+              <w:instrText xml:space="preserve"> PAGEREF _Toc244123285 \h </w:instrText>
             </w:r>
             <w:r>
               <w:rPr>
@@ -4525,7 +4525,7 @@
               <w14:ligatures w14:val="standardContextual"/>
             </w:rPr>
           </w:pPr>
-          <w:hyperlink w:anchor="_Toc244119033" w:history="1">
+          <w:hyperlink w:anchor="_Toc244123286" w:history="1">
             <w:r>
               <w:rPr>
                 <w:rStyle w:val="Hyperlink"/>
@@ -4552,7 +4552,7 @@
                 <w:noProof/>
                 <w:webHidden/>
               </w:rPr>
-              <w:instrText xml:space="preserve"> PAGEREF _Toc244119033 \h </w:instrText>
+              <w:instrText xml:space="preserve"> PAGEREF _Toc244123286 \h </w:instrText>
             </w:r>
             <w:r>
               <w:rPr>
@@ -4599,7 +4599,7 @@
               <w14:ligatures w14:val="standardContextual"/>
             </w:rPr>
           </w:pPr>
-          <w:hyperlink w:anchor="_Toc244119034" w:history="1">
+          <w:hyperlink w:anchor="_Toc244123287" w:history="1">
             <w:r>
               <w:rPr>
                 <w:rStyle w:val="Hyperlink"/>
@@ -4626,7 +4626,7 @@
                 <w:noProof/>
                 <w:webHidden/>
               </w:rPr>
-              <w:instrText xml:space="preserve"> PAGEREF _Toc244119034 \h </w:instrText>
+              <w:instrText xml:space="preserve"> PAGEREF _Toc244123287 \h </w:instrText>
             </w:r>
             <w:r>
               <w:rPr>
@@ -4670,7 +4670,7 @@
         <w:pageBreakBefore/>
       </w:pPr>
       <w:bookmarkStart w:id="0" w:name="mở-đầu"/>
-      <w:bookmarkStart w:id="1" w:name="_Toc244118974"/>
+      <w:bookmarkStart w:id="1" w:name="_Toc244123227"/>
       <w:r>
         <w:lastRenderedPageBreak/>
         <w:t>Mở đầu</w:t>
@@ -4834,7 +4834,7 @@
         <w:pageBreakBefore/>
       </w:pPr>
       <w:bookmarkStart w:id="2" w:name="phần-a-giải-đấu"/>
-      <w:bookmarkStart w:id="3" w:name="_Toc244118975"/>
+      <w:bookmarkStart w:id="3" w:name="_Toc244123228"/>
       <w:bookmarkEnd w:id="0"/>
       <w:r>
         <w:lastRenderedPageBreak/>
@@ -4847,7 +4847,7 @@
         <w:pStyle w:val="Heading2"/>
       </w:pPr>
       <w:bookmarkStart w:id="4" w:name="a1-trò-chơi-ottv2"/>
-      <w:bookmarkStart w:id="5" w:name="_Toc244118976"/>
+      <w:bookmarkStart w:id="5" w:name="_Toc244123229"/>
       <w:r>
         <w:t>1. Trò chơi OTTv2</w:t>
       </w:r>
@@ -5128,7 +5128,7 @@
         <w:pStyle w:val="Heading2"/>
       </w:pPr>
       <w:bookmarkStart w:id="6" w:name="a2-tài-khoản-và-đội"/>
-      <w:bookmarkStart w:id="7" w:name="_Toc244118977"/>
+      <w:bookmarkStart w:id="7" w:name="_Toc244123230"/>
       <w:bookmarkEnd w:id="4"/>
       <w:r>
         <w:t>2. Tài khoản và đội</w:t>
@@ -5447,7 +5447,7 @@
         <w:pStyle w:val="Heading2"/>
       </w:pPr>
       <w:bookmarkStart w:id="8" w:name="a3-nộp-bot-qua-github"/>
-      <w:bookmarkStart w:id="9" w:name="_Toc244118978"/>
+      <w:bookmarkStart w:id="9" w:name="_Toc244123231"/>
       <w:bookmarkEnd w:id="6"/>
       <w:r>
         <w:t>3. Nộp bot qua GitHub</w:t>
@@ -5871,7 +5871,7 @@
         <w:pStyle w:val="Heading2"/>
       </w:pPr>
       <w:bookmarkStart w:id="10" w:name="a4-thể-lệ-và-lịch-đấu"/>
-      <w:bookmarkStart w:id="11" w:name="_Toc244118979"/>
+      <w:bookmarkStart w:id="11" w:name="_Toc244123232"/>
       <w:bookmarkEnd w:id="8"/>
       <w:r>
         <w:t>4. Thể lệ và lịch đấu</w:t>
@@ -5883,7 +5883,7 @@
         <w:pStyle w:val="Heading3"/>
       </w:pPr>
       <w:bookmarkStart w:id="12" w:name="ladder-trước-hạn"/>
-      <w:bookmarkStart w:id="13" w:name="_Toc244118980"/>
+      <w:bookmarkStart w:id="13" w:name="_Toc244123233"/>
       <w:r>
         <w:t>4.1. Ladder trước hạn</w:t>
       </w:r>
@@ -5943,7 +5943,7 @@
         <w:pStyle w:val="Heading3"/>
       </w:pPr>
       <w:bookmarkStart w:id="14" w:name="chốt-bài-tại-hạn"/>
-      <w:bookmarkStart w:id="15" w:name="_Toc244118981"/>
+      <w:bookmarkStart w:id="15" w:name="_Toc244123234"/>
       <w:bookmarkEnd w:id="12"/>
       <w:r>
         <w:lastRenderedPageBreak/>
@@ -5969,7 +5969,7 @@
         <w:pStyle w:val="Heading3"/>
       </w:pPr>
       <w:bookmarkStart w:id="16" w:name="xếp-hạng-chính-thức"/>
-      <w:bookmarkStart w:id="17" w:name="_Toc244118982"/>
+      <w:bookmarkStart w:id="17" w:name="_Toc244123235"/>
       <w:bookmarkEnd w:id="14"/>
       <w:r>
         <w:t>4.3. Xếp hạng chính thức</w:t>
@@ -6320,7 +6320,7 @@
         <w:pStyle w:val="Heading2"/>
       </w:pPr>
       <w:bookmarkStart w:id="18" w:name="a5-xem-kết-quả"/>
-      <w:bookmarkStart w:id="19" w:name="_Toc244118983"/>
+      <w:bookmarkStart w:id="19" w:name="_Toc244123236"/>
       <w:bookmarkEnd w:id="10"/>
       <w:bookmarkEnd w:id="16"/>
       <w:r>
@@ -6488,7 +6488,7 @@
         <w:pStyle w:val="Heading2"/>
       </w:pPr>
       <w:bookmarkStart w:id="20" w:name="a6-ban-tổ-chức-và-điều-hành"/>
-      <w:bookmarkStart w:id="21" w:name="_Toc244118984"/>
+      <w:bookmarkStart w:id="21" w:name="_Toc244123237"/>
       <w:bookmarkEnd w:id="18"/>
       <w:r>
         <w:t>6. Ban tổ chức và điều hành</w:t>
@@ -6497,7 +6497,7 @@
     </w:p>
     <w:p>
       <w:r>
-        <w:t>Tài khoản ban tổ chức được cấp riêng. Người có quyền này quản lý đội, hồ sơ, giải và máy chấm; tài khoản sinh viên không tự nâng quyền bằng dữ liệu gửi từ trình duyệt. Các thao tác quan trọng có nhật ký. Khi hai tab cùng sửa một bản, revision giúp máy chủ từ chối ghi đè dữ liệu vừa thay đổi ở nơi khác.</w:t>
+        <w:t>Tài khoản ban tổ chức được cấp riêng. Người có quyền này quản lý đội, hồ sơ, giải và máy chấm; tài khoản sinh viên không tự nâng quyền bằng dữ liệu gửi từ trình duyệt. Các thao tác quan trọng của BTC, đội và hệ thống được ghi vào Nhật ký hệ thống (tài khoản, vai trò, IP, thời gian); chỉ BTC xem được, tài khoản quản lý thấy đủ IP, BTC khác thấy IP rút gọn. Khi hai tab cùng sửa một bản, revision giúp máy chủ từ chối ghi đè dữ liệu vừa thay đổi ở nơi khác.</w:t>
       </w:r>
     </w:p>
     <w:p>
@@ -6505,7 +6505,11 @@
         <w:pStyle w:val="BodyText"/>
       </w:pPr>
       <w:r>
-        <w:t>Khi tạo giải, ban tổ chức chọn thể thức, số đội tối đa, nền tảng chấm và hạn nộp. Elo online cần hạn nộp và các tham số ladder, nhóm đầu, số suất chung kết. Vòng tròn nội bộ hỗ trợ tối đa 32 đội; Swiss và trường số đội của Elo cho phép tối đa 4.096. Các giới hạn biểu mẫu không phải lời khẳng định máy chủ đã đo được từng quy mô đó.</w:t>
+        <w:t xml:space="preserve">Khi tạo giải, ban tổ chức chọn thể thức, số đội tối đa, nền tảng chấm và hạn nộp. Elo online cần hạn nộp và các tham số ladder, nhóm đầu, số suất chung kết. Vòng tròn nội bộ hỗ trợ tối đa 32 đội; Swiss và </w:t>
+      </w:r>
+      <w:r>
+        <w:lastRenderedPageBreak/>
+        <w:t>trường số đội của Elo cho phép tối đa 4.096. Các giới hạn biểu mẫu không phải lời khẳng định máy chủ đã đo được từng quy mô đó.</w:t>
       </w:r>
     </w:p>
     <w:p>
@@ -6517,7 +6521,6 @@
         <w:rPr>
           <w:noProof/>
         </w:rPr>
-        <w:lastRenderedPageBreak/>
         <w:drawing>
           <wp:inline distT="0" distB="0" distL="0" distR="0" wp14:anchorId="5050B303" wp14:editId="42F06743">
             <wp:extent cx="5759999" cy="3254999"/>
@@ -6607,7 +6610,7 @@
       <w:pPr>
         <w:pStyle w:val="Heading2"/>
       </w:pPr>
-      <w:bookmarkStart w:id="22" w:name="_Toc244118985"/>
+      <w:bookmarkStart w:id="22" w:name="_Toc244123238"/>
       <w:r>
         <w:t>7. Chung kết tại hội trường</w:t>
       </w:r>
@@ -6625,11 +6628,8 @@
     </w:p>
     <w:p>
       <w:r>
-        <w:t xml:space="preserve">Khi BTC bấm Bắt đầu vòng bảng, hệ thống ghim bản Đạt mới nhất của mỗi đội tại đúng lúc đó và dùng một bản bot ấy suốt ngày; bản nạp mới hơn về sau không thay bot ở các vòng loại trực tiếp. Hệ thống tự </w:t>
-      </w:r>
-      <w:r>
         <w:lastRenderedPageBreak/>
-        <w:t>chia bảng theo con rắn: A gồm 1–8–9–16, B gồm 2–7–10–15, C gồm 3–6–11–14, D gồm 4–5–12–13. Mỗi bảng đá vòng tròn hai lượt, 12 ván; thắng một điểm, hòa nửa điểm, thua không điểm. Xếp theo điểm → điểm đối đầu trong nhóm bằng điểm → tổng số ván thắng → hạng online. Hạng online duy nhất giúp chọn rõ nhất, nhì mỗi bảng vào tứ kết.</w:t>
+        <w:t>Khi BTC bấm Bắt đầu vòng bảng, hệ thống ghim bản Đạt mới nhất của mỗi đội tại đúng lúc đó và dùng một bản bot ấy suốt ngày; bản nạp mới hơn về sau không thay bot ở các vòng loại trực tiếp. Hệ thống tự chia bảng theo con rắn: A gồm 1–8–9–16, B gồm 2–7–10–15, C gồm 3–6–11–14, D gồm 4–5–12–13. Mỗi bảng đá vòng tròn hai lượt, 12 ván; thắng một điểm, hòa nửa điểm, thua không điểm. Xếp theo điểm → điểm đối đầu trong nhóm bằng điểm → tổng số ván thắng → hạng online. Hạng online duy nhất giúp chọn rõ nhất, nhì mỗi bảng vào tứ kết.</w:t>
       </w:r>
     </w:p>
     <w:p>
@@ -7042,7 +7042,7 @@
         <w:pageBreakBefore/>
       </w:pPr>
       <w:bookmarkStart w:id="23" w:name="phần-b-thiết-kế-kỹ-thuật"/>
-      <w:bookmarkStart w:id="24" w:name="_Toc244118986"/>
+      <w:bookmarkStart w:id="24" w:name="_Toc244123239"/>
       <w:bookmarkEnd w:id="2"/>
       <w:bookmarkEnd w:id="20"/>
       <w:r>
@@ -7056,7 +7056,7 @@
         <w:pStyle w:val="Heading2"/>
       </w:pPr>
       <w:bookmarkStart w:id="25" w:name="b1-kiến-trúc-tổng-thể"/>
-      <w:bookmarkStart w:id="26" w:name="_Toc244118987"/>
+      <w:bookmarkStart w:id="26" w:name="_Toc244123240"/>
       <w:r>
         <w:t>1. Kiến trúc tổng thể</w:t>
       </w:r>
@@ -7158,7 +7158,7 @@
         <w:pStyle w:val="Heading2"/>
       </w:pPr>
       <w:bookmarkStart w:id="27" w:name="b2-dịch-vụ-được-dùng"/>
-      <w:bookmarkStart w:id="28" w:name="_Toc244118988"/>
+      <w:bookmarkStart w:id="28" w:name="_Toc244123241"/>
       <w:bookmarkEnd w:id="25"/>
       <w:r>
         <w:lastRenderedPageBreak/>
@@ -7490,7 +7490,7 @@
         <w:pStyle w:val="Heading2"/>
       </w:pPr>
       <w:bookmarkStart w:id="29" w:name="b3-hub-và-cách-phục-vụ-dữ-liệu"/>
-      <w:bookmarkStart w:id="30" w:name="_Toc244118989"/>
+      <w:bookmarkStart w:id="30" w:name="_Toc244123242"/>
       <w:bookmarkEnd w:id="27"/>
       <w:r>
         <w:t>3. Hub và cách phục vụ dữ liệu</w:t>
@@ -7569,7 +7569,7 @@
         <w:pStyle w:val="Heading2"/>
       </w:pPr>
       <w:bookmarkStart w:id="31" w:name="b4-máy-chấm-và-chia-việc"/>
-      <w:bookmarkStart w:id="32" w:name="_Toc244118990"/>
+      <w:bookmarkStart w:id="32" w:name="_Toc244123243"/>
       <w:bookmarkEnd w:id="29"/>
       <w:r>
         <w:t>4. Máy chấm và chia việc</w:t>
@@ -7692,7 +7692,7 @@
         <w:pStyle w:val="Heading2"/>
       </w:pPr>
       <w:bookmarkStart w:id="33" w:name="b5-sandbox-thay-docker"/>
-      <w:bookmarkStart w:id="34" w:name="_Toc244118991"/>
+      <w:bookmarkStart w:id="34" w:name="_Toc244123244"/>
       <w:bookmarkEnd w:id="31"/>
       <w:r>
         <w:t>5. Sandbox chạy bot</w:t>
@@ -7734,7 +7734,7 @@
         <w:pStyle w:val="Heading2"/>
       </w:pPr>
       <w:bookmarkStart w:id="35" w:name="b6-quỹ-giờ-và-khả-năng-đối-chiếu"/>
-      <w:bookmarkStart w:id="36" w:name="_Toc244118992"/>
+      <w:bookmarkStart w:id="36" w:name="_Toc244123245"/>
       <w:bookmarkEnd w:id="33"/>
       <w:r>
         <w:t>6. Quỹ giờ và khả năng đối chiếu</w:t>
@@ -7783,7 +7783,7 @@
         <w:pStyle w:val="Heading2"/>
       </w:pPr>
       <w:bookmarkStart w:id="37" w:name="b7-chịu-lỗi-và-sao-lưu"/>
-      <w:bookmarkStart w:id="38" w:name="_Toc244118993"/>
+      <w:bookmarkStart w:id="38" w:name="_Toc244123246"/>
       <w:bookmarkEnd w:id="35"/>
       <w:r>
         <w:t>7. Chịu lỗi và sao lưu</w:t>
@@ -8168,7 +8168,7 @@
         <w:pStyle w:val="Heading2"/>
       </w:pPr>
       <w:bookmarkStart w:id="39" w:name="b8-bảo-mật"/>
-      <w:bookmarkStart w:id="40" w:name="_Toc244118994"/>
+      <w:bookmarkStart w:id="40" w:name="_Toc244123247"/>
       <w:bookmarkEnd w:id="37"/>
       <w:r>
         <w:t>8. Bảo mật</w:t>
@@ -8226,7 +8226,7 @@
         <w:pStyle w:val="Heading2"/>
       </w:pPr>
       <w:bookmarkStart w:id="41" w:name="b9-sức-tải-và-thời-gian-đã-đo"/>
-      <w:bookmarkStart w:id="42" w:name="_Toc244118995"/>
+      <w:bookmarkStart w:id="42" w:name="_Toc244123248"/>
       <w:bookmarkEnd w:id="39"/>
       <w:r>
         <w:t>9. Sức tải và thời gian đã đo</w:t>
@@ -9410,7 +9410,7 @@
       <w:pPr>
         <w:pStyle w:val="Heading2"/>
       </w:pPr>
-      <w:bookmarkStart w:id="43" w:name="_Toc244118996"/>
+      <w:bookmarkStart w:id="43" w:name="_Toc244123249"/>
       <w:bookmarkEnd w:id="41"/>
       <w:r>
         <w:t>10. Cài đặt và vận hành</w:t>
@@ -9524,7 +9524,7 @@
       <w:pPr>
         <w:pStyle w:val="Heading2"/>
       </w:pPr>
-      <w:bookmarkStart w:id="44" w:name="_Toc244118997"/>
+      <w:bookmarkStart w:id="44" w:name="_Toc244123250"/>
       <w:r>
         <w:t>11. Mạng LAN ngày chung kết</w:t>
       </w:r>
@@ -9651,7 +9651,7 @@
         <w:pStyle w:val="Heading2"/>
         <w:pageBreakBefore/>
       </w:pPr>
-      <w:bookmarkStart w:id="45" w:name="_Toc244118998"/>
+      <w:bookmarkStart w:id="45" w:name="_Toc244123251"/>
       <w:r>
         <w:lastRenderedPageBreak/>
         <w:t>12. Giới hạn và hướng tiếp</w:t>
@@ -9745,7 +9745,7 @@
         <w:pageBreakBefore/>
       </w:pPr>
       <w:bookmarkStart w:id="46" w:name="phần-c-hướng-dẫn-demo-từng-bước"/>
-      <w:bookmarkStart w:id="47" w:name="_Toc244118999"/>
+      <w:bookmarkStart w:id="47" w:name="_Toc244123252"/>
       <w:bookmarkEnd w:id="23"/>
       <w:r>
         <w:lastRenderedPageBreak/>
@@ -9763,7 +9763,7 @@
         <w:pStyle w:val="Heading2"/>
       </w:pPr>
       <w:bookmarkStart w:id="48" w:name="c1-khách-xem-giải"/>
-      <w:bookmarkStart w:id="49" w:name="_Toc244119000"/>
+      <w:bookmarkStart w:id="49" w:name="_Toc244123253"/>
       <w:r>
         <w:t>1. Khách xem giải</w:t>
       </w:r>
@@ -9774,7 +9774,7 @@
         <w:pStyle w:val="Heading3"/>
       </w:pPr>
       <w:bookmarkStart w:id="50" w:name="bước-1-mở-giải-công-khai"/>
-      <w:bookmarkStart w:id="51" w:name="_Toc244119001"/>
+      <w:bookmarkStart w:id="51" w:name="_Toc244123254"/>
       <w:r>
         <w:t>Bước 1. Mở giải công khai</w:t>
       </w:r>
@@ -9862,7 +9862,7 @@
         <w:pStyle w:val="Heading3"/>
       </w:pPr>
       <w:bookmarkStart w:id="52" w:name="bước-2-xem-bảng-điểm-và-ma-trận"/>
-      <w:bookmarkStart w:id="53" w:name="_Toc244119002"/>
+      <w:bookmarkStart w:id="53" w:name="_Toc244123255"/>
       <w:bookmarkEnd w:id="50"/>
       <w:r>
         <w:t>Bước 2. Xem bảng điểm và ma trận</w:t>
@@ -9973,7 +9973,7 @@
         <w:pageBreakBefore/>
       </w:pPr>
       <w:bookmarkStart w:id="54" w:name="bước-3-xem-lại-từng-nước"/>
-      <w:bookmarkStart w:id="55" w:name="_Toc244119003"/>
+      <w:bookmarkStart w:id="55" w:name="_Toc244123256"/>
       <w:bookmarkEnd w:id="52"/>
       <w:r>
         <w:lastRenderedPageBreak/>
@@ -10054,7 +10054,7 @@
         <w:pageBreakBefore/>
       </w:pPr>
       <w:bookmarkStart w:id="56" w:name="c2-thí-sinh-đăng-ký-và-nộp-bot"/>
-      <w:bookmarkStart w:id="57" w:name="_Toc244119004"/>
+      <w:bookmarkStart w:id="57" w:name="_Toc244123257"/>
       <w:bookmarkEnd w:id="48"/>
       <w:bookmarkEnd w:id="54"/>
       <w:r>
@@ -10067,7 +10067,7 @@
       <w:pPr>
         <w:pStyle w:val="Heading3"/>
       </w:pPr>
-      <w:bookmarkStart w:id="58" w:name="_Toc244119005"/>
+      <w:bookmarkStart w:id="58" w:name="_Toc244123258"/>
       <w:r>
         <w:t>Bước 4. Đăng ký bằng email trường</w:t>
       </w:r>
@@ -10168,7 +10168,7 @@
         <w:pStyle w:val="Heading3"/>
         <w:pageBreakBefore/>
       </w:pPr>
-      <w:bookmarkStart w:id="59" w:name="_Toc244119006"/>
+      <w:bookmarkStart w:id="59" w:name="_Toc244123259"/>
       <w:r>
         <w:lastRenderedPageBreak/>
         <w:t>Bước 5. Mở email lấy mã</w:t>
@@ -10251,7 +10251,7 @@
         <w:pStyle w:val="Heading3"/>
         <w:pageBreakBefore/>
       </w:pPr>
-      <w:bookmarkStart w:id="60" w:name="_Toc244119007"/>
+      <w:bookmarkStart w:id="60" w:name="_Toc244123260"/>
       <w:r>
         <w:lastRenderedPageBreak/>
         <w:t>Bước 6. Xác minh email</w:t>
@@ -10343,7 +10343,7 @@
         <w:pStyle w:val="Heading3"/>
         <w:pageBreakBefore/>
       </w:pPr>
-      <w:bookmarkStart w:id="61" w:name="_Toc244119008"/>
+      <w:bookmarkStart w:id="61" w:name="_Toc244123261"/>
       <w:r>
         <w:lastRenderedPageBreak/>
         <w:t>Bước 7. Đặt mật khẩu và đăng nhập</w:t>
@@ -10434,7 +10434,7 @@
       <w:pPr>
         <w:pStyle w:val="Heading3"/>
       </w:pPr>
-      <w:bookmarkStart w:id="62" w:name="_Toc244119009"/>
+      <w:bookmarkStart w:id="62" w:name="_Toc244123262"/>
       <w:r>
         <w:t>Bước 8. Tạo đội</w:t>
       </w:r>
@@ -10532,7 +10532,7 @@
         <w:pStyle w:val="Heading3"/>
         <w:pageBreakBefore/>
       </w:pPr>
-      <w:bookmarkStart w:id="63" w:name="_Toc244119010"/>
+      <w:bookmarkStart w:id="63" w:name="_Toc244123263"/>
       <w:r>
         <w:lastRenderedPageBreak/>
         <w:t>Bước 9. Mời các thành viên</w:t>
@@ -10620,7 +10620,7 @@
       <w:pPr>
         <w:pStyle w:val="Heading3"/>
       </w:pPr>
-      <w:bookmarkStart w:id="64" w:name="_Toc244119011"/>
+      <w:bookmarkStart w:id="64" w:name="_Toc244123264"/>
       <w:r>
         <w:t>Bước 10. Vào đội bằng mã mời</w:t>
       </w:r>
@@ -10708,7 +10708,7 @@
         <w:pStyle w:val="Heading3"/>
         <w:pageBreakBefore/>
       </w:pPr>
-      <w:bookmarkStart w:id="65" w:name="_Toc244119012"/>
+      <w:bookmarkStart w:id="65" w:name="_Toc244123265"/>
       <w:r>
         <w:lastRenderedPageBreak/>
         <w:t>Bước 11. Tạo repo từ mẫu</w:t>
@@ -10796,7 +10796,7 @@
       <w:pPr>
         <w:pStyle w:val="Heading3"/>
       </w:pPr>
-      <w:bookmarkStart w:id="66" w:name="_Toc244119013"/>
+      <w:bookmarkStart w:id="66" w:name="_Toc244123266"/>
       <w:r>
         <w:t>Bước 12. Cho App truy cập đúng repo</w:t>
       </w:r>
@@ -10894,7 +10894,7 @@
         <w:pStyle w:val="Heading3"/>
         <w:pageBreakBefore/>
       </w:pPr>
-      <w:bookmarkStart w:id="67" w:name="_Toc244119014"/>
+      <w:bookmarkStart w:id="67" w:name="_Toc244123267"/>
       <w:r>
         <w:lastRenderedPageBreak/>
         <w:t>Bước 13. Gắn link repo với đội</w:t>
@@ -10992,7 +10992,7 @@
       <w:pPr>
         <w:pStyle w:val="Heading3"/>
       </w:pPr>
-      <w:bookmarkStart w:id="68" w:name="_Toc244119015"/>
+      <w:bookmarkStart w:id="68" w:name="_Toc244123268"/>
       <w:r>
         <w:t>Bước 14. Theo dõi kiểm tra 72 mẫu</w:t>
       </w:r>
@@ -11130,7 +11130,7 @@
         <w:pStyle w:val="Heading3"/>
         <w:pageBreakBefore/>
       </w:pPr>
-      <w:bookmarkStart w:id="69" w:name="_Toc244119016"/>
+      <w:bookmarkStart w:id="69" w:name="_Toc244123269"/>
       <w:r>
         <w:lastRenderedPageBreak/>
         <w:t>Bước 15. Thử nhanh không cần GitHub</w:t>
@@ -11203,7 +11203,7 @@
         <w:pStyle w:val="Heading3"/>
         <w:pageBreakBefore/>
       </w:pPr>
-      <w:bookmarkStart w:id="70" w:name="_Toc244119017"/>
+      <w:bookmarkStart w:id="70" w:name="_Toc244123270"/>
       <w:r>
         <w:lastRenderedPageBreak/>
         <w:t>Bước 16. Xem giải của đội</w:t>
@@ -11321,7 +11321,7 @@
       <w:pPr>
         <w:pStyle w:val="Heading3"/>
       </w:pPr>
-      <w:bookmarkStart w:id="71" w:name="_Toc244119018"/>
+      <w:bookmarkStart w:id="71" w:name="_Toc244123271"/>
       <w:r>
         <w:t>Bước 17. Luyện tập với bot mẫu</w:t>
       </w:r>
@@ -11430,7 +11430,7 @@
         <w:pageBreakBefore/>
       </w:pPr>
       <w:bookmarkStart w:id="72" w:name="c3-ban-tổ-chức-điều-hành"/>
-      <w:bookmarkStart w:id="73" w:name="_Toc244119019"/>
+      <w:bookmarkStart w:id="73" w:name="_Toc244123272"/>
       <w:bookmarkEnd w:id="56"/>
       <w:r>
         <w:lastRenderedPageBreak/>
@@ -11442,7 +11442,7 @@
       <w:pPr>
         <w:pStyle w:val="Heading3"/>
       </w:pPr>
-      <w:bookmarkStart w:id="74" w:name="_Toc244119020"/>
+      <w:bookmarkStart w:id="74" w:name="_Toc244123273"/>
       <w:r>
         <w:t>Bước 18. Xem tổng quan ban tổ chức</w:t>
       </w:r>
@@ -11520,7 +11520,7 @@
         <w:pStyle w:val="Heading3"/>
         <w:pageBreakBefore/>
       </w:pPr>
-      <w:bookmarkStart w:id="75" w:name="_Toc244119021"/>
+      <w:bookmarkStart w:id="75" w:name="_Toc244123274"/>
       <w:r>
         <w:lastRenderedPageBreak/>
         <w:t>Bước 19. Chọn giải ở Tổng quan</w:t>
@@ -11639,7 +11639,7 @@
         <w:pStyle w:val="Heading3"/>
         <w:pageBreakBefore/>
       </w:pPr>
-      <w:bookmarkStart w:id="76" w:name="_Toc244119022"/>
+      <w:bookmarkStart w:id="76" w:name="_Toc244123275"/>
       <w:r>
         <w:lastRenderedPageBreak/>
         <w:t>Bước 20. Chuẩn bị giải mới</w:t>
@@ -11727,7 +11727,7 @@
       <w:pPr>
         <w:pStyle w:val="Heading3"/>
       </w:pPr>
-      <w:bookmarkStart w:id="77" w:name="_Toc244119023"/>
+      <w:bookmarkStart w:id="77" w:name="_Toc244123276"/>
       <w:r>
         <w:t>Bước 21. Cài máy chấm Windows hoặc Linux</w:t>
       </w:r>
@@ -11835,7 +11835,7 @@
         <w:pStyle w:val="Heading3"/>
         <w:pageBreakBefore/>
       </w:pPr>
-      <w:bookmarkStart w:id="78" w:name="_Toc244119024"/>
+      <w:bookmarkStart w:id="78" w:name="_Toc244123277"/>
       <w:r>
         <w:lastRenderedPageBreak/>
         <w:t>Bước 22. Kiểm tình trạng chấm và hàng đợi</w:t>
@@ -11923,7 +11923,7 @@
       <w:pPr>
         <w:pStyle w:val="Heading3"/>
       </w:pPr>
-      <w:bookmarkStart w:id="79" w:name="_Toc244119025"/>
+      <w:bookmarkStart w:id="79" w:name="_Toc244123278"/>
       <w:r>
         <w:t>Bước 23. Soạn thông báo</w:t>
       </w:r>
@@ -12021,7 +12021,7 @@
         <w:pStyle w:val="Heading3"/>
         <w:pageBreakBefore/>
       </w:pPr>
-      <w:bookmarkStart w:id="80" w:name="_Toc244119026"/>
+      <w:bookmarkStart w:id="80" w:name="_Toc244123279"/>
       <w:r>
         <w:lastRenderedPageBreak/>
         <w:t>Bước 24. Xuất bảng điểm CSV</w:t>
@@ -12110,7 +12110,7 @@
         <w:pStyle w:val="Heading2"/>
         <w:pageBreakBefore/>
       </w:pPr>
-      <w:bookmarkStart w:id="81" w:name="_Toc244119027"/>
+      <w:bookmarkStart w:id="81" w:name="_Toc244123280"/>
       <w:bookmarkEnd w:id="46"/>
       <w:bookmarkEnd w:id="72"/>
       <w:r>
@@ -12131,7 +12131,7 @@
       <w:pPr>
         <w:pStyle w:val="Heading3"/>
       </w:pPr>
-      <w:bookmarkStart w:id="82" w:name="_Toc244119028"/>
+      <w:bookmarkStart w:id="82" w:name="_Toc244123281"/>
       <w:r>
         <w:t>Bước 25. Tạo tài khoản và phát giấy cho đội</w:t>
       </w:r>
@@ -12205,7 +12205,7 @@
         <w:pStyle w:val="Heading3"/>
         <w:pageBreakBefore/>
       </w:pPr>
-      <w:bookmarkStart w:id="83" w:name="_Toc244119029"/>
+      <w:bookmarkStart w:id="83" w:name="_Toc244123282"/>
       <w:r>
         <w:lastRenderedPageBreak/>
         <w:t>Bước 26. Đội tự nạp ZIP và kiểm tra</w:t>
@@ -12280,7 +12280,7 @@
         <w:pStyle w:val="Heading3"/>
         <w:pageBreakBefore/>
       </w:pPr>
-      <w:bookmarkStart w:id="84" w:name="_Toc244119030"/>
+      <w:bookmarkStart w:id="84" w:name="_Toc244123283"/>
       <w:r>
         <w:lastRenderedPageBreak/>
         <w:t>Bước 27. BTC tạo chung kết</w:t>
@@ -12355,7 +12355,7 @@
         <w:pStyle w:val="Heading3"/>
         <w:pageBreakBefore/>
       </w:pPr>
-      <w:bookmarkStart w:id="85" w:name="_Toc244119031"/>
+      <w:bookmarkStart w:id="85" w:name="_Toc244123284"/>
       <w:r>
         <w:lastRenderedPageBreak/>
         <w:t>Bước 28. Theo dõi vòng bảng và replay</w:t>
@@ -12430,7 +12430,7 @@
         <w:pStyle w:val="Heading3"/>
         <w:pageBreakBefore/>
       </w:pPr>
-      <w:bookmarkStart w:id="86" w:name="_Toc244119032"/>
+      <w:bookmarkStart w:id="86" w:name="_Toc244123285"/>
       <w:r>
         <w:lastRenderedPageBreak/>
         <w:t>Bước 29. Trang nhánh đấu và màn hình chiếu</w:t>
@@ -12505,7 +12505,7 @@
         <w:pStyle w:val="Heading3"/>
         <w:pageBreakBefore/>
       </w:pPr>
-      <w:bookmarkStart w:id="87" w:name="_Toc244119033"/>
+      <w:bookmarkStart w:id="87" w:name="_Toc244123286"/>
       <w:r>
         <w:lastRenderedPageBreak/>
         <w:t>Bước 30. Xuất kết quả trên hub LAN</w:t>
@@ -12580,7 +12580,7 @@
         <w:pStyle w:val="Heading3"/>
         <w:pageBreakBefore/>
       </w:pPr>
-      <w:bookmarkStart w:id="88" w:name="_Toc244119034"/>
+      <w:bookmarkStart w:id="88" w:name="_Toc244123287"/>
       <w:r>
         <w:lastRenderedPageBreak/>
         <w:t>Bước 31. Nạp kết quả lên web thật</w:t>

</xml_diff>

<commit_message>
Bổ sung README và khôi phục bảng bìa
</commit_message>
<xml_diff>
--- a/TAI-LIEU.docx
+++ b/TAI-LIEU.docx
@@ -53,7 +53,7 @@
         <w:jc w:val="center"/>
       </w:pPr>
       <w:r>
-        <w:t>25 tháng 10 năm 2026</w:t>
+        <w:t>29 tháng 10 năm 2026</w:t>
       </w:r>
     </w:p>
     <w:p>
@@ -108,6 +108,185 @@
         </w:r>
       </w:hyperlink>
     </w:p>
+    <w:tbl>
+      <w:tblPr>
+        <w:tblStyle w:val="TableGrid"/>
+        <w:tblW w:w="9071" w:type="dxa"/>
+        <w:jc w:val="center"/>
+        <w:tblBorders>
+          <w:top w:val="single" w:sz="4" w:space="0" w:color="7F7F7F"/>
+          <w:left w:val="single" w:sz="4" w:space="0" w:color="7F7F7F"/>
+          <w:bottom w:val="single" w:sz="4" w:space="0" w:color="7F7F7F"/>
+          <w:right w:val="single" w:sz="4" w:space="0" w:color="7F7F7F"/>
+          <w:insideH w:val="single" w:sz="4" w:space="0" w:color="7F7F7F"/>
+          <w:insideV w:val="single" w:sz="4" w:space="0" w:color="7F7F7F"/>
+        </w:tblBorders>
+        <w:tblLayout w:type="fixed"/>
+        <w:tblLook w:val="04A0" w:firstRow="1" w:lastRow="0" w:firstColumn="1" w:lastColumn="0" w:noHBand="0" w:noVBand="1"/>
+      </w:tblPr>
+      <w:tblGrid>
+        <w:gridCol w:w="4535"/>
+        <w:gridCol w:w="4536"/>
+      </w:tblGrid>
+      <w:tr>
+        <w:trPr>
+          <w:cantSplit/>
+          <w:trHeight w:val="397"/>
+          <w:tblHeader/>
+          <w:jc w:val="center"/>
+        </w:trPr>
+        <w:tc>
+          <w:tcPr>
+            <w:tcW w:w="4535" w:type="dxa"/>
+            <w:shd w:val="clear" w:color="auto" w:fill="F2F2F2"/>
+          </w:tcPr>
+          <w:p>
+            <w:pPr>
+              <w:keepNext/>
+              <w:spacing w:before="60" w:after="100"/>
+            </w:pPr>
+            <w:r>
+              <w:rPr>
+                <w:b/>
+              </w:rPr>
+              <w:t>Họ tên</w:t>
+            </w:r>
+          </w:p>
+        </w:tc>
+        <w:tc>
+          <w:tcPr>
+            <w:tcW w:w="4535" w:type="dxa"/>
+            <w:shd w:val="clear" w:color="auto" w:fill="F2F2F2"/>
+          </w:tcPr>
+          <w:p>
+            <w:pPr>
+              <w:keepNext/>
+              <w:spacing w:before="60" w:after="100"/>
+            </w:pPr>
+            <w:r>
+              <w:rPr>
+                <w:b/>
+              </w:rPr>
+              <w:t>MSSV</w:t>
+            </w:r>
+          </w:p>
+        </w:tc>
+      </w:tr>
+      <w:tr>
+        <w:trPr>
+          <w:cantSplit/>
+          <w:trHeight w:val="397"/>
+          <w:jc w:val="center"/>
+        </w:trPr>
+        <w:tc>
+          <w:tcPr>
+            <w:tcW w:w="4535" w:type="dxa"/>
+          </w:tcPr>
+          <w:p>
+            <w:pPr>
+              <w:keepNext/>
+              <w:spacing w:before="60" w:after="100"/>
+            </w:pPr>
+          </w:p>
+        </w:tc>
+        <w:tc>
+          <w:tcPr>
+            <w:tcW w:w="4535" w:type="dxa"/>
+          </w:tcPr>
+          <w:p>
+            <w:pPr>
+              <w:keepNext/>
+              <w:spacing w:before="60" w:after="100"/>
+            </w:pPr>
+          </w:p>
+        </w:tc>
+      </w:tr>
+      <w:tr>
+        <w:trPr>
+          <w:cantSplit/>
+          <w:trHeight w:val="397"/>
+          <w:jc w:val="center"/>
+        </w:trPr>
+        <w:tc>
+          <w:tcPr>
+            <w:tcW w:w="4535" w:type="dxa"/>
+          </w:tcPr>
+          <w:p>
+            <w:pPr>
+              <w:keepNext/>
+              <w:spacing w:before="60" w:after="100"/>
+            </w:pPr>
+          </w:p>
+        </w:tc>
+        <w:tc>
+          <w:tcPr>
+            <w:tcW w:w="4535" w:type="dxa"/>
+          </w:tcPr>
+          <w:p>
+            <w:pPr>
+              <w:keepNext/>
+              <w:spacing w:before="60" w:after="100"/>
+            </w:pPr>
+          </w:p>
+        </w:tc>
+      </w:tr>
+      <w:tr>
+        <w:trPr>
+          <w:cantSplit/>
+          <w:trHeight w:val="397"/>
+          <w:jc w:val="center"/>
+        </w:trPr>
+        <w:tc>
+          <w:tcPr>
+            <w:tcW w:w="4535" w:type="dxa"/>
+          </w:tcPr>
+          <w:p>
+            <w:pPr>
+              <w:keepNext/>
+              <w:spacing w:before="60" w:after="100"/>
+            </w:pPr>
+          </w:p>
+        </w:tc>
+        <w:tc>
+          <w:tcPr>
+            <w:tcW w:w="4535" w:type="dxa"/>
+          </w:tcPr>
+          <w:p>
+            <w:pPr>
+              <w:keepNext/>
+              <w:spacing w:before="60" w:after="100"/>
+            </w:pPr>
+          </w:p>
+        </w:tc>
+      </w:tr>
+      <w:tr>
+        <w:trPr>
+          <w:cantSplit/>
+          <w:trHeight w:val="397"/>
+          <w:jc w:val="center"/>
+        </w:trPr>
+        <w:tc>
+          <w:tcPr>
+            <w:tcW w:w="4535" w:type="dxa"/>
+          </w:tcPr>
+          <w:p>
+            <w:pPr>
+              <w:spacing w:before="60" w:after="100"/>
+            </w:pPr>
+          </w:p>
+        </w:tc>
+        <w:tc>
+          <w:tcPr>
+            <w:tcW w:w="4535" w:type="dxa"/>
+          </w:tcPr>
+          <w:p>
+            <w:pPr>
+              <w:spacing w:before="60" w:after="100"/>
+            </w:pPr>
+          </w:p>
+        </w:tc>
+      </w:tr>
+    </w:tbl>
     <w:sdt>
       <w:sdtPr>
         <w:rPr>
@@ -159,7 +338,7 @@
           <w:r>
             <w:fldChar w:fldCharType="separate"/>
           </w:r>
-          <w:hyperlink w:anchor="_Toc244123227" w:history="1">
+          <w:hyperlink w:anchor="_Toc244163389" w:history="1">
             <w:r>
               <w:rPr>
                 <w:rStyle w:val="Hyperlink"/>
@@ -186,7 +365,7 @@
                 <w:noProof/>
                 <w:webHidden/>
               </w:rPr>
-              <w:instrText xml:space="preserve"> PAGEREF _Toc244123227 \h </w:instrText>
+              <w:instrText xml:space="preserve"> PAGEREF _Toc244163389 \h </w:instrText>
             </w:r>
             <w:r>
               <w:rPr>
@@ -233,7 +412,7 @@
               <w14:ligatures w14:val="standardContextual"/>
             </w:rPr>
           </w:pPr>
-          <w:hyperlink w:anchor="_Toc244123228" w:history="1">
+          <w:hyperlink w:anchor="_Toc244163390" w:history="1">
             <w:r>
               <w:rPr>
                 <w:rStyle w:val="Hyperlink"/>
@@ -260,7 +439,7 @@
                 <w:noProof/>
                 <w:webHidden/>
               </w:rPr>
-              <w:instrText xml:space="preserve"> PAGEREF _Toc244123228 \h </w:instrText>
+              <w:instrText xml:space="preserve"> PAGEREF _Toc244163390 \h </w:instrText>
             </w:r>
             <w:r>
               <w:rPr>
@@ -307,7 +486,7 @@
               <w14:ligatures w14:val="standardContextual"/>
             </w:rPr>
           </w:pPr>
-          <w:hyperlink w:anchor="_Toc244123229" w:history="1">
+          <w:hyperlink w:anchor="_Toc244163391" w:history="1">
             <w:r>
               <w:rPr>
                 <w:rStyle w:val="Hyperlink"/>
@@ -334,7 +513,7 @@
                 <w:noProof/>
                 <w:webHidden/>
               </w:rPr>
-              <w:instrText xml:space="preserve"> PAGEREF _Toc244123229 \h </w:instrText>
+              <w:instrText xml:space="preserve"> PAGEREF _Toc244163391 \h </w:instrText>
             </w:r>
             <w:r>
               <w:rPr>
@@ -381,7 +560,7 @@
               <w14:ligatures w14:val="standardContextual"/>
             </w:rPr>
           </w:pPr>
-          <w:hyperlink w:anchor="_Toc244123230" w:history="1">
+          <w:hyperlink w:anchor="_Toc244163392" w:history="1">
             <w:r>
               <w:rPr>
                 <w:rStyle w:val="Hyperlink"/>
@@ -408,7 +587,7 @@
                 <w:noProof/>
                 <w:webHidden/>
               </w:rPr>
-              <w:instrText xml:space="preserve"> PAGEREF _Toc244123230 \h </w:instrText>
+              <w:instrText xml:space="preserve"> PAGEREF _Toc244163392 \h </w:instrText>
             </w:r>
             <w:r>
               <w:rPr>
@@ -455,7 +634,7 @@
               <w14:ligatures w14:val="standardContextual"/>
             </w:rPr>
           </w:pPr>
-          <w:hyperlink w:anchor="_Toc244123231" w:history="1">
+          <w:hyperlink w:anchor="_Toc244163393" w:history="1">
             <w:r>
               <w:rPr>
                 <w:rStyle w:val="Hyperlink"/>
@@ -482,7 +661,7 @@
                 <w:noProof/>
                 <w:webHidden/>
               </w:rPr>
-              <w:instrText xml:space="preserve"> PAGEREF _Toc244123231 \h </w:instrText>
+              <w:instrText xml:space="preserve"> PAGEREF _Toc244163393 \h </w:instrText>
             </w:r>
             <w:r>
               <w:rPr>
@@ -529,7 +708,7 @@
               <w14:ligatures w14:val="standardContextual"/>
             </w:rPr>
           </w:pPr>
-          <w:hyperlink w:anchor="_Toc244123232" w:history="1">
+          <w:hyperlink w:anchor="_Toc244163394" w:history="1">
             <w:r>
               <w:rPr>
                 <w:rStyle w:val="Hyperlink"/>
@@ -556,7 +735,7 @@
                 <w:noProof/>
                 <w:webHidden/>
               </w:rPr>
-              <w:instrText xml:space="preserve"> PAGEREF _Toc244123232 \h </w:instrText>
+              <w:instrText xml:space="preserve"> PAGEREF _Toc244163394 \h </w:instrText>
             </w:r>
             <w:r>
               <w:rPr>
@@ -603,7 +782,7 @@
               <w14:ligatures w14:val="standardContextual"/>
             </w:rPr>
           </w:pPr>
-          <w:hyperlink w:anchor="_Toc244123233" w:history="1">
+          <w:hyperlink w:anchor="_Toc244163395" w:history="1">
             <w:r>
               <w:rPr>
                 <w:rStyle w:val="Hyperlink"/>
@@ -630,7 +809,7 @@
                 <w:noProof/>
                 <w:webHidden/>
               </w:rPr>
-              <w:instrText xml:space="preserve"> PAGEREF _Toc244123233 \h </w:instrText>
+              <w:instrText xml:space="preserve"> PAGEREF _Toc244163395 \h </w:instrText>
             </w:r>
             <w:r>
               <w:rPr>
@@ -677,7 +856,7 @@
               <w14:ligatures w14:val="standardContextual"/>
             </w:rPr>
           </w:pPr>
-          <w:hyperlink w:anchor="_Toc244123234" w:history="1">
+          <w:hyperlink w:anchor="_Toc244163396" w:history="1">
             <w:r>
               <w:rPr>
                 <w:rStyle w:val="Hyperlink"/>
@@ -704,7 +883,7 @@
                 <w:noProof/>
                 <w:webHidden/>
               </w:rPr>
-              <w:instrText xml:space="preserve"> PAGEREF _Toc244123234 \h </w:instrText>
+              <w:instrText xml:space="preserve"> PAGEREF _Toc244163396 \h </w:instrText>
             </w:r>
             <w:r>
               <w:rPr>
@@ -751,7 +930,7 @@
               <w14:ligatures w14:val="standardContextual"/>
             </w:rPr>
           </w:pPr>
-          <w:hyperlink w:anchor="_Toc244123235" w:history="1">
+          <w:hyperlink w:anchor="_Toc244163397" w:history="1">
             <w:r>
               <w:rPr>
                 <w:rStyle w:val="Hyperlink"/>
@@ -778,7 +957,7 @@
                 <w:noProof/>
                 <w:webHidden/>
               </w:rPr>
-              <w:instrText xml:space="preserve"> PAGEREF _Toc244123235 \h </w:instrText>
+              <w:instrText xml:space="preserve"> PAGEREF _Toc244163397 \h </w:instrText>
             </w:r>
             <w:r>
               <w:rPr>
@@ -825,7 +1004,7 @@
               <w14:ligatures w14:val="standardContextual"/>
             </w:rPr>
           </w:pPr>
-          <w:hyperlink w:anchor="_Toc244123236" w:history="1">
+          <w:hyperlink w:anchor="_Toc244163398" w:history="1">
             <w:r>
               <w:rPr>
                 <w:rStyle w:val="Hyperlink"/>
@@ -852,7 +1031,7 @@
                 <w:noProof/>
                 <w:webHidden/>
               </w:rPr>
-              <w:instrText xml:space="preserve"> PAGEREF _Toc244123236 \h </w:instrText>
+              <w:instrText xml:space="preserve"> PAGEREF _Toc244163398 \h </w:instrText>
             </w:r>
             <w:r>
               <w:rPr>
@@ -899,7 +1078,7 @@
               <w14:ligatures w14:val="standardContextual"/>
             </w:rPr>
           </w:pPr>
-          <w:hyperlink w:anchor="_Toc244123237" w:history="1">
+          <w:hyperlink w:anchor="_Toc244163399" w:history="1">
             <w:r>
               <w:rPr>
                 <w:rStyle w:val="Hyperlink"/>
@@ -926,7 +1105,7 @@
                 <w:noProof/>
                 <w:webHidden/>
               </w:rPr>
-              <w:instrText xml:space="preserve"> PAGEREF _Toc244123237 \h </w:instrText>
+              <w:instrText xml:space="preserve"> PAGEREF _Toc244163399 \h </w:instrText>
             </w:r>
             <w:r>
               <w:rPr>
@@ -973,7 +1152,7 @@
               <w14:ligatures w14:val="standardContextual"/>
             </w:rPr>
           </w:pPr>
-          <w:hyperlink w:anchor="_Toc244123238" w:history="1">
+          <w:hyperlink w:anchor="_Toc244163400" w:history="1">
             <w:r>
               <w:rPr>
                 <w:rStyle w:val="Hyperlink"/>
@@ -1000,7 +1179,7 @@
                 <w:noProof/>
                 <w:webHidden/>
               </w:rPr>
-              <w:instrText xml:space="preserve"> PAGEREF _Toc244123238 \h </w:instrText>
+              <w:instrText xml:space="preserve"> PAGEREF _Toc244163400 \h </w:instrText>
             </w:r>
             <w:r>
               <w:rPr>
@@ -1047,7 +1226,7 @@
               <w14:ligatures w14:val="standardContextual"/>
             </w:rPr>
           </w:pPr>
-          <w:hyperlink w:anchor="_Toc244123239" w:history="1">
+          <w:hyperlink w:anchor="_Toc244163401" w:history="1">
             <w:r>
               <w:rPr>
                 <w:rStyle w:val="Hyperlink"/>
@@ -1074,7 +1253,7 @@
                 <w:noProof/>
                 <w:webHidden/>
               </w:rPr>
-              <w:instrText xml:space="preserve"> PAGEREF _Toc244123239 \h </w:instrText>
+              <w:instrText xml:space="preserve"> PAGEREF _Toc244163401 \h </w:instrText>
             </w:r>
             <w:r>
               <w:rPr>
@@ -1121,7 +1300,7 @@
               <w14:ligatures w14:val="standardContextual"/>
             </w:rPr>
           </w:pPr>
-          <w:hyperlink w:anchor="_Toc244123240" w:history="1">
+          <w:hyperlink w:anchor="_Toc244163402" w:history="1">
             <w:r>
               <w:rPr>
                 <w:rStyle w:val="Hyperlink"/>
@@ -1148,7 +1327,7 @@
                 <w:noProof/>
                 <w:webHidden/>
               </w:rPr>
-              <w:instrText xml:space="preserve"> PAGEREF _Toc244123240 \h </w:instrText>
+              <w:instrText xml:space="preserve"> PAGEREF _Toc244163402 \h </w:instrText>
             </w:r>
             <w:r>
               <w:rPr>
@@ -1195,7 +1374,7 @@
               <w14:ligatures w14:val="standardContextual"/>
             </w:rPr>
           </w:pPr>
-          <w:hyperlink w:anchor="_Toc244123241" w:history="1">
+          <w:hyperlink w:anchor="_Toc244163403" w:history="1">
             <w:r>
               <w:rPr>
                 <w:rStyle w:val="Hyperlink"/>
@@ -1222,7 +1401,7 @@
                 <w:noProof/>
                 <w:webHidden/>
               </w:rPr>
-              <w:instrText xml:space="preserve"> PAGEREF _Toc244123241 \h </w:instrText>
+              <w:instrText xml:space="preserve"> PAGEREF _Toc244163403 \h </w:instrText>
             </w:r>
             <w:r>
               <w:rPr>
@@ -1269,7 +1448,7 @@
               <w14:ligatures w14:val="standardContextual"/>
             </w:rPr>
           </w:pPr>
-          <w:hyperlink w:anchor="_Toc244123242" w:history="1">
+          <w:hyperlink w:anchor="_Toc244163404" w:history="1">
             <w:r>
               <w:rPr>
                 <w:rStyle w:val="Hyperlink"/>
@@ -1296,7 +1475,7 @@
                 <w:noProof/>
                 <w:webHidden/>
               </w:rPr>
-              <w:instrText xml:space="preserve"> PAGEREF _Toc244123242 \h </w:instrText>
+              <w:instrText xml:space="preserve"> PAGEREF _Toc244163404 \h </w:instrText>
             </w:r>
             <w:r>
               <w:rPr>
@@ -1343,7 +1522,7 @@
               <w14:ligatures w14:val="standardContextual"/>
             </w:rPr>
           </w:pPr>
-          <w:hyperlink w:anchor="_Toc244123243" w:history="1">
+          <w:hyperlink w:anchor="_Toc244163405" w:history="1">
             <w:r>
               <w:rPr>
                 <w:rStyle w:val="Hyperlink"/>
@@ -1370,7 +1549,7 @@
                 <w:noProof/>
                 <w:webHidden/>
               </w:rPr>
-              <w:instrText xml:space="preserve"> PAGEREF _Toc244123243 \h </w:instrText>
+              <w:instrText xml:space="preserve"> PAGEREF _Toc244163405 \h </w:instrText>
             </w:r>
             <w:r>
               <w:rPr>
@@ -1417,7 +1596,7 @@
               <w14:ligatures w14:val="standardContextual"/>
             </w:rPr>
           </w:pPr>
-          <w:hyperlink w:anchor="_Toc244123244" w:history="1">
+          <w:hyperlink w:anchor="_Toc244163406" w:history="1">
             <w:r>
               <w:rPr>
                 <w:rStyle w:val="Hyperlink"/>
@@ -1444,7 +1623,7 @@
                 <w:noProof/>
                 <w:webHidden/>
               </w:rPr>
-              <w:instrText xml:space="preserve"> PAGEREF _Toc244123244 \h </w:instrText>
+              <w:instrText xml:space="preserve"> PAGEREF _Toc244163406 \h </w:instrText>
             </w:r>
             <w:r>
               <w:rPr>
@@ -1491,7 +1670,7 @@
               <w14:ligatures w14:val="standardContextual"/>
             </w:rPr>
           </w:pPr>
-          <w:hyperlink w:anchor="_Toc244123245" w:history="1">
+          <w:hyperlink w:anchor="_Toc244163407" w:history="1">
             <w:r>
               <w:rPr>
                 <w:rStyle w:val="Hyperlink"/>
@@ -1518,7 +1697,7 @@
                 <w:noProof/>
                 <w:webHidden/>
               </w:rPr>
-              <w:instrText xml:space="preserve"> PAGEREF _Toc244123245 \h </w:instrText>
+              <w:instrText xml:space="preserve"> PAGEREF _Toc244163407 \h </w:instrText>
             </w:r>
             <w:r>
               <w:rPr>
@@ -1565,7 +1744,7 @@
               <w14:ligatures w14:val="standardContextual"/>
             </w:rPr>
           </w:pPr>
-          <w:hyperlink w:anchor="_Toc244123246" w:history="1">
+          <w:hyperlink w:anchor="_Toc244163408" w:history="1">
             <w:r>
               <w:rPr>
                 <w:rStyle w:val="Hyperlink"/>
@@ -1592,7 +1771,7 @@
                 <w:noProof/>
                 <w:webHidden/>
               </w:rPr>
-              <w:instrText xml:space="preserve"> PAGEREF _Toc244123246 \h </w:instrText>
+              <w:instrText xml:space="preserve"> PAGEREF _Toc244163408 \h </w:instrText>
             </w:r>
             <w:r>
               <w:rPr>
@@ -1639,7 +1818,7 @@
               <w14:ligatures w14:val="standardContextual"/>
             </w:rPr>
           </w:pPr>
-          <w:hyperlink w:anchor="_Toc244123247" w:history="1">
+          <w:hyperlink w:anchor="_Toc244163409" w:history="1">
             <w:r>
               <w:rPr>
                 <w:rStyle w:val="Hyperlink"/>
@@ -1666,7 +1845,7 @@
                 <w:noProof/>
                 <w:webHidden/>
               </w:rPr>
-              <w:instrText xml:space="preserve"> PAGEREF _Toc244123247 \h </w:instrText>
+              <w:instrText xml:space="preserve"> PAGEREF _Toc244163409 \h </w:instrText>
             </w:r>
             <w:r>
               <w:rPr>
@@ -1713,7 +1892,7 @@
               <w14:ligatures w14:val="standardContextual"/>
             </w:rPr>
           </w:pPr>
-          <w:hyperlink w:anchor="_Toc244123248" w:history="1">
+          <w:hyperlink w:anchor="_Toc244163410" w:history="1">
             <w:r>
               <w:rPr>
                 <w:rStyle w:val="Hyperlink"/>
@@ -1740,7 +1919,7 @@
                 <w:noProof/>
                 <w:webHidden/>
               </w:rPr>
-              <w:instrText xml:space="preserve"> PAGEREF _Toc244123248 \h </w:instrText>
+              <w:instrText xml:space="preserve"> PAGEREF _Toc244163410 \h </w:instrText>
             </w:r>
             <w:r>
               <w:rPr>
@@ -1787,7 +1966,7 @@
               <w14:ligatures w14:val="standardContextual"/>
             </w:rPr>
           </w:pPr>
-          <w:hyperlink w:anchor="_Toc244123249" w:history="1">
+          <w:hyperlink w:anchor="_Toc244163411" w:history="1">
             <w:r>
               <w:rPr>
                 <w:rStyle w:val="Hyperlink"/>
@@ -1814,7 +1993,7 @@
                 <w:noProof/>
                 <w:webHidden/>
               </w:rPr>
-              <w:instrText xml:space="preserve"> PAGEREF _Toc244123249 \h </w:instrText>
+              <w:instrText xml:space="preserve"> PAGEREF _Toc244163411 \h </w:instrText>
             </w:r>
             <w:r>
               <w:rPr>
@@ -1861,7 +2040,7 @@
               <w14:ligatures w14:val="standardContextual"/>
             </w:rPr>
           </w:pPr>
-          <w:hyperlink w:anchor="_Toc244123250" w:history="1">
+          <w:hyperlink w:anchor="_Toc244163412" w:history="1">
             <w:r>
               <w:rPr>
                 <w:rStyle w:val="Hyperlink"/>
@@ -1888,7 +2067,7 @@
                 <w:noProof/>
                 <w:webHidden/>
               </w:rPr>
-              <w:instrText xml:space="preserve"> PAGEREF _Toc244123250 \h </w:instrText>
+              <w:instrText xml:space="preserve"> PAGEREF _Toc244163412 \h </w:instrText>
             </w:r>
             <w:r>
               <w:rPr>
@@ -1935,7 +2114,7 @@
               <w14:ligatures w14:val="standardContextual"/>
             </w:rPr>
           </w:pPr>
-          <w:hyperlink w:anchor="_Toc244123251" w:history="1">
+          <w:hyperlink w:anchor="_Toc244163413" w:history="1">
             <w:r>
               <w:rPr>
                 <w:rStyle w:val="Hyperlink"/>
@@ -1962,7 +2141,7 @@
                 <w:noProof/>
                 <w:webHidden/>
               </w:rPr>
-              <w:instrText xml:space="preserve"> PAGEREF _Toc244123251 \h </w:instrText>
+              <w:instrText xml:space="preserve"> PAGEREF _Toc244163413 \h </w:instrText>
             </w:r>
             <w:r>
               <w:rPr>
@@ -2009,7 +2188,7 @@
               <w14:ligatures w14:val="standardContextual"/>
             </w:rPr>
           </w:pPr>
-          <w:hyperlink w:anchor="_Toc244123252" w:history="1">
+          <w:hyperlink w:anchor="_Toc244163414" w:history="1">
             <w:r>
               <w:rPr>
                 <w:rStyle w:val="Hyperlink"/>
@@ -2036,7 +2215,7 @@
                 <w:noProof/>
                 <w:webHidden/>
               </w:rPr>
-              <w:instrText xml:space="preserve"> PAGEREF _Toc244123252 \h </w:instrText>
+              <w:instrText xml:space="preserve"> PAGEREF _Toc244163414 \h </w:instrText>
             </w:r>
             <w:r>
               <w:rPr>
@@ -2083,7 +2262,7 @@
               <w14:ligatures w14:val="standardContextual"/>
             </w:rPr>
           </w:pPr>
-          <w:hyperlink w:anchor="_Toc244123253" w:history="1">
+          <w:hyperlink w:anchor="_Toc244163415" w:history="1">
             <w:r>
               <w:rPr>
                 <w:rStyle w:val="Hyperlink"/>
@@ -2110,7 +2289,7 @@
                 <w:noProof/>
                 <w:webHidden/>
               </w:rPr>
-              <w:instrText xml:space="preserve"> PAGEREF _Toc244123253 \h </w:instrText>
+              <w:instrText xml:space="preserve"> PAGEREF _Toc244163415 \h </w:instrText>
             </w:r>
             <w:r>
               <w:rPr>
@@ -2157,7 +2336,7 @@
               <w14:ligatures w14:val="standardContextual"/>
             </w:rPr>
           </w:pPr>
-          <w:hyperlink w:anchor="_Toc244123254" w:history="1">
+          <w:hyperlink w:anchor="_Toc244163416" w:history="1">
             <w:r>
               <w:rPr>
                 <w:rStyle w:val="Hyperlink"/>
@@ -2184,7 +2363,7 @@
                 <w:noProof/>
                 <w:webHidden/>
               </w:rPr>
-              <w:instrText xml:space="preserve"> PAGEREF _Toc244123254 \h </w:instrText>
+              <w:instrText xml:space="preserve"> PAGEREF _Toc244163416 \h </w:instrText>
             </w:r>
             <w:r>
               <w:rPr>
@@ -2231,7 +2410,7 @@
               <w14:ligatures w14:val="standardContextual"/>
             </w:rPr>
           </w:pPr>
-          <w:hyperlink w:anchor="_Toc244123255" w:history="1">
+          <w:hyperlink w:anchor="_Toc244163417" w:history="1">
             <w:r>
               <w:rPr>
                 <w:rStyle w:val="Hyperlink"/>
@@ -2258,7 +2437,7 @@
                 <w:noProof/>
                 <w:webHidden/>
               </w:rPr>
-              <w:instrText xml:space="preserve"> PAGEREF _Toc244123255 \h </w:instrText>
+              <w:instrText xml:space="preserve"> PAGEREF _Toc244163417 \h </w:instrText>
             </w:r>
             <w:r>
               <w:rPr>
@@ -2305,7 +2484,7 @@
               <w14:ligatures w14:val="standardContextual"/>
             </w:rPr>
           </w:pPr>
-          <w:hyperlink w:anchor="_Toc244123256" w:history="1">
+          <w:hyperlink w:anchor="_Toc244163418" w:history="1">
             <w:r>
               <w:rPr>
                 <w:rStyle w:val="Hyperlink"/>
@@ -2332,7 +2511,7 @@
                 <w:noProof/>
                 <w:webHidden/>
               </w:rPr>
-              <w:instrText xml:space="preserve"> PAGEREF _Toc244123256 \h </w:instrText>
+              <w:instrText xml:space="preserve"> PAGEREF _Toc244163418 \h </w:instrText>
             </w:r>
             <w:r>
               <w:rPr>
@@ -2379,7 +2558,7 @@
               <w14:ligatures w14:val="standardContextual"/>
             </w:rPr>
           </w:pPr>
-          <w:hyperlink w:anchor="_Toc244123257" w:history="1">
+          <w:hyperlink w:anchor="_Toc244163419" w:history="1">
             <w:r>
               <w:rPr>
                 <w:rStyle w:val="Hyperlink"/>
@@ -2406,7 +2585,7 @@
                 <w:noProof/>
                 <w:webHidden/>
               </w:rPr>
-              <w:instrText xml:space="preserve"> PAGEREF _Toc244123257 \h </w:instrText>
+              <w:instrText xml:space="preserve"> PAGEREF _Toc244163419 \h </w:instrText>
             </w:r>
             <w:r>
               <w:rPr>
@@ -2453,7 +2632,7 @@
               <w14:ligatures w14:val="standardContextual"/>
             </w:rPr>
           </w:pPr>
-          <w:hyperlink w:anchor="_Toc244123258" w:history="1">
+          <w:hyperlink w:anchor="_Toc244163420" w:history="1">
             <w:r>
               <w:rPr>
                 <w:rStyle w:val="Hyperlink"/>
@@ -2480,7 +2659,7 @@
                 <w:noProof/>
                 <w:webHidden/>
               </w:rPr>
-              <w:instrText xml:space="preserve"> PAGEREF _Toc244123258 \h </w:instrText>
+              <w:instrText xml:space="preserve"> PAGEREF _Toc244163420 \h </w:instrText>
             </w:r>
             <w:r>
               <w:rPr>
@@ -2527,7 +2706,7 @@
               <w14:ligatures w14:val="standardContextual"/>
             </w:rPr>
           </w:pPr>
-          <w:hyperlink w:anchor="_Toc244123259" w:history="1">
+          <w:hyperlink w:anchor="_Toc244163421" w:history="1">
             <w:r>
               <w:rPr>
                 <w:rStyle w:val="Hyperlink"/>
@@ -2554,7 +2733,7 @@
                 <w:noProof/>
                 <w:webHidden/>
               </w:rPr>
-              <w:instrText xml:space="preserve"> PAGEREF _Toc244123259 \h </w:instrText>
+              <w:instrText xml:space="preserve"> PAGEREF _Toc244163421 \h </w:instrText>
             </w:r>
             <w:r>
               <w:rPr>
@@ -2601,7 +2780,7 @@
               <w14:ligatures w14:val="standardContextual"/>
             </w:rPr>
           </w:pPr>
-          <w:hyperlink w:anchor="_Toc244123260" w:history="1">
+          <w:hyperlink w:anchor="_Toc244163422" w:history="1">
             <w:r>
               <w:rPr>
                 <w:rStyle w:val="Hyperlink"/>
@@ -2628,7 +2807,7 @@
                 <w:noProof/>
                 <w:webHidden/>
               </w:rPr>
-              <w:instrText xml:space="preserve"> PAGEREF _Toc244123260 \h </w:instrText>
+              <w:instrText xml:space="preserve"> PAGEREF _Toc244163422 \h </w:instrText>
             </w:r>
             <w:r>
               <w:rPr>
@@ -2675,7 +2854,7 @@
               <w14:ligatures w14:val="standardContextual"/>
             </w:rPr>
           </w:pPr>
-          <w:hyperlink w:anchor="_Toc244123261" w:history="1">
+          <w:hyperlink w:anchor="_Toc244163423" w:history="1">
             <w:r>
               <w:rPr>
                 <w:rStyle w:val="Hyperlink"/>
@@ -2702,7 +2881,7 @@
                 <w:noProof/>
                 <w:webHidden/>
               </w:rPr>
-              <w:instrText xml:space="preserve"> PAGEREF _Toc244123261 \h </w:instrText>
+              <w:instrText xml:space="preserve"> PAGEREF _Toc244163423 \h </w:instrText>
             </w:r>
             <w:r>
               <w:rPr>
@@ -2749,7 +2928,7 @@
               <w14:ligatures w14:val="standardContextual"/>
             </w:rPr>
           </w:pPr>
-          <w:hyperlink w:anchor="_Toc244123262" w:history="1">
+          <w:hyperlink w:anchor="_Toc244163424" w:history="1">
             <w:r>
               <w:rPr>
                 <w:rStyle w:val="Hyperlink"/>
@@ -2776,7 +2955,7 @@
                 <w:noProof/>
                 <w:webHidden/>
               </w:rPr>
-              <w:instrText xml:space="preserve"> PAGEREF _Toc244123262 \h </w:instrText>
+              <w:instrText xml:space="preserve"> PAGEREF _Toc244163424 \h </w:instrText>
             </w:r>
             <w:r>
               <w:rPr>
@@ -2823,7 +3002,7 @@
               <w14:ligatures w14:val="standardContextual"/>
             </w:rPr>
           </w:pPr>
-          <w:hyperlink w:anchor="_Toc244123263" w:history="1">
+          <w:hyperlink w:anchor="_Toc244163425" w:history="1">
             <w:r>
               <w:rPr>
                 <w:rStyle w:val="Hyperlink"/>
@@ -2850,7 +3029,7 @@
                 <w:noProof/>
                 <w:webHidden/>
               </w:rPr>
-              <w:instrText xml:space="preserve"> PAGEREF _Toc244123263 \h </w:instrText>
+              <w:instrText xml:space="preserve"> PAGEREF _Toc244163425 \h </w:instrText>
             </w:r>
             <w:r>
               <w:rPr>
@@ -2897,7 +3076,7 @@
               <w14:ligatures w14:val="standardContextual"/>
             </w:rPr>
           </w:pPr>
-          <w:hyperlink w:anchor="_Toc244123264" w:history="1">
+          <w:hyperlink w:anchor="_Toc244163426" w:history="1">
             <w:r>
               <w:rPr>
                 <w:rStyle w:val="Hyperlink"/>
@@ -2924,7 +3103,7 @@
                 <w:noProof/>
                 <w:webHidden/>
               </w:rPr>
-              <w:instrText xml:space="preserve"> PAGEREF _Toc244123264 \h </w:instrText>
+              <w:instrText xml:space="preserve"> PAGEREF _Toc244163426 \h </w:instrText>
             </w:r>
             <w:r>
               <w:rPr>
@@ -2971,7 +3150,7 @@
               <w14:ligatures w14:val="standardContextual"/>
             </w:rPr>
           </w:pPr>
-          <w:hyperlink w:anchor="_Toc244123265" w:history="1">
+          <w:hyperlink w:anchor="_Toc244163427" w:history="1">
             <w:r>
               <w:rPr>
                 <w:rStyle w:val="Hyperlink"/>
@@ -2998,7 +3177,7 @@
                 <w:noProof/>
                 <w:webHidden/>
               </w:rPr>
-              <w:instrText xml:space="preserve"> PAGEREF _Toc244123265 \h </w:instrText>
+              <w:instrText xml:space="preserve"> PAGEREF _Toc244163427 \h </w:instrText>
             </w:r>
             <w:r>
               <w:rPr>
@@ -3045,7 +3224,7 @@
               <w14:ligatures w14:val="standardContextual"/>
             </w:rPr>
           </w:pPr>
-          <w:hyperlink w:anchor="_Toc244123266" w:history="1">
+          <w:hyperlink w:anchor="_Toc244163428" w:history="1">
             <w:r>
               <w:rPr>
                 <w:rStyle w:val="Hyperlink"/>
@@ -3072,7 +3251,7 @@
                 <w:noProof/>
                 <w:webHidden/>
               </w:rPr>
-              <w:instrText xml:space="preserve"> PAGEREF _Toc244123266 \h </w:instrText>
+              <w:instrText xml:space="preserve"> PAGEREF _Toc244163428 \h </w:instrText>
             </w:r>
             <w:r>
               <w:rPr>
@@ -3119,7 +3298,7 @@
               <w14:ligatures w14:val="standardContextual"/>
             </w:rPr>
           </w:pPr>
-          <w:hyperlink w:anchor="_Toc244123267" w:history="1">
+          <w:hyperlink w:anchor="_Toc244163429" w:history="1">
             <w:r>
               <w:rPr>
                 <w:rStyle w:val="Hyperlink"/>
@@ -3146,7 +3325,7 @@
                 <w:noProof/>
                 <w:webHidden/>
               </w:rPr>
-              <w:instrText xml:space="preserve"> PAGEREF _Toc244123267 \h </w:instrText>
+              <w:instrText xml:space="preserve"> PAGEREF _Toc244163429 \h </w:instrText>
             </w:r>
             <w:r>
               <w:rPr>
@@ -3193,7 +3372,7 @@
               <w14:ligatures w14:val="standardContextual"/>
             </w:rPr>
           </w:pPr>
-          <w:hyperlink w:anchor="_Toc244123268" w:history="1">
+          <w:hyperlink w:anchor="_Toc244163430" w:history="1">
             <w:r>
               <w:rPr>
                 <w:rStyle w:val="Hyperlink"/>
@@ -3220,7 +3399,7 @@
                 <w:noProof/>
                 <w:webHidden/>
               </w:rPr>
-              <w:instrText xml:space="preserve"> PAGEREF _Toc244123268 \h </w:instrText>
+              <w:instrText xml:space="preserve"> PAGEREF _Toc244163430 \h </w:instrText>
             </w:r>
             <w:r>
               <w:rPr>
@@ -3267,7 +3446,7 @@
               <w14:ligatures w14:val="standardContextual"/>
             </w:rPr>
           </w:pPr>
-          <w:hyperlink w:anchor="_Toc244123269" w:history="1">
+          <w:hyperlink w:anchor="_Toc244163431" w:history="1">
             <w:r>
               <w:rPr>
                 <w:rStyle w:val="Hyperlink"/>
@@ -3294,7 +3473,7 @@
                 <w:noProof/>
                 <w:webHidden/>
               </w:rPr>
-              <w:instrText xml:space="preserve"> PAGEREF _Toc244123269 \h </w:instrText>
+              <w:instrText xml:space="preserve"> PAGEREF _Toc244163431 \h </w:instrText>
             </w:r>
             <w:r>
               <w:rPr>
@@ -3341,7 +3520,7 @@
               <w14:ligatures w14:val="standardContextual"/>
             </w:rPr>
           </w:pPr>
-          <w:hyperlink w:anchor="_Toc244123270" w:history="1">
+          <w:hyperlink w:anchor="_Toc244163432" w:history="1">
             <w:r>
               <w:rPr>
                 <w:rStyle w:val="Hyperlink"/>
@@ -3368,7 +3547,7 @@
                 <w:noProof/>
                 <w:webHidden/>
               </w:rPr>
-              <w:instrText xml:space="preserve"> PAGEREF _Toc244123270 \h </w:instrText>
+              <w:instrText xml:space="preserve"> PAGEREF _Toc244163432 \h </w:instrText>
             </w:r>
             <w:r>
               <w:rPr>
@@ -3415,7 +3594,7 @@
               <w14:ligatures w14:val="standardContextual"/>
             </w:rPr>
           </w:pPr>
-          <w:hyperlink w:anchor="_Toc244123271" w:history="1">
+          <w:hyperlink w:anchor="_Toc244163433" w:history="1">
             <w:r>
               <w:rPr>
                 <w:rStyle w:val="Hyperlink"/>
@@ -3442,7 +3621,7 @@
                 <w:noProof/>
                 <w:webHidden/>
               </w:rPr>
-              <w:instrText xml:space="preserve"> PAGEREF _Toc244123271 \h </w:instrText>
+              <w:instrText xml:space="preserve"> PAGEREF _Toc244163433 \h </w:instrText>
             </w:r>
             <w:r>
               <w:rPr>
@@ -3489,7 +3668,7 @@
               <w14:ligatures w14:val="standardContextual"/>
             </w:rPr>
           </w:pPr>
-          <w:hyperlink w:anchor="_Toc244123272" w:history="1">
+          <w:hyperlink w:anchor="_Toc244163434" w:history="1">
             <w:r>
               <w:rPr>
                 <w:rStyle w:val="Hyperlink"/>
@@ -3516,7 +3695,7 @@
                 <w:noProof/>
                 <w:webHidden/>
               </w:rPr>
-              <w:instrText xml:space="preserve"> PAGEREF _Toc244123272 \h </w:instrText>
+              <w:instrText xml:space="preserve"> PAGEREF _Toc244163434 \h </w:instrText>
             </w:r>
             <w:r>
               <w:rPr>
@@ -3563,7 +3742,7 @@
               <w14:ligatures w14:val="standardContextual"/>
             </w:rPr>
           </w:pPr>
-          <w:hyperlink w:anchor="_Toc244123273" w:history="1">
+          <w:hyperlink w:anchor="_Toc244163435" w:history="1">
             <w:r>
               <w:rPr>
                 <w:rStyle w:val="Hyperlink"/>
@@ -3590,7 +3769,7 @@
                 <w:noProof/>
                 <w:webHidden/>
               </w:rPr>
-              <w:instrText xml:space="preserve"> PAGEREF _Toc244123273 \h </w:instrText>
+              <w:instrText xml:space="preserve"> PAGEREF _Toc244163435 \h </w:instrText>
             </w:r>
             <w:r>
               <w:rPr>
@@ -3637,7 +3816,7 @@
               <w14:ligatures w14:val="standardContextual"/>
             </w:rPr>
           </w:pPr>
-          <w:hyperlink w:anchor="_Toc244123274" w:history="1">
+          <w:hyperlink w:anchor="_Toc244163436" w:history="1">
             <w:r>
               <w:rPr>
                 <w:rStyle w:val="Hyperlink"/>
@@ -3664,7 +3843,7 @@
                 <w:noProof/>
                 <w:webHidden/>
               </w:rPr>
-              <w:instrText xml:space="preserve"> PAGEREF _Toc244123274 \h </w:instrText>
+              <w:instrText xml:space="preserve"> PAGEREF _Toc244163436 \h </w:instrText>
             </w:r>
             <w:r>
               <w:rPr>
@@ -3711,7 +3890,7 @@
               <w14:ligatures w14:val="standardContextual"/>
             </w:rPr>
           </w:pPr>
-          <w:hyperlink w:anchor="_Toc244123275" w:history="1">
+          <w:hyperlink w:anchor="_Toc244163437" w:history="1">
             <w:r>
               <w:rPr>
                 <w:rStyle w:val="Hyperlink"/>
@@ -3738,7 +3917,7 @@
                 <w:noProof/>
                 <w:webHidden/>
               </w:rPr>
-              <w:instrText xml:space="preserve"> PAGEREF _Toc244123275 \h </w:instrText>
+              <w:instrText xml:space="preserve"> PAGEREF _Toc244163437 \h </w:instrText>
             </w:r>
             <w:r>
               <w:rPr>
@@ -3785,7 +3964,7 @@
               <w14:ligatures w14:val="standardContextual"/>
             </w:rPr>
           </w:pPr>
-          <w:hyperlink w:anchor="_Toc244123276" w:history="1">
+          <w:hyperlink w:anchor="_Toc244163438" w:history="1">
             <w:r>
               <w:rPr>
                 <w:rStyle w:val="Hyperlink"/>
@@ -3812,7 +3991,7 @@
                 <w:noProof/>
                 <w:webHidden/>
               </w:rPr>
-              <w:instrText xml:space="preserve"> PAGEREF _Toc244123276 \h </w:instrText>
+              <w:instrText xml:space="preserve"> PAGEREF _Toc244163438 \h </w:instrText>
             </w:r>
             <w:r>
               <w:rPr>
@@ -3859,7 +4038,7 @@
               <w14:ligatures w14:val="standardContextual"/>
             </w:rPr>
           </w:pPr>
-          <w:hyperlink w:anchor="_Toc244123277" w:history="1">
+          <w:hyperlink w:anchor="_Toc244163439" w:history="1">
             <w:r>
               <w:rPr>
                 <w:rStyle w:val="Hyperlink"/>
@@ -3886,7 +4065,7 @@
                 <w:noProof/>
                 <w:webHidden/>
               </w:rPr>
-              <w:instrText xml:space="preserve"> PAGEREF _Toc244123277 \h </w:instrText>
+              <w:instrText xml:space="preserve"> PAGEREF _Toc244163439 \h </w:instrText>
             </w:r>
             <w:r>
               <w:rPr>
@@ -3933,7 +4112,7 @@
               <w14:ligatures w14:val="standardContextual"/>
             </w:rPr>
           </w:pPr>
-          <w:hyperlink w:anchor="_Toc244123278" w:history="1">
+          <w:hyperlink w:anchor="_Toc244163440" w:history="1">
             <w:r>
               <w:rPr>
                 <w:rStyle w:val="Hyperlink"/>
@@ -3960,7 +4139,7 @@
                 <w:noProof/>
                 <w:webHidden/>
               </w:rPr>
-              <w:instrText xml:space="preserve"> PAGEREF _Toc244123278 \h </w:instrText>
+              <w:instrText xml:space="preserve"> PAGEREF _Toc244163440 \h </w:instrText>
             </w:r>
             <w:r>
               <w:rPr>
@@ -4007,7 +4186,7 @@
               <w14:ligatures w14:val="standardContextual"/>
             </w:rPr>
           </w:pPr>
-          <w:hyperlink w:anchor="_Toc244123279" w:history="1">
+          <w:hyperlink w:anchor="_Toc244163441" w:history="1">
             <w:r>
               <w:rPr>
                 <w:rStyle w:val="Hyperlink"/>
@@ -4034,7 +4213,7 @@
                 <w:noProof/>
                 <w:webHidden/>
               </w:rPr>
-              <w:instrText xml:space="preserve"> PAGEREF _Toc244123279 \h </w:instrText>
+              <w:instrText xml:space="preserve"> PAGEREF _Toc244163441 \h </w:instrText>
             </w:r>
             <w:r>
               <w:rPr>
@@ -4081,7 +4260,7 @@
               <w14:ligatures w14:val="standardContextual"/>
             </w:rPr>
           </w:pPr>
-          <w:hyperlink w:anchor="_Toc244123280" w:history="1">
+          <w:hyperlink w:anchor="_Toc244163442" w:history="1">
             <w:r>
               <w:rPr>
                 <w:rStyle w:val="Hyperlink"/>
@@ -4108,7 +4287,7 @@
                 <w:noProof/>
                 <w:webHidden/>
               </w:rPr>
-              <w:instrText xml:space="preserve"> PAGEREF _Toc244123280 \h </w:instrText>
+              <w:instrText xml:space="preserve"> PAGEREF _Toc244163442 \h </w:instrText>
             </w:r>
             <w:r>
               <w:rPr>
@@ -4155,7 +4334,7 @@
               <w14:ligatures w14:val="standardContextual"/>
             </w:rPr>
           </w:pPr>
-          <w:hyperlink w:anchor="_Toc244123281" w:history="1">
+          <w:hyperlink w:anchor="_Toc244163443" w:history="1">
             <w:r>
               <w:rPr>
                 <w:rStyle w:val="Hyperlink"/>
@@ -4182,7 +4361,7 @@
                 <w:noProof/>
                 <w:webHidden/>
               </w:rPr>
-              <w:instrText xml:space="preserve"> PAGEREF _Toc244123281 \h </w:instrText>
+              <w:instrText xml:space="preserve"> PAGEREF _Toc244163443 \h </w:instrText>
             </w:r>
             <w:r>
               <w:rPr>
@@ -4229,7 +4408,7 @@
               <w14:ligatures w14:val="standardContextual"/>
             </w:rPr>
           </w:pPr>
-          <w:hyperlink w:anchor="_Toc244123282" w:history="1">
+          <w:hyperlink w:anchor="_Toc244163444" w:history="1">
             <w:r>
               <w:rPr>
                 <w:rStyle w:val="Hyperlink"/>
@@ -4256,7 +4435,7 @@
                 <w:noProof/>
                 <w:webHidden/>
               </w:rPr>
-              <w:instrText xml:space="preserve"> PAGEREF _Toc244123282 \h </w:instrText>
+              <w:instrText xml:space="preserve"> PAGEREF _Toc244163444 \h </w:instrText>
             </w:r>
             <w:r>
               <w:rPr>
@@ -4303,7 +4482,7 @@
               <w14:ligatures w14:val="standardContextual"/>
             </w:rPr>
           </w:pPr>
-          <w:hyperlink w:anchor="_Toc244123283" w:history="1">
+          <w:hyperlink w:anchor="_Toc244163445" w:history="1">
             <w:r>
               <w:rPr>
                 <w:rStyle w:val="Hyperlink"/>
@@ -4330,7 +4509,7 @@
                 <w:noProof/>
                 <w:webHidden/>
               </w:rPr>
-              <w:instrText xml:space="preserve"> PAGEREF _Toc244123283 \h </w:instrText>
+              <w:instrText xml:space="preserve"> PAGEREF _Toc244163445 \h </w:instrText>
             </w:r>
             <w:r>
               <w:rPr>
@@ -4377,7 +4556,7 @@
               <w14:ligatures w14:val="standardContextual"/>
             </w:rPr>
           </w:pPr>
-          <w:hyperlink w:anchor="_Toc244123284" w:history="1">
+          <w:hyperlink w:anchor="_Toc244163446" w:history="1">
             <w:r>
               <w:rPr>
                 <w:rStyle w:val="Hyperlink"/>
@@ -4404,7 +4583,7 @@
                 <w:noProof/>
                 <w:webHidden/>
               </w:rPr>
-              <w:instrText xml:space="preserve"> PAGEREF _Toc244123284 \h </w:instrText>
+              <w:instrText xml:space="preserve"> PAGEREF _Toc244163446 \h </w:instrText>
             </w:r>
             <w:r>
               <w:rPr>
@@ -4451,7 +4630,7 @@
               <w14:ligatures w14:val="standardContextual"/>
             </w:rPr>
           </w:pPr>
-          <w:hyperlink w:anchor="_Toc244123285" w:history="1">
+          <w:hyperlink w:anchor="_Toc244163447" w:history="1">
             <w:r>
               <w:rPr>
                 <w:rStyle w:val="Hyperlink"/>
@@ -4478,7 +4657,7 @@
                 <w:noProof/>
                 <w:webHidden/>
               </w:rPr>
-              <w:instrText xml:space="preserve"> PAGEREF _Toc244123285 \h </w:instrText>
+              <w:instrText xml:space="preserve"> PAGEREF _Toc244163447 \h </w:instrText>
             </w:r>
             <w:r>
               <w:rPr>
@@ -4525,7 +4704,7 @@
               <w14:ligatures w14:val="standardContextual"/>
             </w:rPr>
           </w:pPr>
-          <w:hyperlink w:anchor="_Toc244123286" w:history="1">
+          <w:hyperlink w:anchor="_Toc244163448" w:history="1">
             <w:r>
               <w:rPr>
                 <w:rStyle w:val="Hyperlink"/>
@@ -4552,7 +4731,7 @@
                 <w:noProof/>
                 <w:webHidden/>
               </w:rPr>
-              <w:instrText xml:space="preserve"> PAGEREF _Toc244123286 \h </w:instrText>
+              <w:instrText xml:space="preserve"> PAGEREF _Toc244163448 \h </w:instrText>
             </w:r>
             <w:r>
               <w:rPr>
@@ -4599,7 +4778,7 @@
               <w14:ligatures w14:val="standardContextual"/>
             </w:rPr>
           </w:pPr>
-          <w:hyperlink w:anchor="_Toc244123287" w:history="1">
+          <w:hyperlink w:anchor="_Toc244163449" w:history="1">
             <w:r>
               <w:rPr>
                 <w:rStyle w:val="Hyperlink"/>
@@ -4626,7 +4805,7 @@
                 <w:noProof/>
                 <w:webHidden/>
               </w:rPr>
-              <w:instrText xml:space="preserve"> PAGEREF _Toc244123287 \h </w:instrText>
+              <w:instrText xml:space="preserve"> PAGEREF _Toc244163449 \h </w:instrText>
             </w:r>
             <w:r>
               <w:rPr>
@@ -4670,7 +4849,7 @@
         <w:pageBreakBefore/>
       </w:pPr>
       <w:bookmarkStart w:id="0" w:name="mở-đầu"/>
-      <w:bookmarkStart w:id="1" w:name="_Toc244123227"/>
+      <w:bookmarkStart w:id="1" w:name="_Toc244163389"/>
       <w:r>
         <w:lastRenderedPageBreak/>
         <w:t>Mở đầu</w:t>
@@ -4724,7 +4903,7 @@
         <w:pStyle w:val="BodyText"/>
       </w:pPr>
       <w:r>
-        <w:t>Hai giải đã hoàn tất cho phép kiểm tra sản phẩm ngay trên web. Giải vòng tròn có tám đội và 56 ván; giải qua GitHub có bốn đội, một đợt ladder và 12 ván vòng tròn chính thức, chọn hai đội. Giải thứ hai đã kiểm cả trường hợp đẩy mã sau hạn: hệ thống vẫn dùng đúng bản đã chốt trước hạn.</w:t>
+        <w:t>Hai giải demo đã hoàn tất cho phép kiểm tra sản phẩm ngay trên web. Giải vòng tròn có tám đội và 56 ván; giải qua GitHub có bốn đội, một đợt ladder và 12 ván vòng tròn chính thức, chọn hai đội. Giải thứ hai đã kiểm cả trường hợp đẩy mã sau hạn: hệ thống vẫn dùng đúng bản đã chốt trước hạn. Web còn có chung kết thử 16 đội bot mẫu chạy trên hub LAN rồi nạp lên, với nhánh đấu, 64 ván và replay.</w:t>
       </w:r>
     </w:p>
     <w:p>
@@ -4834,7 +5013,7 @@
         <w:pageBreakBefore/>
       </w:pPr>
       <w:bookmarkStart w:id="2" w:name="phần-a-giải-đấu"/>
-      <w:bookmarkStart w:id="3" w:name="_Toc244123228"/>
+      <w:bookmarkStart w:id="3" w:name="_Toc244163390"/>
       <w:bookmarkEnd w:id="0"/>
       <w:r>
         <w:lastRenderedPageBreak/>
@@ -4847,7 +5026,7 @@
         <w:pStyle w:val="Heading2"/>
       </w:pPr>
       <w:bookmarkStart w:id="4" w:name="a1-trò-chơi-ottv2"/>
-      <w:bookmarkStart w:id="5" w:name="_Toc244123229"/>
+      <w:bookmarkStart w:id="5" w:name="_Toc244163391"/>
       <w:r>
         <w:t>1. Trò chơi OTTv2</w:t>
       </w:r>
@@ -5128,7 +5307,7 @@
         <w:pStyle w:val="Heading2"/>
       </w:pPr>
       <w:bookmarkStart w:id="6" w:name="a2-tài-khoản-và-đội"/>
-      <w:bookmarkStart w:id="7" w:name="_Toc244123230"/>
+      <w:bookmarkStart w:id="7" w:name="_Toc244163392"/>
       <w:bookmarkEnd w:id="4"/>
       <w:r>
         <w:t>2. Tài khoản và đội</w:t>
@@ -5447,7 +5626,7 @@
         <w:pStyle w:val="Heading2"/>
       </w:pPr>
       <w:bookmarkStart w:id="8" w:name="a3-nộp-bot-qua-github"/>
-      <w:bookmarkStart w:id="9" w:name="_Toc244123231"/>
+      <w:bookmarkStart w:id="9" w:name="_Toc244163393"/>
       <w:bookmarkEnd w:id="6"/>
       <w:r>
         <w:t>3. Nộp bot qua GitHub</w:t>
@@ -5871,7 +6050,7 @@
         <w:pStyle w:val="Heading2"/>
       </w:pPr>
       <w:bookmarkStart w:id="10" w:name="a4-thể-lệ-và-lịch-đấu"/>
-      <w:bookmarkStart w:id="11" w:name="_Toc244123232"/>
+      <w:bookmarkStart w:id="11" w:name="_Toc244163394"/>
       <w:bookmarkEnd w:id="8"/>
       <w:r>
         <w:t>4. Thể lệ và lịch đấu</w:t>
@@ -5883,7 +6062,7 @@
         <w:pStyle w:val="Heading3"/>
       </w:pPr>
       <w:bookmarkStart w:id="12" w:name="ladder-trước-hạn"/>
-      <w:bookmarkStart w:id="13" w:name="_Toc244123233"/>
+      <w:bookmarkStart w:id="13" w:name="_Toc244163395"/>
       <w:r>
         <w:t>4.1. Ladder trước hạn</w:t>
       </w:r>
@@ -5943,7 +6122,7 @@
         <w:pStyle w:val="Heading3"/>
       </w:pPr>
       <w:bookmarkStart w:id="14" w:name="chốt-bài-tại-hạn"/>
-      <w:bookmarkStart w:id="15" w:name="_Toc244123234"/>
+      <w:bookmarkStart w:id="15" w:name="_Toc244163396"/>
       <w:bookmarkEnd w:id="12"/>
       <w:r>
         <w:lastRenderedPageBreak/>
@@ -5969,7 +6148,7 @@
         <w:pStyle w:val="Heading3"/>
       </w:pPr>
       <w:bookmarkStart w:id="16" w:name="xếp-hạng-chính-thức"/>
-      <w:bookmarkStart w:id="17" w:name="_Toc244123235"/>
+      <w:bookmarkStart w:id="17" w:name="_Toc244163397"/>
       <w:bookmarkEnd w:id="14"/>
       <w:r>
         <w:t>4.3. Xếp hạng chính thức</w:t>
@@ -6320,7 +6499,7 @@
         <w:pStyle w:val="Heading2"/>
       </w:pPr>
       <w:bookmarkStart w:id="18" w:name="a5-xem-kết-quả"/>
-      <w:bookmarkStart w:id="19" w:name="_Toc244123236"/>
+      <w:bookmarkStart w:id="19" w:name="_Toc244163398"/>
       <w:bookmarkEnd w:id="10"/>
       <w:bookmarkEnd w:id="16"/>
       <w:r>
@@ -6488,7 +6667,7 @@
         <w:pStyle w:val="Heading2"/>
       </w:pPr>
       <w:bookmarkStart w:id="20" w:name="a6-ban-tổ-chức-và-điều-hành"/>
-      <w:bookmarkStart w:id="21" w:name="_Toc244123237"/>
+      <w:bookmarkStart w:id="21" w:name="_Toc244163399"/>
       <w:bookmarkEnd w:id="18"/>
       <w:r>
         <w:t>6. Ban tổ chức và điều hành</w:t>
@@ -6610,7 +6789,7 @@
       <w:pPr>
         <w:pStyle w:val="Heading2"/>
       </w:pPr>
-      <w:bookmarkStart w:id="22" w:name="_Toc244123238"/>
+      <w:bookmarkStart w:id="22" w:name="_Toc244163400"/>
       <w:r>
         <w:t>7. Chung kết tại hội trường</w:t>
       </w:r>
@@ -7042,7 +7221,7 @@
         <w:pageBreakBefore/>
       </w:pPr>
       <w:bookmarkStart w:id="23" w:name="phần-b-thiết-kế-kỹ-thuật"/>
-      <w:bookmarkStart w:id="24" w:name="_Toc244123239"/>
+      <w:bookmarkStart w:id="24" w:name="_Toc244163401"/>
       <w:bookmarkEnd w:id="2"/>
       <w:bookmarkEnd w:id="20"/>
       <w:r>
@@ -7056,7 +7235,7 @@
         <w:pStyle w:val="Heading2"/>
       </w:pPr>
       <w:bookmarkStart w:id="25" w:name="b1-kiến-trúc-tổng-thể"/>
-      <w:bookmarkStart w:id="26" w:name="_Toc244123240"/>
+      <w:bookmarkStart w:id="26" w:name="_Toc244163402"/>
       <w:r>
         <w:t>1. Kiến trúc tổng thể</w:t>
       </w:r>
@@ -7158,7 +7337,7 @@
         <w:pStyle w:val="Heading2"/>
       </w:pPr>
       <w:bookmarkStart w:id="27" w:name="b2-dịch-vụ-được-dùng"/>
-      <w:bookmarkStart w:id="28" w:name="_Toc244123241"/>
+      <w:bookmarkStart w:id="28" w:name="_Toc244163403"/>
       <w:bookmarkEnd w:id="25"/>
       <w:r>
         <w:lastRenderedPageBreak/>
@@ -7490,7 +7669,7 @@
         <w:pStyle w:val="Heading2"/>
       </w:pPr>
       <w:bookmarkStart w:id="29" w:name="b3-hub-và-cách-phục-vụ-dữ-liệu"/>
-      <w:bookmarkStart w:id="30" w:name="_Toc244123242"/>
+      <w:bookmarkStart w:id="30" w:name="_Toc244163404"/>
       <w:bookmarkEnd w:id="27"/>
       <w:r>
         <w:t>3. Hub và cách phục vụ dữ liệu</w:t>
@@ -7569,7 +7748,7 @@
         <w:pStyle w:val="Heading2"/>
       </w:pPr>
       <w:bookmarkStart w:id="31" w:name="b4-máy-chấm-và-chia-việc"/>
-      <w:bookmarkStart w:id="32" w:name="_Toc244123243"/>
+      <w:bookmarkStart w:id="32" w:name="_Toc244163405"/>
       <w:bookmarkEnd w:id="29"/>
       <w:r>
         <w:t>4. Máy chấm và chia việc</w:t>
@@ -7692,7 +7871,7 @@
         <w:pStyle w:val="Heading2"/>
       </w:pPr>
       <w:bookmarkStart w:id="33" w:name="b5-sandbox-thay-docker"/>
-      <w:bookmarkStart w:id="34" w:name="_Toc244123244"/>
+      <w:bookmarkStart w:id="34" w:name="_Toc244163406"/>
       <w:bookmarkEnd w:id="31"/>
       <w:r>
         <w:t>5. Sandbox chạy bot</w:t>
@@ -7734,7 +7913,7 @@
         <w:pStyle w:val="Heading2"/>
       </w:pPr>
       <w:bookmarkStart w:id="35" w:name="b6-quỹ-giờ-và-khả-năng-đối-chiếu"/>
-      <w:bookmarkStart w:id="36" w:name="_Toc244123245"/>
+      <w:bookmarkStart w:id="36" w:name="_Toc244163407"/>
       <w:bookmarkEnd w:id="33"/>
       <w:r>
         <w:t>6. Quỹ giờ và khả năng đối chiếu</w:t>
@@ -7783,7 +7962,7 @@
         <w:pStyle w:val="Heading2"/>
       </w:pPr>
       <w:bookmarkStart w:id="37" w:name="b7-chịu-lỗi-và-sao-lưu"/>
-      <w:bookmarkStart w:id="38" w:name="_Toc244123246"/>
+      <w:bookmarkStart w:id="38" w:name="_Toc244163408"/>
       <w:bookmarkEnd w:id="35"/>
       <w:r>
         <w:t>7. Chịu lỗi và sao lưu</w:t>
@@ -8168,7 +8347,7 @@
         <w:pStyle w:val="Heading2"/>
       </w:pPr>
       <w:bookmarkStart w:id="39" w:name="b8-bảo-mật"/>
-      <w:bookmarkStart w:id="40" w:name="_Toc244123247"/>
+      <w:bookmarkStart w:id="40" w:name="_Toc244163409"/>
       <w:bookmarkEnd w:id="37"/>
       <w:r>
         <w:t>8. Bảo mật</w:t>
@@ -8226,7 +8405,7 @@
         <w:pStyle w:val="Heading2"/>
       </w:pPr>
       <w:bookmarkStart w:id="41" w:name="b9-sức-tải-và-thời-gian-đã-đo"/>
-      <w:bookmarkStart w:id="42" w:name="_Toc244123248"/>
+      <w:bookmarkStart w:id="42" w:name="_Toc244163410"/>
       <w:bookmarkEnd w:id="39"/>
       <w:r>
         <w:t>9. Sức tải và thời gian đã đo</w:t>
@@ -9410,7 +9589,7 @@
       <w:pPr>
         <w:pStyle w:val="Heading2"/>
       </w:pPr>
-      <w:bookmarkStart w:id="43" w:name="_Toc244123249"/>
+      <w:bookmarkStart w:id="43" w:name="_Toc244163411"/>
       <w:bookmarkEnd w:id="41"/>
       <w:r>
         <w:t>10. Cài đặt và vận hành</w:t>
@@ -9517,14 +9696,14 @@
         <w:t>Tự thử trên Windows và Linux.</w:t>
       </w:r>
       <w:r>
-        <w:t xml:space="preserve"> Người dùng có thể mở web công khai, xem hai giải demo và replay mà không cần tài khoản quản trị. Người vận hành nhận tin nhắn cài riêng có thể cài máy chấm trên Windows; với Ubuntu hoặc WSL2 cần kiểm cgroup và chính sách user namespace trước. Sau khi nối, xác nhận máy online và nhận được lượt kiểm, thay vì chỉ thấy chương trình cài báo thành công.</w:t>
+        <w:t xml:space="preserve"> Người dùng có thể mở web công khai, xem hai giải demo, chung kết thử và replay mà không cần tài khoản quản trị. Người vận hành nhận tin nhắn cài riêng có thể cài máy chấm trên Windows; với Ubuntu hoặc WSL2 cần kiểm cgroup và chính sách user namespace trước. Sau khi nối, xác nhận máy online và nhận được lượt kiểm, thay vì chỉ thấy chương trình cài báo thành công.</w:t>
       </w:r>
     </w:p>
     <w:p>
       <w:pPr>
         <w:pStyle w:val="Heading2"/>
       </w:pPr>
-      <w:bookmarkStart w:id="44" w:name="_Toc244123250"/>
+      <w:bookmarkStart w:id="44" w:name="_Toc244163412"/>
       <w:r>
         <w:t>11. Mạng LAN ngày chung kết</w:t>
       </w:r>
@@ -9651,7 +9830,7 @@
         <w:pStyle w:val="Heading2"/>
         <w:pageBreakBefore/>
       </w:pPr>
-      <w:bookmarkStart w:id="45" w:name="_Toc244123251"/>
+      <w:bookmarkStart w:id="45" w:name="_Toc244163413"/>
       <w:r>
         <w:lastRenderedPageBreak/>
         <w:t>12. Giới hạn và hướng tiếp</w:t>
@@ -9660,7 +9839,7 @@
     </w:p>
     <w:p>
       <w:r>
-        <w:t>Web thật đã có hai giải demo, nhận bài GitHub, chấm phân tán và bảng kết quả có thể đối chiếu. Bộ thử tự động đã kiểm quyền, sandbox, chạy lại, sao lưu và luồng trình duyệt. Tuy nhiên phạm vi nghiệm thu còn các giới hạn dưới đây; không dùng một số đo nhỏ để thay cho các bước chưa làm.</w:t>
+        <w:t>Web thật đã có hai giải demo và một chung kết thử 16 đội bot mẫu, nhận bài GitHub, chấm phân tán và bảng kết quả có thể đối chiếu. Bộ thử tự động đã kiểm quyền, sandbox, chạy lại, sao lưu và luồng trình duyệt. Tuy nhiên phạm vi nghiệm thu còn các giới hạn dưới đây; không dùng một số đo nhỏ để thay cho các bước chưa làm.</w:t>
       </w:r>
     </w:p>
     <w:p>
@@ -9745,7 +9924,7 @@
         <w:pageBreakBefore/>
       </w:pPr>
       <w:bookmarkStart w:id="46" w:name="phần-c-hướng-dẫn-demo-từng-bước"/>
-      <w:bookmarkStart w:id="47" w:name="_Toc244123252"/>
+      <w:bookmarkStart w:id="47" w:name="_Toc244163414"/>
       <w:bookmarkEnd w:id="23"/>
       <w:r>
         <w:lastRenderedPageBreak/>
@@ -9755,7 +9934,7 @@
     </w:p>
     <w:p>
       <w:r>
-        <w:t xml:space="preserve">Phần này đi theo ba vai trò để người đọc biết bấm ở đâu và kết quả mong đợi. Viền đỏ đánh dấu chỗ cần chú ý; các ô xám che thông tin hoặc mã không cần công khai. Ảnh tạo tài khoản, đội và luyện tập lấy trên hub local cùng phiên bản, email đi qua hộp thư thử; ảnh giải, kết quả và ban tổ chức lấy trên web thật. Các biểu mẫu quản trị chỉ được điền để chụp, không gửi thay đổi vào giải demo. </w:t>
+        <w:t xml:space="preserve">Phần này đi theo ba vai trò (khách, thí sinh, ban tổ chức) và ngày chung kết để người đọc biết bấm ở đâu và kết quả mong đợi. Viền đỏ đánh dấu chỗ cần chú ý; các ô xám che thông tin hoặc mã không cần công khai. Ảnh tạo tài khoản, đội và luyện tập lấy trên hub local cùng phiên bản, email đi qua hộp thư thử; ảnh giải, kết quả và ban tổ chức lấy trên web thật. Các biểu mẫu quản trị chỉ được điền để chụp, không gửi thay đổi vào giải demo. </w:t>
       </w:r>
     </w:p>
     <w:p>
@@ -9763,7 +9942,7 @@
         <w:pStyle w:val="Heading2"/>
       </w:pPr>
       <w:bookmarkStart w:id="48" w:name="c1-khách-xem-giải"/>
-      <w:bookmarkStart w:id="49" w:name="_Toc244123253"/>
+      <w:bookmarkStart w:id="49" w:name="_Toc244163415"/>
       <w:r>
         <w:t>1. Khách xem giải</w:t>
       </w:r>
@@ -9774,7 +9953,7 @@
         <w:pStyle w:val="Heading3"/>
       </w:pPr>
       <w:bookmarkStart w:id="50" w:name="bước-1-mở-giải-công-khai"/>
-      <w:bookmarkStart w:id="51" w:name="_Toc244123254"/>
+      <w:bookmarkStart w:id="51" w:name="_Toc244163416"/>
       <w:r>
         <w:t>Bước 1. Mở giải công khai</w:t>
       </w:r>
@@ -9862,7 +10041,7 @@
         <w:pStyle w:val="Heading3"/>
       </w:pPr>
       <w:bookmarkStart w:id="52" w:name="bước-2-xem-bảng-điểm-và-ma-trận"/>
-      <w:bookmarkStart w:id="53" w:name="_Toc244123255"/>
+      <w:bookmarkStart w:id="53" w:name="_Toc244163417"/>
       <w:bookmarkEnd w:id="50"/>
       <w:r>
         <w:t>Bước 2. Xem bảng điểm và ma trận</w:t>
@@ -9973,7 +10152,7 @@
         <w:pageBreakBefore/>
       </w:pPr>
       <w:bookmarkStart w:id="54" w:name="bước-3-xem-lại-từng-nước"/>
-      <w:bookmarkStart w:id="55" w:name="_Toc244123256"/>
+      <w:bookmarkStart w:id="55" w:name="_Toc244163418"/>
       <w:bookmarkEnd w:id="52"/>
       <w:r>
         <w:lastRenderedPageBreak/>
@@ -10054,7 +10233,7 @@
         <w:pageBreakBefore/>
       </w:pPr>
       <w:bookmarkStart w:id="56" w:name="c2-thí-sinh-đăng-ký-và-nộp-bot"/>
-      <w:bookmarkStart w:id="57" w:name="_Toc244123257"/>
+      <w:bookmarkStart w:id="57" w:name="_Toc244163419"/>
       <w:bookmarkEnd w:id="48"/>
       <w:bookmarkEnd w:id="54"/>
       <w:r>
@@ -10067,7 +10246,7 @@
       <w:pPr>
         <w:pStyle w:val="Heading3"/>
       </w:pPr>
-      <w:bookmarkStart w:id="58" w:name="_Toc244123258"/>
+      <w:bookmarkStart w:id="58" w:name="_Toc244163420"/>
       <w:r>
         <w:t>Bước 4. Đăng ký bằng email trường</w:t>
       </w:r>
@@ -10168,7 +10347,7 @@
         <w:pStyle w:val="Heading3"/>
         <w:pageBreakBefore/>
       </w:pPr>
-      <w:bookmarkStart w:id="59" w:name="_Toc244123259"/>
+      <w:bookmarkStart w:id="59" w:name="_Toc244163421"/>
       <w:r>
         <w:lastRenderedPageBreak/>
         <w:t>Bước 5. Mở email lấy mã</w:t>
@@ -10251,7 +10430,7 @@
         <w:pStyle w:val="Heading3"/>
         <w:pageBreakBefore/>
       </w:pPr>
-      <w:bookmarkStart w:id="60" w:name="_Toc244123260"/>
+      <w:bookmarkStart w:id="60" w:name="_Toc244163422"/>
       <w:r>
         <w:lastRenderedPageBreak/>
         <w:t>Bước 6. Xác minh email</w:t>
@@ -10343,7 +10522,7 @@
         <w:pStyle w:val="Heading3"/>
         <w:pageBreakBefore/>
       </w:pPr>
-      <w:bookmarkStart w:id="61" w:name="_Toc244123261"/>
+      <w:bookmarkStart w:id="61" w:name="_Toc244163423"/>
       <w:r>
         <w:lastRenderedPageBreak/>
         <w:t>Bước 7. Đặt mật khẩu và đăng nhập</w:t>
@@ -10434,7 +10613,7 @@
       <w:pPr>
         <w:pStyle w:val="Heading3"/>
       </w:pPr>
-      <w:bookmarkStart w:id="62" w:name="_Toc244123262"/>
+      <w:bookmarkStart w:id="62" w:name="_Toc244163424"/>
       <w:r>
         <w:t>Bước 8. Tạo đội</w:t>
       </w:r>
@@ -10532,7 +10711,7 @@
         <w:pStyle w:val="Heading3"/>
         <w:pageBreakBefore/>
       </w:pPr>
-      <w:bookmarkStart w:id="63" w:name="_Toc244123263"/>
+      <w:bookmarkStart w:id="63" w:name="_Toc244163425"/>
       <w:r>
         <w:lastRenderedPageBreak/>
         <w:t>Bước 9. Mời các thành viên</w:t>
@@ -10620,7 +10799,7 @@
       <w:pPr>
         <w:pStyle w:val="Heading3"/>
       </w:pPr>
-      <w:bookmarkStart w:id="64" w:name="_Toc244123264"/>
+      <w:bookmarkStart w:id="64" w:name="_Toc244163426"/>
       <w:r>
         <w:t>Bước 10. Vào đội bằng mã mời</w:t>
       </w:r>
@@ -10708,7 +10887,7 @@
         <w:pStyle w:val="Heading3"/>
         <w:pageBreakBefore/>
       </w:pPr>
-      <w:bookmarkStart w:id="65" w:name="_Toc244123265"/>
+      <w:bookmarkStart w:id="65" w:name="_Toc244163427"/>
       <w:r>
         <w:lastRenderedPageBreak/>
         <w:t>Bước 11. Tạo repo từ mẫu</w:t>
@@ -10796,7 +10975,7 @@
       <w:pPr>
         <w:pStyle w:val="Heading3"/>
       </w:pPr>
-      <w:bookmarkStart w:id="66" w:name="_Toc244123266"/>
+      <w:bookmarkStart w:id="66" w:name="_Toc244163428"/>
       <w:r>
         <w:t>Bước 12. Cho App truy cập đúng repo</w:t>
       </w:r>
@@ -10894,7 +11073,7 @@
         <w:pStyle w:val="Heading3"/>
         <w:pageBreakBefore/>
       </w:pPr>
-      <w:bookmarkStart w:id="67" w:name="_Toc244123267"/>
+      <w:bookmarkStart w:id="67" w:name="_Toc244163429"/>
       <w:r>
         <w:lastRenderedPageBreak/>
         <w:t>Bước 13. Gắn link repo với đội</w:t>
@@ -10992,7 +11171,7 @@
       <w:pPr>
         <w:pStyle w:val="Heading3"/>
       </w:pPr>
-      <w:bookmarkStart w:id="68" w:name="_Toc244123268"/>
+      <w:bookmarkStart w:id="68" w:name="_Toc244163430"/>
       <w:r>
         <w:t>Bước 14. Theo dõi kiểm tra 72 mẫu</w:t>
       </w:r>
@@ -11130,7 +11309,7 @@
         <w:pStyle w:val="Heading3"/>
         <w:pageBreakBefore/>
       </w:pPr>
-      <w:bookmarkStart w:id="69" w:name="_Toc244123269"/>
+      <w:bookmarkStart w:id="69" w:name="_Toc244163431"/>
       <w:r>
         <w:lastRenderedPageBreak/>
         <w:t>Bước 15. Thử nhanh không cần GitHub</w:t>
@@ -11203,7 +11382,7 @@
         <w:pStyle w:val="Heading3"/>
         <w:pageBreakBefore/>
       </w:pPr>
-      <w:bookmarkStart w:id="70" w:name="_Toc244123270"/>
+      <w:bookmarkStart w:id="70" w:name="_Toc244163432"/>
       <w:r>
         <w:lastRenderedPageBreak/>
         <w:t>Bước 16. Xem giải của đội</w:t>
@@ -11321,7 +11500,7 @@
       <w:pPr>
         <w:pStyle w:val="Heading3"/>
       </w:pPr>
-      <w:bookmarkStart w:id="71" w:name="_Toc244123271"/>
+      <w:bookmarkStart w:id="71" w:name="_Toc244163433"/>
       <w:r>
         <w:t>Bước 17. Luyện tập với bot mẫu</w:t>
       </w:r>
@@ -11430,7 +11609,7 @@
         <w:pageBreakBefore/>
       </w:pPr>
       <w:bookmarkStart w:id="72" w:name="c3-ban-tổ-chức-điều-hành"/>
-      <w:bookmarkStart w:id="73" w:name="_Toc244123272"/>
+      <w:bookmarkStart w:id="73" w:name="_Toc244163434"/>
       <w:bookmarkEnd w:id="56"/>
       <w:r>
         <w:lastRenderedPageBreak/>
@@ -11442,7 +11621,7 @@
       <w:pPr>
         <w:pStyle w:val="Heading3"/>
       </w:pPr>
-      <w:bookmarkStart w:id="74" w:name="_Toc244123273"/>
+      <w:bookmarkStart w:id="74" w:name="_Toc244163435"/>
       <w:r>
         <w:t>Bước 18. Xem tổng quan ban tổ chức</w:t>
       </w:r>
@@ -11520,7 +11699,7 @@
         <w:pStyle w:val="Heading3"/>
         <w:pageBreakBefore/>
       </w:pPr>
-      <w:bookmarkStart w:id="75" w:name="_Toc244123274"/>
+      <w:bookmarkStart w:id="75" w:name="_Toc244163436"/>
       <w:r>
         <w:lastRenderedPageBreak/>
         <w:t>Bước 19. Chọn giải ở Tổng quan</w:t>
@@ -11639,7 +11818,7 @@
         <w:pStyle w:val="Heading3"/>
         <w:pageBreakBefore/>
       </w:pPr>
-      <w:bookmarkStart w:id="76" w:name="_Toc244123275"/>
+      <w:bookmarkStart w:id="76" w:name="_Toc244163437"/>
       <w:r>
         <w:lastRenderedPageBreak/>
         <w:t>Bước 20. Chuẩn bị giải mới</w:t>
@@ -11727,7 +11906,7 @@
       <w:pPr>
         <w:pStyle w:val="Heading3"/>
       </w:pPr>
-      <w:bookmarkStart w:id="77" w:name="_Toc244123276"/>
+      <w:bookmarkStart w:id="77" w:name="_Toc244163438"/>
       <w:r>
         <w:t>Bước 21. Cài máy chấm Windows hoặc Linux</w:t>
       </w:r>
@@ -11835,7 +12014,7 @@
         <w:pStyle w:val="Heading3"/>
         <w:pageBreakBefore/>
       </w:pPr>
-      <w:bookmarkStart w:id="78" w:name="_Toc244123277"/>
+      <w:bookmarkStart w:id="78" w:name="_Toc244163439"/>
       <w:r>
         <w:lastRenderedPageBreak/>
         <w:t>Bước 22. Kiểm tình trạng chấm và hàng đợi</w:t>
@@ -11923,7 +12102,7 @@
       <w:pPr>
         <w:pStyle w:val="Heading3"/>
       </w:pPr>
-      <w:bookmarkStart w:id="79" w:name="_Toc244123278"/>
+      <w:bookmarkStart w:id="79" w:name="_Toc244163440"/>
       <w:r>
         <w:t>Bước 23. Soạn thông báo</w:t>
       </w:r>
@@ -12021,7 +12200,7 @@
         <w:pStyle w:val="Heading3"/>
         <w:pageBreakBefore/>
       </w:pPr>
-      <w:bookmarkStart w:id="80" w:name="_Toc244123279"/>
+      <w:bookmarkStart w:id="80" w:name="_Toc244163441"/>
       <w:r>
         <w:lastRenderedPageBreak/>
         <w:t>Bước 24. Xuất bảng điểm CSV</w:t>
@@ -12110,7 +12289,7 @@
         <w:pStyle w:val="Heading2"/>
         <w:pageBreakBefore/>
       </w:pPr>
-      <w:bookmarkStart w:id="81" w:name="_Toc244123280"/>
+      <w:bookmarkStart w:id="81" w:name="_Toc244163442"/>
       <w:bookmarkEnd w:id="46"/>
       <w:bookmarkEnd w:id="72"/>
       <w:r>
@@ -12131,7 +12310,7 @@
       <w:pPr>
         <w:pStyle w:val="Heading3"/>
       </w:pPr>
-      <w:bookmarkStart w:id="82" w:name="_Toc244123281"/>
+      <w:bookmarkStart w:id="82" w:name="_Toc244163443"/>
       <w:r>
         <w:t>Bước 25. Tạo tài khoản và phát giấy cho đội</w:t>
       </w:r>
@@ -12205,7 +12384,7 @@
         <w:pStyle w:val="Heading3"/>
         <w:pageBreakBefore/>
       </w:pPr>
-      <w:bookmarkStart w:id="83" w:name="_Toc244123282"/>
+      <w:bookmarkStart w:id="83" w:name="_Toc244163444"/>
       <w:r>
         <w:lastRenderedPageBreak/>
         <w:t>Bước 26. Đội tự nạp ZIP và kiểm tra</w:t>
@@ -12280,7 +12459,7 @@
         <w:pStyle w:val="Heading3"/>
         <w:pageBreakBefore/>
       </w:pPr>
-      <w:bookmarkStart w:id="84" w:name="_Toc244123283"/>
+      <w:bookmarkStart w:id="84" w:name="_Toc244163445"/>
       <w:r>
         <w:lastRenderedPageBreak/>
         <w:t>Bước 27. BTC tạo chung kết</w:t>
@@ -12355,7 +12534,7 @@
         <w:pStyle w:val="Heading3"/>
         <w:pageBreakBefore/>
       </w:pPr>
-      <w:bookmarkStart w:id="85" w:name="_Toc244123284"/>
+      <w:bookmarkStart w:id="85" w:name="_Toc244163446"/>
       <w:r>
         <w:lastRenderedPageBreak/>
         <w:t>Bước 28. Theo dõi vòng bảng và replay</w:t>
@@ -12430,7 +12609,7 @@
         <w:pStyle w:val="Heading3"/>
         <w:pageBreakBefore/>
       </w:pPr>
-      <w:bookmarkStart w:id="86" w:name="_Toc244123285"/>
+      <w:bookmarkStart w:id="86" w:name="_Toc244163447"/>
       <w:r>
         <w:lastRenderedPageBreak/>
         <w:t>Bước 29. Trang nhánh đấu và màn hình chiếu</w:t>
@@ -12505,7 +12684,7 @@
         <w:pStyle w:val="Heading3"/>
         <w:pageBreakBefore/>
       </w:pPr>
-      <w:bookmarkStart w:id="87" w:name="_Toc244123286"/>
+      <w:bookmarkStart w:id="87" w:name="_Toc244163448"/>
       <w:r>
         <w:lastRenderedPageBreak/>
         <w:t>Bước 30. Xuất kết quả trên hub LAN</w:t>
@@ -12580,7 +12759,7 @@
         <w:pStyle w:val="Heading3"/>
         <w:pageBreakBefore/>
       </w:pPr>
-      <w:bookmarkStart w:id="88" w:name="_Toc244123287"/>
+      <w:bookmarkStart w:id="88" w:name="_Toc244163449"/>
       <w:r>
         <w:lastRenderedPageBreak/>
         <w:t>Bước 31. Nạp kết quả lên web thật</w:t>

</xml_diff>